<commit_message>
dokumentace - lineární kontejner.
</commit_message>
<xml_diff>
--- a/ŠpaňúrM_KnihovnaProPraci_JM_2026.docx
+++ b/ŠpaňúrM_KnihovnaProPraci_JM_2026.docx
@@ -2479,7 +2479,7 @@
       <w:r>
         <w:fldChar w:fldCharType="separate"/>
       </w:r>
-      <w:hyperlink w:anchor="_Toc227276680" w:history="1">
+      <w:hyperlink w:anchor="_Toc227520777" w:history="1">
         <w:r>
           <w:rPr>
             <w:rStyle w:val="Hypertextovodkaz"/>
@@ -2507,7 +2507,7 @@
             <w:noProof/>
             <w:webHidden/>
           </w:rPr>
-          <w:instrText xml:space="preserve"> PAGEREF _Toc227276680 \h </w:instrText>
+          <w:instrText xml:space="preserve"> PAGEREF _Toc227520777 \h </w:instrText>
         </w:r>
         <w:r>
           <w:rPr>
@@ -2553,7 +2553,7 @@
           <w14:ligatures w14:val="standardContextual"/>
         </w:rPr>
       </w:pPr>
-      <w:hyperlink w:anchor="_Toc227276681" w:history="1">
+      <w:hyperlink w:anchor="_Toc227520778" w:history="1">
         <w:r>
           <w:rPr>
             <w:rStyle w:val="Hypertextovodkaz"/>
@@ -2581,7 +2581,7 @@
             <w:noProof/>
             <w:webHidden/>
           </w:rPr>
-          <w:instrText xml:space="preserve"> PAGEREF _Toc227276681 \h </w:instrText>
+          <w:instrText xml:space="preserve"> PAGEREF _Toc227520778 \h </w:instrText>
         </w:r>
         <w:r>
           <w:rPr>
@@ -2627,7 +2627,7 @@
           <w14:ligatures w14:val="standardContextual"/>
         </w:rPr>
       </w:pPr>
-      <w:hyperlink w:anchor="_Toc227276682" w:history="1">
+      <w:hyperlink w:anchor="_Toc227520779" w:history="1">
         <w:r>
           <w:rPr>
             <w:rStyle w:val="Hypertextovodkaz"/>
@@ -2655,7 +2655,7 @@
             <w:noProof/>
             <w:webHidden/>
           </w:rPr>
-          <w:instrText xml:space="preserve"> PAGEREF _Toc227276682 \h </w:instrText>
+          <w:instrText xml:space="preserve"> PAGEREF _Toc227520779 \h </w:instrText>
         </w:r>
         <w:r>
           <w:rPr>
@@ -2701,7 +2701,7 @@
           <w14:ligatures w14:val="standardContextual"/>
         </w:rPr>
       </w:pPr>
-      <w:hyperlink w:anchor="_Toc227276683" w:history="1">
+      <w:hyperlink w:anchor="_Toc227520780" w:history="1">
         <w:r>
           <w:rPr>
             <w:rStyle w:val="Hypertextovodkaz"/>
@@ -2728,7 +2728,7 @@
             <w:noProof/>
             <w:webHidden/>
           </w:rPr>
-          <w:instrText xml:space="preserve"> PAGEREF _Toc227276683 \h </w:instrText>
+          <w:instrText xml:space="preserve"> PAGEREF _Toc227520780 \h </w:instrText>
         </w:r>
         <w:r>
           <w:rPr>
@@ -2774,7 +2774,7 @@
           <w14:ligatures w14:val="standardContextual"/>
         </w:rPr>
       </w:pPr>
-      <w:hyperlink w:anchor="_Toc227276684" w:history="1">
+      <w:hyperlink w:anchor="_Toc227520781" w:history="1">
         <w:r>
           <w:rPr>
             <w:rStyle w:val="Hypertextovodkaz"/>
@@ -2801,7 +2801,7 @@
             <w:noProof/>
             <w:webHidden/>
           </w:rPr>
-          <w:instrText xml:space="preserve"> PAGEREF _Toc227276684 \h </w:instrText>
+          <w:instrText xml:space="preserve"> PAGEREF _Toc227520781 \h </w:instrText>
         </w:r>
         <w:r>
           <w:rPr>
@@ -2844,7 +2844,7 @@
           <w14:ligatures w14:val="standardContextual"/>
         </w:rPr>
       </w:pPr>
-      <w:hyperlink w:anchor="_Toc227276685" w:history="1">
+      <w:hyperlink w:anchor="_Toc227520782" w:history="1">
         <w:r>
           <w:rPr>
             <w:rStyle w:val="Hypertextovodkaz"/>
@@ -2871,7 +2871,7 @@
             <w:noProof/>
             <w:webHidden/>
           </w:rPr>
-          <w:instrText xml:space="preserve"> PAGEREF _Toc227276685 \h </w:instrText>
+          <w:instrText xml:space="preserve"> PAGEREF _Toc227520782 \h </w:instrText>
         </w:r>
         <w:r>
           <w:rPr>
@@ -2917,7 +2917,7 @@
           <w14:ligatures w14:val="standardContextual"/>
         </w:rPr>
       </w:pPr>
-      <w:hyperlink w:anchor="_Toc227276686" w:history="1">
+      <w:hyperlink w:anchor="_Toc227520783" w:history="1">
         <w:r>
           <w:rPr>
             <w:rStyle w:val="Hypertextovodkaz"/>
@@ -2944,7 +2944,7 @@
             <w:noProof/>
             <w:webHidden/>
           </w:rPr>
-          <w:instrText xml:space="preserve"> PAGEREF _Toc227276686 \h </w:instrText>
+          <w:instrText xml:space="preserve"> PAGEREF _Toc227520783 \h </w:instrText>
         </w:r>
         <w:r>
           <w:rPr>
@@ -2987,7 +2987,7 @@
           <w14:ligatures w14:val="standardContextual"/>
         </w:rPr>
       </w:pPr>
-      <w:hyperlink w:anchor="_Toc227276687" w:history="1">
+      <w:hyperlink w:anchor="_Toc227520784" w:history="1">
         <w:r>
           <w:rPr>
             <w:rStyle w:val="Hypertextovodkaz"/>
@@ -3014,77 +3014,7 @@
             <w:noProof/>
             <w:webHidden/>
           </w:rPr>
-          <w:instrText xml:space="preserve"> PAGEREF _Toc227276687 \h </w:instrText>
-        </w:r>
-        <w:r>
-          <w:rPr>
-            <w:noProof/>
-            <w:webHidden/>
-          </w:rPr>
-        </w:r>
-        <w:r>
-          <w:rPr>
-            <w:noProof/>
-            <w:webHidden/>
-          </w:rPr>
-          <w:fldChar w:fldCharType="separate"/>
-        </w:r>
-        <w:r>
-          <w:rPr>
-            <w:noProof/>
-            <w:webHidden/>
-          </w:rPr>
-          <w:t>14</w:t>
-        </w:r>
-        <w:r>
-          <w:rPr>
-            <w:noProof/>
-            <w:webHidden/>
-          </w:rPr>
-          <w:fldChar w:fldCharType="end"/>
-        </w:r>
-      </w:hyperlink>
-    </w:p>
-    <w:p>
-      <w:pPr>
-        <w:pStyle w:val="Obsah2"/>
-        <w:rPr>
-          <w:rFonts w:asciiTheme="minorHAnsi" w:eastAsiaTheme="minorEastAsia" w:hAnsiTheme="minorHAnsi" w:cstheme="minorBidi"/>
-          <w:noProof/>
-          <w:kern w:val="2"/>
-          <w:szCs w:val="24"/>
-          <w:lang/>
-          <w14:ligatures w14:val="standardContextual"/>
-        </w:rPr>
-      </w:pPr>
-      <w:hyperlink w:anchor="_Toc227276688" w:history="1">
-        <w:r>
-          <w:rPr>
-            <w:rStyle w:val="Hypertextovodkaz"/>
-            <w:noProof/>
-          </w:rPr>
-          <w:t>2.2 Komponenty</w:t>
-        </w:r>
-        <w:r>
-          <w:rPr>
-            <w:noProof/>
-            <w:webHidden/>
-          </w:rPr>
-          <w:tab/>
-        </w:r>
-        <w:r>
-          <w:rPr>
-            <w:noProof/>
-            <w:webHidden/>
-          </w:rPr>
-          <w:fldChar w:fldCharType="begin"/>
-        </w:r>
-        <w:r>
-          <w:rPr>
-            <w:noProof/>
-            <w:webHidden/>
-          </w:rPr>
-          <w:instrText xml:space="preserve"> PAGEREF _Toc227276688 \h </w:instrText>
+          <w:instrText xml:space="preserve"> PAGEREF _Toc227520784 \h </w:instrText>
         </w:r>
         <w:r>
           <w:rPr>
@@ -3130,21 +3060,13 @@
           <w14:ligatures w14:val="standardContextual"/>
         </w:rPr>
       </w:pPr>
-      <w:hyperlink w:anchor="_Toc227276689" w:history="1">
+      <w:hyperlink w:anchor="_Toc227520785" w:history="1">
         <w:r>
           <w:rPr>
             <w:rStyle w:val="Hypertextovodkaz"/>
             <w:noProof/>
           </w:rPr>
-          <w:t>2.2.1</w:t>
-        </w:r>
-        <w:r>
-          <w:rPr>
-            <w:rStyle w:val="Hypertextovodkaz"/>
-            <w:noProof/>
-            <w:lang w:eastAsia="cs-CZ"/>
-          </w:rPr>
-          <w:t xml:space="preserve"> Lineární kontejner</w:t>
+          <w:t>2.1.1 AdaptiveCpp</w:t>
         </w:r>
         <w:r>
           <w:rPr>
@@ -3165,7 +3087,7 @@
             <w:noProof/>
             <w:webHidden/>
           </w:rPr>
-          <w:instrText xml:space="preserve"> PAGEREF _Toc227276689 \h </w:instrText>
+          <w:instrText xml:space="preserve"> PAGEREF _Toc227520785 \h </w:instrText>
         </w:r>
         <w:r>
           <w:rPr>
@@ -3211,14 +3133,13 @@
           <w14:ligatures w14:val="standardContextual"/>
         </w:rPr>
       </w:pPr>
-      <w:hyperlink w:anchor="_Toc227276690" w:history="1">
+      <w:hyperlink w:anchor="_Toc227520786" w:history="1">
         <w:r>
           <w:rPr>
             <w:rStyle w:val="Hypertextovodkaz"/>
             <w:noProof/>
-            <w:lang w:eastAsia="cs-CZ"/>
-          </w:rPr>
-          <w:t>2.2.2 Tenzor</w:t>
+          </w:rPr>
+          <w:t>2.1.2 Google test</w:t>
         </w:r>
         <w:r>
           <w:rPr>
@@ -3239,7 +3160,77 @@
             <w:noProof/>
             <w:webHidden/>
           </w:rPr>
-          <w:instrText xml:space="preserve"> PAGEREF _Toc227276690 \h </w:instrText>
+          <w:instrText xml:space="preserve"> PAGEREF _Toc227520786 \h </w:instrText>
+        </w:r>
+        <w:r>
+          <w:rPr>
+            <w:noProof/>
+            <w:webHidden/>
+          </w:rPr>
+        </w:r>
+        <w:r>
+          <w:rPr>
+            <w:noProof/>
+            <w:webHidden/>
+          </w:rPr>
+          <w:fldChar w:fldCharType="separate"/>
+        </w:r>
+        <w:r>
+          <w:rPr>
+            <w:noProof/>
+            <w:webHidden/>
+          </w:rPr>
+          <w:t>14</w:t>
+        </w:r>
+        <w:r>
+          <w:rPr>
+            <w:noProof/>
+            <w:webHidden/>
+          </w:rPr>
+          <w:fldChar w:fldCharType="end"/>
+        </w:r>
+      </w:hyperlink>
+    </w:p>
+    <w:p>
+      <w:pPr>
+        <w:pStyle w:val="Obsah2"/>
+        <w:rPr>
+          <w:rFonts w:asciiTheme="minorHAnsi" w:eastAsiaTheme="minorEastAsia" w:hAnsiTheme="minorHAnsi" w:cstheme="minorBidi"/>
+          <w:noProof/>
+          <w:kern w:val="2"/>
+          <w:szCs w:val="24"/>
+          <w:lang/>
+          <w14:ligatures w14:val="standardContextual"/>
+        </w:rPr>
+      </w:pPr>
+      <w:hyperlink w:anchor="_Toc227520787" w:history="1">
+        <w:r>
+          <w:rPr>
+            <w:rStyle w:val="Hypertextovodkaz"/>
+            <w:noProof/>
+          </w:rPr>
+          <w:t>2.2 Komponenty</w:t>
+        </w:r>
+        <w:r>
+          <w:rPr>
+            <w:noProof/>
+            <w:webHidden/>
+          </w:rPr>
+          <w:tab/>
+        </w:r>
+        <w:r>
+          <w:rPr>
+            <w:noProof/>
+            <w:webHidden/>
+          </w:rPr>
+          <w:fldChar w:fldCharType="begin"/>
+        </w:r>
+        <w:r>
+          <w:rPr>
+            <w:noProof/>
+            <w:webHidden/>
+          </w:rPr>
+          <w:instrText xml:space="preserve"> PAGEREF _Toc227520787 \h </w:instrText>
         </w:r>
         <w:r>
           <w:rPr>
@@ -3285,14 +3276,21 @@
           <w14:ligatures w14:val="standardContextual"/>
         </w:rPr>
       </w:pPr>
-      <w:hyperlink w:anchor="_Toc227276691" w:history="1">
+      <w:hyperlink w:anchor="_Toc227520788" w:history="1">
         <w:r>
           <w:rPr>
             <w:rStyle w:val="Hypertextovodkaz"/>
             <w:noProof/>
+          </w:rPr>
+          <w:t>2.2.1</w:t>
+        </w:r>
+        <w:r>
+          <w:rPr>
+            <w:rStyle w:val="Hypertextovodkaz"/>
+            <w:noProof/>
             <w:lang w:eastAsia="cs-CZ"/>
           </w:rPr>
-          <w:t>2.2.3 Paralelní tenzor</w:t>
+          <w:t xml:space="preserve"> Lineární kontejner</w:t>
         </w:r>
         <w:r>
           <w:rPr>
@@ -3313,7 +3311,7 @@
             <w:noProof/>
             <w:webHidden/>
           </w:rPr>
-          <w:instrText xml:space="preserve"> PAGEREF _Toc227276691 \h </w:instrText>
+          <w:instrText xml:space="preserve"> PAGEREF _Toc227520788 \h </w:instrText>
         </w:r>
         <w:r>
           <w:rPr>
@@ -3359,14 +3357,14 @@
           <w14:ligatures w14:val="standardContextual"/>
         </w:rPr>
       </w:pPr>
-      <w:hyperlink w:anchor="_Toc227276692" w:history="1">
+      <w:hyperlink w:anchor="_Toc227520789" w:history="1">
         <w:r>
           <w:rPr>
             <w:rStyle w:val="Hypertextovodkaz"/>
             <w:noProof/>
             <w:lang w:eastAsia="cs-CZ"/>
           </w:rPr>
-          <w:t>2.2.4 Matice</w:t>
+          <w:t>2.2.2 Tenzor</w:t>
         </w:r>
         <w:r>
           <w:rPr>
@@ -3387,7 +3385,7 @@
             <w:noProof/>
             <w:webHidden/>
           </w:rPr>
-          <w:instrText xml:space="preserve"> PAGEREF _Toc227276692 \h </w:instrText>
+          <w:instrText xml:space="preserve"> PAGEREF _Toc227520789 \h </w:instrText>
         </w:r>
         <w:r>
           <w:rPr>
@@ -3407,7 +3405,7 @@
             <w:noProof/>
             <w:webHidden/>
           </w:rPr>
-          <w:t>14</w:t>
+          <w:t>16</w:t>
         </w:r>
         <w:r>
           <w:rPr>
@@ -3433,14 +3431,14 @@
           <w14:ligatures w14:val="standardContextual"/>
         </w:rPr>
       </w:pPr>
-      <w:hyperlink w:anchor="_Toc227276693" w:history="1">
+      <w:hyperlink w:anchor="_Toc227520790" w:history="1">
         <w:r>
           <w:rPr>
             <w:rStyle w:val="Hypertextovodkaz"/>
             <w:noProof/>
             <w:lang w:eastAsia="cs-CZ"/>
           </w:rPr>
-          <w:t>2.2.5 Paralelní matice</w:t>
+          <w:t>2.2.3 Paralelní tenzor</w:t>
         </w:r>
         <w:r>
           <w:rPr>
@@ -3461,7 +3459,7 @@
             <w:noProof/>
             <w:webHidden/>
           </w:rPr>
-          <w:instrText xml:space="preserve"> PAGEREF _Toc227276693 \h </w:instrText>
+          <w:instrText xml:space="preserve"> PAGEREF _Toc227520790 \h </w:instrText>
         </w:r>
         <w:r>
           <w:rPr>
@@ -3481,7 +3479,7 @@
             <w:noProof/>
             <w:webHidden/>
           </w:rPr>
-          <w:t>14</w:t>
+          <w:t>16</w:t>
         </w:r>
         <w:r>
           <w:rPr>
@@ -3507,14 +3505,14 @@
           <w14:ligatures w14:val="standardContextual"/>
         </w:rPr>
       </w:pPr>
-      <w:hyperlink w:anchor="_Toc227276694" w:history="1">
+      <w:hyperlink w:anchor="_Toc227520791" w:history="1">
         <w:r>
           <w:rPr>
             <w:rStyle w:val="Hypertextovodkaz"/>
             <w:noProof/>
             <w:lang w:eastAsia="cs-CZ"/>
           </w:rPr>
-          <w:t>2.2.6 N-nární strom</w:t>
+          <w:t>2.2.4 Matice</w:t>
         </w:r>
         <w:r>
           <w:rPr>
@@ -3535,7 +3533,7 @@
             <w:noProof/>
             <w:webHidden/>
           </w:rPr>
-          <w:instrText xml:space="preserve"> PAGEREF _Toc227276694 \h </w:instrText>
+          <w:instrText xml:space="preserve"> PAGEREF _Toc227520791 \h </w:instrText>
         </w:r>
         <w:r>
           <w:rPr>
@@ -3555,78 +3553,7 @@
             <w:noProof/>
             <w:webHidden/>
           </w:rPr>
-          <w:t>14</w:t>
-        </w:r>
-        <w:r>
-          <w:rPr>
-            <w:noProof/>
-            <w:webHidden/>
-          </w:rPr>
-          <w:fldChar w:fldCharType="end"/>
-        </w:r>
-      </w:hyperlink>
-    </w:p>
-    <w:p>
-      <w:pPr>
-        <w:pStyle w:val="Obsah2"/>
-        <w:rPr>
-          <w:rFonts w:asciiTheme="minorHAnsi" w:eastAsiaTheme="minorEastAsia" w:hAnsiTheme="minorHAnsi" w:cstheme="minorBidi"/>
-          <w:noProof/>
-          <w:kern w:val="2"/>
-          <w:szCs w:val="24"/>
-          <w:lang/>
-          <w14:ligatures w14:val="standardContextual"/>
-        </w:rPr>
-      </w:pPr>
-      <w:hyperlink w:anchor="_Toc227276695" w:history="1">
-        <w:r>
-          <w:rPr>
-            <w:rStyle w:val="Hypertextovodkaz"/>
-            <w:noProof/>
-            <w:lang w:eastAsia="cs-CZ"/>
-          </w:rPr>
-          <w:t>2.3 Testy</w:t>
-        </w:r>
-        <w:r>
-          <w:rPr>
-            <w:noProof/>
-            <w:webHidden/>
-          </w:rPr>
-          <w:tab/>
-        </w:r>
-        <w:r>
-          <w:rPr>
-            <w:noProof/>
-            <w:webHidden/>
-          </w:rPr>
-          <w:fldChar w:fldCharType="begin"/>
-        </w:r>
-        <w:r>
-          <w:rPr>
-            <w:noProof/>
-            <w:webHidden/>
-          </w:rPr>
-          <w:instrText xml:space="preserve"> PAGEREF _Toc227276695 \h </w:instrText>
-        </w:r>
-        <w:r>
-          <w:rPr>
-            <w:noProof/>
-            <w:webHidden/>
-          </w:rPr>
-        </w:r>
-        <w:r>
-          <w:rPr>
-            <w:noProof/>
-            <w:webHidden/>
-          </w:rPr>
-          <w:fldChar w:fldCharType="separate"/>
-        </w:r>
-        <w:r>
-          <w:rPr>
-            <w:noProof/>
-            <w:webHidden/>
-          </w:rPr>
-          <w:t>14</w:t>
+          <w:t>16</w:t>
         </w:r>
         <w:r>
           <w:rPr>
@@ -3652,14 +3579,14 @@
           <w14:ligatures w14:val="standardContextual"/>
         </w:rPr>
       </w:pPr>
-      <w:hyperlink w:anchor="_Toc227276696" w:history="1">
+      <w:hyperlink w:anchor="_Toc227520792" w:history="1">
         <w:r>
           <w:rPr>
             <w:rStyle w:val="Hypertextovodkaz"/>
             <w:noProof/>
             <w:lang w:eastAsia="cs-CZ"/>
           </w:rPr>
-          <w:t>2.3.1 Unit testování</w:t>
+          <w:t>2.2.5 Paralelní matice</w:t>
         </w:r>
         <w:r>
           <w:rPr>
@@ -3680,7 +3607,7 @@
             <w:noProof/>
             <w:webHidden/>
           </w:rPr>
-          <w:instrText xml:space="preserve"> PAGEREF _Toc227276696 \h </w:instrText>
+          <w:instrText xml:space="preserve"> PAGEREF _Toc227520792 \h </w:instrText>
         </w:r>
         <w:r>
           <w:rPr>
@@ -3700,7 +3627,7 @@
             <w:noProof/>
             <w:webHidden/>
           </w:rPr>
-          <w:t>14</w:t>
+          <w:t>16</w:t>
         </w:r>
         <w:r>
           <w:rPr>
@@ -3726,13 +3653,232 @@
           <w14:ligatures w14:val="standardContextual"/>
         </w:rPr>
       </w:pPr>
-      <w:hyperlink w:anchor="_Toc227276697" w:history="1">
+      <w:hyperlink w:anchor="_Toc227520793" w:history="1">
         <w:r>
           <w:rPr>
             <w:rStyle w:val="Hypertextovodkaz"/>
             <w:noProof/>
             <w:lang w:eastAsia="cs-CZ"/>
           </w:rPr>
+          <w:t>2.2.6 N-nární strom</w:t>
+        </w:r>
+        <w:r>
+          <w:rPr>
+            <w:noProof/>
+            <w:webHidden/>
+          </w:rPr>
+          <w:tab/>
+        </w:r>
+        <w:r>
+          <w:rPr>
+            <w:noProof/>
+            <w:webHidden/>
+          </w:rPr>
+          <w:fldChar w:fldCharType="begin"/>
+        </w:r>
+        <w:r>
+          <w:rPr>
+            <w:noProof/>
+            <w:webHidden/>
+          </w:rPr>
+          <w:instrText xml:space="preserve"> PAGEREF _Toc227520793 \h </w:instrText>
+        </w:r>
+        <w:r>
+          <w:rPr>
+            <w:noProof/>
+            <w:webHidden/>
+          </w:rPr>
+        </w:r>
+        <w:r>
+          <w:rPr>
+            <w:noProof/>
+            <w:webHidden/>
+          </w:rPr>
+          <w:fldChar w:fldCharType="separate"/>
+        </w:r>
+        <w:r>
+          <w:rPr>
+            <w:noProof/>
+            <w:webHidden/>
+          </w:rPr>
+          <w:t>16</w:t>
+        </w:r>
+        <w:r>
+          <w:rPr>
+            <w:noProof/>
+            <w:webHidden/>
+          </w:rPr>
+          <w:fldChar w:fldCharType="end"/>
+        </w:r>
+      </w:hyperlink>
+    </w:p>
+    <w:p>
+      <w:pPr>
+        <w:pStyle w:val="Obsah2"/>
+        <w:rPr>
+          <w:rFonts w:asciiTheme="minorHAnsi" w:eastAsiaTheme="minorEastAsia" w:hAnsiTheme="minorHAnsi" w:cstheme="minorBidi"/>
+          <w:noProof/>
+          <w:kern w:val="2"/>
+          <w:szCs w:val="24"/>
+          <w:lang/>
+          <w14:ligatures w14:val="standardContextual"/>
+        </w:rPr>
+      </w:pPr>
+      <w:hyperlink w:anchor="_Toc227520794" w:history="1">
+        <w:r>
+          <w:rPr>
+            <w:rStyle w:val="Hypertextovodkaz"/>
+            <w:noProof/>
+            <w:lang w:eastAsia="cs-CZ"/>
+          </w:rPr>
+          <w:t>2.3 Testy</w:t>
+        </w:r>
+        <w:r>
+          <w:rPr>
+            <w:noProof/>
+            <w:webHidden/>
+          </w:rPr>
+          <w:tab/>
+        </w:r>
+        <w:r>
+          <w:rPr>
+            <w:noProof/>
+            <w:webHidden/>
+          </w:rPr>
+          <w:fldChar w:fldCharType="begin"/>
+        </w:r>
+        <w:r>
+          <w:rPr>
+            <w:noProof/>
+            <w:webHidden/>
+          </w:rPr>
+          <w:instrText xml:space="preserve"> PAGEREF _Toc227520794 \h </w:instrText>
+        </w:r>
+        <w:r>
+          <w:rPr>
+            <w:noProof/>
+            <w:webHidden/>
+          </w:rPr>
+        </w:r>
+        <w:r>
+          <w:rPr>
+            <w:noProof/>
+            <w:webHidden/>
+          </w:rPr>
+          <w:fldChar w:fldCharType="separate"/>
+        </w:r>
+        <w:r>
+          <w:rPr>
+            <w:noProof/>
+            <w:webHidden/>
+          </w:rPr>
+          <w:t>16</w:t>
+        </w:r>
+        <w:r>
+          <w:rPr>
+            <w:noProof/>
+            <w:webHidden/>
+          </w:rPr>
+          <w:fldChar w:fldCharType="end"/>
+        </w:r>
+      </w:hyperlink>
+    </w:p>
+    <w:p>
+      <w:pPr>
+        <w:pStyle w:val="Obsah3"/>
+        <w:tabs>
+          <w:tab w:val="right" w:leader="dot" w:pos="9060"/>
+        </w:tabs>
+        <w:rPr>
+          <w:rFonts w:asciiTheme="minorHAnsi" w:eastAsiaTheme="minorEastAsia" w:hAnsiTheme="minorHAnsi" w:cstheme="minorBidi"/>
+          <w:noProof/>
+          <w:kern w:val="2"/>
+          <w:szCs w:val="24"/>
+          <w:lang/>
+          <w14:ligatures w14:val="standardContextual"/>
+        </w:rPr>
+      </w:pPr>
+      <w:hyperlink w:anchor="_Toc227520795" w:history="1">
+        <w:r>
+          <w:rPr>
+            <w:rStyle w:val="Hypertextovodkaz"/>
+            <w:noProof/>
+            <w:lang w:eastAsia="cs-CZ"/>
+          </w:rPr>
+          <w:t>2.3.1 Unit testování</w:t>
+        </w:r>
+        <w:r>
+          <w:rPr>
+            <w:noProof/>
+            <w:webHidden/>
+          </w:rPr>
+          <w:tab/>
+        </w:r>
+        <w:r>
+          <w:rPr>
+            <w:noProof/>
+            <w:webHidden/>
+          </w:rPr>
+          <w:fldChar w:fldCharType="begin"/>
+        </w:r>
+        <w:r>
+          <w:rPr>
+            <w:noProof/>
+            <w:webHidden/>
+          </w:rPr>
+          <w:instrText xml:space="preserve"> PAGEREF _Toc227520795 \h </w:instrText>
+        </w:r>
+        <w:r>
+          <w:rPr>
+            <w:noProof/>
+            <w:webHidden/>
+          </w:rPr>
+        </w:r>
+        <w:r>
+          <w:rPr>
+            <w:noProof/>
+            <w:webHidden/>
+          </w:rPr>
+          <w:fldChar w:fldCharType="separate"/>
+        </w:r>
+        <w:r>
+          <w:rPr>
+            <w:noProof/>
+            <w:webHidden/>
+          </w:rPr>
+          <w:t>16</w:t>
+        </w:r>
+        <w:r>
+          <w:rPr>
+            <w:noProof/>
+            <w:webHidden/>
+          </w:rPr>
+          <w:fldChar w:fldCharType="end"/>
+        </w:r>
+      </w:hyperlink>
+    </w:p>
+    <w:p>
+      <w:pPr>
+        <w:pStyle w:val="Obsah3"/>
+        <w:tabs>
+          <w:tab w:val="right" w:leader="dot" w:pos="9060"/>
+        </w:tabs>
+        <w:rPr>
+          <w:rFonts w:asciiTheme="minorHAnsi" w:eastAsiaTheme="minorEastAsia" w:hAnsiTheme="minorHAnsi" w:cstheme="minorBidi"/>
+          <w:noProof/>
+          <w:kern w:val="2"/>
+          <w:szCs w:val="24"/>
+          <w:lang/>
+          <w14:ligatures w14:val="standardContextual"/>
+        </w:rPr>
+      </w:pPr>
+      <w:hyperlink w:anchor="_Toc227520796" w:history="1">
+        <w:r>
+          <w:rPr>
+            <w:rStyle w:val="Hypertextovodkaz"/>
+            <w:noProof/>
+            <w:lang w:eastAsia="cs-CZ"/>
+          </w:rPr>
           <w:t>2.3.2 Zátěžové testování</w:t>
         </w:r>
         <w:r>
@@ -3754,7 +3900,7 @@
             <w:noProof/>
             <w:webHidden/>
           </w:rPr>
-          <w:instrText xml:space="preserve"> PAGEREF _Toc227276697 \h </w:instrText>
+          <w:instrText xml:space="preserve"> PAGEREF _Toc227520796 \h </w:instrText>
         </w:r>
         <w:r>
           <w:rPr>
@@ -3774,7 +3920,7 @@
             <w:noProof/>
             <w:webHidden/>
           </w:rPr>
-          <w:t>14</w:t>
+          <w:t>16</w:t>
         </w:r>
         <w:r>
           <w:rPr>
@@ -3800,13 +3946,13 @@
           <w14:ligatures w14:val="standardContextual"/>
         </w:rPr>
       </w:pPr>
-      <w:hyperlink w:anchor="_Toc227276698" w:history="1">
+      <w:hyperlink w:anchor="_Toc227520797" w:history="1">
         <w:r>
           <w:rPr>
             <w:rStyle w:val="Hypertextovodkaz"/>
             <w:noProof/>
           </w:rPr>
-          <w:t>ZÁVĚR</w:t>
+          <w:t>3 TEORETICKÉ VYUŽITÍ</w:t>
         </w:r>
         <w:r>
           <w:rPr>
@@ -3827,7 +3973,7 @@
             <w:noProof/>
             <w:webHidden/>
           </w:rPr>
-          <w:instrText xml:space="preserve"> PAGEREF _Toc227276698 \h </w:instrText>
+          <w:instrText xml:space="preserve"> PAGEREF _Toc227520797 \h </w:instrText>
         </w:r>
         <w:r>
           <w:rPr>
@@ -3847,7 +3993,7 @@
             <w:noProof/>
             <w:webHidden/>
           </w:rPr>
-          <w:t>16</w:t>
+          <w:t>17</w:t>
         </w:r>
         <w:r>
           <w:rPr>
@@ -3873,13 +4019,13 @@
           <w14:ligatures w14:val="standardContextual"/>
         </w:rPr>
       </w:pPr>
-      <w:hyperlink w:anchor="_Toc227276699" w:history="1">
+      <w:hyperlink w:anchor="_Toc227520798" w:history="1">
         <w:r>
           <w:rPr>
             <w:rStyle w:val="Hypertextovodkaz"/>
             <w:noProof/>
           </w:rPr>
-          <w:t>POUŽITÁ LITERATURA</w:t>
+          <w:t>ZÁVĚR</w:t>
         </w:r>
         <w:r>
           <w:rPr>
@@ -3900,7 +4046,7 @@
             <w:noProof/>
             <w:webHidden/>
           </w:rPr>
-          <w:instrText xml:space="preserve"> PAGEREF _Toc227276699 \h </w:instrText>
+          <w:instrText xml:space="preserve"> PAGEREF _Toc227520798 \h </w:instrText>
         </w:r>
         <w:r>
           <w:rPr>
@@ -3920,7 +4066,7 @@
             <w:noProof/>
             <w:webHidden/>
           </w:rPr>
-          <w:t>17</w:t>
+          <w:t>19</w:t>
         </w:r>
         <w:r>
           <w:rPr>
@@ -3946,12 +4092,85 @@
           <w14:ligatures w14:val="standardContextual"/>
         </w:rPr>
       </w:pPr>
-      <w:hyperlink w:anchor="_Toc227276700" w:history="1">
+      <w:hyperlink w:anchor="_Toc227520799" w:history="1">
         <w:r>
           <w:rPr>
             <w:rStyle w:val="Hypertextovodkaz"/>
             <w:noProof/>
           </w:rPr>
+          <w:t>POUŽITÁ LITERATURA</w:t>
+        </w:r>
+        <w:r>
+          <w:rPr>
+            <w:noProof/>
+            <w:webHidden/>
+          </w:rPr>
+          <w:tab/>
+        </w:r>
+        <w:r>
+          <w:rPr>
+            <w:noProof/>
+            <w:webHidden/>
+          </w:rPr>
+          <w:fldChar w:fldCharType="begin"/>
+        </w:r>
+        <w:r>
+          <w:rPr>
+            <w:noProof/>
+            <w:webHidden/>
+          </w:rPr>
+          <w:instrText xml:space="preserve"> PAGEREF _Toc227520799 \h </w:instrText>
+        </w:r>
+        <w:r>
+          <w:rPr>
+            <w:noProof/>
+            <w:webHidden/>
+          </w:rPr>
+        </w:r>
+        <w:r>
+          <w:rPr>
+            <w:noProof/>
+            <w:webHidden/>
+          </w:rPr>
+          <w:fldChar w:fldCharType="separate"/>
+        </w:r>
+        <w:r>
+          <w:rPr>
+            <w:noProof/>
+            <w:webHidden/>
+          </w:rPr>
+          <w:t>20</w:t>
+        </w:r>
+        <w:r>
+          <w:rPr>
+            <w:noProof/>
+            <w:webHidden/>
+          </w:rPr>
+          <w:fldChar w:fldCharType="end"/>
+        </w:r>
+      </w:hyperlink>
+    </w:p>
+    <w:p>
+      <w:pPr>
+        <w:pStyle w:val="Obsah1"/>
+        <w:tabs>
+          <w:tab w:val="right" w:leader="dot" w:pos="9060"/>
+        </w:tabs>
+        <w:rPr>
+          <w:rFonts w:asciiTheme="minorHAnsi" w:eastAsiaTheme="minorEastAsia" w:hAnsiTheme="minorHAnsi" w:cstheme="minorBidi"/>
+          <w:noProof/>
+          <w:kern w:val="2"/>
+          <w:szCs w:val="24"/>
+          <w:lang/>
+          <w14:ligatures w14:val="standardContextual"/>
+        </w:rPr>
+      </w:pPr>
+      <w:hyperlink w:anchor="_Toc227520800" w:history="1">
+        <w:r>
+          <w:rPr>
+            <w:rStyle w:val="Hypertextovodkaz"/>
+            <w:noProof/>
+          </w:rPr>
           <w:t>SEZNAM PŘÍLOH</w:t>
         </w:r>
         <w:r>
@@ -3973,7 +4192,7 @@
             <w:noProof/>
             <w:webHidden/>
           </w:rPr>
-          <w:instrText xml:space="preserve"> PAGEREF _Toc227276700 \h </w:instrText>
+          <w:instrText xml:space="preserve"> PAGEREF _Toc227520800 \h </w:instrText>
         </w:r>
         <w:r>
           <w:rPr>
@@ -3993,7 +4212,7 @@
             <w:noProof/>
             <w:webHidden/>
           </w:rPr>
-          <w:t>18</w:t>
+          <w:t>21</w:t>
         </w:r>
         <w:r>
           <w:rPr>
@@ -4034,7 +4253,7 @@
       <w:pPr>
         <w:pStyle w:val="Nadpis1"/>
       </w:pPr>
-      <w:bookmarkStart w:id="0" w:name="_Toc227276680"/>
+      <w:bookmarkStart w:id="0" w:name="_Toc227520777"/>
       <w:r>
         <w:rPr>
           <w:shd w:val="clear" w:color="auto" w:fill="FFFFFF"/>
@@ -4228,7 +4447,6 @@
           <w:noProof/>
           <w:kern w:val="2"/>
           <w:szCs w:val="24"/>
-          <w:lang/>
           <w14:ligatures w14:val="standardContextual"/>
         </w:rPr>
       </w:pPr>
@@ -4335,7 +4553,7 @@
           <w:shd w:val="clear" w:color="auto" w:fill="FFFFFF"/>
         </w:rPr>
       </w:pPr>
-      <w:bookmarkStart w:id="1" w:name="_Toc227276681"/>
+      <w:bookmarkStart w:id="1" w:name="_Toc227520778"/>
       <w:r>
         <w:rPr>
           <w:shd w:val="clear" w:color="auto" w:fill="FFFFFF"/>
@@ -4385,7 +4603,7 @@
           <w:shd w:val="clear" w:color="auto" w:fill="FFFFFF"/>
         </w:rPr>
       </w:pPr>
-      <w:bookmarkStart w:id="2" w:name="_Toc227276682"/>
+      <w:bookmarkStart w:id="2" w:name="_Toc227520779"/>
       <w:r>
         <w:rPr>
           <w:shd w:val="clear" w:color="auto" w:fill="FFFFFF"/>
@@ -4396,6 +4614,89 @@
       <w:bookmarkEnd w:id="2"/>
     </w:p>
     <w:p/>
+    <w:p>
+      <w:pPr>
+        <w:rPr>
+          <w:color w:val="000000"/>
+          <w:szCs w:val="24"/>
+          <w:shd w:val="clear" w:color="auto" w:fill="FFFFFF"/>
+        </w:rPr>
+      </w:pPr>
+      <w:r>
+        <w:rPr>
+          <w:b/>
+          <w:bCs/>
+          <w:color w:val="000000"/>
+          <w:szCs w:val="24"/>
+          <w:shd w:val="clear" w:color="auto" w:fill="FFFFFF"/>
+        </w:rPr>
+        <w:t>Index</w:t>
+      </w:r>
+      <w:r>
+        <w:rPr>
+          <w:color w:val="000000"/>
+          <w:szCs w:val="24"/>
+          <w:shd w:val="clear" w:color="auto" w:fill="FFFFFF"/>
+        </w:rPr>
+        <w:t xml:space="preserve"> </w:t>
+      </w:r>
+      <w:r>
+        <w:rPr>
+          <w:color w:val="000000"/>
+          <w:szCs w:val="24"/>
+          <w:shd w:val="clear" w:color="auto" w:fill="FFFFFF"/>
+        </w:rPr>
+        <w:t xml:space="preserve">– </w:t>
+      </w:r>
+      <w:r>
+        <w:rPr>
+          <w:color w:val="000000"/>
+          <w:szCs w:val="24"/>
+          <w:shd w:val="clear" w:color="auto" w:fill="FFFFFF"/>
+        </w:rPr>
+        <w:t>pokud</w:t>
+      </w:r>
+      <w:r>
+        <w:rPr>
+          <w:color w:val="000000"/>
+          <w:szCs w:val="24"/>
+          <w:shd w:val="clear" w:color="auto" w:fill="FFFFFF"/>
+        </w:rPr>
+        <w:t xml:space="preserve"> </w:t>
+      </w:r>
+      <w:r>
+        <w:rPr>
+          <w:color w:val="000000"/>
+          <w:szCs w:val="24"/>
+          <w:shd w:val="clear" w:color="auto" w:fill="FFFFFF"/>
+        </w:rPr>
+        <w:t xml:space="preserve">není řečeno jinak, tak </w:t>
+      </w:r>
+      <w:r>
+        <w:rPr>
+          <w:color w:val="000000"/>
+          <w:szCs w:val="24"/>
+          <w:shd w:val="clear" w:color="auto" w:fill="FFFFFF"/>
+        </w:rPr>
+        <w:t>indexem se v tomto kontextu myslí celočíselná hodnota určující částečně či definitivně pozici prvku v</w:t>
+      </w:r>
+      <w:r>
+        <w:rPr>
+          <w:color w:val="000000"/>
+          <w:szCs w:val="24"/>
+          <w:shd w:val="clear" w:color="auto" w:fill="FFFFFF"/>
+        </w:rPr>
+        <w:t xml:space="preserve"> </w:t>
+      </w:r>
+      <w:r>
+        <w:rPr>
+          <w:color w:val="000000"/>
+          <w:szCs w:val="24"/>
+          <w:shd w:val="clear" w:color="auto" w:fill="FFFFFF"/>
+        </w:rPr>
+        <w:t>kolekci.</w:t>
+      </w:r>
+    </w:p>
     <w:p>
       <w:pPr>
         <w:rPr>
@@ -4410,6 +4711,7 @@
           <w:docGrid w:linePitch="360"/>
         </w:sectPr>
       </w:pPr>
+      <w:proofErr w:type="spellStart"/>
       <w:r>
         <w:rPr>
           <w:b/>
@@ -4418,7 +4720,24 @@
           <w:szCs w:val="24"/>
           <w:shd w:val="clear" w:color="auto" w:fill="FFFFFF"/>
         </w:rPr>
-        <w:t>Index</w:t>
+        <w:t>Overhead</w:t>
+      </w:r>
+      <w:proofErr w:type="spellEnd"/>
+      <w:r>
+        <w:rPr>
+          <w:color w:val="000000"/>
+          <w:szCs w:val="24"/>
+          <w:shd w:val="clear" w:color="auto" w:fill="FFFFFF"/>
+        </w:rPr>
+        <w:t xml:space="preserve"> – </w:t>
+      </w:r>
+      <w:r>
+        <w:rPr>
+          <w:color w:val="000000"/>
+          <w:szCs w:val="24"/>
+          <w:shd w:val="clear" w:color="auto" w:fill="FFFFFF"/>
+        </w:rPr>
+        <w:t>více práce programu oproti jinému v</w:t>
       </w:r>
       <w:r>
         <w:rPr>
@@ -4428,46 +4747,20 @@
         </w:rPr>
         <w:t xml:space="preserve"> </w:t>
       </w:r>
-      <w:proofErr w:type="gramStart"/>
-      <w:r>
-        <w:rPr>
-          <w:color w:val="000000"/>
-          <w:szCs w:val="24"/>
-          <w:shd w:val="clear" w:color="auto" w:fill="FFFFFF"/>
-        </w:rPr>
-        <w:t xml:space="preserve">-  </w:t>
-      </w:r>
-      <w:r>
-        <w:rPr>
-          <w:color w:val="000000"/>
-          <w:szCs w:val="24"/>
-          <w:shd w:val="clear" w:color="auto" w:fill="FFFFFF"/>
-        </w:rPr>
-        <w:t>pokud</w:t>
-      </w:r>
-      <w:proofErr w:type="gramEnd"/>
-      <w:r>
-        <w:rPr>
-          <w:color w:val="000000"/>
-          <w:szCs w:val="24"/>
-          <w:shd w:val="clear" w:color="auto" w:fill="FFFFFF"/>
-        </w:rPr>
-        <w:t xml:space="preserve"> není řečeno jinak, tak </w:t>
-      </w:r>
-      <w:r>
-        <w:rPr>
-          <w:color w:val="000000"/>
-          <w:szCs w:val="24"/>
-          <w:shd w:val="clear" w:color="auto" w:fill="FFFFFF"/>
-        </w:rPr>
-        <w:t>indexem se v tomto kontextu myslí celočíselná hodnota určující částečně či definitivně pozici prvku v kolekci.</w:t>
+      <w:r>
+        <w:rPr>
+          <w:color w:val="000000"/>
+          <w:szCs w:val="24"/>
+          <w:shd w:val="clear" w:color="auto" w:fill="FFFFFF"/>
+        </w:rPr>
+        <w:t>oblasti režie.</w:t>
       </w:r>
     </w:p>
     <w:p>
       <w:pPr>
         <w:pStyle w:val="Nadpis1"/>
       </w:pPr>
-      <w:bookmarkStart w:id="3" w:name="_Toc227276683"/>
+      <w:bookmarkStart w:id="3" w:name="_Toc227520780"/>
       <w:r>
         <w:lastRenderedPageBreak/>
         <w:t>ÚVOD</w:t>
@@ -4708,7 +5001,7 @@
       <w:r>
         <w:br w:type="page"/>
       </w:r>
-      <w:bookmarkStart w:id="4" w:name="_Toc227276684"/>
+      <w:bookmarkStart w:id="4" w:name="_Toc227520781"/>
       <w:r>
         <w:lastRenderedPageBreak/>
         <w:t>1</w:t>
@@ -4909,7 +5202,7 @@
         <w:pStyle w:val="Nadpis2"/>
         <w:jc w:val="both"/>
       </w:pPr>
-      <w:bookmarkStart w:id="5" w:name="_Toc227276685"/>
+      <w:bookmarkStart w:id="5" w:name="_Toc227520782"/>
       <w:r>
         <w:t xml:space="preserve">1.1 </w:t>
       </w:r>
@@ -5182,7 +5475,7 @@
       <w:r>
         <w:br w:type="page"/>
       </w:r>
-      <w:bookmarkStart w:id="6" w:name="_Toc227276686"/>
+      <w:bookmarkStart w:id="6" w:name="_Toc227520783"/>
       <w:r>
         <w:lastRenderedPageBreak/>
         <w:t>2</w:t>
@@ -5277,13 +5570,16 @@
       <w:pPr>
         <w:pStyle w:val="Nadpis2"/>
       </w:pPr>
-      <w:bookmarkStart w:id="7" w:name="_Toc227276687"/>
+      <w:bookmarkStart w:id="7" w:name="_Toc227520784"/>
       <w:r>
         <w:t>2.1 Použité nástroje</w:t>
       </w:r>
       <w:bookmarkEnd w:id="7"/>
     </w:p>
     <w:p>
+      <w:pPr>
+        <w:spacing w:line="360" w:lineRule="auto"/>
+      </w:pPr>
       <w:r>
         <w:t>Jak již napovídá název práce, tak je knihovna napsaná v jazyce C++</w:t>
       </w:r>
@@ -5298,6 +5594,7 @@
       <w:pPr>
         <w:pStyle w:val="Nadpis3"/>
       </w:pPr>
+      <w:bookmarkStart w:id="8" w:name="_Toc227520785"/>
       <w:r>
         <w:t xml:space="preserve">2.1.1 </w:t>
       </w:r>
@@ -5305,9 +5602,13 @@
       <w:r>
         <w:t>AdaptiveCpp</w:t>
       </w:r>
-      <w:proofErr w:type="spellEnd"/>
-    </w:p>
-    <w:p>
+      <w:bookmarkEnd w:id="8"/>
+      <w:proofErr w:type="spellEnd"/>
+    </w:p>
+    <w:p>
+      <w:pPr>
+        <w:spacing w:line="360" w:lineRule="auto"/>
+      </w:pPr>
       <w:r>
         <w:t xml:space="preserve">Zajímavější je použitá knihovna </w:t>
       </w:r>
@@ -5334,15 +5635,13 @@
         <w:t>)</w:t>
       </w:r>
       <w:r>
-        <w:t xml:space="preserve">, jejíž hlavní misí je implementace </w:t>
-      </w:r>
-      <w:proofErr w:type="spellStart"/>
-      <w:r>
-        <w:t>stadartu</w:t>
-      </w:r>
-      <w:proofErr w:type="spellEnd"/>
-      <w:r>
-        <w:t xml:space="preserve"> SYCL (</w:t>
+        <w:t>, jejíž hlavní misí je implementace sta</w:t>
+      </w:r>
+      <w:r>
+        <w:t>n</w:t>
+      </w:r>
+      <w:r>
+        <w:t>dartu SYCL (</w:t>
       </w:r>
       <w:hyperlink r:id="rId15" w:history="1">
         <w:r>
@@ -5374,12 +5673,118 @@
       <w:r>
         <w:t>.</w:t>
       </w:r>
+      <w:r>
+        <w:t xml:space="preserve"> SYCL standard definuje abstrakce pro umožnění heterogenního programování. To má umožnit použití více druhů výpočetních zařízení v jedné aplikaci. Například použití CPU (s možností jednoduché paralelizace), GPU a </w:t>
+      </w:r>
+      <w:proofErr w:type="spellStart"/>
+      <w:proofErr w:type="gramStart"/>
+      <w:r>
+        <w:t>podobně.</w:t>
+      </w:r>
+      <w:r>
+        <w:t>AdaptiveCpp</w:t>
+      </w:r>
+      <w:proofErr w:type="spellEnd"/>
+      <w:proofErr w:type="gramEnd"/>
+      <w:r>
+        <w:t xml:space="preserve"> </w:t>
+      </w:r>
+      <w:r>
+        <w:t>funguje jako abstrakční vrstva</w:t>
+      </w:r>
+      <w:r>
+        <w:t>,</w:t>
+      </w:r>
+      <w:r>
+        <w:t xml:space="preserve"> co umí využít více různých </w:t>
+      </w:r>
+      <w:proofErr w:type="spellStart"/>
+      <w:r>
+        <w:t>backendů</w:t>
+      </w:r>
+      <w:proofErr w:type="spellEnd"/>
+      <w:r>
+        <w:t xml:space="preserve">: CUDA pro grafické karty od společnosti NVIDIA, </w:t>
+      </w:r>
+      <w:proofErr w:type="spellStart"/>
+      <w:r>
+        <w:t>ROCm</w:t>
+      </w:r>
+      <w:proofErr w:type="spellEnd"/>
+      <w:r>
+        <w:t xml:space="preserve">/HIP pro grafické karty od AMD či </w:t>
+      </w:r>
+      <w:proofErr w:type="spellStart"/>
+      <w:r>
+        <w:t>OpenMD</w:t>
+      </w:r>
+      <w:proofErr w:type="spellEnd"/>
+      <w:r>
+        <w:t xml:space="preserve"> používající CPU (a tím pádem často používaný jako </w:t>
+      </w:r>
+      <w:proofErr w:type="spellStart"/>
+      <w:r>
+        <w:t>fallback</w:t>
+      </w:r>
+      <w:proofErr w:type="spellEnd"/>
+      <w:r>
+        <w:t>).</w:t>
+      </w:r>
+      <w:r>
+        <w:t xml:space="preserve"> Funguje tak že, vezme SYCL kód, oddělí ho na host kód pro běh na CPU a kód pro zařízení, který je poté převeden kód používaného </w:t>
+      </w:r>
+      <w:proofErr w:type="spellStart"/>
+      <w:r>
+        <w:t>backendu</w:t>
+      </w:r>
+      <w:proofErr w:type="spellEnd"/>
+      <w:r>
+        <w:t>.</w:t>
+      </w:r>
+    </w:p>
+    <w:p>
+      <w:pPr>
+        <w:pStyle w:val="Nadpis3"/>
+      </w:pPr>
+      <w:bookmarkStart w:id="9" w:name="_Toc227520786"/>
+      <w:r>
+        <w:t>2.1.2 Google test</w:t>
+      </w:r>
+      <w:bookmarkEnd w:id="9"/>
+    </w:p>
+    <w:p>
+      <w:r>
+        <w:t xml:space="preserve">Pro testování byl vybrán </w:t>
+      </w:r>
+      <w:r>
+        <w:t xml:space="preserve">framework </w:t>
+      </w:r>
+      <w:proofErr w:type="spellStart"/>
+      <w:r>
+        <w:t>Google</w:t>
+      </w:r>
+      <w:r>
+        <w:t>T</w:t>
+      </w:r>
+      <w:r>
+        <w:t>est</w:t>
+      </w:r>
+      <w:proofErr w:type="spellEnd"/>
+      <w:r>
+        <w:t>.</w:t>
+      </w:r>
+      <w:r>
+        <w:t xml:space="preserve"> Je vhodný díky své jednoduchosti použití a integrace to projektu.</w:t>
+      </w:r>
+      <w:r>
+        <w:t xml:space="preserve"> Umí rozdělovat testy do skupin, a také měřit čas vykonání testu, čímž je vhodný i pro zátěžové testování.</w:t>
+      </w:r>
     </w:p>
     <w:p>
       <w:pPr>
         <w:pStyle w:val="Nadpis2"/>
       </w:pPr>
-      <w:bookmarkStart w:id="8" w:name="_Toc227276688"/>
+      <w:bookmarkStart w:id="10" w:name="_Toc227520787"/>
       <w:r>
         <w:t>2.</w:t>
       </w:r>
@@ -5389,14 +5794,15 @@
       <w:r>
         <w:t xml:space="preserve"> Komponenty</w:t>
       </w:r>
-      <w:bookmarkEnd w:id="8"/>
-    </w:p>
-    <w:p>
-      <w:proofErr w:type="spellStart"/>
-      <w:r>
-        <w:t>Xxx</w:t>
-      </w:r>
-      <w:proofErr w:type="spellEnd"/>
+      <w:bookmarkEnd w:id="10"/>
+    </w:p>
+    <w:p>
+      <w:pPr>
+        <w:spacing w:line="360" w:lineRule="auto"/>
+      </w:pPr>
+      <w:r>
+        <w:t>Práce je a její komponenty jsou ve jmenném prostoru zvaném „gema“. Je to neoficiální název používaný uvnitř projektu.</w:t>
+      </w:r>
     </w:p>
     <w:p>
       <w:pPr>
@@ -5406,7 +5812,7 @@
           <w:lang w:eastAsia="cs-CZ"/>
         </w:rPr>
       </w:pPr>
-      <w:bookmarkStart w:id="9" w:name="_Toc227276689"/>
+      <w:bookmarkStart w:id="11" w:name="_Toc227520788"/>
       <w:r>
         <w:t>2.</w:t>
       </w:r>
@@ -5430,22 +5836,829 @@
         </w:rPr>
         <w:t>Lineární kontejner</w:t>
       </w:r>
-      <w:bookmarkEnd w:id="9"/>
-    </w:p>
-    <w:p>
-      <w:pPr>
-        <w:rPr>
-          <w:lang w:eastAsia="cs-CZ"/>
-        </w:rPr>
-      </w:pPr>
-      <w:proofErr w:type="spellStart"/>
-      <w:r>
-        <w:rPr>
-          <w:lang w:eastAsia="cs-CZ"/>
-        </w:rPr>
-        <w:t>Xxx</w:t>
-      </w:r>
-      <w:proofErr w:type="spellEnd"/>
+      <w:bookmarkEnd w:id="11"/>
+    </w:p>
+    <w:p>
+      <w:pPr>
+        <w:spacing w:line="360" w:lineRule="auto"/>
+        <w:rPr>
+          <w:lang w:eastAsia="cs-CZ"/>
+        </w:rPr>
+      </w:pPr>
+      <w:r>
+        <w:rPr>
+          <w:lang w:eastAsia="cs-CZ"/>
+        </w:rPr>
+        <w:t>V projektu jako třída „</w:t>
+      </w:r>
+      <w:proofErr w:type="spellStart"/>
+      <w:r>
+        <w:rPr>
+          <w:lang w:eastAsia="cs-CZ"/>
+        </w:rPr>
+        <w:t>LinearContainer</w:t>
+      </w:r>
+      <w:proofErr w:type="spellEnd"/>
+      <w:r>
+        <w:rPr>
+          <w:lang w:eastAsia="cs-CZ"/>
+        </w:rPr>
+        <w:t xml:space="preserve">“. </w:t>
+      </w:r>
+      <w:r>
+        <w:rPr>
+          <w:lang w:eastAsia="cs-CZ"/>
+        </w:rPr>
+        <w:t>Jedná se o běžnou implementaci dynamického pole</w:t>
+      </w:r>
+      <w:r>
+        <w:rPr>
+          <w:lang w:eastAsia="cs-CZ"/>
+        </w:rPr>
+        <w:t xml:space="preserve"> souvisle v paměti</w:t>
+      </w:r>
+      <w:r>
+        <w:rPr>
+          <w:lang w:eastAsia="cs-CZ"/>
+        </w:rPr>
+        <w:t xml:space="preserve">. Použit na ukládání dat ve třídě Tensor. </w:t>
+      </w:r>
+      <w:r>
+        <w:rPr>
+          <w:lang w:eastAsia="cs-CZ"/>
+        </w:rPr>
+        <w:t>Používá šablonu (</w:t>
+      </w:r>
+      <w:proofErr w:type="spellStart"/>
+      <w:r>
+        <w:rPr>
+          <w:lang w:eastAsia="cs-CZ"/>
+        </w:rPr>
+        <w:t>template</w:t>
+      </w:r>
+      <w:proofErr w:type="spellEnd"/>
+      <w:r>
+        <w:rPr>
+          <w:lang w:eastAsia="cs-CZ"/>
+        </w:rPr>
+        <w:t xml:space="preserve">) pro možnost uložení libovolného datového typu. </w:t>
+      </w:r>
+      <w:r>
+        <w:rPr>
+          <w:lang w:eastAsia="cs-CZ"/>
+        </w:rPr>
+        <w:t xml:space="preserve">Motivace k jeho implementaci je potřeba kontejneru s rozhraním napodobujícím </w:t>
+      </w:r>
+      <w:proofErr w:type="spellStart"/>
+      <w:proofErr w:type="gramStart"/>
+      <w:r>
+        <w:rPr>
+          <w:lang w:eastAsia="cs-CZ"/>
+        </w:rPr>
+        <w:t>std</w:t>
+      </w:r>
+      <w:proofErr w:type="spellEnd"/>
+      <w:r>
+        <w:rPr>
+          <w:lang w:eastAsia="cs-CZ"/>
+        </w:rPr>
+        <w:t>::</w:t>
+      </w:r>
+      <w:proofErr w:type="spellStart"/>
+      <w:proofErr w:type="gramEnd"/>
+      <w:r>
+        <w:rPr>
+          <w:lang w:eastAsia="cs-CZ"/>
+        </w:rPr>
+        <w:t>vector</w:t>
+      </w:r>
+      <w:proofErr w:type="spellEnd"/>
+      <w:r>
+        <w:rPr>
+          <w:lang w:eastAsia="cs-CZ"/>
+        </w:rPr>
+        <w:t xml:space="preserve">, ale bez nevyhnutelné inicializace paměti. </w:t>
+      </w:r>
+      <w:r>
+        <w:rPr>
+          <w:lang w:eastAsia="cs-CZ"/>
+        </w:rPr>
+        <w:lastRenderedPageBreak/>
+        <w:t>To například vede ke mnohonásobnému zrychlení konstrukce instance tenzoru.</w:t>
+      </w:r>
+      <w:r>
+        <w:rPr>
+          <w:lang w:eastAsia="cs-CZ"/>
+        </w:rPr>
+        <w:t xml:space="preserve"> Uvnitř udržuje ukazatele na konec a začátek pole a také na konec kapacity – neboli celkové alokované paměti.</w:t>
+      </w:r>
+      <w:r>
+        <w:rPr>
+          <w:lang w:eastAsia="cs-CZ"/>
+        </w:rPr>
+        <w:t xml:space="preserve"> </w:t>
+      </w:r>
+    </w:p>
+    <w:p>
+      <w:pPr>
+        <w:spacing w:line="360" w:lineRule="auto"/>
+        <w:rPr>
+          <w:lang w:eastAsia="cs-CZ"/>
+        </w:rPr>
+      </w:pPr>
+      <w:r>
+        <w:rPr>
+          <w:lang w:eastAsia="cs-CZ"/>
+        </w:rPr>
+        <w:t xml:space="preserve">Jak již naznačuje držení kapacity, tak je tento kontejner navržen i na postupné přidávání prvků pomocí metody </w:t>
+      </w:r>
+      <w:proofErr w:type="spellStart"/>
+      <w:r>
+        <w:rPr>
+          <w:lang w:eastAsia="cs-CZ"/>
+        </w:rPr>
+        <w:t>push_back</w:t>
+      </w:r>
+      <w:proofErr w:type="spellEnd"/>
+      <w:r>
+        <w:rPr>
+          <w:lang w:eastAsia="cs-CZ"/>
+        </w:rPr>
+        <w:t xml:space="preserve">, jelikož při překročení kapacity (alokovaného prostoru), dojde k alokaci </w:t>
+      </w:r>
+      <w:r>
+        <w:rPr>
+          <w:lang w:eastAsia="cs-CZ"/>
+        </w:rPr>
+        <w:t>1,5x původní kapacity + konstanta, kterou lze zanedbat pro velké alokace</w:t>
+      </w:r>
+      <w:r>
+        <w:rPr>
+          <w:lang w:eastAsia="cs-CZ"/>
+        </w:rPr>
+        <w:t>.</w:t>
+      </w:r>
+      <w:r>
+        <w:rPr>
+          <w:lang w:eastAsia="cs-CZ"/>
+        </w:rPr>
+        <w:t xml:space="preserve"> </w:t>
+      </w:r>
+      <w:r>
+        <w:rPr>
+          <w:lang w:eastAsia="cs-CZ"/>
+        </w:rPr>
+        <w:t>Konstanta</w:t>
+      </w:r>
+      <w:r>
+        <w:rPr>
+          <w:lang w:eastAsia="cs-CZ"/>
+        </w:rPr>
+        <w:t xml:space="preserve"> řeší jenom případ, kdy je kapacita ještě nulová a tím pádem by jakékoli násobení bylo absorbováno opět na nulu</w:t>
+      </w:r>
+      <w:r>
+        <w:rPr>
+          <w:lang w:eastAsia="cs-CZ"/>
+        </w:rPr>
+        <w:t>.</w:t>
+      </w:r>
+      <w:r>
+        <w:rPr>
+          <w:lang w:eastAsia="cs-CZ"/>
+        </w:rPr>
+        <w:t xml:space="preserve"> Tento přístup tak zajišťuje </w:t>
+      </w:r>
+      <w:r>
+        <w:rPr>
+          <w:lang w:eastAsia="cs-CZ"/>
+        </w:rPr>
+        <w:t>velice rychlé uskutečněn</w:t>
+      </w:r>
+      <w:r>
+        <w:rPr>
+          <w:lang w:eastAsia="cs-CZ"/>
+        </w:rPr>
+        <w:t>í</w:t>
+      </w:r>
+      <w:r>
+        <w:rPr>
+          <w:lang w:eastAsia="cs-CZ"/>
+        </w:rPr>
+        <w:t xml:space="preserve"> větš</w:t>
+      </w:r>
+      <w:r>
+        <w:rPr>
+          <w:lang w:eastAsia="cs-CZ"/>
+        </w:rPr>
+        <w:t>i</w:t>
+      </w:r>
+      <w:r>
+        <w:rPr>
+          <w:lang w:eastAsia="cs-CZ"/>
+        </w:rPr>
+        <w:t>ny</w:t>
+      </w:r>
+      <w:r>
+        <w:rPr>
+          <w:lang w:eastAsia="cs-CZ"/>
+        </w:rPr>
+        <w:t xml:space="preserve"> vkládání.</w:t>
+      </w:r>
+    </w:p>
+    <w:p>
+      <w:pPr>
+        <w:spacing w:line="360" w:lineRule="auto"/>
+        <w:rPr>
+          <w:lang w:eastAsia="cs-CZ"/>
+        </w:rPr>
+      </w:pPr>
+      <w:r>
+        <w:rPr>
+          <w:lang w:eastAsia="cs-CZ"/>
+        </w:rPr>
+        <w:t>Na alokaci byl také vytvořen vlastní alokátor.</w:t>
+      </w:r>
+      <w:r>
+        <w:rPr>
+          <w:lang w:eastAsia="cs-CZ"/>
+        </w:rPr>
+        <w:t xml:space="preserve"> Tento alokátor řeší </w:t>
+      </w:r>
+      <w:proofErr w:type="gramStart"/>
+      <w:r>
+        <w:rPr>
+          <w:lang w:eastAsia="cs-CZ"/>
+        </w:rPr>
+        <w:t>použití ::</w:t>
+      </w:r>
+      <w:proofErr w:type="spellStart"/>
+      <w:r>
+        <w:rPr>
+          <w:lang w:eastAsia="cs-CZ"/>
+        </w:rPr>
+        <w:t>operator</w:t>
+      </w:r>
+      <w:proofErr w:type="spellEnd"/>
+      <w:proofErr w:type="gramEnd"/>
+      <w:r>
+        <w:rPr>
+          <w:lang w:eastAsia="cs-CZ"/>
+        </w:rPr>
+        <w:t xml:space="preserve"> </w:t>
+      </w:r>
+      <w:proofErr w:type="spellStart"/>
+      <w:r>
+        <w:rPr>
+          <w:lang w:eastAsia="cs-CZ"/>
+        </w:rPr>
+        <w:t>new</w:t>
+      </w:r>
+      <w:proofErr w:type="spellEnd"/>
+      <w:r>
+        <w:rPr>
+          <w:lang w:eastAsia="cs-CZ"/>
+        </w:rPr>
+        <w:t xml:space="preserve"> </w:t>
+      </w:r>
+      <w:proofErr w:type="gramStart"/>
+      <w:r>
+        <w:rPr>
+          <w:lang w:eastAsia="cs-CZ"/>
+        </w:rPr>
+        <w:t>a ::</w:t>
+      </w:r>
+      <w:proofErr w:type="spellStart"/>
+      <w:r>
+        <w:rPr>
+          <w:lang w:eastAsia="cs-CZ"/>
+        </w:rPr>
+        <w:t>operator</w:t>
+      </w:r>
+      <w:proofErr w:type="spellEnd"/>
+      <w:proofErr w:type="gramEnd"/>
+      <w:r>
+        <w:rPr>
+          <w:lang w:eastAsia="cs-CZ"/>
+        </w:rPr>
+        <w:t xml:space="preserve"> </w:t>
+      </w:r>
+      <w:proofErr w:type="spellStart"/>
+      <w:r>
+        <w:rPr>
+          <w:lang w:eastAsia="cs-CZ"/>
+        </w:rPr>
+        <w:t>delete</w:t>
+      </w:r>
+      <w:proofErr w:type="spellEnd"/>
+      <w:r>
+        <w:rPr>
+          <w:lang w:eastAsia="cs-CZ"/>
+        </w:rPr>
+        <w:t>, pro získání neinicializované paměti.</w:t>
+      </w:r>
+      <w:r>
+        <w:rPr>
+          <w:lang w:eastAsia="cs-CZ"/>
+        </w:rPr>
+        <w:t xml:space="preserve"> Také se snaží o zarovnání alokace na určitý počet bytů kvůli větší </w:t>
+      </w:r>
+      <w:proofErr w:type="spellStart"/>
+      <w:r>
+        <w:rPr>
+          <w:lang w:eastAsia="cs-CZ"/>
+        </w:rPr>
+        <w:t>cache</w:t>
+      </w:r>
+      <w:proofErr w:type="spellEnd"/>
+      <w:r>
+        <w:rPr>
+          <w:lang w:eastAsia="cs-CZ"/>
+        </w:rPr>
+        <w:t xml:space="preserve"> přívětivosti (která často čte po 64 bytech) a také případným SIMD instrukcím, které kompilátor poté může jednodušeji uplatnit</w:t>
+      </w:r>
+      <w:r>
+        <w:rPr>
+          <w:lang w:eastAsia="cs-CZ"/>
+        </w:rPr>
+        <w:t xml:space="preserve"> (</w:t>
+      </w:r>
+      <w:hyperlink r:id="rId16" w:history="1">
+        <w:r>
+          <w:rPr>
+            <w:rStyle w:val="Hypertextovodkaz"/>
+            <w:lang w:eastAsia="cs-CZ"/>
+          </w:rPr>
+          <w:t>https://www.intel.com/content/www/us/en/content-details/821612/intel-64-and-ia-32-architectures-optimization-reference-manual-volume-1.html</w:t>
+        </w:r>
+      </w:hyperlink>
+      <w:r>
+        <w:rPr>
+          <w:lang w:eastAsia="cs-CZ"/>
+        </w:rPr>
+        <w:t xml:space="preserve"> </w:t>
+      </w:r>
+      <w:r>
+        <w:rPr>
+          <w:lang w:eastAsia="cs-CZ"/>
+        </w:rPr>
+        <w:t>)</w:t>
+      </w:r>
+      <w:r>
+        <w:rPr>
+          <w:lang w:eastAsia="cs-CZ"/>
+        </w:rPr>
+        <w:t>.</w:t>
+      </w:r>
+    </w:p>
+    <w:p>
+      <w:pPr>
+        <w:spacing w:line="360" w:lineRule="auto"/>
+        <w:rPr>
+          <w:lang w:eastAsia="cs-CZ"/>
+        </w:rPr>
+      </w:pPr>
+      <w:r>
+        <w:rPr>
+          <w:lang w:eastAsia="cs-CZ"/>
+        </w:rPr>
+        <w:t xml:space="preserve">Pro kopírování, porovnávání či konstrukci a destrukci jsou v případě triviálně manipulovatelných typů (kontrolováno například pomocí </w:t>
+      </w:r>
+      <w:proofErr w:type="spellStart"/>
+      <w:proofErr w:type="gramStart"/>
+      <w:r>
+        <w:rPr>
+          <w:lang w:eastAsia="cs-CZ"/>
+        </w:rPr>
+        <w:t>std</w:t>
+      </w:r>
+      <w:proofErr w:type="spellEnd"/>
+      <w:r>
+        <w:rPr>
+          <w:lang w:eastAsia="cs-CZ"/>
+        </w:rPr>
+        <w:t>::</w:t>
+      </w:r>
+      <w:proofErr w:type="spellStart"/>
+      <w:proofErr w:type="gramEnd"/>
+      <w:r>
+        <w:rPr>
+          <w:lang w:eastAsia="cs-CZ"/>
+        </w:rPr>
+        <w:t>is_trivially_copyable_v</w:t>
+      </w:r>
+      <w:proofErr w:type="spellEnd"/>
+      <w:r>
+        <w:rPr>
+          <w:lang w:eastAsia="cs-CZ"/>
+        </w:rPr>
+        <w:t>&lt;T&gt;</w:t>
+      </w:r>
+      <w:r>
+        <w:rPr>
+          <w:lang w:eastAsia="cs-CZ"/>
+        </w:rPr>
+        <w:t xml:space="preserve">) jsou použity </w:t>
+      </w:r>
+      <w:proofErr w:type="spellStart"/>
+      <w:r>
+        <w:rPr>
+          <w:lang w:eastAsia="cs-CZ"/>
+        </w:rPr>
+        <w:t>nízkoúrovňové</w:t>
+      </w:r>
+      <w:proofErr w:type="spellEnd"/>
+      <w:r>
+        <w:rPr>
+          <w:lang w:eastAsia="cs-CZ"/>
+        </w:rPr>
+        <w:t xml:space="preserve"> funkce standartní knihovny jako například </w:t>
+      </w:r>
+      <w:proofErr w:type="spellStart"/>
+      <w:proofErr w:type="gramStart"/>
+      <w:r>
+        <w:rPr>
+          <w:lang w:eastAsia="cs-CZ"/>
+        </w:rPr>
+        <w:t>std</w:t>
+      </w:r>
+      <w:proofErr w:type="spellEnd"/>
+      <w:r>
+        <w:rPr>
+          <w:lang w:eastAsia="cs-CZ"/>
+        </w:rPr>
+        <w:t>::</w:t>
+      </w:r>
+      <w:proofErr w:type="spellStart"/>
+      <w:proofErr w:type="gramEnd"/>
+      <w:r>
+        <w:rPr>
+          <w:lang w:eastAsia="cs-CZ"/>
+        </w:rPr>
+        <w:t>memcpy</w:t>
+      </w:r>
+      <w:proofErr w:type="spellEnd"/>
+      <w:r>
+        <w:rPr>
+          <w:lang w:eastAsia="cs-CZ"/>
+        </w:rPr>
+        <w:t xml:space="preserve"> či </w:t>
+      </w:r>
+      <w:proofErr w:type="spellStart"/>
+      <w:proofErr w:type="gramStart"/>
+      <w:r>
+        <w:rPr>
+          <w:lang w:eastAsia="cs-CZ"/>
+        </w:rPr>
+        <w:t>std</w:t>
+      </w:r>
+      <w:proofErr w:type="spellEnd"/>
+      <w:r>
+        <w:rPr>
+          <w:lang w:eastAsia="cs-CZ"/>
+        </w:rPr>
+        <w:t>::</w:t>
+      </w:r>
+      <w:proofErr w:type="spellStart"/>
+      <w:proofErr w:type="gramEnd"/>
+      <w:r>
+        <w:rPr>
+          <w:lang w:eastAsia="cs-CZ"/>
+        </w:rPr>
+        <w:t>memcmp</w:t>
+      </w:r>
+      <w:proofErr w:type="spellEnd"/>
+      <w:r>
+        <w:rPr>
+          <w:lang w:eastAsia="cs-CZ"/>
+        </w:rPr>
+        <w:t xml:space="preserve"> a podobně.</w:t>
+      </w:r>
+      <w:r>
+        <w:rPr>
+          <w:lang w:eastAsia="cs-CZ"/>
+        </w:rPr>
+        <w:t xml:space="preserve"> Jestli jde takovéto operace (téměř s jistotou by se dalo říct optimalizace) jde na daném typu skutečně provést jde vykonat během kompilace a není tím pádem žádný </w:t>
+      </w:r>
+      <w:proofErr w:type="spellStart"/>
+      <w:r>
+        <w:rPr>
+          <w:lang w:eastAsia="cs-CZ"/>
+        </w:rPr>
+        <w:t>overhead</w:t>
+      </w:r>
+      <w:proofErr w:type="spellEnd"/>
+      <w:r>
+        <w:rPr>
+          <w:lang w:eastAsia="cs-CZ"/>
+        </w:rPr>
+        <w:t>.</w:t>
+      </w:r>
+    </w:p>
+    <w:p>
+      <w:pPr>
+        <w:spacing w:line="360" w:lineRule="auto"/>
+        <w:rPr>
+          <w:lang w:eastAsia="cs-CZ"/>
+        </w:rPr>
+      </w:pPr>
+      <w:r>
+        <w:rPr>
+          <w:lang w:eastAsia="cs-CZ"/>
+        </w:rPr>
+        <w:t xml:space="preserve">Z venkovního hlediska se rozhraní této třídy velmi podobá </w:t>
+      </w:r>
+      <w:proofErr w:type="spellStart"/>
+      <w:proofErr w:type="gramStart"/>
+      <w:r>
+        <w:rPr>
+          <w:lang w:eastAsia="cs-CZ"/>
+        </w:rPr>
+        <w:t>std</w:t>
+      </w:r>
+      <w:proofErr w:type="spellEnd"/>
+      <w:r>
+        <w:rPr>
+          <w:lang w:eastAsia="cs-CZ"/>
+        </w:rPr>
+        <w:t>::</w:t>
+      </w:r>
+      <w:proofErr w:type="spellStart"/>
+      <w:proofErr w:type="gramEnd"/>
+      <w:r>
+        <w:rPr>
+          <w:lang w:eastAsia="cs-CZ"/>
+        </w:rPr>
+        <w:t>vector</w:t>
+      </w:r>
+      <w:proofErr w:type="spellEnd"/>
+      <w:r>
+        <w:rPr>
+          <w:lang w:eastAsia="cs-CZ"/>
+        </w:rPr>
+        <w:t xml:space="preserve"> ze standartní knihovny.</w:t>
+      </w:r>
+      <w:r>
+        <w:rPr>
+          <w:lang w:eastAsia="cs-CZ"/>
+        </w:rPr>
+        <w:t xml:space="preserve"> Dá</w:t>
+      </w:r>
+      <w:r>
+        <w:rPr>
+          <w:lang w:eastAsia="cs-CZ"/>
+        </w:rPr>
+        <w:t xml:space="preserve"> </w:t>
+      </w:r>
+      <w:r>
+        <w:rPr>
+          <w:lang w:eastAsia="cs-CZ"/>
+        </w:rPr>
+        <w:t xml:space="preserve">se kopírovat i stěhovat díky copy a </w:t>
+      </w:r>
+      <w:proofErr w:type="spellStart"/>
+      <w:r>
+        <w:rPr>
+          <w:lang w:eastAsia="cs-CZ"/>
+        </w:rPr>
+        <w:t>move</w:t>
+      </w:r>
+      <w:proofErr w:type="spellEnd"/>
+      <w:r>
+        <w:rPr>
+          <w:lang w:eastAsia="cs-CZ"/>
+        </w:rPr>
+        <w:t xml:space="preserve"> konstruktoru a </w:t>
+      </w:r>
+      <w:r>
+        <w:rPr>
+          <w:lang w:eastAsia="cs-CZ"/>
+        </w:rPr>
+        <w:t>přetížení operátoru přiřazení (=).</w:t>
+      </w:r>
+      <w:r>
+        <w:rPr>
+          <w:lang w:eastAsia="cs-CZ"/>
+        </w:rPr>
+        <w:t xml:space="preserve"> Dá se z něj přistoupit na syrová data </w:t>
+      </w:r>
+      <w:r>
+        <w:rPr>
+          <w:lang w:eastAsia="cs-CZ"/>
+        </w:rPr>
+        <w:t xml:space="preserve">(pomocí </w:t>
+      </w:r>
+      <w:r>
+        <w:rPr>
+          <w:lang w:eastAsia="cs-CZ"/>
+        </w:rPr>
+        <w:t>stejnojmenné</w:t>
+      </w:r>
+      <w:r>
+        <w:rPr>
+          <w:lang w:eastAsia="cs-CZ"/>
+        </w:rPr>
+        <w:t xml:space="preserve"> metody </w:t>
+      </w:r>
+      <w:proofErr w:type="gramStart"/>
+      <w:r>
+        <w:rPr>
+          <w:lang w:eastAsia="cs-CZ"/>
+        </w:rPr>
+        <w:t>data(</w:t>
+      </w:r>
+      <w:proofErr w:type="gramEnd"/>
+      <w:r>
+        <w:rPr>
+          <w:lang w:eastAsia="cs-CZ"/>
+        </w:rPr>
+        <w:t xml:space="preserve">)) </w:t>
+      </w:r>
+      <w:r>
+        <w:rPr>
+          <w:lang w:eastAsia="cs-CZ"/>
+        </w:rPr>
+        <w:t xml:space="preserve">a dá se </w:t>
+      </w:r>
+      <w:r>
+        <w:rPr>
+          <w:lang w:eastAsia="cs-CZ"/>
+        </w:rPr>
+        <w:t>použít přetížení indexovacího operátoru ([]) pro přístup na jednotlivé prvky (v </w:t>
+      </w:r>
+      <w:proofErr w:type="gramStart"/>
+      <w:r>
+        <w:rPr>
+          <w:lang w:eastAsia="cs-CZ"/>
+        </w:rPr>
+        <w:t>O(</w:t>
+      </w:r>
+      <w:proofErr w:type="gramEnd"/>
+      <w:r>
+        <w:rPr>
+          <w:lang w:eastAsia="cs-CZ"/>
+        </w:rPr>
+        <w:t>1)</w:t>
+      </w:r>
+      <w:r>
+        <w:rPr>
+          <w:lang w:eastAsia="cs-CZ"/>
+        </w:rPr>
+        <w:t xml:space="preserve"> složitosti).</w:t>
+      </w:r>
+      <w:r>
+        <w:rPr>
+          <w:lang w:eastAsia="cs-CZ"/>
+        </w:rPr>
+        <w:t xml:space="preserve"> Dají se z</w:t>
+      </w:r>
+      <w:r>
+        <w:rPr>
+          <w:lang w:eastAsia="cs-CZ"/>
+        </w:rPr>
+        <w:t> </w:t>
+      </w:r>
+      <w:r>
+        <w:rPr>
+          <w:lang w:eastAsia="cs-CZ"/>
+        </w:rPr>
+        <w:t>něj</w:t>
+      </w:r>
+      <w:r>
+        <w:rPr>
+          <w:lang w:eastAsia="cs-CZ"/>
+        </w:rPr>
+        <w:t xml:space="preserve">, ze stejného rozhraní u </w:t>
+      </w:r>
+      <w:proofErr w:type="spellStart"/>
+      <w:proofErr w:type="gramStart"/>
+      <w:r>
+        <w:rPr>
+          <w:lang w:eastAsia="cs-CZ"/>
+        </w:rPr>
+        <w:t>std</w:t>
+      </w:r>
+      <w:proofErr w:type="spellEnd"/>
+      <w:r>
+        <w:rPr>
+          <w:lang w:eastAsia="cs-CZ"/>
+        </w:rPr>
+        <w:t>::</w:t>
+      </w:r>
+      <w:proofErr w:type="spellStart"/>
+      <w:proofErr w:type="gramEnd"/>
+      <w:r>
+        <w:rPr>
+          <w:lang w:eastAsia="cs-CZ"/>
+        </w:rPr>
+        <w:t>vector</w:t>
+      </w:r>
+      <w:proofErr w:type="spellEnd"/>
+      <w:r>
+        <w:rPr>
+          <w:lang w:eastAsia="cs-CZ"/>
+        </w:rPr>
+        <w:t xml:space="preserve"> dostat </w:t>
+      </w:r>
+      <w:proofErr w:type="spellStart"/>
+      <w:r>
+        <w:rPr>
+          <w:lang w:eastAsia="cs-CZ"/>
+        </w:rPr>
+        <w:t>iterátory</w:t>
+      </w:r>
+      <w:proofErr w:type="spellEnd"/>
+      <w:r>
+        <w:rPr>
+          <w:lang w:eastAsia="cs-CZ"/>
+        </w:rPr>
+        <w:t xml:space="preserve"> jak dopředu</w:t>
+      </w:r>
+      <w:r>
+        <w:rPr>
+          <w:lang w:eastAsia="cs-CZ"/>
+        </w:rPr>
+        <w:t>,</w:t>
+      </w:r>
+      <w:r>
+        <w:rPr>
+          <w:lang w:eastAsia="cs-CZ"/>
+        </w:rPr>
+        <w:t xml:space="preserve"> tak dozadu</w:t>
+      </w:r>
+      <w:r>
+        <w:rPr>
+          <w:lang w:eastAsia="cs-CZ"/>
+        </w:rPr>
+        <w:t xml:space="preserve">, kde je </w:t>
+      </w:r>
+      <w:proofErr w:type="spellStart"/>
+      <w:r>
+        <w:rPr>
+          <w:lang w:eastAsia="cs-CZ"/>
+        </w:rPr>
+        <w:t>iterátor</w:t>
+      </w:r>
+      <w:proofErr w:type="spellEnd"/>
+      <w:r>
+        <w:rPr>
+          <w:lang w:eastAsia="cs-CZ"/>
+        </w:rPr>
+        <w:t xml:space="preserve"> jednoduše </w:t>
+      </w:r>
+      <w:r>
+        <w:rPr>
+          <w:lang w:eastAsia="cs-CZ"/>
+        </w:rPr>
+        <w:t>ukazatel</w:t>
+      </w:r>
+      <w:r>
+        <w:rPr>
+          <w:lang w:eastAsia="cs-CZ"/>
+        </w:rPr>
+        <w:t>.</w:t>
+      </w:r>
+      <w:r>
+        <w:rPr>
+          <w:lang w:eastAsia="cs-CZ"/>
+        </w:rPr>
+        <w:t xml:space="preserve"> Dá se porovnávat s ostatními lineárními kontejnery</w:t>
+      </w:r>
+      <w:r>
+        <w:rPr>
+          <w:lang w:eastAsia="cs-CZ"/>
+        </w:rPr>
+        <w:t xml:space="preserve"> díky přetížení porovnávacího operátoru (==) a operátoru „vesmírné lodi“ (&lt;=&gt;).</w:t>
+      </w:r>
+      <w:r>
+        <w:rPr>
+          <w:lang w:eastAsia="cs-CZ"/>
+        </w:rPr>
+        <w:t xml:space="preserve"> Je možné díky metodě swap také vyměnit obsahy dvou lineárních kontejnerů.</w:t>
+      </w:r>
+      <w:r>
+        <w:rPr>
+          <w:lang w:eastAsia="cs-CZ"/>
+        </w:rPr>
+        <w:t xml:space="preserve"> Samozřejmě je také možné kontejner manuálně změnit v jeho velikosti a kapacitě</w:t>
+      </w:r>
+      <w:r>
+        <w:rPr>
+          <w:lang w:eastAsia="cs-CZ"/>
+        </w:rPr>
+        <w:t xml:space="preserve"> či ho celá vyčistit</w:t>
+      </w:r>
+      <w:r>
+        <w:rPr>
+          <w:lang w:eastAsia="cs-CZ"/>
+        </w:rPr>
+        <w:t>.</w:t>
+      </w:r>
+      <w:r>
+        <w:rPr>
+          <w:lang w:eastAsia="cs-CZ"/>
+        </w:rPr>
+        <w:t xml:space="preserve"> Jde také nakonec přidat prvek či ho z konce odstranit.</w:t>
+      </w:r>
     </w:p>
     <w:p>
       <w:pPr>
@@ -5454,352 +6667,7 @@
           <w:lang w:eastAsia="cs-CZ"/>
         </w:rPr>
       </w:pPr>
-      <w:bookmarkStart w:id="10" w:name="_Toc227276690"/>
-      <w:r>
-        <w:rPr>
-          <w:lang w:eastAsia="cs-CZ"/>
-        </w:rPr>
-        <w:t>2.</w:t>
-      </w:r>
-      <w:r>
-        <w:rPr>
-          <w:lang w:eastAsia="cs-CZ"/>
-        </w:rPr>
-        <w:t>2</w:t>
-      </w:r>
-      <w:r>
-        <w:rPr>
-          <w:lang w:eastAsia="cs-CZ"/>
-        </w:rPr>
-        <w:t>.2</w:t>
-      </w:r>
-      <w:r>
-        <w:rPr>
-          <w:lang w:eastAsia="cs-CZ"/>
-        </w:rPr>
-        <w:t xml:space="preserve"> Tenzor</w:t>
-      </w:r>
-      <w:bookmarkEnd w:id="10"/>
-    </w:p>
-    <w:p>
-      <w:pPr>
-        <w:rPr>
-          <w:lang w:eastAsia="cs-CZ"/>
-        </w:rPr>
-      </w:pPr>
-      <w:proofErr w:type="spellStart"/>
-      <w:r>
-        <w:rPr>
-          <w:lang w:eastAsia="cs-CZ"/>
-        </w:rPr>
-        <w:t>Xxx</w:t>
-      </w:r>
-      <w:proofErr w:type="spellEnd"/>
-    </w:p>
-    <w:p>
-      <w:pPr>
-        <w:pStyle w:val="Nadpis3"/>
-        <w:rPr>
-          <w:lang w:eastAsia="cs-CZ"/>
-        </w:rPr>
-      </w:pPr>
-      <w:bookmarkStart w:id="11" w:name="_Toc227276691"/>
-      <w:r>
-        <w:rPr>
-          <w:lang w:eastAsia="cs-CZ"/>
-        </w:rPr>
-        <w:t>2.</w:t>
-      </w:r>
-      <w:r>
-        <w:rPr>
-          <w:lang w:eastAsia="cs-CZ"/>
-        </w:rPr>
-        <w:t>2</w:t>
-      </w:r>
-      <w:r>
-        <w:rPr>
-          <w:lang w:eastAsia="cs-CZ"/>
-        </w:rPr>
-        <w:t>.3</w:t>
-      </w:r>
-      <w:r>
-        <w:rPr>
-          <w:lang w:eastAsia="cs-CZ"/>
-        </w:rPr>
-        <w:t xml:space="preserve"> Paralelní tenzor</w:t>
-      </w:r>
-      <w:bookmarkEnd w:id="11"/>
-    </w:p>
-    <w:p>
-      <w:pPr>
-        <w:rPr>
-          <w:lang w:eastAsia="cs-CZ"/>
-        </w:rPr>
-      </w:pPr>
-      <w:proofErr w:type="spellStart"/>
-      <w:r>
-        <w:rPr>
-          <w:lang w:eastAsia="cs-CZ"/>
-        </w:rPr>
-        <w:t>Xxx</w:t>
-      </w:r>
-      <w:proofErr w:type="spellEnd"/>
-    </w:p>
-    <w:p>
-      <w:pPr>
-        <w:pStyle w:val="Nadpis3"/>
-        <w:rPr>
-          <w:lang w:eastAsia="cs-CZ"/>
-        </w:rPr>
-      </w:pPr>
-      <w:bookmarkStart w:id="12" w:name="_Toc227276692"/>
-      <w:r>
-        <w:rPr>
-          <w:lang w:eastAsia="cs-CZ"/>
-        </w:rPr>
-        <w:t>2.</w:t>
-      </w:r>
-      <w:r>
-        <w:rPr>
-          <w:lang w:eastAsia="cs-CZ"/>
-        </w:rPr>
-        <w:t>2</w:t>
-      </w:r>
-      <w:r>
-        <w:rPr>
-          <w:lang w:eastAsia="cs-CZ"/>
-        </w:rPr>
-        <w:t>.4</w:t>
-      </w:r>
-      <w:r>
-        <w:rPr>
-          <w:lang w:eastAsia="cs-CZ"/>
-        </w:rPr>
-        <w:t xml:space="preserve"> Matice</w:t>
-      </w:r>
-      <w:bookmarkEnd w:id="12"/>
-    </w:p>
-    <w:p>
-      <w:pPr>
-        <w:rPr>
-          <w:lang w:eastAsia="cs-CZ"/>
-        </w:rPr>
-      </w:pPr>
-      <w:proofErr w:type="spellStart"/>
-      <w:r>
-        <w:rPr>
-          <w:lang w:eastAsia="cs-CZ"/>
-        </w:rPr>
-        <w:t>Xxx</w:t>
-      </w:r>
-      <w:proofErr w:type="spellEnd"/>
-    </w:p>
-    <w:p>
-      <w:pPr>
-        <w:pStyle w:val="Nadpis3"/>
-        <w:rPr>
-          <w:lang w:eastAsia="cs-CZ"/>
-        </w:rPr>
-      </w:pPr>
-      <w:bookmarkStart w:id="13" w:name="_Toc227276693"/>
-      <w:r>
-        <w:rPr>
-          <w:lang w:eastAsia="cs-CZ"/>
-        </w:rPr>
-        <w:t>2.</w:t>
-      </w:r>
-      <w:r>
-        <w:rPr>
-          <w:lang w:eastAsia="cs-CZ"/>
-        </w:rPr>
-        <w:t>2</w:t>
-      </w:r>
-      <w:r>
-        <w:rPr>
-          <w:lang w:eastAsia="cs-CZ"/>
-        </w:rPr>
-        <w:t>.</w:t>
-      </w:r>
-      <w:r>
-        <w:rPr>
-          <w:lang w:eastAsia="cs-CZ"/>
-        </w:rPr>
-        <w:t>5 Paralelní matice</w:t>
-      </w:r>
-      <w:bookmarkEnd w:id="13"/>
-    </w:p>
-    <w:p>
-      <w:pPr>
-        <w:rPr>
-          <w:lang w:eastAsia="cs-CZ"/>
-        </w:rPr>
-      </w:pPr>
-      <w:proofErr w:type="spellStart"/>
-      <w:r>
-        <w:rPr>
-          <w:lang w:eastAsia="cs-CZ"/>
-        </w:rPr>
-        <w:t>Xxx</w:t>
-      </w:r>
-      <w:proofErr w:type="spellEnd"/>
-    </w:p>
-    <w:p>
-      <w:pPr>
-        <w:pStyle w:val="Nadpis3"/>
-        <w:rPr>
-          <w:lang w:eastAsia="cs-CZ"/>
-        </w:rPr>
-      </w:pPr>
-      <w:bookmarkStart w:id="14" w:name="_Toc227276694"/>
-      <w:r>
-        <w:rPr>
-          <w:lang w:eastAsia="cs-CZ"/>
-        </w:rPr>
-        <w:t>2.</w:t>
-      </w:r>
-      <w:r>
-        <w:rPr>
-          <w:lang w:eastAsia="cs-CZ"/>
-        </w:rPr>
-        <w:t>2</w:t>
-      </w:r>
-      <w:r>
-        <w:rPr>
-          <w:lang w:eastAsia="cs-CZ"/>
-        </w:rPr>
-        <w:t>.</w:t>
-      </w:r>
-      <w:r>
-        <w:rPr>
-          <w:lang w:eastAsia="cs-CZ"/>
-        </w:rPr>
-        <w:t>6 N-</w:t>
-      </w:r>
-      <w:proofErr w:type="spellStart"/>
-      <w:r>
-        <w:rPr>
-          <w:lang w:eastAsia="cs-CZ"/>
-        </w:rPr>
-        <w:t>nární</w:t>
-      </w:r>
-      <w:proofErr w:type="spellEnd"/>
-      <w:r>
-        <w:rPr>
-          <w:lang w:eastAsia="cs-CZ"/>
-        </w:rPr>
-        <w:t xml:space="preserve"> strom</w:t>
-      </w:r>
-      <w:bookmarkEnd w:id="14"/>
-    </w:p>
-    <w:p>
-      <w:pPr>
-        <w:rPr>
-          <w:lang w:eastAsia="cs-CZ"/>
-        </w:rPr>
-      </w:pPr>
-      <w:proofErr w:type="spellStart"/>
-      <w:r>
-        <w:rPr>
-          <w:lang w:eastAsia="cs-CZ"/>
-        </w:rPr>
-        <w:t>Xxx</w:t>
-      </w:r>
-      <w:proofErr w:type="spellEnd"/>
-    </w:p>
-    <w:p>
-      <w:pPr>
-        <w:pStyle w:val="Nadpis2"/>
-        <w:rPr>
-          <w:lang w:eastAsia="cs-CZ"/>
-        </w:rPr>
-      </w:pPr>
-      <w:bookmarkStart w:id="15" w:name="_Toc227276695"/>
-      <w:r>
-        <w:rPr>
-          <w:lang w:eastAsia="cs-CZ"/>
-        </w:rPr>
-        <w:t>2.</w:t>
-      </w:r>
-      <w:r>
-        <w:rPr>
-          <w:lang w:eastAsia="cs-CZ"/>
-        </w:rPr>
-        <w:t>3</w:t>
-      </w:r>
-      <w:r>
-        <w:rPr>
-          <w:lang w:eastAsia="cs-CZ"/>
-        </w:rPr>
-        <w:t xml:space="preserve"> Testy</w:t>
-      </w:r>
-      <w:bookmarkEnd w:id="15"/>
-    </w:p>
-    <w:p>
-      <w:pPr>
-        <w:rPr>
-          <w:lang w:eastAsia="cs-CZ"/>
-        </w:rPr>
-      </w:pPr>
-      <w:proofErr w:type="spellStart"/>
-      <w:r>
-        <w:rPr>
-          <w:lang w:eastAsia="cs-CZ"/>
-        </w:rPr>
-        <w:t>Xxx</w:t>
-      </w:r>
-      <w:proofErr w:type="spellEnd"/>
-    </w:p>
-    <w:p>
-      <w:pPr>
-        <w:pStyle w:val="Nadpis3"/>
-        <w:rPr>
-          <w:lang w:eastAsia="cs-CZ"/>
-        </w:rPr>
-      </w:pPr>
-      <w:bookmarkStart w:id="16" w:name="_Toc227276696"/>
-      <w:r>
-        <w:rPr>
-          <w:lang w:eastAsia="cs-CZ"/>
-        </w:rPr>
-        <w:t>2.</w:t>
-      </w:r>
-      <w:r>
-        <w:rPr>
-          <w:lang w:eastAsia="cs-CZ"/>
-        </w:rPr>
-        <w:t>3</w:t>
-      </w:r>
-      <w:r>
-        <w:rPr>
-          <w:lang w:eastAsia="cs-CZ"/>
-        </w:rPr>
-        <w:t>.1 Unit testování</w:t>
-      </w:r>
-      <w:bookmarkEnd w:id="16"/>
-    </w:p>
-    <w:p>
-      <w:pPr>
-        <w:rPr>
-          <w:lang w:eastAsia="cs-CZ"/>
-        </w:rPr>
-      </w:pPr>
-      <w:proofErr w:type="spellStart"/>
-      <w:r>
-        <w:rPr>
-          <w:lang w:eastAsia="cs-CZ"/>
-        </w:rPr>
-        <w:t>Xxx</w:t>
-      </w:r>
-      <w:proofErr w:type="spellEnd"/>
-    </w:p>
-    <w:p>
-      <w:pPr>
-        <w:pStyle w:val="Nadpis3"/>
-        <w:rPr>
-          <w:lang w:eastAsia="cs-CZ"/>
-        </w:rPr>
-      </w:pPr>
-      <w:bookmarkStart w:id="17" w:name="_Toc227276697"/>
+      <w:bookmarkStart w:id="12" w:name="_Toc227520789"/>
       <w:r>
         <w:rPr>
           <w:lang w:eastAsia="cs-CZ"/>
@@ -5811,18 +6679,371 @@
         <w:rPr>
           <w:lang w:eastAsia="cs-CZ"/>
         </w:rPr>
+        <w:t>2</w:t>
+      </w:r>
+      <w:r>
+        <w:rPr>
+          <w:lang w:eastAsia="cs-CZ"/>
+        </w:rPr>
+        <w:t>.2</w:t>
+      </w:r>
+      <w:r>
+        <w:rPr>
+          <w:lang w:eastAsia="cs-CZ"/>
+        </w:rPr>
+        <w:t xml:space="preserve"> Tenzor</w:t>
+      </w:r>
+      <w:bookmarkEnd w:id="12"/>
+    </w:p>
+    <w:p>
+      <w:pPr>
+        <w:spacing w:line="360" w:lineRule="auto"/>
+        <w:rPr>
+          <w:lang w:eastAsia="cs-CZ"/>
+        </w:rPr>
+      </w:pPr>
+      <w:proofErr w:type="spellStart"/>
+      <w:r>
+        <w:rPr>
+          <w:lang w:eastAsia="cs-CZ"/>
+        </w:rPr>
+        <w:t>Xxx</w:t>
+      </w:r>
+      <w:proofErr w:type="spellEnd"/>
+    </w:p>
+    <w:p>
+      <w:pPr>
+        <w:pStyle w:val="Nadpis3"/>
+        <w:rPr>
+          <w:lang w:eastAsia="cs-CZ"/>
+        </w:rPr>
+      </w:pPr>
+      <w:bookmarkStart w:id="13" w:name="_Toc227520790"/>
+      <w:r>
+        <w:rPr>
+          <w:lang w:eastAsia="cs-CZ"/>
+        </w:rPr>
+        <w:t>2.</w:t>
+      </w:r>
+      <w:r>
+        <w:rPr>
+          <w:lang w:eastAsia="cs-CZ"/>
+        </w:rPr>
+        <w:t>2</w:t>
+      </w:r>
+      <w:r>
+        <w:rPr>
+          <w:lang w:eastAsia="cs-CZ"/>
+        </w:rPr>
+        <w:t>.3</w:t>
+      </w:r>
+      <w:r>
+        <w:rPr>
+          <w:lang w:eastAsia="cs-CZ"/>
+        </w:rPr>
+        <w:t xml:space="preserve"> Paralelní tenzor</w:t>
+      </w:r>
+      <w:bookmarkEnd w:id="13"/>
+    </w:p>
+    <w:p>
+      <w:pPr>
+        <w:spacing w:line="360" w:lineRule="auto"/>
+        <w:rPr>
+          <w:lang w:eastAsia="cs-CZ"/>
+        </w:rPr>
+      </w:pPr>
+      <w:proofErr w:type="spellStart"/>
+      <w:r>
+        <w:rPr>
+          <w:lang w:eastAsia="cs-CZ"/>
+        </w:rPr>
+        <w:t>Xxx</w:t>
+      </w:r>
+      <w:proofErr w:type="spellEnd"/>
+    </w:p>
+    <w:p>
+      <w:pPr>
+        <w:pStyle w:val="Nadpis3"/>
+        <w:rPr>
+          <w:lang w:eastAsia="cs-CZ"/>
+        </w:rPr>
+      </w:pPr>
+      <w:bookmarkStart w:id="14" w:name="_Toc227520791"/>
+      <w:r>
+        <w:rPr>
+          <w:lang w:eastAsia="cs-CZ"/>
+        </w:rPr>
+        <w:t>2.</w:t>
+      </w:r>
+      <w:r>
+        <w:rPr>
+          <w:lang w:eastAsia="cs-CZ"/>
+        </w:rPr>
+        <w:t>2</w:t>
+      </w:r>
+      <w:r>
+        <w:rPr>
+          <w:lang w:eastAsia="cs-CZ"/>
+        </w:rPr>
+        <w:t>.4</w:t>
+      </w:r>
+      <w:r>
+        <w:rPr>
+          <w:lang w:eastAsia="cs-CZ"/>
+        </w:rPr>
+        <w:t xml:space="preserve"> Matice</w:t>
+      </w:r>
+      <w:bookmarkEnd w:id="14"/>
+    </w:p>
+    <w:p>
+      <w:pPr>
+        <w:spacing w:line="360" w:lineRule="auto"/>
+        <w:rPr>
+          <w:lang w:eastAsia="cs-CZ"/>
+        </w:rPr>
+      </w:pPr>
+      <w:proofErr w:type="spellStart"/>
+      <w:r>
+        <w:rPr>
+          <w:lang w:eastAsia="cs-CZ"/>
+        </w:rPr>
+        <w:t>Xxx</w:t>
+      </w:r>
+      <w:proofErr w:type="spellEnd"/>
+    </w:p>
+    <w:p>
+      <w:pPr>
+        <w:pStyle w:val="Nadpis3"/>
+        <w:rPr>
+          <w:lang w:eastAsia="cs-CZ"/>
+        </w:rPr>
+      </w:pPr>
+      <w:bookmarkStart w:id="15" w:name="_Toc227520792"/>
+      <w:r>
+        <w:rPr>
+          <w:lang w:eastAsia="cs-CZ"/>
+        </w:rPr>
+        <w:t>2.</w:t>
+      </w:r>
+      <w:r>
+        <w:rPr>
+          <w:lang w:eastAsia="cs-CZ"/>
+        </w:rPr>
+        <w:t>2</w:t>
+      </w:r>
+      <w:r>
+        <w:rPr>
+          <w:lang w:eastAsia="cs-CZ"/>
+        </w:rPr>
+        <w:t>.</w:t>
+      </w:r>
+      <w:r>
+        <w:rPr>
+          <w:lang w:eastAsia="cs-CZ"/>
+        </w:rPr>
+        <w:t>5 Paralelní matice</w:t>
+      </w:r>
+      <w:bookmarkEnd w:id="15"/>
+    </w:p>
+    <w:p>
+      <w:pPr>
+        <w:spacing w:line="360" w:lineRule="auto"/>
+        <w:rPr>
+          <w:lang w:eastAsia="cs-CZ"/>
+        </w:rPr>
+      </w:pPr>
+      <w:proofErr w:type="spellStart"/>
+      <w:r>
+        <w:rPr>
+          <w:lang w:eastAsia="cs-CZ"/>
+        </w:rPr>
+        <w:t>Xxx</w:t>
+      </w:r>
+      <w:proofErr w:type="spellEnd"/>
+    </w:p>
+    <w:p>
+      <w:pPr>
+        <w:pStyle w:val="Nadpis3"/>
+        <w:rPr>
+          <w:lang w:eastAsia="cs-CZ"/>
+        </w:rPr>
+      </w:pPr>
+      <w:bookmarkStart w:id="16" w:name="_Toc227520793"/>
+      <w:r>
+        <w:rPr>
+          <w:lang w:eastAsia="cs-CZ"/>
+        </w:rPr>
+        <w:t>2.</w:t>
+      </w:r>
+      <w:r>
+        <w:rPr>
+          <w:lang w:eastAsia="cs-CZ"/>
+        </w:rPr>
+        <w:t>2</w:t>
+      </w:r>
+      <w:r>
+        <w:rPr>
+          <w:lang w:eastAsia="cs-CZ"/>
+        </w:rPr>
+        <w:t>.</w:t>
+      </w:r>
+      <w:r>
+        <w:rPr>
+          <w:lang w:eastAsia="cs-CZ"/>
+        </w:rPr>
+        <w:t>6 N-</w:t>
+      </w:r>
+      <w:proofErr w:type="spellStart"/>
+      <w:r>
+        <w:rPr>
+          <w:lang w:eastAsia="cs-CZ"/>
+        </w:rPr>
+        <w:t>nární</w:t>
+      </w:r>
+      <w:proofErr w:type="spellEnd"/>
+      <w:r>
+        <w:rPr>
+          <w:lang w:eastAsia="cs-CZ"/>
+        </w:rPr>
+        <w:t xml:space="preserve"> strom</w:t>
+      </w:r>
+      <w:bookmarkEnd w:id="16"/>
+    </w:p>
+    <w:p>
+      <w:pPr>
+        <w:spacing w:line="360" w:lineRule="auto"/>
+        <w:rPr>
+          <w:lang w:eastAsia="cs-CZ"/>
+        </w:rPr>
+      </w:pPr>
+      <w:proofErr w:type="spellStart"/>
+      <w:r>
+        <w:rPr>
+          <w:lang w:eastAsia="cs-CZ"/>
+        </w:rPr>
+        <w:t>Xxx</w:t>
+      </w:r>
+      <w:proofErr w:type="spellEnd"/>
+    </w:p>
+    <w:p>
+      <w:pPr>
+        <w:pStyle w:val="Nadpis2"/>
+        <w:rPr>
+          <w:lang w:eastAsia="cs-CZ"/>
+        </w:rPr>
+      </w:pPr>
+      <w:bookmarkStart w:id="17" w:name="_Toc227520794"/>
+      <w:r>
+        <w:rPr>
+          <w:lang w:eastAsia="cs-CZ"/>
+        </w:rPr>
+        <w:t>2.</w:t>
+      </w:r>
+      <w:r>
+        <w:rPr>
+          <w:lang w:eastAsia="cs-CZ"/>
+        </w:rPr>
         <w:t>3</w:t>
       </w:r>
       <w:r>
         <w:rPr>
           <w:lang w:eastAsia="cs-CZ"/>
         </w:rPr>
+        <w:t xml:space="preserve"> Testy</w:t>
+      </w:r>
+      <w:bookmarkEnd w:id="17"/>
+    </w:p>
+    <w:p>
+      <w:pPr>
+        <w:spacing w:line="360" w:lineRule="auto"/>
+        <w:rPr>
+          <w:lang w:eastAsia="cs-CZ"/>
+        </w:rPr>
+      </w:pPr>
+      <w:proofErr w:type="spellStart"/>
+      <w:r>
+        <w:rPr>
+          <w:lang w:eastAsia="cs-CZ"/>
+        </w:rPr>
+        <w:t>Xxx</w:t>
+      </w:r>
+      <w:proofErr w:type="spellEnd"/>
+    </w:p>
+    <w:p>
+      <w:pPr>
+        <w:pStyle w:val="Nadpis3"/>
+        <w:rPr>
+          <w:lang w:eastAsia="cs-CZ"/>
+        </w:rPr>
+      </w:pPr>
+      <w:bookmarkStart w:id="18" w:name="_Toc227520795"/>
+      <w:r>
+        <w:rPr>
+          <w:lang w:eastAsia="cs-CZ"/>
+        </w:rPr>
+        <w:t>2.</w:t>
+      </w:r>
+      <w:r>
+        <w:rPr>
+          <w:lang w:eastAsia="cs-CZ"/>
+        </w:rPr>
+        <w:t>3</w:t>
+      </w:r>
+      <w:r>
+        <w:rPr>
+          <w:lang w:eastAsia="cs-CZ"/>
+        </w:rPr>
+        <w:t>.1 Unit testování</w:t>
+      </w:r>
+      <w:bookmarkEnd w:id="18"/>
+    </w:p>
+    <w:p>
+      <w:pPr>
+        <w:spacing w:line="360" w:lineRule="auto"/>
+        <w:rPr>
+          <w:lang w:eastAsia="cs-CZ"/>
+        </w:rPr>
+      </w:pPr>
+      <w:proofErr w:type="spellStart"/>
+      <w:r>
+        <w:rPr>
+          <w:lang w:eastAsia="cs-CZ"/>
+        </w:rPr>
+        <w:t>Xxx</w:t>
+      </w:r>
+      <w:proofErr w:type="spellEnd"/>
+    </w:p>
+    <w:p>
+      <w:pPr>
+        <w:pStyle w:val="Nadpis3"/>
+        <w:rPr>
+          <w:lang w:eastAsia="cs-CZ"/>
+        </w:rPr>
+      </w:pPr>
+      <w:bookmarkStart w:id="19" w:name="_Toc227520796"/>
+      <w:r>
+        <w:rPr>
+          <w:lang w:eastAsia="cs-CZ"/>
+        </w:rPr>
+        <w:t>2.</w:t>
+      </w:r>
+      <w:r>
+        <w:rPr>
+          <w:lang w:eastAsia="cs-CZ"/>
+        </w:rPr>
+        <w:t>3</w:t>
+      </w:r>
+      <w:r>
+        <w:rPr>
+          <w:lang w:eastAsia="cs-CZ"/>
+        </w:rPr>
         <w:t>.2 Zátěžové testování</w:t>
       </w:r>
-      <w:bookmarkEnd w:id="17"/>
-    </w:p>
-    <w:p>
-      <w:pPr>
+      <w:bookmarkEnd w:id="19"/>
+    </w:p>
+    <w:p>
+      <w:pPr>
+        <w:spacing w:line="360" w:lineRule="auto"/>
         <w:rPr>
           <w:lang w:eastAsia="cs-CZ"/>
         </w:rPr>
@@ -5858,11 +7079,13 @@
       <w:pPr>
         <w:pStyle w:val="Nadpis1"/>
       </w:pPr>
-      <w:bookmarkStart w:id="18" w:name="_Toc227276220"/>
+      <w:bookmarkStart w:id="20" w:name="_Toc227276220"/>
+      <w:bookmarkStart w:id="21" w:name="_Toc227520797"/>
       <w:r>
         <w:lastRenderedPageBreak/>
         <w:t>3 TEORETICKÉ VYUŽITÍ</w:t>
       </w:r>
+      <w:bookmarkEnd w:id="21"/>
     </w:p>
     <w:p>
       <w:proofErr w:type="spellStart"/>
@@ -5963,7 +7186,7 @@
         </w:rPr>
         <w:t>Vzdělanostní struktura obyvatelstva České republiky (2021)</w:t>
       </w:r>
-      <w:bookmarkEnd w:id="18"/>
+      <w:bookmarkEnd w:id="20"/>
     </w:p>
     <w:tbl>
       <w:tblPr>
@@ -6484,7 +7707,7 @@
                     </pic:cNvPicPr>
                   </pic:nvPicPr>
                   <pic:blipFill>
-                    <a:blip r:embed="rId16">
+                    <a:blip r:embed="rId17">
                       <a:extLst>
                         <a:ext uri="{28A0092B-C50C-407E-A947-70E740481C1C}">
                           <a14:useLocalDpi xmlns:a14="http://schemas.microsoft.com/office/drawing/2010/main" val="0"/>
@@ -6598,8 +7821,8 @@
         </w:rPr>
         <w:t>: Balonky (Min, 2016</w:t>
       </w:r>
-      <w:bookmarkStart w:id="19" w:name="_Toc24458948"/>
-      <w:bookmarkStart w:id="20" w:name="_Toc24459062"/>
+      <w:bookmarkStart w:id="22" w:name="_Toc24458948"/>
+      <w:bookmarkStart w:id="23" w:name="_Toc24459062"/>
       <w:r>
         <w:rPr>
           <w:i w:val="0"/>
@@ -6607,8 +7830,8 @@
         </w:rPr>
         <w:t>)</w:t>
       </w:r>
-      <w:bookmarkEnd w:id="19"/>
-      <w:bookmarkEnd w:id="20"/>
+      <w:bookmarkEnd w:id="22"/>
+      <w:bookmarkEnd w:id="23"/>
       <w:r>
         <w:rPr>
           <w:i w:val="0"/>
@@ -6627,12 +7850,12 @@
         </w:rPr>
         <w:br w:type="page"/>
       </w:r>
-      <w:bookmarkStart w:id="21" w:name="_Toc227276698"/>
+      <w:bookmarkStart w:id="24" w:name="_Toc227520798"/>
       <w:r>
         <w:lastRenderedPageBreak/>
         <w:t>ZÁVĚR</w:t>
       </w:r>
-      <w:bookmarkEnd w:id="21"/>
+      <w:bookmarkEnd w:id="24"/>
     </w:p>
     <w:p>
       <w:pPr>
@@ -6806,12 +8029,12 @@
       <w:r>
         <w:br w:type="page"/>
       </w:r>
-      <w:bookmarkStart w:id="22" w:name="_Toc227276699"/>
+      <w:bookmarkStart w:id="25" w:name="_Toc227520799"/>
       <w:r>
         <w:lastRenderedPageBreak/>
         <w:t>POUŽITÁ LITERATURA</w:t>
       </w:r>
-      <w:bookmarkEnd w:id="22"/>
+      <w:bookmarkEnd w:id="25"/>
     </w:p>
     <w:p>
       <w:pPr>
@@ -6908,7 +8131,7 @@
         </w:rPr>
         <w:t xml:space="preserve">Dostupné z: </w:t>
       </w:r>
-      <w:hyperlink r:id="rId17" w:history="1">
+      <w:hyperlink r:id="rId18" w:history="1">
         <w:r>
           <w:rPr>
             <w:rStyle w:val="Hypertextovodkaz"/>
@@ -7110,7 +8333,7 @@
         </w:rPr>
         <w:t xml:space="preserve"> Dostupné z: </w:t>
       </w:r>
-      <w:hyperlink r:id="rId18" w:history="1">
+      <w:hyperlink r:id="rId19" w:history="1">
         <w:r>
           <w:rPr>
             <w:rStyle w:val="Hypertextovodkaz"/>
@@ -7182,12 +8405,12 @@
       <w:r>
         <w:br w:type="page"/>
       </w:r>
-      <w:bookmarkStart w:id="23" w:name="_Toc227276700"/>
+      <w:bookmarkStart w:id="26" w:name="_Toc227520800"/>
       <w:r>
         <w:lastRenderedPageBreak/>
         <w:t>SEZNAM PŘÍLOH</w:t>
       </w:r>
-      <w:bookmarkEnd w:id="23"/>
+      <w:bookmarkEnd w:id="26"/>
     </w:p>
     <w:p>
       <w:pPr>
@@ -7306,7 +8529,7 @@
       </w:pPr>
     </w:p>
     <w:sectPr>
-      <w:footerReference w:type="default" r:id="rId19"/>
+      <w:footerReference w:type="default" r:id="rId20"/>
       <w:pgSz w:w="11906" w:h="16838"/>
       <w:pgMar w:top="1418" w:right="851" w:bottom="1418" w:left="1985" w:header="709" w:footer="709" w:gutter="0"/>
       <w:cols w:space="708"/>

</xml_diff>

<commit_message>
dokumentace - struktura konceptu a zacatek implementace.
</commit_message>
<xml_diff>
--- a/ŠpaňúrM_KnihovnaProPraci_JM_2026.docx
+++ b/ŠpaňúrM_KnihovnaProPraci_JM_2026.docx
@@ -1433,86 +1433,13 @@
           <w:szCs w:val="24"/>
         </w:rPr>
       </w:pPr>
-      <w:proofErr w:type="spellStart"/>
-      <w:r>
-        <w:rPr>
-          <w:color w:val="000000"/>
-          <w:szCs w:val="24"/>
-          <w:shd w:val="clear" w:color="auto" w:fill="FFFFFF"/>
-        </w:rPr>
-        <w:t>Library</w:t>
-      </w:r>
-      <w:proofErr w:type="spellEnd"/>
-      <w:r>
-        <w:rPr>
-          <w:color w:val="000000"/>
-          <w:szCs w:val="24"/>
-          <w:shd w:val="clear" w:color="auto" w:fill="FFFFFF"/>
-        </w:rPr>
-        <w:t xml:space="preserve"> </w:t>
-      </w:r>
-      <w:proofErr w:type="spellStart"/>
-      <w:r>
-        <w:rPr>
-          <w:color w:val="000000"/>
-          <w:szCs w:val="24"/>
-          <w:shd w:val="clear" w:color="auto" w:fill="FFFFFF"/>
-        </w:rPr>
-        <w:t>for</w:t>
-      </w:r>
-      <w:proofErr w:type="spellEnd"/>
-      <w:r>
-        <w:rPr>
-          <w:color w:val="000000"/>
-          <w:szCs w:val="24"/>
-          <w:shd w:val="clear" w:color="auto" w:fill="FFFFFF"/>
-        </w:rPr>
-        <w:t xml:space="preserve"> </w:t>
-      </w:r>
-      <w:proofErr w:type="spellStart"/>
-      <w:r>
-        <w:rPr>
-          <w:color w:val="000000"/>
-          <w:szCs w:val="24"/>
-          <w:shd w:val="clear" w:color="auto" w:fill="FFFFFF"/>
-        </w:rPr>
-        <w:t>work</w:t>
-      </w:r>
-      <w:proofErr w:type="spellEnd"/>
-      <w:r>
-        <w:rPr>
-          <w:color w:val="000000"/>
-          <w:szCs w:val="24"/>
-          <w:shd w:val="clear" w:color="auto" w:fill="FFFFFF"/>
-        </w:rPr>
-        <w:t xml:space="preserve"> </w:t>
-      </w:r>
-      <w:proofErr w:type="spellStart"/>
-      <w:r>
-        <w:rPr>
-          <w:color w:val="000000"/>
-          <w:szCs w:val="24"/>
-          <w:shd w:val="clear" w:color="auto" w:fill="FFFFFF"/>
-        </w:rPr>
-        <w:t>with</w:t>
-      </w:r>
-      <w:proofErr w:type="spellEnd"/>
-      <w:r>
-        <w:rPr>
-          <w:color w:val="000000"/>
-          <w:szCs w:val="24"/>
-          <w:shd w:val="clear" w:color="auto" w:fill="FFFFFF"/>
-        </w:rPr>
-        <w:t xml:space="preserve"> </w:t>
-      </w:r>
-      <w:proofErr w:type="spellStart"/>
-      <w:r>
-        <w:rPr>
-          <w:color w:val="000000"/>
-          <w:szCs w:val="24"/>
-          <w:shd w:val="clear" w:color="auto" w:fill="FFFFFF"/>
-        </w:rPr>
-        <w:t>ten</w:t>
+      <w:r>
+        <w:rPr>
+          <w:color w:val="000000"/>
+          <w:szCs w:val="24"/>
+          <w:shd w:val="clear" w:color="auto" w:fill="FFFFFF"/>
+        </w:rPr>
+        <w:t>Library for work with ten</w:t>
       </w:r>
       <w:r>
         <w:rPr>
@@ -1528,16 +1455,7 @@
           <w:szCs w:val="24"/>
           <w:shd w:val="clear" w:color="auto" w:fill="FFFFFF"/>
         </w:rPr>
-        <w:t>ors</w:t>
-      </w:r>
-      <w:proofErr w:type="spellEnd"/>
-      <w:r>
-        <w:rPr>
-          <w:color w:val="000000"/>
-          <w:szCs w:val="24"/>
-          <w:shd w:val="clear" w:color="auto" w:fill="FFFFFF"/>
-        </w:rPr>
-        <w:t xml:space="preserve"> in C++</w:t>
+        <w:t>ors in C++</w:t>
       </w:r>
     </w:p>
     <w:p>
@@ -1571,749 +1489,37 @@
           <w:shd w:val="clear" w:color="auto" w:fill="FFFFFF"/>
         </w:rPr>
       </w:pPr>
-      <w:proofErr w:type="spellStart"/>
-      <w:r>
-        <w:rPr>
-          <w:color w:val="000000"/>
-          <w:szCs w:val="24"/>
-          <w:shd w:val="clear" w:color="auto" w:fill="FFFFFF"/>
-        </w:rPr>
-        <w:t>This</w:t>
-      </w:r>
-      <w:proofErr w:type="spellEnd"/>
-      <w:r>
-        <w:rPr>
-          <w:color w:val="000000"/>
-          <w:szCs w:val="24"/>
-          <w:shd w:val="clear" w:color="auto" w:fill="FFFFFF"/>
-        </w:rPr>
-        <w:t xml:space="preserve"> </w:t>
-      </w:r>
-      <w:proofErr w:type="spellStart"/>
-      <w:r>
-        <w:rPr>
-          <w:color w:val="000000"/>
-          <w:szCs w:val="24"/>
-          <w:shd w:val="clear" w:color="auto" w:fill="FFFFFF"/>
-        </w:rPr>
-        <w:t>work</w:t>
-      </w:r>
-      <w:proofErr w:type="spellEnd"/>
-      <w:r>
-        <w:rPr>
-          <w:color w:val="000000"/>
-          <w:szCs w:val="24"/>
-          <w:shd w:val="clear" w:color="auto" w:fill="FFFFFF"/>
-        </w:rPr>
-        <w:t xml:space="preserve"> </w:t>
-      </w:r>
-      <w:proofErr w:type="spellStart"/>
-      <w:r>
-        <w:rPr>
-          <w:color w:val="000000"/>
-          <w:szCs w:val="24"/>
-          <w:shd w:val="clear" w:color="auto" w:fill="FFFFFF"/>
-        </w:rPr>
-        <w:t>deals</w:t>
-      </w:r>
-      <w:proofErr w:type="spellEnd"/>
-      <w:r>
-        <w:rPr>
-          <w:color w:val="000000"/>
-          <w:szCs w:val="24"/>
-          <w:shd w:val="clear" w:color="auto" w:fill="FFFFFF"/>
-        </w:rPr>
-        <w:t xml:space="preserve"> </w:t>
-      </w:r>
-      <w:proofErr w:type="spellStart"/>
-      <w:r>
-        <w:rPr>
-          <w:color w:val="000000"/>
-          <w:szCs w:val="24"/>
-          <w:shd w:val="clear" w:color="auto" w:fill="FFFFFF"/>
-        </w:rPr>
-        <w:t>with</w:t>
-      </w:r>
-      <w:proofErr w:type="spellEnd"/>
-      <w:r>
-        <w:rPr>
-          <w:color w:val="000000"/>
-          <w:szCs w:val="24"/>
-          <w:shd w:val="clear" w:color="auto" w:fill="FFFFFF"/>
-        </w:rPr>
-        <w:t xml:space="preserve"> </w:t>
-      </w:r>
-      <w:proofErr w:type="spellStart"/>
-      <w:r>
-        <w:rPr>
-          <w:color w:val="000000"/>
-          <w:szCs w:val="24"/>
-          <w:shd w:val="clear" w:color="auto" w:fill="FFFFFF"/>
-        </w:rPr>
-        <w:t>implementation</w:t>
-      </w:r>
-      <w:proofErr w:type="spellEnd"/>
-      <w:r>
-        <w:rPr>
-          <w:color w:val="000000"/>
-          <w:szCs w:val="24"/>
-          <w:shd w:val="clear" w:color="auto" w:fill="FFFFFF"/>
-        </w:rPr>
-        <w:t xml:space="preserve"> </w:t>
-      </w:r>
-      <w:proofErr w:type="spellStart"/>
-      <w:r>
-        <w:rPr>
-          <w:color w:val="000000"/>
-          <w:szCs w:val="24"/>
-          <w:shd w:val="clear" w:color="auto" w:fill="FFFFFF"/>
-        </w:rPr>
-        <w:t>of</w:t>
-      </w:r>
-      <w:proofErr w:type="spellEnd"/>
-      <w:r>
-        <w:rPr>
-          <w:color w:val="000000"/>
-          <w:szCs w:val="24"/>
-          <w:shd w:val="clear" w:color="auto" w:fill="FFFFFF"/>
-        </w:rPr>
-        <w:t xml:space="preserve"> </w:t>
-      </w:r>
-      <w:proofErr w:type="spellStart"/>
-      <w:r>
-        <w:rPr>
-          <w:color w:val="000000"/>
-          <w:szCs w:val="24"/>
-          <w:shd w:val="clear" w:color="auto" w:fill="FFFFFF"/>
-        </w:rPr>
-        <w:t>library</w:t>
-      </w:r>
-      <w:proofErr w:type="spellEnd"/>
-      <w:r>
-        <w:rPr>
-          <w:color w:val="000000"/>
-          <w:szCs w:val="24"/>
-          <w:shd w:val="clear" w:color="auto" w:fill="FFFFFF"/>
-        </w:rPr>
-        <w:t xml:space="preserve"> </w:t>
-      </w:r>
-      <w:proofErr w:type="spellStart"/>
-      <w:r>
-        <w:rPr>
-          <w:color w:val="000000"/>
-          <w:szCs w:val="24"/>
-          <w:shd w:val="clear" w:color="auto" w:fill="FFFFFF"/>
-        </w:rPr>
-        <w:t>working</w:t>
-      </w:r>
-      <w:proofErr w:type="spellEnd"/>
-      <w:r>
-        <w:rPr>
-          <w:color w:val="000000"/>
-          <w:szCs w:val="24"/>
-          <w:shd w:val="clear" w:color="auto" w:fill="FFFFFF"/>
-        </w:rPr>
-        <w:t xml:space="preserve"> </w:t>
-      </w:r>
-      <w:proofErr w:type="spellStart"/>
-      <w:r>
-        <w:rPr>
-          <w:color w:val="000000"/>
-          <w:szCs w:val="24"/>
-          <w:shd w:val="clear" w:color="auto" w:fill="FFFFFF"/>
-        </w:rPr>
-        <w:t>with</w:t>
-      </w:r>
-      <w:proofErr w:type="spellEnd"/>
-      <w:r>
-        <w:rPr>
-          <w:color w:val="000000"/>
-          <w:szCs w:val="24"/>
-          <w:shd w:val="clear" w:color="auto" w:fill="FFFFFF"/>
-        </w:rPr>
-        <w:t xml:space="preserve"> tensor as a data </w:t>
-      </w:r>
-      <w:proofErr w:type="spellStart"/>
-      <w:r>
-        <w:rPr>
-          <w:color w:val="000000"/>
-          <w:szCs w:val="24"/>
-          <w:shd w:val="clear" w:color="auto" w:fill="FFFFFF"/>
-        </w:rPr>
-        <w:t>structure</w:t>
-      </w:r>
-      <w:proofErr w:type="spellEnd"/>
-      <w:r>
-        <w:rPr>
-          <w:color w:val="000000"/>
-          <w:szCs w:val="24"/>
-          <w:shd w:val="clear" w:color="auto" w:fill="FFFFFF"/>
-        </w:rPr>
-        <w:t>.</w:t>
-      </w:r>
-      <w:r>
-        <w:rPr>
-          <w:color w:val="000000"/>
-          <w:szCs w:val="24"/>
-          <w:shd w:val="clear" w:color="auto" w:fill="FFFFFF"/>
-        </w:rPr>
-        <w:t xml:space="preserve"> </w:t>
-      </w:r>
-      <w:proofErr w:type="spellStart"/>
-      <w:r>
-        <w:rPr>
-          <w:color w:val="000000"/>
-          <w:szCs w:val="24"/>
-          <w:shd w:val="clear" w:color="auto" w:fill="FFFFFF"/>
-        </w:rPr>
-        <w:t>Library</w:t>
-      </w:r>
-      <w:proofErr w:type="spellEnd"/>
-      <w:r>
-        <w:rPr>
-          <w:color w:val="000000"/>
-          <w:szCs w:val="24"/>
-          <w:shd w:val="clear" w:color="auto" w:fill="FFFFFF"/>
-        </w:rPr>
-        <w:t xml:space="preserve"> </w:t>
-      </w:r>
-      <w:proofErr w:type="spellStart"/>
-      <w:r>
-        <w:rPr>
-          <w:color w:val="000000"/>
-          <w:szCs w:val="24"/>
-          <w:shd w:val="clear" w:color="auto" w:fill="FFFFFF"/>
-        </w:rPr>
-        <w:t>allows</w:t>
-      </w:r>
-      <w:proofErr w:type="spellEnd"/>
-      <w:r>
-        <w:rPr>
-          <w:color w:val="000000"/>
-          <w:szCs w:val="24"/>
-          <w:shd w:val="clear" w:color="auto" w:fill="FFFFFF"/>
-        </w:rPr>
-        <w:t xml:space="preserve"> </w:t>
-      </w:r>
-      <w:proofErr w:type="spellStart"/>
-      <w:r>
-        <w:rPr>
-          <w:color w:val="000000"/>
-          <w:szCs w:val="24"/>
-          <w:shd w:val="clear" w:color="auto" w:fill="FFFFFF"/>
-        </w:rPr>
-        <w:t>parallelization</w:t>
-      </w:r>
-      <w:proofErr w:type="spellEnd"/>
-      <w:r>
-        <w:rPr>
-          <w:color w:val="000000"/>
-          <w:szCs w:val="24"/>
-          <w:shd w:val="clear" w:color="auto" w:fill="FFFFFF"/>
-        </w:rPr>
-        <w:t xml:space="preserve"> </w:t>
-      </w:r>
-      <w:proofErr w:type="spellStart"/>
-      <w:r>
-        <w:rPr>
-          <w:color w:val="000000"/>
-          <w:szCs w:val="24"/>
-          <w:shd w:val="clear" w:color="auto" w:fill="FFFFFF"/>
-        </w:rPr>
-        <w:t>of</w:t>
-      </w:r>
-      <w:proofErr w:type="spellEnd"/>
-      <w:r>
-        <w:rPr>
-          <w:color w:val="000000"/>
-          <w:szCs w:val="24"/>
-          <w:shd w:val="clear" w:color="auto" w:fill="FFFFFF"/>
-        </w:rPr>
-        <w:t xml:space="preserve"> </w:t>
-      </w:r>
-      <w:proofErr w:type="spellStart"/>
-      <w:r>
-        <w:rPr>
-          <w:color w:val="000000"/>
-          <w:szCs w:val="24"/>
-          <w:shd w:val="clear" w:color="auto" w:fill="FFFFFF"/>
-        </w:rPr>
-        <w:t>some</w:t>
-      </w:r>
-      <w:proofErr w:type="spellEnd"/>
-      <w:r>
-        <w:rPr>
-          <w:color w:val="000000"/>
-          <w:szCs w:val="24"/>
-          <w:shd w:val="clear" w:color="auto" w:fill="FFFFFF"/>
-        </w:rPr>
-        <w:t xml:space="preserve"> tensor </w:t>
-      </w:r>
-      <w:proofErr w:type="spellStart"/>
-      <w:r>
-        <w:rPr>
-          <w:color w:val="000000"/>
-          <w:szCs w:val="24"/>
-          <w:shd w:val="clear" w:color="auto" w:fill="FFFFFF"/>
-        </w:rPr>
-        <w:t>operations</w:t>
-      </w:r>
-      <w:proofErr w:type="spellEnd"/>
-      <w:r>
-        <w:rPr>
-          <w:color w:val="000000"/>
-          <w:szCs w:val="24"/>
-          <w:shd w:val="clear" w:color="auto" w:fill="FFFFFF"/>
-        </w:rPr>
-        <w:t xml:space="preserve"> on </w:t>
-      </w:r>
-      <w:proofErr w:type="spellStart"/>
-      <w:r>
-        <w:rPr>
-          <w:color w:val="000000"/>
-          <w:szCs w:val="24"/>
-          <w:shd w:val="clear" w:color="auto" w:fill="FFFFFF"/>
-        </w:rPr>
-        <w:t>graphics</w:t>
-      </w:r>
-      <w:proofErr w:type="spellEnd"/>
-      <w:r>
-        <w:rPr>
-          <w:color w:val="000000"/>
-          <w:szCs w:val="24"/>
-          <w:shd w:val="clear" w:color="auto" w:fill="FFFFFF"/>
-        </w:rPr>
-        <w:t xml:space="preserve"> </w:t>
-      </w:r>
-      <w:proofErr w:type="spellStart"/>
-      <w:r>
-        <w:rPr>
-          <w:color w:val="000000"/>
-          <w:szCs w:val="24"/>
-          <w:shd w:val="clear" w:color="auto" w:fill="FFFFFF"/>
-        </w:rPr>
-        <w:t>card</w:t>
-      </w:r>
-      <w:proofErr w:type="spellEnd"/>
-      <w:r>
-        <w:rPr>
-          <w:color w:val="000000"/>
-          <w:szCs w:val="24"/>
-          <w:shd w:val="clear" w:color="auto" w:fill="FFFFFF"/>
-        </w:rPr>
-        <w:t>.</w:t>
-      </w:r>
-      <w:r>
-        <w:rPr>
-          <w:color w:val="000000"/>
-          <w:szCs w:val="24"/>
-          <w:shd w:val="clear" w:color="auto" w:fill="FFFFFF"/>
-        </w:rPr>
-        <w:t xml:space="preserve"> </w:t>
-      </w:r>
-      <w:proofErr w:type="spellStart"/>
-      <w:r>
-        <w:rPr>
-          <w:color w:val="000000"/>
-          <w:szCs w:val="24"/>
-          <w:shd w:val="clear" w:color="auto" w:fill="FFFFFF"/>
-        </w:rPr>
-        <w:t>Along</w:t>
-      </w:r>
-      <w:proofErr w:type="spellEnd"/>
-      <w:r>
-        <w:rPr>
-          <w:color w:val="000000"/>
-          <w:szCs w:val="24"/>
-          <w:shd w:val="clear" w:color="auto" w:fill="FFFFFF"/>
-        </w:rPr>
-        <w:t xml:space="preserve"> </w:t>
-      </w:r>
-      <w:proofErr w:type="spellStart"/>
-      <w:r>
-        <w:rPr>
-          <w:color w:val="000000"/>
-          <w:szCs w:val="24"/>
-          <w:shd w:val="clear" w:color="auto" w:fill="FFFFFF"/>
-        </w:rPr>
-        <w:t>with</w:t>
-      </w:r>
-      <w:proofErr w:type="spellEnd"/>
-      <w:r>
-        <w:rPr>
-          <w:color w:val="000000"/>
-          <w:szCs w:val="24"/>
-          <w:shd w:val="clear" w:color="auto" w:fill="FFFFFF"/>
-        </w:rPr>
-        <w:t xml:space="preserve"> tensor </w:t>
-      </w:r>
-      <w:proofErr w:type="spellStart"/>
-      <w:r>
-        <w:rPr>
-          <w:color w:val="000000"/>
-          <w:szCs w:val="24"/>
-          <w:shd w:val="clear" w:color="auto" w:fill="FFFFFF"/>
-        </w:rPr>
-        <w:t>there</w:t>
-      </w:r>
-      <w:proofErr w:type="spellEnd"/>
-      <w:r>
-        <w:rPr>
-          <w:color w:val="000000"/>
-          <w:szCs w:val="24"/>
-          <w:shd w:val="clear" w:color="auto" w:fill="FFFFFF"/>
-        </w:rPr>
-        <w:t xml:space="preserve"> are </w:t>
-      </w:r>
-      <w:proofErr w:type="spellStart"/>
-      <w:r>
-        <w:rPr>
-          <w:color w:val="000000"/>
-          <w:szCs w:val="24"/>
-          <w:shd w:val="clear" w:color="auto" w:fill="FFFFFF"/>
-        </w:rPr>
-        <w:t>available</w:t>
-      </w:r>
-      <w:proofErr w:type="spellEnd"/>
-      <w:r>
-        <w:rPr>
-          <w:color w:val="000000"/>
-          <w:szCs w:val="24"/>
-          <w:shd w:val="clear" w:color="auto" w:fill="FFFFFF"/>
-        </w:rPr>
-        <w:t xml:space="preserve"> </w:t>
-      </w:r>
-      <w:proofErr w:type="spellStart"/>
-      <w:r>
-        <w:rPr>
-          <w:color w:val="000000"/>
-          <w:szCs w:val="24"/>
-          <w:shd w:val="clear" w:color="auto" w:fill="FFFFFF"/>
-        </w:rPr>
-        <w:t>other</w:t>
-      </w:r>
-      <w:proofErr w:type="spellEnd"/>
-      <w:r>
-        <w:rPr>
-          <w:color w:val="000000"/>
-          <w:szCs w:val="24"/>
-          <w:shd w:val="clear" w:color="auto" w:fill="FFFFFF"/>
-        </w:rPr>
-        <w:t xml:space="preserve"> </w:t>
-      </w:r>
-      <w:proofErr w:type="spellStart"/>
-      <w:r>
-        <w:rPr>
-          <w:color w:val="000000"/>
-          <w:szCs w:val="24"/>
-          <w:shd w:val="clear" w:color="auto" w:fill="FFFFFF"/>
-        </w:rPr>
-        <w:t>helper</w:t>
-      </w:r>
-      <w:proofErr w:type="spellEnd"/>
-      <w:r>
-        <w:rPr>
-          <w:color w:val="000000"/>
-          <w:szCs w:val="24"/>
-          <w:shd w:val="clear" w:color="auto" w:fill="FFFFFF"/>
-        </w:rPr>
-        <w:t xml:space="preserve"> data </w:t>
-      </w:r>
-      <w:proofErr w:type="spellStart"/>
-      <w:r>
-        <w:rPr>
-          <w:color w:val="000000"/>
-          <w:szCs w:val="24"/>
-          <w:shd w:val="clear" w:color="auto" w:fill="FFFFFF"/>
-        </w:rPr>
-        <w:t>structures</w:t>
-      </w:r>
-      <w:proofErr w:type="spellEnd"/>
-      <w:r>
-        <w:rPr>
-          <w:color w:val="000000"/>
-          <w:szCs w:val="24"/>
-          <w:shd w:val="clear" w:color="auto" w:fill="FFFFFF"/>
-        </w:rPr>
-        <w:t xml:space="preserve">, </w:t>
-      </w:r>
-      <w:proofErr w:type="spellStart"/>
-      <w:r>
-        <w:rPr>
-          <w:color w:val="000000"/>
-          <w:szCs w:val="24"/>
-          <w:shd w:val="clear" w:color="auto" w:fill="FFFFFF"/>
-        </w:rPr>
-        <w:t>for</w:t>
-      </w:r>
-      <w:proofErr w:type="spellEnd"/>
-      <w:r>
-        <w:rPr>
-          <w:color w:val="000000"/>
-          <w:szCs w:val="24"/>
-          <w:shd w:val="clear" w:color="auto" w:fill="FFFFFF"/>
-        </w:rPr>
-        <w:t xml:space="preserve"> instance a tensor </w:t>
-      </w:r>
-      <w:proofErr w:type="spellStart"/>
-      <w:r>
-        <w:rPr>
-          <w:color w:val="000000"/>
-          <w:szCs w:val="24"/>
-          <w:shd w:val="clear" w:color="auto" w:fill="FFFFFF"/>
-        </w:rPr>
-        <w:t>specialization</w:t>
-      </w:r>
-      <w:proofErr w:type="spellEnd"/>
-      <w:r>
-        <w:rPr>
-          <w:color w:val="000000"/>
-          <w:szCs w:val="24"/>
-          <w:shd w:val="clear" w:color="auto" w:fill="FFFFFF"/>
-        </w:rPr>
-        <w:t xml:space="preserve"> as a matrix.</w:t>
-      </w:r>
-      <w:r>
-        <w:rPr>
-          <w:color w:val="000000"/>
-          <w:szCs w:val="24"/>
-          <w:shd w:val="clear" w:color="auto" w:fill="FFFFFF"/>
-        </w:rPr>
-        <w:t xml:space="preserve"> </w:t>
-      </w:r>
-      <w:proofErr w:type="spellStart"/>
-      <w:r>
-        <w:rPr>
-          <w:color w:val="000000"/>
-          <w:szCs w:val="24"/>
-          <w:shd w:val="clear" w:color="auto" w:fill="FFFFFF"/>
-        </w:rPr>
-        <w:t>This</w:t>
-      </w:r>
-      <w:proofErr w:type="spellEnd"/>
-      <w:r>
-        <w:rPr>
-          <w:color w:val="000000"/>
-          <w:szCs w:val="24"/>
-          <w:shd w:val="clear" w:color="auto" w:fill="FFFFFF"/>
-        </w:rPr>
-        <w:t xml:space="preserve"> </w:t>
-      </w:r>
-      <w:proofErr w:type="spellStart"/>
-      <w:r>
-        <w:rPr>
-          <w:color w:val="000000"/>
-          <w:szCs w:val="24"/>
-          <w:shd w:val="clear" w:color="auto" w:fill="FFFFFF"/>
-        </w:rPr>
-        <w:t>library</w:t>
-      </w:r>
-      <w:proofErr w:type="spellEnd"/>
-      <w:r>
-        <w:rPr>
-          <w:color w:val="000000"/>
-          <w:szCs w:val="24"/>
-          <w:shd w:val="clear" w:color="auto" w:fill="FFFFFF"/>
-        </w:rPr>
-        <w:t xml:space="preserve"> </w:t>
-      </w:r>
-      <w:proofErr w:type="spellStart"/>
-      <w:r>
-        <w:rPr>
-          <w:color w:val="000000"/>
-          <w:szCs w:val="24"/>
-          <w:shd w:val="clear" w:color="auto" w:fill="FFFFFF"/>
-        </w:rPr>
-        <w:t>is</w:t>
-      </w:r>
-      <w:proofErr w:type="spellEnd"/>
-      <w:r>
-        <w:rPr>
-          <w:color w:val="000000"/>
-          <w:szCs w:val="24"/>
-          <w:shd w:val="clear" w:color="auto" w:fill="FFFFFF"/>
-        </w:rPr>
-        <w:t xml:space="preserve"> </w:t>
-      </w:r>
-      <w:proofErr w:type="spellStart"/>
-      <w:r>
-        <w:rPr>
-          <w:color w:val="000000"/>
-          <w:szCs w:val="24"/>
-          <w:shd w:val="clear" w:color="auto" w:fill="FFFFFF"/>
-        </w:rPr>
-        <w:t>impemented</w:t>
-      </w:r>
-      <w:proofErr w:type="spellEnd"/>
-      <w:r>
-        <w:rPr>
-          <w:color w:val="000000"/>
-          <w:szCs w:val="24"/>
-          <w:shd w:val="clear" w:color="auto" w:fill="FFFFFF"/>
-        </w:rPr>
-        <w:t xml:space="preserve"> in C++ </w:t>
-      </w:r>
-      <w:proofErr w:type="spellStart"/>
-      <w:r>
-        <w:rPr>
-          <w:color w:val="000000"/>
-          <w:szCs w:val="24"/>
-          <w:shd w:val="clear" w:color="auto" w:fill="FFFFFF"/>
-        </w:rPr>
-        <w:t>programming</w:t>
-      </w:r>
-      <w:proofErr w:type="spellEnd"/>
-      <w:r>
-        <w:rPr>
-          <w:color w:val="000000"/>
-          <w:szCs w:val="24"/>
-          <w:shd w:val="clear" w:color="auto" w:fill="FFFFFF"/>
-        </w:rPr>
-        <w:t xml:space="preserve"> </w:t>
-      </w:r>
-      <w:proofErr w:type="spellStart"/>
-      <w:r>
-        <w:rPr>
-          <w:color w:val="000000"/>
-          <w:szCs w:val="24"/>
-          <w:shd w:val="clear" w:color="auto" w:fill="FFFFFF"/>
-        </w:rPr>
-        <w:t>language</w:t>
-      </w:r>
-      <w:proofErr w:type="spellEnd"/>
-      <w:r>
-        <w:rPr>
-          <w:color w:val="000000"/>
-          <w:szCs w:val="24"/>
-          <w:shd w:val="clear" w:color="auto" w:fill="FFFFFF"/>
-        </w:rPr>
-        <w:t xml:space="preserve">. </w:t>
-      </w:r>
-      <w:proofErr w:type="spellStart"/>
-      <w:r>
-        <w:rPr>
-          <w:color w:val="000000"/>
-          <w:szCs w:val="24"/>
-          <w:shd w:val="clear" w:color="auto" w:fill="FFFFFF"/>
-        </w:rPr>
-        <w:t>This</w:t>
-      </w:r>
-      <w:proofErr w:type="spellEnd"/>
-      <w:r>
-        <w:rPr>
-          <w:color w:val="000000"/>
-          <w:szCs w:val="24"/>
-          <w:shd w:val="clear" w:color="auto" w:fill="FFFFFF"/>
-        </w:rPr>
-        <w:t xml:space="preserve"> </w:t>
-      </w:r>
-      <w:proofErr w:type="spellStart"/>
-      <w:r>
-        <w:rPr>
-          <w:color w:val="000000"/>
-          <w:szCs w:val="24"/>
-          <w:shd w:val="clear" w:color="auto" w:fill="FFFFFF"/>
-        </w:rPr>
-        <w:t>work</w:t>
-      </w:r>
-      <w:proofErr w:type="spellEnd"/>
-      <w:r>
-        <w:rPr>
-          <w:color w:val="000000"/>
-          <w:szCs w:val="24"/>
-          <w:shd w:val="clear" w:color="auto" w:fill="FFFFFF"/>
-        </w:rPr>
-        <w:t xml:space="preserve"> </w:t>
-      </w:r>
-      <w:proofErr w:type="spellStart"/>
-      <w:r>
-        <w:rPr>
-          <w:color w:val="000000"/>
-          <w:szCs w:val="24"/>
-          <w:shd w:val="clear" w:color="auto" w:fill="FFFFFF"/>
-        </w:rPr>
-        <w:t>also</w:t>
-      </w:r>
-      <w:proofErr w:type="spellEnd"/>
-      <w:r>
-        <w:rPr>
-          <w:color w:val="000000"/>
-          <w:szCs w:val="24"/>
-          <w:shd w:val="clear" w:color="auto" w:fill="FFFFFF"/>
-        </w:rPr>
-        <w:t xml:space="preserve"> </w:t>
-      </w:r>
-      <w:proofErr w:type="spellStart"/>
-      <w:r>
-        <w:rPr>
-          <w:color w:val="000000"/>
-          <w:szCs w:val="24"/>
-          <w:shd w:val="clear" w:color="auto" w:fill="FFFFFF"/>
-        </w:rPr>
-        <w:t>deals</w:t>
-      </w:r>
-      <w:proofErr w:type="spellEnd"/>
-      <w:r>
-        <w:rPr>
-          <w:color w:val="000000"/>
-          <w:szCs w:val="24"/>
-          <w:shd w:val="clear" w:color="auto" w:fill="FFFFFF"/>
-        </w:rPr>
-        <w:t xml:space="preserve"> </w:t>
-      </w:r>
-      <w:proofErr w:type="spellStart"/>
-      <w:r>
-        <w:rPr>
-          <w:color w:val="000000"/>
-          <w:szCs w:val="24"/>
-          <w:shd w:val="clear" w:color="auto" w:fill="FFFFFF"/>
-        </w:rPr>
-        <w:t>with</w:t>
-      </w:r>
-      <w:proofErr w:type="spellEnd"/>
-      <w:r>
-        <w:rPr>
-          <w:color w:val="000000"/>
-          <w:szCs w:val="24"/>
-          <w:shd w:val="clear" w:color="auto" w:fill="FFFFFF"/>
-        </w:rPr>
-        <w:t xml:space="preserve"> </w:t>
-      </w:r>
-      <w:proofErr w:type="spellStart"/>
-      <w:r>
-        <w:rPr>
-          <w:color w:val="000000"/>
-          <w:szCs w:val="24"/>
-          <w:shd w:val="clear" w:color="auto" w:fill="FFFFFF"/>
-        </w:rPr>
-        <w:t>theoretical</w:t>
-      </w:r>
-      <w:proofErr w:type="spellEnd"/>
-      <w:r>
-        <w:rPr>
-          <w:color w:val="000000"/>
-          <w:szCs w:val="24"/>
-          <w:shd w:val="clear" w:color="auto" w:fill="FFFFFF"/>
-        </w:rPr>
-        <w:t xml:space="preserve"> use </w:t>
-      </w:r>
-      <w:proofErr w:type="spellStart"/>
-      <w:r>
-        <w:rPr>
-          <w:color w:val="000000"/>
-          <w:szCs w:val="24"/>
-          <w:shd w:val="clear" w:color="auto" w:fill="FFFFFF"/>
-        </w:rPr>
-        <w:t>of</w:t>
-      </w:r>
-      <w:proofErr w:type="spellEnd"/>
-      <w:r>
-        <w:rPr>
-          <w:color w:val="000000"/>
-          <w:szCs w:val="24"/>
-          <w:shd w:val="clear" w:color="auto" w:fill="FFFFFF"/>
-        </w:rPr>
-        <w:t xml:space="preserve"> tensor.</w:t>
+      <w:r>
+        <w:rPr>
+          <w:color w:val="000000"/>
+          <w:szCs w:val="24"/>
+          <w:shd w:val="clear" w:color="auto" w:fill="FFFFFF"/>
+        </w:rPr>
+        <w:t>This work deals with implementation of library working with tensor as a data structure.</w:t>
+      </w:r>
+      <w:r>
+        <w:rPr>
+          <w:color w:val="000000"/>
+          <w:szCs w:val="24"/>
+          <w:shd w:val="clear" w:color="auto" w:fill="FFFFFF"/>
+        </w:rPr>
+        <w:t xml:space="preserve"> Library allows parallelization of some tensor operations on graphics card.</w:t>
+      </w:r>
+      <w:r>
+        <w:rPr>
+          <w:color w:val="000000"/>
+          <w:szCs w:val="24"/>
+          <w:shd w:val="clear" w:color="auto" w:fill="FFFFFF"/>
+        </w:rPr>
+        <w:t xml:space="preserve"> Along with tensor there are available other helper data structures, for instance a tensor specialization as a matrix.</w:t>
+      </w:r>
+      <w:r>
+        <w:rPr>
+          <w:color w:val="000000"/>
+          <w:szCs w:val="24"/>
+          <w:shd w:val="clear" w:color="auto" w:fill="FFFFFF"/>
+        </w:rPr>
+        <w:t xml:space="preserve"> This library is impemented in C++ programming language. This work also deals with theoretical use of tensor.</w:t>
       </w:r>
     </w:p>
     <w:p>
@@ -2365,61 +1571,7 @@
           <w:szCs w:val="24"/>
           <w:shd w:val="clear" w:color="auto" w:fill="FFFFFF"/>
         </w:rPr>
-        <w:t xml:space="preserve">ensor, data </w:t>
-      </w:r>
-      <w:proofErr w:type="spellStart"/>
-      <w:r>
-        <w:rPr>
-          <w:color w:val="000000"/>
-          <w:szCs w:val="24"/>
-          <w:shd w:val="clear" w:color="auto" w:fill="FFFFFF"/>
-        </w:rPr>
-        <w:t>structures</w:t>
-      </w:r>
-      <w:proofErr w:type="spellEnd"/>
-      <w:r>
-        <w:rPr>
-          <w:color w:val="000000"/>
-          <w:szCs w:val="24"/>
-          <w:shd w:val="clear" w:color="auto" w:fill="FFFFFF"/>
-        </w:rPr>
-        <w:t xml:space="preserve">, </w:t>
-      </w:r>
-      <w:proofErr w:type="spellStart"/>
-      <w:r>
-        <w:rPr>
-          <w:color w:val="000000"/>
-          <w:szCs w:val="24"/>
-          <w:shd w:val="clear" w:color="auto" w:fill="FFFFFF"/>
-        </w:rPr>
-        <w:t>parallelization</w:t>
-      </w:r>
-      <w:proofErr w:type="spellEnd"/>
-      <w:r>
-        <w:rPr>
-          <w:color w:val="000000"/>
-          <w:szCs w:val="24"/>
-          <w:shd w:val="clear" w:color="auto" w:fill="FFFFFF"/>
-        </w:rPr>
-        <w:t xml:space="preserve">, </w:t>
-      </w:r>
-      <w:proofErr w:type="spellStart"/>
-      <w:r>
-        <w:rPr>
-          <w:color w:val="000000"/>
-          <w:szCs w:val="24"/>
-          <w:shd w:val="clear" w:color="auto" w:fill="FFFFFF"/>
-        </w:rPr>
-        <w:t>library</w:t>
-      </w:r>
-      <w:proofErr w:type="spellEnd"/>
-      <w:r>
-        <w:rPr>
-          <w:color w:val="000000"/>
-          <w:szCs w:val="24"/>
-          <w:shd w:val="clear" w:color="auto" w:fill="FFFFFF"/>
-        </w:rPr>
-        <w:t>, C++, matrix</w:t>
+        <w:t>ensor, data structures, parallelization, library, C++, matrix</w:t>
       </w:r>
     </w:p>
     <w:p>
@@ -2466,7 +1618,6 @@
           <w:noProof/>
           <w:kern w:val="2"/>
           <w:szCs w:val="24"/>
-          <w:lang/>
           <w14:ligatures w14:val="standardContextual"/>
         </w:rPr>
       </w:pPr>
@@ -2549,7 +1700,6 @@
           <w:noProof/>
           <w:kern w:val="2"/>
           <w:szCs w:val="24"/>
-          <w:lang/>
           <w14:ligatures w14:val="standardContextual"/>
         </w:rPr>
       </w:pPr>
@@ -2623,7 +1773,6 @@
           <w:noProof/>
           <w:kern w:val="2"/>
           <w:szCs w:val="24"/>
-          <w:lang/>
           <w14:ligatures w14:val="standardContextual"/>
         </w:rPr>
       </w:pPr>
@@ -2697,7 +1846,6 @@
           <w:noProof/>
           <w:kern w:val="2"/>
           <w:szCs w:val="24"/>
-          <w:lang/>
           <w14:ligatures w14:val="standardContextual"/>
         </w:rPr>
       </w:pPr>
@@ -2770,7 +1918,6 @@
           <w:noProof/>
           <w:kern w:val="2"/>
           <w:szCs w:val="24"/>
-          <w:lang/>
           <w14:ligatures w14:val="standardContextual"/>
         </w:rPr>
       </w:pPr>
@@ -2840,7 +1987,6 @@
           <w:noProof/>
           <w:kern w:val="2"/>
           <w:szCs w:val="24"/>
-          <w:lang/>
           <w14:ligatures w14:val="standardContextual"/>
         </w:rPr>
       </w:pPr>
@@ -2913,7 +2059,6 @@
           <w:noProof/>
           <w:kern w:val="2"/>
           <w:szCs w:val="24"/>
-          <w:lang/>
           <w14:ligatures w14:val="standardContextual"/>
         </w:rPr>
       </w:pPr>
@@ -2983,7 +2128,6 @@
           <w:noProof/>
           <w:kern w:val="2"/>
           <w:szCs w:val="24"/>
-          <w:lang/>
           <w14:ligatures w14:val="standardContextual"/>
         </w:rPr>
       </w:pPr>
@@ -3056,7 +2200,6 @@
           <w:noProof/>
           <w:kern w:val="2"/>
           <w:szCs w:val="24"/>
-          <w:lang/>
           <w14:ligatures w14:val="standardContextual"/>
         </w:rPr>
       </w:pPr>
@@ -3129,7 +2272,6 @@
           <w:noProof/>
           <w:kern w:val="2"/>
           <w:szCs w:val="24"/>
-          <w:lang/>
           <w14:ligatures w14:val="standardContextual"/>
         </w:rPr>
       </w:pPr>
@@ -3199,7 +2341,6 @@
           <w:noProof/>
           <w:kern w:val="2"/>
           <w:szCs w:val="24"/>
-          <w:lang/>
           <w14:ligatures w14:val="standardContextual"/>
         </w:rPr>
       </w:pPr>
@@ -3272,7 +2413,6 @@
           <w:noProof/>
           <w:kern w:val="2"/>
           <w:szCs w:val="24"/>
-          <w:lang/>
           <w14:ligatures w14:val="standardContextual"/>
         </w:rPr>
       </w:pPr>
@@ -3353,7 +2493,6 @@
           <w:noProof/>
           <w:kern w:val="2"/>
           <w:szCs w:val="24"/>
-          <w:lang/>
           <w14:ligatures w14:val="standardContextual"/>
         </w:rPr>
       </w:pPr>
@@ -3427,7 +2566,6 @@
           <w:noProof/>
           <w:kern w:val="2"/>
           <w:szCs w:val="24"/>
-          <w:lang/>
           <w14:ligatures w14:val="standardContextual"/>
         </w:rPr>
       </w:pPr>
@@ -3501,7 +2639,6 @@
           <w:noProof/>
           <w:kern w:val="2"/>
           <w:szCs w:val="24"/>
-          <w:lang/>
           <w14:ligatures w14:val="standardContextual"/>
         </w:rPr>
       </w:pPr>
@@ -3575,7 +2712,6 @@
           <w:noProof/>
           <w:kern w:val="2"/>
           <w:szCs w:val="24"/>
-          <w:lang/>
           <w14:ligatures w14:val="standardContextual"/>
         </w:rPr>
       </w:pPr>
@@ -3649,7 +2785,6 @@
           <w:noProof/>
           <w:kern w:val="2"/>
           <w:szCs w:val="24"/>
-          <w:lang/>
           <w14:ligatures w14:val="standardContextual"/>
         </w:rPr>
       </w:pPr>
@@ -3720,7 +2855,6 @@
           <w:noProof/>
           <w:kern w:val="2"/>
           <w:szCs w:val="24"/>
-          <w:lang/>
           <w14:ligatures w14:val="standardContextual"/>
         </w:rPr>
       </w:pPr>
@@ -3794,7 +2928,6 @@
           <w:noProof/>
           <w:kern w:val="2"/>
           <w:szCs w:val="24"/>
-          <w:lang/>
           <w14:ligatures w14:val="standardContextual"/>
         </w:rPr>
       </w:pPr>
@@ -3868,7 +3001,6 @@
           <w:noProof/>
           <w:kern w:val="2"/>
           <w:szCs w:val="24"/>
-          <w:lang/>
           <w14:ligatures w14:val="standardContextual"/>
         </w:rPr>
       </w:pPr>
@@ -3942,7 +3074,6 @@
           <w:noProof/>
           <w:kern w:val="2"/>
           <w:szCs w:val="24"/>
-          <w:lang/>
           <w14:ligatures w14:val="standardContextual"/>
         </w:rPr>
       </w:pPr>
@@ -4015,7 +3146,6 @@
           <w:noProof/>
           <w:kern w:val="2"/>
           <w:szCs w:val="24"/>
-          <w:lang/>
           <w14:ligatures w14:val="standardContextual"/>
         </w:rPr>
       </w:pPr>
@@ -4088,7 +3218,6 @@
           <w:noProof/>
           <w:kern w:val="2"/>
           <w:szCs w:val="24"/>
-          <w:lang/>
           <w14:ligatures w14:val="standardContextual"/>
         </w:rPr>
       </w:pPr>
@@ -4161,7 +3290,6 @@
           <w:noProof/>
           <w:kern w:val="2"/>
           <w:szCs w:val="24"/>
-          <w:lang/>
           <w14:ligatures w14:val="standardContextual"/>
         </w:rPr>
       </w:pPr>
@@ -4447,10 +3575,11 @@
           <w:noProof/>
           <w:kern w:val="2"/>
           <w:szCs w:val="24"/>
+          <w:lang/>
           <w14:ligatures w14:val="standardContextual"/>
         </w:rPr>
       </w:pPr>
-      <w:hyperlink w:anchor="_Toc227276220" w:history="1">
+      <w:hyperlink w:anchor="_Toc227521731" w:history="1">
         <w:r>
           <w:rPr>
             <w:rStyle w:val="Hypertextovodkaz"/>
@@ -4477,7 +3606,7 @@
             <w:noProof/>
             <w:webHidden/>
           </w:rPr>
-          <w:instrText xml:space="preserve"> PAGEREF _Toc227276220 \h </w:instrText>
+          <w:instrText xml:space="preserve"> PAGEREF _Toc227521731 \h </w:instrText>
         </w:r>
         <w:r>
           <w:rPr>
@@ -4497,7 +3626,7 @@
             <w:noProof/>
             <w:webHidden/>
           </w:rPr>
-          <w:t>15</w:t>
+          <w:t>18</w:t>
         </w:r>
         <w:r>
           <w:rPr>
@@ -4711,7 +3840,6 @@
           <w:docGrid w:linePitch="360"/>
         </w:sectPr>
       </w:pPr>
-      <w:proofErr w:type="spellStart"/>
       <w:r>
         <w:rPr>
           <w:b/>
@@ -4722,7 +3850,6 @@
         </w:rPr>
         <w:t>Overhead</w:t>
       </w:r>
-      <w:proofErr w:type="spellEnd"/>
       <w:r>
         <w:rPr>
           <w:color w:val="000000"/>
@@ -4977,21 +4104,7 @@
         <w:rPr>
           <w:szCs w:val="24"/>
         </w:rPr>
-        <w:t xml:space="preserve"> nebo n-</w:t>
-      </w:r>
-      <w:proofErr w:type="spellStart"/>
-      <w:r>
-        <w:rPr>
-          <w:szCs w:val="24"/>
-        </w:rPr>
-        <w:t>nární</w:t>
-      </w:r>
-      <w:proofErr w:type="spellEnd"/>
-      <w:r>
-        <w:rPr>
-          <w:szCs w:val="24"/>
-        </w:rPr>
-        <w:t xml:space="preserve"> strom založený na implicitních vztazích.</w:t>
+        <w:t xml:space="preserve"> nebo n-nární strom založený na implicitních vztazích.</w:t>
       </w:r>
     </w:p>
     <w:p>
@@ -5086,16 +4199,8 @@
         <w:rPr>
           <w:szCs w:val="24"/>
         </w:rPr>
-        <w:t xml:space="preserve">ozšíření knihovny </w:t>
-      </w:r>
-      <w:proofErr w:type="spellStart"/>
-      <w:r>
-        <w:rPr>
-          <w:szCs w:val="24"/>
-        </w:rPr>
-        <w:t>Eigen</w:t>
-      </w:r>
-      <w:proofErr w:type="spellEnd"/>
+        <w:t>ozšíření knihovny Eigen</w:t>
+      </w:r>
       <w:r>
         <w:rPr>
           <w:szCs w:val="24"/>
@@ -5133,21 +4238,7 @@
         <w:rPr>
           <w:szCs w:val="24"/>
         </w:rPr>
-        <w:t>také nabízí tenzor, to rozšíření je ovšem označeno jako „</w:t>
-      </w:r>
-      <w:proofErr w:type="spellStart"/>
-      <w:r>
-        <w:rPr>
-          <w:szCs w:val="24"/>
-        </w:rPr>
-        <w:t>unsupported</w:t>
-      </w:r>
-      <w:proofErr w:type="spellEnd"/>
-      <w:r>
-        <w:rPr>
-          <w:szCs w:val="24"/>
-        </w:rPr>
-        <w:t>“ a považováno jako nestabilní.</w:t>
+        <w:t>také nabízí tenzor, to rozšíření je ovšem označeno jako „unsupported“ a považováno jako nestabilní.</w:t>
       </w:r>
       <w:r>
         <w:rPr>
@@ -5155,19 +4246,11 @@
         </w:rPr>
         <w:t xml:space="preserve"> Zajímavý je také </w:t>
       </w:r>
-      <w:proofErr w:type="spellStart"/>
-      <w:r>
-        <w:rPr>
-          <w:szCs w:val="24"/>
-        </w:rPr>
-        <w:t>Cyclops</w:t>
-      </w:r>
-      <w:proofErr w:type="spellEnd"/>
-      <w:r>
-        <w:rPr>
-          <w:szCs w:val="24"/>
-        </w:rPr>
-        <w:t xml:space="preserve"> Tensor Framework</w:t>
+      <w:r>
+        <w:rPr>
+          <w:szCs w:val="24"/>
+        </w:rPr>
+        <w:t>Cyclops Tensor Framework</w:t>
       </w:r>
       <w:r>
         <w:rPr>
@@ -5283,83 +4366,13 @@
         <w:rPr>
           <w:szCs w:val="24"/>
         </w:rPr>
-        <w:t xml:space="preserve"> (</w:t>
-      </w:r>
-      <w:proofErr w:type="spellStart"/>
-      <w:r>
-        <w:rPr>
-          <w:szCs w:val="24"/>
-        </w:rPr>
-        <w:t>copyable</w:t>
-      </w:r>
-      <w:proofErr w:type="spellEnd"/>
-      <w:r>
-        <w:rPr>
-          <w:szCs w:val="24"/>
-        </w:rPr>
-        <w:t xml:space="preserve">) a </w:t>
-      </w:r>
-      <w:proofErr w:type="spellStart"/>
-      <w:r>
-        <w:rPr>
-          <w:szCs w:val="24"/>
-        </w:rPr>
-        <w:t>stěhovatelný</w:t>
-      </w:r>
-      <w:proofErr w:type="spellEnd"/>
-      <w:r>
-        <w:rPr>
-          <w:szCs w:val="24"/>
-        </w:rPr>
-        <w:t xml:space="preserve"> (</w:t>
-      </w:r>
-      <w:proofErr w:type="spellStart"/>
-      <w:r>
-        <w:rPr>
-          <w:szCs w:val="24"/>
-        </w:rPr>
-        <w:t>moveable</w:t>
-      </w:r>
-      <w:proofErr w:type="spellEnd"/>
-      <w:r>
-        <w:rPr>
-          <w:szCs w:val="24"/>
-        </w:rPr>
-        <w:t>)</w:t>
-      </w:r>
-      <w:r>
-        <w:rPr>
-          <w:szCs w:val="24"/>
-        </w:rPr>
-        <w:t xml:space="preserve"> a také je výchoze </w:t>
-      </w:r>
-      <w:proofErr w:type="spellStart"/>
-      <w:r>
-        <w:rPr>
-          <w:szCs w:val="24"/>
-        </w:rPr>
-        <w:t>konstruktibilní</w:t>
-      </w:r>
-      <w:proofErr w:type="spellEnd"/>
-      <w:r>
-        <w:rPr>
-          <w:szCs w:val="24"/>
-        </w:rPr>
-        <w:t xml:space="preserve"> (default </w:t>
-      </w:r>
-      <w:proofErr w:type="spellStart"/>
-      <w:r>
-        <w:rPr>
-          <w:szCs w:val="24"/>
-        </w:rPr>
-        <w:t>constructible</w:t>
-      </w:r>
-      <w:proofErr w:type="spellEnd"/>
-      <w:r>
-        <w:rPr>
-          <w:szCs w:val="24"/>
-        </w:rPr>
-        <w:t>).</w:t>
+        <w:t xml:space="preserve"> (copyable) a stěhovatelný (moveable)</w:t>
+      </w:r>
+      <w:r>
+        <w:rPr>
+          <w:szCs w:val="24"/>
+        </w:rPr>
+        <w:t xml:space="preserve"> a také je výchoze konstruktibilní (default constructible).</w:t>
       </w:r>
       <w:r>
         <w:rPr>
@@ -5469,6 +4482,32 @@
     </w:p>
     <w:p>
       <w:pPr>
+        <w:pStyle w:val="Nadpis2"/>
+      </w:pPr>
+      <w:r>
+        <w:t>1.2 UML</w:t>
+      </w:r>
+    </w:p>
+    <w:p>
+      <w:r>
+        <w:t>Xxx</w:t>
+      </w:r>
+    </w:p>
+    <w:p>
+      <w:pPr>
+        <w:pStyle w:val="Nadpis2"/>
+      </w:pPr>
+      <w:r>
+        <w:t>1.3 Logika tenzoru</w:t>
+      </w:r>
+    </w:p>
+    <w:p>
+      <w:r>
+        <w:t>Xxx</w:t>
+      </w:r>
+    </w:p>
+    <w:p>
+      <w:pPr>
         <w:pStyle w:val="Nadpis1"/>
         <w:jc w:val="both"/>
       </w:pPr>
@@ -5503,35 +4542,7 @@
         <w:rPr>
           <w:szCs w:val="24"/>
         </w:rPr>
-        <w:t>Samotná implementace této knihovny vynucuje přístup „</w:t>
-      </w:r>
-      <w:proofErr w:type="spellStart"/>
-      <w:r>
-        <w:rPr>
-          <w:szCs w:val="24"/>
-        </w:rPr>
-        <w:t>header-only</w:t>
-      </w:r>
-      <w:proofErr w:type="spellEnd"/>
-      <w:r>
-        <w:rPr>
-          <w:szCs w:val="24"/>
-        </w:rPr>
-        <w:t xml:space="preserve"> + source </w:t>
-      </w:r>
-      <w:proofErr w:type="spellStart"/>
-      <w:r>
-        <w:rPr>
-          <w:szCs w:val="24"/>
-        </w:rPr>
-        <w:t>code</w:t>
-      </w:r>
-      <w:proofErr w:type="spellEnd"/>
-      <w:r>
-        <w:rPr>
-          <w:szCs w:val="24"/>
-        </w:rPr>
-        <w:t>“ neboli přidání knihovny do uživatelského projektu pomocí hlavičkového souboru</w:t>
+        <w:t>Samotná implementace této knihovny vynucuje přístup „header-only + source code“ neboli přidání knihovny do uživatelského projektu pomocí hlavičkového souboru</w:t>
       </w:r>
       <w:r>
         <w:rPr>
@@ -5543,21 +4554,7 @@
         <w:rPr>
           <w:szCs w:val="24"/>
         </w:rPr>
-        <w:t>Kvůli použití šablon (</w:t>
-      </w:r>
-      <w:proofErr w:type="spellStart"/>
-      <w:r>
-        <w:rPr>
-          <w:szCs w:val="24"/>
-        </w:rPr>
-        <w:t>template</w:t>
-      </w:r>
-      <w:proofErr w:type="spellEnd"/>
-      <w:r>
-        <w:rPr>
-          <w:szCs w:val="24"/>
-        </w:rPr>
-        <w:t>) by bylo velice složité a nepraktické pokoušet se o předkompilovanou knihovnu – ať dynamickou či statickou.</w:t>
+        <w:t>Kvůli použití šablon (template) by bylo velice složité a nepraktické pokoušet se o předkompilovanou knihovnu – ať dynamickou či statickou.</w:t>
       </w:r>
       <w:r>
         <w:rPr>
@@ -5596,29 +4593,16 @@
       </w:pPr>
       <w:bookmarkStart w:id="8" w:name="_Toc227520785"/>
       <w:r>
-        <w:t xml:space="preserve">2.1.1 </w:t>
-      </w:r>
-      <w:proofErr w:type="spellStart"/>
-      <w:r>
-        <w:t>AdaptiveCpp</w:t>
+        <w:t>2.1.1 AdaptiveCpp</w:t>
       </w:r>
       <w:bookmarkEnd w:id="8"/>
-      <w:proofErr w:type="spellEnd"/>
     </w:p>
     <w:p>
       <w:pPr>
         <w:spacing w:line="360" w:lineRule="auto"/>
       </w:pPr>
       <w:r>
-        <w:t xml:space="preserve">Zajímavější je použitá knihovna </w:t>
-      </w:r>
-      <w:proofErr w:type="spellStart"/>
-      <w:r>
-        <w:t>AdaptiveCpp</w:t>
-      </w:r>
-      <w:proofErr w:type="spellEnd"/>
-      <w:r>
-        <w:t xml:space="preserve"> (</w:t>
+        <w:t>Zajímavější je použitá knihovna AdaptiveCpp (</w:t>
       </w:r>
       <w:hyperlink r:id="rId14" w:history="1">
         <w:r>
@@ -5654,216 +4638,134 @@
       <w:r>
         <w:t xml:space="preserve"> ) spravovaného </w:t>
       </w:r>
-      <w:proofErr w:type="spellStart"/>
-      <w:r>
-        <w:t>The</w:t>
-      </w:r>
-      <w:proofErr w:type="spellEnd"/>
-      <w:r>
+      <w:r>
+        <w:t>The Khronos Group</w:t>
+      </w:r>
+      <w:r>
+        <w:t>.</w:t>
+      </w:r>
+      <w:r>
+        <w:t xml:space="preserve"> SYCL standard definuje abstrakce pro umožnění heterogenního programování. To má umožnit použití více druhů výpočetních zařízení v jedné aplikaci. Například použití CPU (s možností jednoduché paralelizace), GPU a podobně.</w:t>
+      </w:r>
+      <w:r>
+        <w:t xml:space="preserve">AdaptiveCpp </w:t>
+      </w:r>
+      <w:r>
+        <w:t>funguje jako abstrakční vrstva</w:t>
+      </w:r>
+      <w:r>
+        <w:t>,</w:t>
+      </w:r>
+      <w:r>
+        <w:t xml:space="preserve"> co umí využít více různých backendů</w:t>
+      </w:r>
+      <w:r>
+        <w:t>: CUDA pro grafické karty od společnosti NVIDIA, ROCm/HIP pro grafické karty od AMD či OpenMD používající CPU (a tím pádem často používaný jako fallback).</w:t>
+      </w:r>
+      <w:r>
+        <w:t xml:space="preserve"> Funguje tak že, vezme SYCL kód, oddělí ho na host kód pro běh na CPU a kód pro zařízení, který je poté převeden kód používaného backendu.</w:t>
+      </w:r>
+    </w:p>
+    <w:p>
+      <w:pPr>
+        <w:pStyle w:val="Nadpis3"/>
+      </w:pPr>
+      <w:bookmarkStart w:id="9" w:name="_Toc227520786"/>
+      <w:r>
+        <w:t>2.1.2 Google test</w:t>
+      </w:r>
+      <w:bookmarkEnd w:id="9"/>
+    </w:p>
+    <w:p>
+      <w:r>
+        <w:t xml:space="preserve">Pro testování byl vybrán </w:t>
+      </w:r>
+      <w:r>
+        <w:t>framework Google</w:t>
+      </w:r>
+      <w:r>
+        <w:t>T</w:t>
+      </w:r>
+      <w:r>
+        <w:t>est.</w:t>
+      </w:r>
+      <w:r>
+        <w:t xml:space="preserve"> Je vhodný díky své jednoduchosti použití a integrace to projektu.</w:t>
+      </w:r>
+      <w:r>
+        <w:t xml:space="preserve"> Umí rozdělovat testy do skupin, a také měřit čas vykonání testu, čímž je vhodný i pro zátěžové testování.</w:t>
+      </w:r>
+    </w:p>
+    <w:p>
+      <w:pPr>
+        <w:pStyle w:val="Nadpis2"/>
+      </w:pPr>
+      <w:bookmarkStart w:id="10" w:name="_Toc227520787"/>
+      <w:r>
+        <w:t>2.</w:t>
+      </w:r>
+      <w:r>
+        <w:t>2</w:t>
+      </w:r>
+      <w:r>
+        <w:t xml:space="preserve"> Komponenty</w:t>
+      </w:r>
+      <w:bookmarkEnd w:id="10"/>
+    </w:p>
+    <w:p>
+      <w:pPr>
+        <w:spacing w:line="360" w:lineRule="auto"/>
+      </w:pPr>
+      <w:r>
+        <w:t>Práce je a její komponenty jsou ve jmenném prostoru zvaném „gema“. Je to neoficiální název používaný uvnitř projektu.</w:t>
+      </w:r>
+    </w:p>
+    <w:p>
+      <w:pPr>
+        <w:pStyle w:val="Nadpis3"/>
+        <w:rPr>
+          <w:noProof/>
+          <w:lang w:eastAsia="cs-CZ"/>
+        </w:rPr>
+      </w:pPr>
+      <w:bookmarkStart w:id="11" w:name="_Toc227520788"/>
+      <w:r>
+        <w:t>2.</w:t>
+      </w:r>
+      <w:r>
+        <w:t>2</w:t>
+      </w:r>
+      <w:r>
+        <w:t>.1</w:t>
+      </w:r>
+      <w:r>
+        <w:rPr>
+          <w:noProof/>
+          <w:lang w:eastAsia="cs-CZ"/>
+        </w:rPr>
         <w:t xml:space="preserve"> </w:t>
       </w:r>
-      <w:proofErr w:type="spellStart"/>
-      <w:r>
-        <w:t>Khronos</w:t>
-      </w:r>
-      <w:proofErr w:type="spellEnd"/>
-      <w:r>
-        <w:t xml:space="preserve"> Group</w:t>
-      </w:r>
-      <w:r>
-        <w:t>.</w:t>
-      </w:r>
-      <w:r>
-        <w:t xml:space="preserve"> SYCL standard definuje abstrakce pro umožnění heterogenního programování. To má umožnit použití více druhů výpočetních zařízení v jedné aplikaci. Například použití CPU (s možností jednoduché paralelizace), GPU a </w:t>
-      </w:r>
-      <w:proofErr w:type="spellStart"/>
-      <w:proofErr w:type="gramStart"/>
-      <w:r>
-        <w:t>podobně.</w:t>
-      </w:r>
-      <w:r>
-        <w:t>AdaptiveCpp</w:t>
-      </w:r>
-      <w:proofErr w:type="spellEnd"/>
-      <w:proofErr w:type="gramEnd"/>
-      <w:r>
-        <w:t xml:space="preserve"> </w:t>
-      </w:r>
-      <w:r>
-        <w:t>funguje jako abstrakční vrstva</w:t>
-      </w:r>
-      <w:r>
-        <w:t>,</w:t>
-      </w:r>
-      <w:r>
-        <w:t xml:space="preserve"> co umí využít více různých </w:t>
-      </w:r>
-      <w:proofErr w:type="spellStart"/>
-      <w:r>
-        <w:t>backendů</w:t>
-      </w:r>
-      <w:proofErr w:type="spellEnd"/>
-      <w:r>
-        <w:t xml:space="preserve">: CUDA pro grafické karty od společnosti NVIDIA, </w:t>
-      </w:r>
-      <w:proofErr w:type="spellStart"/>
-      <w:r>
-        <w:t>ROCm</w:t>
-      </w:r>
-      <w:proofErr w:type="spellEnd"/>
-      <w:r>
-        <w:t xml:space="preserve">/HIP pro grafické karty od AMD či </w:t>
-      </w:r>
-      <w:proofErr w:type="spellStart"/>
-      <w:r>
-        <w:t>OpenMD</w:t>
-      </w:r>
-      <w:proofErr w:type="spellEnd"/>
-      <w:r>
-        <w:t xml:space="preserve"> používající CPU (a tím pádem často používaný jako </w:t>
-      </w:r>
-      <w:proofErr w:type="spellStart"/>
-      <w:r>
-        <w:t>fallback</w:t>
-      </w:r>
-      <w:proofErr w:type="spellEnd"/>
-      <w:r>
-        <w:t>).</w:t>
-      </w:r>
-      <w:r>
-        <w:t xml:space="preserve"> Funguje tak že, vezme SYCL kód, oddělí ho na host kód pro běh na CPU a kód pro zařízení, který je poté převeden kód používaného </w:t>
-      </w:r>
-      <w:proofErr w:type="spellStart"/>
-      <w:r>
-        <w:t>backendu</w:t>
-      </w:r>
-      <w:proofErr w:type="spellEnd"/>
-      <w:r>
-        <w:t>.</w:t>
-      </w:r>
-    </w:p>
-    <w:p>
-      <w:pPr>
-        <w:pStyle w:val="Nadpis3"/>
-      </w:pPr>
-      <w:bookmarkStart w:id="9" w:name="_Toc227520786"/>
-      <w:r>
-        <w:t>2.1.2 Google test</w:t>
-      </w:r>
-      <w:bookmarkEnd w:id="9"/>
-    </w:p>
-    <w:p>
-      <w:r>
-        <w:t xml:space="preserve">Pro testování byl vybrán </w:t>
-      </w:r>
-      <w:r>
-        <w:t xml:space="preserve">framework </w:t>
-      </w:r>
-      <w:proofErr w:type="spellStart"/>
-      <w:r>
-        <w:t>Google</w:t>
-      </w:r>
-      <w:r>
-        <w:t>T</w:t>
-      </w:r>
-      <w:r>
-        <w:t>est</w:t>
-      </w:r>
-      <w:proofErr w:type="spellEnd"/>
-      <w:r>
-        <w:t>.</w:t>
-      </w:r>
-      <w:r>
-        <w:t xml:space="preserve"> Je vhodný díky své jednoduchosti použití a integrace to projektu.</w:t>
-      </w:r>
-      <w:r>
-        <w:t xml:space="preserve"> Umí rozdělovat testy do skupin, a také měřit čas vykonání testu, čímž je vhodný i pro zátěžové testování.</w:t>
-      </w:r>
-    </w:p>
-    <w:p>
-      <w:pPr>
-        <w:pStyle w:val="Nadpis2"/>
-      </w:pPr>
-      <w:bookmarkStart w:id="10" w:name="_Toc227520787"/>
-      <w:r>
-        <w:t>2.</w:t>
-      </w:r>
-      <w:r>
-        <w:t>2</w:t>
-      </w:r>
-      <w:r>
-        <w:t xml:space="preserve"> Komponenty</w:t>
-      </w:r>
-      <w:bookmarkEnd w:id="10"/>
+      <w:r>
+        <w:rPr>
+          <w:noProof/>
+          <w:lang w:eastAsia="cs-CZ"/>
+        </w:rPr>
+        <w:t>Lineární kontejner</w:t>
+      </w:r>
+      <w:bookmarkEnd w:id="11"/>
     </w:p>
     <w:p>
       <w:pPr>
         <w:spacing w:line="360" w:lineRule="auto"/>
-      </w:pPr>
-      <w:r>
-        <w:t>Práce je a její komponenty jsou ve jmenném prostoru zvaném „gema“. Je to neoficiální název používaný uvnitř projektu.</w:t>
-      </w:r>
-    </w:p>
-    <w:p>
-      <w:pPr>
-        <w:pStyle w:val="Nadpis3"/>
-        <w:rPr>
-          <w:noProof/>
-          <w:lang w:eastAsia="cs-CZ"/>
-        </w:rPr>
-      </w:pPr>
-      <w:bookmarkStart w:id="11" w:name="_Toc227520788"/>
-      <w:r>
-        <w:t>2.</w:t>
-      </w:r>
-      <w:r>
-        <w:t>2</w:t>
-      </w:r>
-      <w:r>
-        <w:t>.1</w:t>
-      </w:r>
-      <w:r>
-        <w:rPr>
-          <w:noProof/>
-          <w:lang w:eastAsia="cs-CZ"/>
-        </w:rPr>
-        <w:t xml:space="preserve"> </w:t>
-      </w:r>
-      <w:r>
-        <w:rPr>
-          <w:noProof/>
-          <w:lang w:eastAsia="cs-CZ"/>
-        </w:rPr>
-        <w:t>Lineární kontejner</w:t>
-      </w:r>
-      <w:bookmarkEnd w:id="11"/>
-    </w:p>
-    <w:p>
-      <w:pPr>
-        <w:spacing w:line="360" w:lineRule="auto"/>
-        <w:rPr>
-          <w:lang w:eastAsia="cs-CZ"/>
-        </w:rPr>
-      </w:pPr>
-      <w:r>
-        <w:rPr>
-          <w:lang w:eastAsia="cs-CZ"/>
-        </w:rPr>
-        <w:t>V projektu jako třída „</w:t>
-      </w:r>
-      <w:proofErr w:type="spellStart"/>
-      <w:r>
-        <w:rPr>
-          <w:lang w:eastAsia="cs-CZ"/>
-        </w:rPr>
-        <w:t>LinearContainer</w:t>
-      </w:r>
-      <w:proofErr w:type="spellEnd"/>
-      <w:r>
-        <w:rPr>
-          <w:lang w:eastAsia="cs-CZ"/>
-        </w:rPr>
-        <w:t xml:space="preserve">“. </w:t>
+        <w:rPr>
+          <w:lang w:eastAsia="cs-CZ"/>
+        </w:rPr>
+      </w:pPr>
+      <w:r>
+        <w:rPr>
+          <w:lang w:eastAsia="cs-CZ"/>
+        </w:rPr>
+        <w:t xml:space="preserve">V projektu jako třída „LinearContainer“. </w:t>
       </w:r>
       <w:r>
         <w:rPr>
@@ -5887,57 +4789,13 @@
         <w:rPr>
           <w:lang w:eastAsia="cs-CZ"/>
         </w:rPr>
-        <w:t>Používá šablonu (</w:t>
-      </w:r>
-      <w:proofErr w:type="spellStart"/>
-      <w:r>
-        <w:rPr>
-          <w:lang w:eastAsia="cs-CZ"/>
-        </w:rPr>
-        <w:t>template</w:t>
-      </w:r>
-      <w:proofErr w:type="spellEnd"/>
-      <w:r>
-        <w:rPr>
-          <w:lang w:eastAsia="cs-CZ"/>
-        </w:rPr>
-        <w:t xml:space="preserve">) pro možnost uložení libovolného datového typu. </w:t>
-      </w:r>
-      <w:r>
-        <w:rPr>
-          <w:lang w:eastAsia="cs-CZ"/>
-        </w:rPr>
-        <w:t xml:space="preserve">Motivace k jeho implementaci je potřeba kontejneru s rozhraním napodobujícím </w:t>
-      </w:r>
-      <w:proofErr w:type="spellStart"/>
-      <w:proofErr w:type="gramStart"/>
-      <w:r>
-        <w:rPr>
-          <w:lang w:eastAsia="cs-CZ"/>
-        </w:rPr>
-        <w:t>std</w:t>
-      </w:r>
-      <w:proofErr w:type="spellEnd"/>
-      <w:r>
-        <w:rPr>
-          <w:lang w:eastAsia="cs-CZ"/>
-        </w:rPr>
-        <w:t>::</w:t>
-      </w:r>
-      <w:proofErr w:type="spellStart"/>
-      <w:proofErr w:type="gramEnd"/>
-      <w:r>
-        <w:rPr>
-          <w:lang w:eastAsia="cs-CZ"/>
-        </w:rPr>
-        <w:t>vector</w:t>
-      </w:r>
-      <w:proofErr w:type="spellEnd"/>
-      <w:r>
-        <w:rPr>
-          <w:lang w:eastAsia="cs-CZ"/>
-        </w:rPr>
-        <w:t xml:space="preserve">, ale bez nevyhnutelné inicializace paměti. </w:t>
+        <w:t xml:space="preserve">Používá šablonu (template) pro možnost uložení libovolného datového typu. </w:t>
+      </w:r>
+      <w:r>
+        <w:rPr>
+          <w:lang w:eastAsia="cs-CZ"/>
+        </w:rPr>
+        <w:t xml:space="preserve">Motivace k jeho implementaci je potřeba kontejneru s rozhraním napodobujícím std::vector, ale bez nevyhnutelné inicializace paměti. </w:t>
       </w:r>
       <w:r>
         <w:rPr>
@@ -5970,16 +4828,8 @@
         <w:rPr>
           <w:lang w:eastAsia="cs-CZ"/>
         </w:rPr>
-        <w:t xml:space="preserve">Jak již naznačuje držení kapacity, tak je tento kontejner navržen i na postupné přidávání prvků pomocí metody </w:t>
-      </w:r>
-      <w:proofErr w:type="spellStart"/>
-      <w:r>
-        <w:rPr>
-          <w:lang w:eastAsia="cs-CZ"/>
-        </w:rPr>
-        <w:t>push_back</w:t>
-      </w:r>
-      <w:proofErr w:type="spellEnd"/>
+        <w:t>Jak již naznačuje držení kapacity, tak je tento kontejner navržen i na postupné přidávání prvků pomocí metody push_back</w:t>
+      </w:r>
       <w:r>
         <w:rPr>
           <w:lang w:eastAsia="cs-CZ"/>
@@ -6082,99 +4932,13 @@
         <w:rPr>
           <w:lang w:eastAsia="cs-CZ"/>
         </w:rPr>
-        <w:t xml:space="preserve"> Tento alokátor řeší </w:t>
-      </w:r>
-      <w:proofErr w:type="gramStart"/>
-      <w:r>
-        <w:rPr>
-          <w:lang w:eastAsia="cs-CZ"/>
-        </w:rPr>
-        <w:t>použití ::</w:t>
-      </w:r>
-      <w:proofErr w:type="spellStart"/>
-      <w:r>
-        <w:rPr>
-          <w:lang w:eastAsia="cs-CZ"/>
-        </w:rPr>
-        <w:t>operator</w:t>
-      </w:r>
-      <w:proofErr w:type="spellEnd"/>
-      <w:proofErr w:type="gramEnd"/>
-      <w:r>
-        <w:rPr>
-          <w:lang w:eastAsia="cs-CZ"/>
-        </w:rPr>
-        <w:t xml:space="preserve"> </w:t>
-      </w:r>
-      <w:proofErr w:type="spellStart"/>
-      <w:r>
-        <w:rPr>
-          <w:lang w:eastAsia="cs-CZ"/>
-        </w:rPr>
-        <w:t>new</w:t>
-      </w:r>
-      <w:proofErr w:type="spellEnd"/>
-      <w:r>
-        <w:rPr>
-          <w:lang w:eastAsia="cs-CZ"/>
-        </w:rPr>
-        <w:t xml:space="preserve"> </w:t>
-      </w:r>
-      <w:proofErr w:type="gramStart"/>
-      <w:r>
-        <w:rPr>
-          <w:lang w:eastAsia="cs-CZ"/>
-        </w:rPr>
-        <w:t>a ::</w:t>
-      </w:r>
-      <w:proofErr w:type="spellStart"/>
-      <w:r>
-        <w:rPr>
-          <w:lang w:eastAsia="cs-CZ"/>
-        </w:rPr>
-        <w:t>operator</w:t>
-      </w:r>
-      <w:proofErr w:type="spellEnd"/>
-      <w:proofErr w:type="gramEnd"/>
-      <w:r>
-        <w:rPr>
-          <w:lang w:eastAsia="cs-CZ"/>
-        </w:rPr>
-        <w:t xml:space="preserve"> </w:t>
-      </w:r>
-      <w:proofErr w:type="spellStart"/>
-      <w:r>
-        <w:rPr>
-          <w:lang w:eastAsia="cs-CZ"/>
-        </w:rPr>
-        <w:t>delete</w:t>
-      </w:r>
-      <w:proofErr w:type="spellEnd"/>
-      <w:r>
-        <w:rPr>
-          <w:lang w:eastAsia="cs-CZ"/>
-        </w:rPr>
-        <w:t>, pro získání neinicializované paměti.</w:t>
-      </w:r>
-      <w:r>
-        <w:rPr>
-          <w:lang w:eastAsia="cs-CZ"/>
-        </w:rPr>
-        <w:t xml:space="preserve"> Také se snaží o zarovnání alokace na určitý počet bytů kvůli větší </w:t>
-      </w:r>
-      <w:proofErr w:type="spellStart"/>
-      <w:r>
-        <w:rPr>
-          <w:lang w:eastAsia="cs-CZ"/>
-        </w:rPr>
-        <w:t>cache</w:t>
-      </w:r>
-      <w:proofErr w:type="spellEnd"/>
-      <w:r>
-        <w:rPr>
-          <w:lang w:eastAsia="cs-CZ"/>
-        </w:rPr>
-        <w:t xml:space="preserve"> přívětivosti (která často čte po 64 bytech) a také případným SIMD instrukcím, které kompilátor poté může jednodušeji uplatnit</w:t>
+        <w:t xml:space="preserve"> Tento alokátor řeší použití ::operator new a ::operator delete, pro získání neinicializované paměti.</w:t>
+      </w:r>
+      <w:r>
+        <w:rPr>
+          <w:lang w:eastAsia="cs-CZ"/>
+        </w:rPr>
+        <w:t xml:space="preserve"> Také se snaží o zarovnání alokace na určitý počet bytů kvůli větší cache přívětivosti (která často čte po 64 bytech) a také případným SIMD instrukcím, které kompilátor poté může jednodušeji uplatnit</w:t>
       </w:r>
       <w:r>
         <w:rPr>
@@ -6223,135 +4987,23 @@
         </w:rPr>
         <w:t xml:space="preserve">Pro kopírování, porovnávání či konstrukci a destrukci jsou v případě triviálně manipulovatelných typů (kontrolováno například pomocí </w:t>
       </w:r>
-      <w:proofErr w:type="spellStart"/>
-      <w:proofErr w:type="gramStart"/>
-      <w:r>
-        <w:rPr>
-          <w:lang w:eastAsia="cs-CZ"/>
-        </w:rPr>
-        <w:t>std</w:t>
-      </w:r>
-      <w:proofErr w:type="spellEnd"/>
-      <w:r>
-        <w:rPr>
-          <w:lang w:eastAsia="cs-CZ"/>
-        </w:rPr>
-        <w:t>::</w:t>
-      </w:r>
-      <w:proofErr w:type="spellStart"/>
-      <w:proofErr w:type="gramEnd"/>
-      <w:r>
-        <w:rPr>
-          <w:lang w:eastAsia="cs-CZ"/>
-        </w:rPr>
-        <w:t>is_trivially_copyable_v</w:t>
-      </w:r>
-      <w:proofErr w:type="spellEnd"/>
-      <w:r>
-        <w:rPr>
-          <w:lang w:eastAsia="cs-CZ"/>
-        </w:rPr>
-        <w:t>&lt;T&gt;</w:t>
-      </w:r>
-      <w:r>
-        <w:rPr>
-          <w:lang w:eastAsia="cs-CZ"/>
-        </w:rPr>
-        <w:t xml:space="preserve">) jsou použity </w:t>
-      </w:r>
-      <w:proofErr w:type="spellStart"/>
-      <w:r>
-        <w:rPr>
-          <w:lang w:eastAsia="cs-CZ"/>
-        </w:rPr>
-        <w:t>nízkoúrovňové</w:t>
-      </w:r>
-      <w:proofErr w:type="spellEnd"/>
-      <w:r>
-        <w:rPr>
-          <w:lang w:eastAsia="cs-CZ"/>
-        </w:rPr>
-        <w:t xml:space="preserve"> funkce standartní knihovny jako například </w:t>
-      </w:r>
-      <w:proofErr w:type="spellStart"/>
-      <w:proofErr w:type="gramStart"/>
-      <w:r>
-        <w:rPr>
-          <w:lang w:eastAsia="cs-CZ"/>
-        </w:rPr>
-        <w:t>std</w:t>
-      </w:r>
-      <w:proofErr w:type="spellEnd"/>
-      <w:r>
-        <w:rPr>
-          <w:lang w:eastAsia="cs-CZ"/>
-        </w:rPr>
-        <w:t>::</w:t>
-      </w:r>
-      <w:proofErr w:type="spellStart"/>
-      <w:proofErr w:type="gramEnd"/>
-      <w:r>
-        <w:rPr>
-          <w:lang w:eastAsia="cs-CZ"/>
-        </w:rPr>
-        <w:t>memcpy</w:t>
-      </w:r>
-      <w:proofErr w:type="spellEnd"/>
-      <w:r>
-        <w:rPr>
-          <w:lang w:eastAsia="cs-CZ"/>
-        </w:rPr>
-        <w:t xml:space="preserve"> či </w:t>
-      </w:r>
-      <w:proofErr w:type="spellStart"/>
-      <w:proofErr w:type="gramStart"/>
-      <w:r>
-        <w:rPr>
-          <w:lang w:eastAsia="cs-CZ"/>
-        </w:rPr>
-        <w:t>std</w:t>
-      </w:r>
-      <w:proofErr w:type="spellEnd"/>
-      <w:r>
-        <w:rPr>
-          <w:lang w:eastAsia="cs-CZ"/>
-        </w:rPr>
-        <w:t>::</w:t>
-      </w:r>
-      <w:proofErr w:type="spellStart"/>
-      <w:proofErr w:type="gramEnd"/>
-      <w:r>
-        <w:rPr>
-          <w:lang w:eastAsia="cs-CZ"/>
-        </w:rPr>
-        <w:t>memcmp</w:t>
-      </w:r>
-      <w:proofErr w:type="spellEnd"/>
-      <w:r>
-        <w:rPr>
-          <w:lang w:eastAsia="cs-CZ"/>
-        </w:rPr>
-        <w:t xml:space="preserve"> a podobně.</w:t>
-      </w:r>
-      <w:r>
-        <w:rPr>
-          <w:lang w:eastAsia="cs-CZ"/>
-        </w:rPr>
-        <w:t xml:space="preserve"> Jestli jde takovéto operace (téměř s jistotou by se dalo říct optimalizace) jde na daném typu skutečně provést jde vykonat během kompilace a není tím pádem žádný </w:t>
-      </w:r>
-      <w:proofErr w:type="spellStart"/>
-      <w:r>
-        <w:rPr>
-          <w:lang w:eastAsia="cs-CZ"/>
-        </w:rPr>
-        <w:t>overhead</w:t>
-      </w:r>
-      <w:proofErr w:type="spellEnd"/>
-      <w:r>
-        <w:rPr>
-          <w:lang w:eastAsia="cs-CZ"/>
-        </w:rPr>
-        <w:t>.</w:t>
+      <w:r>
+        <w:rPr>
+          <w:lang w:eastAsia="cs-CZ"/>
+        </w:rPr>
+        <w:t>std::is_trivially_copyable_v&lt;T&gt;</w:t>
+      </w:r>
+      <w:r>
+        <w:rPr>
+          <w:lang w:eastAsia="cs-CZ"/>
+        </w:rPr>
+        <w:t>) jsou použity nízkoúrovňové funkce standartní knihovny jako například std::memcpy či std::memcmp a podobně.</w:t>
+      </w:r>
+      <w:r>
+        <w:rPr>
+          <w:lang w:eastAsia="cs-CZ"/>
+        </w:rPr>
+        <w:t xml:space="preserve"> Jestli jde takovéto operace (téměř s jistotou by se dalo říct optimalizace) jde na daném typu skutečně provést jde vykonat během kompilace a není tím pádem žádný overhead.</w:t>
       </w:r>
     </w:p>
     <w:p>
@@ -6365,37 +5017,7 @@
         <w:rPr>
           <w:lang w:eastAsia="cs-CZ"/>
         </w:rPr>
-        <w:t xml:space="preserve">Z venkovního hlediska se rozhraní této třídy velmi podobá </w:t>
-      </w:r>
-      <w:proofErr w:type="spellStart"/>
-      <w:proofErr w:type="gramStart"/>
-      <w:r>
-        <w:rPr>
-          <w:lang w:eastAsia="cs-CZ"/>
-        </w:rPr>
-        <w:t>std</w:t>
-      </w:r>
-      <w:proofErr w:type="spellEnd"/>
-      <w:r>
-        <w:rPr>
-          <w:lang w:eastAsia="cs-CZ"/>
-        </w:rPr>
-        <w:t>::</w:t>
-      </w:r>
-      <w:proofErr w:type="spellStart"/>
-      <w:proofErr w:type="gramEnd"/>
-      <w:r>
-        <w:rPr>
-          <w:lang w:eastAsia="cs-CZ"/>
-        </w:rPr>
-        <w:t>vector</w:t>
-      </w:r>
-      <w:proofErr w:type="spellEnd"/>
-      <w:r>
-        <w:rPr>
-          <w:lang w:eastAsia="cs-CZ"/>
-        </w:rPr>
-        <w:t xml:space="preserve"> ze standartní knihovny.</w:t>
+        <w:t>Z venkovního hlediska se rozhraní této třídy velmi podobá std::vector ze standartní knihovny.</w:t>
       </w:r>
       <w:r>
         <w:rPr>
@@ -6413,21 +5035,7 @@
         <w:rPr>
           <w:lang w:eastAsia="cs-CZ"/>
         </w:rPr>
-        <w:t xml:space="preserve">se kopírovat i stěhovat díky copy a </w:t>
-      </w:r>
-      <w:proofErr w:type="spellStart"/>
-      <w:r>
-        <w:rPr>
-          <w:lang w:eastAsia="cs-CZ"/>
-        </w:rPr>
-        <w:t>move</w:t>
-      </w:r>
-      <w:proofErr w:type="spellEnd"/>
-      <w:r>
-        <w:rPr>
-          <w:lang w:eastAsia="cs-CZ"/>
-        </w:rPr>
-        <w:t xml:space="preserve"> konstruktoru a </w:t>
+        <w:t xml:space="preserve">se kopírovat i stěhovat díky copy a move konstruktoru a </w:t>
       </w:r>
       <w:r>
         <w:rPr>
@@ -6457,21 +5065,7 @@
         <w:rPr>
           <w:lang w:eastAsia="cs-CZ"/>
         </w:rPr>
-        <w:t xml:space="preserve"> metody </w:t>
-      </w:r>
-      <w:proofErr w:type="gramStart"/>
-      <w:r>
-        <w:rPr>
-          <w:lang w:eastAsia="cs-CZ"/>
-        </w:rPr>
-        <w:t>data(</w:t>
-      </w:r>
-      <w:proofErr w:type="gramEnd"/>
-      <w:r>
-        <w:rPr>
-          <w:lang w:eastAsia="cs-CZ"/>
-        </w:rPr>
-        <w:t xml:space="preserve">)) </w:t>
+        <w:t xml:space="preserve"> metody data()) </w:t>
       </w:r>
       <w:r>
         <w:rPr>
@@ -6485,19 +5079,11 @@
         </w:rPr>
         <w:t>použít přetížení indexovacího operátoru ([]) pro přístup na jednotlivé prvky (v </w:t>
       </w:r>
-      <w:proofErr w:type="gramStart"/>
-      <w:r>
-        <w:rPr>
-          <w:lang w:eastAsia="cs-CZ"/>
-        </w:rPr>
-        <w:t>O(</w:t>
-      </w:r>
-      <w:proofErr w:type="gramEnd"/>
-      <w:r>
-        <w:rPr>
-          <w:lang w:eastAsia="cs-CZ"/>
-        </w:rPr>
-        <w:t>1)</w:t>
+      <w:r>
+        <w:rPr>
+          <w:lang w:eastAsia="cs-CZ"/>
+        </w:rPr>
+        <w:t>O(1)</w:t>
       </w:r>
       <w:r>
         <w:rPr>
@@ -6527,51 +5113,7 @@
         <w:rPr>
           <w:lang w:eastAsia="cs-CZ"/>
         </w:rPr>
-        <w:t xml:space="preserve">, ze stejného rozhraní u </w:t>
-      </w:r>
-      <w:proofErr w:type="spellStart"/>
-      <w:proofErr w:type="gramStart"/>
-      <w:r>
-        <w:rPr>
-          <w:lang w:eastAsia="cs-CZ"/>
-        </w:rPr>
-        <w:t>std</w:t>
-      </w:r>
-      <w:proofErr w:type="spellEnd"/>
-      <w:r>
-        <w:rPr>
-          <w:lang w:eastAsia="cs-CZ"/>
-        </w:rPr>
-        <w:t>::</w:t>
-      </w:r>
-      <w:proofErr w:type="spellStart"/>
-      <w:proofErr w:type="gramEnd"/>
-      <w:r>
-        <w:rPr>
-          <w:lang w:eastAsia="cs-CZ"/>
-        </w:rPr>
-        <w:t>vector</w:t>
-      </w:r>
-      <w:proofErr w:type="spellEnd"/>
-      <w:r>
-        <w:rPr>
-          <w:lang w:eastAsia="cs-CZ"/>
-        </w:rPr>
-        <w:t xml:space="preserve"> dostat </w:t>
-      </w:r>
-      <w:proofErr w:type="spellStart"/>
-      <w:r>
-        <w:rPr>
-          <w:lang w:eastAsia="cs-CZ"/>
-        </w:rPr>
-        <w:t>iterátory</w:t>
-      </w:r>
-      <w:proofErr w:type="spellEnd"/>
-      <w:r>
-        <w:rPr>
-          <w:lang w:eastAsia="cs-CZ"/>
-        </w:rPr>
-        <w:t xml:space="preserve"> jak dopředu</w:t>
+        <w:t>, ze stejného rozhraní u std::vector dostat iterátory jak dopředu</w:t>
       </w:r>
       <w:r>
         <w:rPr>
@@ -6589,27 +5131,7 @@
         <w:rPr>
           <w:lang w:eastAsia="cs-CZ"/>
         </w:rPr>
-        <w:t xml:space="preserve">, kde je </w:t>
-      </w:r>
-      <w:proofErr w:type="spellStart"/>
-      <w:r>
-        <w:rPr>
-          <w:lang w:eastAsia="cs-CZ"/>
-        </w:rPr>
-        <w:t>iterátor</w:t>
-      </w:r>
-      <w:proofErr w:type="spellEnd"/>
-      <w:r>
-        <w:rPr>
-          <w:lang w:eastAsia="cs-CZ"/>
-        </w:rPr>
-        <w:t xml:space="preserve"> jednoduše </w:t>
-      </w:r>
-      <w:r>
-        <w:rPr>
-          <w:lang w:eastAsia="cs-CZ"/>
-        </w:rPr>
-        <w:t>ukazatel</w:t>
+        <w:t>. Iterátor je pro jednoduchost ukazatel, což je jednoduché a efektivní</w:t>
       </w:r>
       <w:r>
         <w:rPr>
@@ -6702,14 +5224,90 @@
           <w:lang w:eastAsia="cs-CZ"/>
         </w:rPr>
       </w:pPr>
-      <w:proofErr w:type="spellStart"/>
+      <w:r>
+        <w:rPr>
+          <w:lang w:eastAsia="cs-CZ"/>
+        </w:rPr>
+        <w:t>Jedná se o „hlavní“ třídu celé práce. Je navržen a implementován tak, aby byl univerzální, dynamický s širokým využitím.</w:t>
+      </w:r>
+      <w:r>
+        <w:rPr>
+          <w:lang w:eastAsia="cs-CZ"/>
+        </w:rPr>
+        <w:t xml:space="preserve"> </w:t>
+      </w:r>
+      <w:r>
+        <w:rPr>
+          <w:lang w:eastAsia="cs-CZ"/>
+        </w:rPr>
+        <w:t xml:space="preserve">V projektu se nazývá „Tensor“. </w:t>
+      </w:r>
+      <w:r>
+        <w:rPr>
+          <w:lang w:eastAsia="cs-CZ"/>
+        </w:rPr>
+        <w:t xml:space="preserve">Stejně jako lineární kontejner, tak je tato třída šablonovaná pro versatilní ukládání různých datových typů. </w:t>
+      </w:r>
+      <w:r>
+        <w:rPr>
+          <w:lang w:eastAsia="cs-CZ"/>
+        </w:rPr>
+        <w:t xml:space="preserve">Používá </w:t>
+      </w:r>
+      <w:r>
+        <w:rPr>
+          <w:lang w:eastAsia="cs-CZ"/>
+        </w:rPr>
+        <w:t>v sobě lineární kontejner pro udržení dat.</w:t>
+      </w:r>
+    </w:p>
+    <w:p>
+      <w:pPr>
+        <w:pStyle w:val="Nadpis3"/>
+        <w:rPr>
+          <w:lang w:eastAsia="cs-CZ"/>
+        </w:rPr>
+      </w:pPr>
+      <w:bookmarkStart w:id="13" w:name="_Toc227520790"/>
+      <w:r>
+        <w:rPr>
+          <w:lang w:eastAsia="cs-CZ"/>
+        </w:rPr>
+        <w:t>2.</w:t>
+      </w:r>
+      <w:r>
+        <w:rPr>
+          <w:lang w:eastAsia="cs-CZ"/>
+        </w:rPr>
+        <w:t>2</w:t>
+      </w:r>
+      <w:r>
+        <w:rPr>
+          <w:lang w:eastAsia="cs-CZ"/>
+        </w:rPr>
+        <w:t>.3</w:t>
+      </w:r>
+      <w:r>
+        <w:rPr>
+          <w:lang w:eastAsia="cs-CZ"/>
+        </w:rPr>
+        <w:t xml:space="preserve"> Paralelní tenzor</w:t>
+      </w:r>
+      <w:bookmarkEnd w:id="13"/>
+    </w:p>
+    <w:p>
+      <w:pPr>
+        <w:spacing w:line="360" w:lineRule="auto"/>
+        <w:rPr>
+          <w:lang w:eastAsia="cs-CZ"/>
+        </w:rPr>
+      </w:pPr>
       <w:r>
         <w:rPr>
           <w:lang w:eastAsia="cs-CZ"/>
         </w:rPr>
         <w:t>Xxx</w:t>
       </w:r>
-      <w:proofErr w:type="spellEnd"/>
     </w:p>
     <w:p>
       <w:pPr>
@@ -6718,7 +5316,7 @@
           <w:lang w:eastAsia="cs-CZ"/>
         </w:rPr>
       </w:pPr>
-      <w:bookmarkStart w:id="13" w:name="_Toc227520790"/>
+      <w:bookmarkStart w:id="14" w:name="_Toc227520791"/>
       <w:r>
         <w:rPr>
           <w:lang w:eastAsia="cs-CZ"/>
@@ -6735,15 +5333,15 @@
         <w:rPr>
           <w:lang w:eastAsia="cs-CZ"/>
         </w:rPr>
-        <w:t>.3</w:t>
-      </w:r>
-      <w:r>
-        <w:rPr>
-          <w:lang w:eastAsia="cs-CZ"/>
-        </w:rPr>
-        <w:t xml:space="preserve"> Paralelní tenzor</w:t>
-      </w:r>
-      <w:bookmarkEnd w:id="13"/>
+        <w:t>.4</w:t>
+      </w:r>
+      <w:r>
+        <w:rPr>
+          <w:lang w:eastAsia="cs-CZ"/>
+        </w:rPr>
+        <w:t xml:space="preserve"> Matice</w:t>
+      </w:r>
+      <w:bookmarkEnd w:id="14"/>
     </w:p>
     <w:p>
       <w:pPr>
@@ -6752,14 +5350,12 @@
           <w:lang w:eastAsia="cs-CZ"/>
         </w:rPr>
       </w:pPr>
-      <w:proofErr w:type="spellStart"/>
       <w:r>
         <w:rPr>
           <w:lang w:eastAsia="cs-CZ"/>
         </w:rPr>
         <w:t>Xxx</w:t>
       </w:r>
-      <w:proofErr w:type="spellEnd"/>
     </w:p>
     <w:p>
       <w:pPr>
@@ -6768,7 +5364,7 @@
           <w:lang w:eastAsia="cs-CZ"/>
         </w:rPr>
       </w:pPr>
-      <w:bookmarkStart w:id="14" w:name="_Toc227520791"/>
+      <w:bookmarkStart w:id="15" w:name="_Toc227520792"/>
       <w:r>
         <w:rPr>
           <w:lang w:eastAsia="cs-CZ"/>
@@ -6785,15 +5381,15 @@
         <w:rPr>
           <w:lang w:eastAsia="cs-CZ"/>
         </w:rPr>
-        <w:t>.4</w:t>
-      </w:r>
-      <w:r>
-        <w:rPr>
-          <w:lang w:eastAsia="cs-CZ"/>
-        </w:rPr>
-        <w:t xml:space="preserve"> Matice</w:t>
-      </w:r>
-      <w:bookmarkEnd w:id="14"/>
+        <w:t>.</w:t>
+      </w:r>
+      <w:r>
+        <w:rPr>
+          <w:lang w:eastAsia="cs-CZ"/>
+        </w:rPr>
+        <w:t>5 Paralelní matice</w:t>
+      </w:r>
+      <w:bookmarkEnd w:id="15"/>
     </w:p>
     <w:p>
       <w:pPr>
@@ -6802,14 +5398,12 @@
           <w:lang w:eastAsia="cs-CZ"/>
         </w:rPr>
       </w:pPr>
-      <w:proofErr w:type="spellStart"/>
       <w:r>
         <w:rPr>
           <w:lang w:eastAsia="cs-CZ"/>
         </w:rPr>
         <w:t>Xxx</w:t>
       </w:r>
-      <w:proofErr w:type="spellEnd"/>
     </w:p>
     <w:p>
       <w:pPr>
@@ -6818,7 +5412,7 @@
           <w:lang w:eastAsia="cs-CZ"/>
         </w:rPr>
       </w:pPr>
-      <w:bookmarkStart w:id="15" w:name="_Toc227520792"/>
+      <w:bookmarkStart w:id="16" w:name="_Toc227520793"/>
       <w:r>
         <w:rPr>
           <w:lang w:eastAsia="cs-CZ"/>
@@ -6841,9 +5435,9 @@
         <w:rPr>
           <w:lang w:eastAsia="cs-CZ"/>
         </w:rPr>
-        <w:t>5 Paralelní matice</w:t>
-      </w:r>
-      <w:bookmarkEnd w:id="15"/>
+        <w:t>6 N-nární strom</w:t>
+      </w:r>
+      <w:bookmarkEnd w:id="16"/>
     </w:p>
     <w:p>
       <w:pPr>
@@ -6852,14 +5446,54 @@
           <w:lang w:eastAsia="cs-CZ"/>
         </w:rPr>
       </w:pPr>
-      <w:proofErr w:type="spellStart"/>
       <w:r>
         <w:rPr>
           <w:lang w:eastAsia="cs-CZ"/>
         </w:rPr>
         <w:t>Xxx</w:t>
       </w:r>
-      <w:proofErr w:type="spellEnd"/>
+    </w:p>
+    <w:p>
+      <w:pPr>
+        <w:pStyle w:val="Nadpis2"/>
+        <w:rPr>
+          <w:lang w:eastAsia="cs-CZ"/>
+        </w:rPr>
+      </w:pPr>
+      <w:bookmarkStart w:id="17" w:name="_Toc227520794"/>
+      <w:r>
+        <w:rPr>
+          <w:lang w:eastAsia="cs-CZ"/>
+        </w:rPr>
+        <w:t>2.</w:t>
+      </w:r>
+      <w:r>
+        <w:rPr>
+          <w:lang w:eastAsia="cs-CZ"/>
+        </w:rPr>
+        <w:t>3</w:t>
+      </w:r>
+      <w:r>
+        <w:rPr>
+          <w:lang w:eastAsia="cs-CZ"/>
+        </w:rPr>
+        <w:t xml:space="preserve"> Testy</w:t>
+      </w:r>
+      <w:bookmarkEnd w:id="17"/>
+    </w:p>
+    <w:p>
+      <w:pPr>
+        <w:spacing w:line="360" w:lineRule="auto"/>
+        <w:rPr>
+          <w:lang w:eastAsia="cs-CZ"/>
+        </w:rPr>
+      </w:pPr>
+      <w:r>
+        <w:rPr>
+          <w:lang w:eastAsia="cs-CZ"/>
+        </w:rPr>
+        <w:t>Xxx</w:t>
+      </w:r>
     </w:p>
     <w:p>
       <w:pPr>
@@ -6868,7 +5502,7 @@
           <w:lang w:eastAsia="cs-CZ"/>
         </w:rPr>
       </w:pPr>
-      <w:bookmarkStart w:id="16" w:name="_Toc227520793"/>
+      <w:bookmarkStart w:id="18" w:name="_Toc227520795"/>
       <w:r>
         <w:rPr>
           <w:lang w:eastAsia="cs-CZ"/>
@@ -6879,35 +5513,15 @@
         <w:rPr>
           <w:lang w:eastAsia="cs-CZ"/>
         </w:rPr>
-        <w:t>2</w:t>
-      </w:r>
-      <w:r>
-        <w:rPr>
-          <w:lang w:eastAsia="cs-CZ"/>
-        </w:rPr>
-        <w:t>.</w:t>
-      </w:r>
-      <w:r>
-        <w:rPr>
-          <w:lang w:eastAsia="cs-CZ"/>
-        </w:rPr>
-        <w:t>6 N-</w:t>
-      </w:r>
-      <w:proofErr w:type="spellStart"/>
-      <w:r>
-        <w:rPr>
-          <w:lang w:eastAsia="cs-CZ"/>
-        </w:rPr>
-        <w:t>nární</w:t>
-      </w:r>
-      <w:proofErr w:type="spellEnd"/>
-      <w:r>
-        <w:rPr>
-          <w:lang w:eastAsia="cs-CZ"/>
-        </w:rPr>
-        <w:t xml:space="preserve"> strom</w:t>
-      </w:r>
-      <w:bookmarkEnd w:id="16"/>
+        <w:t>3</w:t>
+      </w:r>
+      <w:r>
+        <w:rPr>
+          <w:lang w:eastAsia="cs-CZ"/>
+        </w:rPr>
+        <w:t>.1 Unit testování</w:t>
+      </w:r>
+      <w:bookmarkEnd w:id="18"/>
     </w:p>
     <w:p>
       <w:pPr>
@@ -6916,23 +5530,21 @@
           <w:lang w:eastAsia="cs-CZ"/>
         </w:rPr>
       </w:pPr>
-      <w:proofErr w:type="spellStart"/>
       <w:r>
         <w:rPr>
           <w:lang w:eastAsia="cs-CZ"/>
         </w:rPr>
         <w:t>Xxx</w:t>
       </w:r>
-      <w:proofErr w:type="spellEnd"/>
-    </w:p>
-    <w:p>
-      <w:pPr>
-        <w:pStyle w:val="Nadpis2"/>
-        <w:rPr>
-          <w:lang w:eastAsia="cs-CZ"/>
-        </w:rPr>
-      </w:pPr>
-      <w:bookmarkStart w:id="17" w:name="_Toc227520794"/>
+    </w:p>
+    <w:p>
+      <w:pPr>
+        <w:pStyle w:val="Nadpis3"/>
+        <w:rPr>
+          <w:lang w:eastAsia="cs-CZ"/>
+        </w:rPr>
+      </w:pPr>
+      <w:bookmarkStart w:id="19" w:name="_Toc227520796"/>
       <w:r>
         <w:rPr>
           <w:lang w:eastAsia="cs-CZ"/>
@@ -6949,9 +5561,9 @@
         <w:rPr>
           <w:lang w:eastAsia="cs-CZ"/>
         </w:rPr>
-        <w:t xml:space="preserve"> Testy</w:t>
-      </w:r>
-      <w:bookmarkEnd w:id="17"/>
+        <w:t>.2 Zátěžové testování</w:t>
+      </w:r>
+      <w:bookmarkEnd w:id="19"/>
     </w:p>
     <w:p>
       <w:pPr>
@@ -6960,102 +5572,12 @@
           <w:lang w:eastAsia="cs-CZ"/>
         </w:rPr>
       </w:pPr>
-      <w:proofErr w:type="spellStart"/>
       <w:r>
         <w:rPr>
           <w:lang w:eastAsia="cs-CZ"/>
         </w:rPr>
         <w:t>Xxx</w:t>
       </w:r>
-      <w:proofErr w:type="spellEnd"/>
-    </w:p>
-    <w:p>
-      <w:pPr>
-        <w:pStyle w:val="Nadpis3"/>
-        <w:rPr>
-          <w:lang w:eastAsia="cs-CZ"/>
-        </w:rPr>
-      </w:pPr>
-      <w:bookmarkStart w:id="18" w:name="_Toc227520795"/>
-      <w:r>
-        <w:rPr>
-          <w:lang w:eastAsia="cs-CZ"/>
-        </w:rPr>
-        <w:t>2.</w:t>
-      </w:r>
-      <w:r>
-        <w:rPr>
-          <w:lang w:eastAsia="cs-CZ"/>
-        </w:rPr>
-        <w:t>3</w:t>
-      </w:r>
-      <w:r>
-        <w:rPr>
-          <w:lang w:eastAsia="cs-CZ"/>
-        </w:rPr>
-        <w:t>.1 Unit testování</w:t>
-      </w:r>
-      <w:bookmarkEnd w:id="18"/>
-    </w:p>
-    <w:p>
-      <w:pPr>
-        <w:spacing w:line="360" w:lineRule="auto"/>
-        <w:rPr>
-          <w:lang w:eastAsia="cs-CZ"/>
-        </w:rPr>
-      </w:pPr>
-      <w:proofErr w:type="spellStart"/>
-      <w:r>
-        <w:rPr>
-          <w:lang w:eastAsia="cs-CZ"/>
-        </w:rPr>
-        <w:t>Xxx</w:t>
-      </w:r>
-      <w:proofErr w:type="spellEnd"/>
-    </w:p>
-    <w:p>
-      <w:pPr>
-        <w:pStyle w:val="Nadpis3"/>
-        <w:rPr>
-          <w:lang w:eastAsia="cs-CZ"/>
-        </w:rPr>
-      </w:pPr>
-      <w:bookmarkStart w:id="19" w:name="_Toc227520796"/>
-      <w:r>
-        <w:rPr>
-          <w:lang w:eastAsia="cs-CZ"/>
-        </w:rPr>
-        <w:t>2.</w:t>
-      </w:r>
-      <w:r>
-        <w:rPr>
-          <w:lang w:eastAsia="cs-CZ"/>
-        </w:rPr>
-        <w:t>3</w:t>
-      </w:r>
-      <w:r>
-        <w:rPr>
-          <w:lang w:eastAsia="cs-CZ"/>
-        </w:rPr>
-        <w:t>.2 Zátěžové testování</w:t>
-      </w:r>
-      <w:bookmarkEnd w:id="19"/>
-    </w:p>
-    <w:p>
-      <w:pPr>
-        <w:spacing w:line="360" w:lineRule="auto"/>
-        <w:rPr>
-          <w:lang w:eastAsia="cs-CZ"/>
-        </w:rPr>
-      </w:pPr>
-      <w:proofErr w:type="spellStart"/>
-      <w:r>
-        <w:rPr>
-          <w:lang w:eastAsia="cs-CZ"/>
-        </w:rPr>
-        <w:t>Xxx</w:t>
-      </w:r>
-      <w:proofErr w:type="spellEnd"/>
     </w:p>
     <w:p>
       <w:pPr>
@@ -7079,20 +5601,17 @@
       <w:pPr>
         <w:pStyle w:val="Nadpis1"/>
       </w:pPr>
-      <w:bookmarkStart w:id="20" w:name="_Toc227276220"/>
-      <w:bookmarkStart w:id="21" w:name="_Toc227520797"/>
+      <w:bookmarkStart w:id="20" w:name="_Toc227520797"/>
       <w:r>
         <w:lastRenderedPageBreak/>
         <w:t>3 TEORETICKÉ VYUŽITÍ</w:t>
       </w:r>
-      <w:bookmarkEnd w:id="21"/>
-    </w:p>
-    <w:p>
-      <w:proofErr w:type="spellStart"/>
+      <w:bookmarkEnd w:id="20"/>
+    </w:p>
+    <w:p>
       <w:r>
         <w:t>Xxx</w:t>
       </w:r>
-      <w:proofErr w:type="spellEnd"/>
     </w:p>
     <w:p>
       <w:pPr>
@@ -7112,6 +5631,7 @@
           <w:szCs w:val="24"/>
         </w:rPr>
       </w:pPr>
+      <w:bookmarkStart w:id="21" w:name="_Toc227521731"/>
       <w:r>
         <w:rPr>
           <w:i w:val="0"/>
@@ -7186,7 +5706,7 @@
         </w:rPr>
         <w:t>Vzdělanostní struktura obyvatelstva České republiky (2021)</w:t>
       </w:r>
-      <w:bookmarkEnd w:id="20"/>
+      <w:bookmarkEnd w:id="21"/>
     </w:p>
     <w:tbl>
       <w:tblPr>
@@ -8237,32 +6757,22 @@
           <w:sz w:val="24"/>
           <w:szCs w:val="24"/>
         </w:rPr>
-        <w:t xml:space="preserve">, </w:t>
-      </w:r>
-      <w:proofErr w:type="spellStart"/>
+        <w:t>, Jungyeon</w:t>
+      </w:r>
       <w:r>
         <w:rPr>
           <w:sz w:val="24"/>
           <w:szCs w:val="24"/>
         </w:rPr>
-        <w:t>Jungyeon</w:t>
-      </w:r>
-      <w:proofErr w:type="spellEnd"/>
+        <w:t>, 2016</w:t>
+      </w:r>
       <w:r>
         <w:rPr>
           <w:sz w:val="24"/>
           <w:szCs w:val="24"/>
         </w:rPr>
-        <w:t>, 2016</w:t>
-      </w:r>
-      <w:r>
-        <w:rPr>
-          <w:sz w:val="24"/>
-          <w:szCs w:val="24"/>
-        </w:rPr>
         <w:t xml:space="preserve">. </w:t>
       </w:r>
-      <w:proofErr w:type="spellStart"/>
       <w:r>
         <w:rPr>
           <w:i/>
@@ -8272,7 +6782,6 @@
         </w:rPr>
         <w:t>Balloons</w:t>
       </w:r>
-      <w:proofErr w:type="spellEnd"/>
       <w:r>
         <w:rPr>
           <w:sz w:val="24"/>
@@ -8294,7 +6803,6 @@
         </w:rPr>
         <w:t xml:space="preserve">In: </w:t>
       </w:r>
-      <w:proofErr w:type="spellStart"/>
       <w:r>
         <w:rPr>
           <w:sz w:val="24"/>
@@ -8302,7 +6810,6 @@
         </w:rPr>
         <w:t>Pixabay</w:t>
       </w:r>
-      <w:proofErr w:type="spellEnd"/>
       <w:r>
         <w:rPr>
           <w:sz w:val="24"/>
@@ -9150,6 +7657,7 @@
   <w:style w:type="character" w:default="1" w:styleId="Standardnpsmoodstavce">
     <w:name w:val="Default Paragraph Font"/>
     <w:uiPriority w:val="1"/>
+    <w:semiHidden/>
     <w:unhideWhenUsed/>
   </w:style>
   <w:style w:type="table" w:default="1" w:styleId="Normlntabulka">

</xml_diff>

<commit_message>
dokumentace - logika tenzoru začátek + začátek implementace tenzoru.
</commit_message>
<xml_diff>
--- a/ŠpaňúrM_KnihovnaProPraci_JM_2026.docx
+++ b/ŠpaňúrM_KnihovnaProPraci_JM_2026.docx
@@ -1433,13 +1433,86 @@
           <w:szCs w:val="24"/>
         </w:rPr>
       </w:pPr>
-      <w:r>
-        <w:rPr>
-          <w:color w:val="000000"/>
-          <w:szCs w:val="24"/>
-          <w:shd w:val="clear" w:color="auto" w:fill="FFFFFF"/>
-        </w:rPr>
-        <w:t>Library for work with ten</w:t>
+      <w:proofErr w:type="spellStart"/>
+      <w:r>
+        <w:rPr>
+          <w:color w:val="000000"/>
+          <w:szCs w:val="24"/>
+          <w:shd w:val="clear" w:color="auto" w:fill="FFFFFF"/>
+        </w:rPr>
+        <w:t>Library</w:t>
+      </w:r>
+      <w:proofErr w:type="spellEnd"/>
+      <w:r>
+        <w:rPr>
+          <w:color w:val="000000"/>
+          <w:szCs w:val="24"/>
+          <w:shd w:val="clear" w:color="auto" w:fill="FFFFFF"/>
+        </w:rPr>
+        <w:t xml:space="preserve"> </w:t>
+      </w:r>
+      <w:proofErr w:type="spellStart"/>
+      <w:r>
+        <w:rPr>
+          <w:color w:val="000000"/>
+          <w:szCs w:val="24"/>
+          <w:shd w:val="clear" w:color="auto" w:fill="FFFFFF"/>
+        </w:rPr>
+        <w:t>for</w:t>
+      </w:r>
+      <w:proofErr w:type="spellEnd"/>
+      <w:r>
+        <w:rPr>
+          <w:color w:val="000000"/>
+          <w:szCs w:val="24"/>
+          <w:shd w:val="clear" w:color="auto" w:fill="FFFFFF"/>
+        </w:rPr>
+        <w:t xml:space="preserve"> </w:t>
+      </w:r>
+      <w:proofErr w:type="spellStart"/>
+      <w:r>
+        <w:rPr>
+          <w:color w:val="000000"/>
+          <w:szCs w:val="24"/>
+          <w:shd w:val="clear" w:color="auto" w:fill="FFFFFF"/>
+        </w:rPr>
+        <w:t>work</w:t>
+      </w:r>
+      <w:proofErr w:type="spellEnd"/>
+      <w:r>
+        <w:rPr>
+          <w:color w:val="000000"/>
+          <w:szCs w:val="24"/>
+          <w:shd w:val="clear" w:color="auto" w:fill="FFFFFF"/>
+        </w:rPr>
+        <w:t xml:space="preserve"> </w:t>
+      </w:r>
+      <w:proofErr w:type="spellStart"/>
+      <w:r>
+        <w:rPr>
+          <w:color w:val="000000"/>
+          <w:szCs w:val="24"/>
+          <w:shd w:val="clear" w:color="auto" w:fill="FFFFFF"/>
+        </w:rPr>
+        <w:t>with</w:t>
+      </w:r>
+      <w:proofErr w:type="spellEnd"/>
+      <w:r>
+        <w:rPr>
+          <w:color w:val="000000"/>
+          <w:szCs w:val="24"/>
+          <w:shd w:val="clear" w:color="auto" w:fill="FFFFFF"/>
+        </w:rPr>
+        <w:t xml:space="preserve"> </w:t>
+      </w:r>
+      <w:proofErr w:type="spellStart"/>
+      <w:r>
+        <w:rPr>
+          <w:color w:val="000000"/>
+          <w:szCs w:val="24"/>
+          <w:shd w:val="clear" w:color="auto" w:fill="FFFFFF"/>
+        </w:rPr>
+        <w:t>ten</w:t>
       </w:r>
       <w:r>
         <w:rPr>
@@ -1455,7 +1528,16 @@
           <w:szCs w:val="24"/>
           <w:shd w:val="clear" w:color="auto" w:fill="FFFFFF"/>
         </w:rPr>
-        <w:t>ors in C++</w:t>
+        <w:t>ors</w:t>
+      </w:r>
+      <w:proofErr w:type="spellEnd"/>
+      <w:r>
+        <w:rPr>
+          <w:color w:val="000000"/>
+          <w:szCs w:val="24"/>
+          <w:shd w:val="clear" w:color="auto" w:fill="FFFFFF"/>
+        </w:rPr>
+        <w:t xml:space="preserve"> in C++</w:t>
       </w:r>
     </w:p>
     <w:p>
@@ -1489,37 +1571,749 @@
           <w:shd w:val="clear" w:color="auto" w:fill="FFFFFF"/>
         </w:rPr>
       </w:pPr>
-      <w:r>
-        <w:rPr>
-          <w:color w:val="000000"/>
-          <w:szCs w:val="24"/>
-          <w:shd w:val="clear" w:color="auto" w:fill="FFFFFF"/>
-        </w:rPr>
-        <w:t>This work deals with implementation of library working with tensor as a data structure.</w:t>
-      </w:r>
-      <w:r>
-        <w:rPr>
-          <w:color w:val="000000"/>
-          <w:szCs w:val="24"/>
-          <w:shd w:val="clear" w:color="auto" w:fill="FFFFFF"/>
-        </w:rPr>
-        <w:t xml:space="preserve"> Library allows parallelization of some tensor operations on graphics card.</w:t>
-      </w:r>
-      <w:r>
-        <w:rPr>
-          <w:color w:val="000000"/>
-          <w:szCs w:val="24"/>
-          <w:shd w:val="clear" w:color="auto" w:fill="FFFFFF"/>
-        </w:rPr>
-        <w:t xml:space="preserve"> Along with tensor there are available other helper data structures, for instance a tensor specialization as a matrix.</w:t>
-      </w:r>
-      <w:r>
-        <w:rPr>
-          <w:color w:val="000000"/>
-          <w:szCs w:val="24"/>
-          <w:shd w:val="clear" w:color="auto" w:fill="FFFFFF"/>
-        </w:rPr>
-        <w:t xml:space="preserve"> This library is impemented in C++ programming language. This work also deals with theoretical use of tensor.</w:t>
+      <w:proofErr w:type="spellStart"/>
+      <w:r>
+        <w:rPr>
+          <w:color w:val="000000"/>
+          <w:szCs w:val="24"/>
+          <w:shd w:val="clear" w:color="auto" w:fill="FFFFFF"/>
+        </w:rPr>
+        <w:t>This</w:t>
+      </w:r>
+      <w:proofErr w:type="spellEnd"/>
+      <w:r>
+        <w:rPr>
+          <w:color w:val="000000"/>
+          <w:szCs w:val="24"/>
+          <w:shd w:val="clear" w:color="auto" w:fill="FFFFFF"/>
+        </w:rPr>
+        <w:t xml:space="preserve"> </w:t>
+      </w:r>
+      <w:proofErr w:type="spellStart"/>
+      <w:r>
+        <w:rPr>
+          <w:color w:val="000000"/>
+          <w:szCs w:val="24"/>
+          <w:shd w:val="clear" w:color="auto" w:fill="FFFFFF"/>
+        </w:rPr>
+        <w:t>work</w:t>
+      </w:r>
+      <w:proofErr w:type="spellEnd"/>
+      <w:r>
+        <w:rPr>
+          <w:color w:val="000000"/>
+          <w:szCs w:val="24"/>
+          <w:shd w:val="clear" w:color="auto" w:fill="FFFFFF"/>
+        </w:rPr>
+        <w:t xml:space="preserve"> </w:t>
+      </w:r>
+      <w:proofErr w:type="spellStart"/>
+      <w:r>
+        <w:rPr>
+          <w:color w:val="000000"/>
+          <w:szCs w:val="24"/>
+          <w:shd w:val="clear" w:color="auto" w:fill="FFFFFF"/>
+        </w:rPr>
+        <w:t>deals</w:t>
+      </w:r>
+      <w:proofErr w:type="spellEnd"/>
+      <w:r>
+        <w:rPr>
+          <w:color w:val="000000"/>
+          <w:szCs w:val="24"/>
+          <w:shd w:val="clear" w:color="auto" w:fill="FFFFFF"/>
+        </w:rPr>
+        <w:t xml:space="preserve"> </w:t>
+      </w:r>
+      <w:proofErr w:type="spellStart"/>
+      <w:r>
+        <w:rPr>
+          <w:color w:val="000000"/>
+          <w:szCs w:val="24"/>
+          <w:shd w:val="clear" w:color="auto" w:fill="FFFFFF"/>
+        </w:rPr>
+        <w:t>with</w:t>
+      </w:r>
+      <w:proofErr w:type="spellEnd"/>
+      <w:r>
+        <w:rPr>
+          <w:color w:val="000000"/>
+          <w:szCs w:val="24"/>
+          <w:shd w:val="clear" w:color="auto" w:fill="FFFFFF"/>
+        </w:rPr>
+        <w:t xml:space="preserve"> </w:t>
+      </w:r>
+      <w:proofErr w:type="spellStart"/>
+      <w:r>
+        <w:rPr>
+          <w:color w:val="000000"/>
+          <w:szCs w:val="24"/>
+          <w:shd w:val="clear" w:color="auto" w:fill="FFFFFF"/>
+        </w:rPr>
+        <w:t>implementation</w:t>
+      </w:r>
+      <w:proofErr w:type="spellEnd"/>
+      <w:r>
+        <w:rPr>
+          <w:color w:val="000000"/>
+          <w:szCs w:val="24"/>
+          <w:shd w:val="clear" w:color="auto" w:fill="FFFFFF"/>
+        </w:rPr>
+        <w:t xml:space="preserve"> </w:t>
+      </w:r>
+      <w:proofErr w:type="spellStart"/>
+      <w:r>
+        <w:rPr>
+          <w:color w:val="000000"/>
+          <w:szCs w:val="24"/>
+          <w:shd w:val="clear" w:color="auto" w:fill="FFFFFF"/>
+        </w:rPr>
+        <w:t>of</w:t>
+      </w:r>
+      <w:proofErr w:type="spellEnd"/>
+      <w:r>
+        <w:rPr>
+          <w:color w:val="000000"/>
+          <w:szCs w:val="24"/>
+          <w:shd w:val="clear" w:color="auto" w:fill="FFFFFF"/>
+        </w:rPr>
+        <w:t xml:space="preserve"> </w:t>
+      </w:r>
+      <w:proofErr w:type="spellStart"/>
+      <w:r>
+        <w:rPr>
+          <w:color w:val="000000"/>
+          <w:szCs w:val="24"/>
+          <w:shd w:val="clear" w:color="auto" w:fill="FFFFFF"/>
+        </w:rPr>
+        <w:t>library</w:t>
+      </w:r>
+      <w:proofErr w:type="spellEnd"/>
+      <w:r>
+        <w:rPr>
+          <w:color w:val="000000"/>
+          <w:szCs w:val="24"/>
+          <w:shd w:val="clear" w:color="auto" w:fill="FFFFFF"/>
+        </w:rPr>
+        <w:t xml:space="preserve"> </w:t>
+      </w:r>
+      <w:proofErr w:type="spellStart"/>
+      <w:r>
+        <w:rPr>
+          <w:color w:val="000000"/>
+          <w:szCs w:val="24"/>
+          <w:shd w:val="clear" w:color="auto" w:fill="FFFFFF"/>
+        </w:rPr>
+        <w:t>working</w:t>
+      </w:r>
+      <w:proofErr w:type="spellEnd"/>
+      <w:r>
+        <w:rPr>
+          <w:color w:val="000000"/>
+          <w:szCs w:val="24"/>
+          <w:shd w:val="clear" w:color="auto" w:fill="FFFFFF"/>
+        </w:rPr>
+        <w:t xml:space="preserve"> </w:t>
+      </w:r>
+      <w:proofErr w:type="spellStart"/>
+      <w:r>
+        <w:rPr>
+          <w:color w:val="000000"/>
+          <w:szCs w:val="24"/>
+          <w:shd w:val="clear" w:color="auto" w:fill="FFFFFF"/>
+        </w:rPr>
+        <w:t>with</w:t>
+      </w:r>
+      <w:proofErr w:type="spellEnd"/>
+      <w:r>
+        <w:rPr>
+          <w:color w:val="000000"/>
+          <w:szCs w:val="24"/>
+          <w:shd w:val="clear" w:color="auto" w:fill="FFFFFF"/>
+        </w:rPr>
+        <w:t xml:space="preserve"> tensor as a data </w:t>
+      </w:r>
+      <w:proofErr w:type="spellStart"/>
+      <w:r>
+        <w:rPr>
+          <w:color w:val="000000"/>
+          <w:szCs w:val="24"/>
+          <w:shd w:val="clear" w:color="auto" w:fill="FFFFFF"/>
+        </w:rPr>
+        <w:t>structure</w:t>
+      </w:r>
+      <w:proofErr w:type="spellEnd"/>
+      <w:r>
+        <w:rPr>
+          <w:color w:val="000000"/>
+          <w:szCs w:val="24"/>
+          <w:shd w:val="clear" w:color="auto" w:fill="FFFFFF"/>
+        </w:rPr>
+        <w:t>.</w:t>
+      </w:r>
+      <w:r>
+        <w:rPr>
+          <w:color w:val="000000"/>
+          <w:szCs w:val="24"/>
+          <w:shd w:val="clear" w:color="auto" w:fill="FFFFFF"/>
+        </w:rPr>
+        <w:t xml:space="preserve"> </w:t>
+      </w:r>
+      <w:proofErr w:type="spellStart"/>
+      <w:r>
+        <w:rPr>
+          <w:color w:val="000000"/>
+          <w:szCs w:val="24"/>
+          <w:shd w:val="clear" w:color="auto" w:fill="FFFFFF"/>
+        </w:rPr>
+        <w:t>Library</w:t>
+      </w:r>
+      <w:proofErr w:type="spellEnd"/>
+      <w:r>
+        <w:rPr>
+          <w:color w:val="000000"/>
+          <w:szCs w:val="24"/>
+          <w:shd w:val="clear" w:color="auto" w:fill="FFFFFF"/>
+        </w:rPr>
+        <w:t xml:space="preserve"> </w:t>
+      </w:r>
+      <w:proofErr w:type="spellStart"/>
+      <w:r>
+        <w:rPr>
+          <w:color w:val="000000"/>
+          <w:szCs w:val="24"/>
+          <w:shd w:val="clear" w:color="auto" w:fill="FFFFFF"/>
+        </w:rPr>
+        <w:t>allows</w:t>
+      </w:r>
+      <w:proofErr w:type="spellEnd"/>
+      <w:r>
+        <w:rPr>
+          <w:color w:val="000000"/>
+          <w:szCs w:val="24"/>
+          <w:shd w:val="clear" w:color="auto" w:fill="FFFFFF"/>
+        </w:rPr>
+        <w:t xml:space="preserve"> </w:t>
+      </w:r>
+      <w:proofErr w:type="spellStart"/>
+      <w:r>
+        <w:rPr>
+          <w:color w:val="000000"/>
+          <w:szCs w:val="24"/>
+          <w:shd w:val="clear" w:color="auto" w:fill="FFFFFF"/>
+        </w:rPr>
+        <w:t>parallelization</w:t>
+      </w:r>
+      <w:proofErr w:type="spellEnd"/>
+      <w:r>
+        <w:rPr>
+          <w:color w:val="000000"/>
+          <w:szCs w:val="24"/>
+          <w:shd w:val="clear" w:color="auto" w:fill="FFFFFF"/>
+        </w:rPr>
+        <w:t xml:space="preserve"> </w:t>
+      </w:r>
+      <w:proofErr w:type="spellStart"/>
+      <w:r>
+        <w:rPr>
+          <w:color w:val="000000"/>
+          <w:szCs w:val="24"/>
+          <w:shd w:val="clear" w:color="auto" w:fill="FFFFFF"/>
+        </w:rPr>
+        <w:t>of</w:t>
+      </w:r>
+      <w:proofErr w:type="spellEnd"/>
+      <w:r>
+        <w:rPr>
+          <w:color w:val="000000"/>
+          <w:szCs w:val="24"/>
+          <w:shd w:val="clear" w:color="auto" w:fill="FFFFFF"/>
+        </w:rPr>
+        <w:t xml:space="preserve"> </w:t>
+      </w:r>
+      <w:proofErr w:type="spellStart"/>
+      <w:r>
+        <w:rPr>
+          <w:color w:val="000000"/>
+          <w:szCs w:val="24"/>
+          <w:shd w:val="clear" w:color="auto" w:fill="FFFFFF"/>
+        </w:rPr>
+        <w:t>some</w:t>
+      </w:r>
+      <w:proofErr w:type="spellEnd"/>
+      <w:r>
+        <w:rPr>
+          <w:color w:val="000000"/>
+          <w:szCs w:val="24"/>
+          <w:shd w:val="clear" w:color="auto" w:fill="FFFFFF"/>
+        </w:rPr>
+        <w:t xml:space="preserve"> tensor </w:t>
+      </w:r>
+      <w:proofErr w:type="spellStart"/>
+      <w:r>
+        <w:rPr>
+          <w:color w:val="000000"/>
+          <w:szCs w:val="24"/>
+          <w:shd w:val="clear" w:color="auto" w:fill="FFFFFF"/>
+        </w:rPr>
+        <w:t>operations</w:t>
+      </w:r>
+      <w:proofErr w:type="spellEnd"/>
+      <w:r>
+        <w:rPr>
+          <w:color w:val="000000"/>
+          <w:szCs w:val="24"/>
+          <w:shd w:val="clear" w:color="auto" w:fill="FFFFFF"/>
+        </w:rPr>
+        <w:t xml:space="preserve"> on </w:t>
+      </w:r>
+      <w:proofErr w:type="spellStart"/>
+      <w:r>
+        <w:rPr>
+          <w:color w:val="000000"/>
+          <w:szCs w:val="24"/>
+          <w:shd w:val="clear" w:color="auto" w:fill="FFFFFF"/>
+        </w:rPr>
+        <w:t>graphics</w:t>
+      </w:r>
+      <w:proofErr w:type="spellEnd"/>
+      <w:r>
+        <w:rPr>
+          <w:color w:val="000000"/>
+          <w:szCs w:val="24"/>
+          <w:shd w:val="clear" w:color="auto" w:fill="FFFFFF"/>
+        </w:rPr>
+        <w:t xml:space="preserve"> </w:t>
+      </w:r>
+      <w:proofErr w:type="spellStart"/>
+      <w:r>
+        <w:rPr>
+          <w:color w:val="000000"/>
+          <w:szCs w:val="24"/>
+          <w:shd w:val="clear" w:color="auto" w:fill="FFFFFF"/>
+        </w:rPr>
+        <w:t>card</w:t>
+      </w:r>
+      <w:proofErr w:type="spellEnd"/>
+      <w:r>
+        <w:rPr>
+          <w:color w:val="000000"/>
+          <w:szCs w:val="24"/>
+          <w:shd w:val="clear" w:color="auto" w:fill="FFFFFF"/>
+        </w:rPr>
+        <w:t>.</w:t>
+      </w:r>
+      <w:r>
+        <w:rPr>
+          <w:color w:val="000000"/>
+          <w:szCs w:val="24"/>
+          <w:shd w:val="clear" w:color="auto" w:fill="FFFFFF"/>
+        </w:rPr>
+        <w:t xml:space="preserve"> </w:t>
+      </w:r>
+      <w:proofErr w:type="spellStart"/>
+      <w:r>
+        <w:rPr>
+          <w:color w:val="000000"/>
+          <w:szCs w:val="24"/>
+          <w:shd w:val="clear" w:color="auto" w:fill="FFFFFF"/>
+        </w:rPr>
+        <w:t>Along</w:t>
+      </w:r>
+      <w:proofErr w:type="spellEnd"/>
+      <w:r>
+        <w:rPr>
+          <w:color w:val="000000"/>
+          <w:szCs w:val="24"/>
+          <w:shd w:val="clear" w:color="auto" w:fill="FFFFFF"/>
+        </w:rPr>
+        <w:t xml:space="preserve"> </w:t>
+      </w:r>
+      <w:proofErr w:type="spellStart"/>
+      <w:r>
+        <w:rPr>
+          <w:color w:val="000000"/>
+          <w:szCs w:val="24"/>
+          <w:shd w:val="clear" w:color="auto" w:fill="FFFFFF"/>
+        </w:rPr>
+        <w:t>with</w:t>
+      </w:r>
+      <w:proofErr w:type="spellEnd"/>
+      <w:r>
+        <w:rPr>
+          <w:color w:val="000000"/>
+          <w:szCs w:val="24"/>
+          <w:shd w:val="clear" w:color="auto" w:fill="FFFFFF"/>
+        </w:rPr>
+        <w:t xml:space="preserve"> tensor </w:t>
+      </w:r>
+      <w:proofErr w:type="spellStart"/>
+      <w:r>
+        <w:rPr>
+          <w:color w:val="000000"/>
+          <w:szCs w:val="24"/>
+          <w:shd w:val="clear" w:color="auto" w:fill="FFFFFF"/>
+        </w:rPr>
+        <w:t>there</w:t>
+      </w:r>
+      <w:proofErr w:type="spellEnd"/>
+      <w:r>
+        <w:rPr>
+          <w:color w:val="000000"/>
+          <w:szCs w:val="24"/>
+          <w:shd w:val="clear" w:color="auto" w:fill="FFFFFF"/>
+        </w:rPr>
+        <w:t xml:space="preserve"> are </w:t>
+      </w:r>
+      <w:proofErr w:type="spellStart"/>
+      <w:r>
+        <w:rPr>
+          <w:color w:val="000000"/>
+          <w:szCs w:val="24"/>
+          <w:shd w:val="clear" w:color="auto" w:fill="FFFFFF"/>
+        </w:rPr>
+        <w:t>available</w:t>
+      </w:r>
+      <w:proofErr w:type="spellEnd"/>
+      <w:r>
+        <w:rPr>
+          <w:color w:val="000000"/>
+          <w:szCs w:val="24"/>
+          <w:shd w:val="clear" w:color="auto" w:fill="FFFFFF"/>
+        </w:rPr>
+        <w:t xml:space="preserve"> </w:t>
+      </w:r>
+      <w:proofErr w:type="spellStart"/>
+      <w:r>
+        <w:rPr>
+          <w:color w:val="000000"/>
+          <w:szCs w:val="24"/>
+          <w:shd w:val="clear" w:color="auto" w:fill="FFFFFF"/>
+        </w:rPr>
+        <w:t>other</w:t>
+      </w:r>
+      <w:proofErr w:type="spellEnd"/>
+      <w:r>
+        <w:rPr>
+          <w:color w:val="000000"/>
+          <w:szCs w:val="24"/>
+          <w:shd w:val="clear" w:color="auto" w:fill="FFFFFF"/>
+        </w:rPr>
+        <w:t xml:space="preserve"> </w:t>
+      </w:r>
+      <w:proofErr w:type="spellStart"/>
+      <w:r>
+        <w:rPr>
+          <w:color w:val="000000"/>
+          <w:szCs w:val="24"/>
+          <w:shd w:val="clear" w:color="auto" w:fill="FFFFFF"/>
+        </w:rPr>
+        <w:t>helper</w:t>
+      </w:r>
+      <w:proofErr w:type="spellEnd"/>
+      <w:r>
+        <w:rPr>
+          <w:color w:val="000000"/>
+          <w:szCs w:val="24"/>
+          <w:shd w:val="clear" w:color="auto" w:fill="FFFFFF"/>
+        </w:rPr>
+        <w:t xml:space="preserve"> data </w:t>
+      </w:r>
+      <w:proofErr w:type="spellStart"/>
+      <w:r>
+        <w:rPr>
+          <w:color w:val="000000"/>
+          <w:szCs w:val="24"/>
+          <w:shd w:val="clear" w:color="auto" w:fill="FFFFFF"/>
+        </w:rPr>
+        <w:t>structures</w:t>
+      </w:r>
+      <w:proofErr w:type="spellEnd"/>
+      <w:r>
+        <w:rPr>
+          <w:color w:val="000000"/>
+          <w:szCs w:val="24"/>
+          <w:shd w:val="clear" w:color="auto" w:fill="FFFFFF"/>
+        </w:rPr>
+        <w:t xml:space="preserve">, </w:t>
+      </w:r>
+      <w:proofErr w:type="spellStart"/>
+      <w:r>
+        <w:rPr>
+          <w:color w:val="000000"/>
+          <w:szCs w:val="24"/>
+          <w:shd w:val="clear" w:color="auto" w:fill="FFFFFF"/>
+        </w:rPr>
+        <w:t>for</w:t>
+      </w:r>
+      <w:proofErr w:type="spellEnd"/>
+      <w:r>
+        <w:rPr>
+          <w:color w:val="000000"/>
+          <w:szCs w:val="24"/>
+          <w:shd w:val="clear" w:color="auto" w:fill="FFFFFF"/>
+        </w:rPr>
+        <w:t xml:space="preserve"> instance a tensor </w:t>
+      </w:r>
+      <w:proofErr w:type="spellStart"/>
+      <w:r>
+        <w:rPr>
+          <w:color w:val="000000"/>
+          <w:szCs w:val="24"/>
+          <w:shd w:val="clear" w:color="auto" w:fill="FFFFFF"/>
+        </w:rPr>
+        <w:t>specialization</w:t>
+      </w:r>
+      <w:proofErr w:type="spellEnd"/>
+      <w:r>
+        <w:rPr>
+          <w:color w:val="000000"/>
+          <w:szCs w:val="24"/>
+          <w:shd w:val="clear" w:color="auto" w:fill="FFFFFF"/>
+        </w:rPr>
+        <w:t xml:space="preserve"> as a matrix.</w:t>
+      </w:r>
+      <w:r>
+        <w:rPr>
+          <w:color w:val="000000"/>
+          <w:szCs w:val="24"/>
+          <w:shd w:val="clear" w:color="auto" w:fill="FFFFFF"/>
+        </w:rPr>
+        <w:t xml:space="preserve"> </w:t>
+      </w:r>
+      <w:proofErr w:type="spellStart"/>
+      <w:r>
+        <w:rPr>
+          <w:color w:val="000000"/>
+          <w:szCs w:val="24"/>
+          <w:shd w:val="clear" w:color="auto" w:fill="FFFFFF"/>
+        </w:rPr>
+        <w:t>This</w:t>
+      </w:r>
+      <w:proofErr w:type="spellEnd"/>
+      <w:r>
+        <w:rPr>
+          <w:color w:val="000000"/>
+          <w:szCs w:val="24"/>
+          <w:shd w:val="clear" w:color="auto" w:fill="FFFFFF"/>
+        </w:rPr>
+        <w:t xml:space="preserve"> </w:t>
+      </w:r>
+      <w:proofErr w:type="spellStart"/>
+      <w:r>
+        <w:rPr>
+          <w:color w:val="000000"/>
+          <w:szCs w:val="24"/>
+          <w:shd w:val="clear" w:color="auto" w:fill="FFFFFF"/>
+        </w:rPr>
+        <w:t>library</w:t>
+      </w:r>
+      <w:proofErr w:type="spellEnd"/>
+      <w:r>
+        <w:rPr>
+          <w:color w:val="000000"/>
+          <w:szCs w:val="24"/>
+          <w:shd w:val="clear" w:color="auto" w:fill="FFFFFF"/>
+        </w:rPr>
+        <w:t xml:space="preserve"> </w:t>
+      </w:r>
+      <w:proofErr w:type="spellStart"/>
+      <w:r>
+        <w:rPr>
+          <w:color w:val="000000"/>
+          <w:szCs w:val="24"/>
+          <w:shd w:val="clear" w:color="auto" w:fill="FFFFFF"/>
+        </w:rPr>
+        <w:t>is</w:t>
+      </w:r>
+      <w:proofErr w:type="spellEnd"/>
+      <w:r>
+        <w:rPr>
+          <w:color w:val="000000"/>
+          <w:szCs w:val="24"/>
+          <w:shd w:val="clear" w:color="auto" w:fill="FFFFFF"/>
+        </w:rPr>
+        <w:t xml:space="preserve"> </w:t>
+      </w:r>
+      <w:proofErr w:type="spellStart"/>
+      <w:r>
+        <w:rPr>
+          <w:color w:val="000000"/>
+          <w:szCs w:val="24"/>
+          <w:shd w:val="clear" w:color="auto" w:fill="FFFFFF"/>
+        </w:rPr>
+        <w:t>impemented</w:t>
+      </w:r>
+      <w:proofErr w:type="spellEnd"/>
+      <w:r>
+        <w:rPr>
+          <w:color w:val="000000"/>
+          <w:szCs w:val="24"/>
+          <w:shd w:val="clear" w:color="auto" w:fill="FFFFFF"/>
+        </w:rPr>
+        <w:t xml:space="preserve"> in C++ </w:t>
+      </w:r>
+      <w:proofErr w:type="spellStart"/>
+      <w:r>
+        <w:rPr>
+          <w:color w:val="000000"/>
+          <w:szCs w:val="24"/>
+          <w:shd w:val="clear" w:color="auto" w:fill="FFFFFF"/>
+        </w:rPr>
+        <w:t>programming</w:t>
+      </w:r>
+      <w:proofErr w:type="spellEnd"/>
+      <w:r>
+        <w:rPr>
+          <w:color w:val="000000"/>
+          <w:szCs w:val="24"/>
+          <w:shd w:val="clear" w:color="auto" w:fill="FFFFFF"/>
+        </w:rPr>
+        <w:t xml:space="preserve"> </w:t>
+      </w:r>
+      <w:proofErr w:type="spellStart"/>
+      <w:r>
+        <w:rPr>
+          <w:color w:val="000000"/>
+          <w:szCs w:val="24"/>
+          <w:shd w:val="clear" w:color="auto" w:fill="FFFFFF"/>
+        </w:rPr>
+        <w:t>language</w:t>
+      </w:r>
+      <w:proofErr w:type="spellEnd"/>
+      <w:r>
+        <w:rPr>
+          <w:color w:val="000000"/>
+          <w:szCs w:val="24"/>
+          <w:shd w:val="clear" w:color="auto" w:fill="FFFFFF"/>
+        </w:rPr>
+        <w:t xml:space="preserve">. </w:t>
+      </w:r>
+      <w:proofErr w:type="spellStart"/>
+      <w:r>
+        <w:rPr>
+          <w:color w:val="000000"/>
+          <w:szCs w:val="24"/>
+          <w:shd w:val="clear" w:color="auto" w:fill="FFFFFF"/>
+        </w:rPr>
+        <w:t>This</w:t>
+      </w:r>
+      <w:proofErr w:type="spellEnd"/>
+      <w:r>
+        <w:rPr>
+          <w:color w:val="000000"/>
+          <w:szCs w:val="24"/>
+          <w:shd w:val="clear" w:color="auto" w:fill="FFFFFF"/>
+        </w:rPr>
+        <w:t xml:space="preserve"> </w:t>
+      </w:r>
+      <w:proofErr w:type="spellStart"/>
+      <w:r>
+        <w:rPr>
+          <w:color w:val="000000"/>
+          <w:szCs w:val="24"/>
+          <w:shd w:val="clear" w:color="auto" w:fill="FFFFFF"/>
+        </w:rPr>
+        <w:t>work</w:t>
+      </w:r>
+      <w:proofErr w:type="spellEnd"/>
+      <w:r>
+        <w:rPr>
+          <w:color w:val="000000"/>
+          <w:szCs w:val="24"/>
+          <w:shd w:val="clear" w:color="auto" w:fill="FFFFFF"/>
+        </w:rPr>
+        <w:t xml:space="preserve"> </w:t>
+      </w:r>
+      <w:proofErr w:type="spellStart"/>
+      <w:r>
+        <w:rPr>
+          <w:color w:val="000000"/>
+          <w:szCs w:val="24"/>
+          <w:shd w:val="clear" w:color="auto" w:fill="FFFFFF"/>
+        </w:rPr>
+        <w:t>also</w:t>
+      </w:r>
+      <w:proofErr w:type="spellEnd"/>
+      <w:r>
+        <w:rPr>
+          <w:color w:val="000000"/>
+          <w:szCs w:val="24"/>
+          <w:shd w:val="clear" w:color="auto" w:fill="FFFFFF"/>
+        </w:rPr>
+        <w:t xml:space="preserve"> </w:t>
+      </w:r>
+      <w:proofErr w:type="spellStart"/>
+      <w:r>
+        <w:rPr>
+          <w:color w:val="000000"/>
+          <w:szCs w:val="24"/>
+          <w:shd w:val="clear" w:color="auto" w:fill="FFFFFF"/>
+        </w:rPr>
+        <w:t>deals</w:t>
+      </w:r>
+      <w:proofErr w:type="spellEnd"/>
+      <w:r>
+        <w:rPr>
+          <w:color w:val="000000"/>
+          <w:szCs w:val="24"/>
+          <w:shd w:val="clear" w:color="auto" w:fill="FFFFFF"/>
+        </w:rPr>
+        <w:t xml:space="preserve"> </w:t>
+      </w:r>
+      <w:proofErr w:type="spellStart"/>
+      <w:r>
+        <w:rPr>
+          <w:color w:val="000000"/>
+          <w:szCs w:val="24"/>
+          <w:shd w:val="clear" w:color="auto" w:fill="FFFFFF"/>
+        </w:rPr>
+        <w:t>with</w:t>
+      </w:r>
+      <w:proofErr w:type="spellEnd"/>
+      <w:r>
+        <w:rPr>
+          <w:color w:val="000000"/>
+          <w:szCs w:val="24"/>
+          <w:shd w:val="clear" w:color="auto" w:fill="FFFFFF"/>
+        </w:rPr>
+        <w:t xml:space="preserve"> </w:t>
+      </w:r>
+      <w:proofErr w:type="spellStart"/>
+      <w:r>
+        <w:rPr>
+          <w:color w:val="000000"/>
+          <w:szCs w:val="24"/>
+          <w:shd w:val="clear" w:color="auto" w:fill="FFFFFF"/>
+        </w:rPr>
+        <w:t>theoretical</w:t>
+      </w:r>
+      <w:proofErr w:type="spellEnd"/>
+      <w:r>
+        <w:rPr>
+          <w:color w:val="000000"/>
+          <w:szCs w:val="24"/>
+          <w:shd w:val="clear" w:color="auto" w:fill="FFFFFF"/>
+        </w:rPr>
+        <w:t xml:space="preserve"> use </w:t>
+      </w:r>
+      <w:proofErr w:type="spellStart"/>
+      <w:r>
+        <w:rPr>
+          <w:color w:val="000000"/>
+          <w:szCs w:val="24"/>
+          <w:shd w:val="clear" w:color="auto" w:fill="FFFFFF"/>
+        </w:rPr>
+        <w:t>of</w:t>
+      </w:r>
+      <w:proofErr w:type="spellEnd"/>
+      <w:r>
+        <w:rPr>
+          <w:color w:val="000000"/>
+          <w:szCs w:val="24"/>
+          <w:shd w:val="clear" w:color="auto" w:fill="FFFFFF"/>
+        </w:rPr>
+        <w:t xml:space="preserve"> tensor.</w:t>
       </w:r>
     </w:p>
     <w:p>
@@ -1571,7 +2365,61 @@
           <w:szCs w:val="24"/>
           <w:shd w:val="clear" w:color="auto" w:fill="FFFFFF"/>
         </w:rPr>
-        <w:t>ensor, data structures, parallelization, library, C++, matrix</w:t>
+        <w:t xml:space="preserve">ensor, data </w:t>
+      </w:r>
+      <w:proofErr w:type="spellStart"/>
+      <w:r>
+        <w:rPr>
+          <w:color w:val="000000"/>
+          <w:szCs w:val="24"/>
+          <w:shd w:val="clear" w:color="auto" w:fill="FFFFFF"/>
+        </w:rPr>
+        <w:t>structures</w:t>
+      </w:r>
+      <w:proofErr w:type="spellEnd"/>
+      <w:r>
+        <w:rPr>
+          <w:color w:val="000000"/>
+          <w:szCs w:val="24"/>
+          <w:shd w:val="clear" w:color="auto" w:fill="FFFFFF"/>
+        </w:rPr>
+        <w:t xml:space="preserve">, </w:t>
+      </w:r>
+      <w:proofErr w:type="spellStart"/>
+      <w:r>
+        <w:rPr>
+          <w:color w:val="000000"/>
+          <w:szCs w:val="24"/>
+          <w:shd w:val="clear" w:color="auto" w:fill="FFFFFF"/>
+        </w:rPr>
+        <w:t>parallelization</w:t>
+      </w:r>
+      <w:proofErr w:type="spellEnd"/>
+      <w:r>
+        <w:rPr>
+          <w:color w:val="000000"/>
+          <w:szCs w:val="24"/>
+          <w:shd w:val="clear" w:color="auto" w:fill="FFFFFF"/>
+        </w:rPr>
+        <w:t xml:space="preserve">, </w:t>
+      </w:r>
+      <w:proofErr w:type="spellStart"/>
+      <w:r>
+        <w:rPr>
+          <w:color w:val="000000"/>
+          <w:szCs w:val="24"/>
+          <w:shd w:val="clear" w:color="auto" w:fill="FFFFFF"/>
+        </w:rPr>
+        <w:t>library</w:t>
+      </w:r>
+      <w:proofErr w:type="spellEnd"/>
+      <w:r>
+        <w:rPr>
+          <w:color w:val="000000"/>
+          <w:szCs w:val="24"/>
+          <w:shd w:val="clear" w:color="auto" w:fill="FFFFFF"/>
+        </w:rPr>
+        <w:t>, C++, matrix</w:t>
       </w:r>
     </w:p>
     <w:p>
@@ -1618,6 +2466,7 @@
           <w:noProof/>
           <w:kern w:val="2"/>
           <w:szCs w:val="24"/>
+          <w:lang/>
           <w14:ligatures w14:val="standardContextual"/>
         </w:rPr>
       </w:pPr>
@@ -1630,7 +2479,7 @@
       <w:r>
         <w:fldChar w:fldCharType="separate"/>
       </w:r>
-      <w:hyperlink w:anchor="_Toc227520777" w:history="1">
+      <w:hyperlink w:anchor="_Toc227522077" w:history="1">
         <w:r>
           <w:rPr>
             <w:rStyle w:val="Hypertextovodkaz"/>
@@ -1658,7 +2507,7 @@
             <w:noProof/>
             <w:webHidden/>
           </w:rPr>
-          <w:instrText xml:space="preserve"> PAGEREF _Toc227520777 \h </w:instrText>
+          <w:instrText xml:space="preserve"> PAGEREF _Toc227522077 \h </w:instrText>
         </w:r>
         <w:r>
           <w:rPr>
@@ -1700,10 +2549,11 @@
           <w:noProof/>
           <w:kern w:val="2"/>
           <w:szCs w:val="24"/>
+          <w:lang/>
           <w14:ligatures w14:val="standardContextual"/>
         </w:rPr>
       </w:pPr>
-      <w:hyperlink w:anchor="_Toc227520778" w:history="1">
+      <w:hyperlink w:anchor="_Toc227522078" w:history="1">
         <w:r>
           <w:rPr>
             <w:rStyle w:val="Hypertextovodkaz"/>
@@ -1731,7 +2581,7 @@
             <w:noProof/>
             <w:webHidden/>
           </w:rPr>
-          <w:instrText xml:space="preserve"> PAGEREF _Toc227520778 \h </w:instrText>
+          <w:instrText xml:space="preserve"> PAGEREF _Toc227522078 \h </w:instrText>
         </w:r>
         <w:r>
           <w:rPr>
@@ -1773,10 +2623,11 @@
           <w:noProof/>
           <w:kern w:val="2"/>
           <w:szCs w:val="24"/>
+          <w:lang/>
           <w14:ligatures w14:val="standardContextual"/>
         </w:rPr>
       </w:pPr>
-      <w:hyperlink w:anchor="_Toc227520779" w:history="1">
+      <w:hyperlink w:anchor="_Toc227522079" w:history="1">
         <w:r>
           <w:rPr>
             <w:rStyle w:val="Hypertextovodkaz"/>
@@ -1804,7 +2655,7 @@
             <w:noProof/>
             <w:webHidden/>
           </w:rPr>
-          <w:instrText xml:space="preserve"> PAGEREF _Toc227520779 \h </w:instrText>
+          <w:instrText xml:space="preserve"> PAGEREF _Toc227522079 \h </w:instrText>
         </w:r>
         <w:r>
           <w:rPr>
@@ -1846,10 +2697,11 @@
           <w:noProof/>
           <w:kern w:val="2"/>
           <w:szCs w:val="24"/>
+          <w:lang/>
           <w14:ligatures w14:val="standardContextual"/>
         </w:rPr>
       </w:pPr>
-      <w:hyperlink w:anchor="_Toc227520780" w:history="1">
+      <w:hyperlink w:anchor="_Toc227522080" w:history="1">
         <w:r>
           <w:rPr>
             <w:rStyle w:val="Hypertextovodkaz"/>
@@ -1876,7 +2728,7 @@
             <w:noProof/>
             <w:webHidden/>
           </w:rPr>
-          <w:instrText xml:space="preserve"> PAGEREF _Toc227520780 \h </w:instrText>
+          <w:instrText xml:space="preserve"> PAGEREF _Toc227522080 \h </w:instrText>
         </w:r>
         <w:r>
           <w:rPr>
@@ -1918,10 +2770,11 @@
           <w:noProof/>
           <w:kern w:val="2"/>
           <w:szCs w:val="24"/>
+          <w:lang/>
           <w14:ligatures w14:val="standardContextual"/>
         </w:rPr>
       </w:pPr>
-      <w:hyperlink w:anchor="_Toc227520781" w:history="1">
+      <w:hyperlink w:anchor="_Toc227522081" w:history="1">
         <w:r>
           <w:rPr>
             <w:rStyle w:val="Hypertextovodkaz"/>
@@ -1948,7 +2801,7 @@
             <w:noProof/>
             <w:webHidden/>
           </w:rPr>
-          <w:instrText xml:space="preserve"> PAGEREF _Toc227520781 \h </w:instrText>
+          <w:instrText xml:space="preserve"> PAGEREF _Toc227522081 \h </w:instrText>
         </w:r>
         <w:r>
           <w:rPr>
@@ -1987,10 +2840,11 @@
           <w:noProof/>
           <w:kern w:val="2"/>
           <w:szCs w:val="24"/>
+          <w:lang/>
           <w14:ligatures w14:val="standardContextual"/>
         </w:rPr>
       </w:pPr>
-      <w:hyperlink w:anchor="_Toc227520782" w:history="1">
+      <w:hyperlink w:anchor="_Toc227522082" w:history="1">
         <w:r>
           <w:rPr>
             <w:rStyle w:val="Hypertextovodkaz"/>
@@ -2017,7 +2871,147 @@
             <w:noProof/>
             <w:webHidden/>
           </w:rPr>
-          <w:instrText xml:space="preserve"> PAGEREF _Toc227520782 \h </w:instrText>
+          <w:instrText xml:space="preserve"> PAGEREF _Toc227522082 \h </w:instrText>
+        </w:r>
+        <w:r>
+          <w:rPr>
+            <w:noProof/>
+            <w:webHidden/>
+          </w:rPr>
+        </w:r>
+        <w:r>
+          <w:rPr>
+            <w:noProof/>
+            <w:webHidden/>
+          </w:rPr>
+          <w:fldChar w:fldCharType="separate"/>
+        </w:r>
+        <w:r>
+          <w:rPr>
+            <w:noProof/>
+            <w:webHidden/>
+          </w:rPr>
+          <w:t>13</w:t>
+        </w:r>
+        <w:r>
+          <w:rPr>
+            <w:noProof/>
+            <w:webHidden/>
+          </w:rPr>
+          <w:fldChar w:fldCharType="end"/>
+        </w:r>
+      </w:hyperlink>
+    </w:p>
+    <w:p>
+      <w:pPr>
+        <w:pStyle w:val="Obsah2"/>
+        <w:rPr>
+          <w:rFonts w:asciiTheme="minorHAnsi" w:eastAsiaTheme="minorEastAsia" w:hAnsiTheme="minorHAnsi" w:cstheme="minorBidi"/>
+          <w:noProof/>
+          <w:kern w:val="2"/>
+          <w:szCs w:val="24"/>
+          <w:lang/>
+          <w14:ligatures w14:val="standardContextual"/>
+        </w:rPr>
+      </w:pPr>
+      <w:hyperlink w:anchor="_Toc227522083" w:history="1">
+        <w:r>
+          <w:rPr>
+            <w:rStyle w:val="Hypertextovodkaz"/>
+            <w:noProof/>
+          </w:rPr>
+          <w:t>1.2 UML</w:t>
+        </w:r>
+        <w:r>
+          <w:rPr>
+            <w:noProof/>
+            <w:webHidden/>
+          </w:rPr>
+          <w:tab/>
+        </w:r>
+        <w:r>
+          <w:rPr>
+            <w:noProof/>
+            <w:webHidden/>
+          </w:rPr>
+          <w:fldChar w:fldCharType="begin"/>
+        </w:r>
+        <w:r>
+          <w:rPr>
+            <w:noProof/>
+            <w:webHidden/>
+          </w:rPr>
+          <w:instrText xml:space="preserve"> PAGEREF _Toc227522083 \h </w:instrText>
+        </w:r>
+        <w:r>
+          <w:rPr>
+            <w:noProof/>
+            <w:webHidden/>
+          </w:rPr>
+        </w:r>
+        <w:r>
+          <w:rPr>
+            <w:noProof/>
+            <w:webHidden/>
+          </w:rPr>
+          <w:fldChar w:fldCharType="separate"/>
+        </w:r>
+        <w:r>
+          <w:rPr>
+            <w:noProof/>
+            <w:webHidden/>
+          </w:rPr>
+          <w:t>13</w:t>
+        </w:r>
+        <w:r>
+          <w:rPr>
+            <w:noProof/>
+            <w:webHidden/>
+          </w:rPr>
+          <w:fldChar w:fldCharType="end"/>
+        </w:r>
+      </w:hyperlink>
+    </w:p>
+    <w:p>
+      <w:pPr>
+        <w:pStyle w:val="Obsah2"/>
+        <w:rPr>
+          <w:rFonts w:asciiTheme="minorHAnsi" w:eastAsiaTheme="minorEastAsia" w:hAnsiTheme="minorHAnsi" w:cstheme="minorBidi"/>
+          <w:noProof/>
+          <w:kern w:val="2"/>
+          <w:szCs w:val="24"/>
+          <w:lang/>
+          <w14:ligatures w14:val="standardContextual"/>
+        </w:rPr>
+      </w:pPr>
+      <w:hyperlink w:anchor="_Toc227522084" w:history="1">
+        <w:r>
+          <w:rPr>
+            <w:rStyle w:val="Hypertextovodkaz"/>
+            <w:noProof/>
+          </w:rPr>
+          <w:t>1.3 Logika tenzoru</w:t>
+        </w:r>
+        <w:r>
+          <w:rPr>
+            <w:noProof/>
+            <w:webHidden/>
+          </w:rPr>
+          <w:tab/>
+        </w:r>
+        <w:r>
+          <w:rPr>
+            <w:noProof/>
+            <w:webHidden/>
+          </w:rPr>
+          <w:fldChar w:fldCharType="begin"/>
+        </w:r>
+        <w:r>
+          <w:rPr>
+            <w:noProof/>
+            <w:webHidden/>
+          </w:rPr>
+          <w:instrText xml:space="preserve"> PAGEREF _Toc227522084 \h </w:instrText>
         </w:r>
         <w:r>
           <w:rPr>
@@ -2059,10 +3053,11 @@
           <w:noProof/>
           <w:kern w:val="2"/>
           <w:szCs w:val="24"/>
+          <w:lang/>
           <w14:ligatures w14:val="standardContextual"/>
         </w:rPr>
       </w:pPr>
-      <w:hyperlink w:anchor="_Toc227520783" w:history="1">
+      <w:hyperlink w:anchor="_Toc227522085" w:history="1">
         <w:r>
           <w:rPr>
             <w:rStyle w:val="Hypertextovodkaz"/>
@@ -2089,7 +3084,7 @@
             <w:noProof/>
             <w:webHidden/>
           </w:rPr>
-          <w:instrText xml:space="preserve"> PAGEREF _Toc227520783 \h </w:instrText>
+          <w:instrText xml:space="preserve"> PAGEREF _Toc227522085 \h </w:instrText>
         </w:r>
         <w:r>
           <w:rPr>
@@ -2128,10 +3123,11 @@
           <w:noProof/>
           <w:kern w:val="2"/>
           <w:szCs w:val="24"/>
+          <w:lang/>
           <w14:ligatures w14:val="standardContextual"/>
         </w:rPr>
       </w:pPr>
-      <w:hyperlink w:anchor="_Toc227520784" w:history="1">
+      <w:hyperlink w:anchor="_Toc227522086" w:history="1">
         <w:r>
           <w:rPr>
             <w:rStyle w:val="Hypertextovodkaz"/>
@@ -2158,7 +3154,7 @@
             <w:noProof/>
             <w:webHidden/>
           </w:rPr>
-          <w:instrText xml:space="preserve"> PAGEREF _Toc227520784 \h </w:instrText>
+          <w:instrText xml:space="preserve"> PAGEREF _Toc227522086 \h </w:instrText>
         </w:r>
         <w:r>
           <w:rPr>
@@ -2200,10 +3196,11 @@
           <w:noProof/>
           <w:kern w:val="2"/>
           <w:szCs w:val="24"/>
+          <w:lang/>
           <w14:ligatures w14:val="standardContextual"/>
         </w:rPr>
       </w:pPr>
-      <w:hyperlink w:anchor="_Toc227520785" w:history="1">
+      <w:hyperlink w:anchor="_Toc227522087" w:history="1">
         <w:r>
           <w:rPr>
             <w:rStyle w:val="Hypertextovodkaz"/>
@@ -2230,7 +3227,7 @@
             <w:noProof/>
             <w:webHidden/>
           </w:rPr>
-          <w:instrText xml:space="preserve"> PAGEREF _Toc227520785 \h </w:instrText>
+          <w:instrText xml:space="preserve"> PAGEREF _Toc227522087 \h </w:instrText>
         </w:r>
         <w:r>
           <w:rPr>
@@ -2272,10 +3269,11 @@
           <w:noProof/>
           <w:kern w:val="2"/>
           <w:szCs w:val="24"/>
+          <w:lang/>
           <w14:ligatures w14:val="standardContextual"/>
         </w:rPr>
       </w:pPr>
-      <w:hyperlink w:anchor="_Toc227520786" w:history="1">
+      <w:hyperlink w:anchor="_Toc227522088" w:history="1">
         <w:r>
           <w:rPr>
             <w:rStyle w:val="Hypertextovodkaz"/>
@@ -2302,7 +3300,7 @@
             <w:noProof/>
             <w:webHidden/>
           </w:rPr>
-          <w:instrText xml:space="preserve"> PAGEREF _Toc227520786 \h </w:instrText>
+          <w:instrText xml:space="preserve"> PAGEREF _Toc227522088 \h </w:instrText>
         </w:r>
         <w:r>
           <w:rPr>
@@ -2341,10 +3339,11 @@
           <w:noProof/>
           <w:kern w:val="2"/>
           <w:szCs w:val="24"/>
+          <w:lang/>
           <w14:ligatures w14:val="standardContextual"/>
         </w:rPr>
       </w:pPr>
-      <w:hyperlink w:anchor="_Toc227520787" w:history="1">
+      <w:hyperlink w:anchor="_Toc227522089" w:history="1">
         <w:r>
           <w:rPr>
             <w:rStyle w:val="Hypertextovodkaz"/>
@@ -2371,7 +3370,7 @@
             <w:noProof/>
             <w:webHidden/>
           </w:rPr>
-          <w:instrText xml:space="preserve"> PAGEREF _Toc227520787 \h </w:instrText>
+          <w:instrText xml:space="preserve"> PAGEREF _Toc227522089 \h </w:instrText>
         </w:r>
         <w:r>
           <w:rPr>
@@ -2413,10 +3412,11 @@
           <w:noProof/>
           <w:kern w:val="2"/>
           <w:szCs w:val="24"/>
+          <w:lang/>
           <w14:ligatures w14:val="standardContextual"/>
         </w:rPr>
       </w:pPr>
-      <w:hyperlink w:anchor="_Toc227520788" w:history="1">
+      <w:hyperlink w:anchor="_Toc227522090" w:history="1">
         <w:r>
           <w:rPr>
             <w:rStyle w:val="Hypertextovodkaz"/>
@@ -2451,7 +3451,7 @@
             <w:noProof/>
             <w:webHidden/>
           </w:rPr>
-          <w:instrText xml:space="preserve"> PAGEREF _Toc227520788 \h </w:instrText>
+          <w:instrText xml:space="preserve"> PAGEREF _Toc227522090 \h </w:instrText>
         </w:r>
         <w:r>
           <w:rPr>
@@ -2493,10 +3493,11 @@
           <w:noProof/>
           <w:kern w:val="2"/>
           <w:szCs w:val="24"/>
+          <w:lang/>
           <w14:ligatures w14:val="standardContextual"/>
         </w:rPr>
       </w:pPr>
-      <w:hyperlink w:anchor="_Toc227520789" w:history="1">
+      <w:hyperlink w:anchor="_Toc227522091" w:history="1">
         <w:r>
           <w:rPr>
             <w:rStyle w:val="Hypertextovodkaz"/>
@@ -2524,7 +3525,7 @@
             <w:noProof/>
             <w:webHidden/>
           </w:rPr>
-          <w:instrText xml:space="preserve"> PAGEREF _Toc227520789 \h </w:instrText>
+          <w:instrText xml:space="preserve"> PAGEREF _Toc227522091 \h </w:instrText>
         </w:r>
         <w:r>
           <w:rPr>
@@ -2566,10 +3567,11 @@
           <w:noProof/>
           <w:kern w:val="2"/>
           <w:szCs w:val="24"/>
+          <w:lang/>
           <w14:ligatures w14:val="standardContextual"/>
         </w:rPr>
       </w:pPr>
-      <w:hyperlink w:anchor="_Toc227520790" w:history="1">
+      <w:hyperlink w:anchor="_Toc227522092" w:history="1">
         <w:r>
           <w:rPr>
             <w:rStyle w:val="Hypertextovodkaz"/>
@@ -2597,7 +3599,7 @@
             <w:noProof/>
             <w:webHidden/>
           </w:rPr>
-          <w:instrText xml:space="preserve"> PAGEREF _Toc227520790 \h </w:instrText>
+          <w:instrText xml:space="preserve"> PAGEREF _Toc227522092 \h </w:instrText>
         </w:r>
         <w:r>
           <w:rPr>
@@ -2639,10 +3641,11 @@
           <w:noProof/>
           <w:kern w:val="2"/>
           <w:szCs w:val="24"/>
+          <w:lang/>
           <w14:ligatures w14:val="standardContextual"/>
         </w:rPr>
       </w:pPr>
-      <w:hyperlink w:anchor="_Toc227520791" w:history="1">
+      <w:hyperlink w:anchor="_Toc227522093" w:history="1">
         <w:r>
           <w:rPr>
             <w:rStyle w:val="Hypertextovodkaz"/>
@@ -2670,7 +3673,7 @@
             <w:noProof/>
             <w:webHidden/>
           </w:rPr>
-          <w:instrText xml:space="preserve"> PAGEREF _Toc227520791 \h </w:instrText>
+          <w:instrText xml:space="preserve"> PAGEREF _Toc227522093 \h </w:instrText>
         </w:r>
         <w:r>
           <w:rPr>
@@ -2712,10 +3715,11 @@
           <w:noProof/>
           <w:kern w:val="2"/>
           <w:szCs w:val="24"/>
+          <w:lang/>
           <w14:ligatures w14:val="standardContextual"/>
         </w:rPr>
       </w:pPr>
-      <w:hyperlink w:anchor="_Toc227520792" w:history="1">
+      <w:hyperlink w:anchor="_Toc227522094" w:history="1">
         <w:r>
           <w:rPr>
             <w:rStyle w:val="Hypertextovodkaz"/>
@@ -2743,7 +3747,7 @@
             <w:noProof/>
             <w:webHidden/>
           </w:rPr>
-          <w:instrText xml:space="preserve"> PAGEREF _Toc227520792 \h </w:instrText>
+          <w:instrText xml:space="preserve"> PAGEREF _Toc227522094 \h </w:instrText>
         </w:r>
         <w:r>
           <w:rPr>
@@ -2785,10 +3789,11 @@
           <w:noProof/>
           <w:kern w:val="2"/>
           <w:szCs w:val="24"/>
+          <w:lang/>
           <w14:ligatures w14:val="standardContextual"/>
         </w:rPr>
       </w:pPr>
-      <w:hyperlink w:anchor="_Toc227520793" w:history="1">
+      <w:hyperlink w:anchor="_Toc227522095" w:history="1">
         <w:r>
           <w:rPr>
             <w:rStyle w:val="Hypertextovodkaz"/>
@@ -2816,7 +3821,7 @@
             <w:noProof/>
             <w:webHidden/>
           </w:rPr>
-          <w:instrText xml:space="preserve"> PAGEREF _Toc227520793 \h </w:instrText>
+          <w:instrText xml:space="preserve"> PAGEREF _Toc227522095 \h </w:instrText>
         </w:r>
         <w:r>
           <w:rPr>
@@ -2855,10 +3860,11 @@
           <w:noProof/>
           <w:kern w:val="2"/>
           <w:szCs w:val="24"/>
+          <w:lang/>
           <w14:ligatures w14:val="standardContextual"/>
         </w:rPr>
       </w:pPr>
-      <w:hyperlink w:anchor="_Toc227520794" w:history="1">
+      <w:hyperlink w:anchor="_Toc227522096" w:history="1">
         <w:r>
           <w:rPr>
             <w:rStyle w:val="Hypertextovodkaz"/>
@@ -2886,7 +3892,7 @@
             <w:noProof/>
             <w:webHidden/>
           </w:rPr>
-          <w:instrText xml:space="preserve"> PAGEREF _Toc227520794 \h </w:instrText>
+          <w:instrText xml:space="preserve"> PAGEREF _Toc227522096 \h </w:instrText>
         </w:r>
         <w:r>
           <w:rPr>
@@ -2928,10 +3934,11 @@
           <w:noProof/>
           <w:kern w:val="2"/>
           <w:szCs w:val="24"/>
+          <w:lang/>
           <w14:ligatures w14:val="standardContextual"/>
         </w:rPr>
       </w:pPr>
-      <w:hyperlink w:anchor="_Toc227520795" w:history="1">
+      <w:hyperlink w:anchor="_Toc227522097" w:history="1">
         <w:r>
           <w:rPr>
             <w:rStyle w:val="Hypertextovodkaz"/>
@@ -2959,7 +3966,7 @@
             <w:noProof/>
             <w:webHidden/>
           </w:rPr>
-          <w:instrText xml:space="preserve"> PAGEREF _Toc227520795 \h </w:instrText>
+          <w:instrText xml:space="preserve"> PAGEREF _Toc227522097 \h </w:instrText>
         </w:r>
         <w:r>
           <w:rPr>
@@ -3001,10 +4008,11 @@
           <w:noProof/>
           <w:kern w:val="2"/>
           <w:szCs w:val="24"/>
+          <w:lang/>
           <w14:ligatures w14:val="standardContextual"/>
         </w:rPr>
       </w:pPr>
-      <w:hyperlink w:anchor="_Toc227520796" w:history="1">
+      <w:hyperlink w:anchor="_Toc227522098" w:history="1">
         <w:r>
           <w:rPr>
             <w:rStyle w:val="Hypertextovodkaz"/>
@@ -3032,7 +4040,7 @@
             <w:noProof/>
             <w:webHidden/>
           </w:rPr>
-          <w:instrText xml:space="preserve"> PAGEREF _Toc227520796 \h </w:instrText>
+          <w:instrText xml:space="preserve"> PAGEREF _Toc227522098 \h </w:instrText>
         </w:r>
         <w:r>
           <w:rPr>
@@ -3074,10 +4082,11 @@
           <w:noProof/>
           <w:kern w:val="2"/>
           <w:szCs w:val="24"/>
+          <w:lang/>
           <w14:ligatures w14:val="standardContextual"/>
         </w:rPr>
       </w:pPr>
-      <w:hyperlink w:anchor="_Toc227520797" w:history="1">
+      <w:hyperlink w:anchor="_Toc227522099" w:history="1">
         <w:r>
           <w:rPr>
             <w:rStyle w:val="Hypertextovodkaz"/>
@@ -3104,7 +4113,7 @@
             <w:noProof/>
             <w:webHidden/>
           </w:rPr>
-          <w:instrText xml:space="preserve"> PAGEREF _Toc227520797 \h </w:instrText>
+          <w:instrText xml:space="preserve"> PAGEREF _Toc227522099 \h </w:instrText>
         </w:r>
         <w:r>
           <w:rPr>
@@ -3146,10 +4155,11 @@
           <w:noProof/>
           <w:kern w:val="2"/>
           <w:szCs w:val="24"/>
+          <w:lang/>
           <w14:ligatures w14:val="standardContextual"/>
         </w:rPr>
       </w:pPr>
-      <w:hyperlink w:anchor="_Toc227520798" w:history="1">
+      <w:hyperlink w:anchor="_Toc227522100" w:history="1">
         <w:r>
           <w:rPr>
             <w:rStyle w:val="Hypertextovodkaz"/>
@@ -3176,7 +4186,7 @@
             <w:noProof/>
             <w:webHidden/>
           </w:rPr>
-          <w:instrText xml:space="preserve"> PAGEREF _Toc227520798 \h </w:instrText>
+          <w:instrText xml:space="preserve"> PAGEREF _Toc227522100 \h </w:instrText>
         </w:r>
         <w:r>
           <w:rPr>
@@ -3218,10 +4228,11 @@
           <w:noProof/>
           <w:kern w:val="2"/>
           <w:szCs w:val="24"/>
+          <w:lang/>
           <w14:ligatures w14:val="standardContextual"/>
         </w:rPr>
       </w:pPr>
-      <w:hyperlink w:anchor="_Toc227520799" w:history="1">
+      <w:hyperlink w:anchor="_Toc227522101" w:history="1">
         <w:r>
           <w:rPr>
             <w:rStyle w:val="Hypertextovodkaz"/>
@@ -3248,7 +4259,7 @@
             <w:noProof/>
             <w:webHidden/>
           </w:rPr>
-          <w:instrText xml:space="preserve"> PAGEREF _Toc227520799 \h </w:instrText>
+          <w:instrText xml:space="preserve"> PAGEREF _Toc227522101 \h </w:instrText>
         </w:r>
         <w:r>
           <w:rPr>
@@ -3290,10 +4301,11 @@
           <w:noProof/>
           <w:kern w:val="2"/>
           <w:szCs w:val="24"/>
+          <w:lang/>
           <w14:ligatures w14:val="standardContextual"/>
         </w:rPr>
       </w:pPr>
-      <w:hyperlink w:anchor="_Toc227520800" w:history="1">
+      <w:hyperlink w:anchor="_Toc227522102" w:history="1">
         <w:r>
           <w:rPr>
             <w:rStyle w:val="Hypertextovodkaz"/>
@@ -3320,7 +4332,7 @@
             <w:noProof/>
             <w:webHidden/>
           </w:rPr>
-          <w:instrText xml:space="preserve"> PAGEREF _Toc227520800 \h </w:instrText>
+          <w:instrText xml:space="preserve"> PAGEREF _Toc227522102 \h </w:instrText>
         </w:r>
         <w:r>
           <w:rPr>
@@ -3381,7 +4393,7 @@
       <w:pPr>
         <w:pStyle w:val="Nadpis1"/>
       </w:pPr>
-      <w:bookmarkStart w:id="0" w:name="_Toc227520777"/>
+      <w:bookmarkStart w:id="0" w:name="_Toc227522077"/>
       <w:r>
         <w:rPr>
           <w:shd w:val="clear" w:color="auto" w:fill="FFFFFF"/>
@@ -3682,7 +4694,7 @@
           <w:shd w:val="clear" w:color="auto" w:fill="FFFFFF"/>
         </w:rPr>
       </w:pPr>
-      <w:bookmarkStart w:id="1" w:name="_Toc227520778"/>
+      <w:bookmarkStart w:id="1" w:name="_Toc227522078"/>
       <w:r>
         <w:rPr>
           <w:shd w:val="clear" w:color="auto" w:fill="FFFFFF"/>
@@ -3732,7 +4744,7 @@
           <w:shd w:val="clear" w:color="auto" w:fill="FFFFFF"/>
         </w:rPr>
       </w:pPr>
-      <w:bookmarkStart w:id="2" w:name="_Toc227520779"/>
+      <w:bookmarkStart w:id="2" w:name="_Toc227522079"/>
       <w:r>
         <w:rPr>
           <w:shd w:val="clear" w:color="auto" w:fill="FFFFFF"/>
@@ -3840,6 +4852,7 @@
           <w:docGrid w:linePitch="360"/>
         </w:sectPr>
       </w:pPr>
+      <w:proofErr w:type="spellStart"/>
       <w:r>
         <w:rPr>
           <w:b/>
@@ -3850,6 +4863,7 @@
         </w:rPr>
         <w:t>Overhead</w:t>
       </w:r>
+      <w:proofErr w:type="spellEnd"/>
       <w:r>
         <w:rPr>
           <w:color w:val="000000"/>
@@ -3887,7 +4901,7 @@
       <w:pPr>
         <w:pStyle w:val="Nadpis1"/>
       </w:pPr>
-      <w:bookmarkStart w:id="3" w:name="_Toc227520780"/>
+      <w:bookmarkStart w:id="3" w:name="_Toc227522080"/>
       <w:r>
         <w:lastRenderedPageBreak/>
         <w:t>ÚVOD</w:t>
@@ -4104,7 +5118,21 @@
         <w:rPr>
           <w:szCs w:val="24"/>
         </w:rPr>
-        <w:t xml:space="preserve"> nebo n-nární strom založený na implicitních vztazích.</w:t>
+        <w:t xml:space="preserve"> nebo n-</w:t>
+      </w:r>
+      <w:proofErr w:type="spellStart"/>
+      <w:r>
+        <w:rPr>
+          <w:szCs w:val="24"/>
+        </w:rPr>
+        <w:t>nární</w:t>
+      </w:r>
+      <w:proofErr w:type="spellEnd"/>
+      <w:r>
+        <w:rPr>
+          <w:szCs w:val="24"/>
+        </w:rPr>
+        <w:t xml:space="preserve"> strom založený na implicitních vztazích.</w:t>
       </w:r>
     </w:p>
     <w:p>
@@ -4114,7 +5142,7 @@
       <w:r>
         <w:br w:type="page"/>
       </w:r>
-      <w:bookmarkStart w:id="4" w:name="_Toc227520781"/>
+      <w:bookmarkStart w:id="4" w:name="_Toc227522081"/>
       <w:r>
         <w:lastRenderedPageBreak/>
         <w:t>1</w:t>
@@ -4199,8 +5227,16 @@
         <w:rPr>
           <w:szCs w:val="24"/>
         </w:rPr>
-        <w:t>ozšíření knihovny Eigen</w:t>
-      </w:r>
+        <w:t xml:space="preserve">ozšíření knihovny </w:t>
+      </w:r>
+      <w:proofErr w:type="spellStart"/>
+      <w:r>
+        <w:rPr>
+          <w:szCs w:val="24"/>
+        </w:rPr>
+        <w:t>Eigen</w:t>
+      </w:r>
+      <w:proofErr w:type="spellEnd"/>
       <w:r>
         <w:rPr>
           <w:szCs w:val="24"/>
@@ -4238,7 +5274,21 @@
         <w:rPr>
           <w:szCs w:val="24"/>
         </w:rPr>
-        <w:t>také nabízí tenzor, to rozšíření je ovšem označeno jako „unsupported“ a považováno jako nestabilní.</w:t>
+        <w:t>také nabízí tenzor, to rozšíření je ovšem označeno jako „</w:t>
+      </w:r>
+      <w:proofErr w:type="spellStart"/>
+      <w:r>
+        <w:rPr>
+          <w:szCs w:val="24"/>
+        </w:rPr>
+        <w:t>unsupported</w:t>
+      </w:r>
+      <w:proofErr w:type="spellEnd"/>
+      <w:r>
+        <w:rPr>
+          <w:szCs w:val="24"/>
+        </w:rPr>
+        <w:t>“ a považováno jako nestabilní.</w:t>
       </w:r>
       <w:r>
         <w:rPr>
@@ -4246,11 +5296,19 @@
         </w:rPr>
         <w:t xml:space="preserve"> Zajímavý je také </w:t>
       </w:r>
-      <w:r>
-        <w:rPr>
-          <w:szCs w:val="24"/>
-        </w:rPr>
-        <w:t>Cyclops Tensor Framework</w:t>
+      <w:proofErr w:type="spellStart"/>
+      <w:r>
+        <w:rPr>
+          <w:szCs w:val="24"/>
+        </w:rPr>
+        <w:t>Cyclops</w:t>
+      </w:r>
+      <w:proofErr w:type="spellEnd"/>
+      <w:r>
+        <w:rPr>
+          <w:szCs w:val="24"/>
+        </w:rPr>
+        <w:t xml:space="preserve"> Tensor Framework</w:t>
       </w:r>
       <w:r>
         <w:rPr>
@@ -4285,7 +5343,7 @@
         <w:pStyle w:val="Nadpis2"/>
         <w:jc w:val="both"/>
       </w:pPr>
-      <w:bookmarkStart w:id="5" w:name="_Toc227520782"/>
+      <w:bookmarkStart w:id="5" w:name="_Toc227522082"/>
       <w:r>
         <w:t xml:space="preserve">1.1 </w:t>
       </w:r>
@@ -4366,13 +5424,83 @@
         <w:rPr>
           <w:szCs w:val="24"/>
         </w:rPr>
-        <w:t xml:space="preserve"> (copyable) a stěhovatelný (moveable)</w:t>
-      </w:r>
-      <w:r>
-        <w:rPr>
-          <w:szCs w:val="24"/>
-        </w:rPr>
-        <w:t xml:space="preserve"> a také je výchoze konstruktibilní (default constructible).</w:t>
+        <w:t xml:space="preserve"> (</w:t>
+      </w:r>
+      <w:proofErr w:type="spellStart"/>
+      <w:r>
+        <w:rPr>
+          <w:szCs w:val="24"/>
+        </w:rPr>
+        <w:t>copyable</w:t>
+      </w:r>
+      <w:proofErr w:type="spellEnd"/>
+      <w:r>
+        <w:rPr>
+          <w:szCs w:val="24"/>
+        </w:rPr>
+        <w:t xml:space="preserve">) a </w:t>
+      </w:r>
+      <w:proofErr w:type="spellStart"/>
+      <w:r>
+        <w:rPr>
+          <w:szCs w:val="24"/>
+        </w:rPr>
+        <w:t>stěhovatelný</w:t>
+      </w:r>
+      <w:proofErr w:type="spellEnd"/>
+      <w:r>
+        <w:rPr>
+          <w:szCs w:val="24"/>
+        </w:rPr>
+        <w:t xml:space="preserve"> (</w:t>
+      </w:r>
+      <w:proofErr w:type="spellStart"/>
+      <w:r>
+        <w:rPr>
+          <w:szCs w:val="24"/>
+        </w:rPr>
+        <w:t>moveable</w:t>
+      </w:r>
+      <w:proofErr w:type="spellEnd"/>
+      <w:r>
+        <w:rPr>
+          <w:szCs w:val="24"/>
+        </w:rPr>
+        <w:t>)</w:t>
+      </w:r>
+      <w:r>
+        <w:rPr>
+          <w:szCs w:val="24"/>
+        </w:rPr>
+        <w:t xml:space="preserve"> a také je výchoze </w:t>
+      </w:r>
+      <w:proofErr w:type="spellStart"/>
+      <w:r>
+        <w:rPr>
+          <w:szCs w:val="24"/>
+        </w:rPr>
+        <w:t>konstruktibilní</w:t>
+      </w:r>
+      <w:proofErr w:type="spellEnd"/>
+      <w:r>
+        <w:rPr>
+          <w:szCs w:val="24"/>
+        </w:rPr>
+        <w:t xml:space="preserve"> (default </w:t>
+      </w:r>
+      <w:proofErr w:type="spellStart"/>
+      <w:r>
+        <w:rPr>
+          <w:szCs w:val="24"/>
+        </w:rPr>
+        <w:t>constructible</w:t>
+      </w:r>
+      <w:proofErr w:type="spellEnd"/>
+      <w:r>
+        <w:rPr>
+          <w:szCs w:val="24"/>
+        </w:rPr>
+        <w:t>).</w:t>
       </w:r>
       <w:r>
         <w:rPr>
@@ -4484,26 +5612,109 @@
       <w:pPr>
         <w:pStyle w:val="Nadpis2"/>
       </w:pPr>
+      <w:bookmarkStart w:id="6" w:name="_Toc227522083"/>
       <w:r>
         <w:t>1.2 UML</w:t>
       </w:r>
-    </w:p>
-    <w:p>
+      <w:bookmarkEnd w:id="6"/>
+    </w:p>
+    <w:p>
+      <w:proofErr w:type="spellStart"/>
       <w:r>
         <w:t>Xxx</w:t>
       </w:r>
+      <w:proofErr w:type="spellEnd"/>
     </w:p>
     <w:p>
       <w:pPr>
         <w:pStyle w:val="Nadpis2"/>
       </w:pPr>
+      <w:bookmarkStart w:id="7" w:name="_Toc227522084"/>
       <w:r>
         <w:t>1.3 Logika tenzoru</w:t>
       </w:r>
-    </w:p>
-    <w:p>
-      <w:r>
-        <w:t>Xxx</w:t>
+      <w:bookmarkEnd w:id="7"/>
+    </w:p>
+    <w:p>
+      <w:pPr>
+        <w:spacing w:line="360" w:lineRule="auto"/>
+      </w:pPr>
+      <w:r>
+        <w:t>Tenzor byl implementován tak, že uvnitř udržuje informace v jednorozměrném poli</w:t>
+      </w:r>
+      <w:r>
+        <w:t>. Udržuje také pole s velikostmi dimenzí.</w:t>
+      </w:r>
+      <w:r>
+        <w:t xml:space="preserve"> Navenek pracuje se souřadnicemi, kde definitivní souřadnice </w:t>
+      </w:r>
+      <w:r>
+        <w:t>je sada</w:t>
+      </w:r>
+      <w:r>
+        <w:t xml:space="preserve"> cel</w:t>
+      </w:r>
+      <w:r>
+        <w:t>ých</w:t>
+      </w:r>
+      <w:r>
+        <w:t xml:space="preserve"> čís</w:t>
+      </w:r>
+      <w:r>
+        <w:t>e</w:t>
+      </w:r>
+      <w:r>
+        <w:t>l v poli o stejné velikosti, jako pole udržující velikosti dimenzí.</w:t>
+      </w:r>
+      <w:r>
+        <w:t xml:space="preserve"> Uvnitř tenzoru dochází k přepočítávání daných souřadnic na jedno číslo – index pro pole co udržuje </w:t>
+      </w:r>
+      <w:r>
+        <w:lastRenderedPageBreak/>
+        <w:t>data.</w:t>
+      </w:r>
+      <w:r>
+        <w:t xml:space="preserve"> Jako konvence pro souřadnice byla vybrána big-</w:t>
+      </w:r>
+      <w:proofErr w:type="spellStart"/>
+      <w:r>
+        <w:t>endian</w:t>
+      </w:r>
+      <w:proofErr w:type="spellEnd"/>
+      <w:r>
+        <w:t>.</w:t>
+      </w:r>
+      <w:r>
+        <w:t xml:space="preserve"> To zde znamená, že změna posledního čísla souřadnic, posune vnitřní index dat o jednu a změna první souřadnice změní index o součin všech velikostí dimenzí kromě první (čili o největší číslo, o které se index může posunou u změny libovolné souřadnice o jed</w:t>
+      </w:r>
+      <w:r>
+        <w:t>na</w:t>
+      </w:r>
+      <w:r>
+        <w:t>).</w:t>
+      </w:r>
+      <w:r>
+        <w:t xml:space="preserve"> V tensoru jsou dvě inverzní privátní metody. Jedna pro konverzi souřadnic na vnitřní index a druhá na opačný proces.</w:t>
+      </w:r>
+    </w:p>
+    <w:p>
+      <w:pPr>
+        <w:spacing w:line="360" w:lineRule="auto"/>
+      </w:pPr>
+      <w:r>
+        <w:t>Tenzoru také bude možné změnit rozměry či nějaký rozměr přidat či vymazat.</w:t>
+      </w:r>
+      <w:r>
+        <w:t xml:space="preserve"> Jelikož je počet prvků rovný součinu všech velikostí dimenzí, tak je jakákoli změna rozměru doprovázena velkým množstvím nových či zaniklých prvků (rovný kumulativnímu souč</w:t>
+      </w:r>
+      <w:r>
+        <w:t>inu</w:t>
+      </w:r>
+      <w:r>
+        <w:t xml:space="preserve"> předešlých velikostí dimenzí).</w:t>
+      </w:r>
+      <w:r>
+        <w:t xml:space="preserve"> </w:t>
       </w:r>
     </w:p>
     <w:p>
@@ -4514,7 +5725,7 @@
       <w:r>
         <w:br w:type="page"/>
       </w:r>
-      <w:bookmarkStart w:id="6" w:name="_Toc227520783"/>
+      <w:bookmarkStart w:id="8" w:name="_Toc227522085"/>
       <w:r>
         <w:lastRenderedPageBreak/>
         <w:t>2</w:t>
@@ -4525,7 +5736,7 @@
       <w:r>
         <w:t>IMPLEMENTACE</w:t>
       </w:r>
-      <w:bookmarkEnd w:id="6"/>
+      <w:bookmarkEnd w:id="8"/>
       <w:r>
         <w:t xml:space="preserve"> </w:t>
       </w:r>
@@ -4542,7 +5753,35 @@
         <w:rPr>
           <w:szCs w:val="24"/>
         </w:rPr>
-        <w:t>Samotná implementace této knihovny vynucuje přístup „header-only + source code“ neboli přidání knihovny do uživatelského projektu pomocí hlavičkového souboru</w:t>
+        <w:t>Samotná implementace této knihovny vynucuje přístup „</w:t>
+      </w:r>
+      <w:proofErr w:type="spellStart"/>
+      <w:r>
+        <w:rPr>
+          <w:szCs w:val="24"/>
+        </w:rPr>
+        <w:t>header-only</w:t>
+      </w:r>
+      <w:proofErr w:type="spellEnd"/>
+      <w:r>
+        <w:rPr>
+          <w:szCs w:val="24"/>
+        </w:rPr>
+        <w:t xml:space="preserve"> + source </w:t>
+      </w:r>
+      <w:proofErr w:type="spellStart"/>
+      <w:r>
+        <w:rPr>
+          <w:szCs w:val="24"/>
+        </w:rPr>
+        <w:t>code</w:t>
+      </w:r>
+      <w:proofErr w:type="spellEnd"/>
+      <w:r>
+        <w:rPr>
+          <w:szCs w:val="24"/>
+        </w:rPr>
+        <w:t>“ neboli přidání knihovny do uživatelského projektu pomocí hlavičkového souboru</w:t>
       </w:r>
       <w:r>
         <w:rPr>
@@ -4554,7 +5793,21 @@
         <w:rPr>
           <w:szCs w:val="24"/>
         </w:rPr>
-        <w:t>Kvůli použití šablon (template) by bylo velice složité a nepraktické pokoušet se o předkompilovanou knihovnu – ať dynamickou či statickou.</w:t>
+        <w:t>Kvůli použití šablon (</w:t>
+      </w:r>
+      <w:proofErr w:type="spellStart"/>
+      <w:r>
+        <w:rPr>
+          <w:szCs w:val="24"/>
+        </w:rPr>
+        <w:t>template</w:t>
+      </w:r>
+      <w:proofErr w:type="spellEnd"/>
+      <w:r>
+        <w:rPr>
+          <w:szCs w:val="24"/>
+        </w:rPr>
+        <w:t>) by bylo velice složité a nepraktické pokoušet se o předkompilovanou knihovnu – ať dynamickou či statickou.</w:t>
       </w:r>
       <w:r>
         <w:rPr>
@@ -4567,11 +5820,11 @@
       <w:pPr>
         <w:pStyle w:val="Nadpis2"/>
       </w:pPr>
-      <w:bookmarkStart w:id="7" w:name="_Toc227520784"/>
+      <w:bookmarkStart w:id="9" w:name="_Toc227522086"/>
       <w:r>
         <w:t>2.1 Použité nástroje</w:t>
       </w:r>
-      <w:bookmarkEnd w:id="7"/>
+      <w:bookmarkEnd w:id="9"/>
     </w:p>
     <w:p>
       <w:pPr>
@@ -4591,18 +5844,31 @@
       <w:pPr>
         <w:pStyle w:val="Nadpis3"/>
       </w:pPr>
-      <w:bookmarkStart w:id="8" w:name="_Toc227520785"/>
-      <w:r>
-        <w:t>2.1.1 AdaptiveCpp</w:t>
-      </w:r>
-      <w:bookmarkEnd w:id="8"/>
+      <w:bookmarkStart w:id="10" w:name="_Toc227522087"/>
+      <w:r>
+        <w:t xml:space="preserve">2.1.1 </w:t>
+      </w:r>
+      <w:proofErr w:type="spellStart"/>
+      <w:r>
+        <w:t>AdaptiveCpp</w:t>
+      </w:r>
+      <w:bookmarkEnd w:id="10"/>
+      <w:proofErr w:type="spellEnd"/>
     </w:p>
     <w:p>
       <w:pPr>
         <w:spacing w:line="360" w:lineRule="auto"/>
       </w:pPr>
       <w:r>
-        <w:t>Zajímavější je použitá knihovna AdaptiveCpp (</w:t>
+        <w:t xml:space="preserve">Zajímavější je použitá knihovna </w:t>
+      </w:r>
+      <w:proofErr w:type="spellStart"/>
+      <w:r>
+        <w:t>AdaptiveCpp</w:t>
+      </w:r>
+      <w:proofErr w:type="spellEnd"/>
+      <w:r>
+        <w:t xml:space="preserve"> (</w:t>
       </w:r>
       <w:hyperlink r:id="rId14" w:history="1">
         <w:r>
@@ -4638,17 +5904,40 @@
       <w:r>
         <w:t xml:space="preserve"> ) spravovaného </w:t>
       </w:r>
-      <w:r>
-        <w:t>The Khronos Group</w:t>
+      <w:proofErr w:type="spellStart"/>
+      <w:r>
+        <w:t>The</w:t>
+      </w:r>
+      <w:proofErr w:type="spellEnd"/>
+      <w:r>
+        <w:t xml:space="preserve"> </w:t>
+      </w:r>
+      <w:proofErr w:type="spellStart"/>
+      <w:r>
+        <w:t>Khronos</w:t>
+      </w:r>
+      <w:proofErr w:type="spellEnd"/>
+      <w:r>
+        <w:t xml:space="preserve"> Group</w:t>
       </w:r>
       <w:r>
         <w:t>.</w:t>
       </w:r>
       <w:r>
-        <w:t xml:space="preserve"> SYCL standard definuje abstrakce pro umožnění heterogenního programování. To má umožnit použití více druhů výpočetních zařízení v jedné aplikaci. Například použití CPU (s možností jednoduché paralelizace), GPU a podobně.</w:t>
-      </w:r>
-      <w:r>
-        <w:t xml:space="preserve">AdaptiveCpp </w:t>
+        <w:t xml:space="preserve"> SYCL standard definuje abstrakce pro umožnění heterogenního programování. To má umožnit použití více druhů výpočetních zařízení v jedné aplikaci. Například použití CPU (s možností jednoduché paralelizace), GPU a </w:t>
+      </w:r>
+      <w:proofErr w:type="spellStart"/>
+      <w:proofErr w:type="gramStart"/>
+      <w:r>
+        <w:t>podobně.</w:t>
+      </w:r>
+      <w:r>
+        <w:t>AdaptiveCpp</w:t>
+      </w:r>
+      <w:proofErr w:type="spellEnd"/>
+      <w:proofErr w:type="gramEnd"/>
+      <w:r>
+        <w:t xml:space="preserve"> </w:t>
       </w:r>
       <w:r>
         <w:t>funguje jako abstrakční vrstva</w:t>
@@ -4657,37 +5946,82 @@
         <w:t>,</w:t>
       </w:r>
       <w:r>
-        <w:t xml:space="preserve"> co umí využít více různých backendů</w:t>
-      </w:r>
-      <w:r>
-        <w:t>: CUDA pro grafické karty od společnosti NVIDIA, ROCm/HIP pro grafické karty od AMD či OpenMD používající CPU (a tím pádem často používaný jako fallback).</w:t>
-      </w:r>
-      <w:r>
-        <w:t xml:space="preserve"> Funguje tak že, vezme SYCL kód, oddělí ho na host kód pro běh na CPU a kód pro zařízení, který je poté převeden kód používaného backendu.</w:t>
+        <w:t xml:space="preserve"> co umí využít více různých </w:t>
+      </w:r>
+      <w:proofErr w:type="spellStart"/>
+      <w:r>
+        <w:t>backendů</w:t>
+      </w:r>
+      <w:proofErr w:type="spellEnd"/>
+      <w:r>
+        <w:t xml:space="preserve">: CUDA pro grafické karty od společnosti NVIDIA, </w:t>
+      </w:r>
+      <w:proofErr w:type="spellStart"/>
+      <w:r>
+        <w:t>ROCm</w:t>
+      </w:r>
+      <w:proofErr w:type="spellEnd"/>
+      <w:r>
+        <w:t xml:space="preserve">/HIP pro grafické karty od AMD či </w:t>
+      </w:r>
+      <w:proofErr w:type="spellStart"/>
+      <w:r>
+        <w:t>OpenMD</w:t>
+      </w:r>
+      <w:proofErr w:type="spellEnd"/>
+      <w:r>
+        <w:t xml:space="preserve"> používající CPU (a tím pádem často používaný jako </w:t>
+      </w:r>
+      <w:proofErr w:type="spellStart"/>
+      <w:r>
+        <w:t>fallback</w:t>
+      </w:r>
+      <w:proofErr w:type="spellEnd"/>
+      <w:r>
+        <w:t>).</w:t>
+      </w:r>
+      <w:r>
+        <w:t xml:space="preserve"> Funguje tak že, vezme SYCL kód, oddělí ho na host kód pro běh na CPU a kód pro zařízení, který je poté převeden kód používaného </w:t>
+      </w:r>
+      <w:proofErr w:type="spellStart"/>
+      <w:r>
+        <w:t>backendu</w:t>
+      </w:r>
+      <w:proofErr w:type="spellEnd"/>
+      <w:r>
+        <w:t>.</w:t>
       </w:r>
     </w:p>
     <w:p>
       <w:pPr>
         <w:pStyle w:val="Nadpis3"/>
       </w:pPr>
-      <w:bookmarkStart w:id="9" w:name="_Toc227520786"/>
+      <w:bookmarkStart w:id="11" w:name="_Toc227522088"/>
       <w:r>
         <w:t>2.1.2 Google test</w:t>
       </w:r>
-      <w:bookmarkEnd w:id="9"/>
+      <w:bookmarkEnd w:id="11"/>
     </w:p>
     <w:p>
       <w:r>
         <w:t xml:space="preserve">Pro testování byl vybrán </w:t>
       </w:r>
       <w:r>
-        <w:t>framework Google</w:t>
+        <w:t xml:space="preserve">framework </w:t>
+      </w:r>
+      <w:proofErr w:type="spellStart"/>
+      <w:r>
+        <w:t>Google</w:t>
       </w:r>
       <w:r>
         <w:t>T</w:t>
       </w:r>
       <w:r>
-        <w:t>est.</w:t>
+        <w:t>est</w:t>
+      </w:r>
+      <w:proofErr w:type="spellEnd"/>
+      <w:r>
+        <w:t>.</w:t>
       </w:r>
       <w:r>
         <w:t xml:space="preserve"> Je vhodný díky své jednoduchosti použití a integrace to projektu.</w:t>
@@ -4700,7 +6034,7 @@
       <w:pPr>
         <w:pStyle w:val="Nadpis2"/>
       </w:pPr>
-      <w:bookmarkStart w:id="10" w:name="_Toc227520787"/>
+      <w:bookmarkStart w:id="12" w:name="_Toc227522089"/>
       <w:r>
         <w:t>2.</w:t>
       </w:r>
@@ -4710,7 +6044,7 @@
       <w:r>
         <w:t xml:space="preserve"> Komponenty</w:t>
       </w:r>
-      <w:bookmarkEnd w:id="10"/>
+      <w:bookmarkEnd w:id="12"/>
     </w:p>
     <w:p>
       <w:pPr>
@@ -4728,7 +6062,7 @@
           <w:lang w:eastAsia="cs-CZ"/>
         </w:rPr>
       </w:pPr>
-      <w:bookmarkStart w:id="11" w:name="_Toc227520788"/>
+      <w:bookmarkStart w:id="13" w:name="_Toc227522090"/>
       <w:r>
         <w:t>2.</w:t>
       </w:r>
@@ -4752,7 +6086,7 @@
         </w:rPr>
         <w:t>Lineární kontejner</w:t>
       </w:r>
-      <w:bookmarkEnd w:id="11"/>
+      <w:bookmarkEnd w:id="13"/>
     </w:p>
     <w:p>
       <w:pPr>
@@ -4765,7 +6099,21 @@
         <w:rPr>
           <w:lang w:eastAsia="cs-CZ"/>
         </w:rPr>
-        <w:t xml:space="preserve">V projektu jako třída „LinearContainer“. </w:t>
+        <w:t>V projektu jako třída „</w:t>
+      </w:r>
+      <w:proofErr w:type="spellStart"/>
+      <w:r>
+        <w:rPr>
+          <w:lang w:eastAsia="cs-CZ"/>
+        </w:rPr>
+        <w:t>LinearContainer</w:t>
+      </w:r>
+      <w:proofErr w:type="spellEnd"/>
+      <w:r>
+        <w:rPr>
+          <w:lang w:eastAsia="cs-CZ"/>
+        </w:rPr>
+        <w:t xml:space="preserve">“. </w:t>
       </w:r>
       <w:r>
         <w:rPr>
@@ -4789,13 +6137,57 @@
         <w:rPr>
           <w:lang w:eastAsia="cs-CZ"/>
         </w:rPr>
-        <w:t xml:space="preserve">Používá šablonu (template) pro možnost uložení libovolného datového typu. </w:t>
-      </w:r>
-      <w:r>
-        <w:rPr>
-          <w:lang w:eastAsia="cs-CZ"/>
-        </w:rPr>
-        <w:t xml:space="preserve">Motivace k jeho implementaci je potřeba kontejneru s rozhraním napodobujícím std::vector, ale bez nevyhnutelné inicializace paměti. </w:t>
+        <w:t>Používá šablonu (</w:t>
+      </w:r>
+      <w:proofErr w:type="spellStart"/>
+      <w:r>
+        <w:rPr>
+          <w:lang w:eastAsia="cs-CZ"/>
+        </w:rPr>
+        <w:t>template</w:t>
+      </w:r>
+      <w:proofErr w:type="spellEnd"/>
+      <w:r>
+        <w:rPr>
+          <w:lang w:eastAsia="cs-CZ"/>
+        </w:rPr>
+        <w:t xml:space="preserve">) pro možnost uložení libovolného datového typu. </w:t>
+      </w:r>
+      <w:r>
+        <w:rPr>
+          <w:lang w:eastAsia="cs-CZ"/>
+        </w:rPr>
+        <w:t xml:space="preserve">Motivace k jeho implementaci je potřeba kontejneru s rozhraním napodobujícím </w:t>
+      </w:r>
+      <w:proofErr w:type="spellStart"/>
+      <w:proofErr w:type="gramStart"/>
+      <w:r>
+        <w:rPr>
+          <w:lang w:eastAsia="cs-CZ"/>
+        </w:rPr>
+        <w:t>std</w:t>
+      </w:r>
+      <w:proofErr w:type="spellEnd"/>
+      <w:r>
+        <w:rPr>
+          <w:lang w:eastAsia="cs-CZ"/>
+        </w:rPr>
+        <w:t>::</w:t>
+      </w:r>
+      <w:proofErr w:type="spellStart"/>
+      <w:proofErr w:type="gramEnd"/>
+      <w:r>
+        <w:rPr>
+          <w:lang w:eastAsia="cs-CZ"/>
+        </w:rPr>
+        <w:t>vector</w:t>
+      </w:r>
+      <w:proofErr w:type="spellEnd"/>
+      <w:r>
+        <w:rPr>
+          <w:lang w:eastAsia="cs-CZ"/>
+        </w:rPr>
+        <w:t xml:space="preserve">, ale bez nevyhnutelné inicializace paměti. </w:t>
       </w:r>
       <w:r>
         <w:rPr>
@@ -4828,8 +6220,16 @@
         <w:rPr>
           <w:lang w:eastAsia="cs-CZ"/>
         </w:rPr>
-        <w:t>Jak již naznačuje držení kapacity, tak je tento kontejner navržen i na postupné přidávání prvků pomocí metody push_back</w:t>
-      </w:r>
+        <w:t xml:space="preserve">Jak již naznačuje držení kapacity, tak je tento kontejner navržen i na postupné přidávání prvků pomocí metody </w:t>
+      </w:r>
+      <w:proofErr w:type="spellStart"/>
+      <w:r>
+        <w:rPr>
+          <w:lang w:eastAsia="cs-CZ"/>
+        </w:rPr>
+        <w:t>push_back</w:t>
+      </w:r>
+      <w:proofErr w:type="spellEnd"/>
       <w:r>
         <w:rPr>
           <w:lang w:eastAsia="cs-CZ"/>
@@ -4932,13 +6332,99 @@
         <w:rPr>
           <w:lang w:eastAsia="cs-CZ"/>
         </w:rPr>
-        <w:t xml:space="preserve"> Tento alokátor řeší použití ::operator new a ::operator delete, pro získání neinicializované paměti.</w:t>
-      </w:r>
-      <w:r>
-        <w:rPr>
-          <w:lang w:eastAsia="cs-CZ"/>
-        </w:rPr>
-        <w:t xml:space="preserve"> Také se snaží o zarovnání alokace na určitý počet bytů kvůli větší cache přívětivosti (která často čte po 64 bytech) a také případným SIMD instrukcím, které kompilátor poté může jednodušeji uplatnit</w:t>
+        <w:t xml:space="preserve"> Tento alokátor řeší </w:t>
+      </w:r>
+      <w:proofErr w:type="gramStart"/>
+      <w:r>
+        <w:rPr>
+          <w:lang w:eastAsia="cs-CZ"/>
+        </w:rPr>
+        <w:t>použití ::</w:t>
+      </w:r>
+      <w:proofErr w:type="spellStart"/>
+      <w:r>
+        <w:rPr>
+          <w:lang w:eastAsia="cs-CZ"/>
+        </w:rPr>
+        <w:t>operator</w:t>
+      </w:r>
+      <w:proofErr w:type="spellEnd"/>
+      <w:proofErr w:type="gramEnd"/>
+      <w:r>
+        <w:rPr>
+          <w:lang w:eastAsia="cs-CZ"/>
+        </w:rPr>
+        <w:t xml:space="preserve"> </w:t>
+      </w:r>
+      <w:proofErr w:type="spellStart"/>
+      <w:r>
+        <w:rPr>
+          <w:lang w:eastAsia="cs-CZ"/>
+        </w:rPr>
+        <w:t>new</w:t>
+      </w:r>
+      <w:proofErr w:type="spellEnd"/>
+      <w:r>
+        <w:rPr>
+          <w:lang w:eastAsia="cs-CZ"/>
+        </w:rPr>
+        <w:t xml:space="preserve"> </w:t>
+      </w:r>
+      <w:proofErr w:type="gramStart"/>
+      <w:r>
+        <w:rPr>
+          <w:lang w:eastAsia="cs-CZ"/>
+        </w:rPr>
+        <w:t>a ::</w:t>
+      </w:r>
+      <w:proofErr w:type="spellStart"/>
+      <w:r>
+        <w:rPr>
+          <w:lang w:eastAsia="cs-CZ"/>
+        </w:rPr>
+        <w:t>operator</w:t>
+      </w:r>
+      <w:proofErr w:type="spellEnd"/>
+      <w:proofErr w:type="gramEnd"/>
+      <w:r>
+        <w:rPr>
+          <w:lang w:eastAsia="cs-CZ"/>
+        </w:rPr>
+        <w:t xml:space="preserve"> </w:t>
+      </w:r>
+      <w:proofErr w:type="spellStart"/>
+      <w:r>
+        <w:rPr>
+          <w:lang w:eastAsia="cs-CZ"/>
+        </w:rPr>
+        <w:t>delete</w:t>
+      </w:r>
+      <w:proofErr w:type="spellEnd"/>
+      <w:r>
+        <w:rPr>
+          <w:lang w:eastAsia="cs-CZ"/>
+        </w:rPr>
+        <w:t>, pro získání neinicializované paměti.</w:t>
+      </w:r>
+      <w:r>
+        <w:rPr>
+          <w:lang w:eastAsia="cs-CZ"/>
+        </w:rPr>
+        <w:t xml:space="preserve"> Také se snaží o zarovnání alokace na určitý počet bytů kvůli větší </w:t>
+      </w:r>
+      <w:proofErr w:type="spellStart"/>
+      <w:r>
+        <w:rPr>
+          <w:lang w:eastAsia="cs-CZ"/>
+        </w:rPr>
+        <w:t>cache</w:t>
+      </w:r>
+      <w:proofErr w:type="spellEnd"/>
+      <w:r>
+        <w:rPr>
+          <w:lang w:eastAsia="cs-CZ"/>
+        </w:rPr>
+        <w:t xml:space="preserve"> přívětivosti (která často čte po 64 bytech) a také případným SIMD instrukcím, které kompilátor poté může jednodušeji uplatnit</w:t>
       </w:r>
       <w:r>
         <w:rPr>
@@ -4987,23 +6473,135 @@
         </w:rPr>
         <w:t xml:space="preserve">Pro kopírování, porovnávání či konstrukci a destrukci jsou v případě triviálně manipulovatelných typů (kontrolováno například pomocí </w:t>
       </w:r>
-      <w:r>
-        <w:rPr>
-          <w:lang w:eastAsia="cs-CZ"/>
-        </w:rPr>
-        <w:t>std::is_trivially_copyable_v&lt;T&gt;</w:t>
-      </w:r>
-      <w:r>
-        <w:rPr>
-          <w:lang w:eastAsia="cs-CZ"/>
-        </w:rPr>
-        <w:t>) jsou použity nízkoúrovňové funkce standartní knihovny jako například std::memcpy či std::memcmp a podobně.</w:t>
-      </w:r>
-      <w:r>
-        <w:rPr>
-          <w:lang w:eastAsia="cs-CZ"/>
-        </w:rPr>
-        <w:t xml:space="preserve"> Jestli jde takovéto operace (téměř s jistotou by se dalo říct optimalizace) jde na daném typu skutečně provést jde vykonat během kompilace a není tím pádem žádný overhead.</w:t>
+      <w:proofErr w:type="spellStart"/>
+      <w:proofErr w:type="gramStart"/>
+      <w:r>
+        <w:rPr>
+          <w:lang w:eastAsia="cs-CZ"/>
+        </w:rPr>
+        <w:t>std</w:t>
+      </w:r>
+      <w:proofErr w:type="spellEnd"/>
+      <w:r>
+        <w:rPr>
+          <w:lang w:eastAsia="cs-CZ"/>
+        </w:rPr>
+        <w:t>::</w:t>
+      </w:r>
+      <w:proofErr w:type="spellStart"/>
+      <w:proofErr w:type="gramEnd"/>
+      <w:r>
+        <w:rPr>
+          <w:lang w:eastAsia="cs-CZ"/>
+        </w:rPr>
+        <w:t>is_trivially_copyable_v</w:t>
+      </w:r>
+      <w:proofErr w:type="spellEnd"/>
+      <w:r>
+        <w:rPr>
+          <w:lang w:eastAsia="cs-CZ"/>
+        </w:rPr>
+        <w:t>&lt;T&gt;</w:t>
+      </w:r>
+      <w:r>
+        <w:rPr>
+          <w:lang w:eastAsia="cs-CZ"/>
+        </w:rPr>
+        <w:t xml:space="preserve">) jsou použity </w:t>
+      </w:r>
+      <w:proofErr w:type="spellStart"/>
+      <w:r>
+        <w:rPr>
+          <w:lang w:eastAsia="cs-CZ"/>
+        </w:rPr>
+        <w:t>nízkoúrovňové</w:t>
+      </w:r>
+      <w:proofErr w:type="spellEnd"/>
+      <w:r>
+        <w:rPr>
+          <w:lang w:eastAsia="cs-CZ"/>
+        </w:rPr>
+        <w:t xml:space="preserve"> funkce standartní knihovny jako například </w:t>
+      </w:r>
+      <w:proofErr w:type="spellStart"/>
+      <w:proofErr w:type="gramStart"/>
+      <w:r>
+        <w:rPr>
+          <w:lang w:eastAsia="cs-CZ"/>
+        </w:rPr>
+        <w:t>std</w:t>
+      </w:r>
+      <w:proofErr w:type="spellEnd"/>
+      <w:r>
+        <w:rPr>
+          <w:lang w:eastAsia="cs-CZ"/>
+        </w:rPr>
+        <w:t>::</w:t>
+      </w:r>
+      <w:proofErr w:type="spellStart"/>
+      <w:proofErr w:type="gramEnd"/>
+      <w:r>
+        <w:rPr>
+          <w:lang w:eastAsia="cs-CZ"/>
+        </w:rPr>
+        <w:t>memcpy</w:t>
+      </w:r>
+      <w:proofErr w:type="spellEnd"/>
+      <w:r>
+        <w:rPr>
+          <w:lang w:eastAsia="cs-CZ"/>
+        </w:rPr>
+        <w:t xml:space="preserve"> či </w:t>
+      </w:r>
+      <w:proofErr w:type="spellStart"/>
+      <w:proofErr w:type="gramStart"/>
+      <w:r>
+        <w:rPr>
+          <w:lang w:eastAsia="cs-CZ"/>
+        </w:rPr>
+        <w:t>std</w:t>
+      </w:r>
+      <w:proofErr w:type="spellEnd"/>
+      <w:r>
+        <w:rPr>
+          <w:lang w:eastAsia="cs-CZ"/>
+        </w:rPr>
+        <w:t>::</w:t>
+      </w:r>
+      <w:proofErr w:type="spellStart"/>
+      <w:proofErr w:type="gramEnd"/>
+      <w:r>
+        <w:rPr>
+          <w:lang w:eastAsia="cs-CZ"/>
+        </w:rPr>
+        <w:t>memcmp</w:t>
+      </w:r>
+      <w:proofErr w:type="spellEnd"/>
+      <w:r>
+        <w:rPr>
+          <w:lang w:eastAsia="cs-CZ"/>
+        </w:rPr>
+        <w:t xml:space="preserve"> a podobně.</w:t>
+      </w:r>
+      <w:r>
+        <w:rPr>
+          <w:lang w:eastAsia="cs-CZ"/>
+        </w:rPr>
+        <w:t xml:space="preserve"> Jestli jde takovéto operace (téměř s jistotou by se dalo říct optimalizace) jde na daném typu skutečně provést jde vykonat během kompilace a není tím pádem žádný </w:t>
+      </w:r>
+      <w:proofErr w:type="spellStart"/>
+      <w:r>
+        <w:rPr>
+          <w:lang w:eastAsia="cs-CZ"/>
+        </w:rPr>
+        <w:t>overhead</w:t>
+      </w:r>
+      <w:proofErr w:type="spellEnd"/>
+      <w:r>
+        <w:rPr>
+          <w:lang w:eastAsia="cs-CZ"/>
+        </w:rPr>
+        <w:t>.</w:t>
       </w:r>
     </w:p>
     <w:p>
@@ -5017,7 +6615,37 @@
         <w:rPr>
           <w:lang w:eastAsia="cs-CZ"/>
         </w:rPr>
-        <w:t>Z venkovního hlediska se rozhraní této třídy velmi podobá std::vector ze standartní knihovny.</w:t>
+        <w:t xml:space="preserve">Z venkovního hlediska se rozhraní této třídy velmi podobá </w:t>
+      </w:r>
+      <w:proofErr w:type="spellStart"/>
+      <w:proofErr w:type="gramStart"/>
+      <w:r>
+        <w:rPr>
+          <w:lang w:eastAsia="cs-CZ"/>
+        </w:rPr>
+        <w:t>std</w:t>
+      </w:r>
+      <w:proofErr w:type="spellEnd"/>
+      <w:r>
+        <w:rPr>
+          <w:lang w:eastAsia="cs-CZ"/>
+        </w:rPr>
+        <w:t>::</w:t>
+      </w:r>
+      <w:proofErr w:type="spellStart"/>
+      <w:proofErr w:type="gramEnd"/>
+      <w:r>
+        <w:rPr>
+          <w:lang w:eastAsia="cs-CZ"/>
+        </w:rPr>
+        <w:t>vector</w:t>
+      </w:r>
+      <w:proofErr w:type="spellEnd"/>
+      <w:r>
+        <w:rPr>
+          <w:lang w:eastAsia="cs-CZ"/>
+        </w:rPr>
+        <w:t xml:space="preserve"> ze standartní knihovny.</w:t>
       </w:r>
       <w:r>
         <w:rPr>
@@ -5035,7 +6663,21 @@
         <w:rPr>
           <w:lang w:eastAsia="cs-CZ"/>
         </w:rPr>
-        <w:t xml:space="preserve">se kopírovat i stěhovat díky copy a move konstruktoru a </w:t>
+        <w:t xml:space="preserve">se kopírovat i stěhovat díky copy a </w:t>
+      </w:r>
+      <w:proofErr w:type="spellStart"/>
+      <w:r>
+        <w:rPr>
+          <w:lang w:eastAsia="cs-CZ"/>
+        </w:rPr>
+        <w:t>move</w:t>
+      </w:r>
+      <w:proofErr w:type="spellEnd"/>
+      <w:r>
+        <w:rPr>
+          <w:lang w:eastAsia="cs-CZ"/>
+        </w:rPr>
+        <w:t xml:space="preserve"> konstruktoru a </w:t>
       </w:r>
       <w:r>
         <w:rPr>
@@ -5065,7 +6707,21 @@
         <w:rPr>
           <w:lang w:eastAsia="cs-CZ"/>
         </w:rPr>
-        <w:t xml:space="preserve"> metody data()) </w:t>
+        <w:t xml:space="preserve"> metody </w:t>
+      </w:r>
+      <w:proofErr w:type="gramStart"/>
+      <w:r>
+        <w:rPr>
+          <w:lang w:eastAsia="cs-CZ"/>
+        </w:rPr>
+        <w:t>data(</w:t>
+      </w:r>
+      <w:proofErr w:type="gramEnd"/>
+      <w:r>
+        <w:rPr>
+          <w:lang w:eastAsia="cs-CZ"/>
+        </w:rPr>
+        <w:t xml:space="preserve">)) </w:t>
       </w:r>
       <w:r>
         <w:rPr>
@@ -5079,11 +6735,19 @@
         </w:rPr>
         <w:t>použít přetížení indexovacího operátoru ([]) pro přístup na jednotlivé prvky (v </w:t>
       </w:r>
-      <w:r>
-        <w:rPr>
-          <w:lang w:eastAsia="cs-CZ"/>
-        </w:rPr>
-        <w:t>O(1)</w:t>
+      <w:proofErr w:type="gramStart"/>
+      <w:r>
+        <w:rPr>
+          <w:lang w:eastAsia="cs-CZ"/>
+        </w:rPr>
+        <w:t>O(</w:t>
+      </w:r>
+      <w:proofErr w:type="gramEnd"/>
+      <w:r>
+        <w:rPr>
+          <w:lang w:eastAsia="cs-CZ"/>
+        </w:rPr>
+        <w:t>1)</w:t>
       </w:r>
       <w:r>
         <w:rPr>
@@ -5113,7 +6777,51 @@
         <w:rPr>
           <w:lang w:eastAsia="cs-CZ"/>
         </w:rPr>
-        <w:t>, ze stejného rozhraní u std::vector dostat iterátory jak dopředu</w:t>
+        <w:t xml:space="preserve">, ze stejného rozhraní u </w:t>
+      </w:r>
+      <w:proofErr w:type="spellStart"/>
+      <w:proofErr w:type="gramStart"/>
+      <w:r>
+        <w:rPr>
+          <w:lang w:eastAsia="cs-CZ"/>
+        </w:rPr>
+        <w:t>std</w:t>
+      </w:r>
+      <w:proofErr w:type="spellEnd"/>
+      <w:r>
+        <w:rPr>
+          <w:lang w:eastAsia="cs-CZ"/>
+        </w:rPr>
+        <w:t>::</w:t>
+      </w:r>
+      <w:proofErr w:type="spellStart"/>
+      <w:proofErr w:type="gramEnd"/>
+      <w:r>
+        <w:rPr>
+          <w:lang w:eastAsia="cs-CZ"/>
+        </w:rPr>
+        <w:t>vector</w:t>
+      </w:r>
+      <w:proofErr w:type="spellEnd"/>
+      <w:r>
+        <w:rPr>
+          <w:lang w:eastAsia="cs-CZ"/>
+        </w:rPr>
+        <w:t xml:space="preserve"> dostat </w:t>
+      </w:r>
+      <w:proofErr w:type="spellStart"/>
+      <w:r>
+        <w:rPr>
+          <w:lang w:eastAsia="cs-CZ"/>
+        </w:rPr>
+        <w:t>iterátory</w:t>
+      </w:r>
+      <w:proofErr w:type="spellEnd"/>
+      <w:r>
+        <w:rPr>
+          <w:lang w:eastAsia="cs-CZ"/>
+        </w:rPr>
+        <w:t xml:space="preserve"> jak dopředu</w:t>
       </w:r>
       <w:r>
         <w:rPr>
@@ -5131,7 +6839,21 @@
         <w:rPr>
           <w:lang w:eastAsia="cs-CZ"/>
         </w:rPr>
-        <w:t>. Iterátor je pro jednoduchost ukazatel, což je jednoduché a efektivní</w:t>
+        <w:t xml:space="preserve">. </w:t>
+      </w:r>
+      <w:proofErr w:type="spellStart"/>
+      <w:r>
+        <w:rPr>
+          <w:lang w:eastAsia="cs-CZ"/>
+        </w:rPr>
+        <w:t>Iterátor</w:t>
+      </w:r>
+      <w:proofErr w:type="spellEnd"/>
+      <w:r>
+        <w:rPr>
+          <w:lang w:eastAsia="cs-CZ"/>
+        </w:rPr>
+        <w:t xml:space="preserve"> je pro jednoduchost ukazatel, což je jednoduché a efektivní</w:t>
       </w:r>
       <w:r>
         <w:rPr>
@@ -5189,7 +6911,7 @@
           <w:lang w:eastAsia="cs-CZ"/>
         </w:rPr>
       </w:pPr>
-      <w:bookmarkStart w:id="12" w:name="_Toc227520789"/>
+      <w:bookmarkStart w:id="14" w:name="_Toc227522091"/>
       <w:r>
         <w:rPr>
           <w:lang w:eastAsia="cs-CZ"/>
@@ -5215,7 +6937,7 @@
         </w:rPr>
         <w:t xml:space="preserve"> Tenzor</w:t>
       </w:r>
-      <w:bookmarkEnd w:id="12"/>
+      <w:bookmarkEnd w:id="14"/>
     </w:p>
     <w:p>
       <w:pPr>
@@ -5260,6 +6982,695 @@
         </w:rPr>
         <w:t>v sobě lineární kontejner pro udržení dat.</w:t>
       </w:r>
+      <w:r>
+        <w:rPr>
+          <w:lang w:eastAsia="cs-CZ"/>
+        </w:rPr>
+        <w:t xml:space="preserve"> Jelikož udržování informací o struktuře tenzoru (tím myšleno rozměry dimenzí) je očekávané jen se zanedbatelným využitím paměti oproti datům, tak pro jednoduchost byly tyto informace uloženy do </w:t>
+      </w:r>
+      <w:proofErr w:type="spellStart"/>
+      <w:proofErr w:type="gramStart"/>
+      <w:r>
+        <w:rPr>
+          <w:lang w:eastAsia="cs-CZ"/>
+        </w:rPr>
+        <w:t>std</w:t>
+      </w:r>
+      <w:proofErr w:type="spellEnd"/>
+      <w:r>
+        <w:rPr>
+          <w:lang w:eastAsia="cs-CZ"/>
+        </w:rPr>
+        <w:t>::</w:t>
+      </w:r>
+      <w:proofErr w:type="spellStart"/>
+      <w:proofErr w:type="gramEnd"/>
+      <w:r>
+        <w:rPr>
+          <w:lang w:eastAsia="cs-CZ"/>
+        </w:rPr>
+        <w:t>vector</w:t>
+      </w:r>
+      <w:proofErr w:type="spellEnd"/>
+      <w:r>
+        <w:rPr>
+          <w:lang w:eastAsia="cs-CZ"/>
+        </w:rPr>
+        <w:t xml:space="preserve">. Díky tomu je možné využít plného rozhraní manipulace nabízeného standartní knihovnou a </w:t>
+      </w:r>
+      <w:r>
+        <w:rPr>
+          <w:lang w:eastAsia="cs-CZ"/>
+        </w:rPr>
+        <w:t>také využít optimalizací, které s sebou knihovna přináší.</w:t>
+      </w:r>
+    </w:p>
+    <w:p>
+      <w:pPr>
+        <w:spacing w:line="360" w:lineRule="auto"/>
+        <w:rPr>
+          <w:lang w:eastAsia="cs-CZ"/>
+        </w:rPr>
+      </w:pPr>
+      <w:r>
+        <w:rPr>
+          <w:lang w:eastAsia="cs-CZ"/>
+        </w:rPr>
+        <w:t xml:space="preserve">Dobré si nyní definovat definitivní a nedefinitivní souřadnice. </w:t>
+      </w:r>
+      <w:r>
+        <w:rPr>
+          <w:b/>
+          <w:bCs/>
+          <w:lang w:eastAsia="cs-CZ"/>
+        </w:rPr>
+        <w:t>Definitivní souřadnice</w:t>
+      </w:r>
+      <w:r>
+        <w:rPr>
+          <w:lang w:eastAsia="cs-CZ"/>
+        </w:rPr>
+        <w:t>, co jsou svými hodnotami validní pro daný tenzor (hodnota jedné souřadnice větší než 0 a menší než velikost dané dimenze) a délkou stejnou jako je počet dimenzí.</w:t>
+      </w:r>
+      <w:r>
+        <w:rPr>
+          <w:lang w:eastAsia="cs-CZ"/>
+        </w:rPr>
+        <w:t xml:space="preserve"> Tyto souřadnice ukazují na jeden konkrétní prvek.</w:t>
+      </w:r>
+      <w:r>
+        <w:rPr>
+          <w:lang w:eastAsia="cs-CZ"/>
+        </w:rPr>
+        <w:t xml:space="preserve"> </w:t>
+      </w:r>
+      <w:r>
+        <w:rPr>
+          <w:b/>
+          <w:bCs/>
+          <w:lang w:eastAsia="cs-CZ"/>
+        </w:rPr>
+        <w:t>Nedefinitivní souřadnice</w:t>
+      </w:r>
+      <w:r>
+        <w:rPr>
+          <w:lang w:eastAsia="cs-CZ"/>
+        </w:rPr>
+        <w:t xml:space="preserve"> jsou souřadnice s validními hodnotami (stejně jako u definitivních), ale na rozdíl od definitivních souřadnic mají délku menší, než je počet dimenzí. </w:t>
+      </w:r>
+      <w:r>
+        <w:rPr>
+          <w:lang w:eastAsia="cs-CZ"/>
+        </w:rPr>
+        <w:t>Všechny souřadnice (definitivní i nedefinitivní) mají vždy jednotlivé hodnoty korespondující k dimenzím o té největší (první dimenzi</w:t>
+      </w:r>
+      <w:r>
+        <w:rPr>
+          <w:lang w:eastAsia="cs-CZ"/>
+        </w:rPr>
+        <w:t xml:space="preserve"> podle big-</w:t>
+      </w:r>
+      <w:proofErr w:type="spellStart"/>
+      <w:r>
+        <w:rPr>
+          <w:lang w:eastAsia="cs-CZ"/>
+        </w:rPr>
+        <w:t>endian</w:t>
+      </w:r>
+      <w:proofErr w:type="spellEnd"/>
+      <w:r>
+        <w:rPr>
+          <w:lang w:eastAsia="cs-CZ"/>
+        </w:rPr>
+        <w:t>)</w:t>
+      </w:r>
+      <w:r>
+        <w:rPr>
+          <w:lang w:eastAsia="cs-CZ"/>
+        </w:rPr>
+        <w:t>.</w:t>
+      </w:r>
+      <w:r>
+        <w:rPr>
+          <w:lang w:eastAsia="cs-CZ"/>
+        </w:rPr>
+        <w:t xml:space="preserve"> Příkladem to znamená, že nedefinitivní souřadnice o velikosti jedné </w:t>
+      </w:r>
+      <w:proofErr w:type="gramStart"/>
+      <w:r>
+        <w:rPr>
+          <w:lang w:eastAsia="cs-CZ"/>
+        </w:rPr>
+        <w:t>menší</w:t>
+      </w:r>
+      <w:r>
+        <w:rPr>
+          <w:lang w:eastAsia="cs-CZ"/>
+        </w:rPr>
+        <w:t>,</w:t>
+      </w:r>
+      <w:proofErr w:type="gramEnd"/>
+      <w:r>
+        <w:rPr>
+          <w:lang w:eastAsia="cs-CZ"/>
+        </w:rPr>
+        <w:t xml:space="preserve"> než počet dimenzí, mají </w:t>
+      </w:r>
+      <w:r>
+        <w:rPr>
+          <w:lang w:eastAsia="cs-CZ"/>
+        </w:rPr>
+        <w:t>nejednoznačný výběr</w:t>
+      </w:r>
+      <w:r>
+        <w:rPr>
+          <w:lang w:eastAsia="cs-CZ"/>
+        </w:rPr>
+        <w:t xml:space="preserve"> o velikosti poslední velikosti dimenze (té u které změna o jeden znamená změna o jeden u vnitřního indexu).</w:t>
+      </w:r>
+      <w:r>
+        <w:rPr>
+          <w:lang w:eastAsia="cs-CZ"/>
+        </w:rPr>
+        <w:t xml:space="preserve"> </w:t>
+      </w:r>
+      <w:r>
+        <w:rPr>
+          <w:b/>
+          <w:bCs/>
+          <w:lang w:eastAsia="cs-CZ"/>
+        </w:rPr>
+        <w:t>Nejednoznačný výběr</w:t>
+      </w:r>
+      <w:r>
+        <w:rPr>
+          <w:lang w:eastAsia="cs-CZ"/>
+        </w:rPr>
+        <w:t xml:space="preserve"> zde znamená všechny prvky, na které by se mohly ukazovat nedefinitivní souřadnice po jejich validním doplnění na definitivní souřadnice.</w:t>
+      </w:r>
+    </w:p>
+    <w:p>
+      <w:pPr>
+        <w:spacing w:line="360" w:lineRule="auto"/>
+        <w:rPr>
+          <w:lang w:eastAsia="cs-CZ"/>
+        </w:rPr>
+      </w:pPr>
+      <w:r>
+        <w:rPr>
+          <w:lang w:eastAsia="cs-CZ"/>
+        </w:rPr>
+        <w:t xml:space="preserve">Z vlastností tenzoru jako matematické struktury vyplývá, že bude často nutné, </w:t>
+      </w:r>
+      <w:r>
+        <w:rPr>
+          <w:lang w:eastAsia="cs-CZ"/>
+        </w:rPr>
+        <w:t xml:space="preserve">pro jednu dimenzi </w:t>
+      </w:r>
+      <w:r>
+        <w:rPr>
+          <w:lang w:eastAsia="cs-CZ"/>
+        </w:rPr>
+        <w:t xml:space="preserve">vypočítat </w:t>
+      </w:r>
+      <w:r>
+        <w:rPr>
+          <w:lang w:eastAsia="cs-CZ"/>
+        </w:rPr>
+        <w:t xml:space="preserve">kumulativní </w:t>
+      </w:r>
+      <w:r>
+        <w:rPr>
+          <w:lang w:eastAsia="cs-CZ"/>
+        </w:rPr>
+        <w:t xml:space="preserve">součin </w:t>
+      </w:r>
+      <w:r>
+        <w:rPr>
+          <w:lang w:eastAsia="cs-CZ"/>
+        </w:rPr>
+        <w:t xml:space="preserve">předešlých </w:t>
+      </w:r>
+      <w:r>
+        <w:rPr>
+          <w:lang w:eastAsia="cs-CZ"/>
+        </w:rPr>
+        <w:t xml:space="preserve">velikostí dimenzí. </w:t>
+      </w:r>
+      <w:r>
+        <w:rPr>
+          <w:lang w:eastAsia="cs-CZ"/>
+        </w:rPr>
+        <w:t xml:space="preserve">Kvůli tomu také při konstrukci a změnách struktury bude vypočítán další </w:t>
+      </w:r>
+      <w:proofErr w:type="spellStart"/>
+      <w:proofErr w:type="gramStart"/>
+      <w:r>
+        <w:rPr>
+          <w:lang w:eastAsia="cs-CZ"/>
+        </w:rPr>
+        <w:t>std</w:t>
+      </w:r>
+      <w:proofErr w:type="spellEnd"/>
+      <w:r>
+        <w:rPr>
+          <w:lang w:eastAsia="cs-CZ"/>
+        </w:rPr>
+        <w:t>::</w:t>
+      </w:r>
+      <w:proofErr w:type="spellStart"/>
+      <w:proofErr w:type="gramEnd"/>
+      <w:r>
+        <w:rPr>
+          <w:lang w:eastAsia="cs-CZ"/>
+        </w:rPr>
+        <w:t>vector</w:t>
+      </w:r>
+      <w:proofErr w:type="spellEnd"/>
+      <w:r>
+        <w:rPr>
+          <w:lang w:eastAsia="cs-CZ"/>
+        </w:rPr>
+        <w:t>, bijektivní s vektorem schraňujícím velikosti dimenzí, kde tyto součiny budou.</w:t>
+      </w:r>
+      <w:r>
+        <w:rPr>
+          <w:lang w:eastAsia="cs-CZ"/>
+        </w:rPr>
+        <w:t xml:space="preserve"> To přináší potenciál pro optimalizaci, kde místo potřeby vypočítat takový součin (O(D) kde D je počet dimenzí) stačí pouze přečíst náležící prvek z tohoto vypočítaného pole pro složitost </w:t>
+      </w:r>
+      <w:proofErr w:type="gramStart"/>
+      <w:r>
+        <w:rPr>
+          <w:lang w:eastAsia="cs-CZ"/>
+        </w:rPr>
+        <w:t>O(</w:t>
+      </w:r>
+      <w:proofErr w:type="gramEnd"/>
+      <w:r>
+        <w:rPr>
+          <w:lang w:eastAsia="cs-CZ"/>
+        </w:rPr>
+        <w:t>1).</w:t>
+      </w:r>
+    </w:p>
+    <w:p>
+      <w:pPr>
+        <w:spacing w:line="360" w:lineRule="auto"/>
+        <w:rPr>
+          <w:lang w:eastAsia="cs-CZ"/>
+        </w:rPr>
+      </w:pPr>
+      <w:r>
+        <w:rPr>
+          <w:lang w:eastAsia="cs-CZ"/>
+        </w:rPr>
+        <w:t>Kumulativní souč</w:t>
+      </w:r>
+      <w:r>
+        <w:rPr>
+          <w:lang w:eastAsia="cs-CZ"/>
+        </w:rPr>
+        <w:t>in</w:t>
+      </w:r>
+      <w:r>
+        <w:rPr>
+          <w:lang w:eastAsia="cs-CZ"/>
+        </w:rPr>
+        <w:t xml:space="preserve"> předešlých dimenzí tedy udává, o kolik se vnitřní index změní, při změně souřadnice dané dimenze o jedna.</w:t>
+      </w:r>
+      <w:r>
+        <w:rPr>
+          <w:lang w:eastAsia="cs-CZ"/>
+        </w:rPr>
+        <w:t xml:space="preserve"> </w:t>
+      </w:r>
+    </w:p>
+    <w:p>
+      <w:pPr>
+        <w:spacing w:line="360" w:lineRule="auto"/>
+        <w:rPr>
+          <w:lang w:eastAsia="cs-CZ"/>
+        </w:rPr>
+      </w:pPr>
+      <m:oMathPara>
+        <m:oMath>
+          <m:sSub>
+            <m:sSubPr>
+              <m:ctrlPr>
+                <w:rPr>
+                  <w:rFonts w:ascii="Cambria Math" w:hAnsi="Cambria Math"/>
+                  <w:i/>
+                  <w:lang w:eastAsia="cs-CZ"/>
+                </w:rPr>
+              </m:ctrlPr>
+            </m:sSubPr>
+            <m:e>
+              <m:r>
+                <w:rPr>
+                  <w:rFonts w:ascii="Cambria Math" w:hAnsi="Cambria Math"/>
+                  <w:lang w:eastAsia="cs-CZ"/>
+                </w:rPr>
+                <m:t>k</m:t>
+              </m:r>
+            </m:e>
+            <m:sub>
+              <m:r>
+                <w:rPr>
+                  <w:rFonts w:ascii="Cambria Math" w:hAnsi="Cambria Math"/>
+                  <w:lang w:eastAsia="cs-CZ"/>
+                </w:rPr>
+                <m:t>i</m:t>
+              </m:r>
+            </m:sub>
+          </m:sSub>
+          <m:r>
+            <w:rPr>
+              <w:rFonts w:ascii="Cambria Math" w:hAnsi="Cambria Math"/>
+              <w:lang w:eastAsia="cs-CZ"/>
+            </w:rPr>
+            <m:t>=</m:t>
+          </m:r>
+          <m:d>
+            <m:dPr>
+              <m:begChr m:val="{"/>
+              <m:endChr m:val=""/>
+              <m:ctrlPr>
+                <w:rPr>
+                  <w:rFonts w:ascii="Cambria Math" w:hAnsi="Cambria Math"/>
+                  <w:i/>
+                  <w:lang w:eastAsia="cs-CZ"/>
+                </w:rPr>
+              </m:ctrlPr>
+            </m:dPr>
+            <m:e>
+              <m:eqArr>
+                <m:eqArrPr>
+                  <m:ctrlPr>
+                    <w:rPr>
+                      <w:rFonts w:ascii="Cambria Math" w:hAnsi="Cambria Math"/>
+                      <w:i/>
+                      <w:lang w:eastAsia="cs-CZ"/>
+                    </w:rPr>
+                  </m:ctrlPr>
+                </m:eqArrPr>
+                <m:e>
+                  <m:nary>
+                    <m:naryPr>
+                      <m:chr m:val="∏"/>
+                      <m:limLoc m:val="undOvr"/>
+                      <m:ctrlPr>
+                        <w:rPr>
+                          <w:rFonts w:ascii="Cambria Math" w:hAnsi="Cambria Math"/>
+                          <w:i/>
+                          <w:lang w:eastAsia="cs-CZ"/>
+                        </w:rPr>
+                      </m:ctrlPr>
+                    </m:naryPr>
+                    <m:sub>
+                      <m:r>
+                        <w:rPr>
+                          <w:rFonts w:ascii="Cambria Math" w:hAnsi="Cambria Math"/>
+                          <w:lang w:eastAsia="cs-CZ"/>
+                        </w:rPr>
+                        <m:t>k=0</m:t>
+                      </m:r>
+                    </m:sub>
+                    <m:sup>
+                      <m:r>
+                        <w:rPr>
+                          <w:rFonts w:ascii="Cambria Math" w:hAnsi="Cambria Math"/>
+                          <w:lang w:eastAsia="cs-CZ"/>
+                        </w:rPr>
+                        <m:t>i-1</m:t>
+                      </m:r>
+                    </m:sup>
+                    <m:e>
+                      <m:sSub>
+                        <m:sSubPr>
+                          <m:ctrlPr>
+                            <w:rPr>
+                              <w:rFonts w:ascii="Cambria Math" w:hAnsi="Cambria Math"/>
+                              <w:i/>
+                              <w:lang w:eastAsia="cs-CZ"/>
+                            </w:rPr>
+                          </m:ctrlPr>
+                        </m:sSubPr>
+                        <m:e>
+                          <m:r>
+                            <w:rPr>
+                              <w:rFonts w:ascii="Cambria Math" w:hAnsi="Cambria Math"/>
+                              <w:lang w:eastAsia="cs-CZ"/>
+                            </w:rPr>
+                            <m:t>ds</m:t>
+                          </m:r>
+                        </m:e>
+                        <m:sub>
+                          <m:r>
+                            <w:rPr>
+                              <w:rFonts w:ascii="Cambria Math" w:hAnsi="Cambria Math"/>
+                              <w:lang w:eastAsia="cs-CZ"/>
+                            </w:rPr>
+                            <m:t>k</m:t>
+                          </m:r>
+                        </m:sub>
+                      </m:sSub>
+                    </m:e>
+                  </m:nary>
+                  <m:r>
+                    <w:rPr>
+                      <w:rFonts w:ascii="Cambria Math" w:hAnsi="Cambria Math"/>
+                      <w:lang w:eastAsia="cs-CZ"/>
+                    </w:rPr>
+                    <m:t>;pro i&gt;0</m:t>
+                  </m:r>
+                </m:e>
+                <m:e>
+                  <m:r>
+                    <w:rPr>
+                      <w:rFonts w:ascii="Cambria Math" w:hAnsi="Cambria Math"/>
+                      <w:lang w:eastAsia="cs-CZ"/>
+                    </w:rPr>
+                    <m:t>1 ;pro i=0</m:t>
+                  </m:r>
+                </m:e>
+              </m:eqArr>
+            </m:e>
+          </m:d>
+        </m:oMath>
+      </m:oMathPara>
+    </w:p>
+    <w:p>
+      <w:pPr>
+        <w:spacing w:line="360" w:lineRule="auto"/>
+        <w:rPr>
+          <w:lang w:eastAsia="cs-CZ"/>
+        </w:rPr>
+      </w:pPr>
+      <w:r>
+        <w:rPr>
+          <w:lang w:eastAsia="cs-CZ"/>
+        </w:rPr>
+        <w:lastRenderedPageBreak/>
+        <w:t xml:space="preserve">Kde </w:t>
+      </w:r>
+      <w:r>
+        <w:rPr>
+          <w:i/>
+          <w:iCs/>
+          <w:lang w:eastAsia="cs-CZ"/>
+        </w:rPr>
+        <w:t>i</w:t>
+      </w:r>
+      <w:r>
+        <w:rPr>
+          <w:lang w:eastAsia="cs-CZ"/>
+        </w:rPr>
+        <w:t xml:space="preserve"> udává dimenzi, ke které se počítá tento </w:t>
+      </w:r>
+      <w:r>
+        <w:rPr>
+          <w:lang w:eastAsia="cs-CZ"/>
+        </w:rPr>
+        <w:t>kumulativní součin předešlých dimenzí</w:t>
+      </w:r>
+      <w:r>
+        <w:rPr>
+          <w:lang w:eastAsia="cs-CZ"/>
+        </w:rPr>
+        <w:t xml:space="preserve"> – označen jako </w:t>
+      </w:r>
+      <w:proofErr w:type="spellStart"/>
+      <w:r>
+        <w:rPr>
+          <w:i/>
+          <w:iCs/>
+          <w:lang w:eastAsia="cs-CZ"/>
+        </w:rPr>
+        <w:t>k</w:t>
+      </w:r>
+      <w:r>
+        <w:rPr>
+          <w:i/>
+          <w:iCs/>
+          <w:vertAlign w:val="subscript"/>
+          <w:lang w:eastAsia="cs-CZ"/>
+        </w:rPr>
+        <w:t>i</w:t>
+      </w:r>
+      <w:proofErr w:type="spellEnd"/>
+      <w:r>
+        <w:rPr>
+          <w:lang w:eastAsia="cs-CZ"/>
+        </w:rPr>
+        <w:t>.</w:t>
+      </w:r>
+      <w:r>
+        <w:rPr>
+          <w:lang w:eastAsia="cs-CZ"/>
+        </w:rPr>
+        <w:t xml:space="preserve"> </w:t>
+      </w:r>
+      <w:r>
+        <w:rPr>
+          <w:lang w:eastAsia="cs-CZ"/>
+        </w:rPr>
+        <w:t xml:space="preserve">Velikost dimenze zahrnutá do výpočtu je zde jako </w:t>
+      </w:r>
+      <w:proofErr w:type="spellStart"/>
+      <w:r>
+        <w:rPr>
+          <w:i/>
+          <w:iCs/>
+          <w:lang w:eastAsia="cs-CZ"/>
+        </w:rPr>
+        <w:t>ds</w:t>
+      </w:r>
+      <w:r>
+        <w:rPr>
+          <w:i/>
+          <w:iCs/>
+          <w:vertAlign w:val="subscript"/>
+          <w:lang w:eastAsia="cs-CZ"/>
+        </w:rPr>
+        <w:t>k</w:t>
+      </w:r>
+      <w:proofErr w:type="spellEnd"/>
+      <w:r>
+        <w:rPr>
+          <w:lang w:eastAsia="cs-CZ"/>
+        </w:rPr>
+        <w:t>.</w:t>
+      </w:r>
+      <w:r>
+        <w:rPr>
+          <w:lang w:eastAsia="cs-CZ"/>
+        </w:rPr>
+        <w:t xml:space="preserve"> </w:t>
+      </w:r>
+      <w:r>
+        <w:rPr>
+          <w:lang w:eastAsia="cs-CZ"/>
+        </w:rPr>
+        <w:t xml:space="preserve">Dobré si uvědomit, že když vynásobíme </w:t>
+      </w:r>
+      <w:proofErr w:type="spellStart"/>
+      <w:r>
+        <w:rPr>
+          <w:i/>
+          <w:iCs/>
+          <w:lang w:eastAsia="cs-CZ"/>
+        </w:rPr>
+        <w:t>k</w:t>
+      </w:r>
+      <w:r>
+        <w:rPr>
+          <w:i/>
+          <w:iCs/>
+          <w:vertAlign w:val="subscript"/>
+          <w:lang w:eastAsia="cs-CZ"/>
+        </w:rPr>
+        <w:t>i</w:t>
+      </w:r>
+      <w:proofErr w:type="spellEnd"/>
+      <w:r>
+        <w:rPr>
+          <w:lang w:eastAsia="cs-CZ"/>
+        </w:rPr>
+        <w:t xml:space="preserve"> </w:t>
+      </w:r>
+      <w:r>
+        <w:rPr>
+          <w:lang w:eastAsia="cs-CZ"/>
+        </w:rPr>
+        <w:t>rozměrem dimenze</w:t>
+      </w:r>
+      <w:r>
+        <w:rPr>
+          <w:lang w:eastAsia="cs-CZ"/>
+        </w:rPr>
+        <w:t>,</w:t>
+      </w:r>
+      <w:r>
+        <w:rPr>
+          <w:lang w:eastAsia="cs-CZ"/>
+        </w:rPr>
+        <w:t xml:space="preserve"> ke které je toto </w:t>
+      </w:r>
+      <w:proofErr w:type="spellStart"/>
+      <w:r>
+        <w:rPr>
+          <w:i/>
+          <w:iCs/>
+          <w:lang w:eastAsia="cs-CZ"/>
+        </w:rPr>
+        <w:t>k</w:t>
+      </w:r>
+      <w:r>
+        <w:rPr>
+          <w:i/>
+          <w:iCs/>
+          <w:vertAlign w:val="subscript"/>
+          <w:lang w:eastAsia="cs-CZ"/>
+        </w:rPr>
+        <w:t>i</w:t>
+      </w:r>
+      <w:proofErr w:type="spellEnd"/>
+      <w:r>
+        <w:rPr>
+          <w:lang w:eastAsia="cs-CZ"/>
+        </w:rPr>
+        <w:t xml:space="preserve"> počítáno, tak dostaneme </w:t>
+      </w:r>
+      <w:r>
+        <w:rPr>
+          <w:b/>
+          <w:bCs/>
+          <w:lang w:eastAsia="cs-CZ"/>
+        </w:rPr>
+        <w:t>velikost nejednoznačného výběru</w:t>
+      </w:r>
+      <w:r>
+        <w:rPr>
+          <w:lang w:eastAsia="cs-CZ"/>
+        </w:rPr>
+        <w:t xml:space="preserve"> v případě, kdyby souřadnice byly vyplněny až po dimenzi </w:t>
+      </w:r>
+      <w:r>
+        <w:rPr>
+          <w:i/>
+          <w:iCs/>
+          <w:lang w:eastAsia="cs-CZ"/>
+        </w:rPr>
+        <w:t>i</w:t>
+      </w:r>
+      <w:r>
+        <w:rPr>
+          <w:lang w:eastAsia="cs-CZ"/>
+        </w:rPr>
+        <w:t xml:space="preserve"> (včetně).</w:t>
+      </w:r>
     </w:p>
     <w:p>
       <w:pPr>
@@ -5268,7 +7679,7 @@
           <w:lang w:eastAsia="cs-CZ"/>
         </w:rPr>
       </w:pPr>
-      <w:bookmarkStart w:id="13" w:name="_Toc227520790"/>
+      <w:bookmarkStart w:id="15" w:name="_Toc227522092"/>
       <w:r>
         <w:rPr>
           <w:lang w:eastAsia="cs-CZ"/>
@@ -5293,7 +7704,7 @@
         </w:rPr>
         <w:t xml:space="preserve"> Paralelní tenzor</w:t>
       </w:r>
-      <w:bookmarkEnd w:id="13"/>
+      <w:bookmarkEnd w:id="15"/>
     </w:p>
     <w:p>
       <w:pPr>
@@ -5302,12 +7713,14 @@
           <w:lang w:eastAsia="cs-CZ"/>
         </w:rPr>
       </w:pPr>
+      <w:proofErr w:type="spellStart"/>
       <w:r>
         <w:rPr>
           <w:lang w:eastAsia="cs-CZ"/>
         </w:rPr>
         <w:t>Xxx</w:t>
       </w:r>
+      <w:proofErr w:type="spellEnd"/>
     </w:p>
     <w:p>
       <w:pPr>
@@ -5316,7 +7729,7 @@
           <w:lang w:eastAsia="cs-CZ"/>
         </w:rPr>
       </w:pPr>
-      <w:bookmarkStart w:id="14" w:name="_Toc227520791"/>
+      <w:bookmarkStart w:id="16" w:name="_Toc227522093"/>
       <w:r>
         <w:rPr>
           <w:lang w:eastAsia="cs-CZ"/>
@@ -5341,7 +7754,7 @@
         </w:rPr>
         <w:t xml:space="preserve"> Matice</w:t>
       </w:r>
-      <w:bookmarkEnd w:id="14"/>
+      <w:bookmarkEnd w:id="16"/>
     </w:p>
     <w:p>
       <w:pPr>
@@ -5350,12 +7763,14 @@
           <w:lang w:eastAsia="cs-CZ"/>
         </w:rPr>
       </w:pPr>
+      <w:proofErr w:type="spellStart"/>
       <w:r>
         <w:rPr>
           <w:lang w:eastAsia="cs-CZ"/>
         </w:rPr>
         <w:t>Xxx</w:t>
       </w:r>
+      <w:proofErr w:type="spellEnd"/>
     </w:p>
     <w:p>
       <w:pPr>
@@ -5364,7 +7779,7 @@
           <w:lang w:eastAsia="cs-CZ"/>
         </w:rPr>
       </w:pPr>
-      <w:bookmarkStart w:id="15" w:name="_Toc227520792"/>
+      <w:bookmarkStart w:id="17" w:name="_Toc227522094"/>
       <w:r>
         <w:rPr>
           <w:lang w:eastAsia="cs-CZ"/>
@@ -5389,7 +7804,7 @@
         </w:rPr>
         <w:t>5 Paralelní matice</w:t>
       </w:r>
-      <w:bookmarkEnd w:id="15"/>
+      <w:bookmarkEnd w:id="17"/>
     </w:p>
     <w:p>
       <w:pPr>
@@ -5398,12 +7813,14 @@
           <w:lang w:eastAsia="cs-CZ"/>
         </w:rPr>
       </w:pPr>
+      <w:proofErr w:type="spellStart"/>
       <w:r>
         <w:rPr>
           <w:lang w:eastAsia="cs-CZ"/>
         </w:rPr>
         <w:t>Xxx</w:t>
       </w:r>
+      <w:proofErr w:type="spellEnd"/>
     </w:p>
     <w:p>
       <w:pPr>
@@ -5412,7 +7829,7 @@
           <w:lang w:eastAsia="cs-CZ"/>
         </w:rPr>
       </w:pPr>
-      <w:bookmarkStart w:id="16" w:name="_Toc227520793"/>
+      <w:bookmarkStart w:id="18" w:name="_Toc227522095"/>
       <w:r>
         <w:rPr>
           <w:lang w:eastAsia="cs-CZ"/>
@@ -5435,9 +7852,23 @@
         <w:rPr>
           <w:lang w:eastAsia="cs-CZ"/>
         </w:rPr>
-        <w:t>6 N-nární strom</w:t>
-      </w:r>
-      <w:bookmarkEnd w:id="16"/>
+        <w:t>6 N-</w:t>
+      </w:r>
+      <w:proofErr w:type="spellStart"/>
+      <w:r>
+        <w:rPr>
+          <w:lang w:eastAsia="cs-CZ"/>
+        </w:rPr>
+        <w:t>nární</w:t>
+      </w:r>
+      <w:proofErr w:type="spellEnd"/>
+      <w:r>
+        <w:rPr>
+          <w:lang w:eastAsia="cs-CZ"/>
+        </w:rPr>
+        <w:t xml:space="preserve"> strom</w:t>
+      </w:r>
+      <w:bookmarkEnd w:id="18"/>
     </w:p>
     <w:p>
       <w:pPr>
@@ -5446,12 +7877,14 @@
           <w:lang w:eastAsia="cs-CZ"/>
         </w:rPr>
       </w:pPr>
+      <w:proofErr w:type="spellStart"/>
       <w:r>
         <w:rPr>
           <w:lang w:eastAsia="cs-CZ"/>
         </w:rPr>
         <w:t>Xxx</w:t>
       </w:r>
+      <w:proofErr w:type="spellEnd"/>
     </w:p>
     <w:p>
       <w:pPr>
@@ -5460,7 +7893,7 @@
           <w:lang w:eastAsia="cs-CZ"/>
         </w:rPr>
       </w:pPr>
-      <w:bookmarkStart w:id="17" w:name="_Toc227520794"/>
+      <w:bookmarkStart w:id="19" w:name="_Toc227522096"/>
       <w:r>
         <w:rPr>
           <w:lang w:eastAsia="cs-CZ"/>
@@ -5479,7 +7912,7 @@
         </w:rPr>
         <w:t xml:space="preserve"> Testy</w:t>
       </w:r>
-      <w:bookmarkEnd w:id="17"/>
+      <w:bookmarkEnd w:id="19"/>
     </w:p>
     <w:p>
       <w:pPr>
@@ -5488,12 +7921,14 @@
           <w:lang w:eastAsia="cs-CZ"/>
         </w:rPr>
       </w:pPr>
+      <w:proofErr w:type="spellStart"/>
       <w:r>
         <w:rPr>
           <w:lang w:eastAsia="cs-CZ"/>
         </w:rPr>
         <w:t>Xxx</w:t>
       </w:r>
+      <w:proofErr w:type="spellEnd"/>
     </w:p>
     <w:p>
       <w:pPr>
@@ -5502,7 +7937,7 @@
           <w:lang w:eastAsia="cs-CZ"/>
         </w:rPr>
       </w:pPr>
-      <w:bookmarkStart w:id="18" w:name="_Toc227520795"/>
+      <w:bookmarkStart w:id="20" w:name="_Toc227522097"/>
       <w:r>
         <w:rPr>
           <w:lang w:eastAsia="cs-CZ"/>
@@ -5521,7 +7956,7 @@
         </w:rPr>
         <w:t>.1 Unit testování</w:t>
       </w:r>
-      <w:bookmarkEnd w:id="18"/>
+      <w:bookmarkEnd w:id="20"/>
     </w:p>
     <w:p>
       <w:pPr>
@@ -5530,12 +7965,14 @@
           <w:lang w:eastAsia="cs-CZ"/>
         </w:rPr>
       </w:pPr>
+      <w:proofErr w:type="spellStart"/>
       <w:r>
         <w:rPr>
           <w:lang w:eastAsia="cs-CZ"/>
         </w:rPr>
         <w:t>Xxx</w:t>
       </w:r>
+      <w:proofErr w:type="spellEnd"/>
     </w:p>
     <w:p>
       <w:pPr>
@@ -5544,7 +7981,7 @@
           <w:lang w:eastAsia="cs-CZ"/>
         </w:rPr>
       </w:pPr>
-      <w:bookmarkStart w:id="19" w:name="_Toc227520796"/>
+      <w:bookmarkStart w:id="21" w:name="_Toc227522098"/>
       <w:r>
         <w:rPr>
           <w:lang w:eastAsia="cs-CZ"/>
@@ -5563,7 +8000,7 @@
         </w:rPr>
         <w:t>.2 Zátěžové testování</w:t>
       </w:r>
-      <w:bookmarkEnd w:id="19"/>
+      <w:bookmarkEnd w:id="21"/>
     </w:p>
     <w:p>
       <w:pPr>
@@ -5572,12 +8009,14 @@
           <w:lang w:eastAsia="cs-CZ"/>
         </w:rPr>
       </w:pPr>
+      <w:proofErr w:type="spellStart"/>
       <w:r>
         <w:rPr>
           <w:lang w:eastAsia="cs-CZ"/>
         </w:rPr>
         <w:t>Xxx</w:t>
       </w:r>
+      <w:proofErr w:type="spellEnd"/>
     </w:p>
     <w:p>
       <w:pPr>
@@ -5601,17 +8040,19 @@
       <w:pPr>
         <w:pStyle w:val="Nadpis1"/>
       </w:pPr>
-      <w:bookmarkStart w:id="20" w:name="_Toc227520797"/>
+      <w:bookmarkStart w:id="22" w:name="_Toc227522099"/>
       <w:r>
         <w:lastRenderedPageBreak/>
         <w:t>3 TEORETICKÉ VYUŽITÍ</w:t>
       </w:r>
-      <w:bookmarkEnd w:id="20"/>
-    </w:p>
-    <w:p>
+      <w:bookmarkEnd w:id="22"/>
+    </w:p>
+    <w:p>
+      <w:proofErr w:type="spellStart"/>
       <w:r>
         <w:t>Xxx</w:t>
       </w:r>
+      <w:proofErr w:type="spellEnd"/>
     </w:p>
     <w:p>
       <w:pPr>
@@ -5631,7 +8072,7 @@
           <w:szCs w:val="24"/>
         </w:rPr>
       </w:pPr>
-      <w:bookmarkStart w:id="21" w:name="_Toc227521731"/>
+      <w:bookmarkStart w:id="23" w:name="_Toc227521731"/>
       <w:r>
         <w:rPr>
           <w:i w:val="0"/>
@@ -5706,7 +8147,7 @@
         </w:rPr>
         <w:t>Vzdělanostní struktura obyvatelstva České republiky (2021)</w:t>
       </w:r>
-      <w:bookmarkEnd w:id="21"/>
+      <w:bookmarkEnd w:id="23"/>
     </w:p>
     <w:tbl>
       <w:tblPr>
@@ -6341,8 +8782,8 @@
         </w:rPr>
         <w:t>: Balonky (Min, 2016</w:t>
       </w:r>
-      <w:bookmarkStart w:id="22" w:name="_Toc24458948"/>
-      <w:bookmarkStart w:id="23" w:name="_Toc24459062"/>
+      <w:bookmarkStart w:id="24" w:name="_Toc24458948"/>
+      <w:bookmarkStart w:id="25" w:name="_Toc24459062"/>
       <w:r>
         <w:rPr>
           <w:i w:val="0"/>
@@ -6350,8 +8791,8 @@
         </w:rPr>
         <w:t>)</w:t>
       </w:r>
-      <w:bookmarkEnd w:id="22"/>
-      <w:bookmarkEnd w:id="23"/>
+      <w:bookmarkEnd w:id="24"/>
+      <w:bookmarkEnd w:id="25"/>
       <w:r>
         <w:rPr>
           <w:i w:val="0"/>
@@ -6370,12 +8811,12 @@
         </w:rPr>
         <w:br w:type="page"/>
       </w:r>
-      <w:bookmarkStart w:id="24" w:name="_Toc227520798"/>
+      <w:bookmarkStart w:id="26" w:name="_Toc227522100"/>
       <w:r>
         <w:lastRenderedPageBreak/>
         <w:t>ZÁVĚR</w:t>
       </w:r>
-      <w:bookmarkEnd w:id="24"/>
+      <w:bookmarkEnd w:id="26"/>
     </w:p>
     <w:p>
       <w:pPr>
@@ -6549,12 +8990,12 @@
       <w:r>
         <w:br w:type="page"/>
       </w:r>
-      <w:bookmarkStart w:id="25" w:name="_Toc227520799"/>
+      <w:bookmarkStart w:id="27" w:name="_Toc227522101"/>
       <w:r>
         <w:lastRenderedPageBreak/>
         <w:t>POUŽITÁ LITERATURA</w:t>
       </w:r>
-      <w:bookmarkEnd w:id="25"/>
+      <w:bookmarkEnd w:id="27"/>
     </w:p>
     <w:p>
       <w:pPr>
@@ -6757,13 +9198,22 @@
           <w:sz w:val="24"/>
           <w:szCs w:val="24"/>
         </w:rPr>
-        <w:t>, Jungyeon</w:t>
-      </w:r>
+        <w:t xml:space="preserve">, </w:t>
+      </w:r>
+      <w:proofErr w:type="spellStart"/>
       <w:r>
         <w:rPr>
           <w:sz w:val="24"/>
           <w:szCs w:val="24"/>
         </w:rPr>
+        <w:t>Jungyeon</w:t>
+      </w:r>
+      <w:proofErr w:type="spellEnd"/>
+      <w:r>
+        <w:rPr>
+          <w:sz w:val="24"/>
+          <w:szCs w:val="24"/>
+        </w:rPr>
         <w:t>, 2016</w:t>
       </w:r>
       <w:r>
@@ -6773,6 +9223,7 @@
         </w:rPr>
         <w:t xml:space="preserve">. </w:t>
       </w:r>
+      <w:proofErr w:type="spellStart"/>
       <w:r>
         <w:rPr>
           <w:i/>
@@ -6782,6 +9233,7 @@
         </w:rPr>
         <w:t>Balloons</w:t>
       </w:r>
+      <w:proofErr w:type="spellEnd"/>
       <w:r>
         <w:rPr>
           <w:sz w:val="24"/>
@@ -6803,6 +9255,7 @@
         </w:rPr>
         <w:t xml:space="preserve">In: </w:t>
       </w:r>
+      <w:proofErr w:type="spellStart"/>
       <w:r>
         <w:rPr>
           <w:sz w:val="24"/>
@@ -6810,6 +9263,7 @@
         </w:rPr>
         <w:t>Pixabay</w:t>
       </w:r>
+      <w:proofErr w:type="spellEnd"/>
       <w:r>
         <w:rPr>
           <w:sz w:val="24"/>
@@ -6912,12 +9366,12 @@
       <w:r>
         <w:br w:type="page"/>
       </w:r>
-      <w:bookmarkStart w:id="26" w:name="_Toc227520800"/>
+      <w:bookmarkStart w:id="28" w:name="_Toc227522102"/>
       <w:r>
         <w:lastRenderedPageBreak/>
         <w:t>SEZNAM PŘÍLOH</w:t>
       </w:r>
-      <w:bookmarkEnd w:id="26"/>
+      <w:bookmarkEnd w:id="28"/>
     </w:p>
     <w:p>
       <w:pPr>
@@ -8098,6 +10552,16 @@
       <w:shd w:val="clear" w:color="auto" w:fill="E1DFDD"/>
     </w:rPr>
   </w:style>
+  <w:style w:type="character" w:styleId="Zstupntext">
+    <w:name w:val="Placeholder Text"/>
+    <w:basedOn w:val="Standardnpsmoodstavce"/>
+    <w:uiPriority w:val="99"/>
+    <w:semiHidden/>
+    <w:rsid w:val="002C386C"/>
+    <w:rPr>
+      <w:color w:val="666666"/>
+    </w:rPr>
+  </w:style>
 </w:styles>
 </file>
 

</xml_diff>

<commit_message>
documentation - incrementation of coordinates and transposition.
</commit_message>
<xml_diff>
--- a/ŠpaňúrM_KnihovnaProPraci_JM_2026.docx
+++ b/ŠpaňúrM_KnihovnaProPraci_JM_2026.docx
@@ -2466,6 +2466,7 @@
           <w:noProof/>
           <w:kern w:val="2"/>
           <w:szCs w:val="24"/>
+          <w:lang/>
           <w14:ligatures w14:val="standardContextual"/>
         </w:rPr>
       </w:pPr>
@@ -2478,7 +2479,7 @@
       <w:r>
         <w:fldChar w:fldCharType="separate"/>
       </w:r>
-      <w:hyperlink w:anchor="_Toc227522077" w:history="1">
+      <w:hyperlink w:anchor="_Toc229768686" w:history="1">
         <w:r>
           <w:rPr>
             <w:rStyle w:val="Hypertextovodkaz"/>
@@ -2506,7 +2507,7 @@
             <w:noProof/>
             <w:webHidden/>
           </w:rPr>
-          <w:instrText xml:space="preserve"> PAGEREF _Toc227522077 \h </w:instrText>
+          <w:instrText xml:space="preserve"> PAGEREF _Toc229768686 \h </w:instrText>
         </w:r>
         <w:r>
           <w:rPr>
@@ -2548,10 +2549,11 @@
           <w:noProof/>
           <w:kern w:val="2"/>
           <w:szCs w:val="24"/>
+          <w:lang/>
           <w14:ligatures w14:val="standardContextual"/>
         </w:rPr>
       </w:pPr>
-      <w:hyperlink w:anchor="_Toc227522078" w:history="1">
+      <w:hyperlink w:anchor="_Toc229768687" w:history="1">
         <w:r>
           <w:rPr>
             <w:rStyle w:val="Hypertextovodkaz"/>
@@ -2579,7 +2581,7 @@
             <w:noProof/>
             <w:webHidden/>
           </w:rPr>
-          <w:instrText xml:space="preserve"> PAGEREF _Toc227522078 \h </w:instrText>
+          <w:instrText xml:space="preserve"> PAGEREF _Toc229768687 \h </w:instrText>
         </w:r>
         <w:r>
           <w:rPr>
@@ -2621,10 +2623,11 @@
           <w:noProof/>
           <w:kern w:val="2"/>
           <w:szCs w:val="24"/>
+          <w:lang/>
           <w14:ligatures w14:val="standardContextual"/>
         </w:rPr>
       </w:pPr>
-      <w:hyperlink w:anchor="_Toc227522079" w:history="1">
+      <w:hyperlink w:anchor="_Toc229768688" w:history="1">
         <w:r>
           <w:rPr>
             <w:rStyle w:val="Hypertextovodkaz"/>
@@ -2652,7 +2655,7 @@
             <w:noProof/>
             <w:webHidden/>
           </w:rPr>
-          <w:instrText xml:space="preserve"> PAGEREF _Toc227522079 \h </w:instrText>
+          <w:instrText xml:space="preserve"> PAGEREF _Toc229768688 \h </w:instrText>
         </w:r>
         <w:r>
           <w:rPr>
@@ -2694,10 +2697,11 @@
           <w:noProof/>
           <w:kern w:val="2"/>
           <w:szCs w:val="24"/>
+          <w:lang/>
           <w14:ligatures w14:val="standardContextual"/>
         </w:rPr>
       </w:pPr>
-      <w:hyperlink w:anchor="_Toc227522080" w:history="1">
+      <w:hyperlink w:anchor="_Toc229768689" w:history="1">
         <w:r>
           <w:rPr>
             <w:rStyle w:val="Hypertextovodkaz"/>
@@ -2724,7 +2728,7 @@
             <w:noProof/>
             <w:webHidden/>
           </w:rPr>
-          <w:instrText xml:space="preserve"> PAGEREF _Toc227522080 \h </w:instrText>
+          <w:instrText xml:space="preserve"> PAGEREF _Toc229768689 \h </w:instrText>
         </w:r>
         <w:r>
           <w:rPr>
@@ -2766,10 +2770,11 @@
           <w:noProof/>
           <w:kern w:val="2"/>
           <w:szCs w:val="24"/>
+          <w:lang/>
           <w14:ligatures w14:val="standardContextual"/>
         </w:rPr>
       </w:pPr>
-      <w:hyperlink w:anchor="_Toc227522081" w:history="1">
+      <w:hyperlink w:anchor="_Toc229768690" w:history="1">
         <w:r>
           <w:rPr>
             <w:rStyle w:val="Hypertextovodkaz"/>
@@ -2796,7 +2801,7 @@
             <w:noProof/>
             <w:webHidden/>
           </w:rPr>
-          <w:instrText xml:space="preserve"> PAGEREF _Toc227522081 \h </w:instrText>
+          <w:instrText xml:space="preserve"> PAGEREF _Toc229768690 \h </w:instrText>
         </w:r>
         <w:r>
           <w:rPr>
@@ -2835,10 +2840,11 @@
           <w:noProof/>
           <w:kern w:val="2"/>
           <w:szCs w:val="24"/>
+          <w:lang/>
           <w14:ligatures w14:val="standardContextual"/>
         </w:rPr>
       </w:pPr>
-      <w:hyperlink w:anchor="_Toc227522082" w:history="1">
+      <w:hyperlink w:anchor="_Toc229768691" w:history="1">
         <w:r>
           <w:rPr>
             <w:rStyle w:val="Hypertextovodkaz"/>
@@ -2865,7 +2871,7 @@
             <w:noProof/>
             <w:webHidden/>
           </w:rPr>
-          <w:instrText xml:space="preserve"> PAGEREF _Toc227522082 \h </w:instrText>
+          <w:instrText xml:space="preserve"> PAGEREF _Toc229768691 \h </w:instrText>
         </w:r>
         <w:r>
           <w:rPr>
@@ -2904,10 +2910,11 @@
           <w:noProof/>
           <w:kern w:val="2"/>
           <w:szCs w:val="24"/>
+          <w:lang/>
           <w14:ligatures w14:val="standardContextual"/>
         </w:rPr>
       </w:pPr>
-      <w:hyperlink w:anchor="_Toc227522083" w:history="1">
+      <w:hyperlink w:anchor="_Toc229768692" w:history="1">
         <w:r>
           <w:rPr>
             <w:rStyle w:val="Hypertextovodkaz"/>
@@ -2934,7 +2941,7 @@
             <w:noProof/>
             <w:webHidden/>
           </w:rPr>
-          <w:instrText xml:space="preserve"> PAGEREF _Toc227522083 \h </w:instrText>
+          <w:instrText xml:space="preserve"> PAGEREF _Toc229768692 \h </w:instrText>
         </w:r>
         <w:r>
           <w:rPr>
@@ -2973,10 +2980,11 @@
           <w:noProof/>
           <w:kern w:val="2"/>
           <w:szCs w:val="24"/>
+          <w:lang/>
           <w14:ligatures w14:val="standardContextual"/>
         </w:rPr>
       </w:pPr>
-      <w:hyperlink w:anchor="_Toc227522084" w:history="1">
+      <w:hyperlink w:anchor="_Toc229768693" w:history="1">
         <w:r>
           <w:rPr>
             <w:rStyle w:val="Hypertextovodkaz"/>
@@ -3003,7 +3011,7 @@
             <w:noProof/>
             <w:webHidden/>
           </w:rPr>
-          <w:instrText xml:space="preserve"> PAGEREF _Toc227522084 \h </w:instrText>
+          <w:instrText xml:space="preserve"> PAGEREF _Toc229768693 \h </w:instrText>
         </w:r>
         <w:r>
           <w:rPr>
@@ -3045,10 +3053,11 @@
           <w:noProof/>
           <w:kern w:val="2"/>
           <w:szCs w:val="24"/>
+          <w:lang/>
           <w14:ligatures w14:val="standardContextual"/>
         </w:rPr>
       </w:pPr>
-      <w:hyperlink w:anchor="_Toc227522085" w:history="1">
+      <w:hyperlink w:anchor="_Toc229768694" w:history="1">
         <w:r>
           <w:rPr>
             <w:rStyle w:val="Hypertextovodkaz"/>
@@ -3075,7 +3084,7 @@
             <w:noProof/>
             <w:webHidden/>
           </w:rPr>
-          <w:instrText xml:space="preserve"> PAGEREF _Toc227522085 \h </w:instrText>
+          <w:instrText xml:space="preserve"> PAGEREF _Toc229768694 \h </w:instrText>
         </w:r>
         <w:r>
           <w:rPr>
@@ -3095,7 +3104,7 @@
             <w:noProof/>
             <w:webHidden/>
           </w:rPr>
-          <w:t>14</w:t>
+          <w:t>17</w:t>
         </w:r>
         <w:r>
           <w:rPr>
@@ -3114,10 +3123,11 @@
           <w:noProof/>
           <w:kern w:val="2"/>
           <w:szCs w:val="24"/>
+          <w:lang/>
           <w14:ligatures w14:val="standardContextual"/>
         </w:rPr>
       </w:pPr>
-      <w:hyperlink w:anchor="_Toc227522086" w:history="1">
+      <w:hyperlink w:anchor="_Toc229768695" w:history="1">
         <w:r>
           <w:rPr>
             <w:rStyle w:val="Hypertextovodkaz"/>
@@ -3144,7 +3154,7 @@
             <w:noProof/>
             <w:webHidden/>
           </w:rPr>
-          <w:instrText xml:space="preserve"> PAGEREF _Toc227522086 \h </w:instrText>
+          <w:instrText xml:space="preserve"> PAGEREF _Toc229768695 \h </w:instrText>
         </w:r>
         <w:r>
           <w:rPr>
@@ -3164,7 +3174,7 @@
             <w:noProof/>
             <w:webHidden/>
           </w:rPr>
-          <w:t>14</w:t>
+          <w:t>17</w:t>
         </w:r>
         <w:r>
           <w:rPr>
@@ -3186,10 +3196,11 @@
           <w:noProof/>
           <w:kern w:val="2"/>
           <w:szCs w:val="24"/>
+          <w:lang/>
           <w14:ligatures w14:val="standardContextual"/>
         </w:rPr>
       </w:pPr>
-      <w:hyperlink w:anchor="_Toc227522087" w:history="1">
+      <w:hyperlink w:anchor="_Toc229768696" w:history="1">
         <w:r>
           <w:rPr>
             <w:rStyle w:val="Hypertextovodkaz"/>
@@ -3216,7 +3227,7 @@
             <w:noProof/>
             <w:webHidden/>
           </w:rPr>
-          <w:instrText xml:space="preserve"> PAGEREF _Toc227522087 \h </w:instrText>
+          <w:instrText xml:space="preserve"> PAGEREF _Toc229768696 \h </w:instrText>
         </w:r>
         <w:r>
           <w:rPr>
@@ -3236,7 +3247,7 @@
             <w:noProof/>
             <w:webHidden/>
           </w:rPr>
-          <w:t>14</w:t>
+          <w:t>17</w:t>
         </w:r>
         <w:r>
           <w:rPr>
@@ -3258,10 +3269,11 @@
           <w:noProof/>
           <w:kern w:val="2"/>
           <w:szCs w:val="24"/>
+          <w:lang/>
           <w14:ligatures w14:val="standardContextual"/>
         </w:rPr>
       </w:pPr>
-      <w:hyperlink w:anchor="_Toc227522088" w:history="1">
+      <w:hyperlink w:anchor="_Toc229768697" w:history="1">
         <w:r>
           <w:rPr>
             <w:rStyle w:val="Hypertextovodkaz"/>
@@ -3288,7 +3300,7 @@
             <w:noProof/>
             <w:webHidden/>
           </w:rPr>
-          <w:instrText xml:space="preserve"> PAGEREF _Toc227522088 \h </w:instrText>
+          <w:instrText xml:space="preserve"> PAGEREF _Toc229768697 \h </w:instrText>
         </w:r>
         <w:r>
           <w:rPr>
@@ -3308,7 +3320,7 @@
             <w:noProof/>
             <w:webHidden/>
           </w:rPr>
-          <w:t>14</w:t>
+          <w:t>17</w:t>
         </w:r>
         <w:r>
           <w:rPr>
@@ -3327,10 +3339,11 @@
           <w:noProof/>
           <w:kern w:val="2"/>
           <w:szCs w:val="24"/>
+          <w:lang/>
           <w14:ligatures w14:val="standardContextual"/>
         </w:rPr>
       </w:pPr>
-      <w:hyperlink w:anchor="_Toc227522089" w:history="1">
+      <w:hyperlink w:anchor="_Toc229768698" w:history="1">
         <w:r>
           <w:rPr>
             <w:rStyle w:val="Hypertextovodkaz"/>
@@ -3357,7 +3370,7 @@
             <w:noProof/>
             <w:webHidden/>
           </w:rPr>
-          <w:instrText xml:space="preserve"> PAGEREF _Toc227522089 \h </w:instrText>
+          <w:instrText xml:space="preserve"> PAGEREF _Toc229768698 \h </w:instrText>
         </w:r>
         <w:r>
           <w:rPr>
@@ -3377,7 +3390,7 @@
             <w:noProof/>
             <w:webHidden/>
           </w:rPr>
-          <w:t>14</w:t>
+          <w:t>17</w:t>
         </w:r>
         <w:r>
           <w:rPr>
@@ -3399,24 +3412,17 @@
           <w:noProof/>
           <w:kern w:val="2"/>
           <w:szCs w:val="24"/>
+          <w:lang/>
           <w14:ligatures w14:val="standardContextual"/>
         </w:rPr>
       </w:pPr>
-      <w:hyperlink w:anchor="_Toc227522090" w:history="1">
+      <w:hyperlink w:anchor="_Toc229768699" w:history="1">
         <w:r>
           <w:rPr>
             <w:rStyle w:val="Hypertextovodkaz"/>
             <w:noProof/>
           </w:rPr>
-          <w:t>2.2.1</w:t>
-        </w:r>
-        <w:r>
-          <w:rPr>
-            <w:rStyle w:val="Hypertextovodkaz"/>
-            <w:noProof/>
-            <w:lang w:eastAsia="cs-CZ"/>
-          </w:rPr>
-          <w:t xml:space="preserve"> Lineární kontejner</w:t>
+          <w:t>2.2.1 Koncepty</w:t>
         </w:r>
         <w:r>
           <w:rPr>
@@ -3437,7 +3443,7 @@
             <w:noProof/>
             <w:webHidden/>
           </w:rPr>
-          <w:instrText xml:space="preserve"> PAGEREF _Toc227522090 \h </w:instrText>
+          <w:instrText xml:space="preserve"> PAGEREF _Toc229768699 \h </w:instrText>
         </w:r>
         <w:r>
           <w:rPr>
@@ -3457,7 +3463,7 @@
             <w:noProof/>
             <w:webHidden/>
           </w:rPr>
-          <w:t>14</w:t>
+          <w:t>17</w:t>
         </w:r>
         <w:r>
           <w:rPr>
@@ -3479,17 +3485,17 @@
           <w:noProof/>
           <w:kern w:val="2"/>
           <w:szCs w:val="24"/>
+          <w:lang/>
           <w14:ligatures w14:val="standardContextual"/>
         </w:rPr>
       </w:pPr>
-      <w:hyperlink w:anchor="_Toc227522091" w:history="1">
+      <w:hyperlink w:anchor="_Toc229768700" w:history="1">
         <w:r>
           <w:rPr>
             <w:rStyle w:val="Hypertextovodkaz"/>
             <w:noProof/>
-            <w:lang w:eastAsia="cs-CZ"/>
-          </w:rPr>
-          <w:t>2.2.2 Tenzor</w:t>
+          </w:rPr>
+          <w:t>2.2.2 Paměťový backend</w:t>
         </w:r>
         <w:r>
           <w:rPr>
@@ -3510,7 +3516,7 @@
             <w:noProof/>
             <w:webHidden/>
           </w:rPr>
-          <w:instrText xml:space="preserve"> PAGEREF _Toc227522091 \h </w:instrText>
+          <w:instrText xml:space="preserve"> PAGEREF _Toc229768700 \h </w:instrText>
         </w:r>
         <w:r>
           <w:rPr>
@@ -3530,7 +3536,7 @@
             <w:noProof/>
             <w:webHidden/>
           </w:rPr>
-          <w:t>16</w:t>
+          <w:t>18</w:t>
         </w:r>
         <w:r>
           <w:rPr>
@@ -3552,17 +3558,25 @@
           <w:noProof/>
           <w:kern w:val="2"/>
           <w:szCs w:val="24"/>
+          <w:lang/>
           <w14:ligatures w14:val="standardContextual"/>
         </w:rPr>
       </w:pPr>
-      <w:hyperlink w:anchor="_Toc227522092" w:history="1">
+      <w:hyperlink w:anchor="_Toc229768701" w:history="1">
         <w:r>
           <w:rPr>
             <w:rStyle w:val="Hypertextovodkaz"/>
             <w:noProof/>
+          </w:rPr>
+          <w:t>2.2.3</w:t>
+        </w:r>
+        <w:r>
+          <w:rPr>
+            <w:rStyle w:val="Hypertextovodkaz"/>
+            <w:noProof/>
             <w:lang w:eastAsia="cs-CZ"/>
           </w:rPr>
-          <w:t>2.2.3 Paralelní tenzor</w:t>
+          <w:t xml:space="preserve"> Lineární kontejner</w:t>
         </w:r>
         <w:r>
           <w:rPr>
@@ -3583,7 +3597,7 @@
             <w:noProof/>
             <w:webHidden/>
           </w:rPr>
-          <w:instrText xml:space="preserve"> PAGEREF _Toc227522092 \h </w:instrText>
+          <w:instrText xml:space="preserve"> PAGEREF _Toc229768701 \h </w:instrText>
         </w:r>
         <w:r>
           <w:rPr>
@@ -3603,7 +3617,7 @@
             <w:noProof/>
             <w:webHidden/>
           </w:rPr>
-          <w:t>16</w:t>
+          <w:t>18</w:t>
         </w:r>
         <w:r>
           <w:rPr>
@@ -3625,17 +3639,18 @@
           <w:noProof/>
           <w:kern w:val="2"/>
           <w:szCs w:val="24"/>
+          <w:lang/>
           <w14:ligatures w14:val="standardContextual"/>
         </w:rPr>
       </w:pPr>
-      <w:hyperlink w:anchor="_Toc227522093" w:history="1">
+      <w:hyperlink w:anchor="_Toc229768702" w:history="1">
         <w:r>
           <w:rPr>
             <w:rStyle w:val="Hypertextovodkaz"/>
             <w:noProof/>
             <w:lang w:eastAsia="cs-CZ"/>
           </w:rPr>
-          <w:t>2.2.4 Matice</w:t>
+          <w:t>2.2.4 Tenzor</w:t>
         </w:r>
         <w:r>
           <w:rPr>
@@ -3656,7 +3671,7 @@
             <w:noProof/>
             <w:webHidden/>
           </w:rPr>
-          <w:instrText xml:space="preserve"> PAGEREF _Toc227522093 \h </w:instrText>
+          <w:instrText xml:space="preserve"> PAGEREF _Toc229768702 \h </w:instrText>
         </w:r>
         <w:r>
           <w:rPr>
@@ -3676,7 +3691,7 @@
             <w:noProof/>
             <w:webHidden/>
           </w:rPr>
-          <w:t>16</w:t>
+          <w:t>19</w:t>
         </w:r>
         <w:r>
           <w:rPr>
@@ -3698,17 +3713,18 @@
           <w:noProof/>
           <w:kern w:val="2"/>
           <w:szCs w:val="24"/>
+          <w:lang/>
           <w14:ligatures w14:val="standardContextual"/>
         </w:rPr>
       </w:pPr>
-      <w:hyperlink w:anchor="_Toc227522094" w:history="1">
+      <w:hyperlink w:anchor="_Toc229768703" w:history="1">
         <w:r>
           <w:rPr>
             <w:rStyle w:val="Hypertextovodkaz"/>
             <w:noProof/>
             <w:lang w:eastAsia="cs-CZ"/>
           </w:rPr>
-          <w:t>2.2.5 Paralelní matice</w:t>
+          <w:t>2.2.5 Paralelní tenzor</w:t>
         </w:r>
         <w:r>
           <w:rPr>
@@ -3729,7 +3745,7 @@
             <w:noProof/>
             <w:webHidden/>
           </w:rPr>
-          <w:instrText xml:space="preserve"> PAGEREF _Toc227522094 \h </w:instrText>
+          <w:instrText xml:space="preserve"> PAGEREF _Toc229768703 \h </w:instrText>
         </w:r>
         <w:r>
           <w:rPr>
@@ -3749,7 +3765,7 @@
             <w:noProof/>
             <w:webHidden/>
           </w:rPr>
-          <w:t>16</w:t>
+          <w:t>20</w:t>
         </w:r>
         <w:r>
           <w:rPr>
@@ -3771,17 +3787,18 @@
           <w:noProof/>
           <w:kern w:val="2"/>
           <w:szCs w:val="24"/>
+          <w:lang/>
           <w14:ligatures w14:val="standardContextual"/>
         </w:rPr>
       </w:pPr>
-      <w:hyperlink w:anchor="_Toc227522095" w:history="1">
+      <w:hyperlink w:anchor="_Toc229768704" w:history="1">
         <w:r>
           <w:rPr>
             <w:rStyle w:val="Hypertextovodkaz"/>
             <w:noProof/>
             <w:lang w:eastAsia="cs-CZ"/>
           </w:rPr>
-          <w:t>2.2.6 N-nární strom</w:t>
+          <w:t>2.2.6 Matice</w:t>
         </w:r>
         <w:r>
           <w:rPr>
@@ -3802,7 +3819,7 @@
             <w:noProof/>
             <w:webHidden/>
           </w:rPr>
-          <w:instrText xml:space="preserve"> PAGEREF _Toc227522095 \h </w:instrText>
+          <w:instrText xml:space="preserve"> PAGEREF _Toc229768704 \h </w:instrText>
         </w:r>
         <w:r>
           <w:rPr>
@@ -3822,77 +3839,7 @@
             <w:noProof/>
             <w:webHidden/>
           </w:rPr>
-          <w:t>16</w:t>
-        </w:r>
-        <w:r>
-          <w:rPr>
-            <w:noProof/>
-            <w:webHidden/>
-          </w:rPr>
-          <w:fldChar w:fldCharType="end"/>
-        </w:r>
-      </w:hyperlink>
-    </w:p>
-    <w:p>
-      <w:pPr>
-        <w:pStyle w:val="Obsah2"/>
-        <w:rPr>
-          <w:rFonts w:asciiTheme="minorHAnsi" w:eastAsiaTheme="minorEastAsia" w:hAnsiTheme="minorHAnsi" w:cstheme="minorBidi"/>
-          <w:noProof/>
-          <w:kern w:val="2"/>
-          <w:szCs w:val="24"/>
-          <w14:ligatures w14:val="standardContextual"/>
-        </w:rPr>
-      </w:pPr>
-      <w:hyperlink w:anchor="_Toc227522096" w:history="1">
-        <w:r>
-          <w:rPr>
-            <w:rStyle w:val="Hypertextovodkaz"/>
-            <w:noProof/>
-            <w:lang w:eastAsia="cs-CZ"/>
-          </w:rPr>
-          <w:t>2.3 Testy</w:t>
-        </w:r>
-        <w:r>
-          <w:rPr>
-            <w:noProof/>
-            <w:webHidden/>
-          </w:rPr>
-          <w:tab/>
-        </w:r>
-        <w:r>
-          <w:rPr>
-            <w:noProof/>
-            <w:webHidden/>
-          </w:rPr>
-          <w:fldChar w:fldCharType="begin"/>
-        </w:r>
-        <w:r>
-          <w:rPr>
-            <w:noProof/>
-            <w:webHidden/>
-          </w:rPr>
-          <w:instrText xml:space="preserve"> PAGEREF _Toc227522096 \h </w:instrText>
-        </w:r>
-        <w:r>
-          <w:rPr>
-            <w:noProof/>
-            <w:webHidden/>
-          </w:rPr>
-        </w:r>
-        <w:r>
-          <w:rPr>
-            <w:noProof/>
-            <w:webHidden/>
-          </w:rPr>
-          <w:fldChar w:fldCharType="separate"/>
-        </w:r>
-        <w:r>
-          <w:rPr>
-            <w:noProof/>
-            <w:webHidden/>
-          </w:rPr>
-          <w:t>16</w:t>
+          <w:t>20</w:t>
         </w:r>
         <w:r>
           <w:rPr>
@@ -3914,17 +3861,18 @@
           <w:noProof/>
           <w:kern w:val="2"/>
           <w:szCs w:val="24"/>
+          <w:lang/>
           <w14:ligatures w14:val="standardContextual"/>
         </w:rPr>
       </w:pPr>
-      <w:hyperlink w:anchor="_Toc227522097" w:history="1">
+      <w:hyperlink w:anchor="_Toc229768705" w:history="1">
         <w:r>
           <w:rPr>
             <w:rStyle w:val="Hypertextovodkaz"/>
             <w:noProof/>
             <w:lang w:eastAsia="cs-CZ"/>
           </w:rPr>
-          <w:t>2.3.1 Unit testování</w:t>
+          <w:t>2.2.7 Paralelní matice</w:t>
         </w:r>
         <w:r>
           <w:rPr>
@@ -3945,7 +3893,7 @@
             <w:noProof/>
             <w:webHidden/>
           </w:rPr>
-          <w:instrText xml:space="preserve"> PAGEREF _Toc227522097 \h </w:instrText>
+          <w:instrText xml:space="preserve"> PAGEREF _Toc229768705 \h </w:instrText>
         </w:r>
         <w:r>
           <w:rPr>
@@ -3965,7 +3913,7 @@
             <w:noProof/>
             <w:webHidden/>
           </w:rPr>
-          <w:t>16</w:t>
+          <w:t>20</w:t>
         </w:r>
         <w:r>
           <w:rPr>
@@ -3987,16 +3935,236 @@
           <w:noProof/>
           <w:kern w:val="2"/>
           <w:szCs w:val="24"/>
+          <w:lang/>
           <w14:ligatures w14:val="standardContextual"/>
         </w:rPr>
       </w:pPr>
-      <w:hyperlink w:anchor="_Toc227522098" w:history="1">
+      <w:hyperlink w:anchor="_Toc229768706" w:history="1">
         <w:r>
           <w:rPr>
             <w:rStyle w:val="Hypertextovodkaz"/>
             <w:noProof/>
             <w:lang w:eastAsia="cs-CZ"/>
           </w:rPr>
+          <w:t>2.2.8 N-nární strom</w:t>
+        </w:r>
+        <w:r>
+          <w:rPr>
+            <w:noProof/>
+            <w:webHidden/>
+          </w:rPr>
+          <w:tab/>
+        </w:r>
+        <w:r>
+          <w:rPr>
+            <w:noProof/>
+            <w:webHidden/>
+          </w:rPr>
+          <w:fldChar w:fldCharType="begin"/>
+        </w:r>
+        <w:r>
+          <w:rPr>
+            <w:noProof/>
+            <w:webHidden/>
+          </w:rPr>
+          <w:instrText xml:space="preserve"> PAGEREF _Toc229768706 \h </w:instrText>
+        </w:r>
+        <w:r>
+          <w:rPr>
+            <w:noProof/>
+            <w:webHidden/>
+          </w:rPr>
+        </w:r>
+        <w:r>
+          <w:rPr>
+            <w:noProof/>
+            <w:webHidden/>
+          </w:rPr>
+          <w:fldChar w:fldCharType="separate"/>
+        </w:r>
+        <w:r>
+          <w:rPr>
+            <w:noProof/>
+            <w:webHidden/>
+          </w:rPr>
+          <w:t>20</w:t>
+        </w:r>
+        <w:r>
+          <w:rPr>
+            <w:noProof/>
+            <w:webHidden/>
+          </w:rPr>
+          <w:fldChar w:fldCharType="end"/>
+        </w:r>
+      </w:hyperlink>
+    </w:p>
+    <w:p>
+      <w:pPr>
+        <w:pStyle w:val="Obsah2"/>
+        <w:rPr>
+          <w:rFonts w:asciiTheme="minorHAnsi" w:eastAsiaTheme="minorEastAsia" w:hAnsiTheme="minorHAnsi" w:cstheme="minorBidi"/>
+          <w:noProof/>
+          <w:kern w:val="2"/>
+          <w:szCs w:val="24"/>
+          <w:lang/>
+          <w14:ligatures w14:val="standardContextual"/>
+        </w:rPr>
+      </w:pPr>
+      <w:hyperlink w:anchor="_Toc229768707" w:history="1">
+        <w:r>
+          <w:rPr>
+            <w:rStyle w:val="Hypertextovodkaz"/>
+            <w:noProof/>
+            <w:lang w:eastAsia="cs-CZ"/>
+          </w:rPr>
+          <w:t>2.3 Testy</w:t>
+        </w:r>
+        <w:r>
+          <w:rPr>
+            <w:noProof/>
+            <w:webHidden/>
+          </w:rPr>
+          <w:tab/>
+        </w:r>
+        <w:r>
+          <w:rPr>
+            <w:noProof/>
+            <w:webHidden/>
+          </w:rPr>
+          <w:fldChar w:fldCharType="begin"/>
+        </w:r>
+        <w:r>
+          <w:rPr>
+            <w:noProof/>
+            <w:webHidden/>
+          </w:rPr>
+          <w:instrText xml:space="preserve"> PAGEREF _Toc229768707 \h </w:instrText>
+        </w:r>
+        <w:r>
+          <w:rPr>
+            <w:noProof/>
+            <w:webHidden/>
+          </w:rPr>
+        </w:r>
+        <w:r>
+          <w:rPr>
+            <w:noProof/>
+            <w:webHidden/>
+          </w:rPr>
+          <w:fldChar w:fldCharType="separate"/>
+        </w:r>
+        <w:r>
+          <w:rPr>
+            <w:noProof/>
+            <w:webHidden/>
+          </w:rPr>
+          <w:t>20</w:t>
+        </w:r>
+        <w:r>
+          <w:rPr>
+            <w:noProof/>
+            <w:webHidden/>
+          </w:rPr>
+          <w:fldChar w:fldCharType="end"/>
+        </w:r>
+      </w:hyperlink>
+    </w:p>
+    <w:p>
+      <w:pPr>
+        <w:pStyle w:val="Obsah3"/>
+        <w:tabs>
+          <w:tab w:val="right" w:leader="dot" w:pos="9060"/>
+        </w:tabs>
+        <w:rPr>
+          <w:rFonts w:asciiTheme="minorHAnsi" w:eastAsiaTheme="minorEastAsia" w:hAnsiTheme="minorHAnsi" w:cstheme="minorBidi"/>
+          <w:noProof/>
+          <w:kern w:val="2"/>
+          <w:szCs w:val="24"/>
+          <w:lang/>
+          <w14:ligatures w14:val="standardContextual"/>
+        </w:rPr>
+      </w:pPr>
+      <w:hyperlink w:anchor="_Toc229768708" w:history="1">
+        <w:r>
+          <w:rPr>
+            <w:rStyle w:val="Hypertextovodkaz"/>
+            <w:noProof/>
+            <w:lang w:eastAsia="cs-CZ"/>
+          </w:rPr>
+          <w:t>2.3.1 Unit testování</w:t>
+        </w:r>
+        <w:r>
+          <w:rPr>
+            <w:noProof/>
+            <w:webHidden/>
+          </w:rPr>
+          <w:tab/>
+        </w:r>
+        <w:r>
+          <w:rPr>
+            <w:noProof/>
+            <w:webHidden/>
+          </w:rPr>
+          <w:fldChar w:fldCharType="begin"/>
+        </w:r>
+        <w:r>
+          <w:rPr>
+            <w:noProof/>
+            <w:webHidden/>
+          </w:rPr>
+          <w:instrText xml:space="preserve"> PAGEREF _Toc229768708 \h </w:instrText>
+        </w:r>
+        <w:r>
+          <w:rPr>
+            <w:noProof/>
+            <w:webHidden/>
+          </w:rPr>
+        </w:r>
+        <w:r>
+          <w:rPr>
+            <w:noProof/>
+            <w:webHidden/>
+          </w:rPr>
+          <w:fldChar w:fldCharType="separate"/>
+        </w:r>
+        <w:r>
+          <w:rPr>
+            <w:noProof/>
+            <w:webHidden/>
+          </w:rPr>
+          <w:t>21</w:t>
+        </w:r>
+        <w:r>
+          <w:rPr>
+            <w:noProof/>
+            <w:webHidden/>
+          </w:rPr>
+          <w:fldChar w:fldCharType="end"/>
+        </w:r>
+      </w:hyperlink>
+    </w:p>
+    <w:p>
+      <w:pPr>
+        <w:pStyle w:val="Obsah3"/>
+        <w:tabs>
+          <w:tab w:val="right" w:leader="dot" w:pos="9060"/>
+        </w:tabs>
+        <w:rPr>
+          <w:rFonts w:asciiTheme="minorHAnsi" w:eastAsiaTheme="minorEastAsia" w:hAnsiTheme="minorHAnsi" w:cstheme="minorBidi"/>
+          <w:noProof/>
+          <w:kern w:val="2"/>
+          <w:szCs w:val="24"/>
+          <w:lang/>
+          <w14:ligatures w14:val="standardContextual"/>
+        </w:rPr>
+      </w:pPr>
+      <w:hyperlink w:anchor="_Toc229768709" w:history="1">
+        <w:r>
+          <w:rPr>
+            <w:rStyle w:val="Hypertextovodkaz"/>
+            <w:noProof/>
+            <w:lang w:eastAsia="cs-CZ"/>
+          </w:rPr>
           <w:t>2.3.2 Zátěžové testování</w:t>
         </w:r>
         <w:r>
@@ -4018,7 +4186,7 @@
             <w:noProof/>
             <w:webHidden/>
           </w:rPr>
-          <w:instrText xml:space="preserve"> PAGEREF _Toc227522098 \h </w:instrText>
+          <w:instrText xml:space="preserve"> PAGEREF _Toc229768709 \h </w:instrText>
         </w:r>
         <w:r>
           <w:rPr>
@@ -4038,7 +4206,7 @@
             <w:noProof/>
             <w:webHidden/>
           </w:rPr>
-          <w:t>16</w:t>
+          <w:t>21</w:t>
         </w:r>
         <w:r>
           <w:rPr>
@@ -4060,10 +4228,11 @@
           <w:noProof/>
           <w:kern w:val="2"/>
           <w:szCs w:val="24"/>
+          <w:lang/>
           <w14:ligatures w14:val="standardContextual"/>
         </w:rPr>
       </w:pPr>
-      <w:hyperlink w:anchor="_Toc227522099" w:history="1">
+      <w:hyperlink w:anchor="_Toc229768710" w:history="1">
         <w:r>
           <w:rPr>
             <w:rStyle w:val="Hypertextovodkaz"/>
@@ -4090,7 +4259,7 @@
             <w:noProof/>
             <w:webHidden/>
           </w:rPr>
-          <w:instrText xml:space="preserve"> PAGEREF _Toc227522099 \h </w:instrText>
+          <w:instrText xml:space="preserve"> PAGEREF _Toc229768710 \h </w:instrText>
         </w:r>
         <w:r>
           <w:rPr>
@@ -4110,7 +4279,7 @@
             <w:noProof/>
             <w:webHidden/>
           </w:rPr>
-          <w:t>17</w:t>
+          <w:t>22</w:t>
         </w:r>
         <w:r>
           <w:rPr>
@@ -4132,10 +4301,11 @@
           <w:noProof/>
           <w:kern w:val="2"/>
           <w:szCs w:val="24"/>
+          <w:lang/>
           <w14:ligatures w14:val="standardContextual"/>
         </w:rPr>
       </w:pPr>
-      <w:hyperlink w:anchor="_Toc227522100" w:history="1">
+      <w:hyperlink w:anchor="_Toc229768711" w:history="1">
         <w:r>
           <w:rPr>
             <w:rStyle w:val="Hypertextovodkaz"/>
@@ -4162,7 +4332,7 @@
             <w:noProof/>
             <w:webHidden/>
           </w:rPr>
-          <w:instrText xml:space="preserve"> PAGEREF _Toc227522100 \h </w:instrText>
+          <w:instrText xml:space="preserve"> PAGEREF _Toc229768711 \h </w:instrText>
         </w:r>
         <w:r>
           <w:rPr>
@@ -4182,7 +4352,7 @@
             <w:noProof/>
             <w:webHidden/>
           </w:rPr>
-          <w:t>19</w:t>
+          <w:t>24</w:t>
         </w:r>
         <w:r>
           <w:rPr>
@@ -4204,10 +4374,11 @@
           <w:noProof/>
           <w:kern w:val="2"/>
           <w:szCs w:val="24"/>
+          <w:lang/>
           <w14:ligatures w14:val="standardContextual"/>
         </w:rPr>
       </w:pPr>
-      <w:hyperlink w:anchor="_Toc227522101" w:history="1">
+      <w:hyperlink w:anchor="_Toc229768712" w:history="1">
         <w:r>
           <w:rPr>
             <w:rStyle w:val="Hypertextovodkaz"/>
@@ -4234,7 +4405,7 @@
             <w:noProof/>
             <w:webHidden/>
           </w:rPr>
-          <w:instrText xml:space="preserve"> PAGEREF _Toc227522101 \h </w:instrText>
+          <w:instrText xml:space="preserve"> PAGEREF _Toc229768712 \h </w:instrText>
         </w:r>
         <w:r>
           <w:rPr>
@@ -4254,7 +4425,7 @@
             <w:noProof/>
             <w:webHidden/>
           </w:rPr>
-          <w:t>20</w:t>
+          <w:t>25</w:t>
         </w:r>
         <w:r>
           <w:rPr>
@@ -4276,10 +4447,11 @@
           <w:noProof/>
           <w:kern w:val="2"/>
           <w:szCs w:val="24"/>
+          <w:lang/>
           <w14:ligatures w14:val="standardContextual"/>
         </w:rPr>
       </w:pPr>
-      <w:hyperlink w:anchor="_Toc227522102" w:history="1">
+      <w:hyperlink w:anchor="_Toc229768713" w:history="1">
         <w:r>
           <w:rPr>
             <w:rStyle w:val="Hypertextovodkaz"/>
@@ -4306,7 +4478,7 @@
             <w:noProof/>
             <w:webHidden/>
           </w:rPr>
-          <w:instrText xml:space="preserve"> PAGEREF _Toc227522102 \h </w:instrText>
+          <w:instrText xml:space="preserve"> PAGEREF _Toc229768713 \h </w:instrText>
         </w:r>
         <w:r>
           <w:rPr>
@@ -4326,7 +4498,7 @@
             <w:noProof/>
             <w:webHidden/>
           </w:rPr>
-          <w:t>21</w:t>
+          <w:t>26</w:t>
         </w:r>
         <w:r>
           <w:rPr>
@@ -4367,7 +4539,7 @@
       <w:pPr>
         <w:pStyle w:val="Nadpis1"/>
       </w:pPr>
-      <w:bookmarkStart w:id="0" w:name="_Toc227522077"/>
+      <w:bookmarkStart w:id="0" w:name="_Toc229768686"/>
       <w:r>
         <w:rPr>
           <w:shd w:val="clear" w:color="auto" w:fill="FFFFFF"/>
@@ -4667,7 +4839,7 @@
           <w:shd w:val="clear" w:color="auto" w:fill="FFFFFF"/>
         </w:rPr>
       </w:pPr>
-      <w:bookmarkStart w:id="1" w:name="_Toc227522078"/>
+      <w:bookmarkStart w:id="1" w:name="_Toc229768687"/>
       <w:r>
         <w:rPr>
           <w:shd w:val="clear" w:color="auto" w:fill="FFFFFF"/>
@@ -4769,7 +4941,7 @@
           <w:shd w:val="clear" w:color="auto" w:fill="FFFFFF"/>
         </w:rPr>
       </w:pPr>
-      <w:bookmarkStart w:id="2" w:name="_Toc227522079"/>
+      <w:bookmarkStart w:id="2" w:name="_Toc229768688"/>
       <w:r>
         <w:rPr>
           <w:shd w:val="clear" w:color="auto" w:fill="FFFFFF"/>
@@ -4926,7 +5098,7 @@
       <w:pPr>
         <w:pStyle w:val="Nadpis1"/>
       </w:pPr>
-      <w:bookmarkStart w:id="3" w:name="_Toc227522080"/>
+      <w:bookmarkStart w:id="3" w:name="_Toc229768689"/>
       <w:r>
         <w:lastRenderedPageBreak/>
         <w:t>ÚVOD</w:t>
@@ -5167,7 +5339,7 @@
       <w:r>
         <w:br w:type="page"/>
       </w:r>
-      <w:bookmarkStart w:id="4" w:name="_Toc227522081"/>
+      <w:bookmarkStart w:id="4" w:name="_Toc229768690"/>
       <w:r>
         <w:lastRenderedPageBreak/>
         <w:t>1</w:t>
@@ -5368,7 +5540,7 @@
         <w:pStyle w:val="Nadpis2"/>
         <w:jc w:val="both"/>
       </w:pPr>
-      <w:bookmarkStart w:id="5" w:name="_Toc227522082"/>
+      <w:bookmarkStart w:id="5" w:name="_Toc229768691"/>
       <w:r>
         <w:t xml:space="preserve">1.1 </w:t>
       </w:r>
@@ -5637,7 +5809,7 @@
       <w:pPr>
         <w:pStyle w:val="Nadpis2"/>
       </w:pPr>
-      <w:bookmarkStart w:id="6" w:name="_Toc227522083"/>
+      <w:bookmarkStart w:id="6" w:name="_Toc229768692"/>
       <w:r>
         <w:t>1.2 UML</w:t>
       </w:r>
@@ -5654,7 +5826,7 @@
       <w:pPr>
         <w:pStyle w:val="Nadpis2"/>
       </w:pPr>
-      <w:bookmarkStart w:id="7" w:name="_Toc227522084"/>
+      <w:bookmarkStart w:id="7" w:name="_Toc229768693"/>
       <w:r>
         <w:t>1.3 Logika tenzoru</w:t>
       </w:r>
@@ -5719,7 +5891,19 @@
         <w:t>).</w:t>
       </w:r>
       <w:r>
-        <w:t xml:space="preserve"> V tensoru jsou dvě inverzní privátní metody. Jedna pro konverzi souřadnic na vnitřní index a druhá na opačný proces.</w:t>
+        <w:t xml:space="preserve"> V tensoru jsou dvě </w:t>
+      </w:r>
+      <w:r>
+        <w:t>klíčové a nav</w:t>
+      </w:r>
+      <w:r>
+        <w:t>z</w:t>
+      </w:r>
+      <w:r>
+        <w:t xml:space="preserve">ájem </w:t>
+      </w:r>
+      <w:r>
+        <w:t>inverzní metody. Jedna pro konverzi souřadnic na vnitřní index a druhá na opačný proces.</w:t>
       </w:r>
     </w:p>
     <w:p>
@@ -5740,6 +5924,15 @@
       </w:r>
       <w:r>
         <w:t xml:space="preserve"> </w:t>
+      </w:r>
+      <w:r>
+        <w:t>To v implementaci povede k realokaci paměti při takovémto úkonu.</w:t>
+      </w:r>
+      <w:r>
+        <w:t xml:space="preserve"> Znamená to, že z algoritmického hlediska tyto transformace nejsou na místě (in-place)</w:t>
+      </w:r>
+      <w:r>
+        <w:t>, jelikož by to výpočetně bylo méně efektivní.</w:t>
       </w:r>
     </w:p>
     <w:p>
@@ -5795,21 +5988,7 @@
         <w:rPr>
           <w:lang w:eastAsia="cs-CZ"/>
         </w:rPr>
-        <w:t xml:space="preserve">). Příkladem to znamená, že nedefinitivní souřadnice o velikosti jedné </w:t>
-      </w:r>
-      <w:proofErr w:type="gramStart"/>
-      <w:r>
-        <w:rPr>
-          <w:lang w:eastAsia="cs-CZ"/>
-        </w:rPr>
-        <w:t>menší,</w:t>
-      </w:r>
-      <w:proofErr w:type="gramEnd"/>
-      <w:r>
-        <w:rPr>
-          <w:lang w:eastAsia="cs-CZ"/>
-        </w:rPr>
-        <w:t xml:space="preserve"> než počet dimenzí, mají </w:t>
+        <w:t xml:space="preserve">). Příkladem to znamená, že nedefinitivní souřadnice o velikosti jedné menší, než počet dimenzí, mají </w:t>
       </w:r>
       <w:r>
         <w:rPr>
@@ -5939,21 +6118,7 @@
         <w:rPr>
           <w:lang w:eastAsia="cs-CZ"/>
         </w:rPr>
-        <w:t xml:space="preserve"> je počet dimenzí) stačí pouze přečíst náležící prvek z tohoto vypočítaného pole pro složitost </w:t>
-      </w:r>
-      <w:proofErr w:type="gramStart"/>
-      <w:r>
-        <w:rPr>
-          <w:lang w:eastAsia="cs-CZ"/>
-        </w:rPr>
-        <w:t>O(</w:t>
-      </w:r>
-      <w:proofErr w:type="gramEnd"/>
-      <w:r>
-        <w:rPr>
-          <w:lang w:eastAsia="cs-CZ"/>
-        </w:rPr>
-        <w:t>1).</w:t>
+        <w:t xml:space="preserve"> je počet dimenzí) stačí pouze přečíst náležící prvek z tohoto vypočítaného pole pro složitost O(1).</w:t>
       </w:r>
       <w:r>
         <w:rPr>
@@ -5975,6 +6140,7 @@
           <w:bCs/>
           <w:lang w:eastAsia="cs-CZ"/>
         </w:rPr>
+        <w:lastRenderedPageBreak/>
         <w:t xml:space="preserve">Kumulativní součin předešlých </w:t>
       </w:r>
       <w:r>
@@ -6093,7 +6259,14 @@
                           <w:rFonts w:ascii="Cambria Math" w:hAnsi="Cambria Math"/>
                           <w:lang w:eastAsia="cs-CZ"/>
                         </w:rPr>
-                        <m:t>k=0</m:t>
+                        <m:t>k</m:t>
+                      </m:r>
+                      <m:r>
+                        <w:rPr>
+                          <w:rFonts w:ascii="Cambria Math" w:hAnsi="Cambria Math"/>
+                          <w:lang w:eastAsia="cs-CZ"/>
+                        </w:rPr>
+                        <m:t>=0</m:t>
                       </m:r>
                     </m:sub>
                     <m:sup>
@@ -6102,7 +6275,21 @@
                           <w:rFonts w:ascii="Cambria Math" w:hAnsi="Cambria Math"/>
                           <w:lang w:eastAsia="cs-CZ"/>
                         </w:rPr>
-                        <m:t>i-1</m:t>
+                        <m:t>i</m:t>
+                      </m:r>
+                      <m:r>
+                        <w:rPr>
+                          <w:rFonts w:ascii="Cambria Math" w:hAnsi="Cambria Math"/>
+                          <w:lang w:eastAsia="cs-CZ"/>
+                        </w:rPr>
+                        <m:t>-</m:t>
+                      </m:r>
+                      <m:r>
+                        <w:rPr>
+                          <w:rFonts w:ascii="Cambria Math" w:hAnsi="Cambria Math"/>
+                          <w:lang w:eastAsia="cs-CZ"/>
+                        </w:rPr>
+                        <m:t>1</m:t>
                       </m:r>
                     </m:sup>
                     <m:e>
@@ -6142,7 +6329,35 @@
                       <w:rFonts w:ascii="Cambria Math" w:hAnsi="Cambria Math"/>
                       <w:lang w:eastAsia="cs-CZ"/>
                     </w:rPr>
-                    <m:t>;pro i&gt;0</m:t>
+                    <m:t>;</m:t>
+                  </m:r>
+                  <m:r>
+                    <w:rPr>
+                      <w:rFonts w:ascii="Cambria Math" w:hAnsi="Cambria Math"/>
+                      <w:lang w:eastAsia="cs-CZ"/>
+                    </w:rPr>
+                    <m:t>pro</m:t>
+                  </m:r>
+                  <m:r>
+                    <w:rPr>
+                      <w:rFonts w:ascii="Cambria Math" w:hAnsi="Cambria Math"/>
+                      <w:lang w:eastAsia="cs-CZ"/>
+                    </w:rPr>
+                    <m:t xml:space="preserve"> </m:t>
+                  </m:r>
+                  <m:r>
+                    <w:rPr>
+                      <w:rFonts w:ascii="Cambria Math" w:hAnsi="Cambria Math"/>
+                      <w:lang w:eastAsia="cs-CZ"/>
+                    </w:rPr>
+                    <m:t>i</m:t>
+                  </m:r>
+                  <m:r>
+                    <w:rPr>
+                      <w:rFonts w:ascii="Cambria Math" w:hAnsi="Cambria Math"/>
+                      <w:lang w:eastAsia="cs-CZ"/>
+                    </w:rPr>
+                    <m:t>&gt;0</m:t>
                   </m:r>
                 </m:e>
                 <m:e>
@@ -6151,7 +6366,35 @@
                       <w:rFonts w:ascii="Cambria Math" w:hAnsi="Cambria Math"/>
                       <w:lang w:eastAsia="cs-CZ"/>
                     </w:rPr>
-                    <m:t>1 ;pro i=0</m:t>
+                    <m:t>1 ;</m:t>
+                  </m:r>
+                  <m:r>
+                    <w:rPr>
+                      <w:rFonts w:ascii="Cambria Math" w:hAnsi="Cambria Math"/>
+                      <w:lang w:eastAsia="cs-CZ"/>
+                    </w:rPr>
+                    <m:t>pro</m:t>
+                  </m:r>
+                  <m:r>
+                    <w:rPr>
+                      <w:rFonts w:ascii="Cambria Math" w:hAnsi="Cambria Math"/>
+                      <w:lang w:eastAsia="cs-CZ"/>
+                    </w:rPr>
+                    <m:t xml:space="preserve"> </m:t>
+                  </m:r>
+                  <m:r>
+                    <w:rPr>
+                      <w:rFonts w:ascii="Cambria Math" w:hAnsi="Cambria Math"/>
+                      <w:lang w:eastAsia="cs-CZ"/>
+                    </w:rPr>
+                    <m:t>i</m:t>
+                  </m:r>
+                  <m:r>
+                    <w:rPr>
+                      <w:rFonts w:ascii="Cambria Math" w:hAnsi="Cambria Math"/>
+                      <w:lang w:eastAsia="cs-CZ"/>
+                    </w:rPr>
+                    <m:t>=0</m:t>
                   </m:r>
                 </m:e>
               </m:eqArr>
@@ -6371,7 +6614,27 @@
         <w:rPr>
           <w:lang w:eastAsia="cs-CZ"/>
         </w:rPr>
-        <w:t xml:space="preserve"> (včetně).</w:t>
+        <w:t xml:space="preserve"> </w:t>
+      </w:r>
+      <w:r>
+        <w:rPr>
+          <w:lang w:eastAsia="cs-CZ"/>
+        </w:rPr>
+        <w:t xml:space="preserve">kromě </w:t>
+      </w:r>
+      <w:r>
+        <w:rPr>
+          <w:i/>
+          <w:iCs/>
+          <w:lang w:eastAsia="cs-CZ"/>
+        </w:rPr>
+        <w:t>i</w:t>
+      </w:r>
+      <w:r>
+        <w:rPr>
+          <w:lang w:eastAsia="cs-CZ"/>
+        </w:rPr>
+        <w:t xml:space="preserve"> samotné.</w:t>
       </w:r>
     </w:p>
     <w:p>
@@ -6469,14 +6732,7 @@
         <w:rPr>
           <w:lang w:eastAsia="cs-CZ"/>
         </w:rPr>
-        <w:t>2⁶</w:t>
-      </w:r>
-      <w:proofErr w:type="gramStart"/>
-      <w:r>
-        <w:rPr>
-          <w:lang w:eastAsia="cs-CZ"/>
-        </w:rPr>
-        <w:t>⁴</w:t>
+        <w:t>2⁶⁴</w:t>
       </w:r>
       <w:r>
         <w:rPr>
@@ -6502,7 +6758,6 @@
         </w:rPr>
         <w:t>1</w:t>
       </w:r>
-      <w:proofErr w:type="gramEnd"/>
       <w:r>
         <w:rPr>
           <w:lang w:eastAsia="cs-CZ"/>
@@ -6531,14 +6786,7 @@
         <w:rPr>
           <w:lang w:eastAsia="cs-CZ"/>
         </w:rPr>
-        <w:t xml:space="preserve"> Délka přístupu na jeden prvek tak realisticky (vůči limitům jazyka C++ a </w:t>
-      </w:r>
-      <w:proofErr w:type="gramStart"/>
-      <w:r>
-        <w:rPr>
-          <w:lang w:eastAsia="cs-CZ"/>
-        </w:rPr>
-        <w:t>64</w:t>
+        <w:t xml:space="preserve"> Délka přístupu na jeden prvek tak realisticky (vůči limitům jazyka C++ a 64</w:t>
       </w:r>
       <w:r>
         <w:rPr>
@@ -6550,14 +6798,7 @@
         <w:rPr>
           <w:lang w:eastAsia="cs-CZ"/>
         </w:rPr>
-        <w:t>bitové</w:t>
-      </w:r>
-      <w:proofErr w:type="gramEnd"/>
-      <w:r>
-        <w:rPr>
-          <w:lang w:eastAsia="cs-CZ"/>
-        </w:rPr>
-        <w:t xml:space="preserve"> architektury) nepřekročí 64 výpočtů a tím pádem se dá z tohoto pohledu považovat za konstantní.</w:t>
+        <w:t>bitové architektury) nepřekročí 64 výpočtů a tím pádem se dá z tohoto pohledu považovat za konstantní.</w:t>
       </w:r>
       <w:r>
         <w:rPr>
@@ -6851,6 +7092,7 @@
           <w:rPr>
             <w:rFonts w:ascii="Cambria Math" w:hAnsi="Cambria Math"/>
           </w:rPr>
+          <w:lastRenderedPageBreak/>
           <m:t>pro k od 0 do len</m:t>
         </m:r>
         <m:d>
@@ -6920,7 +7162,19 @@
           <w:rPr>
             <w:rFonts w:ascii="Cambria Math" w:hAnsi="Cambria Math"/>
           </w:rPr>
-          <m:t>≔i/</m:t>
+          <m:t>≔</m:t>
+        </m:r>
+        <m:r>
+          <w:rPr>
+            <w:rFonts w:ascii="Cambria Math" w:hAnsi="Cambria Math"/>
+          </w:rPr>
+          <m:t>i</m:t>
+        </m:r>
+        <m:r>
+          <w:rPr>
+            <w:rFonts w:ascii="Cambria Math" w:hAnsi="Cambria Math"/>
+          </w:rPr>
+          <m:t>/</m:t>
         </m:r>
         <m:sSub>
           <m:sSubPr>
@@ -7107,6 +7361,98 @@
         <w:spacing w:line="360" w:lineRule="auto"/>
       </w:pPr>
       <w:r>
+        <w:t>Pro některé sériové implementace ale není výhodné neustále tímto způsobem přepočítávat souřadnice, zvláště pokud se tenzor prochází po indexu.</w:t>
+      </w:r>
+      <w:r>
+        <w:t xml:space="preserve"> Pro takovéto procházení, od prvního prvku k poslednímu po řadě existuje metoda, co umí inkrementovat souřadnice.</w:t>
+      </w:r>
+      <w:r>
+        <w:t xml:space="preserve"> Na vstupu musí znát souřadnice k inkrementaci a velikosti dimenzí.</w:t>
+      </w:r>
+      <w:r>
+        <w:t xml:space="preserve"> Poté je nejméně signifikantní souřadnice inkrementována a pokud její hodnota dosáhne velikosti dané dimenze, tak přeteče na nulu a ten samý proces je opakován pro vedlejší více signifikantní souřadnici.</w:t>
+      </w:r>
+      <w:r>
+        <w:t xml:space="preserve"> Pokud se toto řetězové přetečení dostane až na poslední souřadnici, tak se na výstupu metody vrátí hodnota </w:t>
+      </w:r>
+      <w:proofErr w:type="spellStart"/>
+      <w:r>
+        <w:rPr>
+          <w:b/>
+          <w:bCs/>
+        </w:rPr>
+        <w:t>true</w:t>
+      </w:r>
+      <w:proofErr w:type="spellEnd"/>
+      <w:r>
+        <w:t xml:space="preserve">, jinak se vrátí </w:t>
+      </w:r>
+      <w:proofErr w:type="spellStart"/>
+      <w:r>
+        <w:rPr>
+          <w:b/>
+          <w:bCs/>
+        </w:rPr>
+        <w:t>false</w:t>
+      </w:r>
+      <w:proofErr w:type="spellEnd"/>
+      <w:r>
+        <w:t>.</w:t>
+      </w:r>
+      <w:r>
+        <w:t xml:space="preserve"> To zajišťuje, že se ze souřadnice posledního prvku stane souřadnice prvního prvku a zároveň toto přetočení na začátek bude signalizováno návratovou hodnotou.</w:t>
+      </w:r>
+      <w:r>
+        <w:t xml:space="preserve"> Z algoritmické efektivity je tato metoda oproti běžnému výpočtu souřadnice výhodná.</w:t>
+      </w:r>
+      <w:r>
+        <w:t xml:space="preserve"> V nejhorším případě přetočení z posledního prvku na první je její komplexita O(len(D)) a v nejlepším případě inkrementace nejméně signifikantní souřadnice bez přetečení O(1). </w:t>
+      </w:r>
+      <w:r>
+        <w:t>Ovšem je třeba si uvědomit, že při rovnoměrných velikostech dimenzí, bude ten lepší případ daleko více převládat nad tím nejhorším</w:t>
+      </w:r>
+      <w:r>
+        <w:t>.</w:t>
+      </w:r>
+      <w:r>
+        <w:t xml:space="preserve"> To je</w:t>
+      </w:r>
+      <w:r>
+        <w:t>,</w:t>
+      </w:r>
+      <w:r>
+        <w:t xml:space="preserve"> protože pravděpodobnost změny první souřadnice (nejméně signifikantní) je vždy 1. U té další to už ale je jenom 1/(</w:t>
+      </w:r>
+      <w:r>
+        <w:t>Kumulativní součin předešlých velikostí dimenzí</w:t>
+      </w:r>
+      <w:r>
+        <w:t>) přičemž s každou další více signifikantní souřadnicí tento k</w:t>
+      </w:r>
+      <w:r>
+        <w:t>umulativní součin předešlých velikostí dimenzí</w:t>
+      </w:r>
+      <w:r>
+        <w:t xml:space="preserve"> násobně roste a tím pádem pravděpodobnost změny dané souřadnice násobně klesá.</w:t>
+      </w:r>
+      <w:r>
+        <w:t xml:space="preserve"> Tím pádem je průměrná </w:t>
+      </w:r>
+      <w:r>
+        <w:t xml:space="preserve">amortizovaná </w:t>
+      </w:r>
+      <w:r>
+        <w:t>složitost</w:t>
+      </w:r>
+      <w:r>
+        <w:t xml:space="preserve"> této metody O(1).</w:t>
+      </w:r>
+    </w:p>
+    <w:p>
+      <w:pPr>
+        <w:spacing w:line="360" w:lineRule="auto"/>
+      </w:pPr>
+      <w:r>
         <w:t xml:space="preserve">Jelikož jsou data v tenzoru uložena v jednorozměrném </w:t>
       </w:r>
       <w:r>
@@ -7138,6 +7484,7 @@
         <w:spacing w:line="360" w:lineRule="auto"/>
       </w:pPr>
       <w:r>
+        <w:lastRenderedPageBreak/>
         <w:t>Tenzor také je schopen svého převodu na řetězec znaků.</w:t>
       </w:r>
       <w:r>
@@ -7212,13 +7559,336 @@
         <w:spacing w:line="360" w:lineRule="auto"/>
       </w:pPr>
       <w:r>
-        <w:t>Logika změny struktury…</w:t>
-      </w:r>
-      <w:proofErr w:type="spellStart"/>
-      <w:r>
-        <w:t>xxx</w:t>
-      </w:r>
-      <w:proofErr w:type="spellEnd"/>
+        <w:t xml:space="preserve">Tenzoru umí transpozici jako operaci měnící strukturu. </w:t>
+      </w:r>
+      <w:r>
+        <w:t xml:space="preserve">Tato operace vyžaduje vybrat dvě </w:t>
+      </w:r>
+      <w:r>
+        <w:t xml:space="preserve">validní </w:t>
+      </w:r>
+      <w:r>
+        <w:t>dimenze k</w:t>
+      </w:r>
+      <w:r>
+        <w:t> </w:t>
+      </w:r>
+      <w:r>
+        <w:t>prohození</w:t>
+      </w:r>
+      <w:r>
+        <w:t>.</w:t>
+      </w:r>
+      <w:r>
+        <w:t xml:space="preserve"> Poté jsou v poli s velikostmi dimenzí korespondující dimenze prohozeny a pole udržující </w:t>
+      </w:r>
+      <w:r>
+        <w:t>vektor kumulativních součinů předchozích velikostí dimenzí</w:t>
+      </w:r>
+      <w:r>
+        <w:t xml:space="preserve"> je aktualizován, jelikož z logiky operace jeho hodnoty nezůstanou stejné</w:t>
+      </w:r>
+      <w:r>
+        <w:t xml:space="preserve"> v</w:t>
+      </w:r>
+      <w:r>
+        <w:t> </w:t>
+      </w:r>
+      <w:r>
+        <w:t>případě</w:t>
+      </w:r>
+      <w:r>
+        <w:t>,</w:t>
+      </w:r>
+      <w:r>
+        <w:t xml:space="preserve"> kdy se velikosti prohazovaných dimenzí liší</w:t>
+      </w:r>
+      <w:r>
+        <w:t>.</w:t>
+      </w:r>
+    </w:p>
+    <w:p>
+      <w:pPr>
+        <w:pStyle w:val="Odstavecseseznamem"/>
+        <w:numPr>
+          <w:ilvl w:val="0"/>
+          <w:numId w:val="5"/>
+        </w:numPr>
+        <w:spacing w:line="360" w:lineRule="auto"/>
+      </w:pPr>
+      <w:r>
+        <w:t>Prohoďme</w:t>
+      </w:r>
+      <w:r>
+        <w:t xml:space="preserve"> dvě velikosti dimenzí, které se liší</w:t>
+      </w:r>
+      <w:r>
+        <w:t xml:space="preserve"> tak, že se velikost dimenze d1 přesune na místo méně signifikantní velikosti dimenze d2. Velikost dimenze d2 se přesune na původní místo d1.</w:t>
+      </w:r>
+    </w:p>
+    <w:p>
+      <w:pPr>
+        <w:pStyle w:val="Odstavecseseznamem"/>
+        <w:numPr>
+          <w:ilvl w:val="0"/>
+          <w:numId w:val="5"/>
+        </w:numPr>
+        <w:spacing w:line="360" w:lineRule="auto"/>
+        <w:ind w:left="714" w:hanging="357"/>
+        <w:rPr>
+          <w:i/>
+          <w:iCs/>
+        </w:rPr>
+      </w:pPr>
+      <w:r>
+        <w:t xml:space="preserve">Vlastností </w:t>
+      </w:r>
+      <w:r>
+        <w:t>vektor</w:t>
+      </w:r>
+      <w:r>
+        <w:t>u</w:t>
+      </w:r>
+      <w:r>
+        <w:t xml:space="preserve"> kumulativních součinů předchozích velikostí dimenzí</w:t>
+      </w:r>
+      <w:r>
+        <w:t xml:space="preserve"> je, že hodnota na místě </w:t>
+      </w:r>
+      <w:r>
+        <w:rPr>
+          <w:i/>
+          <w:iCs/>
+        </w:rPr>
+        <w:t>i</w:t>
+      </w:r>
+      <w:r>
+        <w:rPr>
+          <w:i/>
+          <w:iCs/>
+        </w:rPr>
+        <w:t xml:space="preserve"> </w:t>
+      </w:r>
+      <w:r>
+        <w:t>(</w:t>
+      </w:r>
+      <w:r>
+        <w:t xml:space="preserve">Kumulativní součin předešlých velikostí dimenzí korespondující </w:t>
+      </w:r>
+      <w:r>
+        <w:t xml:space="preserve">velikosti dimenze </w:t>
+      </w:r>
+      <w:r>
+        <w:rPr>
+          <w:i/>
+          <w:iCs/>
+        </w:rPr>
+        <w:t>i</w:t>
+      </w:r>
+      <w:r>
+        <w:t>)</w:t>
+      </w:r>
+      <w:r>
+        <w:rPr>
+          <w:i/>
+          <w:iCs/>
+        </w:rPr>
+        <w:t xml:space="preserve"> </w:t>
+      </w:r>
+      <w:r>
+        <w:t>je závislá na předchozích hodnotách z vektoru velikostí dimenzí od méně signifikantní strany</w:t>
+      </w:r>
+      <w:r>
+        <w:t xml:space="preserve"> (</w:t>
+      </w:r>
+      <w:r>
+        <w:t>od konce</w:t>
+      </w:r>
+      <w:r>
+        <w:t xml:space="preserve"> dle big-</w:t>
+      </w:r>
+      <w:proofErr w:type="spellStart"/>
+      <w:r>
+        <w:t>endian</w:t>
+      </w:r>
+      <w:proofErr w:type="spellEnd"/>
+      <w:r>
+        <w:t>)</w:t>
+      </w:r>
+      <w:r>
+        <w:t>.</w:t>
+      </w:r>
+    </w:p>
+    <w:p>
+      <w:pPr>
+        <w:pStyle w:val="Odstavecseseznamem"/>
+        <w:numPr>
+          <w:ilvl w:val="0"/>
+          <w:numId w:val="5"/>
+        </w:numPr>
+        <w:spacing w:line="360" w:lineRule="auto"/>
+      </w:pPr>
+      <w:r>
+        <w:t>Pro d2 po prohození platí, že je na více signifikantním místě.</w:t>
+      </w:r>
+      <w:r>
+        <w:t xml:space="preserve"> Pro d1 platí, že je na méně signifikantním místě (a tím pádem až po d2 dle big-</w:t>
+      </w:r>
+      <w:proofErr w:type="spellStart"/>
+      <w:r>
+        <w:t>endian</w:t>
+      </w:r>
+      <w:proofErr w:type="spellEnd"/>
+      <w:r>
+        <w:t>).</w:t>
+      </w:r>
+    </w:p>
+    <w:p>
+      <w:pPr>
+        <w:pStyle w:val="Odstavecseseznamem"/>
+        <w:numPr>
+          <w:ilvl w:val="0"/>
+          <w:numId w:val="5"/>
+        </w:numPr>
+        <w:spacing w:line="360" w:lineRule="auto"/>
+      </w:pPr>
+      <w:r>
+        <w:t>Kumulativní součin předešlých velikostí dimenzí</w:t>
+      </w:r>
+      <w:r>
+        <w:t xml:space="preserve"> korespondující </w:t>
+      </w:r>
+      <w:r>
+        <w:t>pro velikost dimenze d2 tím pádem musí být změněn</w:t>
+      </w:r>
+      <w:r>
+        <w:t>, jelikož jedna z hodnot velikostí dimenzí mezi d2 a koncem byla změněna.</w:t>
+      </w:r>
+    </w:p>
+    <w:p>
+      <w:pPr>
+        <w:spacing w:line="360" w:lineRule="auto"/>
+        <w:jc w:val="right"/>
+      </w:pPr>
+      <w:r>
+        <w:tab/>
+        <w:t>□</w:t>
+      </w:r>
+    </w:p>
+    <w:p>
+      <w:pPr>
+        <w:spacing w:line="360" w:lineRule="auto"/>
+      </w:pPr>
+      <w:r>
+        <w:t xml:space="preserve">Jelikož se jedná o prohození hodnot, tak to díky </w:t>
+      </w:r>
+      <w:proofErr w:type="spellStart"/>
+      <w:r>
+        <w:t>komutativitě</w:t>
+      </w:r>
+      <w:proofErr w:type="spellEnd"/>
+      <w:r>
+        <w:t xml:space="preserve"> násobení znamená nezměněný celkový po</w:t>
+      </w:r>
+      <w:r>
+        <w:t>č</w:t>
+      </w:r>
+      <w:r>
+        <w:t>et prvků.</w:t>
+      </w:r>
+      <w:r>
+        <w:t xml:space="preserve"> Při transpozici se tedy alokuje nové pole o stejné velikosti jako to staré.</w:t>
+      </w:r>
+      <w:r>
+        <w:t xml:space="preserve"> Bylo by sice možné implementovat tuto operaci na místě (in-place), to by ale znamenalo více </w:t>
+      </w:r>
+      <w:r>
+        <w:lastRenderedPageBreak/>
+        <w:t>celkových přesouvání, což by se značně prodražilo u velkých objektů.</w:t>
+      </w:r>
+      <w:r>
+        <w:t xml:space="preserve"> Poté dochází k přesunu prvků ze starého pole na nové</w:t>
+      </w:r>
+      <w:r>
+        <w:t>,</w:t>
+      </w:r>
+      <w:r>
+        <w:t xml:space="preserve"> a to </w:t>
+      </w:r>
+      <w:r>
+        <w:t>pomocí získání jeho souřadnice dle starých velikostí souřadnic a následném uložení na místo odpovídající daným souřadnicím po výměně vybraných souřadnic.</w:t>
+      </w:r>
+      <w:r>
+        <w:t xml:space="preserve"> Je totiž nutné si uvědomit, že pozice prvku se nezmění, jenom v případě, kdy jeho dvě vybrané souřadnice, korespondující vyměněným souřadnicím, jsou stejné.</w:t>
+      </w:r>
+      <w:r>
+        <w:t xml:space="preserve"> V praxi to znamená procházet od nejnižšího indexu v poli a pro každý prvek:</w:t>
+      </w:r>
+    </w:p>
+    <w:p>
+      <w:pPr>
+        <w:pStyle w:val="Odstavecseseznamem"/>
+        <w:numPr>
+          <w:ilvl w:val="0"/>
+          <w:numId w:val="6"/>
+        </w:numPr>
+        <w:spacing w:line="360" w:lineRule="auto"/>
+      </w:pPr>
+      <w:r>
+        <w:t>Vypočítat jeho souřadnice podle starých velikostí dimenzí.</w:t>
+      </w:r>
+    </w:p>
+    <w:p>
+      <w:pPr>
+        <w:pStyle w:val="Odstavecseseznamem"/>
+        <w:numPr>
+          <w:ilvl w:val="0"/>
+          <w:numId w:val="6"/>
+        </w:numPr>
+        <w:spacing w:line="360" w:lineRule="auto"/>
+      </w:pPr>
+      <w:r>
+        <w:t>Prohodit jeho souřadnice podle toto, jaké dimenze jsou vybrány k prohození.</w:t>
+      </w:r>
+    </w:p>
+    <w:p>
+      <w:pPr>
+        <w:pStyle w:val="Odstavecseseznamem"/>
+        <w:numPr>
+          <w:ilvl w:val="0"/>
+          <w:numId w:val="6"/>
+        </w:numPr>
+        <w:spacing w:line="360" w:lineRule="auto"/>
+      </w:pPr>
+      <w:r>
+        <w:t>Přesunout prvek na tyto nové souřadnice do nového pole.</w:t>
+      </w:r>
+    </w:p>
+    <w:p>
+      <w:pPr>
+        <w:spacing w:line="360" w:lineRule="auto"/>
+      </w:pPr>
+      <w:r>
+        <w:t>V případě sériové implementace je na první krok použita</w:t>
+      </w:r>
+      <w:r>
+        <w:t xml:space="preserve"> již zmíněná</w:t>
+      </w:r>
+      <w:r>
+        <w:t xml:space="preserve"> metoda</w:t>
+      </w:r>
+      <w:r>
+        <w:t xml:space="preserve"> pro inkrementaci souřadnic.</w:t>
+      </w:r>
+      <w:r>
+        <w:t xml:space="preserve"> Tu ovšem díky závislosti na předchozích souřadnicích nelze použít v paralelním provedení, kde je využito méně efektivní metody pro </w:t>
+      </w:r>
+      <w:r>
+        <w:t>výpočet</w:t>
+      </w:r>
+      <w:r>
+        <w:t xml:space="preserve"> souřadnic z indexu.</w:t>
+      </w:r>
     </w:p>
     <w:p>
       <w:pPr>
@@ -7228,7 +7898,7 @@
       <w:r>
         <w:br w:type="page"/>
       </w:r>
-      <w:bookmarkStart w:id="8" w:name="_Toc227522085"/>
+      <w:bookmarkStart w:id="8" w:name="_Toc229768694"/>
       <w:r>
         <w:lastRenderedPageBreak/>
         <w:t>2</w:t>
@@ -7323,7 +7993,7 @@
       <w:pPr>
         <w:pStyle w:val="Nadpis2"/>
       </w:pPr>
-      <w:bookmarkStart w:id="9" w:name="_Toc227522086"/>
+      <w:bookmarkStart w:id="9" w:name="_Toc229768695"/>
       <w:r>
         <w:t>2.1 Použité nástroje</w:t>
       </w:r>
@@ -7347,7 +8017,7 @@
       <w:pPr>
         <w:pStyle w:val="Nadpis3"/>
       </w:pPr>
-      <w:bookmarkStart w:id="10" w:name="_Toc227522087"/>
+      <w:bookmarkStart w:id="10" w:name="_Toc229768696"/>
       <w:r>
         <w:t xml:space="preserve">2.1.1 </w:t>
       </w:r>
@@ -7430,7 +8100,6 @@
         <w:t xml:space="preserve"> SYCL standard definuje abstrakce pro umožnění heterogenního programování. To má umožnit použití více druhů výpočetních zařízení v jedné aplikaci. Například použití CPU (s možností jednoduché paralelizace), GPU a </w:t>
       </w:r>
       <w:proofErr w:type="spellStart"/>
-      <w:proofErr w:type="gramStart"/>
       <w:r>
         <w:t>podobně.</w:t>
       </w:r>
@@ -7438,7 +8107,6 @@
         <w:t>AdaptiveCpp</w:t>
       </w:r>
       <w:proofErr w:type="spellEnd"/>
-      <w:proofErr w:type="gramEnd"/>
       <w:r>
         <w:t xml:space="preserve"> </w:t>
       </w:r>
@@ -7499,7 +8167,7 @@
       <w:pPr>
         <w:pStyle w:val="Nadpis3"/>
       </w:pPr>
-      <w:bookmarkStart w:id="11" w:name="_Toc227522088"/>
+      <w:bookmarkStart w:id="11" w:name="_Toc229768697"/>
       <w:r>
         <w:t>2.1.2 Google test</w:t>
       </w:r>
@@ -7540,7 +8208,7 @@
       <w:pPr>
         <w:pStyle w:val="Nadpis2"/>
       </w:pPr>
-      <w:bookmarkStart w:id="12" w:name="_Toc227522089"/>
+      <w:bookmarkStart w:id="12" w:name="_Toc229768698"/>
       <w:r>
         <w:t>2.</w:t>
       </w:r>
@@ -7563,12 +8231,136 @@
     <w:p>
       <w:pPr>
         <w:pStyle w:val="Nadpis3"/>
+      </w:pPr>
+      <w:bookmarkStart w:id="13" w:name="_Toc229768699"/>
+      <w:r>
+        <w:t>2.2.1 Koncepty</w:t>
+      </w:r>
+      <w:bookmarkEnd w:id="13"/>
+    </w:p>
+    <w:p>
+      <w:pPr>
+        <w:spacing w:line="360" w:lineRule="auto"/>
+      </w:pPr>
+      <w:r>
+        <w:t>Konceptem je v tomto smyslu myšlen nástroj jazyka C++</w:t>
+      </w:r>
+      <w:r>
+        <w:t xml:space="preserve"> (od standardu C++20)</w:t>
+      </w:r>
+      <w:r>
+        <w:t>.</w:t>
+      </w:r>
+      <w:r>
+        <w:t xml:space="preserve"> Koncepty jsou silně spjaté s generickým programováním, které je v C++ řešeno pomocí </w:t>
+      </w:r>
+      <w:proofErr w:type="spellStart"/>
+      <w:r>
+        <w:t>instanciace</w:t>
+      </w:r>
+      <w:proofErr w:type="spellEnd"/>
+      <w:r>
+        <w:t xml:space="preserve"> kódu podle příslušného typu.</w:t>
+      </w:r>
+      <w:r>
+        <w:t xml:space="preserve"> Koncepty pomáhají omezovat typy, které se snaží do šablony zasadit. Prakticky fungují jako taková podmínka vyžadující splnění určitého rozhraní či </w:t>
+      </w:r>
+      <w:r>
+        <w:lastRenderedPageBreak/>
+        <w:t xml:space="preserve">vlastnosti (v obecném slova smyslu) typového parametru. Tento nástroj se nejvíce podobá entitě </w:t>
+      </w:r>
+      <w:r>
+        <w:rPr>
+          <w:b/>
+          <w:bCs/>
+        </w:rPr>
+        <w:t>Interface</w:t>
+      </w:r>
+      <w:r>
+        <w:t xml:space="preserve"> z jazyků jako </w:t>
+      </w:r>
+      <w:r>
+        <w:rPr>
+          <w:b/>
+          <w:bCs/>
+        </w:rPr>
+        <w:t>Java</w:t>
+      </w:r>
+      <w:r>
+        <w:t xml:space="preserve"> či </w:t>
+      </w:r>
+      <w:r>
+        <w:rPr>
+          <w:b/>
+          <w:bCs/>
+        </w:rPr>
+        <w:t>C#</w:t>
+      </w:r>
+      <w:r>
+        <w:t xml:space="preserve">. Na rozdíl od Interface je daleko verzatilnější, se schopností kontrolovat téměř cokoliv dostupné během kompilace. Na druhou stranu je </w:t>
+      </w:r>
+      <w:r>
+        <w:t xml:space="preserve">daleko </w:t>
+      </w:r>
+      <w:r>
+        <w:t>imperativnější</w:t>
+      </w:r>
+      <w:r>
+        <w:t xml:space="preserve"> a tím pádem i složitější k užití.</w:t>
+      </w:r>
+    </w:p>
+    <w:p>
+      <w:pPr>
+        <w:spacing w:line="360" w:lineRule="auto"/>
+      </w:pPr>
+      <w:r>
+        <w:t xml:space="preserve">V práci je několik konceptů, které zajišťují shodné rozhraní některých dvojic tříd. Vzor, který dominuje této práci je konceptuálně řízený </w:t>
+      </w:r>
+      <w:r>
+        <w:t>polymorfismus</w:t>
+      </w:r>
+      <w:r>
+        <w:t xml:space="preserve"> kompilačního času.</w:t>
+      </w:r>
+      <w:r>
+        <w:t xml:space="preserve"> V rámci zachování jádra knihovny nezávislé na SYCL, tak byly často pro jeden účel implementovány dvě třídy, jedna nevyužívající knihovny, pracující pouze s CPU a host pamětí a druhá využívající nástroje SYCL.</w:t>
+      </w:r>
+    </w:p>
+    <w:p>
+      <w:pPr>
+        <w:pStyle w:val="Nadpis3"/>
+      </w:pPr>
+      <w:bookmarkStart w:id="14" w:name="_Toc229768700"/>
+      <w:r>
+        <w:t>2.2.</w:t>
+      </w:r>
+      <w:r>
+        <w:t>2</w:t>
+      </w:r>
+      <w:r>
+        <w:t xml:space="preserve"> Paměťový </w:t>
+      </w:r>
+      <w:proofErr w:type="spellStart"/>
+      <w:r>
+        <w:t>backend</w:t>
+      </w:r>
+      <w:bookmarkEnd w:id="14"/>
+      <w:proofErr w:type="spellEnd"/>
+    </w:p>
+    <w:p>
+      <w:r>
+        <w:t>h</w:t>
+      </w:r>
+    </w:p>
+    <w:p>
+      <w:pPr>
+        <w:pStyle w:val="Nadpis3"/>
         <w:rPr>
           <w:noProof/>
           <w:lang w:eastAsia="cs-CZ"/>
         </w:rPr>
       </w:pPr>
-      <w:bookmarkStart w:id="13" w:name="_Toc227522090"/>
+      <w:bookmarkStart w:id="15" w:name="_Toc229768701"/>
       <w:r>
         <w:t>2.</w:t>
       </w:r>
@@ -7576,7 +8368,10 @@
         <w:t>2</w:t>
       </w:r>
       <w:r>
-        <w:t>.1</w:t>
+        <w:t>.</w:t>
+      </w:r>
+      <w:r>
+        <w:t>3</w:t>
       </w:r>
       <w:r>
         <w:rPr>
@@ -7592,7 +8387,7 @@
         </w:rPr>
         <w:t>Lineární kontejner</w:t>
       </w:r>
-      <w:bookmarkEnd w:id="13"/>
+      <w:bookmarkEnd w:id="15"/>
     </w:p>
     <w:p>
       <w:pPr>
@@ -7666,7 +8461,6 @@
         <w:t xml:space="preserve">Motivace k jeho implementaci je potřeba kontejneru s rozhraním napodobujícím </w:t>
       </w:r>
       <w:proofErr w:type="spellStart"/>
-      <w:proofErr w:type="gramStart"/>
       <w:r>
         <w:rPr>
           <w:lang w:eastAsia="cs-CZ"/>
@@ -7681,7 +8475,6 @@
         <w:t>::</w:t>
       </w:r>
       <w:proofErr w:type="spellStart"/>
-      <w:proofErr w:type="gramEnd"/>
       <w:r>
         <w:rPr>
           <w:lang w:eastAsia="cs-CZ"/>
@@ -7693,20 +8486,87 @@
         <w:rPr>
           <w:lang w:eastAsia="cs-CZ"/>
         </w:rPr>
-        <w:t xml:space="preserve">, ale bez nevyhnutelné inicializace paměti. </w:t>
-      </w:r>
-      <w:r>
-        <w:rPr>
-          <w:lang w:eastAsia="cs-CZ"/>
-        </w:rPr>
-        <w:lastRenderedPageBreak/>
-        <w:t>To například vede ke mnohonásobnému zrychlení konstrukce instance tenzoru.</w:t>
-      </w:r>
-      <w:r>
-        <w:rPr>
-          <w:lang w:eastAsia="cs-CZ"/>
-        </w:rPr>
-        <w:t xml:space="preserve"> Uvnitř udržuje ukazatele na konec a začátek pole a také na konec kapacity – neboli celkové alokované paměti.</w:t>
+        <w:t xml:space="preserve">, ale </w:t>
+      </w:r>
+      <w:r>
+        <w:rPr>
+          <w:lang w:eastAsia="cs-CZ"/>
+        </w:rPr>
+        <w:t>s možností vlastní správy paměti</w:t>
+      </w:r>
+      <w:r>
+        <w:rPr>
+          <w:lang w:eastAsia="cs-CZ"/>
+        </w:rPr>
+        <w:t>, jelikož existuje potřeba pro speciální alokaci paměti na různých zařízeních (například GPU), kterou ani vlastní alokátor použitý s </w:t>
+      </w:r>
+      <w:proofErr w:type="spellStart"/>
+      <w:r>
+        <w:rPr>
+          <w:lang w:eastAsia="cs-CZ"/>
+        </w:rPr>
+        <w:t>std</w:t>
+      </w:r>
+      <w:proofErr w:type="spellEnd"/>
+      <w:r>
+        <w:rPr>
+          <w:lang w:eastAsia="cs-CZ"/>
+        </w:rPr>
+        <w:t>::</w:t>
+      </w:r>
+      <w:proofErr w:type="spellStart"/>
+      <w:r>
+        <w:rPr>
+          <w:lang w:eastAsia="cs-CZ"/>
+        </w:rPr>
+        <w:t>vector</w:t>
+      </w:r>
+      <w:proofErr w:type="spellEnd"/>
+      <w:r>
+        <w:rPr>
+          <w:lang w:eastAsia="cs-CZ"/>
+        </w:rPr>
+        <w:t xml:space="preserve"> nemůže pokrýt.</w:t>
+      </w:r>
+    </w:p>
+    <w:p>
+      <w:pPr>
+        <w:spacing w:line="360" w:lineRule="auto"/>
+        <w:rPr>
+          <w:lang w:eastAsia="cs-CZ"/>
+        </w:rPr>
+      </w:pPr>
+      <w:r>
+        <w:rPr>
+          <w:lang w:eastAsia="cs-CZ"/>
+        </w:rPr>
+        <w:t xml:space="preserve">Jak již naznačuje držení kapacity, tak je tento kontejner navržen i na postupné přidávání prvků pomocí metody </w:t>
+      </w:r>
+      <w:proofErr w:type="spellStart"/>
+      <w:r>
+        <w:rPr>
+          <w:lang w:eastAsia="cs-CZ"/>
+        </w:rPr>
+        <w:t>push_back</w:t>
+      </w:r>
+      <w:proofErr w:type="spellEnd"/>
+      <w:r>
+        <w:rPr>
+          <w:lang w:eastAsia="cs-CZ"/>
+        </w:rPr>
+        <w:t xml:space="preserve">, jelikož při překročení kapacity (alokovaného prostoru), dojde k alokaci </w:t>
+      </w:r>
+      <w:r>
+        <w:rPr>
+          <w:lang w:eastAsia="cs-CZ"/>
+        </w:rPr>
+        <w:t>1,5x původní kapacity + konstanta, kterou lze zanedbat pro velké alokace</w:t>
+      </w:r>
+      <w:r>
+        <w:rPr>
+          <w:lang w:eastAsia="cs-CZ"/>
+        </w:rPr>
+        <w:t>.</w:t>
       </w:r>
       <w:r>
         <w:rPr>
@@ -7714,6 +8574,66 @@
         </w:rPr>
         <w:t xml:space="preserve"> </w:t>
       </w:r>
+      <w:r>
+        <w:rPr>
+          <w:lang w:eastAsia="cs-CZ"/>
+        </w:rPr>
+        <w:t>Konstanta</w:t>
+      </w:r>
+      <w:r>
+        <w:rPr>
+          <w:lang w:eastAsia="cs-CZ"/>
+        </w:rPr>
+        <w:t xml:space="preserve"> řeší jenom případ, kdy je kapacita ještě nulová a tím pádem by jakékoli násobení bylo absorbováno opět na nulu</w:t>
+      </w:r>
+      <w:r>
+        <w:rPr>
+          <w:lang w:eastAsia="cs-CZ"/>
+        </w:rPr>
+        <w:t>.</w:t>
+      </w:r>
+      <w:r>
+        <w:rPr>
+          <w:lang w:eastAsia="cs-CZ"/>
+        </w:rPr>
+        <w:t xml:space="preserve"> Tento přístup tak zajišťuje </w:t>
+      </w:r>
+      <w:r>
+        <w:rPr>
+          <w:lang w:eastAsia="cs-CZ"/>
+        </w:rPr>
+        <w:t>velice rychlé uskutečněn</w:t>
+      </w:r>
+      <w:r>
+        <w:rPr>
+          <w:lang w:eastAsia="cs-CZ"/>
+        </w:rPr>
+        <w:t>í</w:t>
+      </w:r>
+      <w:r>
+        <w:rPr>
+          <w:lang w:eastAsia="cs-CZ"/>
+        </w:rPr>
+        <w:t xml:space="preserve"> větš</w:t>
+      </w:r>
+      <w:r>
+        <w:rPr>
+          <w:lang w:eastAsia="cs-CZ"/>
+        </w:rPr>
+        <w:t>i</w:t>
+      </w:r>
+      <w:r>
+        <w:rPr>
+          <w:lang w:eastAsia="cs-CZ"/>
+        </w:rPr>
+        <w:t>ny</w:t>
+      </w:r>
+      <w:r>
+        <w:rPr>
+          <w:lang w:eastAsia="cs-CZ"/>
+        </w:rPr>
+        <w:t xml:space="preserve"> vkládání.</w:t>
+      </w:r>
     </w:p>
     <w:p>
       <w:pPr>
@@ -7726,126 +8646,41 @@
         <w:rPr>
           <w:lang w:eastAsia="cs-CZ"/>
         </w:rPr>
-        <w:t xml:space="preserve">Jak již naznačuje držení kapacity, tak je tento kontejner navržen i na postupné přidávání prvků pomocí metody </w:t>
-      </w:r>
-      <w:proofErr w:type="spellStart"/>
-      <w:r>
-        <w:rPr>
-          <w:lang w:eastAsia="cs-CZ"/>
-        </w:rPr>
-        <w:t>push_back</w:t>
-      </w:r>
-      <w:proofErr w:type="spellEnd"/>
-      <w:r>
-        <w:rPr>
-          <w:lang w:eastAsia="cs-CZ"/>
-        </w:rPr>
-        <w:t xml:space="preserve">, jelikož při překročení kapacity (alokovaného prostoru), dojde k alokaci </w:t>
-      </w:r>
-      <w:r>
-        <w:rPr>
-          <w:lang w:eastAsia="cs-CZ"/>
-        </w:rPr>
-        <w:t>1,5x původní kapacity + konstanta, kterou lze zanedbat pro velké alokace</w:t>
-      </w:r>
-      <w:r>
-        <w:rPr>
-          <w:lang w:eastAsia="cs-CZ"/>
-        </w:rPr>
-        <w:t>.</w:t>
-      </w:r>
+        <w:t>Na alokaci byl také vytvořen vlastní alokátor.</w:t>
+      </w:r>
+      <w:r>
+        <w:rPr>
+          <w:lang w:eastAsia="cs-CZ"/>
+        </w:rPr>
+        <w:t xml:space="preserve"> Tento alokátor řeší použití ::</w:t>
+      </w:r>
+      <w:proofErr w:type="spellStart"/>
+      <w:r>
+        <w:rPr>
+          <w:lang w:eastAsia="cs-CZ"/>
+        </w:rPr>
+        <w:t>operator</w:t>
+      </w:r>
+      <w:proofErr w:type="spellEnd"/>
       <w:r>
         <w:rPr>
           <w:lang w:eastAsia="cs-CZ"/>
         </w:rPr>
         <w:t xml:space="preserve"> </w:t>
       </w:r>
-      <w:r>
-        <w:rPr>
-          <w:lang w:eastAsia="cs-CZ"/>
-        </w:rPr>
-        <w:t>Konstanta</w:t>
-      </w:r>
-      <w:r>
-        <w:rPr>
-          <w:lang w:eastAsia="cs-CZ"/>
-        </w:rPr>
-        <w:t xml:space="preserve"> řeší jenom případ, kdy je kapacita ještě nulová a tím pádem by jakékoli násobení bylo absorbováno opět na nulu</w:t>
-      </w:r>
-      <w:r>
-        <w:rPr>
-          <w:lang w:eastAsia="cs-CZ"/>
-        </w:rPr>
-        <w:t>.</w:t>
-      </w:r>
-      <w:r>
-        <w:rPr>
-          <w:lang w:eastAsia="cs-CZ"/>
-        </w:rPr>
-        <w:t xml:space="preserve"> Tento přístup tak zajišťuje </w:t>
-      </w:r>
-      <w:r>
-        <w:rPr>
-          <w:lang w:eastAsia="cs-CZ"/>
-        </w:rPr>
-        <w:t>velice rychlé uskutečněn</w:t>
-      </w:r>
-      <w:r>
-        <w:rPr>
-          <w:lang w:eastAsia="cs-CZ"/>
-        </w:rPr>
-        <w:t>í</w:t>
-      </w:r>
-      <w:r>
-        <w:rPr>
-          <w:lang w:eastAsia="cs-CZ"/>
-        </w:rPr>
-        <w:t xml:space="preserve"> větš</w:t>
-      </w:r>
-      <w:r>
-        <w:rPr>
-          <w:lang w:eastAsia="cs-CZ"/>
-        </w:rPr>
-        <w:t>i</w:t>
-      </w:r>
-      <w:r>
-        <w:rPr>
-          <w:lang w:eastAsia="cs-CZ"/>
-        </w:rPr>
-        <w:t>ny</w:t>
-      </w:r>
-      <w:r>
-        <w:rPr>
-          <w:lang w:eastAsia="cs-CZ"/>
-        </w:rPr>
-        <w:t xml:space="preserve"> vkládání.</w:t>
-      </w:r>
-    </w:p>
-    <w:p>
-      <w:pPr>
-        <w:spacing w:line="360" w:lineRule="auto"/>
-        <w:rPr>
-          <w:lang w:eastAsia="cs-CZ"/>
-        </w:rPr>
-      </w:pPr>
-      <w:r>
-        <w:rPr>
-          <w:lang w:eastAsia="cs-CZ"/>
-        </w:rPr>
-        <w:t>Na alokaci byl také vytvořen vlastní alokátor.</w:t>
-      </w:r>
-      <w:r>
-        <w:rPr>
-          <w:lang w:eastAsia="cs-CZ"/>
-        </w:rPr>
-        <w:t xml:space="preserve"> Tento alokátor řeší </w:t>
-      </w:r>
-      <w:proofErr w:type="gramStart"/>
-      <w:r>
-        <w:rPr>
-          <w:lang w:eastAsia="cs-CZ"/>
-        </w:rPr>
-        <w:t>použití ::</w:t>
+      <w:proofErr w:type="spellStart"/>
+      <w:r>
+        <w:rPr>
+          <w:lang w:eastAsia="cs-CZ"/>
+        </w:rPr>
+        <w:t>new</w:t>
+      </w:r>
+      <w:proofErr w:type="spellEnd"/>
+      <w:r>
+        <w:rPr>
+          <w:lang w:eastAsia="cs-CZ"/>
+        </w:rPr>
+        <w:t xml:space="preserve"> a ::</w:t>
       </w:r>
       <w:proofErr w:type="spellStart"/>
       <w:r>
@@ -7855,43 +8690,6 @@
         <w:t>operator</w:t>
       </w:r>
       <w:proofErr w:type="spellEnd"/>
-      <w:proofErr w:type="gramEnd"/>
-      <w:r>
-        <w:rPr>
-          <w:lang w:eastAsia="cs-CZ"/>
-        </w:rPr>
-        <w:t xml:space="preserve"> </w:t>
-      </w:r>
-      <w:proofErr w:type="spellStart"/>
-      <w:r>
-        <w:rPr>
-          <w:lang w:eastAsia="cs-CZ"/>
-        </w:rPr>
-        <w:t>new</w:t>
-      </w:r>
-      <w:proofErr w:type="spellEnd"/>
-      <w:r>
-        <w:rPr>
-          <w:lang w:eastAsia="cs-CZ"/>
-        </w:rPr>
-        <w:t xml:space="preserve"> </w:t>
-      </w:r>
-      <w:proofErr w:type="gramStart"/>
-      <w:r>
-        <w:rPr>
-          <w:lang w:eastAsia="cs-CZ"/>
-        </w:rPr>
-        <w:t>a ::</w:t>
-      </w:r>
-      <w:proofErr w:type="spellStart"/>
-      <w:r>
-        <w:rPr>
-          <w:lang w:eastAsia="cs-CZ"/>
-        </w:rPr>
-        <w:t>operator</w:t>
-      </w:r>
-      <w:proofErr w:type="spellEnd"/>
-      <w:proofErr w:type="gramEnd"/>
       <w:r>
         <w:rPr>
           <w:lang w:eastAsia="cs-CZ"/>
@@ -7977,10 +8775,10 @@
         <w:rPr>
           <w:lang w:eastAsia="cs-CZ"/>
         </w:rPr>
+        <w:lastRenderedPageBreak/>
         <w:t xml:space="preserve">Pro kopírování, porovnávání či konstrukci a destrukci jsou v případě triviálně manipulovatelných typů (kontrolováno například pomocí </w:t>
       </w:r>
       <w:proofErr w:type="spellStart"/>
-      <w:proofErr w:type="gramStart"/>
       <w:r>
         <w:rPr>
           <w:lang w:eastAsia="cs-CZ"/>
@@ -7995,7 +8793,6 @@
         <w:t>::</w:t>
       </w:r>
       <w:proofErr w:type="spellStart"/>
-      <w:proofErr w:type="gramEnd"/>
       <w:r>
         <w:rPr>
           <w:lang w:eastAsia="cs-CZ"/>
@@ -8030,7 +8827,6 @@
         <w:t xml:space="preserve"> funkce standartní knihovny jako například </w:t>
       </w:r>
       <w:proofErr w:type="spellStart"/>
-      <w:proofErr w:type="gramStart"/>
       <w:r>
         <w:rPr>
           <w:lang w:eastAsia="cs-CZ"/>
@@ -8045,7 +8841,6 @@
         <w:t>::</w:t>
       </w:r>
       <w:proofErr w:type="spellStart"/>
-      <w:proofErr w:type="gramEnd"/>
       <w:r>
         <w:rPr>
           <w:lang w:eastAsia="cs-CZ"/>
@@ -8060,7 +8855,6 @@
         <w:t xml:space="preserve"> či </w:t>
       </w:r>
       <w:proofErr w:type="spellStart"/>
-      <w:proofErr w:type="gramStart"/>
       <w:r>
         <w:rPr>
           <w:lang w:eastAsia="cs-CZ"/>
@@ -8075,7 +8869,6 @@
         <w:t>::</w:t>
       </w:r>
       <w:proofErr w:type="spellStart"/>
-      <w:proofErr w:type="gramEnd"/>
       <w:r>
         <w:rPr>
           <w:lang w:eastAsia="cs-CZ"/>
@@ -8124,7 +8917,6 @@
         <w:t xml:space="preserve">Z venkovního hlediska se rozhraní této třídy velmi podobá </w:t>
       </w:r>
       <w:proofErr w:type="spellStart"/>
-      <w:proofErr w:type="gramStart"/>
       <w:r>
         <w:rPr>
           <w:lang w:eastAsia="cs-CZ"/>
@@ -8139,7 +8931,6 @@
         <w:t>::</w:t>
       </w:r>
       <w:proofErr w:type="spellStart"/>
-      <w:proofErr w:type="gramEnd"/>
       <w:r>
         <w:rPr>
           <w:lang w:eastAsia="cs-CZ"/>
@@ -8213,21 +9004,7 @@
         <w:rPr>
           <w:lang w:eastAsia="cs-CZ"/>
         </w:rPr>
-        <w:t xml:space="preserve"> metody </w:t>
-      </w:r>
-      <w:proofErr w:type="gramStart"/>
-      <w:r>
-        <w:rPr>
-          <w:lang w:eastAsia="cs-CZ"/>
-        </w:rPr>
-        <w:t>data(</w:t>
-      </w:r>
-      <w:proofErr w:type="gramEnd"/>
-      <w:r>
-        <w:rPr>
-          <w:lang w:eastAsia="cs-CZ"/>
-        </w:rPr>
-        <w:t xml:space="preserve">)) </w:t>
+        <w:t xml:space="preserve"> metody data()) </w:t>
       </w:r>
       <w:r>
         <w:rPr>
@@ -8241,19 +9018,11 @@
         </w:rPr>
         <w:t>použít přetížení indexovacího operátoru ([]) pro přístup na jednotlivé prvky (v </w:t>
       </w:r>
-      <w:proofErr w:type="gramStart"/>
-      <w:r>
-        <w:rPr>
-          <w:lang w:eastAsia="cs-CZ"/>
-        </w:rPr>
-        <w:t>O(</w:t>
-      </w:r>
-      <w:proofErr w:type="gramEnd"/>
-      <w:r>
-        <w:rPr>
-          <w:lang w:eastAsia="cs-CZ"/>
-        </w:rPr>
-        <w:t>1)</w:t>
+      <w:r>
+        <w:rPr>
+          <w:lang w:eastAsia="cs-CZ"/>
+        </w:rPr>
+        <w:t>O(1)</w:t>
       </w:r>
       <w:r>
         <w:rPr>
@@ -8286,7 +9055,6 @@
         <w:t xml:space="preserve">, ze stejného rozhraní u </w:t>
       </w:r>
       <w:proofErr w:type="spellStart"/>
-      <w:proofErr w:type="gramStart"/>
       <w:r>
         <w:rPr>
           <w:lang w:eastAsia="cs-CZ"/>
@@ -8301,7 +9069,6 @@
         <w:t>::</w:t>
       </w:r>
       <w:proofErr w:type="spellStart"/>
-      <w:proofErr w:type="gramEnd"/>
       <w:r>
         <w:rPr>
           <w:lang w:eastAsia="cs-CZ"/>
@@ -8417,12 +9184,450 @@
           <w:lang w:eastAsia="cs-CZ"/>
         </w:rPr>
       </w:pPr>
-      <w:bookmarkStart w:id="14" w:name="_Toc227522091"/>
+      <w:bookmarkStart w:id="16" w:name="_Toc229768702"/>
+      <w:r>
+        <w:rPr>
+          <w:lang w:eastAsia="cs-CZ"/>
+        </w:rPr>
+        <w:t>2.</w:t>
+      </w:r>
+      <w:r>
+        <w:rPr>
+          <w:lang w:eastAsia="cs-CZ"/>
+        </w:rPr>
+        <w:t>2</w:t>
+      </w:r>
+      <w:r>
+        <w:rPr>
+          <w:lang w:eastAsia="cs-CZ"/>
+        </w:rPr>
+        <w:t>.</w:t>
+      </w:r>
+      <w:r>
+        <w:rPr>
+          <w:lang w:eastAsia="cs-CZ"/>
+        </w:rPr>
+        <w:t>4</w:t>
+      </w:r>
+      <w:r>
+        <w:rPr>
+          <w:lang w:eastAsia="cs-CZ"/>
+        </w:rPr>
+        <w:t xml:space="preserve"> Tenzor</w:t>
+      </w:r>
+      <w:bookmarkEnd w:id="16"/>
+    </w:p>
+    <w:p>
+      <w:pPr>
+        <w:spacing w:line="360" w:lineRule="auto"/>
+        <w:rPr>
+          <w:lang w:eastAsia="cs-CZ"/>
+        </w:rPr>
+      </w:pPr>
+      <w:r>
+        <w:rPr>
+          <w:lang w:eastAsia="cs-CZ"/>
+        </w:rPr>
+        <w:t>Jedná se o „hlavní“ třídu celé práce. Je navržen a implementován tak, aby byl univerzální, dynamický s širokým využitím.</w:t>
+      </w:r>
+      <w:r>
+        <w:rPr>
+          <w:lang w:eastAsia="cs-CZ"/>
+        </w:rPr>
+        <w:t xml:space="preserve"> </w:t>
+      </w:r>
+      <w:r>
+        <w:rPr>
+          <w:lang w:eastAsia="cs-CZ"/>
+        </w:rPr>
+        <w:t xml:space="preserve">V projektu se nazývá „Tensor“. </w:t>
+      </w:r>
+      <w:r>
+        <w:rPr>
+          <w:lang w:eastAsia="cs-CZ"/>
+        </w:rPr>
+        <w:t xml:space="preserve">Stejně jako lineární kontejner, tak je tato třída šablonovaná pro versatilní ukládání různých datových typů. </w:t>
+      </w:r>
+      <w:r>
+        <w:rPr>
+          <w:lang w:eastAsia="cs-CZ"/>
+        </w:rPr>
+        <w:t xml:space="preserve">Používá </w:t>
+      </w:r>
+      <w:r>
+        <w:rPr>
+          <w:lang w:eastAsia="cs-CZ"/>
+        </w:rPr>
+        <w:t>v sobě lineární kontejner pro udržení dat.</w:t>
+      </w:r>
+      <w:r>
+        <w:rPr>
+          <w:lang w:eastAsia="cs-CZ"/>
+        </w:rPr>
+        <w:t xml:space="preserve"> Jelikož udržování informací o struktuře tenzoru (tím myšleno rozměry dimenzí) je očekávané jen se zanedbatelným využitím paměti oproti datům, tak pro jednoduchost byly tyto informace uloženy do </w:t>
+      </w:r>
+      <w:proofErr w:type="spellStart"/>
+      <w:r>
+        <w:rPr>
+          <w:lang w:eastAsia="cs-CZ"/>
+        </w:rPr>
+        <w:t>std</w:t>
+      </w:r>
+      <w:proofErr w:type="spellEnd"/>
+      <w:r>
+        <w:rPr>
+          <w:lang w:eastAsia="cs-CZ"/>
+        </w:rPr>
+        <w:t>::</w:t>
+      </w:r>
+      <w:proofErr w:type="spellStart"/>
+      <w:r>
+        <w:rPr>
+          <w:lang w:eastAsia="cs-CZ"/>
+        </w:rPr>
+        <w:t>vector</w:t>
+      </w:r>
+      <w:proofErr w:type="spellEnd"/>
+      <w:r>
+        <w:rPr>
+          <w:lang w:eastAsia="cs-CZ"/>
+        </w:rPr>
+        <w:t xml:space="preserve">. Díky tomu je možné využít plného rozhraní manipulace nabízeného standartní knihovnou a </w:t>
+      </w:r>
+      <w:r>
+        <w:rPr>
+          <w:lang w:eastAsia="cs-CZ"/>
+        </w:rPr>
+        <w:t>také využít optimalizací, které s sebou knihovna přináší.</w:t>
+      </w:r>
+      <w:r>
+        <w:rPr>
+          <w:lang w:eastAsia="cs-CZ"/>
+        </w:rPr>
+        <w:t xml:space="preserve"> </w:t>
+      </w:r>
+    </w:p>
+    <w:p>
+      <w:pPr>
+        <w:spacing w:line="360" w:lineRule="auto"/>
+        <w:rPr>
+          <w:lang w:eastAsia="cs-CZ"/>
+        </w:rPr>
+      </w:pPr>
+      <w:r>
+        <w:rPr>
+          <w:lang w:eastAsia="cs-CZ"/>
+        </w:rPr>
+        <w:t>Použitím lineárního kontejneru se implementace vyhne</w:t>
+      </w:r>
+      <w:r>
+        <w:rPr>
+          <w:lang w:eastAsia="cs-CZ"/>
+        </w:rPr>
+        <w:t xml:space="preserve"> jednomu velikému problému. Vektor tak jak je ve standartní knihovně má zvláštní specializaci pro datový typ </w:t>
+      </w:r>
+      <w:proofErr w:type="spellStart"/>
+      <w:r>
+        <w:rPr>
+          <w:lang w:eastAsia="cs-CZ"/>
+        </w:rPr>
+        <w:t>bool</w:t>
+      </w:r>
+      <w:proofErr w:type="spellEnd"/>
+      <w:r>
+        <w:rPr>
+          <w:lang w:eastAsia="cs-CZ"/>
+        </w:rPr>
+        <w:t xml:space="preserve">. Je to optimalizace za účelem šetření místa, tak, že jeden </w:t>
+      </w:r>
+      <w:proofErr w:type="spellStart"/>
+      <w:r>
+        <w:rPr>
+          <w:lang w:eastAsia="cs-CZ"/>
+        </w:rPr>
+        <w:t>bool</w:t>
+      </w:r>
+      <w:proofErr w:type="spellEnd"/>
+      <w:r>
+        <w:rPr>
+          <w:lang w:eastAsia="cs-CZ"/>
+        </w:rPr>
+        <w:t xml:space="preserve"> je uložen pouze v jednom bitu místo bytu.</w:t>
+      </w:r>
+      <w:r>
+        <w:rPr>
+          <w:lang w:eastAsia="cs-CZ"/>
+        </w:rPr>
+        <w:t xml:space="preserve"> Taková specializace ovšem přináší problémy při imp</w:t>
+      </w:r>
+      <w:r>
+        <w:rPr>
+          <w:lang w:eastAsia="cs-CZ"/>
+        </w:rPr>
+        <w:t>l</w:t>
+      </w:r>
+      <w:r>
+        <w:rPr>
+          <w:lang w:eastAsia="cs-CZ"/>
+        </w:rPr>
+        <w:t xml:space="preserve">ementaci šablonovaných metod. Například reference na jeden prvek není reference na </w:t>
+      </w:r>
+      <w:proofErr w:type="spellStart"/>
+      <w:r>
+        <w:rPr>
+          <w:lang w:eastAsia="cs-CZ"/>
+        </w:rPr>
+        <w:t>bool</w:t>
+      </w:r>
+      <w:proofErr w:type="spellEnd"/>
+      <w:r>
+        <w:rPr>
+          <w:lang w:eastAsia="cs-CZ"/>
+        </w:rPr>
+        <w:t xml:space="preserve"> ale jedná se o složitější objekt. Čtenář si jistě představí, jaké problémy to může přinést, když by se pokoušel programovat genericky. Navíc je tento typ ukládání obtížen drobným </w:t>
+      </w:r>
+      <w:proofErr w:type="spellStart"/>
+      <w:r>
+        <w:rPr>
+          <w:lang w:eastAsia="cs-CZ"/>
+        </w:rPr>
+        <w:t>overheadem</w:t>
+      </w:r>
+      <w:proofErr w:type="spellEnd"/>
+      <w:r>
+        <w:rPr>
+          <w:lang w:eastAsia="cs-CZ"/>
+        </w:rPr>
+        <w:t xml:space="preserve"> u přístupů k prvkům, </w:t>
+      </w:r>
       <w:r>
         <w:rPr>
           <w:lang w:eastAsia="cs-CZ"/>
         </w:rPr>
         <w:lastRenderedPageBreak/>
+        <w:t>jelikož se nejedná o pouhé přistupování na byte paměti, ale dostávání hodnoty konkrétního bitu, což normálně jde jen za pomocí bitových operací a masek.</w:t>
+      </w:r>
+      <w:r>
+        <w:rPr>
+          <w:lang w:eastAsia="cs-CZ"/>
+        </w:rPr>
+        <w:t xml:space="preserve"> V lineárním kontejneru jsou bity uloženy vedle sebe v bytech. To dává stejné chování jako u ostatních primitivních datových typů</w:t>
+      </w:r>
+      <w:r>
+        <w:rPr>
+          <w:lang w:eastAsia="cs-CZ"/>
+        </w:rPr>
+        <w:t>,</w:t>
+      </w:r>
+      <w:r>
+        <w:rPr>
+          <w:lang w:eastAsia="cs-CZ"/>
+        </w:rPr>
+        <w:t xml:space="preserve"> a navíc je bez </w:t>
+      </w:r>
+      <w:proofErr w:type="spellStart"/>
+      <w:r>
+        <w:rPr>
+          <w:lang w:eastAsia="cs-CZ"/>
+        </w:rPr>
+        <w:t>overheadu</w:t>
+      </w:r>
+      <w:proofErr w:type="spellEnd"/>
+      <w:r>
+        <w:rPr>
+          <w:lang w:eastAsia="cs-CZ"/>
+        </w:rPr>
+        <w:t>.</w:t>
+      </w:r>
+    </w:p>
+    <w:p>
+      <w:pPr>
+        <w:spacing w:line="360" w:lineRule="auto"/>
+        <w:rPr>
+          <w:lang w:eastAsia="cs-CZ"/>
+        </w:rPr>
+      </w:pPr>
+      <w:r>
+        <w:rPr>
+          <w:lang w:eastAsia="cs-CZ"/>
+        </w:rPr>
+        <w:t>V této třídě je také uložen vektor kumulativních součinů</w:t>
+      </w:r>
+      <w:r>
+        <w:rPr>
+          <w:lang w:eastAsia="cs-CZ"/>
+        </w:rPr>
+        <w:t xml:space="preserve"> předešlých dimenzí</w:t>
+      </w:r>
+      <w:r>
+        <w:rPr>
+          <w:lang w:eastAsia="cs-CZ"/>
+        </w:rPr>
+        <w:t xml:space="preserve">, a to pomocí </w:t>
+      </w:r>
+      <w:proofErr w:type="spellStart"/>
+      <w:r>
+        <w:rPr>
+          <w:lang w:eastAsia="cs-CZ"/>
+        </w:rPr>
+        <w:t>std</w:t>
+      </w:r>
+      <w:proofErr w:type="spellEnd"/>
+      <w:r>
+        <w:rPr>
+          <w:lang w:eastAsia="cs-CZ"/>
+        </w:rPr>
+        <w:t>::</w:t>
+      </w:r>
+      <w:proofErr w:type="spellStart"/>
+      <w:r>
+        <w:rPr>
+          <w:lang w:eastAsia="cs-CZ"/>
+        </w:rPr>
+        <w:t>vector</w:t>
+      </w:r>
+      <w:proofErr w:type="spellEnd"/>
+      <w:r>
+        <w:rPr>
+          <w:lang w:eastAsia="cs-CZ"/>
+        </w:rPr>
+        <w:t>. Ze stejných důvodů jako u dimenzí tenzoru je toto řešení do</w:t>
+      </w:r>
+      <w:r>
+        <w:rPr>
+          <w:lang w:eastAsia="cs-CZ"/>
+        </w:rPr>
+        <w:t>s</w:t>
+      </w:r>
+      <w:r>
+        <w:rPr>
+          <w:lang w:eastAsia="cs-CZ"/>
+        </w:rPr>
+        <w:t>tačující.</w:t>
+      </w:r>
+    </w:p>
+    <w:p>
+      <w:pPr>
+        <w:spacing w:line="360" w:lineRule="auto"/>
+        <w:rPr>
+          <w:lang w:eastAsia="cs-CZ"/>
+        </w:rPr>
+      </w:pPr>
+      <w:r>
+        <w:rPr>
+          <w:lang w:eastAsia="cs-CZ"/>
+        </w:rPr>
+        <w:t>Základním způsobem</w:t>
+      </w:r>
+      <w:r>
+        <w:rPr>
+          <w:lang w:eastAsia="cs-CZ"/>
+        </w:rPr>
+        <w:t>,</w:t>
+      </w:r>
+      <w:r>
+        <w:rPr>
+          <w:lang w:eastAsia="cs-CZ"/>
+        </w:rPr>
+        <w:t xml:space="preserve"> jak vytvořit tenzor je použít konstruktor přijímající jeden </w:t>
+      </w:r>
+      <w:proofErr w:type="spellStart"/>
+      <w:r>
+        <w:rPr>
+          <w:lang w:eastAsia="cs-CZ"/>
+        </w:rPr>
+        <w:t>std</w:t>
+      </w:r>
+      <w:proofErr w:type="spellEnd"/>
+      <w:r>
+        <w:rPr>
+          <w:lang w:eastAsia="cs-CZ"/>
+        </w:rPr>
+        <w:t>::</w:t>
+      </w:r>
+      <w:proofErr w:type="spellStart"/>
+      <w:r>
+        <w:rPr>
+          <w:lang w:eastAsia="cs-CZ"/>
+        </w:rPr>
+        <w:t>ve</w:t>
+      </w:r>
+      <w:r>
+        <w:rPr>
+          <w:lang w:eastAsia="cs-CZ"/>
+        </w:rPr>
+        <w:t>c</w:t>
+      </w:r>
+      <w:r>
+        <w:rPr>
+          <w:lang w:eastAsia="cs-CZ"/>
+        </w:rPr>
+        <w:t>tor</w:t>
+      </w:r>
+      <w:proofErr w:type="spellEnd"/>
+      <w:r>
+        <w:rPr>
+          <w:lang w:eastAsia="cs-CZ"/>
+        </w:rPr>
+        <w:t>&lt;uint64_t&gt;</w:t>
+      </w:r>
+      <w:r>
+        <w:rPr>
+          <w:lang w:eastAsia="cs-CZ"/>
+        </w:rPr>
+        <w:t>.</w:t>
+      </w:r>
+      <w:r>
+        <w:rPr>
+          <w:lang w:eastAsia="cs-CZ"/>
+        </w:rPr>
+        <w:t xml:space="preserve"> Ten vektor obsahuje velikosti dimenzí. V konstruktoru se nakopíruje do vektoru pro udržování velikostí dimenzí a poté se spustí metoda update(), která vypočítá potřebné místo k alokaci tenzoru</w:t>
+      </w:r>
+      <w:r>
+        <w:rPr>
+          <w:lang w:eastAsia="cs-CZ"/>
+        </w:rPr>
+        <w:t>,</w:t>
+      </w:r>
+      <w:r>
+        <w:rPr>
+          <w:lang w:eastAsia="cs-CZ"/>
+        </w:rPr>
+        <w:t xml:space="preserve"> a to místo skutečně alokuje na lineárním kontejneru.</w:t>
+      </w:r>
+      <w:r>
+        <w:rPr>
+          <w:lang w:eastAsia="cs-CZ"/>
+        </w:rPr>
+        <w:t xml:space="preserve"> Poté také aktualizuje/vypočítá strukturální optimalizační data závislá na velikostech dimenze jako například vektor kumulativních </w:t>
+      </w:r>
+      <w:r>
+        <w:rPr>
+          <w:lang w:eastAsia="cs-CZ"/>
+        </w:rPr>
+        <w:t>součinů předchozích velikostí dimenzí.</w:t>
+      </w:r>
+    </w:p>
+    <w:p>
+      <w:pPr>
+        <w:spacing w:line="360" w:lineRule="auto"/>
+        <w:rPr>
+          <w:lang w:eastAsia="cs-CZ"/>
+        </w:rPr>
+      </w:pPr>
+    </w:p>
+    <w:p>
+      <w:pPr>
+        <w:pStyle w:val="Nadpis3"/>
+        <w:rPr>
+          <w:lang w:eastAsia="cs-CZ"/>
+        </w:rPr>
+      </w:pPr>
+      <w:bookmarkStart w:id="17" w:name="_Toc229768703"/>
+      <w:r>
+        <w:rPr>
+          <w:lang w:eastAsia="cs-CZ"/>
+        </w:rPr>
         <w:t>2.</w:t>
       </w:r>
       <w:r>
@@ -8435,15 +9640,21 @@
         <w:rPr>
           <w:lang w:eastAsia="cs-CZ"/>
         </w:rPr>
-        <w:t>.2</w:t>
-      </w:r>
-      <w:r>
-        <w:rPr>
-          <w:lang w:eastAsia="cs-CZ"/>
-        </w:rPr>
-        <w:t xml:space="preserve"> Tenzor</w:t>
-      </w:r>
-      <w:bookmarkEnd w:id="14"/>
+        <w:t>.</w:t>
+      </w:r>
+      <w:r>
+        <w:rPr>
+          <w:lang w:eastAsia="cs-CZ"/>
+        </w:rPr>
+        <w:t>5</w:t>
+      </w:r>
+      <w:r>
+        <w:rPr>
+          <w:lang w:eastAsia="cs-CZ"/>
+        </w:rPr>
+        <w:t xml:space="preserve"> Paralelní tenzor</w:t>
+      </w:r>
+      <w:bookmarkEnd w:id="17"/>
     </w:p>
     <w:p>
       <w:pPr>
@@ -8452,90 +9663,54 @@
           <w:lang w:eastAsia="cs-CZ"/>
         </w:rPr>
       </w:pPr>
-      <w:r>
-        <w:rPr>
-          <w:lang w:eastAsia="cs-CZ"/>
-        </w:rPr>
-        <w:t>Jedná se o „hlavní“ třídu celé práce. Je navržen a implementován tak, aby byl univerzální, dynamický s širokým využitím.</w:t>
-      </w:r>
-      <w:r>
-        <w:rPr>
-          <w:lang w:eastAsia="cs-CZ"/>
-        </w:rPr>
-        <w:t xml:space="preserve"> </w:t>
-      </w:r>
-      <w:r>
-        <w:rPr>
-          <w:lang w:eastAsia="cs-CZ"/>
-        </w:rPr>
-        <w:t xml:space="preserve">V projektu se nazývá „Tensor“. </w:t>
-      </w:r>
-      <w:r>
-        <w:rPr>
-          <w:lang w:eastAsia="cs-CZ"/>
-        </w:rPr>
-        <w:t xml:space="preserve">Stejně jako lineární kontejner, tak je tato třída šablonovaná pro versatilní ukládání různých datových typů. </w:t>
-      </w:r>
-      <w:r>
-        <w:rPr>
-          <w:lang w:eastAsia="cs-CZ"/>
-        </w:rPr>
-        <w:t xml:space="preserve">Používá </w:t>
-      </w:r>
-      <w:r>
-        <w:rPr>
-          <w:lang w:eastAsia="cs-CZ"/>
-        </w:rPr>
-        <w:t>v sobě lineární kontejner pro udržení dat.</w:t>
-      </w:r>
-      <w:r>
-        <w:rPr>
-          <w:lang w:eastAsia="cs-CZ"/>
-        </w:rPr>
-        <w:t xml:space="preserve"> Jelikož udržování informací o struktuře tenzoru (tím myšleno rozměry dimenzí) je očekávané jen se zanedbatelným využitím paměti oproti datům, tak pro jednoduchost byly tyto informace uloženy do </w:t>
-      </w:r>
-      <w:proofErr w:type="spellStart"/>
-      <w:proofErr w:type="gramStart"/>
-      <w:r>
-        <w:rPr>
-          <w:lang w:eastAsia="cs-CZ"/>
-        </w:rPr>
-        <w:t>std</w:t>
-      </w:r>
-      <w:proofErr w:type="spellEnd"/>
-      <w:r>
-        <w:rPr>
-          <w:lang w:eastAsia="cs-CZ"/>
-        </w:rPr>
-        <w:t>::</w:t>
-      </w:r>
-      <w:proofErr w:type="spellStart"/>
-      <w:proofErr w:type="gramEnd"/>
-      <w:r>
-        <w:rPr>
-          <w:lang w:eastAsia="cs-CZ"/>
-        </w:rPr>
-        <w:t>vector</w:t>
-      </w:r>
-      <w:proofErr w:type="spellEnd"/>
-      <w:r>
-        <w:rPr>
-          <w:lang w:eastAsia="cs-CZ"/>
-        </w:rPr>
-        <w:t xml:space="preserve">. Díky tomu je možné využít plného rozhraní manipulace nabízeného standartní knihovnou a </w:t>
-      </w:r>
-      <w:r>
-        <w:rPr>
-          <w:lang w:eastAsia="cs-CZ"/>
-        </w:rPr>
-        <w:t>také využít optimalizací, které s sebou knihovna přináší.</w:t>
-      </w:r>
-      <w:r>
-        <w:rPr>
-          <w:lang w:eastAsia="cs-CZ"/>
-        </w:rPr>
-        <w:t xml:space="preserve"> </w:t>
-      </w:r>
+      <w:proofErr w:type="spellStart"/>
+      <w:r>
+        <w:rPr>
+          <w:lang w:eastAsia="cs-CZ"/>
+        </w:rPr>
+        <w:t>Xxx</w:t>
+      </w:r>
+      <w:proofErr w:type="spellEnd"/>
+    </w:p>
+    <w:p>
+      <w:pPr>
+        <w:pStyle w:val="Nadpis3"/>
+        <w:rPr>
+          <w:lang w:eastAsia="cs-CZ"/>
+        </w:rPr>
+      </w:pPr>
+      <w:bookmarkStart w:id="18" w:name="_Toc229768704"/>
+      <w:r>
+        <w:rPr>
+          <w:lang w:eastAsia="cs-CZ"/>
+        </w:rPr>
+        <w:t>2.</w:t>
+      </w:r>
+      <w:r>
+        <w:rPr>
+          <w:lang w:eastAsia="cs-CZ"/>
+        </w:rPr>
+        <w:t>2</w:t>
+      </w:r>
+      <w:r>
+        <w:rPr>
+          <w:lang w:eastAsia="cs-CZ"/>
+        </w:rPr>
+        <w:t>.</w:t>
+      </w:r>
+      <w:r>
+        <w:rPr>
+          <w:lang w:eastAsia="cs-CZ"/>
+        </w:rPr>
+        <w:t>6</w:t>
+      </w:r>
+      <w:r>
+        <w:rPr>
+          <w:lang w:eastAsia="cs-CZ"/>
+        </w:rPr>
+        <w:t xml:space="preserve"> Matice</w:t>
+      </w:r>
+      <w:bookmarkEnd w:id="18"/>
     </w:p>
     <w:p>
       <w:pPr>
@@ -8544,126 +9719,54 @@
           <w:lang w:eastAsia="cs-CZ"/>
         </w:rPr>
       </w:pPr>
-      <w:r>
-        <w:rPr>
-          <w:lang w:eastAsia="cs-CZ"/>
-        </w:rPr>
-        <w:t>Použitím lineárního kontejneru se implementace vyhne</w:t>
-      </w:r>
-      <w:r>
-        <w:rPr>
-          <w:lang w:eastAsia="cs-CZ"/>
-        </w:rPr>
-        <w:t xml:space="preserve"> jednomu velikému problému. Vektor tak jak je ve standartní knihovně má zvláštní specializaci pro datový typ </w:t>
-      </w:r>
-      <w:proofErr w:type="spellStart"/>
-      <w:r>
-        <w:rPr>
-          <w:lang w:eastAsia="cs-CZ"/>
-        </w:rPr>
-        <w:t>bool</w:t>
-      </w:r>
-      <w:proofErr w:type="spellEnd"/>
-      <w:r>
-        <w:rPr>
-          <w:lang w:eastAsia="cs-CZ"/>
-        </w:rPr>
-        <w:t xml:space="preserve">. Je to optimalizace za účelem šetření místa, tak, že jeden </w:t>
-      </w:r>
-      <w:proofErr w:type="spellStart"/>
-      <w:r>
-        <w:rPr>
-          <w:lang w:eastAsia="cs-CZ"/>
-        </w:rPr>
-        <w:t>bool</w:t>
-      </w:r>
-      <w:proofErr w:type="spellEnd"/>
-      <w:r>
-        <w:rPr>
-          <w:lang w:eastAsia="cs-CZ"/>
-        </w:rPr>
-        <w:t xml:space="preserve"> je uložen pouze v jednom bitu místo bytu.</w:t>
-      </w:r>
-      <w:r>
-        <w:rPr>
-          <w:lang w:eastAsia="cs-CZ"/>
-        </w:rPr>
-        <w:t xml:space="preserve"> Taková specializace ovšem přináší problémy při imp</w:t>
-      </w:r>
-      <w:r>
-        <w:rPr>
-          <w:lang w:eastAsia="cs-CZ"/>
-        </w:rPr>
-        <w:t>l</w:t>
-      </w:r>
-      <w:r>
-        <w:rPr>
-          <w:lang w:eastAsia="cs-CZ"/>
-        </w:rPr>
-        <w:t xml:space="preserve">ementaci šablonovaných metod. Například reference na jeden prvek není reference na </w:t>
-      </w:r>
-      <w:proofErr w:type="spellStart"/>
-      <w:proofErr w:type="gramStart"/>
-      <w:r>
-        <w:rPr>
-          <w:lang w:eastAsia="cs-CZ"/>
-        </w:rPr>
-        <w:t>bool</w:t>
-      </w:r>
-      <w:proofErr w:type="spellEnd"/>
-      <w:proofErr w:type="gramEnd"/>
-      <w:r>
-        <w:rPr>
-          <w:lang w:eastAsia="cs-CZ"/>
-        </w:rPr>
-        <w:t xml:space="preserve"> ale jedná se o složitější objekt. Čtenář si jistě představí, jaké problémy to může přinést, když by se pokoušel programovat genericky. Navíc je tento typ ukládání obtížen drobným </w:t>
-      </w:r>
-      <w:proofErr w:type="spellStart"/>
-      <w:r>
-        <w:rPr>
-          <w:lang w:eastAsia="cs-CZ"/>
-        </w:rPr>
-        <w:t>overheadem</w:t>
-      </w:r>
-      <w:proofErr w:type="spellEnd"/>
-      <w:r>
-        <w:rPr>
-          <w:lang w:eastAsia="cs-CZ"/>
-        </w:rPr>
-        <w:t xml:space="preserve"> u přístupů k prvkům, jelikož se nejedná o pouhé přistupování na byte paměti, ale dostávání hodnoty konkrétního bitu, což normálně jde jen za pomocí bitových operací a masek.</w:t>
-      </w:r>
-      <w:r>
-        <w:rPr>
-          <w:lang w:eastAsia="cs-CZ"/>
-        </w:rPr>
-        <w:t xml:space="preserve"> V lineárním kontejneru jsou bity uloženy vedle sebe v bytech. To dává stejné chování jako u ostatních primitivních datových typů</w:t>
-      </w:r>
-      <w:r>
-        <w:rPr>
-          <w:lang w:eastAsia="cs-CZ"/>
-        </w:rPr>
-        <w:t>,</w:t>
-      </w:r>
-      <w:r>
-        <w:rPr>
-          <w:lang w:eastAsia="cs-CZ"/>
-        </w:rPr>
-        <w:t xml:space="preserve"> a navíc je bez </w:t>
-      </w:r>
-      <w:proofErr w:type="spellStart"/>
-      <w:r>
-        <w:rPr>
-          <w:lang w:eastAsia="cs-CZ"/>
-        </w:rPr>
-        <w:t>overheadu</w:t>
-      </w:r>
-      <w:proofErr w:type="spellEnd"/>
+      <w:proofErr w:type="spellStart"/>
+      <w:r>
+        <w:rPr>
+          <w:lang w:eastAsia="cs-CZ"/>
+        </w:rPr>
+        <w:t>Xxx</w:t>
+      </w:r>
+      <w:proofErr w:type="spellEnd"/>
+    </w:p>
+    <w:p>
+      <w:pPr>
+        <w:pStyle w:val="Nadpis3"/>
+        <w:rPr>
+          <w:lang w:eastAsia="cs-CZ"/>
+        </w:rPr>
+      </w:pPr>
+      <w:bookmarkStart w:id="19" w:name="_Toc229768705"/>
+      <w:r>
+        <w:rPr>
+          <w:lang w:eastAsia="cs-CZ"/>
+        </w:rPr>
+        <w:t>2.</w:t>
+      </w:r>
+      <w:r>
+        <w:rPr>
+          <w:lang w:eastAsia="cs-CZ"/>
+        </w:rPr>
+        <w:t>2</w:t>
+      </w:r>
       <w:r>
         <w:rPr>
           <w:lang w:eastAsia="cs-CZ"/>
         </w:rPr>
         <w:t>.</w:t>
       </w:r>
+      <w:r>
+        <w:rPr>
+          <w:lang w:eastAsia="cs-CZ"/>
+        </w:rPr>
+        <w:t>7</w:t>
+      </w:r>
+      <w:r>
+        <w:rPr>
+          <w:lang w:eastAsia="cs-CZ"/>
+        </w:rPr>
+        <w:t xml:space="preserve"> Paralelní matice</w:t>
+      </w:r>
+      <w:bookmarkEnd w:id="19"/>
     </w:p>
     <w:p>
       <w:pPr>
@@ -8672,66 +9775,68 @@
           <w:lang w:eastAsia="cs-CZ"/>
         </w:rPr>
       </w:pPr>
-      <w:r>
-        <w:rPr>
-          <w:lang w:eastAsia="cs-CZ"/>
-        </w:rPr>
-        <w:t>V této třídě je také uložen vektor kumulativních součinů</w:t>
-      </w:r>
-      <w:r>
-        <w:rPr>
-          <w:lang w:eastAsia="cs-CZ"/>
-        </w:rPr>
-        <w:t xml:space="preserve"> předešlých dimenzí</w:t>
-      </w:r>
-      <w:r>
-        <w:rPr>
-          <w:lang w:eastAsia="cs-CZ"/>
-        </w:rPr>
-        <w:t xml:space="preserve">, a to pomocí </w:t>
-      </w:r>
-      <w:proofErr w:type="spellStart"/>
-      <w:proofErr w:type="gramStart"/>
-      <w:r>
-        <w:rPr>
-          <w:lang w:eastAsia="cs-CZ"/>
-        </w:rPr>
-        <w:t>std</w:t>
-      </w:r>
-      <w:proofErr w:type="spellEnd"/>
-      <w:r>
-        <w:rPr>
-          <w:lang w:eastAsia="cs-CZ"/>
-        </w:rPr>
-        <w:t>::</w:t>
-      </w:r>
-      <w:proofErr w:type="spellStart"/>
-      <w:proofErr w:type="gramEnd"/>
-      <w:r>
-        <w:rPr>
-          <w:lang w:eastAsia="cs-CZ"/>
-        </w:rPr>
-        <w:t>vector</w:t>
-      </w:r>
-      <w:proofErr w:type="spellEnd"/>
-      <w:r>
-        <w:rPr>
-          <w:lang w:eastAsia="cs-CZ"/>
-        </w:rPr>
-        <w:t>. Ze stejných důvodů jako u dimenzí tenzoru je toto řešení do</w:t>
-      </w:r>
-      <w:r>
-        <w:rPr>
-          <w:lang w:eastAsia="cs-CZ"/>
-        </w:rPr>
-        <w:t>s</w:t>
-      </w:r>
-      <w:r>
-        <w:rPr>
-          <w:lang w:eastAsia="cs-CZ"/>
-        </w:rPr>
-        <w:t>tačující.</w:t>
-      </w:r>
+      <w:proofErr w:type="spellStart"/>
+      <w:r>
+        <w:rPr>
+          <w:lang w:eastAsia="cs-CZ"/>
+        </w:rPr>
+        <w:t>Xxx</w:t>
+      </w:r>
+      <w:proofErr w:type="spellEnd"/>
+    </w:p>
+    <w:p>
+      <w:pPr>
+        <w:pStyle w:val="Nadpis3"/>
+        <w:rPr>
+          <w:lang w:eastAsia="cs-CZ"/>
+        </w:rPr>
+      </w:pPr>
+      <w:bookmarkStart w:id="20" w:name="_Toc229768706"/>
+      <w:r>
+        <w:rPr>
+          <w:lang w:eastAsia="cs-CZ"/>
+        </w:rPr>
+        <w:t>2.</w:t>
+      </w:r>
+      <w:r>
+        <w:rPr>
+          <w:lang w:eastAsia="cs-CZ"/>
+        </w:rPr>
+        <w:t>2</w:t>
+      </w:r>
+      <w:r>
+        <w:rPr>
+          <w:lang w:eastAsia="cs-CZ"/>
+        </w:rPr>
+        <w:t>.</w:t>
+      </w:r>
+      <w:r>
+        <w:rPr>
+          <w:lang w:eastAsia="cs-CZ"/>
+        </w:rPr>
+        <w:t>8</w:t>
+      </w:r>
+      <w:r>
+        <w:rPr>
+          <w:lang w:eastAsia="cs-CZ"/>
+        </w:rPr>
+        <w:t xml:space="preserve"> N-</w:t>
+      </w:r>
+      <w:proofErr w:type="spellStart"/>
+      <w:r>
+        <w:rPr>
+          <w:lang w:eastAsia="cs-CZ"/>
+        </w:rPr>
+        <w:t>nární</w:t>
+      </w:r>
+      <w:proofErr w:type="spellEnd"/>
+      <w:r>
+        <w:rPr>
+          <w:lang w:eastAsia="cs-CZ"/>
+        </w:rPr>
+        <w:t xml:space="preserve"> strom</w:t>
+      </w:r>
+      <w:bookmarkEnd w:id="20"/>
     </w:p>
     <w:p>
       <w:pPr>
@@ -8740,116 +9845,42 @@
           <w:lang w:eastAsia="cs-CZ"/>
         </w:rPr>
       </w:pPr>
-      <w:r>
-        <w:rPr>
-          <w:lang w:eastAsia="cs-CZ"/>
-        </w:rPr>
-        <w:t>Základním způsobem</w:t>
-      </w:r>
-      <w:r>
-        <w:rPr>
-          <w:lang w:eastAsia="cs-CZ"/>
-        </w:rPr>
-        <w:t>,</w:t>
-      </w:r>
-      <w:r>
-        <w:rPr>
-          <w:lang w:eastAsia="cs-CZ"/>
-        </w:rPr>
-        <w:t xml:space="preserve"> jak vytvořit tenzor je použít konstruktor přijímající jeden </w:t>
-      </w:r>
-      <w:proofErr w:type="spellStart"/>
-      <w:proofErr w:type="gramStart"/>
-      <w:r>
-        <w:rPr>
-          <w:lang w:eastAsia="cs-CZ"/>
-        </w:rPr>
-        <w:t>std</w:t>
-      </w:r>
-      <w:proofErr w:type="spellEnd"/>
-      <w:r>
-        <w:rPr>
-          <w:lang w:eastAsia="cs-CZ"/>
-        </w:rPr>
-        <w:t>::</w:t>
-      </w:r>
-      <w:proofErr w:type="spellStart"/>
-      <w:proofErr w:type="gramEnd"/>
-      <w:r>
-        <w:rPr>
-          <w:lang w:eastAsia="cs-CZ"/>
-        </w:rPr>
-        <w:t>ve</w:t>
-      </w:r>
-      <w:r>
-        <w:rPr>
-          <w:lang w:eastAsia="cs-CZ"/>
-        </w:rPr>
-        <w:t>c</w:t>
-      </w:r>
-      <w:r>
-        <w:rPr>
-          <w:lang w:eastAsia="cs-CZ"/>
-        </w:rPr>
-        <w:t>tor</w:t>
-      </w:r>
-      <w:proofErr w:type="spellEnd"/>
-      <w:r>
-        <w:rPr>
-          <w:lang w:eastAsia="cs-CZ"/>
-        </w:rPr>
-        <w:t>&lt;uint64_t&gt;</w:t>
-      </w:r>
-      <w:r>
-        <w:rPr>
-          <w:lang w:eastAsia="cs-CZ"/>
-        </w:rPr>
-        <w:t>.</w:t>
-      </w:r>
-      <w:r>
-        <w:rPr>
-          <w:lang w:eastAsia="cs-CZ"/>
-        </w:rPr>
-        <w:t xml:space="preserve"> Ten vektor obsahuje velikosti dimenzí. V konstruktoru se nakopíruje do vektoru pro udržování velikostí dimenzí a poté se spustí metoda </w:t>
-      </w:r>
-      <w:proofErr w:type="gramStart"/>
-      <w:r>
-        <w:rPr>
-          <w:lang w:eastAsia="cs-CZ"/>
-        </w:rPr>
-        <w:t>update(</w:t>
-      </w:r>
-      <w:proofErr w:type="gramEnd"/>
-      <w:r>
-        <w:rPr>
-          <w:lang w:eastAsia="cs-CZ"/>
-        </w:rPr>
-        <w:t>), která vypočítá potřebné místo k alokaci tenzoru</w:t>
-      </w:r>
-      <w:r>
-        <w:rPr>
-          <w:lang w:eastAsia="cs-CZ"/>
-        </w:rPr>
-        <w:t>,</w:t>
-      </w:r>
-      <w:r>
-        <w:rPr>
-          <w:lang w:eastAsia="cs-CZ"/>
-        </w:rPr>
-        <w:t xml:space="preserve"> a to místo skutečně alokuje na lineárním kontejneru.</w:t>
-      </w:r>
-      <w:r>
-        <w:rPr>
-          <w:lang w:eastAsia="cs-CZ"/>
-        </w:rPr>
-        <w:t xml:space="preserve"> Poté také aktualizuje/vypočítá strukturální optimalizační data závislá na velikostech dimenze jako například vektor kumulativních </w:t>
-      </w:r>
-      <w:r>
-        <w:rPr>
-          <w:lang w:eastAsia="cs-CZ"/>
-        </w:rPr>
-        <w:t>součinů předchozích velikostí dimenzí.</w:t>
-      </w:r>
+      <w:proofErr w:type="spellStart"/>
+      <w:r>
+        <w:rPr>
+          <w:lang w:eastAsia="cs-CZ"/>
+        </w:rPr>
+        <w:t>Xxx</w:t>
+      </w:r>
+      <w:proofErr w:type="spellEnd"/>
+    </w:p>
+    <w:p>
+      <w:pPr>
+        <w:pStyle w:val="Nadpis2"/>
+        <w:rPr>
+          <w:lang w:eastAsia="cs-CZ"/>
+        </w:rPr>
+      </w:pPr>
+      <w:bookmarkStart w:id="21" w:name="_Toc229768707"/>
+      <w:r>
+        <w:rPr>
+          <w:lang w:eastAsia="cs-CZ"/>
+        </w:rPr>
+        <w:t>2.</w:t>
+      </w:r>
+      <w:r>
+        <w:rPr>
+          <w:lang w:eastAsia="cs-CZ"/>
+        </w:rPr>
+        <w:t>3</w:t>
+      </w:r>
+      <w:r>
+        <w:rPr>
+          <w:lang w:eastAsia="cs-CZ"/>
+        </w:rPr>
+        <w:t xml:space="preserve"> Testy</w:t>
+      </w:r>
+      <w:bookmarkEnd w:id="21"/>
     </w:p>
     <w:p>
       <w:pPr>
@@ -8858,6 +9889,143 @@
           <w:lang w:eastAsia="cs-CZ"/>
         </w:rPr>
       </w:pPr>
+      <w:r>
+        <w:rPr>
+          <w:lang w:eastAsia="cs-CZ"/>
+        </w:rPr>
+        <w:t xml:space="preserve">Testy byly uskutečněny pomocí </w:t>
+      </w:r>
+      <w:proofErr w:type="spellStart"/>
+      <w:r>
+        <w:rPr>
+          <w:lang w:eastAsia="cs-CZ"/>
+        </w:rPr>
+        <w:t>GoogleTest</w:t>
+      </w:r>
+      <w:proofErr w:type="spellEnd"/>
+      <w:r>
+        <w:rPr>
+          <w:lang w:eastAsia="cs-CZ"/>
+        </w:rPr>
+        <w:t xml:space="preserve"> frameworku.</w:t>
+      </w:r>
+      <w:r>
+        <w:rPr>
+          <w:lang w:eastAsia="cs-CZ"/>
+        </w:rPr>
+        <w:t xml:space="preserve"> Testy jsou ve složce „test“ ve které je složka „</w:t>
+      </w:r>
+      <w:proofErr w:type="spellStart"/>
+      <w:r>
+        <w:rPr>
+          <w:lang w:eastAsia="cs-CZ"/>
+        </w:rPr>
+        <w:t>src</w:t>
+      </w:r>
+      <w:proofErr w:type="spellEnd"/>
+      <w:r>
+        <w:rPr>
+          <w:lang w:eastAsia="cs-CZ"/>
+        </w:rPr>
+        <w:t xml:space="preserve">“ ve které je struktura </w:t>
+      </w:r>
+      <w:r>
+        <w:rPr>
+          <w:lang w:eastAsia="cs-CZ"/>
+        </w:rPr>
+        <w:t>kopírující</w:t>
+      </w:r>
+      <w:r>
+        <w:rPr>
+          <w:lang w:eastAsia="cs-CZ"/>
+        </w:rPr>
+        <w:t xml:space="preserve"> strukturu projektu.</w:t>
+      </w:r>
+      <w:r>
+        <w:rPr>
+          <w:lang w:eastAsia="cs-CZ"/>
+        </w:rPr>
+        <w:t xml:space="preserve"> Na místech zdrojových kódu, které jsou </w:t>
+      </w:r>
+      <w:r>
+        <w:rPr>
+          <w:lang w:eastAsia="cs-CZ"/>
+        </w:rPr>
+        <w:t xml:space="preserve">unit </w:t>
+      </w:r>
+      <w:r>
+        <w:rPr>
+          <w:lang w:eastAsia="cs-CZ"/>
+        </w:rPr>
+        <w:t>testovány tam ovšem jsou soubory s testy podle jmenné konvence: „jméno původního souboru + _test + .</w:t>
+      </w:r>
+      <w:proofErr w:type="spellStart"/>
+      <w:r>
+        <w:rPr>
+          <w:lang w:eastAsia="cs-CZ"/>
+        </w:rPr>
+        <w:t>cpp</w:t>
+      </w:r>
+      <w:proofErr w:type="spellEnd"/>
+      <w:r>
+        <w:rPr>
+          <w:lang w:eastAsia="cs-CZ"/>
+        </w:rPr>
+        <w:t>“.</w:t>
+      </w:r>
+      <w:r>
+        <w:rPr>
+          <w:lang w:eastAsia="cs-CZ"/>
+        </w:rPr>
+        <w:t xml:space="preserve"> Pro zátěžové testy je konvence stejná, jenom místo „_test“ je nahrazeno „_stress“.</w:t>
+      </w:r>
+    </w:p>
+    <w:p>
+      <w:pPr>
+        <w:spacing w:line="360" w:lineRule="auto"/>
+        <w:rPr>
+          <w:lang w:eastAsia="cs-CZ"/>
+        </w:rPr>
+      </w:pPr>
+      <w:r>
+        <w:rPr>
+          <w:lang w:eastAsia="cs-CZ"/>
+        </w:rPr>
+        <w:t xml:space="preserve">V obou typech testů (unit i zátěž) bylo na začátku, těsně před vložením hlavičkového souboru „Tensor.hpp“ </w:t>
+      </w:r>
+      <w:r>
+        <w:rPr>
+          <w:lang w:eastAsia="cs-CZ"/>
+        </w:rPr>
+        <w:t xml:space="preserve">definováno makro, které ihned po vložení tohoto hlavičkového souboru </w:t>
+      </w:r>
+      <w:r>
+        <w:rPr>
+          <w:lang w:eastAsia="cs-CZ"/>
+        </w:rPr>
+        <w:lastRenderedPageBreak/>
+        <w:t>oddefinováno.</w:t>
+      </w:r>
+      <w:r>
+        <w:rPr>
+          <w:lang w:eastAsia="cs-CZ"/>
+        </w:rPr>
+        <w:t xml:space="preserve"> Toto makro zaměňuje klíčové slovo C++ „</w:t>
+      </w:r>
+      <w:proofErr w:type="spellStart"/>
+      <w:r>
+        <w:rPr>
+          <w:lang w:eastAsia="cs-CZ"/>
+        </w:rPr>
+        <w:t>private</w:t>
+      </w:r>
+      <w:proofErr w:type="spellEnd"/>
+      <w:r>
+        <w:rPr>
+          <w:lang w:eastAsia="cs-CZ"/>
+        </w:rPr>
+        <w:t>“ za „public“ a tím pádem pro testy odkrývá privátní členy třídy k jejich otestování.</w:t>
+      </w:r>
     </w:p>
     <w:p>
       <w:pPr>
@@ -8866,7 +10034,7 @@
           <w:lang w:eastAsia="cs-CZ"/>
         </w:rPr>
       </w:pPr>
-      <w:bookmarkStart w:id="15" w:name="_Toc227522092"/>
+      <w:bookmarkStart w:id="22" w:name="_Toc229768708"/>
       <w:r>
         <w:rPr>
           <w:lang w:eastAsia="cs-CZ"/>
@@ -8877,21 +10045,15 @@
         <w:rPr>
           <w:lang w:eastAsia="cs-CZ"/>
         </w:rPr>
-        <w:t>2</w:t>
-      </w:r>
-      <w:r>
-        <w:rPr>
-          <w:lang w:eastAsia="cs-CZ"/>
-        </w:rPr>
-        <w:t>.3</w:t>
-      </w:r>
-      <w:r>
-        <w:rPr>
-          <w:lang w:eastAsia="cs-CZ"/>
-        </w:rPr>
-        <w:t xml:space="preserve"> Paralelní tenzor</w:t>
-      </w:r>
-      <w:bookmarkEnd w:id="15"/>
+        <w:t>3</w:t>
+      </w:r>
+      <w:r>
+        <w:rPr>
+          <w:lang w:eastAsia="cs-CZ"/>
+        </w:rPr>
+        <w:t>.1 Unit testování</w:t>
+      </w:r>
+      <w:bookmarkEnd w:id="22"/>
     </w:p>
     <w:p>
       <w:pPr>
@@ -8916,33 +10078,26 @@
           <w:lang w:eastAsia="cs-CZ"/>
         </w:rPr>
       </w:pPr>
-      <w:bookmarkStart w:id="16" w:name="_Toc227522093"/>
-      <w:r>
-        <w:rPr>
-          <w:lang w:eastAsia="cs-CZ"/>
-        </w:rPr>
-        <w:lastRenderedPageBreak/>
+      <w:bookmarkStart w:id="23" w:name="_Toc229768709"/>
+      <w:r>
+        <w:rPr>
+          <w:lang w:eastAsia="cs-CZ"/>
+        </w:rPr>
         <w:t>2.</w:t>
       </w:r>
       <w:r>
         <w:rPr>
           <w:lang w:eastAsia="cs-CZ"/>
         </w:rPr>
-        <w:t>2</w:t>
-      </w:r>
-      <w:r>
-        <w:rPr>
-          <w:lang w:eastAsia="cs-CZ"/>
-        </w:rPr>
-        <w:t>.4</w:t>
-      </w:r>
-      <w:r>
-        <w:rPr>
-          <w:lang w:eastAsia="cs-CZ"/>
-        </w:rPr>
-        <w:t xml:space="preserve"> Matice</w:t>
-      </w:r>
-      <w:bookmarkEnd w:id="16"/>
+        <w:t>3</w:t>
+      </w:r>
+      <w:r>
+        <w:rPr>
+          <w:lang w:eastAsia="cs-CZ"/>
+        </w:rPr>
+        <w:t>.2 Zátěžové testování</w:t>
+      </w:r>
+      <w:bookmarkEnd w:id="23"/>
     </w:p>
     <w:p>
       <w:pPr>
@@ -8962,374 +10117,6 @@
     </w:p>
     <w:p>
       <w:pPr>
-        <w:pStyle w:val="Nadpis3"/>
-        <w:rPr>
-          <w:lang w:eastAsia="cs-CZ"/>
-        </w:rPr>
-      </w:pPr>
-      <w:bookmarkStart w:id="17" w:name="_Toc227522094"/>
-      <w:r>
-        <w:rPr>
-          <w:lang w:eastAsia="cs-CZ"/>
-        </w:rPr>
-        <w:t>2.</w:t>
-      </w:r>
-      <w:r>
-        <w:rPr>
-          <w:lang w:eastAsia="cs-CZ"/>
-        </w:rPr>
-        <w:t>2</w:t>
-      </w:r>
-      <w:r>
-        <w:rPr>
-          <w:lang w:eastAsia="cs-CZ"/>
-        </w:rPr>
-        <w:t>.</w:t>
-      </w:r>
-      <w:r>
-        <w:rPr>
-          <w:lang w:eastAsia="cs-CZ"/>
-        </w:rPr>
-        <w:t>5 Paralelní matice</w:t>
-      </w:r>
-      <w:bookmarkEnd w:id="17"/>
-    </w:p>
-    <w:p>
-      <w:pPr>
-        <w:spacing w:line="360" w:lineRule="auto"/>
-        <w:rPr>
-          <w:lang w:eastAsia="cs-CZ"/>
-        </w:rPr>
-      </w:pPr>
-      <w:proofErr w:type="spellStart"/>
-      <w:r>
-        <w:rPr>
-          <w:lang w:eastAsia="cs-CZ"/>
-        </w:rPr>
-        <w:t>Xxx</w:t>
-      </w:r>
-      <w:proofErr w:type="spellEnd"/>
-    </w:p>
-    <w:p>
-      <w:pPr>
-        <w:pStyle w:val="Nadpis3"/>
-        <w:rPr>
-          <w:lang w:eastAsia="cs-CZ"/>
-        </w:rPr>
-      </w:pPr>
-      <w:bookmarkStart w:id="18" w:name="_Toc227522095"/>
-      <w:r>
-        <w:rPr>
-          <w:lang w:eastAsia="cs-CZ"/>
-        </w:rPr>
-        <w:t>2.</w:t>
-      </w:r>
-      <w:r>
-        <w:rPr>
-          <w:lang w:eastAsia="cs-CZ"/>
-        </w:rPr>
-        <w:t>2</w:t>
-      </w:r>
-      <w:r>
-        <w:rPr>
-          <w:lang w:eastAsia="cs-CZ"/>
-        </w:rPr>
-        <w:t>.</w:t>
-      </w:r>
-      <w:r>
-        <w:rPr>
-          <w:lang w:eastAsia="cs-CZ"/>
-        </w:rPr>
-        <w:t>6 N-</w:t>
-      </w:r>
-      <w:proofErr w:type="spellStart"/>
-      <w:r>
-        <w:rPr>
-          <w:lang w:eastAsia="cs-CZ"/>
-        </w:rPr>
-        <w:t>nární</w:t>
-      </w:r>
-      <w:proofErr w:type="spellEnd"/>
-      <w:r>
-        <w:rPr>
-          <w:lang w:eastAsia="cs-CZ"/>
-        </w:rPr>
-        <w:t xml:space="preserve"> strom</w:t>
-      </w:r>
-      <w:bookmarkEnd w:id="18"/>
-    </w:p>
-    <w:p>
-      <w:pPr>
-        <w:spacing w:line="360" w:lineRule="auto"/>
-        <w:rPr>
-          <w:lang w:eastAsia="cs-CZ"/>
-        </w:rPr>
-      </w:pPr>
-      <w:proofErr w:type="spellStart"/>
-      <w:r>
-        <w:rPr>
-          <w:lang w:eastAsia="cs-CZ"/>
-        </w:rPr>
-        <w:t>Xxx</w:t>
-      </w:r>
-      <w:proofErr w:type="spellEnd"/>
-    </w:p>
-    <w:p>
-      <w:pPr>
-        <w:pStyle w:val="Nadpis2"/>
-        <w:rPr>
-          <w:lang w:eastAsia="cs-CZ"/>
-        </w:rPr>
-      </w:pPr>
-      <w:bookmarkStart w:id="19" w:name="_Toc227522096"/>
-      <w:r>
-        <w:rPr>
-          <w:lang w:eastAsia="cs-CZ"/>
-        </w:rPr>
-        <w:t>2.</w:t>
-      </w:r>
-      <w:r>
-        <w:rPr>
-          <w:lang w:eastAsia="cs-CZ"/>
-        </w:rPr>
-        <w:t>3</w:t>
-      </w:r>
-      <w:r>
-        <w:rPr>
-          <w:lang w:eastAsia="cs-CZ"/>
-        </w:rPr>
-        <w:t xml:space="preserve"> Testy</w:t>
-      </w:r>
-      <w:bookmarkEnd w:id="19"/>
-    </w:p>
-    <w:p>
-      <w:pPr>
-        <w:spacing w:line="360" w:lineRule="auto"/>
-        <w:rPr>
-          <w:lang w:eastAsia="cs-CZ"/>
-        </w:rPr>
-      </w:pPr>
-      <w:r>
-        <w:rPr>
-          <w:lang w:eastAsia="cs-CZ"/>
-        </w:rPr>
-        <w:t xml:space="preserve">Testy byly uskutečněny pomocí </w:t>
-      </w:r>
-      <w:proofErr w:type="spellStart"/>
-      <w:r>
-        <w:rPr>
-          <w:lang w:eastAsia="cs-CZ"/>
-        </w:rPr>
-        <w:t>GoogleTest</w:t>
-      </w:r>
-      <w:proofErr w:type="spellEnd"/>
-      <w:r>
-        <w:rPr>
-          <w:lang w:eastAsia="cs-CZ"/>
-        </w:rPr>
-        <w:t xml:space="preserve"> frameworku.</w:t>
-      </w:r>
-      <w:r>
-        <w:rPr>
-          <w:lang w:eastAsia="cs-CZ"/>
-        </w:rPr>
-        <w:t xml:space="preserve"> Testy jsou ve složce „test“ ve které je složka „</w:t>
-      </w:r>
-      <w:proofErr w:type="spellStart"/>
-      <w:r>
-        <w:rPr>
-          <w:lang w:eastAsia="cs-CZ"/>
-        </w:rPr>
-        <w:t>src</w:t>
-      </w:r>
-      <w:proofErr w:type="spellEnd"/>
-      <w:r>
-        <w:rPr>
-          <w:lang w:eastAsia="cs-CZ"/>
-        </w:rPr>
-        <w:t xml:space="preserve">“ ve které je struktura </w:t>
-      </w:r>
-      <w:r>
-        <w:rPr>
-          <w:lang w:eastAsia="cs-CZ"/>
-        </w:rPr>
-        <w:t>kopírující</w:t>
-      </w:r>
-      <w:r>
-        <w:rPr>
-          <w:lang w:eastAsia="cs-CZ"/>
-        </w:rPr>
-        <w:t xml:space="preserve"> strukturu projektu.</w:t>
-      </w:r>
-      <w:r>
-        <w:rPr>
-          <w:lang w:eastAsia="cs-CZ"/>
-        </w:rPr>
-        <w:t xml:space="preserve"> Na místech zdrojových kódu, které jsou </w:t>
-      </w:r>
-      <w:r>
-        <w:rPr>
-          <w:lang w:eastAsia="cs-CZ"/>
-        </w:rPr>
-        <w:t xml:space="preserve">unit </w:t>
-      </w:r>
-      <w:r>
-        <w:rPr>
-          <w:lang w:eastAsia="cs-CZ"/>
-        </w:rPr>
-        <w:t>testovány tam ovšem jsou soubory s testy podle jmenné konvence: „jméno původního souboru + _test + .</w:t>
-      </w:r>
-      <w:proofErr w:type="spellStart"/>
-      <w:r>
-        <w:rPr>
-          <w:lang w:eastAsia="cs-CZ"/>
-        </w:rPr>
-        <w:t>cpp</w:t>
-      </w:r>
-      <w:proofErr w:type="spellEnd"/>
-      <w:r>
-        <w:rPr>
-          <w:lang w:eastAsia="cs-CZ"/>
-        </w:rPr>
-        <w:t>“.</w:t>
-      </w:r>
-      <w:r>
-        <w:rPr>
-          <w:lang w:eastAsia="cs-CZ"/>
-        </w:rPr>
-        <w:t xml:space="preserve"> Pro zátěžové testy je konvence stejná, jenom místo „_test“ je nahrazeno „_stress“.</w:t>
-      </w:r>
-    </w:p>
-    <w:p>
-      <w:pPr>
-        <w:spacing w:line="360" w:lineRule="auto"/>
-        <w:rPr>
-          <w:lang w:eastAsia="cs-CZ"/>
-        </w:rPr>
-      </w:pPr>
-      <w:r>
-        <w:rPr>
-          <w:lang w:eastAsia="cs-CZ"/>
-        </w:rPr>
-        <w:t xml:space="preserve">V obou typech testů (unit i zátěž) bylo na začátku, těsně před vložením hlavičkového souboru „Tensor.hpp“ </w:t>
-      </w:r>
-      <w:r>
-        <w:rPr>
-          <w:lang w:eastAsia="cs-CZ"/>
-        </w:rPr>
-        <w:t>definováno makro, které ihned po vložení tohoto hlavičkového souboru oddefinováno.</w:t>
-      </w:r>
-      <w:r>
-        <w:rPr>
-          <w:lang w:eastAsia="cs-CZ"/>
-        </w:rPr>
-        <w:t xml:space="preserve"> Toto makro zaměňuje klíčové slovo C++ „</w:t>
-      </w:r>
-      <w:proofErr w:type="spellStart"/>
-      <w:r>
-        <w:rPr>
-          <w:lang w:eastAsia="cs-CZ"/>
-        </w:rPr>
-        <w:t>private</w:t>
-      </w:r>
-      <w:proofErr w:type="spellEnd"/>
-      <w:r>
-        <w:rPr>
-          <w:lang w:eastAsia="cs-CZ"/>
-        </w:rPr>
-        <w:t>“ za „public“ a tím pádem pro testy odkrývá privátní členy třídy k jejich otestování.</w:t>
-      </w:r>
-    </w:p>
-    <w:p>
-      <w:pPr>
-        <w:pStyle w:val="Nadpis3"/>
-        <w:rPr>
-          <w:lang w:eastAsia="cs-CZ"/>
-        </w:rPr>
-      </w:pPr>
-      <w:bookmarkStart w:id="20" w:name="_Toc227522097"/>
-      <w:r>
-        <w:rPr>
-          <w:lang w:eastAsia="cs-CZ"/>
-        </w:rPr>
-        <w:t>2.</w:t>
-      </w:r>
-      <w:r>
-        <w:rPr>
-          <w:lang w:eastAsia="cs-CZ"/>
-        </w:rPr>
-        <w:t>3</w:t>
-      </w:r>
-      <w:r>
-        <w:rPr>
-          <w:lang w:eastAsia="cs-CZ"/>
-        </w:rPr>
-        <w:t>.1 Unit testování</w:t>
-      </w:r>
-      <w:bookmarkEnd w:id="20"/>
-    </w:p>
-    <w:p>
-      <w:pPr>
-        <w:spacing w:line="360" w:lineRule="auto"/>
-        <w:rPr>
-          <w:lang w:eastAsia="cs-CZ"/>
-        </w:rPr>
-      </w:pPr>
-      <w:proofErr w:type="spellStart"/>
-      <w:r>
-        <w:rPr>
-          <w:lang w:eastAsia="cs-CZ"/>
-        </w:rPr>
-        <w:t>Xxx</w:t>
-      </w:r>
-      <w:proofErr w:type="spellEnd"/>
-    </w:p>
-    <w:p>
-      <w:pPr>
-        <w:pStyle w:val="Nadpis3"/>
-        <w:rPr>
-          <w:lang w:eastAsia="cs-CZ"/>
-        </w:rPr>
-      </w:pPr>
-      <w:bookmarkStart w:id="21" w:name="_Toc227522098"/>
-      <w:r>
-        <w:rPr>
-          <w:lang w:eastAsia="cs-CZ"/>
-        </w:rPr>
-        <w:t>2.</w:t>
-      </w:r>
-      <w:r>
-        <w:rPr>
-          <w:lang w:eastAsia="cs-CZ"/>
-        </w:rPr>
-        <w:t>3</w:t>
-      </w:r>
-      <w:r>
-        <w:rPr>
-          <w:lang w:eastAsia="cs-CZ"/>
-        </w:rPr>
-        <w:t>.2 Zátěžové testování</w:t>
-      </w:r>
-      <w:bookmarkEnd w:id="21"/>
-    </w:p>
-    <w:p>
-      <w:pPr>
-        <w:spacing w:line="360" w:lineRule="auto"/>
-        <w:rPr>
-          <w:lang w:eastAsia="cs-CZ"/>
-        </w:rPr>
-      </w:pPr>
-      <w:proofErr w:type="spellStart"/>
-      <w:r>
-        <w:rPr>
-          <w:lang w:eastAsia="cs-CZ"/>
-        </w:rPr>
-        <w:t>Xxx</w:t>
-      </w:r>
-      <w:proofErr w:type="spellEnd"/>
-    </w:p>
-    <w:p>
-      <w:pPr>
         <w:spacing w:after="0" w:line="240" w:lineRule="auto"/>
         <w:rPr>
           <w:noProof/>
@@ -9350,12 +10137,12 @@
       <w:pPr>
         <w:pStyle w:val="Nadpis1"/>
       </w:pPr>
-      <w:bookmarkStart w:id="22" w:name="_Toc227522099"/>
+      <w:bookmarkStart w:id="24" w:name="_Toc229768710"/>
       <w:r>
         <w:lastRenderedPageBreak/>
         <w:t>3 TEORETICKÉ VYUŽITÍ</w:t>
       </w:r>
-      <w:bookmarkEnd w:id="22"/>
+      <w:bookmarkEnd w:id="24"/>
     </w:p>
     <w:p>
       <w:proofErr w:type="spellStart"/>
@@ -9382,7 +10169,7 @@
           <w:szCs w:val="24"/>
         </w:rPr>
       </w:pPr>
-      <w:bookmarkStart w:id="23" w:name="_Toc227521731"/>
+      <w:bookmarkStart w:id="25" w:name="_Toc227521731"/>
       <w:r>
         <w:rPr>
           <w:i w:val="0"/>
@@ -9457,7 +10244,7 @@
         </w:rPr>
         <w:t>Vzdělanostní struktura obyvatelstva České republiky (2021)</w:t>
       </w:r>
-      <w:bookmarkEnd w:id="23"/>
+      <w:bookmarkEnd w:id="25"/>
     </w:p>
     <w:tbl>
       <w:tblPr>
@@ -10092,8 +10879,8 @@
         </w:rPr>
         <w:t>: Balonky (Min, 2016</w:t>
       </w:r>
-      <w:bookmarkStart w:id="24" w:name="_Toc24458948"/>
-      <w:bookmarkStart w:id="25" w:name="_Toc24459062"/>
+      <w:bookmarkStart w:id="26" w:name="_Toc24458948"/>
+      <w:bookmarkStart w:id="27" w:name="_Toc24459062"/>
       <w:r>
         <w:rPr>
           <w:i w:val="0"/>
@@ -10101,8 +10888,8 @@
         </w:rPr>
         <w:t>)</w:t>
       </w:r>
-      <w:bookmarkEnd w:id="24"/>
-      <w:bookmarkEnd w:id="25"/>
+      <w:bookmarkEnd w:id="26"/>
+      <w:bookmarkEnd w:id="27"/>
       <w:r>
         <w:rPr>
           <w:i w:val="0"/>
@@ -10121,12 +10908,12 @@
         </w:rPr>
         <w:br w:type="page"/>
       </w:r>
-      <w:bookmarkStart w:id="26" w:name="_Toc227522100"/>
+      <w:bookmarkStart w:id="28" w:name="_Toc229768711"/>
       <w:r>
         <w:lastRenderedPageBreak/>
         <w:t>ZÁVĚR</w:t>
       </w:r>
-      <w:bookmarkEnd w:id="26"/>
+      <w:bookmarkEnd w:id="28"/>
     </w:p>
     <w:p>
       <w:pPr>
@@ -10300,12 +11087,12 @@
       <w:r>
         <w:br w:type="page"/>
       </w:r>
-      <w:bookmarkStart w:id="27" w:name="_Toc227522101"/>
+      <w:bookmarkStart w:id="29" w:name="_Toc229768712"/>
       <w:r>
         <w:lastRenderedPageBreak/>
         <w:t>POUŽITÁ LITERATURA</w:t>
       </w:r>
-      <w:bookmarkEnd w:id="27"/>
+      <w:bookmarkEnd w:id="29"/>
     </w:p>
     <w:p>
       <w:pPr>
@@ -10676,12 +11463,12 @@
       <w:r>
         <w:br w:type="page"/>
       </w:r>
-      <w:bookmarkStart w:id="28" w:name="_Toc227522102"/>
+      <w:bookmarkStart w:id="30" w:name="_Toc229768713"/>
       <w:r>
         <w:lastRenderedPageBreak/>
         <w:t>SEZNAM PŘÍLOH</w:t>
       </w:r>
-      <w:bookmarkEnd w:id="28"/>
+      <w:bookmarkEnd w:id="30"/>
     </w:p>
     <w:p>
       <w:pPr>
@@ -10928,6 +11715,181 @@
 <file path=word/numbering.xml><?xml version="1.0" encoding="utf-8"?>
 <w:numbering xmlns:wpc="http://schemas.microsoft.com/office/word/2010/wordprocessingCanvas" xmlns:cx="http://schemas.microsoft.com/office/drawing/2014/chartex" xmlns:cx1="http://schemas.microsoft.com/office/drawing/2015/9/8/chartex" xmlns:cx2="http://schemas.microsoft.com/office/drawing/2015/10/21/chartex" xmlns:cx3="http://schemas.microsoft.com/office/drawing/2016/5/9/chartex" xmlns:cx4="http://schemas.microsoft.com/office/drawing/2016/5/10/chartex" xmlns:cx5="http://schemas.microsoft.com/office/drawing/2016/5/11/chartex" xmlns:cx6="http://schemas.microsoft.com/office/drawing/2016/5/12/chartex" xmlns:cx7="http://schemas.microsoft.com/office/drawing/2016/5/13/chartex" xmlns:cx8="http://schemas.microsoft.com/office/drawing/2016/5/14/chartex" xmlns:mc="http://schemas.openxmlformats.org/markup-compatibility/2006" xmlns:aink="http://schemas.microsoft.com/office/drawing/2016/ink" xmlns:am3d="http://schemas.microsoft.com/office/drawing/2017/model3d" xmlns:o="urn:schemas-microsoft-com:office:office" xmlns:oel="http://schemas.microsoft.com/office/2019/extlst" xmlns:r="http://schemas.openxmlformats.org/officeDocument/2006/relationships" xmlns:m="http://schemas.openxmlformats.org/officeDocument/2006/math" xmlns:v="urn:schemas-microsoft-com:vml" xmlns:wp14="http://schemas.microsoft.com/office/word/2010/wordprocessingDrawing" xmlns:wp="http://schemas.openxmlformats.org/drawingml/2006/wordprocessingDrawing" xmlns:w10="urn:schemas-microsoft-com:office:word" xmlns:w="http://schemas.openxmlformats.org/wordprocessingml/2006/main" xmlns:w14="http://schemas.microsoft.com/office/word/2010/wordml" xmlns:w15="http://schemas.microsoft.com/office/word/2012/wordml" xmlns:w16cex="http://schemas.microsoft.com/office/word/2018/wordml/cex" xmlns:w16cid="http://schemas.microsoft.com/office/word/2016/wordml/cid" xmlns:w16="http://schemas.microsoft.com/office/word/2018/wordml" xmlns:w16du="http://schemas.microsoft.com/office/word/2023/wordml/word16du" xmlns:w16sdtdh="http://schemas.microsoft.com/office/word/2020/wordml/sdtdatahash" xmlns:w16sdtfl="http://schemas.microsoft.com/office/word/2024/wordml/sdtformatlock" xmlns:w16se="http://schemas.microsoft.com/office/word/2015/wordml/symex" xmlns:wpg="http://schemas.microsoft.com/office/word/2010/wordprocessingGroup" xmlns:wpi="http://schemas.microsoft.com/office/word/2010/wordprocessingInk" xmlns:wne="http://schemas.microsoft.com/office/word/2006/wordml" xmlns:wps="http://schemas.microsoft.com/office/word/2010/wordprocessingShape" mc:Ignorable="w14 w15 w16se w16cid w16 w16cex w16sdtdh w16sdtfl w16du wp14">
   <w:abstractNum w:abstractNumId="0" w15:restartNumberingAfterBreak="0">
+    <w:nsid w:val="0852758B"/>
+    <w:multiLevelType w:val="hybridMultilevel"/>
+    <w:tmpl w:val="555E8D38"/>
+    <w:lvl w:ilvl="0" w:tplc="1000000F">
+      <w:start w:val="1"/>
+      <w:numFmt w:val="decimal"/>
+      <w:lvlText w:val="%1."/>
+      <w:lvlJc w:val="left"/>
+      <w:pPr>
+        <w:ind w:left="720" w:hanging="360"/>
+      </w:pPr>
+    </w:lvl>
+    <w:lvl w:ilvl="1" w:tplc="10000019" w:tentative="1">
+      <w:start w:val="1"/>
+      <w:numFmt w:val="lowerLetter"/>
+      <w:lvlText w:val="%2."/>
+      <w:lvlJc w:val="left"/>
+      <w:pPr>
+        <w:ind w:left="1440" w:hanging="360"/>
+      </w:pPr>
+    </w:lvl>
+    <w:lvl w:ilvl="2" w:tplc="1000001B" w:tentative="1">
+      <w:start w:val="1"/>
+      <w:numFmt w:val="lowerRoman"/>
+      <w:lvlText w:val="%3."/>
+      <w:lvlJc w:val="right"/>
+      <w:pPr>
+        <w:ind w:left="2160" w:hanging="180"/>
+      </w:pPr>
+    </w:lvl>
+    <w:lvl w:ilvl="3" w:tplc="1000000F" w:tentative="1">
+      <w:start w:val="1"/>
+      <w:numFmt w:val="decimal"/>
+      <w:lvlText w:val="%4."/>
+      <w:lvlJc w:val="left"/>
+      <w:pPr>
+        <w:ind w:left="2880" w:hanging="360"/>
+      </w:pPr>
+    </w:lvl>
+    <w:lvl w:ilvl="4" w:tplc="10000019" w:tentative="1">
+      <w:start w:val="1"/>
+      <w:numFmt w:val="lowerLetter"/>
+      <w:lvlText w:val="%5."/>
+      <w:lvlJc w:val="left"/>
+      <w:pPr>
+        <w:ind w:left="3600" w:hanging="360"/>
+      </w:pPr>
+    </w:lvl>
+    <w:lvl w:ilvl="5" w:tplc="1000001B" w:tentative="1">
+      <w:start w:val="1"/>
+      <w:numFmt w:val="lowerRoman"/>
+      <w:lvlText w:val="%6."/>
+      <w:lvlJc w:val="right"/>
+      <w:pPr>
+        <w:ind w:left="4320" w:hanging="180"/>
+      </w:pPr>
+    </w:lvl>
+    <w:lvl w:ilvl="6" w:tplc="1000000F" w:tentative="1">
+      <w:start w:val="1"/>
+      <w:numFmt w:val="decimal"/>
+      <w:lvlText w:val="%7."/>
+      <w:lvlJc w:val="left"/>
+      <w:pPr>
+        <w:ind w:left="5040" w:hanging="360"/>
+      </w:pPr>
+    </w:lvl>
+    <w:lvl w:ilvl="7" w:tplc="10000019" w:tentative="1">
+      <w:start w:val="1"/>
+      <w:numFmt w:val="lowerLetter"/>
+      <w:lvlText w:val="%8."/>
+      <w:lvlJc w:val="left"/>
+      <w:pPr>
+        <w:ind w:left="5760" w:hanging="360"/>
+      </w:pPr>
+    </w:lvl>
+    <w:lvl w:ilvl="8" w:tplc="1000001B" w:tentative="1">
+      <w:start w:val="1"/>
+      <w:numFmt w:val="lowerRoman"/>
+      <w:lvlText w:val="%9."/>
+      <w:lvlJc w:val="right"/>
+      <w:pPr>
+        <w:ind w:left="6480" w:hanging="180"/>
+      </w:pPr>
+    </w:lvl>
+  </w:abstractNum>
+  <w:abstractNum w:abstractNumId="1" w15:restartNumberingAfterBreak="0">
+    <w:nsid w:val="12934C2F"/>
+    <w:multiLevelType w:val="hybridMultilevel"/>
+    <w:tmpl w:val="D5743A56"/>
+    <w:lvl w:ilvl="0" w:tplc="1000000F">
+      <w:start w:val="1"/>
+      <w:numFmt w:val="decimal"/>
+      <w:lvlText w:val="%1."/>
+      <w:lvlJc w:val="left"/>
+      <w:pPr>
+        <w:ind w:left="720" w:hanging="360"/>
+      </w:pPr>
+      <w:rPr>
+        <w:rFonts w:hint="default"/>
+      </w:rPr>
+    </w:lvl>
+    <w:lvl w:ilvl="1" w:tplc="10000019" w:tentative="1">
+      <w:start w:val="1"/>
+      <w:numFmt w:val="lowerLetter"/>
+      <w:lvlText w:val="%2."/>
+      <w:lvlJc w:val="left"/>
+      <w:pPr>
+        <w:ind w:left="1440" w:hanging="360"/>
+      </w:pPr>
+    </w:lvl>
+    <w:lvl w:ilvl="2" w:tplc="1000001B" w:tentative="1">
+      <w:start w:val="1"/>
+      <w:numFmt w:val="lowerRoman"/>
+      <w:lvlText w:val="%3."/>
+      <w:lvlJc w:val="right"/>
+      <w:pPr>
+        <w:ind w:left="2160" w:hanging="180"/>
+      </w:pPr>
+    </w:lvl>
+    <w:lvl w:ilvl="3" w:tplc="1000000F" w:tentative="1">
+      <w:start w:val="1"/>
+      <w:numFmt w:val="decimal"/>
+      <w:lvlText w:val="%4."/>
+      <w:lvlJc w:val="left"/>
+      <w:pPr>
+        <w:ind w:left="2880" w:hanging="360"/>
+      </w:pPr>
+    </w:lvl>
+    <w:lvl w:ilvl="4" w:tplc="10000019" w:tentative="1">
+      <w:start w:val="1"/>
+      <w:numFmt w:val="lowerLetter"/>
+      <w:lvlText w:val="%5."/>
+      <w:lvlJc w:val="left"/>
+      <w:pPr>
+        <w:ind w:left="3600" w:hanging="360"/>
+      </w:pPr>
+    </w:lvl>
+    <w:lvl w:ilvl="5" w:tplc="1000001B" w:tentative="1">
+      <w:start w:val="1"/>
+      <w:numFmt w:val="lowerRoman"/>
+      <w:lvlText w:val="%6."/>
+      <w:lvlJc w:val="right"/>
+      <w:pPr>
+        <w:ind w:left="4320" w:hanging="180"/>
+      </w:pPr>
+    </w:lvl>
+    <w:lvl w:ilvl="6" w:tplc="1000000F" w:tentative="1">
+      <w:start w:val="1"/>
+      <w:numFmt w:val="decimal"/>
+      <w:lvlText w:val="%7."/>
+      <w:lvlJc w:val="left"/>
+      <w:pPr>
+        <w:ind w:left="5040" w:hanging="360"/>
+      </w:pPr>
+    </w:lvl>
+    <w:lvl w:ilvl="7" w:tplc="10000019" w:tentative="1">
+      <w:start w:val="1"/>
+      <w:numFmt w:val="lowerLetter"/>
+      <w:lvlText w:val="%8."/>
+      <w:lvlJc w:val="left"/>
+      <w:pPr>
+        <w:ind w:left="5760" w:hanging="360"/>
+      </w:pPr>
+    </w:lvl>
+    <w:lvl w:ilvl="8" w:tplc="1000001B" w:tentative="1">
+      <w:start w:val="1"/>
+      <w:numFmt w:val="lowerRoman"/>
+      <w:lvlText w:val="%9."/>
+      <w:lvlJc w:val="right"/>
+      <w:pPr>
+        <w:ind w:left="6480" w:hanging="180"/>
+      </w:pPr>
+    </w:lvl>
+  </w:abstractNum>
+  <w:abstractNum w:abstractNumId="2" w15:restartNumberingAfterBreak="0">
     <w:nsid w:val="315D782D"/>
     <w:multiLevelType w:val="hybridMultilevel"/>
     <w:tmpl w:val="E4181C80"/>
@@ -11040,7 +12002,7 @@
       </w:rPr>
     </w:lvl>
   </w:abstractNum>
-  <w:abstractNum w:abstractNumId="1" w15:restartNumberingAfterBreak="0">
+  <w:abstractNum w:abstractNumId="3" w15:restartNumberingAfterBreak="0">
     <w:nsid w:val="4A5A348B"/>
     <w:multiLevelType w:val="hybridMultilevel"/>
     <w:tmpl w:val="A30C79EE"/>
@@ -11129,7 +12091,7 @@
       </w:pPr>
     </w:lvl>
   </w:abstractNum>
-  <w:abstractNum w:abstractNumId="2" w15:restartNumberingAfterBreak="0">
+  <w:abstractNum w:abstractNumId="4" w15:restartNumberingAfterBreak="0">
     <w:nsid w:val="627D13D0"/>
     <w:multiLevelType w:val="hybridMultilevel"/>
     <w:tmpl w:val="59129952"/>
@@ -11218,7 +12180,7 @@
       </w:pPr>
     </w:lvl>
   </w:abstractNum>
-  <w:abstractNum w:abstractNumId="3" w15:restartNumberingAfterBreak="0">
+  <w:abstractNum w:abstractNumId="5" w15:restartNumberingAfterBreak="0">
     <w:nsid w:val="6CD60F60"/>
     <w:multiLevelType w:val="hybridMultilevel"/>
     <w:tmpl w:val="B79662A6"/>
@@ -11332,16 +12294,22 @@
     </w:lvl>
   </w:abstractNum>
   <w:num w:numId="1" w16cid:durableId="506363759">
+    <w:abstractNumId w:val="4"/>
+  </w:num>
+  <w:num w:numId="2" w16cid:durableId="1706523164">
+    <w:abstractNumId w:val="3"/>
+  </w:num>
+  <w:num w:numId="3" w16cid:durableId="865871639">
     <w:abstractNumId w:val="2"/>
   </w:num>
-  <w:num w:numId="2" w16cid:durableId="1706523164">
-    <w:abstractNumId w:val="1"/>
+  <w:num w:numId="4" w16cid:durableId="1896233046">
+    <w:abstractNumId w:val="5"/>
   </w:num>
-  <w:num w:numId="3" w16cid:durableId="865871639">
+  <w:num w:numId="5" w16cid:durableId="1601258577">
     <w:abstractNumId w:val="0"/>
   </w:num>
-  <w:num w:numId="4" w16cid:durableId="1896233046">
-    <w:abstractNumId w:val="3"/>
+  <w:num w:numId="6" w16cid:durableId="1876505679">
+    <w:abstractNumId w:val="1"/>
   </w:num>
 </w:numbering>
 </file>

</xml_diff>

<commit_message>
documentation - tensor restructure logic.
</commit_message>
<xml_diff>
--- a/ŠpaňúrM_KnihovnaProPraci_JM_2026.docx
+++ b/ŠpaňúrM_KnihovnaProPraci_JM_2026.docx
@@ -2466,7 +2466,6 @@
           <w:noProof/>
           <w:kern w:val="2"/>
           <w:szCs w:val="24"/>
-          <w:lang/>
           <w14:ligatures w14:val="standardContextual"/>
         </w:rPr>
       </w:pPr>
@@ -2549,7 +2548,6 @@
           <w:noProof/>
           <w:kern w:val="2"/>
           <w:szCs w:val="24"/>
-          <w:lang/>
           <w14:ligatures w14:val="standardContextual"/>
         </w:rPr>
       </w:pPr>
@@ -2623,7 +2621,6 @@
           <w:noProof/>
           <w:kern w:val="2"/>
           <w:szCs w:val="24"/>
-          <w:lang/>
           <w14:ligatures w14:val="standardContextual"/>
         </w:rPr>
       </w:pPr>
@@ -2697,7 +2694,6 @@
           <w:noProof/>
           <w:kern w:val="2"/>
           <w:szCs w:val="24"/>
-          <w:lang/>
           <w14:ligatures w14:val="standardContextual"/>
         </w:rPr>
       </w:pPr>
@@ -2770,7 +2766,6 @@
           <w:noProof/>
           <w:kern w:val="2"/>
           <w:szCs w:val="24"/>
-          <w:lang/>
           <w14:ligatures w14:val="standardContextual"/>
         </w:rPr>
       </w:pPr>
@@ -2840,7 +2835,6 @@
           <w:noProof/>
           <w:kern w:val="2"/>
           <w:szCs w:val="24"/>
-          <w:lang/>
           <w14:ligatures w14:val="standardContextual"/>
         </w:rPr>
       </w:pPr>
@@ -2910,7 +2904,6 @@
           <w:noProof/>
           <w:kern w:val="2"/>
           <w:szCs w:val="24"/>
-          <w:lang/>
           <w14:ligatures w14:val="standardContextual"/>
         </w:rPr>
       </w:pPr>
@@ -2980,7 +2973,6 @@
           <w:noProof/>
           <w:kern w:val="2"/>
           <w:szCs w:val="24"/>
-          <w:lang/>
           <w14:ligatures w14:val="standardContextual"/>
         </w:rPr>
       </w:pPr>
@@ -3053,7 +3045,6 @@
           <w:noProof/>
           <w:kern w:val="2"/>
           <w:szCs w:val="24"/>
-          <w:lang/>
           <w14:ligatures w14:val="standardContextual"/>
         </w:rPr>
       </w:pPr>
@@ -3123,7 +3114,6 @@
           <w:noProof/>
           <w:kern w:val="2"/>
           <w:szCs w:val="24"/>
-          <w:lang/>
           <w14:ligatures w14:val="standardContextual"/>
         </w:rPr>
       </w:pPr>
@@ -3196,7 +3186,6 @@
           <w:noProof/>
           <w:kern w:val="2"/>
           <w:szCs w:val="24"/>
-          <w:lang/>
           <w14:ligatures w14:val="standardContextual"/>
         </w:rPr>
       </w:pPr>
@@ -3269,7 +3258,6 @@
           <w:noProof/>
           <w:kern w:val="2"/>
           <w:szCs w:val="24"/>
-          <w:lang/>
           <w14:ligatures w14:val="standardContextual"/>
         </w:rPr>
       </w:pPr>
@@ -3339,7 +3327,6 @@
           <w:noProof/>
           <w:kern w:val="2"/>
           <w:szCs w:val="24"/>
-          <w:lang/>
           <w14:ligatures w14:val="standardContextual"/>
         </w:rPr>
       </w:pPr>
@@ -3412,7 +3399,6 @@
           <w:noProof/>
           <w:kern w:val="2"/>
           <w:szCs w:val="24"/>
-          <w:lang/>
           <w14:ligatures w14:val="standardContextual"/>
         </w:rPr>
       </w:pPr>
@@ -3485,7 +3471,6 @@
           <w:noProof/>
           <w:kern w:val="2"/>
           <w:szCs w:val="24"/>
-          <w:lang/>
           <w14:ligatures w14:val="standardContextual"/>
         </w:rPr>
       </w:pPr>
@@ -3558,7 +3543,6 @@
           <w:noProof/>
           <w:kern w:val="2"/>
           <w:szCs w:val="24"/>
-          <w:lang/>
           <w14:ligatures w14:val="standardContextual"/>
         </w:rPr>
       </w:pPr>
@@ -3639,7 +3623,6 @@
           <w:noProof/>
           <w:kern w:val="2"/>
           <w:szCs w:val="24"/>
-          <w:lang/>
           <w14:ligatures w14:val="standardContextual"/>
         </w:rPr>
       </w:pPr>
@@ -3713,7 +3696,6 @@
           <w:noProof/>
           <w:kern w:val="2"/>
           <w:szCs w:val="24"/>
-          <w:lang/>
           <w14:ligatures w14:val="standardContextual"/>
         </w:rPr>
       </w:pPr>
@@ -3787,7 +3769,6 @@
           <w:noProof/>
           <w:kern w:val="2"/>
           <w:szCs w:val="24"/>
-          <w:lang/>
           <w14:ligatures w14:val="standardContextual"/>
         </w:rPr>
       </w:pPr>
@@ -3861,7 +3842,6 @@
           <w:noProof/>
           <w:kern w:val="2"/>
           <w:szCs w:val="24"/>
-          <w:lang/>
           <w14:ligatures w14:val="standardContextual"/>
         </w:rPr>
       </w:pPr>
@@ -3935,7 +3915,6 @@
           <w:noProof/>
           <w:kern w:val="2"/>
           <w:szCs w:val="24"/>
-          <w:lang/>
           <w14:ligatures w14:val="standardContextual"/>
         </w:rPr>
       </w:pPr>
@@ -4006,7 +3985,6 @@
           <w:noProof/>
           <w:kern w:val="2"/>
           <w:szCs w:val="24"/>
-          <w:lang/>
           <w14:ligatures w14:val="standardContextual"/>
         </w:rPr>
       </w:pPr>
@@ -4080,7 +4058,6 @@
           <w:noProof/>
           <w:kern w:val="2"/>
           <w:szCs w:val="24"/>
-          <w:lang/>
           <w14:ligatures w14:val="standardContextual"/>
         </w:rPr>
       </w:pPr>
@@ -4154,7 +4131,6 @@
           <w:noProof/>
           <w:kern w:val="2"/>
           <w:szCs w:val="24"/>
-          <w:lang/>
           <w14:ligatures w14:val="standardContextual"/>
         </w:rPr>
       </w:pPr>
@@ -4228,7 +4204,6 @@
           <w:noProof/>
           <w:kern w:val="2"/>
           <w:szCs w:val="24"/>
-          <w:lang/>
           <w14:ligatures w14:val="standardContextual"/>
         </w:rPr>
       </w:pPr>
@@ -4301,7 +4276,6 @@
           <w:noProof/>
           <w:kern w:val="2"/>
           <w:szCs w:val="24"/>
-          <w:lang/>
           <w14:ligatures w14:val="standardContextual"/>
         </w:rPr>
       </w:pPr>
@@ -4374,7 +4348,6 @@
           <w:noProof/>
           <w:kern w:val="2"/>
           <w:szCs w:val="24"/>
-          <w:lang/>
           <w14:ligatures w14:val="standardContextual"/>
         </w:rPr>
       </w:pPr>
@@ -4447,7 +4420,6 @@
           <w:noProof/>
           <w:kern w:val="2"/>
           <w:szCs w:val="24"/>
-          <w:lang/>
           <w14:ligatures w14:val="standardContextual"/>
         </w:rPr>
       </w:pPr>
@@ -6259,14 +6231,7 @@
                           <w:rFonts w:ascii="Cambria Math" w:hAnsi="Cambria Math"/>
                           <w:lang w:eastAsia="cs-CZ"/>
                         </w:rPr>
-                        <m:t>k</m:t>
-                      </m:r>
-                      <m:r>
-                        <w:rPr>
-                          <w:rFonts w:ascii="Cambria Math" w:hAnsi="Cambria Math"/>
-                          <w:lang w:eastAsia="cs-CZ"/>
-                        </w:rPr>
-                        <m:t>=0</m:t>
+                        <m:t>k=0</m:t>
                       </m:r>
                     </m:sub>
                     <m:sup>
@@ -6275,21 +6240,7 @@
                           <w:rFonts w:ascii="Cambria Math" w:hAnsi="Cambria Math"/>
                           <w:lang w:eastAsia="cs-CZ"/>
                         </w:rPr>
-                        <m:t>i</m:t>
-                      </m:r>
-                      <m:r>
-                        <w:rPr>
-                          <w:rFonts w:ascii="Cambria Math" w:hAnsi="Cambria Math"/>
-                          <w:lang w:eastAsia="cs-CZ"/>
-                        </w:rPr>
-                        <m:t>-</m:t>
-                      </m:r>
-                      <m:r>
-                        <w:rPr>
-                          <w:rFonts w:ascii="Cambria Math" w:hAnsi="Cambria Math"/>
-                          <w:lang w:eastAsia="cs-CZ"/>
-                        </w:rPr>
-                        <m:t>1</m:t>
+                        <m:t>i-1</m:t>
                       </m:r>
                     </m:sup>
                     <m:e>
@@ -6329,35 +6280,7 @@
                       <w:rFonts w:ascii="Cambria Math" w:hAnsi="Cambria Math"/>
                       <w:lang w:eastAsia="cs-CZ"/>
                     </w:rPr>
-                    <m:t>;</m:t>
-                  </m:r>
-                  <m:r>
-                    <w:rPr>
-                      <w:rFonts w:ascii="Cambria Math" w:hAnsi="Cambria Math"/>
-                      <w:lang w:eastAsia="cs-CZ"/>
-                    </w:rPr>
-                    <m:t>pro</m:t>
-                  </m:r>
-                  <m:r>
-                    <w:rPr>
-                      <w:rFonts w:ascii="Cambria Math" w:hAnsi="Cambria Math"/>
-                      <w:lang w:eastAsia="cs-CZ"/>
-                    </w:rPr>
-                    <m:t xml:space="preserve"> </m:t>
-                  </m:r>
-                  <m:r>
-                    <w:rPr>
-                      <w:rFonts w:ascii="Cambria Math" w:hAnsi="Cambria Math"/>
-                      <w:lang w:eastAsia="cs-CZ"/>
-                    </w:rPr>
-                    <m:t>i</m:t>
-                  </m:r>
-                  <m:r>
-                    <w:rPr>
-                      <w:rFonts w:ascii="Cambria Math" w:hAnsi="Cambria Math"/>
-                      <w:lang w:eastAsia="cs-CZ"/>
-                    </w:rPr>
-                    <m:t>&gt;0</m:t>
+                    <m:t>;pro i&gt;0</m:t>
                   </m:r>
                 </m:e>
                 <m:e>
@@ -6366,35 +6289,7 @@
                       <w:rFonts w:ascii="Cambria Math" w:hAnsi="Cambria Math"/>
                       <w:lang w:eastAsia="cs-CZ"/>
                     </w:rPr>
-                    <m:t>1 ;</m:t>
-                  </m:r>
-                  <m:r>
-                    <w:rPr>
-                      <w:rFonts w:ascii="Cambria Math" w:hAnsi="Cambria Math"/>
-                      <w:lang w:eastAsia="cs-CZ"/>
-                    </w:rPr>
-                    <m:t>pro</m:t>
-                  </m:r>
-                  <m:r>
-                    <w:rPr>
-                      <w:rFonts w:ascii="Cambria Math" w:hAnsi="Cambria Math"/>
-                      <w:lang w:eastAsia="cs-CZ"/>
-                    </w:rPr>
-                    <m:t xml:space="preserve"> </m:t>
-                  </m:r>
-                  <m:r>
-                    <w:rPr>
-                      <w:rFonts w:ascii="Cambria Math" w:hAnsi="Cambria Math"/>
-                      <w:lang w:eastAsia="cs-CZ"/>
-                    </w:rPr>
-                    <m:t>i</m:t>
-                  </m:r>
-                  <m:r>
-                    <w:rPr>
-                      <w:rFonts w:ascii="Cambria Math" w:hAnsi="Cambria Math"/>
-                      <w:lang w:eastAsia="cs-CZ"/>
-                    </w:rPr>
-                    <m:t>=0</m:t>
+                    <m:t>1 ;pro i=0</m:t>
                   </m:r>
                 </m:e>
               </m:eqArr>
@@ -6635,6 +6530,58 @@
           <w:lang w:eastAsia="cs-CZ"/>
         </w:rPr>
         <w:t xml:space="preserve"> samotné.</w:t>
+      </w:r>
+      <w:r>
+        <w:rPr>
+          <w:lang w:eastAsia="cs-CZ"/>
+        </w:rPr>
+        <w:t xml:space="preserve"> Čili samotné </w:t>
+      </w:r>
+      <w:r>
+        <w:rPr>
+          <w:i/>
+          <w:iCs/>
+          <w:lang w:eastAsia="cs-CZ"/>
+        </w:rPr>
+        <w:t>J</w:t>
+      </w:r>
+      <w:r>
+        <w:rPr>
+          <w:i/>
+          <w:iCs/>
+          <w:vertAlign w:val="subscript"/>
+          <w:lang w:eastAsia="cs-CZ"/>
+        </w:rPr>
+        <w:t>i</w:t>
+      </w:r>
+      <w:r>
+        <w:rPr>
+          <w:i/>
+          <w:iCs/>
+          <w:vertAlign w:val="subscript"/>
+          <w:lang w:eastAsia="cs-CZ"/>
+        </w:rPr>
+        <w:t xml:space="preserve"> </w:t>
+      </w:r>
+      <w:r>
+        <w:rPr>
+          <w:lang w:eastAsia="cs-CZ"/>
+        </w:rPr>
+        <w:t xml:space="preserve">je vlastně velikostí nejednoznačného výběru, pokud by souřadnice byly vyplněny až po </w:t>
+      </w:r>
+      <w:r>
+        <w:rPr>
+          <w:i/>
+          <w:iCs/>
+          <w:lang w:eastAsia="cs-CZ"/>
+        </w:rPr>
+        <w:t>i</w:t>
+      </w:r>
+      <w:r>
+        <w:rPr>
+          <w:lang w:eastAsia="cs-CZ"/>
+        </w:rPr>
+        <w:t xml:space="preserve"> včetně.</w:t>
       </w:r>
     </w:p>
     <w:p>
@@ -7070,6 +7017,7 @@
           <w:rPr>
             <w:rFonts w:ascii="Cambria Math" w:hAnsi="Cambria Math"/>
           </w:rPr>
+          <w:lastRenderedPageBreak/>
           <m:t>i≔index</m:t>
         </m:r>
       </m:oMath>
@@ -7092,7 +7040,6 @@
           <w:rPr>
             <w:rFonts w:ascii="Cambria Math" w:hAnsi="Cambria Math"/>
           </w:rPr>
-          <w:lastRenderedPageBreak/>
           <m:t>pro k od 0 do len</m:t>
         </m:r>
         <m:d>
@@ -7162,19 +7109,7 @@
           <w:rPr>
             <w:rFonts w:ascii="Cambria Math" w:hAnsi="Cambria Math"/>
           </w:rPr>
-          <m:t>≔</m:t>
-        </m:r>
-        <m:r>
-          <w:rPr>
-            <w:rFonts w:ascii="Cambria Math" w:hAnsi="Cambria Math"/>
-          </w:rPr>
-          <m:t>i</m:t>
-        </m:r>
-        <m:r>
-          <w:rPr>
-            <w:rFonts w:ascii="Cambria Math" w:hAnsi="Cambria Math"/>
-          </w:rPr>
-          <m:t>/</m:t>
+          <m:t>≔i/</m:t>
         </m:r>
         <m:sSub>
           <m:sSubPr>
@@ -7465,7 +7400,11 @@
         <w:t xml:space="preserve"> V takovém případě totiž stačí uvnitř tenzoru projít toto jednorozměrné pole s daty a aplikovat danou operaci.</w:t>
       </w:r>
       <w:r>
-        <w:t xml:space="preserve"> Je to navíc jednoduše </w:t>
+        <w:t xml:space="preserve"> Je to navíc </w:t>
+      </w:r>
+      <w:r>
+        <w:lastRenderedPageBreak/>
+        <w:t xml:space="preserve">jednoduše </w:t>
       </w:r>
       <w:proofErr w:type="spellStart"/>
       <w:r>
@@ -7484,7 +7423,6 @@
         <w:spacing w:line="360" w:lineRule="auto"/>
       </w:pPr>
       <w:r>
-        <w:lastRenderedPageBreak/>
         <w:t>Tenzor také je schopen svého převodu na řetězec znaků.</w:t>
       </w:r>
       <w:r>
@@ -7670,10 +7608,7 @@
         <w:t xml:space="preserve"> </w:t>
       </w:r>
       <w:r>
-        <w:t>(</w:t>
-      </w:r>
-      <w:r>
-        <w:t xml:space="preserve">Kumulativní součin předešlých velikostí dimenzí korespondující </w:t>
+        <w:t xml:space="preserve">(Kumulativní součin předešlých velikostí dimenzí korespondující </w:t>
       </w:r>
       <w:r>
         <w:t xml:space="preserve">velikosti dimenze </w:t>
@@ -7780,6 +7715,7 @@
         <w:spacing w:line="360" w:lineRule="auto"/>
       </w:pPr>
       <w:r>
+        <w:lastRenderedPageBreak/>
         <w:t xml:space="preserve">Jelikož se jedná o prohození hodnot, tak to díky </w:t>
       </w:r>
       <w:proofErr w:type="spellStart"/>
@@ -7800,11 +7736,7 @@
         <w:t xml:space="preserve"> Při transpozici se tedy alokuje nové pole o stejné velikosti jako to staré.</w:t>
       </w:r>
       <w:r>
-        <w:t xml:space="preserve"> Bylo by sice možné implementovat tuto operaci na místě (in-place), to by ale znamenalo více </w:t>
-      </w:r>
-      <w:r>
-        <w:lastRenderedPageBreak/>
-        <w:t>celkových přesouvání, což by se značně prodražilo u velkých objektů.</w:t>
+        <w:t xml:space="preserve"> Bylo by sice možné implementovat tuto operaci na místě (in-place), to by ale znamenalo více celkových přesouvání, což by se značně prodražilo u velkých objektů.</w:t>
       </w:r>
       <w:r>
         <w:t xml:space="preserve"> Poté dochází k přesunu prvků ze starého pole na nové</w:t>
@@ -7892,6 +7824,980 @@
     </w:p>
     <w:p>
       <w:pPr>
+        <w:spacing w:line="360" w:lineRule="auto"/>
+      </w:pPr>
+      <w:r>
+        <w:t xml:space="preserve">Existuje také metoda pro změnu velikosti </w:t>
+      </w:r>
+      <w:r>
+        <w:t>dimenzí.</w:t>
+      </w:r>
+      <w:r>
+        <w:t xml:space="preserve"> Taková metoda přijímá nové souřadnice stejné délky jako ty aktuální.</w:t>
+      </w:r>
+      <w:r>
+        <w:t xml:space="preserve"> Následně vypočítá aktualizuje velikosti dimenzí i pole s </w:t>
+      </w:r>
+      <w:r>
+        <w:t>vektor</w:t>
+      </w:r>
+      <w:r>
+        <w:t>em</w:t>
+      </w:r>
+      <w:r>
+        <w:t xml:space="preserve"> kumulativních součinů předchozích velikostí dimenzí</w:t>
+      </w:r>
+      <w:r>
+        <w:t xml:space="preserve">. Poté vypočítá novou velikost úložného pole a alokuje ho. </w:t>
+      </w:r>
+      <w:r>
+        <w:t xml:space="preserve">Je velmi výhodné vždy alokovat nové pole. První z důvodu je stejný jako při transpozici – a to díky tomu, že je jednorázový přesun rychlejší než vyměňování na místě. </w:t>
+      </w:r>
+      <w:r>
+        <w:t xml:space="preserve">Druhý je asi ještě silnější, protože byť jen inkrementální změna velikosti dimenze vede k násobnému zvětšení či zmenšení úložného prostoru. </w:t>
+      </w:r>
+      <w:r>
+        <w:t xml:space="preserve">Ze starého pole se poté přesouvají prvky, ale jenom ty, pro které jsou jejich staré souřadnice stále validní. </w:t>
+      </w:r>
+      <w:r>
+        <w:t>Ty</w:t>
+      </w:r>
+      <w:r>
+        <w:t xml:space="preserve"> prvky, pro které jejich staré souřadnice nejsou validní podle nových velikostí dimenzí, jsou zahozeny.</w:t>
+      </w:r>
+      <w:r>
+        <w:t xml:space="preserve"> Podobně jako v případě transpozice se v sériové implementaci používá pro </w:t>
+      </w:r>
+      <w:r>
+        <w:t>zjištění</w:t>
+      </w:r>
+      <w:r>
+        <w:t xml:space="preserve"> souřadnic dalšího prvku metoda pro inkrementaci souřadnic, která ovšem není použita v paralelním provedení.</w:t>
+      </w:r>
+      <w:r>
+        <w:t xml:space="preserve"> Komplexita sériového zpracování je tudíž O(len(T) * len(D)), </w:t>
+      </w:r>
+      <w:r>
+        <w:t>kde len(D) je počet dimenzí a len(T) je počet prvků v původním poli</w:t>
+      </w:r>
+      <w:r>
+        <w:t>.</w:t>
+      </w:r>
+    </w:p>
+    <w:p>
+      <w:pPr>
+        <w:spacing w:line="360" w:lineRule="auto"/>
+      </w:pPr>
+      <w:r>
+        <w:t>Uživatel má dále možnost odebrat či přidat dimenzi.</w:t>
+      </w:r>
+      <w:r>
+        <w:t xml:space="preserve"> To je řešeno pomocí dvou sobě podobných metod.</w:t>
+      </w:r>
+      <w:r>
+        <w:t xml:space="preserve"> U metody pro přidání dimenze uživatel specifikuje velikost dané dimenze a pozici, na které bude vložena. Ostatní velikosti dimenzí od dané pozice do konce budou </w:t>
+      </w:r>
+      <w:r>
+        <w:lastRenderedPageBreak/>
+        <w:t>posunuty.</w:t>
+      </w:r>
+      <w:r>
+        <w:t xml:space="preserve"> </w:t>
+      </w:r>
+      <w:r>
+        <w:t>Poté je aktualizován vnitřní stav metadat (</w:t>
+      </w:r>
+      <w:r>
+        <w:t>vektor kumulativních součinů předchozích velikostí dimenzí</w:t>
+      </w:r>
+      <w:r>
+        <w:t xml:space="preserve">). </w:t>
+      </w:r>
+      <w:r>
+        <w:t xml:space="preserve">Následně je alokováno nové pole pro prvky. </w:t>
+      </w:r>
+      <w:r>
+        <w:t>Při přesunu prvků je využito optimalizačního triku, díky kterému není třeba žádné práce se souřadnicemi</w:t>
+      </w:r>
+      <w:r>
+        <w:t xml:space="preserve"> u každého prvku</w:t>
+      </w:r>
+      <w:r>
+        <w:t>.</w:t>
+      </w:r>
+      <w:r>
+        <w:t xml:space="preserve"> Z původního pole je třeba přesunout každý prvek, ale nové pole nebude prvky zcela zaplněno (pokud přidaná dimenze není velikosti 1).</w:t>
+      </w:r>
+      <w:r>
+        <w:t xml:space="preserve"> Stane se tak, že na novém poli budou rozsahy indexů, kam se prvky vloží a mezi nimi budou mezery, které nedostanou žádný vložený prvek.</w:t>
+      </w:r>
+      <w:r>
+        <w:t xml:space="preserve"> Tyto rozsahy jde vypočítat a sestrojit tak cyklus, co jen jednou projede indexem po původním poli přesouvajíc prvky na druhé jedna ku jedné a poté v pravý čas přeskočí několik indexů na cílovém poli</w:t>
+      </w:r>
+      <w:r>
+        <w:t>,</w:t>
+      </w:r>
+      <w:r>
+        <w:t xml:space="preserve"> zatímco bude normálně pokračovat na tom původním.</w:t>
+      </w:r>
+      <w:r>
+        <w:t xml:space="preserve"> Tím se složitost tohoto úkonu sníží oproti naivnímu přístupu z O(len(D) * len(T)) na </w:t>
+      </w:r>
+      <w:r>
+        <w:t>pouhé</w:t>
+      </w:r>
+      <w:r>
+        <w:t xml:space="preserve"> O(len(T)), kde len(D) je počet dimenzí a len(T) je počet prvků v původním poli.</w:t>
+      </w:r>
+      <w:r>
+        <w:t xml:space="preserve"> </w:t>
+      </w:r>
+      <w:r>
+        <w:rPr>
+          <w:b/>
+          <w:bCs/>
+        </w:rPr>
+        <w:t>Rozsah k přesunu</w:t>
+      </w:r>
+      <w:r>
+        <w:t xml:space="preserve"> je </w:t>
+      </w:r>
+      <w:r>
+        <w:t xml:space="preserve">velikostí </w:t>
+      </w:r>
+      <w:r>
+        <w:t>roven k</w:t>
+      </w:r>
+      <w:r>
+        <w:t>umulativní</w:t>
+      </w:r>
+      <w:r>
+        <w:t>mu</w:t>
+      </w:r>
+      <w:r>
+        <w:t xml:space="preserve"> součin</w:t>
+      </w:r>
+      <w:r>
+        <w:t>u</w:t>
+      </w:r>
+      <w:r>
+        <w:t xml:space="preserve"> předešlých velikostí dimenzí</w:t>
+      </w:r>
+      <w:r>
+        <w:t xml:space="preserve"> na pozici nové dimenze pro již aktualizovaný stav</w:t>
+      </w:r>
+      <w:r>
+        <w:t xml:space="preserve"> a </w:t>
+      </w:r>
+      <w:r>
+        <w:t xml:space="preserve">následující </w:t>
+      </w:r>
+      <w:r>
+        <w:rPr>
+          <w:b/>
+          <w:bCs/>
+        </w:rPr>
+        <w:t>rozsah přeskočení</w:t>
+      </w:r>
+      <w:r>
+        <w:t xml:space="preserve"> je </w:t>
+      </w:r>
+      <w:r>
+        <w:t xml:space="preserve">velikostí </w:t>
+      </w:r>
+      <w:r>
+        <w:t xml:space="preserve">roven </w:t>
+      </w:r>
+      <w:r>
+        <w:t>tomuto rozsahu vynásobeném velikostí korespondující dimenze mínus jedna.</w:t>
+      </w:r>
+      <w:r>
+        <w:t xml:space="preserve"> Tedy index procházející původní pole se vždy posouvá po jednom a index procházející nové pole se po jednom inkrementuje do vypočítané hodnoty velikosti rozsahu přesunu a poté se mu přičte velikost rozsahu </w:t>
+      </w:r>
+      <w:r>
+        <w:t>přeskočení</w:t>
+      </w:r>
+      <w:r>
+        <w:t>.</w:t>
+      </w:r>
+      <w:r>
+        <w:t xml:space="preserve"> Takto se inkrementace a přeskočení opakují až do chvíle, kdy jsou všechny prvky z původního pole přesunuty.</w:t>
+      </w:r>
+    </w:p>
+    <w:p>
+      <w:pPr>
+        <w:pStyle w:val="Odstavecseseznamem"/>
+        <w:numPr>
+          <w:ilvl w:val="0"/>
+          <w:numId w:val="8"/>
+        </w:numPr>
+        <w:spacing w:line="360" w:lineRule="auto"/>
+      </w:pPr>
+      <m:oMath>
+        <m:r>
+          <w:rPr>
+            <w:rFonts w:ascii="Cambria Math" w:hAnsi="Cambria Math"/>
+          </w:rPr>
+          <m:t>novýT je nové pole,</m:t>
+        </m:r>
+        <m:r>
+          <w:rPr>
+            <w:rFonts w:ascii="Cambria Math" w:hAnsi="Cambria Math"/>
+          </w:rPr>
+          <m:t xml:space="preserve"> </m:t>
+        </m:r>
+        <m:r>
+          <w:rPr>
+            <w:rFonts w:ascii="Cambria Math" w:hAnsi="Cambria Math"/>
+          </w:rPr>
+          <m:t xml:space="preserve"> starýT staré pole</m:t>
+        </m:r>
+      </m:oMath>
+    </w:p>
+    <w:p>
+      <w:pPr>
+        <w:pStyle w:val="Odstavecseseznamem"/>
+        <w:numPr>
+          <w:ilvl w:val="0"/>
+          <w:numId w:val="8"/>
+        </w:numPr>
+        <w:spacing w:line="360" w:lineRule="auto"/>
+      </w:pPr>
+      <w:r>
+        <w:rPr>
+          <w:i/>
+          <w:iCs/>
+        </w:rPr>
+        <w:t>i</w:t>
+      </w:r>
+      <w:r>
+        <w:t xml:space="preserve"> je pozice nové dimenze a </w:t>
+      </w:r>
+      <w:r>
+        <w:rPr>
+          <w:i/>
+          <w:iCs/>
+        </w:rPr>
+        <w:t>D</w:t>
+      </w:r>
+      <w:r>
+        <w:rPr>
+          <w:i/>
+          <w:iCs/>
+          <w:vertAlign w:val="subscript"/>
+        </w:rPr>
+        <w:t>i</w:t>
+      </w:r>
+      <w:r>
+        <w:t xml:space="preserve"> je velikost nové dimenze</w:t>
+      </w:r>
+    </w:p>
+    <w:p>
+      <w:pPr>
+        <w:pStyle w:val="Odstavecseseznamem"/>
+        <w:numPr>
+          <w:ilvl w:val="0"/>
+          <w:numId w:val="8"/>
+        </w:numPr>
+        <w:spacing w:line="360" w:lineRule="auto"/>
+      </w:pPr>
+      <m:oMath>
+        <m:r>
+          <w:rPr>
+            <w:rFonts w:ascii="Cambria Math" w:hAnsi="Cambria Math"/>
+          </w:rPr>
+          <m:t>m≔</m:t>
+        </m:r>
+        <m:sSub>
+          <m:sSubPr>
+            <m:ctrlPr>
+              <w:rPr>
+                <w:rFonts w:ascii="Cambria Math" w:hAnsi="Cambria Math"/>
+                <w:i/>
+              </w:rPr>
+            </m:ctrlPr>
+          </m:sSubPr>
+          <m:e>
+            <m:r>
+              <w:rPr>
+                <w:rFonts w:ascii="Cambria Math" w:hAnsi="Cambria Math"/>
+              </w:rPr>
+              <m:t>J</m:t>
+            </m:r>
+          </m:e>
+          <m:sub>
+            <m:r>
+              <w:rPr>
+                <w:rFonts w:ascii="Cambria Math" w:hAnsi="Cambria Math"/>
+              </w:rPr>
+              <m:t>i</m:t>
+            </m:r>
+          </m:sub>
+        </m:sSub>
+      </m:oMath>
+    </w:p>
+    <w:p>
+      <w:pPr>
+        <w:pStyle w:val="Odstavecseseznamem"/>
+        <w:numPr>
+          <w:ilvl w:val="0"/>
+          <w:numId w:val="8"/>
+        </w:numPr>
+        <w:spacing w:line="360" w:lineRule="auto"/>
+      </w:pPr>
+      <m:oMath>
+        <m:r>
+          <w:rPr>
+            <w:rFonts w:ascii="Cambria Math" w:hAnsi="Cambria Math"/>
+          </w:rPr>
+          <m:t>s≔m*</m:t>
+        </m:r>
+        <m:d>
+          <m:dPr>
+            <m:ctrlPr>
+              <w:rPr>
+                <w:rFonts w:ascii="Cambria Math" w:hAnsi="Cambria Math"/>
+                <w:i/>
+              </w:rPr>
+            </m:ctrlPr>
+          </m:dPr>
+          <m:e>
+            <m:sSub>
+              <m:sSubPr>
+                <m:ctrlPr>
+                  <w:rPr>
+                    <w:rFonts w:ascii="Cambria Math" w:hAnsi="Cambria Math"/>
+                    <w:i/>
+                  </w:rPr>
+                </m:ctrlPr>
+              </m:sSubPr>
+              <m:e>
+                <m:r>
+                  <w:rPr>
+                    <w:rFonts w:ascii="Cambria Math" w:hAnsi="Cambria Math"/>
+                  </w:rPr>
+                  <m:t>D</m:t>
+                </m:r>
+              </m:e>
+              <m:sub>
+                <m:r>
+                  <w:rPr>
+                    <w:rFonts w:ascii="Cambria Math" w:hAnsi="Cambria Math"/>
+                  </w:rPr>
+                  <m:t>i</m:t>
+                </m:r>
+              </m:sub>
+            </m:sSub>
+            <m:r>
+              <w:rPr>
+                <w:rFonts w:ascii="Cambria Math" w:hAnsi="Cambria Math"/>
+              </w:rPr>
+              <m:t>-1</m:t>
+            </m:r>
+          </m:e>
+        </m:d>
+      </m:oMath>
+    </w:p>
+    <w:p>
+      <w:pPr>
+        <w:pStyle w:val="Odstavecseseznamem"/>
+        <w:numPr>
+          <w:ilvl w:val="0"/>
+          <w:numId w:val="8"/>
+        </w:numPr>
+        <w:spacing w:line="360" w:lineRule="auto"/>
+      </w:pPr>
+      <m:oMath>
+        <m:r>
+          <w:rPr>
+            <w:rFonts w:ascii="Cambria Math" w:hAnsi="Cambria Math"/>
+          </w:rPr>
+          <m:t>b≔0</m:t>
+        </m:r>
+      </m:oMath>
+    </w:p>
+    <w:p>
+      <w:pPr>
+        <w:pStyle w:val="Odstavecseseznamem"/>
+        <w:numPr>
+          <w:ilvl w:val="0"/>
+          <w:numId w:val="8"/>
+        </w:numPr>
+        <w:spacing w:line="360" w:lineRule="auto"/>
+      </w:pPr>
+      <m:oMath>
+        <m:r>
+          <w:rPr>
+            <w:rFonts w:ascii="Cambria Math" w:hAnsi="Cambria Math"/>
+          </w:rPr>
+          <m:t>c≔0</m:t>
+        </m:r>
+      </m:oMath>
+    </w:p>
+    <w:p>
+      <w:pPr>
+        <w:pStyle w:val="Odstavecseseznamem"/>
+        <w:numPr>
+          <w:ilvl w:val="0"/>
+          <w:numId w:val="8"/>
+        </w:numPr>
+        <w:spacing w:line="360" w:lineRule="auto"/>
+      </w:pPr>
+      <m:oMath>
+        <m:r>
+          <w:rPr>
+            <w:rFonts w:ascii="Cambria Math" w:hAnsi="Cambria Math"/>
+          </w:rPr>
+          <m:t>p</m:t>
+        </m:r>
+        <m:r>
+          <w:rPr>
+            <w:rFonts w:ascii="Cambria Math" w:hAnsi="Cambria Math"/>
+          </w:rPr>
+          <m:t xml:space="preserve">ro </m:t>
+        </m:r>
+        <m:r>
+          <w:rPr>
+            <w:rFonts w:ascii="Cambria Math" w:hAnsi="Cambria Math"/>
+          </w:rPr>
+          <m:t>a</m:t>
+        </m:r>
+        <m:r>
+          <w:rPr>
+            <w:rFonts w:ascii="Cambria Math" w:hAnsi="Cambria Math"/>
+          </w:rPr>
+          <m:t xml:space="preserve"> od 0 do len</m:t>
+        </m:r>
+        <m:d>
+          <m:dPr>
+            <m:ctrlPr>
+              <w:rPr>
+                <w:rFonts w:ascii="Cambria Math" w:hAnsi="Cambria Math"/>
+                <w:i/>
+              </w:rPr>
+            </m:ctrlPr>
+          </m:dPr>
+          <m:e>
+            <m:r>
+              <w:rPr>
+                <w:rFonts w:ascii="Cambria Math" w:hAnsi="Cambria Math"/>
+              </w:rPr>
+              <m:t>starýT</m:t>
+            </m:r>
+          </m:e>
+        </m:d>
+        <m:r>
+          <w:rPr>
+            <w:rFonts w:ascii="Cambria Math" w:hAnsi="Cambria Math"/>
+          </w:rPr>
+          <m:t>-1 opakuj:</m:t>
+        </m:r>
+      </m:oMath>
+    </w:p>
+    <w:p>
+      <w:pPr>
+        <w:pStyle w:val="Odstavecseseznamem"/>
+        <w:numPr>
+          <w:ilvl w:val="0"/>
+          <w:numId w:val="11"/>
+        </w:numPr>
+        <w:spacing w:line="360" w:lineRule="auto"/>
+      </w:pPr>
+      <m:oMath>
+        <m:sSub>
+          <m:sSubPr>
+            <m:ctrlPr>
+              <w:rPr>
+                <w:rFonts w:ascii="Cambria Math" w:hAnsi="Cambria Math"/>
+                <w:i/>
+              </w:rPr>
+            </m:ctrlPr>
+          </m:sSubPr>
+          <m:e>
+            <m:r>
+              <w:rPr>
+                <w:rFonts w:ascii="Cambria Math" w:hAnsi="Cambria Math"/>
+              </w:rPr>
+              <m:t>novýT</m:t>
+            </m:r>
+          </m:e>
+          <m:sub>
+            <m:r>
+              <w:rPr>
+                <w:rFonts w:ascii="Cambria Math" w:hAnsi="Cambria Math"/>
+              </w:rPr>
+              <m:t>b</m:t>
+            </m:r>
+          </m:sub>
+        </m:sSub>
+        <m:r>
+          <w:rPr>
+            <w:rFonts w:ascii="Cambria Math" w:hAnsi="Cambria Math"/>
+          </w:rPr>
+          <m:t>≔</m:t>
+        </m:r>
+        <m:sSub>
+          <m:sSubPr>
+            <m:ctrlPr>
+              <w:rPr>
+                <w:rFonts w:ascii="Cambria Math" w:hAnsi="Cambria Math"/>
+                <w:i/>
+              </w:rPr>
+            </m:ctrlPr>
+          </m:sSubPr>
+          <m:e>
+            <m:r>
+              <w:rPr>
+                <w:rFonts w:ascii="Cambria Math" w:hAnsi="Cambria Math"/>
+              </w:rPr>
+              <m:t>starýT</m:t>
+            </m:r>
+          </m:e>
+          <m:sub>
+            <m:r>
+              <w:rPr>
+                <w:rFonts w:ascii="Cambria Math" w:hAnsi="Cambria Math"/>
+              </w:rPr>
+              <m:t>a</m:t>
+            </m:r>
+          </m:sub>
+        </m:sSub>
+      </m:oMath>
+    </w:p>
+    <w:p>
+      <w:pPr>
+        <w:pStyle w:val="Odstavecseseznamem"/>
+        <w:numPr>
+          <w:ilvl w:val="0"/>
+          <w:numId w:val="11"/>
+        </w:numPr>
+        <w:spacing w:line="360" w:lineRule="auto"/>
+      </w:pPr>
+      <m:oMath>
+        <m:r>
+          <w:rPr>
+            <w:rFonts w:ascii="Cambria Math" w:hAnsi="Cambria Math"/>
+          </w:rPr>
+          <m:t>b≔b+1</m:t>
+        </m:r>
+      </m:oMath>
+    </w:p>
+    <w:p>
+      <w:pPr>
+        <w:pStyle w:val="Odstavecseseznamem"/>
+        <w:numPr>
+          <w:ilvl w:val="0"/>
+          <w:numId w:val="11"/>
+        </w:numPr>
+        <w:spacing w:line="360" w:lineRule="auto"/>
+      </w:pPr>
+      <m:oMath>
+        <m:r>
+          <w:rPr>
+            <w:rFonts w:ascii="Cambria Math" w:hAnsi="Cambria Math"/>
+          </w:rPr>
+          <m:t>c≔c+1</m:t>
+        </m:r>
+      </m:oMath>
+    </w:p>
+    <w:p>
+      <w:pPr>
+        <w:pStyle w:val="Odstavecseseznamem"/>
+        <w:numPr>
+          <w:ilvl w:val="0"/>
+          <w:numId w:val="11"/>
+        </w:numPr>
+        <w:spacing w:line="360" w:lineRule="auto"/>
+      </w:pPr>
+      <m:oMath>
+        <m:d>
+          <m:dPr>
+            <m:begChr m:val="{"/>
+            <m:endChr m:val=""/>
+            <m:ctrlPr>
+              <w:rPr>
+                <w:rFonts w:ascii="Cambria Math" w:hAnsi="Cambria Math"/>
+                <w:i/>
+              </w:rPr>
+            </m:ctrlPr>
+          </m:dPr>
+          <m:e>
+            <m:eqArr>
+              <m:eqArrPr>
+                <m:ctrlPr>
+                  <w:rPr>
+                    <w:rFonts w:ascii="Cambria Math" w:hAnsi="Cambria Math"/>
+                    <w:i/>
+                  </w:rPr>
+                </m:ctrlPr>
+              </m:eqArrPr>
+              <m:e>
+                <m:r>
+                  <w:rPr>
+                    <w:rFonts w:ascii="Cambria Math" w:hAnsi="Cambria Math"/>
+                  </w:rPr>
+                  <m:t>pokud c=m ;</m:t>
+                </m:r>
+                <m:r>
+                  <w:rPr>
+                    <w:rFonts w:ascii="Cambria Math" w:hAnsi="Cambria Math"/>
+                  </w:rPr>
+                  <m:t>b :=b+s;c≔0</m:t>
+                </m:r>
+                <m:r>
+                  <w:rPr>
+                    <w:rFonts w:ascii="Cambria Math" w:hAnsi="Cambria Math"/>
+                  </w:rPr>
+                  <m:t xml:space="preserve"> </m:t>
+                </m:r>
+              </m:e>
+              <m:e>
+                <m:r>
+                  <w:rPr>
+                    <w:rFonts w:ascii="Cambria Math" w:hAnsi="Cambria Math"/>
+                  </w:rPr>
+                  <m:t>jinak ;nic</m:t>
+                </m:r>
+              </m:e>
+            </m:eqArr>
+          </m:e>
+        </m:d>
+      </m:oMath>
+    </w:p>
+    <w:p>
+      <w:pPr>
+        <w:pStyle w:val="Odstavecseseznamem"/>
+        <w:numPr>
+          <w:ilvl w:val="0"/>
+          <w:numId w:val="8"/>
+        </w:numPr>
+        <w:spacing w:line="360" w:lineRule="auto"/>
+      </w:pPr>
+      <w:r>
+        <w:t>Konec</w:t>
+      </w:r>
+    </w:p>
+    <w:p>
+      <w:pPr>
+        <w:spacing w:line="360" w:lineRule="auto"/>
+      </w:pPr>
+      <w:r>
+        <w:t>Tímto jsou prvky přesunuty za předpokladu, že nové pole mělo alokováno dost prostoru.</w:t>
+      </w:r>
+    </w:p>
+    <w:p>
+      <w:pPr>
+        <w:pStyle w:val="Odstavecseseznamem"/>
+        <w:numPr>
+          <w:ilvl w:val="0"/>
+          <w:numId w:val="12"/>
+        </w:numPr>
+        <w:spacing w:line="360" w:lineRule="auto"/>
+        <w:rPr>
+          <w:lang w:eastAsia="cs-CZ"/>
+        </w:rPr>
+      </w:pPr>
+      <w:r>
+        <w:lastRenderedPageBreak/>
+        <w:t>Toto funguje</w:t>
+      </w:r>
+      <w:r>
+        <w:t>,</w:t>
+      </w:r>
+      <w:r>
+        <w:t xml:space="preserve"> jelikož</w:t>
+      </w:r>
+      <w:r>
+        <w:t xml:space="preserve"> pokud</w:t>
+      </w:r>
+      <w:r>
+        <w:t xml:space="preserve"> </w:t>
+      </w:r>
+      <w:r>
+        <w:t xml:space="preserve">je </w:t>
+      </w:r>
+      <w:r>
+        <w:t xml:space="preserve">nejednoznačný výběr na </w:t>
+      </w:r>
+      <w:r>
+        <w:rPr>
+          <w:i/>
+          <w:iCs/>
+        </w:rPr>
+        <w:t>i</w:t>
+      </w:r>
+      <w:r>
+        <w:t xml:space="preserve"> roven číslu </w:t>
+      </w:r>
+      <w:r>
+        <w:rPr>
+          <w:i/>
+          <w:iCs/>
+        </w:rPr>
+        <w:t>n</w:t>
+      </w:r>
+      <w:r>
+        <w:t xml:space="preserve">, tak dle vlastní definice se musí nejednoznačný výběr na </w:t>
+      </w:r>
+      <w:r>
+        <w:rPr>
+          <w:i/>
+          <w:iCs/>
+        </w:rPr>
+        <w:t>i</w:t>
+      </w:r>
+      <w:r>
+        <w:rPr>
+          <w:i/>
+          <w:iCs/>
+        </w:rPr>
+        <w:t xml:space="preserve"> </w:t>
+      </w:r>
+      <w:r>
+        <w:t>v</w:t>
+      </w:r>
+      <w:r>
+        <w:t>ynásobit nově přidanou dimenzí</w:t>
+      </w:r>
+      <w:r>
+        <w:t xml:space="preserve"> </w:t>
+      </w:r>
+      <w:r>
+        <w:t xml:space="preserve">po </w:t>
+      </w:r>
+      <w:r>
+        <w:t xml:space="preserve">jejím </w:t>
+      </w:r>
+      <w:r>
+        <w:t>přidání</w:t>
+      </w:r>
+      <w:r>
+        <w:t>.</w:t>
+      </w:r>
+      <w:r>
+        <w:t xml:space="preserve"> </w:t>
+      </w:r>
+    </w:p>
+    <w:p>
+      <w:pPr>
+        <w:pStyle w:val="Odstavecseseznamem"/>
+        <w:numPr>
+          <w:ilvl w:val="0"/>
+          <w:numId w:val="12"/>
+        </w:numPr>
+        <w:spacing w:line="360" w:lineRule="auto"/>
+        <w:rPr>
+          <w:lang w:eastAsia="cs-CZ"/>
+        </w:rPr>
+      </w:pPr>
+      <w:r>
+        <w:t>Přidání dimenze ovšem nemění souřadnice již existujících prvků a tím pádem prvky po přidání dimenze zůstanou vedle sebe a začínat budou od nejnižší souřadnice v daném nejednoznačném výběru.</w:t>
+      </w:r>
+      <w:r>
+        <w:t xml:space="preserve"> </w:t>
+      </w:r>
+    </w:p>
+    <w:p>
+      <w:pPr>
+        <w:pStyle w:val="Odstavecseseznamem"/>
+        <w:numPr>
+          <w:ilvl w:val="0"/>
+          <w:numId w:val="12"/>
+        </w:numPr>
+        <w:spacing w:line="360" w:lineRule="auto"/>
+        <w:rPr>
+          <w:lang w:eastAsia="cs-CZ"/>
+        </w:rPr>
+      </w:pPr>
+      <w:r>
+        <w:t xml:space="preserve">To </w:t>
+      </w:r>
+      <w:r>
+        <w:t>(</w:t>
+      </w:r>
+      <w:r>
+        <w:t>díky přepočtu souřadnic na index</w:t>
+      </w:r>
+      <w:r>
+        <w:t>)</w:t>
+      </w:r>
+      <w:r>
+        <w:t xml:space="preserve"> vede k bloku o velikosti nového nejednoznačného výběru s prvky na místě starého nejednoznačného výběru, které je ihned na začátku nového nejednoznačného výb</w:t>
+      </w:r>
+      <w:r>
+        <w:t>ě</w:t>
+      </w:r>
+      <w:r>
+        <w:t>ru</w:t>
+      </w:r>
+      <w:r>
+        <w:t xml:space="preserve"> a je</w:t>
+      </w:r>
+      <w:r>
+        <w:t xml:space="preserve"> násobně menší</w:t>
+      </w:r>
+      <w:r>
+        <w:t xml:space="preserve"> (podle nově přidané dimenze)</w:t>
+      </w:r>
+      <w:r>
+        <w:t>.</w:t>
+      </w:r>
+      <w:r>
+        <w:t xml:space="preserve"> </w:t>
+      </w:r>
+    </w:p>
+    <w:p>
+      <w:pPr>
+        <w:pStyle w:val="Odstavecseseznamem"/>
+        <w:numPr>
+          <w:ilvl w:val="0"/>
+          <w:numId w:val="12"/>
+        </w:numPr>
+        <w:spacing w:line="360" w:lineRule="auto"/>
+        <w:rPr>
+          <w:lang w:eastAsia="cs-CZ"/>
+        </w:rPr>
+      </w:pPr>
+      <w:r>
+        <w:t xml:space="preserve">Dle definice nejednoznačného výběru je nejednoznačný výběr stejně velký pro souřadnice vyplněné do </w:t>
+      </w:r>
+      <w:r>
+        <w:rPr>
+          <w:i/>
+          <w:iCs/>
+        </w:rPr>
+        <w:t>i</w:t>
+      </w:r>
+      <w:r>
+        <w:t xml:space="preserve"> nehledě na hodnotě </w:t>
+      </w:r>
+      <w:r>
+        <w:rPr>
+          <w:i/>
+          <w:iCs/>
+          <w:lang w:eastAsia="cs-CZ"/>
+        </w:rPr>
+        <w:t>D</w:t>
+      </w:r>
+      <w:r>
+        <w:rPr>
+          <w:i/>
+          <w:iCs/>
+          <w:vertAlign w:val="subscript"/>
+          <w:lang w:eastAsia="cs-CZ"/>
+        </w:rPr>
+        <w:t>i</w:t>
+      </w:r>
+      <w:r>
+        <w:rPr>
+          <w:lang w:eastAsia="cs-CZ"/>
+        </w:rPr>
+        <w:t xml:space="preserve"> ani na hodnotách jakékoli velikosti přední ze strany větší signifikance (začátku</w:t>
+      </w:r>
+      <w:r>
+        <w:rPr>
+          <w:lang w:eastAsia="cs-CZ"/>
+        </w:rPr>
+        <w:t xml:space="preserve"> podle big-</w:t>
+      </w:r>
+      <w:proofErr w:type="spellStart"/>
+      <w:r>
+        <w:rPr>
+          <w:lang w:eastAsia="cs-CZ"/>
+        </w:rPr>
+        <w:t>endian</w:t>
+      </w:r>
+      <w:proofErr w:type="spellEnd"/>
+      <w:r>
+        <w:rPr>
+          <w:lang w:eastAsia="cs-CZ"/>
+        </w:rPr>
+        <w:t>).</w:t>
+      </w:r>
+      <w:r>
+        <w:rPr>
+          <w:lang w:eastAsia="cs-CZ"/>
+        </w:rPr>
+        <w:t xml:space="preserve"> Toto implikuje že jde pole prvků poskládat z prvního menšího dílu A a následujícím násobně větším dílem B </w:t>
+      </w:r>
+      <w:r>
+        <w:rPr>
+          <w:lang w:eastAsia="cs-CZ"/>
+        </w:rPr>
+        <w:t xml:space="preserve">střídajícími </w:t>
+      </w:r>
+      <w:r>
+        <w:rPr>
+          <w:lang w:eastAsia="cs-CZ"/>
+        </w:rPr>
+        <w:t xml:space="preserve">se za sebou </w:t>
+      </w:r>
+      <w:r>
+        <w:rPr>
+          <w:lang w:eastAsia="cs-CZ"/>
+        </w:rPr>
+        <w:t xml:space="preserve">a </w:t>
+      </w:r>
+      <w:r>
+        <w:rPr>
+          <w:lang w:eastAsia="cs-CZ"/>
+        </w:rPr>
+        <w:t>opakujícími</w:t>
+      </w:r>
+      <w:r>
+        <w:rPr>
+          <w:lang w:eastAsia="cs-CZ"/>
+        </w:rPr>
+        <w:t xml:space="preserve"> </w:t>
+      </w:r>
+      <w:r>
+        <w:rPr>
+          <w:lang w:eastAsia="cs-CZ"/>
+        </w:rPr>
+        <w:t xml:space="preserve">se </w:t>
+      </w:r>
+      <w:r>
+        <w:rPr>
+          <w:lang w:eastAsia="cs-CZ"/>
+        </w:rPr>
+        <w:t>až do konce.</w:t>
+      </w:r>
+    </w:p>
+    <w:p>
+      <w:pPr>
+        <w:spacing w:line="360" w:lineRule="auto"/>
+        <w:jc w:val="right"/>
+      </w:pPr>
+      <w:r>
+        <w:tab/>
+        <w:t>□</w:t>
+      </w:r>
+    </w:p>
+    <w:p>
+      <w:pPr>
+        <w:spacing w:line="360" w:lineRule="auto"/>
+      </w:pPr>
+      <w:r>
+        <w:t>Metoda na odstranění dimenze funguje podobně. Na vstupu požaduje jenom pozici dimenze k odstranění.</w:t>
+      </w:r>
+      <w:r>
+        <w:t xml:space="preserve"> Strategie aktualizace stavu a alokace nového pole je prakticky stejná. Trik na rychlejší přesun prvků byl použit podobně jako u přidání dimenze, ovšem víceméně obráceně.</w:t>
+      </w:r>
+      <w:r>
+        <w:t xml:space="preserve"> Ne všechny prvky ze starého pole totiž třeba přesouvat do nového</w:t>
+      </w:r>
+      <w:r>
+        <w:t>, jelikož je jisté (pokud dimenze k odstranění není velikosti 1), že se o nějaké prvky přijde.</w:t>
+      </w:r>
+      <w:r>
+        <w:t xml:space="preserve"> Tedy je třeba již řečené rozsahy přesunů a přeskakování indexů vypočítat pro původní pole.</w:t>
+      </w:r>
+      <w:r>
+        <w:t xml:space="preserve"> Přináší so stejnou výhodu na komplexitě jako u přidání dimenze.</w:t>
+      </w:r>
+    </w:p>
+    <w:p>
+      <w:pPr>
         <w:pStyle w:val="Nadpis1"/>
         <w:jc w:val="both"/>
       </w:pPr>
@@ -8097,12 +9003,12 @@
         <w:t>.</w:t>
       </w:r>
       <w:r>
-        <w:t xml:space="preserve"> SYCL standard definuje abstrakce pro umožnění heterogenního programování. To má umožnit použití více druhů výpočetních zařízení v jedné aplikaci. Například použití CPU (s možností jednoduché paralelizace), GPU a </w:t>
+        <w:t xml:space="preserve"> SYCL standard definuje abstrakce pro umožnění heterogenního programování. To má umožnit použití více druhů výpočetních zařízení v jedné aplikaci. Například použití CPU (s možností jednoduché paralelizace), GPU a podobně.</w:t>
+      </w:r>
+      <w:r>
+        <w:t xml:space="preserve"> </w:t>
       </w:r>
       <w:proofErr w:type="spellStart"/>
-      <w:r>
-        <w:t>podobně.</w:t>
-      </w:r>
       <w:r>
         <w:t>AdaptiveCpp</w:t>
       </w:r>
@@ -11715,102 +12621,16 @@
 <file path=word/numbering.xml><?xml version="1.0" encoding="utf-8"?>
 <w:numbering xmlns:wpc="http://schemas.microsoft.com/office/word/2010/wordprocessingCanvas" xmlns:cx="http://schemas.microsoft.com/office/drawing/2014/chartex" xmlns:cx1="http://schemas.microsoft.com/office/drawing/2015/9/8/chartex" xmlns:cx2="http://schemas.microsoft.com/office/drawing/2015/10/21/chartex" xmlns:cx3="http://schemas.microsoft.com/office/drawing/2016/5/9/chartex" xmlns:cx4="http://schemas.microsoft.com/office/drawing/2016/5/10/chartex" xmlns:cx5="http://schemas.microsoft.com/office/drawing/2016/5/11/chartex" xmlns:cx6="http://schemas.microsoft.com/office/drawing/2016/5/12/chartex" xmlns:cx7="http://schemas.microsoft.com/office/drawing/2016/5/13/chartex" xmlns:cx8="http://schemas.microsoft.com/office/drawing/2016/5/14/chartex" xmlns:mc="http://schemas.openxmlformats.org/markup-compatibility/2006" xmlns:aink="http://schemas.microsoft.com/office/drawing/2016/ink" xmlns:am3d="http://schemas.microsoft.com/office/drawing/2017/model3d" xmlns:o="urn:schemas-microsoft-com:office:office" xmlns:oel="http://schemas.microsoft.com/office/2019/extlst" xmlns:r="http://schemas.openxmlformats.org/officeDocument/2006/relationships" xmlns:m="http://schemas.openxmlformats.org/officeDocument/2006/math" xmlns:v="urn:schemas-microsoft-com:vml" xmlns:wp14="http://schemas.microsoft.com/office/word/2010/wordprocessingDrawing" xmlns:wp="http://schemas.openxmlformats.org/drawingml/2006/wordprocessingDrawing" xmlns:w10="urn:schemas-microsoft-com:office:word" xmlns:w="http://schemas.openxmlformats.org/wordprocessingml/2006/main" xmlns:w14="http://schemas.microsoft.com/office/word/2010/wordml" xmlns:w15="http://schemas.microsoft.com/office/word/2012/wordml" xmlns:w16cex="http://schemas.microsoft.com/office/word/2018/wordml/cex" xmlns:w16cid="http://schemas.microsoft.com/office/word/2016/wordml/cid" xmlns:w16="http://schemas.microsoft.com/office/word/2018/wordml" xmlns:w16du="http://schemas.microsoft.com/office/word/2023/wordml/word16du" xmlns:w16sdtdh="http://schemas.microsoft.com/office/word/2020/wordml/sdtdatahash" xmlns:w16sdtfl="http://schemas.microsoft.com/office/word/2024/wordml/sdtformatlock" xmlns:w16se="http://schemas.microsoft.com/office/word/2015/wordml/symex" xmlns:wpg="http://schemas.microsoft.com/office/word/2010/wordprocessingGroup" xmlns:wpi="http://schemas.microsoft.com/office/word/2010/wordprocessingInk" xmlns:wne="http://schemas.microsoft.com/office/word/2006/wordml" xmlns:wps="http://schemas.microsoft.com/office/word/2010/wordprocessingShape" mc:Ignorable="w14 w15 w16se w16cid w16 w16cex w16sdtdh w16sdtfl w16du wp14">
   <w:abstractNum w:abstractNumId="0" w15:restartNumberingAfterBreak="0">
-    <w:nsid w:val="0852758B"/>
+    <w:nsid w:val="03451D26"/>
     <w:multiLevelType w:val="hybridMultilevel"/>
-    <w:tmpl w:val="555E8D38"/>
-    <w:lvl w:ilvl="0" w:tplc="1000000F">
+    <w:tmpl w:val="FB523530"/>
+    <w:lvl w:ilvl="0" w:tplc="F3B05302">
       <w:start w:val="1"/>
       <w:numFmt w:val="decimal"/>
-      <w:lvlText w:val="%1."/>
+      <w:lvlText w:val="%1)"/>
       <w:lvlJc w:val="left"/>
       <w:pPr>
-        <w:ind w:left="720" w:hanging="360"/>
-      </w:pPr>
-    </w:lvl>
-    <w:lvl w:ilvl="1" w:tplc="10000019" w:tentative="1">
-      <w:start w:val="1"/>
-      <w:numFmt w:val="lowerLetter"/>
-      <w:lvlText w:val="%2."/>
-      <w:lvlJc w:val="left"/>
-      <w:pPr>
-        <w:ind w:left="1440" w:hanging="360"/>
-      </w:pPr>
-    </w:lvl>
-    <w:lvl w:ilvl="2" w:tplc="1000001B" w:tentative="1">
-      <w:start w:val="1"/>
-      <w:numFmt w:val="lowerRoman"/>
-      <w:lvlText w:val="%3."/>
-      <w:lvlJc w:val="right"/>
-      <w:pPr>
-        <w:ind w:left="2160" w:hanging="180"/>
-      </w:pPr>
-    </w:lvl>
-    <w:lvl w:ilvl="3" w:tplc="1000000F" w:tentative="1">
-      <w:start w:val="1"/>
-      <w:numFmt w:val="decimal"/>
-      <w:lvlText w:val="%4."/>
-      <w:lvlJc w:val="left"/>
-      <w:pPr>
-        <w:ind w:left="2880" w:hanging="360"/>
-      </w:pPr>
-    </w:lvl>
-    <w:lvl w:ilvl="4" w:tplc="10000019" w:tentative="1">
-      <w:start w:val="1"/>
-      <w:numFmt w:val="lowerLetter"/>
-      <w:lvlText w:val="%5."/>
-      <w:lvlJc w:val="left"/>
-      <w:pPr>
-        <w:ind w:left="3600" w:hanging="360"/>
-      </w:pPr>
-    </w:lvl>
-    <w:lvl w:ilvl="5" w:tplc="1000001B" w:tentative="1">
-      <w:start w:val="1"/>
-      <w:numFmt w:val="lowerRoman"/>
-      <w:lvlText w:val="%6."/>
-      <w:lvlJc w:val="right"/>
-      <w:pPr>
-        <w:ind w:left="4320" w:hanging="180"/>
-      </w:pPr>
-    </w:lvl>
-    <w:lvl w:ilvl="6" w:tplc="1000000F" w:tentative="1">
-      <w:start w:val="1"/>
-      <w:numFmt w:val="decimal"/>
-      <w:lvlText w:val="%7."/>
-      <w:lvlJc w:val="left"/>
-      <w:pPr>
-        <w:ind w:left="5040" w:hanging="360"/>
-      </w:pPr>
-    </w:lvl>
-    <w:lvl w:ilvl="7" w:tplc="10000019" w:tentative="1">
-      <w:start w:val="1"/>
-      <w:numFmt w:val="lowerLetter"/>
-      <w:lvlText w:val="%8."/>
-      <w:lvlJc w:val="left"/>
-      <w:pPr>
-        <w:ind w:left="5760" w:hanging="360"/>
-      </w:pPr>
-    </w:lvl>
-    <w:lvl w:ilvl="8" w:tplc="1000001B" w:tentative="1">
-      <w:start w:val="1"/>
-      <w:numFmt w:val="lowerRoman"/>
-      <w:lvlText w:val="%9."/>
-      <w:lvlJc w:val="right"/>
-      <w:pPr>
-        <w:ind w:left="6480" w:hanging="180"/>
-      </w:pPr>
-    </w:lvl>
-  </w:abstractNum>
-  <w:abstractNum w:abstractNumId="1" w15:restartNumberingAfterBreak="0">
-    <w:nsid w:val="12934C2F"/>
-    <w:multiLevelType w:val="hybridMultilevel"/>
-    <w:tmpl w:val="D5743A56"/>
-    <w:lvl w:ilvl="0" w:tplc="1000000F">
-      <w:start w:val="1"/>
-      <w:numFmt w:val="decimal"/>
-      <w:lvlText w:val="%1."/>
-      <w:lvlJc w:val="left"/>
-      <w:pPr>
-        <w:ind w:left="720" w:hanging="360"/>
+        <w:ind w:left="1069" w:hanging="360"/>
       </w:pPr>
       <w:rPr>
         <w:rFonts w:hint="default"/>
@@ -11822,7 +12642,7 @@
       <w:lvlText w:val="%2."/>
       <w:lvlJc w:val="left"/>
       <w:pPr>
-        <w:ind w:left="1440" w:hanging="360"/>
+        <w:ind w:left="1789" w:hanging="360"/>
       </w:pPr>
     </w:lvl>
     <w:lvl w:ilvl="2" w:tplc="1000001B" w:tentative="1">
@@ -11831,7 +12651,7 @@
       <w:lvlText w:val="%3."/>
       <w:lvlJc w:val="right"/>
       <w:pPr>
-        <w:ind w:left="2160" w:hanging="180"/>
+        <w:ind w:left="2509" w:hanging="180"/>
       </w:pPr>
     </w:lvl>
     <w:lvl w:ilvl="3" w:tplc="1000000F" w:tentative="1">
@@ -11840,7 +12660,7 @@
       <w:lvlText w:val="%4."/>
       <w:lvlJc w:val="left"/>
       <w:pPr>
-        <w:ind w:left="2880" w:hanging="360"/>
+        <w:ind w:left="3229" w:hanging="360"/>
       </w:pPr>
     </w:lvl>
     <w:lvl w:ilvl="4" w:tplc="10000019" w:tentative="1">
@@ -11849,7 +12669,7 @@
       <w:lvlText w:val="%5."/>
       <w:lvlJc w:val="left"/>
       <w:pPr>
-        <w:ind w:left="3600" w:hanging="360"/>
+        <w:ind w:left="3949" w:hanging="360"/>
       </w:pPr>
     </w:lvl>
     <w:lvl w:ilvl="5" w:tplc="1000001B" w:tentative="1">
@@ -11858,7 +12678,7 @@
       <w:lvlText w:val="%6."/>
       <w:lvlJc w:val="right"/>
       <w:pPr>
-        <w:ind w:left="4320" w:hanging="180"/>
+        <w:ind w:left="4669" w:hanging="180"/>
       </w:pPr>
     </w:lvl>
     <w:lvl w:ilvl="6" w:tplc="1000000F" w:tentative="1">
@@ -11867,7 +12687,7 @@
       <w:lvlText w:val="%7."/>
       <w:lvlJc w:val="left"/>
       <w:pPr>
-        <w:ind w:left="5040" w:hanging="360"/>
+        <w:ind w:left="5389" w:hanging="360"/>
       </w:pPr>
     </w:lvl>
     <w:lvl w:ilvl="7" w:tplc="10000019" w:tentative="1">
@@ -11876,7 +12696,7 @@
       <w:lvlText w:val="%8."/>
       <w:lvlJc w:val="left"/>
       <w:pPr>
-        <w:ind w:left="5760" w:hanging="360"/>
+        <w:ind w:left="6109" w:hanging="360"/>
       </w:pPr>
     </w:lvl>
     <w:lvl w:ilvl="8" w:tplc="1000001B" w:tentative="1">
@@ -11885,11 +12705,525 @@
       <w:lvlText w:val="%9."/>
       <w:lvlJc w:val="right"/>
       <w:pPr>
+        <w:ind w:left="6829" w:hanging="180"/>
+      </w:pPr>
+    </w:lvl>
+  </w:abstractNum>
+  <w:abstractNum w:abstractNumId="1" w15:restartNumberingAfterBreak="0">
+    <w:nsid w:val="0852758B"/>
+    <w:multiLevelType w:val="hybridMultilevel"/>
+    <w:tmpl w:val="555E8D38"/>
+    <w:lvl w:ilvl="0" w:tplc="1000000F">
+      <w:start w:val="1"/>
+      <w:numFmt w:val="decimal"/>
+      <w:lvlText w:val="%1."/>
+      <w:lvlJc w:val="left"/>
+      <w:pPr>
+        <w:ind w:left="720" w:hanging="360"/>
+      </w:pPr>
+    </w:lvl>
+    <w:lvl w:ilvl="1" w:tplc="10000019" w:tentative="1">
+      <w:start w:val="1"/>
+      <w:numFmt w:val="lowerLetter"/>
+      <w:lvlText w:val="%2."/>
+      <w:lvlJc w:val="left"/>
+      <w:pPr>
+        <w:ind w:left="1440" w:hanging="360"/>
+      </w:pPr>
+    </w:lvl>
+    <w:lvl w:ilvl="2" w:tplc="1000001B" w:tentative="1">
+      <w:start w:val="1"/>
+      <w:numFmt w:val="lowerRoman"/>
+      <w:lvlText w:val="%3."/>
+      <w:lvlJc w:val="right"/>
+      <w:pPr>
+        <w:ind w:left="2160" w:hanging="180"/>
+      </w:pPr>
+    </w:lvl>
+    <w:lvl w:ilvl="3" w:tplc="1000000F" w:tentative="1">
+      <w:start w:val="1"/>
+      <w:numFmt w:val="decimal"/>
+      <w:lvlText w:val="%4."/>
+      <w:lvlJc w:val="left"/>
+      <w:pPr>
+        <w:ind w:left="2880" w:hanging="360"/>
+      </w:pPr>
+    </w:lvl>
+    <w:lvl w:ilvl="4" w:tplc="10000019" w:tentative="1">
+      <w:start w:val="1"/>
+      <w:numFmt w:val="lowerLetter"/>
+      <w:lvlText w:val="%5."/>
+      <w:lvlJc w:val="left"/>
+      <w:pPr>
+        <w:ind w:left="3600" w:hanging="360"/>
+      </w:pPr>
+    </w:lvl>
+    <w:lvl w:ilvl="5" w:tplc="1000001B" w:tentative="1">
+      <w:start w:val="1"/>
+      <w:numFmt w:val="lowerRoman"/>
+      <w:lvlText w:val="%6."/>
+      <w:lvlJc w:val="right"/>
+      <w:pPr>
+        <w:ind w:left="4320" w:hanging="180"/>
+      </w:pPr>
+    </w:lvl>
+    <w:lvl w:ilvl="6" w:tplc="1000000F" w:tentative="1">
+      <w:start w:val="1"/>
+      <w:numFmt w:val="decimal"/>
+      <w:lvlText w:val="%7."/>
+      <w:lvlJc w:val="left"/>
+      <w:pPr>
+        <w:ind w:left="5040" w:hanging="360"/>
+      </w:pPr>
+    </w:lvl>
+    <w:lvl w:ilvl="7" w:tplc="10000019" w:tentative="1">
+      <w:start w:val="1"/>
+      <w:numFmt w:val="lowerLetter"/>
+      <w:lvlText w:val="%8."/>
+      <w:lvlJc w:val="left"/>
+      <w:pPr>
+        <w:ind w:left="5760" w:hanging="360"/>
+      </w:pPr>
+    </w:lvl>
+    <w:lvl w:ilvl="8" w:tplc="1000001B" w:tentative="1">
+      <w:start w:val="1"/>
+      <w:numFmt w:val="lowerRoman"/>
+      <w:lvlText w:val="%9."/>
+      <w:lvlJc w:val="right"/>
+      <w:pPr>
         <w:ind w:left="6480" w:hanging="180"/>
       </w:pPr>
     </w:lvl>
   </w:abstractNum>
   <w:abstractNum w:abstractNumId="2" w15:restartNumberingAfterBreak="0">
+    <w:nsid w:val="0CE7279B"/>
+    <w:multiLevelType w:val="hybridMultilevel"/>
+    <w:tmpl w:val="1E5879EC"/>
+    <w:lvl w:ilvl="0" w:tplc="10000001">
+      <w:start w:val="1"/>
+      <w:numFmt w:val="bullet"/>
+      <w:lvlText w:val=""/>
+      <w:lvlJc w:val="left"/>
+      <w:pPr>
+        <w:ind w:left="1789" w:hanging="360"/>
+      </w:pPr>
+      <w:rPr>
+        <w:rFonts w:ascii="Symbol" w:hAnsi="Symbol" w:hint="default"/>
+      </w:rPr>
+    </w:lvl>
+    <w:lvl w:ilvl="1" w:tplc="10000003" w:tentative="1">
+      <w:start w:val="1"/>
+      <w:numFmt w:val="bullet"/>
+      <w:lvlText w:val="o"/>
+      <w:lvlJc w:val="left"/>
+      <w:pPr>
+        <w:ind w:left="2509" w:hanging="360"/>
+      </w:pPr>
+      <w:rPr>
+        <w:rFonts w:ascii="Courier New" w:hAnsi="Courier New" w:cs="Courier New" w:hint="default"/>
+      </w:rPr>
+    </w:lvl>
+    <w:lvl w:ilvl="2" w:tplc="10000005" w:tentative="1">
+      <w:start w:val="1"/>
+      <w:numFmt w:val="bullet"/>
+      <w:lvlText w:val=""/>
+      <w:lvlJc w:val="left"/>
+      <w:pPr>
+        <w:ind w:left="3229" w:hanging="360"/>
+      </w:pPr>
+      <w:rPr>
+        <w:rFonts w:ascii="Wingdings" w:hAnsi="Wingdings" w:hint="default"/>
+      </w:rPr>
+    </w:lvl>
+    <w:lvl w:ilvl="3" w:tplc="10000001" w:tentative="1">
+      <w:start w:val="1"/>
+      <w:numFmt w:val="bullet"/>
+      <w:lvlText w:val=""/>
+      <w:lvlJc w:val="left"/>
+      <w:pPr>
+        <w:ind w:left="3949" w:hanging="360"/>
+      </w:pPr>
+      <w:rPr>
+        <w:rFonts w:ascii="Symbol" w:hAnsi="Symbol" w:hint="default"/>
+      </w:rPr>
+    </w:lvl>
+    <w:lvl w:ilvl="4" w:tplc="10000003" w:tentative="1">
+      <w:start w:val="1"/>
+      <w:numFmt w:val="bullet"/>
+      <w:lvlText w:val="o"/>
+      <w:lvlJc w:val="left"/>
+      <w:pPr>
+        <w:ind w:left="4669" w:hanging="360"/>
+      </w:pPr>
+      <w:rPr>
+        <w:rFonts w:ascii="Courier New" w:hAnsi="Courier New" w:cs="Courier New" w:hint="default"/>
+      </w:rPr>
+    </w:lvl>
+    <w:lvl w:ilvl="5" w:tplc="10000005" w:tentative="1">
+      <w:start w:val="1"/>
+      <w:numFmt w:val="bullet"/>
+      <w:lvlText w:val=""/>
+      <w:lvlJc w:val="left"/>
+      <w:pPr>
+        <w:ind w:left="5389" w:hanging="360"/>
+      </w:pPr>
+      <w:rPr>
+        <w:rFonts w:ascii="Wingdings" w:hAnsi="Wingdings" w:hint="default"/>
+      </w:rPr>
+    </w:lvl>
+    <w:lvl w:ilvl="6" w:tplc="10000001" w:tentative="1">
+      <w:start w:val="1"/>
+      <w:numFmt w:val="bullet"/>
+      <w:lvlText w:val=""/>
+      <w:lvlJc w:val="left"/>
+      <w:pPr>
+        <w:ind w:left="6109" w:hanging="360"/>
+      </w:pPr>
+      <w:rPr>
+        <w:rFonts w:ascii="Symbol" w:hAnsi="Symbol" w:hint="default"/>
+      </w:rPr>
+    </w:lvl>
+    <w:lvl w:ilvl="7" w:tplc="10000003" w:tentative="1">
+      <w:start w:val="1"/>
+      <w:numFmt w:val="bullet"/>
+      <w:lvlText w:val="o"/>
+      <w:lvlJc w:val="left"/>
+      <w:pPr>
+        <w:ind w:left="6829" w:hanging="360"/>
+      </w:pPr>
+      <w:rPr>
+        <w:rFonts w:ascii="Courier New" w:hAnsi="Courier New" w:cs="Courier New" w:hint="default"/>
+      </w:rPr>
+    </w:lvl>
+    <w:lvl w:ilvl="8" w:tplc="10000005" w:tentative="1">
+      <w:start w:val="1"/>
+      <w:numFmt w:val="bullet"/>
+      <w:lvlText w:val=""/>
+      <w:lvlJc w:val="left"/>
+      <w:pPr>
+        <w:ind w:left="7549" w:hanging="360"/>
+      </w:pPr>
+      <w:rPr>
+        <w:rFonts w:ascii="Wingdings" w:hAnsi="Wingdings" w:hint="default"/>
+      </w:rPr>
+    </w:lvl>
+  </w:abstractNum>
+  <w:abstractNum w:abstractNumId="3" w15:restartNumberingAfterBreak="0">
+    <w:nsid w:val="10A95182"/>
+    <w:multiLevelType w:val="hybridMultilevel"/>
+    <w:tmpl w:val="4682413C"/>
+    <w:lvl w:ilvl="0" w:tplc="10000001">
+      <w:start w:val="1"/>
+      <w:numFmt w:val="bullet"/>
+      <w:lvlText w:val=""/>
+      <w:lvlJc w:val="left"/>
+      <w:pPr>
+        <w:ind w:left="1429" w:hanging="360"/>
+      </w:pPr>
+      <w:rPr>
+        <w:rFonts w:ascii="Symbol" w:hAnsi="Symbol" w:hint="default"/>
+      </w:rPr>
+    </w:lvl>
+    <w:lvl w:ilvl="1" w:tplc="10000003" w:tentative="1">
+      <w:start w:val="1"/>
+      <w:numFmt w:val="bullet"/>
+      <w:lvlText w:val="o"/>
+      <w:lvlJc w:val="left"/>
+      <w:pPr>
+        <w:ind w:left="2149" w:hanging="360"/>
+      </w:pPr>
+      <w:rPr>
+        <w:rFonts w:ascii="Courier New" w:hAnsi="Courier New" w:cs="Courier New" w:hint="default"/>
+      </w:rPr>
+    </w:lvl>
+    <w:lvl w:ilvl="2" w:tplc="10000005" w:tentative="1">
+      <w:start w:val="1"/>
+      <w:numFmt w:val="bullet"/>
+      <w:lvlText w:val=""/>
+      <w:lvlJc w:val="left"/>
+      <w:pPr>
+        <w:ind w:left="2869" w:hanging="360"/>
+      </w:pPr>
+      <w:rPr>
+        <w:rFonts w:ascii="Wingdings" w:hAnsi="Wingdings" w:hint="default"/>
+      </w:rPr>
+    </w:lvl>
+    <w:lvl w:ilvl="3" w:tplc="10000001" w:tentative="1">
+      <w:start w:val="1"/>
+      <w:numFmt w:val="bullet"/>
+      <w:lvlText w:val=""/>
+      <w:lvlJc w:val="left"/>
+      <w:pPr>
+        <w:ind w:left="3589" w:hanging="360"/>
+      </w:pPr>
+      <w:rPr>
+        <w:rFonts w:ascii="Symbol" w:hAnsi="Symbol" w:hint="default"/>
+      </w:rPr>
+    </w:lvl>
+    <w:lvl w:ilvl="4" w:tplc="10000003" w:tentative="1">
+      <w:start w:val="1"/>
+      <w:numFmt w:val="bullet"/>
+      <w:lvlText w:val="o"/>
+      <w:lvlJc w:val="left"/>
+      <w:pPr>
+        <w:ind w:left="4309" w:hanging="360"/>
+      </w:pPr>
+      <w:rPr>
+        <w:rFonts w:ascii="Courier New" w:hAnsi="Courier New" w:cs="Courier New" w:hint="default"/>
+      </w:rPr>
+    </w:lvl>
+    <w:lvl w:ilvl="5" w:tplc="10000005" w:tentative="1">
+      <w:start w:val="1"/>
+      <w:numFmt w:val="bullet"/>
+      <w:lvlText w:val=""/>
+      <w:lvlJc w:val="left"/>
+      <w:pPr>
+        <w:ind w:left="5029" w:hanging="360"/>
+      </w:pPr>
+      <w:rPr>
+        <w:rFonts w:ascii="Wingdings" w:hAnsi="Wingdings" w:hint="default"/>
+      </w:rPr>
+    </w:lvl>
+    <w:lvl w:ilvl="6" w:tplc="10000001" w:tentative="1">
+      <w:start w:val="1"/>
+      <w:numFmt w:val="bullet"/>
+      <w:lvlText w:val=""/>
+      <w:lvlJc w:val="left"/>
+      <w:pPr>
+        <w:ind w:left="5749" w:hanging="360"/>
+      </w:pPr>
+      <w:rPr>
+        <w:rFonts w:ascii="Symbol" w:hAnsi="Symbol" w:hint="default"/>
+      </w:rPr>
+    </w:lvl>
+    <w:lvl w:ilvl="7" w:tplc="10000003" w:tentative="1">
+      <w:start w:val="1"/>
+      <w:numFmt w:val="bullet"/>
+      <w:lvlText w:val="o"/>
+      <w:lvlJc w:val="left"/>
+      <w:pPr>
+        <w:ind w:left="6469" w:hanging="360"/>
+      </w:pPr>
+      <w:rPr>
+        <w:rFonts w:ascii="Courier New" w:hAnsi="Courier New" w:cs="Courier New" w:hint="default"/>
+      </w:rPr>
+    </w:lvl>
+    <w:lvl w:ilvl="8" w:tplc="10000005" w:tentative="1">
+      <w:start w:val="1"/>
+      <w:numFmt w:val="bullet"/>
+      <w:lvlText w:val=""/>
+      <w:lvlJc w:val="left"/>
+      <w:pPr>
+        <w:ind w:left="7189" w:hanging="360"/>
+      </w:pPr>
+      <w:rPr>
+        <w:rFonts w:ascii="Wingdings" w:hAnsi="Wingdings" w:hint="default"/>
+      </w:rPr>
+    </w:lvl>
+  </w:abstractNum>
+  <w:abstractNum w:abstractNumId="4" w15:restartNumberingAfterBreak="0">
+    <w:nsid w:val="12934C2F"/>
+    <w:multiLevelType w:val="hybridMultilevel"/>
+    <w:tmpl w:val="D5743A56"/>
+    <w:lvl w:ilvl="0" w:tplc="1000000F">
+      <w:start w:val="1"/>
+      <w:numFmt w:val="decimal"/>
+      <w:lvlText w:val="%1."/>
+      <w:lvlJc w:val="left"/>
+      <w:pPr>
+        <w:ind w:left="720" w:hanging="360"/>
+      </w:pPr>
+      <w:rPr>
+        <w:rFonts w:hint="default"/>
+      </w:rPr>
+    </w:lvl>
+    <w:lvl w:ilvl="1" w:tplc="10000019" w:tentative="1">
+      <w:start w:val="1"/>
+      <w:numFmt w:val="lowerLetter"/>
+      <w:lvlText w:val="%2."/>
+      <w:lvlJc w:val="left"/>
+      <w:pPr>
+        <w:ind w:left="1440" w:hanging="360"/>
+      </w:pPr>
+    </w:lvl>
+    <w:lvl w:ilvl="2" w:tplc="1000001B" w:tentative="1">
+      <w:start w:val="1"/>
+      <w:numFmt w:val="lowerRoman"/>
+      <w:lvlText w:val="%3."/>
+      <w:lvlJc w:val="right"/>
+      <w:pPr>
+        <w:ind w:left="2160" w:hanging="180"/>
+      </w:pPr>
+    </w:lvl>
+    <w:lvl w:ilvl="3" w:tplc="1000000F" w:tentative="1">
+      <w:start w:val="1"/>
+      <w:numFmt w:val="decimal"/>
+      <w:lvlText w:val="%4."/>
+      <w:lvlJc w:val="left"/>
+      <w:pPr>
+        <w:ind w:left="2880" w:hanging="360"/>
+      </w:pPr>
+    </w:lvl>
+    <w:lvl w:ilvl="4" w:tplc="10000019" w:tentative="1">
+      <w:start w:val="1"/>
+      <w:numFmt w:val="lowerLetter"/>
+      <w:lvlText w:val="%5."/>
+      <w:lvlJc w:val="left"/>
+      <w:pPr>
+        <w:ind w:left="3600" w:hanging="360"/>
+      </w:pPr>
+    </w:lvl>
+    <w:lvl w:ilvl="5" w:tplc="1000001B" w:tentative="1">
+      <w:start w:val="1"/>
+      <w:numFmt w:val="lowerRoman"/>
+      <w:lvlText w:val="%6."/>
+      <w:lvlJc w:val="right"/>
+      <w:pPr>
+        <w:ind w:left="4320" w:hanging="180"/>
+      </w:pPr>
+    </w:lvl>
+    <w:lvl w:ilvl="6" w:tplc="1000000F" w:tentative="1">
+      <w:start w:val="1"/>
+      <w:numFmt w:val="decimal"/>
+      <w:lvlText w:val="%7."/>
+      <w:lvlJc w:val="left"/>
+      <w:pPr>
+        <w:ind w:left="5040" w:hanging="360"/>
+      </w:pPr>
+    </w:lvl>
+    <w:lvl w:ilvl="7" w:tplc="10000019" w:tentative="1">
+      <w:start w:val="1"/>
+      <w:numFmt w:val="lowerLetter"/>
+      <w:lvlText w:val="%8."/>
+      <w:lvlJc w:val="left"/>
+      <w:pPr>
+        <w:ind w:left="5760" w:hanging="360"/>
+      </w:pPr>
+    </w:lvl>
+    <w:lvl w:ilvl="8" w:tplc="1000001B" w:tentative="1">
+      <w:start w:val="1"/>
+      <w:numFmt w:val="lowerRoman"/>
+      <w:lvlText w:val="%9."/>
+      <w:lvlJc w:val="right"/>
+      <w:pPr>
+        <w:ind w:left="6480" w:hanging="180"/>
+      </w:pPr>
+    </w:lvl>
+  </w:abstractNum>
+  <w:abstractNum w:abstractNumId="5" w15:restartNumberingAfterBreak="0">
+    <w:nsid w:val="1336345F"/>
+    <w:multiLevelType w:val="hybridMultilevel"/>
+    <w:tmpl w:val="C16005A6"/>
+    <w:lvl w:ilvl="0" w:tplc="10000001">
+      <w:start w:val="1"/>
+      <w:numFmt w:val="bullet"/>
+      <w:lvlText w:val=""/>
+      <w:lvlJc w:val="left"/>
+      <w:pPr>
+        <w:ind w:left="1429" w:hanging="360"/>
+      </w:pPr>
+      <w:rPr>
+        <w:rFonts w:ascii="Symbol" w:hAnsi="Symbol" w:hint="default"/>
+      </w:rPr>
+    </w:lvl>
+    <w:lvl w:ilvl="1" w:tplc="10000003" w:tentative="1">
+      <w:start w:val="1"/>
+      <w:numFmt w:val="bullet"/>
+      <w:lvlText w:val="o"/>
+      <w:lvlJc w:val="left"/>
+      <w:pPr>
+        <w:ind w:left="2149" w:hanging="360"/>
+      </w:pPr>
+      <w:rPr>
+        <w:rFonts w:ascii="Courier New" w:hAnsi="Courier New" w:cs="Courier New" w:hint="default"/>
+      </w:rPr>
+    </w:lvl>
+    <w:lvl w:ilvl="2" w:tplc="10000005" w:tentative="1">
+      <w:start w:val="1"/>
+      <w:numFmt w:val="bullet"/>
+      <w:lvlText w:val=""/>
+      <w:lvlJc w:val="left"/>
+      <w:pPr>
+        <w:ind w:left="2869" w:hanging="360"/>
+      </w:pPr>
+      <w:rPr>
+        <w:rFonts w:ascii="Wingdings" w:hAnsi="Wingdings" w:hint="default"/>
+      </w:rPr>
+    </w:lvl>
+    <w:lvl w:ilvl="3" w:tplc="10000001" w:tentative="1">
+      <w:start w:val="1"/>
+      <w:numFmt w:val="bullet"/>
+      <w:lvlText w:val=""/>
+      <w:lvlJc w:val="left"/>
+      <w:pPr>
+        <w:ind w:left="3589" w:hanging="360"/>
+      </w:pPr>
+      <w:rPr>
+        <w:rFonts w:ascii="Symbol" w:hAnsi="Symbol" w:hint="default"/>
+      </w:rPr>
+    </w:lvl>
+    <w:lvl w:ilvl="4" w:tplc="10000003" w:tentative="1">
+      <w:start w:val="1"/>
+      <w:numFmt w:val="bullet"/>
+      <w:lvlText w:val="o"/>
+      <w:lvlJc w:val="left"/>
+      <w:pPr>
+        <w:ind w:left="4309" w:hanging="360"/>
+      </w:pPr>
+      <w:rPr>
+        <w:rFonts w:ascii="Courier New" w:hAnsi="Courier New" w:cs="Courier New" w:hint="default"/>
+      </w:rPr>
+    </w:lvl>
+    <w:lvl w:ilvl="5" w:tplc="10000005" w:tentative="1">
+      <w:start w:val="1"/>
+      <w:numFmt w:val="bullet"/>
+      <w:lvlText w:val=""/>
+      <w:lvlJc w:val="left"/>
+      <w:pPr>
+        <w:ind w:left="5029" w:hanging="360"/>
+      </w:pPr>
+      <w:rPr>
+        <w:rFonts w:ascii="Wingdings" w:hAnsi="Wingdings" w:hint="default"/>
+      </w:rPr>
+    </w:lvl>
+    <w:lvl w:ilvl="6" w:tplc="10000001" w:tentative="1">
+      <w:start w:val="1"/>
+      <w:numFmt w:val="bullet"/>
+      <w:lvlText w:val=""/>
+      <w:lvlJc w:val="left"/>
+      <w:pPr>
+        <w:ind w:left="5749" w:hanging="360"/>
+      </w:pPr>
+      <w:rPr>
+        <w:rFonts w:ascii="Symbol" w:hAnsi="Symbol" w:hint="default"/>
+      </w:rPr>
+    </w:lvl>
+    <w:lvl w:ilvl="7" w:tplc="10000003" w:tentative="1">
+      <w:start w:val="1"/>
+      <w:numFmt w:val="bullet"/>
+      <w:lvlText w:val="o"/>
+      <w:lvlJc w:val="left"/>
+      <w:pPr>
+        <w:ind w:left="6469" w:hanging="360"/>
+      </w:pPr>
+      <w:rPr>
+        <w:rFonts w:ascii="Courier New" w:hAnsi="Courier New" w:cs="Courier New" w:hint="default"/>
+      </w:rPr>
+    </w:lvl>
+    <w:lvl w:ilvl="8" w:tplc="10000005" w:tentative="1">
+      <w:start w:val="1"/>
+      <w:numFmt w:val="bullet"/>
+      <w:lvlText w:val=""/>
+      <w:lvlJc w:val="left"/>
+      <w:pPr>
+        <w:ind w:left="7189" w:hanging="360"/>
+      </w:pPr>
+      <w:rPr>
+        <w:rFonts w:ascii="Wingdings" w:hAnsi="Wingdings" w:hint="default"/>
+      </w:rPr>
+    </w:lvl>
+  </w:abstractNum>
+  <w:abstractNum w:abstractNumId="6" w15:restartNumberingAfterBreak="0">
     <w:nsid w:val="315D782D"/>
     <w:multiLevelType w:val="hybridMultilevel"/>
     <w:tmpl w:val="E4181C80"/>
@@ -12002,7 +13336,7 @@
       </w:rPr>
     </w:lvl>
   </w:abstractNum>
-  <w:abstractNum w:abstractNumId="3" w15:restartNumberingAfterBreak="0">
+  <w:abstractNum w:abstractNumId="7" w15:restartNumberingAfterBreak="0">
     <w:nsid w:val="4A5A348B"/>
     <w:multiLevelType w:val="hybridMultilevel"/>
     <w:tmpl w:val="A30C79EE"/>
@@ -12091,17 +13425,17 @@
       </w:pPr>
     </w:lvl>
   </w:abstractNum>
-  <w:abstractNum w:abstractNumId="4" w15:restartNumberingAfterBreak="0">
-    <w:nsid w:val="627D13D0"/>
+  <w:abstractNum w:abstractNumId="8" w15:restartNumberingAfterBreak="0">
+    <w:nsid w:val="586270F6"/>
     <w:multiLevelType w:val="hybridMultilevel"/>
-    <w:tmpl w:val="59129952"/>
-    <w:lvl w:ilvl="0" w:tplc="10000011">
+    <w:tmpl w:val="B1D00598"/>
+    <w:lvl w:ilvl="0" w:tplc="5C6AD858">
       <w:start w:val="1"/>
       <w:numFmt w:val="decimal"/>
       <w:lvlText w:val="%1)"/>
       <w:lvlJc w:val="left"/>
       <w:pPr>
-        <w:ind w:left="720" w:hanging="360"/>
+        <w:ind w:left="1069" w:hanging="360"/>
       </w:pPr>
       <w:rPr>
         <w:rFonts w:hint="default"/>
@@ -12113,7 +13447,7 @@
       <w:lvlText w:val="%2."/>
       <w:lvlJc w:val="left"/>
       <w:pPr>
-        <w:ind w:left="1440" w:hanging="360"/>
+        <w:ind w:left="1789" w:hanging="360"/>
       </w:pPr>
     </w:lvl>
     <w:lvl w:ilvl="2" w:tplc="1000001B" w:tentative="1">
@@ -12122,7 +13456,7 @@
       <w:lvlText w:val="%3."/>
       <w:lvlJc w:val="right"/>
       <w:pPr>
-        <w:ind w:left="2160" w:hanging="180"/>
+        <w:ind w:left="2509" w:hanging="180"/>
       </w:pPr>
     </w:lvl>
     <w:lvl w:ilvl="3" w:tplc="1000000F" w:tentative="1">
@@ -12131,7 +13465,7 @@
       <w:lvlText w:val="%4."/>
       <w:lvlJc w:val="left"/>
       <w:pPr>
-        <w:ind w:left="2880" w:hanging="360"/>
+        <w:ind w:left="3229" w:hanging="360"/>
       </w:pPr>
     </w:lvl>
     <w:lvl w:ilvl="4" w:tplc="10000019" w:tentative="1">
@@ -12140,7 +13474,7 @@
       <w:lvlText w:val="%5."/>
       <w:lvlJc w:val="left"/>
       <w:pPr>
-        <w:ind w:left="3600" w:hanging="360"/>
+        <w:ind w:left="3949" w:hanging="360"/>
       </w:pPr>
     </w:lvl>
     <w:lvl w:ilvl="5" w:tplc="1000001B" w:tentative="1">
@@ -12149,7 +13483,7 @@
       <w:lvlText w:val="%6."/>
       <w:lvlJc w:val="right"/>
       <w:pPr>
-        <w:ind w:left="4320" w:hanging="180"/>
+        <w:ind w:left="4669" w:hanging="180"/>
       </w:pPr>
     </w:lvl>
     <w:lvl w:ilvl="6" w:tplc="1000000F" w:tentative="1">
@@ -12158,7 +13492,7 @@
       <w:lvlText w:val="%7."/>
       <w:lvlJc w:val="left"/>
       <w:pPr>
-        <w:ind w:left="5040" w:hanging="360"/>
+        <w:ind w:left="5389" w:hanging="360"/>
       </w:pPr>
     </w:lvl>
     <w:lvl w:ilvl="7" w:tplc="10000019" w:tentative="1">
@@ -12167,7 +13501,7 @@
       <w:lvlText w:val="%8."/>
       <w:lvlJc w:val="left"/>
       <w:pPr>
-        <w:ind w:left="5760" w:hanging="360"/>
+        <w:ind w:left="6109" w:hanging="360"/>
       </w:pPr>
     </w:lvl>
     <w:lvl w:ilvl="8" w:tplc="1000001B" w:tentative="1">
@@ -12176,11 +13510,189 @@
       <w:lvlText w:val="%9."/>
       <w:lvlJc w:val="right"/>
       <w:pPr>
-        <w:ind w:left="6480" w:hanging="180"/>
+        <w:ind w:left="6829" w:hanging="180"/>
       </w:pPr>
     </w:lvl>
   </w:abstractNum>
-  <w:abstractNum w:abstractNumId="5" w15:restartNumberingAfterBreak="0">
+  <w:abstractNum w:abstractNumId="9" w15:restartNumberingAfterBreak="0">
+    <w:nsid w:val="5B284985"/>
+    <w:multiLevelType w:val="hybridMultilevel"/>
+    <w:tmpl w:val="55760854"/>
+    <w:lvl w:ilvl="0" w:tplc="1000000F">
+      <w:start w:val="1"/>
+      <w:numFmt w:val="decimal"/>
+      <w:lvlText w:val="%1."/>
+      <w:lvlJc w:val="left"/>
+      <w:pPr>
+        <w:ind w:left="720" w:hanging="360"/>
+      </w:pPr>
+      <w:rPr>
+        <w:rFonts w:hint="default"/>
+      </w:rPr>
+    </w:lvl>
+    <w:lvl w:ilvl="1" w:tplc="10000019" w:tentative="1">
+      <w:start w:val="1"/>
+      <w:numFmt w:val="lowerLetter"/>
+      <w:lvlText w:val="%2."/>
+      <w:lvlJc w:val="left"/>
+      <w:pPr>
+        <w:ind w:left="1440" w:hanging="360"/>
+      </w:pPr>
+    </w:lvl>
+    <w:lvl w:ilvl="2" w:tplc="1000001B" w:tentative="1">
+      <w:start w:val="1"/>
+      <w:numFmt w:val="lowerRoman"/>
+      <w:lvlText w:val="%3."/>
+      <w:lvlJc w:val="right"/>
+      <w:pPr>
+        <w:ind w:left="2160" w:hanging="180"/>
+      </w:pPr>
+    </w:lvl>
+    <w:lvl w:ilvl="3" w:tplc="1000000F" w:tentative="1">
+      <w:start w:val="1"/>
+      <w:numFmt w:val="decimal"/>
+      <w:lvlText w:val="%4."/>
+      <w:lvlJc w:val="left"/>
+      <w:pPr>
+        <w:ind w:left="2880" w:hanging="360"/>
+      </w:pPr>
+    </w:lvl>
+    <w:lvl w:ilvl="4" w:tplc="10000019" w:tentative="1">
+      <w:start w:val="1"/>
+      <w:numFmt w:val="lowerLetter"/>
+      <w:lvlText w:val="%5."/>
+      <w:lvlJc w:val="left"/>
+      <w:pPr>
+        <w:ind w:left="3600" w:hanging="360"/>
+      </w:pPr>
+    </w:lvl>
+    <w:lvl w:ilvl="5" w:tplc="1000001B" w:tentative="1">
+      <w:start w:val="1"/>
+      <w:numFmt w:val="lowerRoman"/>
+      <w:lvlText w:val="%6."/>
+      <w:lvlJc w:val="right"/>
+      <w:pPr>
+        <w:ind w:left="4320" w:hanging="180"/>
+      </w:pPr>
+    </w:lvl>
+    <w:lvl w:ilvl="6" w:tplc="1000000F" w:tentative="1">
+      <w:start w:val="1"/>
+      <w:numFmt w:val="decimal"/>
+      <w:lvlText w:val="%7."/>
+      <w:lvlJc w:val="left"/>
+      <w:pPr>
+        <w:ind w:left="5040" w:hanging="360"/>
+      </w:pPr>
+    </w:lvl>
+    <w:lvl w:ilvl="7" w:tplc="10000019" w:tentative="1">
+      <w:start w:val="1"/>
+      <w:numFmt w:val="lowerLetter"/>
+      <w:lvlText w:val="%8."/>
+      <w:lvlJc w:val="left"/>
+      <w:pPr>
+        <w:ind w:left="5760" w:hanging="360"/>
+      </w:pPr>
+    </w:lvl>
+    <w:lvl w:ilvl="8" w:tplc="1000001B" w:tentative="1">
+      <w:start w:val="1"/>
+      <w:numFmt w:val="lowerRoman"/>
+      <w:lvlText w:val="%9."/>
+      <w:lvlJc w:val="right"/>
+      <w:pPr>
+        <w:ind w:left="6480" w:hanging="180"/>
+      </w:pPr>
+    </w:lvl>
+  </w:abstractNum>
+  <w:abstractNum w:abstractNumId="10" w15:restartNumberingAfterBreak="0">
+    <w:nsid w:val="627D13D0"/>
+    <w:multiLevelType w:val="hybridMultilevel"/>
+    <w:tmpl w:val="59129952"/>
+    <w:lvl w:ilvl="0" w:tplc="10000011">
+      <w:start w:val="1"/>
+      <w:numFmt w:val="decimal"/>
+      <w:lvlText w:val="%1)"/>
+      <w:lvlJc w:val="left"/>
+      <w:pPr>
+        <w:ind w:left="720" w:hanging="360"/>
+      </w:pPr>
+      <w:rPr>
+        <w:rFonts w:hint="default"/>
+      </w:rPr>
+    </w:lvl>
+    <w:lvl w:ilvl="1" w:tplc="10000019">
+      <w:start w:val="1"/>
+      <w:numFmt w:val="lowerLetter"/>
+      <w:lvlText w:val="%2."/>
+      <w:lvlJc w:val="left"/>
+      <w:pPr>
+        <w:ind w:left="1440" w:hanging="360"/>
+      </w:pPr>
+    </w:lvl>
+    <w:lvl w:ilvl="2" w:tplc="1000001B" w:tentative="1">
+      <w:start w:val="1"/>
+      <w:numFmt w:val="lowerRoman"/>
+      <w:lvlText w:val="%3."/>
+      <w:lvlJc w:val="right"/>
+      <w:pPr>
+        <w:ind w:left="2160" w:hanging="180"/>
+      </w:pPr>
+    </w:lvl>
+    <w:lvl w:ilvl="3" w:tplc="1000000F" w:tentative="1">
+      <w:start w:val="1"/>
+      <w:numFmt w:val="decimal"/>
+      <w:lvlText w:val="%4."/>
+      <w:lvlJc w:val="left"/>
+      <w:pPr>
+        <w:ind w:left="2880" w:hanging="360"/>
+      </w:pPr>
+    </w:lvl>
+    <w:lvl w:ilvl="4" w:tplc="10000019" w:tentative="1">
+      <w:start w:val="1"/>
+      <w:numFmt w:val="lowerLetter"/>
+      <w:lvlText w:val="%5."/>
+      <w:lvlJc w:val="left"/>
+      <w:pPr>
+        <w:ind w:left="3600" w:hanging="360"/>
+      </w:pPr>
+    </w:lvl>
+    <w:lvl w:ilvl="5" w:tplc="1000001B" w:tentative="1">
+      <w:start w:val="1"/>
+      <w:numFmt w:val="lowerRoman"/>
+      <w:lvlText w:val="%6."/>
+      <w:lvlJc w:val="right"/>
+      <w:pPr>
+        <w:ind w:left="4320" w:hanging="180"/>
+      </w:pPr>
+    </w:lvl>
+    <w:lvl w:ilvl="6" w:tplc="1000000F" w:tentative="1">
+      <w:start w:val="1"/>
+      <w:numFmt w:val="decimal"/>
+      <w:lvlText w:val="%7."/>
+      <w:lvlJc w:val="left"/>
+      <w:pPr>
+        <w:ind w:left="5040" w:hanging="360"/>
+      </w:pPr>
+    </w:lvl>
+    <w:lvl w:ilvl="7" w:tplc="10000019" w:tentative="1">
+      <w:start w:val="1"/>
+      <w:numFmt w:val="lowerLetter"/>
+      <w:lvlText w:val="%8."/>
+      <w:lvlJc w:val="left"/>
+      <w:pPr>
+        <w:ind w:left="5760" w:hanging="360"/>
+      </w:pPr>
+    </w:lvl>
+    <w:lvl w:ilvl="8" w:tplc="1000001B" w:tentative="1">
+      <w:start w:val="1"/>
+      <w:numFmt w:val="lowerRoman"/>
+      <w:lvlText w:val="%9."/>
+      <w:lvlJc w:val="right"/>
+      <w:pPr>
+        <w:ind w:left="6480" w:hanging="180"/>
+      </w:pPr>
+    </w:lvl>
+  </w:abstractNum>
+  <w:abstractNum w:abstractNumId="11" w15:restartNumberingAfterBreak="0">
     <w:nsid w:val="6CD60F60"/>
     <w:multiLevelType w:val="hybridMultilevel"/>
     <w:tmpl w:val="B79662A6"/>
@@ -12294,22 +13806,40 @@
     </w:lvl>
   </w:abstractNum>
   <w:num w:numId="1" w16cid:durableId="506363759">
+    <w:abstractNumId w:val="10"/>
+  </w:num>
+  <w:num w:numId="2" w16cid:durableId="1706523164">
+    <w:abstractNumId w:val="7"/>
+  </w:num>
+  <w:num w:numId="3" w16cid:durableId="865871639">
+    <w:abstractNumId w:val="6"/>
+  </w:num>
+  <w:num w:numId="4" w16cid:durableId="1896233046">
+    <w:abstractNumId w:val="11"/>
+  </w:num>
+  <w:num w:numId="5" w16cid:durableId="1601258577">
+    <w:abstractNumId w:val="1"/>
+  </w:num>
+  <w:num w:numId="6" w16cid:durableId="1876505679">
     <w:abstractNumId w:val="4"/>
   </w:num>
-  <w:num w:numId="2" w16cid:durableId="1706523164">
+  <w:num w:numId="7" w16cid:durableId="1743022847">
+    <w:abstractNumId w:val="0"/>
+  </w:num>
+  <w:num w:numId="8" w16cid:durableId="756678759">
+    <w:abstractNumId w:val="8"/>
+  </w:num>
+  <w:num w:numId="9" w16cid:durableId="1404789503">
+    <w:abstractNumId w:val="2"/>
+  </w:num>
+  <w:num w:numId="10" w16cid:durableId="1172916999">
+    <w:abstractNumId w:val="5"/>
+  </w:num>
+  <w:num w:numId="11" w16cid:durableId="711727846">
     <w:abstractNumId w:val="3"/>
   </w:num>
-  <w:num w:numId="3" w16cid:durableId="865871639">
-    <w:abstractNumId w:val="2"/>
-  </w:num>
-  <w:num w:numId="4" w16cid:durableId="1896233046">
-    <w:abstractNumId w:val="5"/>
-  </w:num>
-  <w:num w:numId="5" w16cid:durableId="1601258577">
-    <w:abstractNumId w:val="0"/>
-  </w:num>
-  <w:num w:numId="6" w16cid:durableId="1876505679">
-    <w:abstractNumId w:val="1"/>
+  <w:num w:numId="12" w16cid:durableId="844826931">
+    <w:abstractNumId w:val="9"/>
   </w:num>
 </w:numbering>
 </file>
@@ -12706,7 +14236,7 @@
   <w:style w:type="paragraph" w:default="1" w:styleId="Normln">
     <w:name w:val="Normal"/>
     <w:qFormat/>
-    <w:rsid w:val="009A4645"/>
+    <w:rsid w:val="009B29C2"/>
     <w:pPr>
       <w:spacing w:after="160" w:line="259" w:lineRule="auto"/>
     </w:pPr>

</xml_diff>

<commit_message>
documentation - finiched tensor logic + logic of linear container.
</commit_message>
<xml_diff>
--- a/ŠpaňúrM_KnihovnaProPraci_JM_2026.docx
+++ b/ŠpaňúrM_KnihovnaProPraci_JM_2026.docx
@@ -2466,6 +2466,7 @@
           <w:noProof/>
           <w:kern w:val="2"/>
           <w:szCs w:val="24"/>
+          <w:lang/>
           <w14:ligatures w14:val="standardContextual"/>
         </w:rPr>
       </w:pPr>
@@ -2478,7 +2479,7 @@
       <w:r>
         <w:fldChar w:fldCharType="separate"/>
       </w:r>
-      <w:hyperlink w:anchor="_Toc229768686" w:history="1">
+      <w:hyperlink w:anchor="_Toc229844809" w:history="1">
         <w:r>
           <w:rPr>
             <w:rStyle w:val="Hypertextovodkaz"/>
@@ -2506,7 +2507,7 @@
             <w:noProof/>
             <w:webHidden/>
           </w:rPr>
-          <w:instrText xml:space="preserve"> PAGEREF _Toc229768686 \h </w:instrText>
+          <w:instrText xml:space="preserve"> PAGEREF _Toc229844809 \h </w:instrText>
         </w:r>
         <w:r>
           <w:rPr>
@@ -2526,7 +2527,7 @@
             <w:noProof/>
             <w:webHidden/>
           </w:rPr>
-          <w:t>9</w:t>
+          <w:t>10</w:t>
         </w:r>
         <w:r>
           <w:rPr>
@@ -2548,10 +2549,11 @@
           <w:noProof/>
           <w:kern w:val="2"/>
           <w:szCs w:val="24"/>
+          <w:lang/>
           <w14:ligatures w14:val="standardContextual"/>
         </w:rPr>
       </w:pPr>
-      <w:hyperlink w:anchor="_Toc229768687" w:history="1">
+      <w:hyperlink w:anchor="_Toc229844810" w:history="1">
         <w:r>
           <w:rPr>
             <w:rStyle w:val="Hypertextovodkaz"/>
@@ -2579,7 +2581,7 @@
             <w:noProof/>
             <w:webHidden/>
           </w:rPr>
-          <w:instrText xml:space="preserve"> PAGEREF _Toc229768687 \h </w:instrText>
+          <w:instrText xml:space="preserve"> PAGEREF _Toc229844810 \h </w:instrText>
         </w:r>
         <w:r>
           <w:rPr>
@@ -2599,7 +2601,7 @@
             <w:noProof/>
             <w:webHidden/>
           </w:rPr>
-          <w:t>10</w:t>
+          <w:t>11</w:t>
         </w:r>
         <w:r>
           <w:rPr>
@@ -2621,10 +2623,11 @@
           <w:noProof/>
           <w:kern w:val="2"/>
           <w:szCs w:val="24"/>
+          <w:lang/>
           <w14:ligatures w14:val="standardContextual"/>
         </w:rPr>
       </w:pPr>
-      <w:hyperlink w:anchor="_Toc229768688" w:history="1">
+      <w:hyperlink w:anchor="_Toc229844811" w:history="1">
         <w:r>
           <w:rPr>
             <w:rStyle w:val="Hypertextovodkaz"/>
@@ -2652,7 +2655,7 @@
             <w:noProof/>
             <w:webHidden/>
           </w:rPr>
-          <w:instrText xml:space="preserve"> PAGEREF _Toc229768688 \h </w:instrText>
+          <w:instrText xml:space="preserve"> PAGEREF _Toc229844811 \h </w:instrText>
         </w:r>
         <w:r>
           <w:rPr>
@@ -2672,7 +2675,7 @@
             <w:noProof/>
             <w:webHidden/>
           </w:rPr>
-          <w:t>11</w:t>
+          <w:t>12</w:t>
         </w:r>
         <w:r>
           <w:rPr>
@@ -2694,10 +2697,11 @@
           <w:noProof/>
           <w:kern w:val="2"/>
           <w:szCs w:val="24"/>
+          <w:lang/>
           <w14:ligatures w14:val="standardContextual"/>
         </w:rPr>
       </w:pPr>
-      <w:hyperlink w:anchor="_Toc229768689" w:history="1">
+      <w:hyperlink w:anchor="_Toc229844812" w:history="1">
         <w:r>
           <w:rPr>
             <w:rStyle w:val="Hypertextovodkaz"/>
@@ -2724,7 +2728,7 @@
             <w:noProof/>
             <w:webHidden/>
           </w:rPr>
-          <w:instrText xml:space="preserve"> PAGEREF _Toc229768689 \h </w:instrText>
+          <w:instrText xml:space="preserve"> PAGEREF _Toc229844812 \h </w:instrText>
         </w:r>
         <w:r>
           <w:rPr>
@@ -2744,7 +2748,7 @@
             <w:noProof/>
             <w:webHidden/>
           </w:rPr>
-          <w:t>12</w:t>
+          <w:t>13</w:t>
         </w:r>
         <w:r>
           <w:rPr>
@@ -2766,10 +2770,11 @@
           <w:noProof/>
           <w:kern w:val="2"/>
           <w:szCs w:val="24"/>
+          <w:lang/>
           <w14:ligatures w14:val="standardContextual"/>
         </w:rPr>
       </w:pPr>
-      <w:hyperlink w:anchor="_Toc229768690" w:history="1">
+      <w:hyperlink w:anchor="_Toc229844813" w:history="1">
         <w:r>
           <w:rPr>
             <w:rStyle w:val="Hypertextovodkaz"/>
@@ -2796,7 +2801,7 @@
             <w:noProof/>
             <w:webHidden/>
           </w:rPr>
-          <w:instrText xml:space="preserve"> PAGEREF _Toc229768690 \h </w:instrText>
+          <w:instrText xml:space="preserve"> PAGEREF _Toc229844813 \h </w:instrText>
         </w:r>
         <w:r>
           <w:rPr>
@@ -2816,7 +2821,7 @@
             <w:noProof/>
             <w:webHidden/>
           </w:rPr>
-          <w:t>13</w:t>
+          <w:t>14</w:t>
         </w:r>
         <w:r>
           <w:rPr>
@@ -2835,10 +2840,11 @@
           <w:noProof/>
           <w:kern w:val="2"/>
           <w:szCs w:val="24"/>
+          <w:lang/>
           <w14:ligatures w14:val="standardContextual"/>
         </w:rPr>
       </w:pPr>
-      <w:hyperlink w:anchor="_Toc229768691" w:history="1">
+      <w:hyperlink w:anchor="_Toc229844814" w:history="1">
         <w:r>
           <w:rPr>
             <w:rStyle w:val="Hypertextovodkaz"/>
@@ -2865,7 +2871,7 @@
             <w:noProof/>
             <w:webHidden/>
           </w:rPr>
-          <w:instrText xml:space="preserve"> PAGEREF _Toc229768691 \h </w:instrText>
+          <w:instrText xml:space="preserve"> PAGEREF _Toc229844814 \h </w:instrText>
         </w:r>
         <w:r>
           <w:rPr>
@@ -2885,7 +2891,7 @@
             <w:noProof/>
             <w:webHidden/>
           </w:rPr>
-          <w:t>13</w:t>
+          <w:t>14</w:t>
         </w:r>
         <w:r>
           <w:rPr>
@@ -2904,10 +2910,11 @@
           <w:noProof/>
           <w:kern w:val="2"/>
           <w:szCs w:val="24"/>
+          <w:lang/>
           <w14:ligatures w14:val="standardContextual"/>
         </w:rPr>
       </w:pPr>
-      <w:hyperlink w:anchor="_Toc229768692" w:history="1">
+      <w:hyperlink w:anchor="_Toc229844815" w:history="1">
         <w:r>
           <w:rPr>
             <w:rStyle w:val="Hypertextovodkaz"/>
@@ -2934,7 +2941,7 @@
             <w:noProof/>
             <w:webHidden/>
           </w:rPr>
-          <w:instrText xml:space="preserve"> PAGEREF _Toc229768692 \h </w:instrText>
+          <w:instrText xml:space="preserve"> PAGEREF _Toc229844815 \h </w:instrText>
         </w:r>
         <w:r>
           <w:rPr>
@@ -2954,7 +2961,7 @@
             <w:noProof/>
             <w:webHidden/>
           </w:rPr>
-          <w:t>13</w:t>
+          <w:t>14</w:t>
         </w:r>
         <w:r>
           <w:rPr>
@@ -2973,10 +2980,11 @@
           <w:noProof/>
           <w:kern w:val="2"/>
           <w:szCs w:val="24"/>
+          <w:lang/>
           <w14:ligatures w14:val="standardContextual"/>
         </w:rPr>
       </w:pPr>
-      <w:hyperlink w:anchor="_Toc229768693" w:history="1">
+      <w:hyperlink w:anchor="_Toc229844816" w:history="1">
         <w:r>
           <w:rPr>
             <w:rStyle w:val="Hypertextovodkaz"/>
@@ -3003,7 +3011,7 @@
             <w:noProof/>
             <w:webHidden/>
           </w:rPr>
-          <w:instrText xml:space="preserve"> PAGEREF _Toc229768693 \h </w:instrText>
+          <w:instrText xml:space="preserve"> PAGEREF _Toc229844816 \h </w:instrText>
         </w:r>
         <w:r>
           <w:rPr>
@@ -3023,7 +3031,77 @@
             <w:noProof/>
             <w:webHidden/>
           </w:rPr>
-          <w:t>13</w:t>
+          <w:t>14</w:t>
+        </w:r>
+        <w:r>
+          <w:rPr>
+            <w:noProof/>
+            <w:webHidden/>
+          </w:rPr>
+          <w:fldChar w:fldCharType="end"/>
+        </w:r>
+      </w:hyperlink>
+    </w:p>
+    <w:p>
+      <w:pPr>
+        <w:pStyle w:val="Obsah2"/>
+        <w:rPr>
+          <w:rFonts w:asciiTheme="minorHAnsi" w:eastAsiaTheme="minorEastAsia" w:hAnsiTheme="minorHAnsi" w:cstheme="minorBidi"/>
+          <w:noProof/>
+          <w:kern w:val="2"/>
+          <w:szCs w:val="24"/>
+          <w:lang/>
+          <w14:ligatures w14:val="standardContextual"/>
+        </w:rPr>
+      </w:pPr>
+      <w:hyperlink w:anchor="_Toc229844817" w:history="1">
+        <w:r>
+          <w:rPr>
+            <w:rStyle w:val="Hypertextovodkaz"/>
+            <w:noProof/>
+          </w:rPr>
+          <w:t>1.4 Logika pole/kontejneru na prvky</w:t>
+        </w:r>
+        <w:r>
+          <w:rPr>
+            <w:noProof/>
+            <w:webHidden/>
+          </w:rPr>
+          <w:tab/>
+        </w:r>
+        <w:r>
+          <w:rPr>
+            <w:noProof/>
+            <w:webHidden/>
+          </w:rPr>
+          <w:fldChar w:fldCharType="begin"/>
+        </w:r>
+        <w:r>
+          <w:rPr>
+            <w:noProof/>
+            <w:webHidden/>
+          </w:rPr>
+          <w:instrText xml:space="preserve"> PAGEREF _Toc229844817 \h </w:instrText>
+        </w:r>
+        <w:r>
+          <w:rPr>
+            <w:noProof/>
+            <w:webHidden/>
+          </w:rPr>
+        </w:r>
+        <w:r>
+          <w:rPr>
+            <w:noProof/>
+            <w:webHidden/>
+          </w:rPr>
+          <w:fldChar w:fldCharType="separate"/>
+        </w:r>
+        <w:r>
+          <w:rPr>
+            <w:noProof/>
+            <w:webHidden/>
+          </w:rPr>
+          <w:t>22</w:t>
         </w:r>
         <w:r>
           <w:rPr>
@@ -3045,10 +3123,11 @@
           <w:noProof/>
           <w:kern w:val="2"/>
           <w:szCs w:val="24"/>
+          <w:lang/>
           <w14:ligatures w14:val="standardContextual"/>
         </w:rPr>
       </w:pPr>
-      <w:hyperlink w:anchor="_Toc229768694" w:history="1">
+      <w:hyperlink w:anchor="_Toc229844818" w:history="1">
         <w:r>
           <w:rPr>
             <w:rStyle w:val="Hypertextovodkaz"/>
@@ -3075,7 +3154,7 @@
             <w:noProof/>
             <w:webHidden/>
           </w:rPr>
-          <w:instrText xml:space="preserve"> PAGEREF _Toc229768694 \h </w:instrText>
+          <w:instrText xml:space="preserve"> PAGEREF _Toc229844818 \h </w:instrText>
         </w:r>
         <w:r>
           <w:rPr>
@@ -3095,7 +3174,7 @@
             <w:noProof/>
             <w:webHidden/>
           </w:rPr>
-          <w:t>17</w:t>
+          <w:t>24</w:t>
         </w:r>
         <w:r>
           <w:rPr>
@@ -3114,10 +3193,11 @@
           <w:noProof/>
           <w:kern w:val="2"/>
           <w:szCs w:val="24"/>
+          <w:lang/>
           <w14:ligatures w14:val="standardContextual"/>
         </w:rPr>
       </w:pPr>
-      <w:hyperlink w:anchor="_Toc229768695" w:history="1">
+      <w:hyperlink w:anchor="_Toc229844819" w:history="1">
         <w:r>
           <w:rPr>
             <w:rStyle w:val="Hypertextovodkaz"/>
@@ -3144,7 +3224,7 @@
             <w:noProof/>
             <w:webHidden/>
           </w:rPr>
-          <w:instrText xml:space="preserve"> PAGEREF _Toc229768695 \h </w:instrText>
+          <w:instrText xml:space="preserve"> PAGEREF _Toc229844819 \h </w:instrText>
         </w:r>
         <w:r>
           <w:rPr>
@@ -3164,7 +3244,7 @@
             <w:noProof/>
             <w:webHidden/>
           </w:rPr>
-          <w:t>17</w:t>
+          <w:t>24</w:t>
         </w:r>
         <w:r>
           <w:rPr>
@@ -3186,10 +3266,11 @@
           <w:noProof/>
           <w:kern w:val="2"/>
           <w:szCs w:val="24"/>
+          <w:lang/>
           <w14:ligatures w14:val="standardContextual"/>
         </w:rPr>
       </w:pPr>
-      <w:hyperlink w:anchor="_Toc229768696" w:history="1">
+      <w:hyperlink w:anchor="_Toc229844820" w:history="1">
         <w:r>
           <w:rPr>
             <w:rStyle w:val="Hypertextovodkaz"/>
@@ -3216,7 +3297,7 @@
             <w:noProof/>
             <w:webHidden/>
           </w:rPr>
-          <w:instrText xml:space="preserve"> PAGEREF _Toc229768696 \h </w:instrText>
+          <w:instrText xml:space="preserve"> PAGEREF _Toc229844820 \h </w:instrText>
         </w:r>
         <w:r>
           <w:rPr>
@@ -3236,7 +3317,7 @@
             <w:noProof/>
             <w:webHidden/>
           </w:rPr>
-          <w:t>17</w:t>
+          <w:t>24</w:t>
         </w:r>
         <w:r>
           <w:rPr>
@@ -3258,10 +3339,11 @@
           <w:noProof/>
           <w:kern w:val="2"/>
           <w:szCs w:val="24"/>
+          <w:lang/>
           <w14:ligatures w14:val="standardContextual"/>
         </w:rPr>
       </w:pPr>
-      <w:hyperlink w:anchor="_Toc229768697" w:history="1">
+      <w:hyperlink w:anchor="_Toc229844821" w:history="1">
         <w:r>
           <w:rPr>
             <w:rStyle w:val="Hypertextovodkaz"/>
@@ -3288,7 +3370,7 @@
             <w:noProof/>
             <w:webHidden/>
           </w:rPr>
-          <w:instrText xml:space="preserve"> PAGEREF _Toc229768697 \h </w:instrText>
+          <w:instrText xml:space="preserve"> PAGEREF _Toc229844821 \h </w:instrText>
         </w:r>
         <w:r>
           <w:rPr>
@@ -3308,7 +3390,7 @@
             <w:noProof/>
             <w:webHidden/>
           </w:rPr>
-          <w:t>17</w:t>
+          <w:t>24</w:t>
         </w:r>
         <w:r>
           <w:rPr>
@@ -3327,10 +3409,11 @@
           <w:noProof/>
           <w:kern w:val="2"/>
           <w:szCs w:val="24"/>
+          <w:lang/>
           <w14:ligatures w14:val="standardContextual"/>
         </w:rPr>
       </w:pPr>
-      <w:hyperlink w:anchor="_Toc229768698" w:history="1">
+      <w:hyperlink w:anchor="_Toc229844822" w:history="1">
         <w:r>
           <w:rPr>
             <w:rStyle w:val="Hypertextovodkaz"/>
@@ -3357,7 +3440,7 @@
             <w:noProof/>
             <w:webHidden/>
           </w:rPr>
-          <w:instrText xml:space="preserve"> PAGEREF _Toc229768698 \h </w:instrText>
+          <w:instrText xml:space="preserve"> PAGEREF _Toc229844822 \h </w:instrText>
         </w:r>
         <w:r>
           <w:rPr>
@@ -3377,7 +3460,7 @@
             <w:noProof/>
             <w:webHidden/>
           </w:rPr>
-          <w:t>17</w:t>
+          <w:t>24</w:t>
         </w:r>
         <w:r>
           <w:rPr>
@@ -3399,10 +3482,11 @@
           <w:noProof/>
           <w:kern w:val="2"/>
           <w:szCs w:val="24"/>
+          <w:lang/>
           <w14:ligatures w14:val="standardContextual"/>
         </w:rPr>
       </w:pPr>
-      <w:hyperlink w:anchor="_Toc229768699" w:history="1">
+      <w:hyperlink w:anchor="_Toc229844823" w:history="1">
         <w:r>
           <w:rPr>
             <w:rStyle w:val="Hypertextovodkaz"/>
@@ -3429,7 +3513,7 @@
             <w:noProof/>
             <w:webHidden/>
           </w:rPr>
-          <w:instrText xml:space="preserve"> PAGEREF _Toc229768699 \h </w:instrText>
+          <w:instrText xml:space="preserve"> PAGEREF _Toc229844823 \h </w:instrText>
         </w:r>
         <w:r>
           <w:rPr>
@@ -3449,7 +3533,7 @@
             <w:noProof/>
             <w:webHidden/>
           </w:rPr>
-          <w:t>17</w:t>
+          <w:t>24</w:t>
         </w:r>
         <w:r>
           <w:rPr>
@@ -3471,10 +3555,11 @@
           <w:noProof/>
           <w:kern w:val="2"/>
           <w:szCs w:val="24"/>
+          <w:lang/>
           <w14:ligatures w14:val="standardContextual"/>
         </w:rPr>
       </w:pPr>
-      <w:hyperlink w:anchor="_Toc229768700" w:history="1">
+      <w:hyperlink w:anchor="_Toc229844824" w:history="1">
         <w:r>
           <w:rPr>
             <w:rStyle w:val="Hypertextovodkaz"/>
@@ -3501,7 +3586,7 @@
             <w:noProof/>
             <w:webHidden/>
           </w:rPr>
-          <w:instrText xml:space="preserve"> PAGEREF _Toc229768700 \h </w:instrText>
+          <w:instrText xml:space="preserve"> PAGEREF _Toc229844824 \h </w:instrText>
         </w:r>
         <w:r>
           <w:rPr>
@@ -3521,7 +3606,7 @@
             <w:noProof/>
             <w:webHidden/>
           </w:rPr>
-          <w:t>18</w:t>
+          <w:t>25</w:t>
         </w:r>
         <w:r>
           <w:rPr>
@@ -3543,10 +3628,11 @@
           <w:noProof/>
           <w:kern w:val="2"/>
           <w:szCs w:val="24"/>
+          <w:lang/>
           <w14:ligatures w14:val="standardContextual"/>
         </w:rPr>
       </w:pPr>
-      <w:hyperlink w:anchor="_Toc229768701" w:history="1">
+      <w:hyperlink w:anchor="_Toc229844825" w:history="1">
         <w:r>
           <w:rPr>
             <w:rStyle w:val="Hypertextovodkaz"/>
@@ -3581,7 +3667,7 @@
             <w:noProof/>
             <w:webHidden/>
           </w:rPr>
-          <w:instrText xml:space="preserve"> PAGEREF _Toc229768701 \h </w:instrText>
+          <w:instrText xml:space="preserve"> PAGEREF _Toc229844825 \h </w:instrText>
         </w:r>
         <w:r>
           <w:rPr>
@@ -3601,7 +3687,7 @@
             <w:noProof/>
             <w:webHidden/>
           </w:rPr>
-          <w:t>18</w:t>
+          <w:t>25</w:t>
         </w:r>
         <w:r>
           <w:rPr>
@@ -3623,10 +3709,11 @@
           <w:noProof/>
           <w:kern w:val="2"/>
           <w:szCs w:val="24"/>
+          <w:lang/>
           <w14:ligatures w14:val="standardContextual"/>
         </w:rPr>
       </w:pPr>
-      <w:hyperlink w:anchor="_Toc229768702" w:history="1">
+      <w:hyperlink w:anchor="_Toc229844826" w:history="1">
         <w:r>
           <w:rPr>
             <w:rStyle w:val="Hypertextovodkaz"/>
@@ -3654,7 +3741,7 @@
             <w:noProof/>
             <w:webHidden/>
           </w:rPr>
-          <w:instrText xml:space="preserve"> PAGEREF _Toc229768702 \h </w:instrText>
+          <w:instrText xml:space="preserve"> PAGEREF _Toc229844826 \h </w:instrText>
         </w:r>
         <w:r>
           <w:rPr>
@@ -3674,7 +3761,7 @@
             <w:noProof/>
             <w:webHidden/>
           </w:rPr>
-          <w:t>19</w:t>
+          <w:t>26</w:t>
         </w:r>
         <w:r>
           <w:rPr>
@@ -3696,10 +3783,11 @@
           <w:noProof/>
           <w:kern w:val="2"/>
           <w:szCs w:val="24"/>
+          <w:lang/>
           <w14:ligatures w14:val="standardContextual"/>
         </w:rPr>
       </w:pPr>
-      <w:hyperlink w:anchor="_Toc229768703" w:history="1">
+      <w:hyperlink w:anchor="_Toc229844827" w:history="1">
         <w:r>
           <w:rPr>
             <w:rStyle w:val="Hypertextovodkaz"/>
@@ -3727,7 +3815,7 @@
             <w:noProof/>
             <w:webHidden/>
           </w:rPr>
-          <w:instrText xml:space="preserve"> PAGEREF _Toc229768703 \h </w:instrText>
+          <w:instrText xml:space="preserve"> PAGEREF _Toc229844827 \h </w:instrText>
         </w:r>
         <w:r>
           <w:rPr>
@@ -3747,7 +3835,7 @@
             <w:noProof/>
             <w:webHidden/>
           </w:rPr>
-          <w:t>20</w:t>
+          <w:t>27</w:t>
         </w:r>
         <w:r>
           <w:rPr>
@@ -3769,10 +3857,11 @@
           <w:noProof/>
           <w:kern w:val="2"/>
           <w:szCs w:val="24"/>
+          <w:lang/>
           <w14:ligatures w14:val="standardContextual"/>
         </w:rPr>
       </w:pPr>
-      <w:hyperlink w:anchor="_Toc229768704" w:history="1">
+      <w:hyperlink w:anchor="_Toc229844828" w:history="1">
         <w:r>
           <w:rPr>
             <w:rStyle w:val="Hypertextovodkaz"/>
@@ -3800,7 +3889,7 @@
             <w:noProof/>
             <w:webHidden/>
           </w:rPr>
-          <w:instrText xml:space="preserve"> PAGEREF _Toc229768704 \h </w:instrText>
+          <w:instrText xml:space="preserve"> PAGEREF _Toc229844828 \h </w:instrText>
         </w:r>
         <w:r>
           <w:rPr>
@@ -3820,7 +3909,7 @@
             <w:noProof/>
             <w:webHidden/>
           </w:rPr>
-          <w:t>20</w:t>
+          <w:t>27</w:t>
         </w:r>
         <w:r>
           <w:rPr>
@@ -3842,10 +3931,11 @@
           <w:noProof/>
           <w:kern w:val="2"/>
           <w:szCs w:val="24"/>
+          <w:lang/>
           <w14:ligatures w14:val="standardContextual"/>
         </w:rPr>
       </w:pPr>
-      <w:hyperlink w:anchor="_Toc229768705" w:history="1">
+      <w:hyperlink w:anchor="_Toc229844829" w:history="1">
         <w:r>
           <w:rPr>
             <w:rStyle w:val="Hypertextovodkaz"/>
@@ -3873,7 +3963,7 @@
             <w:noProof/>
             <w:webHidden/>
           </w:rPr>
-          <w:instrText xml:space="preserve"> PAGEREF _Toc229768705 \h </w:instrText>
+          <w:instrText xml:space="preserve"> PAGEREF _Toc229844829 \h </w:instrText>
         </w:r>
         <w:r>
           <w:rPr>
@@ -3893,7 +3983,7 @@
             <w:noProof/>
             <w:webHidden/>
           </w:rPr>
-          <w:t>20</w:t>
+          <w:t>27</w:t>
         </w:r>
         <w:r>
           <w:rPr>
@@ -3915,10 +4005,11 @@
           <w:noProof/>
           <w:kern w:val="2"/>
           <w:szCs w:val="24"/>
+          <w:lang/>
           <w14:ligatures w14:val="standardContextual"/>
         </w:rPr>
       </w:pPr>
-      <w:hyperlink w:anchor="_Toc229768706" w:history="1">
+      <w:hyperlink w:anchor="_Toc229844830" w:history="1">
         <w:r>
           <w:rPr>
             <w:rStyle w:val="Hypertextovodkaz"/>
@@ -3946,7 +4037,7 @@
             <w:noProof/>
             <w:webHidden/>
           </w:rPr>
-          <w:instrText xml:space="preserve"> PAGEREF _Toc229768706 \h </w:instrText>
+          <w:instrText xml:space="preserve"> PAGEREF _Toc229844830 \h </w:instrText>
         </w:r>
         <w:r>
           <w:rPr>
@@ -3966,7 +4057,7 @@
             <w:noProof/>
             <w:webHidden/>
           </w:rPr>
-          <w:t>20</w:t>
+          <w:t>27</w:t>
         </w:r>
         <w:r>
           <w:rPr>
@@ -3985,10 +4076,11 @@
           <w:noProof/>
           <w:kern w:val="2"/>
           <w:szCs w:val="24"/>
+          <w:lang/>
           <w14:ligatures w14:val="standardContextual"/>
         </w:rPr>
       </w:pPr>
-      <w:hyperlink w:anchor="_Toc229768707" w:history="1">
+      <w:hyperlink w:anchor="_Toc229844831" w:history="1">
         <w:r>
           <w:rPr>
             <w:rStyle w:val="Hypertextovodkaz"/>
@@ -4016,7 +4108,7 @@
             <w:noProof/>
             <w:webHidden/>
           </w:rPr>
-          <w:instrText xml:space="preserve"> PAGEREF _Toc229768707 \h </w:instrText>
+          <w:instrText xml:space="preserve"> PAGEREF _Toc229844831 \h </w:instrText>
         </w:r>
         <w:r>
           <w:rPr>
@@ -4036,7 +4128,7 @@
             <w:noProof/>
             <w:webHidden/>
           </w:rPr>
-          <w:t>20</w:t>
+          <w:t>27</w:t>
         </w:r>
         <w:r>
           <w:rPr>
@@ -4058,10 +4150,11 @@
           <w:noProof/>
           <w:kern w:val="2"/>
           <w:szCs w:val="24"/>
+          <w:lang/>
           <w14:ligatures w14:val="standardContextual"/>
         </w:rPr>
       </w:pPr>
-      <w:hyperlink w:anchor="_Toc229768708" w:history="1">
+      <w:hyperlink w:anchor="_Toc229844832" w:history="1">
         <w:r>
           <w:rPr>
             <w:rStyle w:val="Hypertextovodkaz"/>
@@ -4089,7 +4182,7 @@
             <w:noProof/>
             <w:webHidden/>
           </w:rPr>
-          <w:instrText xml:space="preserve"> PAGEREF _Toc229768708 \h </w:instrText>
+          <w:instrText xml:space="preserve"> PAGEREF _Toc229844832 \h </w:instrText>
         </w:r>
         <w:r>
           <w:rPr>
@@ -4109,7 +4202,7 @@
             <w:noProof/>
             <w:webHidden/>
           </w:rPr>
-          <w:t>21</w:t>
+          <w:t>28</w:t>
         </w:r>
         <w:r>
           <w:rPr>
@@ -4131,10 +4224,11 @@
           <w:noProof/>
           <w:kern w:val="2"/>
           <w:szCs w:val="24"/>
+          <w:lang/>
           <w14:ligatures w14:val="standardContextual"/>
         </w:rPr>
       </w:pPr>
-      <w:hyperlink w:anchor="_Toc229768709" w:history="1">
+      <w:hyperlink w:anchor="_Toc229844833" w:history="1">
         <w:r>
           <w:rPr>
             <w:rStyle w:val="Hypertextovodkaz"/>
@@ -4162,7 +4256,7 @@
             <w:noProof/>
             <w:webHidden/>
           </w:rPr>
-          <w:instrText xml:space="preserve"> PAGEREF _Toc229768709 \h </w:instrText>
+          <w:instrText xml:space="preserve"> PAGEREF _Toc229844833 \h </w:instrText>
         </w:r>
         <w:r>
           <w:rPr>
@@ -4182,7 +4276,7 @@
             <w:noProof/>
             <w:webHidden/>
           </w:rPr>
-          <w:t>21</w:t>
+          <w:t>28</w:t>
         </w:r>
         <w:r>
           <w:rPr>
@@ -4204,10 +4298,11 @@
           <w:noProof/>
           <w:kern w:val="2"/>
           <w:szCs w:val="24"/>
+          <w:lang/>
           <w14:ligatures w14:val="standardContextual"/>
         </w:rPr>
       </w:pPr>
-      <w:hyperlink w:anchor="_Toc229768710" w:history="1">
+      <w:hyperlink w:anchor="_Toc229844834" w:history="1">
         <w:r>
           <w:rPr>
             <w:rStyle w:val="Hypertextovodkaz"/>
@@ -4234,7 +4329,7 @@
             <w:noProof/>
             <w:webHidden/>
           </w:rPr>
-          <w:instrText xml:space="preserve"> PAGEREF _Toc229768710 \h </w:instrText>
+          <w:instrText xml:space="preserve"> PAGEREF _Toc229844834 \h </w:instrText>
         </w:r>
         <w:r>
           <w:rPr>
@@ -4254,7 +4349,7 @@
             <w:noProof/>
             <w:webHidden/>
           </w:rPr>
-          <w:t>22</w:t>
+          <w:t>29</w:t>
         </w:r>
         <w:r>
           <w:rPr>
@@ -4276,10 +4371,11 @@
           <w:noProof/>
           <w:kern w:val="2"/>
           <w:szCs w:val="24"/>
+          <w:lang/>
           <w14:ligatures w14:val="standardContextual"/>
         </w:rPr>
       </w:pPr>
-      <w:hyperlink w:anchor="_Toc229768711" w:history="1">
+      <w:hyperlink w:anchor="_Toc229844835" w:history="1">
         <w:r>
           <w:rPr>
             <w:rStyle w:val="Hypertextovodkaz"/>
@@ -4306,7 +4402,7 @@
             <w:noProof/>
             <w:webHidden/>
           </w:rPr>
-          <w:instrText xml:space="preserve"> PAGEREF _Toc229768711 \h </w:instrText>
+          <w:instrText xml:space="preserve"> PAGEREF _Toc229844835 \h </w:instrText>
         </w:r>
         <w:r>
           <w:rPr>
@@ -4326,7 +4422,7 @@
             <w:noProof/>
             <w:webHidden/>
           </w:rPr>
-          <w:t>24</w:t>
+          <w:t>31</w:t>
         </w:r>
         <w:r>
           <w:rPr>
@@ -4348,10 +4444,11 @@
           <w:noProof/>
           <w:kern w:val="2"/>
           <w:szCs w:val="24"/>
+          <w:lang/>
           <w14:ligatures w14:val="standardContextual"/>
         </w:rPr>
       </w:pPr>
-      <w:hyperlink w:anchor="_Toc229768712" w:history="1">
+      <w:hyperlink w:anchor="_Toc229844836" w:history="1">
         <w:r>
           <w:rPr>
             <w:rStyle w:val="Hypertextovodkaz"/>
@@ -4378,7 +4475,7 @@
             <w:noProof/>
             <w:webHidden/>
           </w:rPr>
-          <w:instrText xml:space="preserve"> PAGEREF _Toc229768712 \h </w:instrText>
+          <w:instrText xml:space="preserve"> PAGEREF _Toc229844836 \h </w:instrText>
         </w:r>
         <w:r>
           <w:rPr>
@@ -4398,7 +4495,7 @@
             <w:noProof/>
             <w:webHidden/>
           </w:rPr>
-          <w:t>25</w:t>
+          <w:t>32</w:t>
         </w:r>
         <w:r>
           <w:rPr>
@@ -4420,10 +4517,11 @@
           <w:noProof/>
           <w:kern w:val="2"/>
           <w:szCs w:val="24"/>
+          <w:lang/>
           <w14:ligatures w14:val="standardContextual"/>
         </w:rPr>
       </w:pPr>
-      <w:hyperlink w:anchor="_Toc229768713" w:history="1">
+      <w:hyperlink w:anchor="_Toc229844837" w:history="1">
         <w:r>
           <w:rPr>
             <w:rStyle w:val="Hypertextovodkaz"/>
@@ -4450,7 +4548,7 @@
             <w:noProof/>
             <w:webHidden/>
           </w:rPr>
-          <w:instrText xml:space="preserve"> PAGEREF _Toc229768713 \h </w:instrText>
+          <w:instrText xml:space="preserve"> PAGEREF _Toc229844837 \h </w:instrText>
         </w:r>
         <w:r>
           <w:rPr>
@@ -4470,7 +4568,7 @@
             <w:noProof/>
             <w:webHidden/>
           </w:rPr>
-          <w:t>26</w:t>
+          <w:t>33</w:t>
         </w:r>
         <w:r>
           <w:rPr>
@@ -4504,6 +4602,7 @@
           <w:szCs w:val="24"/>
           <w:shd w:val="clear" w:color="auto" w:fill="FFFFFF"/>
         </w:rPr>
+        <w:lastRenderedPageBreak/>
         <w:br w:type="page"/>
       </w:r>
     </w:p>
@@ -4511,7 +4610,7 @@
       <w:pPr>
         <w:pStyle w:val="Nadpis1"/>
       </w:pPr>
-      <w:bookmarkStart w:id="0" w:name="_Toc229768686"/>
+      <w:bookmarkStart w:id="0" w:name="_Toc229844809"/>
       <w:r>
         <w:rPr>
           <w:shd w:val="clear" w:color="auto" w:fill="FFFFFF"/>
@@ -4811,7 +4910,7 @@
           <w:shd w:val="clear" w:color="auto" w:fill="FFFFFF"/>
         </w:rPr>
       </w:pPr>
-      <w:bookmarkStart w:id="1" w:name="_Toc229768687"/>
+      <w:bookmarkStart w:id="1" w:name="_Toc229844810"/>
       <w:r>
         <w:rPr>
           <w:shd w:val="clear" w:color="auto" w:fill="FFFFFF"/>
@@ -4913,7 +5012,7 @@
           <w:shd w:val="clear" w:color="auto" w:fill="FFFFFF"/>
         </w:rPr>
       </w:pPr>
-      <w:bookmarkStart w:id="2" w:name="_Toc229768688"/>
+      <w:bookmarkStart w:id="2" w:name="_Toc229844811"/>
       <w:r>
         <w:rPr>
           <w:shd w:val="clear" w:color="auto" w:fill="FFFFFF"/>
@@ -5070,7 +5169,7 @@
       <w:pPr>
         <w:pStyle w:val="Nadpis1"/>
       </w:pPr>
-      <w:bookmarkStart w:id="3" w:name="_Toc229768689"/>
+      <w:bookmarkStart w:id="3" w:name="_Toc229844812"/>
       <w:r>
         <w:lastRenderedPageBreak/>
         <w:t>ÚVOD</w:t>
@@ -5311,7 +5410,7 @@
       <w:r>
         <w:br w:type="page"/>
       </w:r>
-      <w:bookmarkStart w:id="4" w:name="_Toc229768690"/>
+      <w:bookmarkStart w:id="4" w:name="_Toc229844813"/>
       <w:r>
         <w:lastRenderedPageBreak/>
         <w:t>1</w:t>
@@ -5512,7 +5611,7 @@
         <w:pStyle w:val="Nadpis2"/>
         <w:jc w:val="both"/>
       </w:pPr>
-      <w:bookmarkStart w:id="5" w:name="_Toc229768691"/>
+      <w:bookmarkStart w:id="5" w:name="_Toc229844814"/>
       <w:r>
         <w:t xml:space="preserve">1.1 </w:t>
       </w:r>
@@ -5781,7 +5880,7 @@
       <w:pPr>
         <w:pStyle w:val="Nadpis2"/>
       </w:pPr>
-      <w:bookmarkStart w:id="6" w:name="_Toc229768692"/>
+      <w:bookmarkStart w:id="6" w:name="_Toc229844815"/>
       <w:r>
         <w:t>1.2 UML</w:t>
       </w:r>
@@ -5798,7 +5897,7 @@
       <w:pPr>
         <w:pStyle w:val="Nadpis2"/>
       </w:pPr>
-      <w:bookmarkStart w:id="7" w:name="_Toc229768693"/>
+      <w:bookmarkStart w:id="7" w:name="_Toc229844816"/>
       <w:r>
         <w:t>1.3 Logika tenzoru</w:t>
       </w:r>
@@ -5960,7 +6059,21 @@
         <w:rPr>
           <w:lang w:eastAsia="cs-CZ"/>
         </w:rPr>
-        <w:t xml:space="preserve">). Příkladem to znamená, že nedefinitivní souřadnice o velikosti jedné menší, než počet dimenzí, mají </w:t>
+        <w:t xml:space="preserve">). Příkladem to znamená, že nedefinitivní souřadnice o velikosti jedné </w:t>
+      </w:r>
+      <w:proofErr w:type="gramStart"/>
+      <w:r>
+        <w:rPr>
+          <w:lang w:eastAsia="cs-CZ"/>
+        </w:rPr>
+        <w:t>menší,</w:t>
+      </w:r>
+      <w:proofErr w:type="gramEnd"/>
+      <w:r>
+        <w:rPr>
+          <w:lang w:eastAsia="cs-CZ"/>
+        </w:rPr>
+        <w:t xml:space="preserve"> než počet dimenzí, mají </w:t>
       </w:r>
       <w:r>
         <w:rPr>
@@ -6090,7 +6203,21 @@
         <w:rPr>
           <w:lang w:eastAsia="cs-CZ"/>
         </w:rPr>
-        <w:t xml:space="preserve"> je počet dimenzí) stačí pouze přečíst náležící prvek z tohoto vypočítaného pole pro složitost O(1).</w:t>
+        <w:t xml:space="preserve"> je počet dimenzí) stačí pouze přečíst náležící prvek z tohoto vypočítaného pole pro složitost </w:t>
+      </w:r>
+      <w:proofErr w:type="gramStart"/>
+      <w:r>
+        <w:rPr>
+          <w:lang w:eastAsia="cs-CZ"/>
+        </w:rPr>
+        <w:t>O(</w:t>
+      </w:r>
+      <w:proofErr w:type="gramEnd"/>
+      <w:r>
+        <w:rPr>
+          <w:lang w:eastAsia="cs-CZ"/>
+        </w:rPr>
+        <w:t>1).</w:t>
       </w:r>
       <w:r>
         <w:rPr>
@@ -6679,7 +6806,14 @@
         <w:rPr>
           <w:lang w:eastAsia="cs-CZ"/>
         </w:rPr>
-        <w:t>2⁶⁴</w:t>
+        <w:t>2⁶</w:t>
+      </w:r>
+      <w:proofErr w:type="gramStart"/>
+      <w:r>
+        <w:rPr>
+          <w:lang w:eastAsia="cs-CZ"/>
+        </w:rPr>
+        <w:t>⁴</w:t>
       </w:r>
       <w:r>
         <w:rPr>
@@ -6705,6 +6839,7 @@
         </w:rPr>
         <w:t>1</w:t>
       </w:r>
+      <w:proofErr w:type="gramEnd"/>
       <w:r>
         <w:rPr>
           <w:lang w:eastAsia="cs-CZ"/>
@@ -6733,7 +6868,14 @@
         <w:rPr>
           <w:lang w:eastAsia="cs-CZ"/>
         </w:rPr>
-        <w:t xml:space="preserve"> Délka přístupu na jeden prvek tak realisticky (vůči limitům jazyka C++ a 64</w:t>
+        <w:t xml:space="preserve"> Délka přístupu na jeden prvek tak realisticky (vůči limitům jazyka C++ a </w:t>
+      </w:r>
+      <w:proofErr w:type="gramStart"/>
+      <w:r>
+        <w:rPr>
+          <w:lang w:eastAsia="cs-CZ"/>
+        </w:rPr>
+        <w:t>64</w:t>
       </w:r>
       <w:r>
         <w:rPr>
@@ -6745,7 +6887,14 @@
         <w:rPr>
           <w:lang w:eastAsia="cs-CZ"/>
         </w:rPr>
-        <w:t>bitové architektury) nepřekročí 64 výpočtů a tím pádem se dá z tohoto pohledu považovat za konstantní.</w:t>
+        <w:t>bitové</w:t>
+      </w:r>
+      <w:proofErr w:type="gramEnd"/>
+      <w:r>
+        <w:rPr>
+          <w:lang w:eastAsia="cs-CZ"/>
+        </w:rPr>
+        <w:t xml:space="preserve"> architektury) nepřekročí 64 výpočtů a tím pádem se dá z tohoto pohledu považovat za konstantní.</w:t>
       </w:r>
       <w:r>
         <w:rPr>
@@ -7341,7 +7490,15 @@
         <w:t xml:space="preserve"> Z algoritmické efektivity je tato metoda oproti běžnému výpočtu souřadnice výhodná.</w:t>
       </w:r>
       <w:r>
-        <w:t xml:space="preserve"> V nejhorším případě přetočení z posledního prvku na první je její komplexita O(len(D)) a v nejlepším případě inkrementace nejméně signifikantní souřadnice bez přetečení O(1). </w:t>
+        <w:t xml:space="preserve"> V nejhorším případě přetočení z posledního prvku na první je její komplexita O(len(D)) a v nejlepším případě inkrementace nejméně signifikantní souřadnice bez přetečení </w:t>
+      </w:r>
+      <w:proofErr w:type="gramStart"/>
+      <w:r>
+        <w:t>O(</w:t>
+      </w:r>
+      <w:proofErr w:type="gramEnd"/>
+      <w:r>
+        <w:t xml:space="preserve">1). </w:t>
       </w:r>
       <w:r>
         <w:t>Ovšem je třeba si uvědomit, že při rovnoměrných velikostech dimenzí, bude ten lepší případ daleko více převládat nad tím nejhorším</w:t>
@@ -7356,8 +7513,13 @@
         <w:t>,</w:t>
       </w:r>
       <w:r>
-        <w:t xml:space="preserve"> protože pravděpodobnost změny první souřadnice (nejméně signifikantní) je vždy 1. U té další to už ale je jenom 1/(</w:t>
-      </w:r>
+        <w:t xml:space="preserve"> protože pravděpodobnost změny první souřadnice (nejméně signifikantní) je vždy 1. U té další to už ale je jenom 1</w:t>
+      </w:r>
+      <w:proofErr w:type="gramStart"/>
+      <w:r>
+        <w:t>/(</w:t>
+      </w:r>
+      <w:proofErr w:type="gramEnd"/>
       <w:r>
         <w:t>Kumulativní součin předešlých velikostí dimenzí</w:t>
       </w:r>
@@ -7380,7 +7542,15 @@
         <w:t>složitost</w:t>
       </w:r>
       <w:r>
-        <w:t xml:space="preserve"> této metody O(1).</w:t>
+        <w:t xml:space="preserve"> této metody </w:t>
+      </w:r>
+      <w:proofErr w:type="gramStart"/>
+      <w:r>
+        <w:t>O(</w:t>
+      </w:r>
+      <w:proofErr w:type="gramEnd"/>
+      <w:r>
+        <w:t>1).</w:t>
       </w:r>
     </w:p>
     <w:p>
@@ -8038,19 +8208,7 @@
           <w:rPr>
             <w:rFonts w:ascii="Cambria Math" w:hAnsi="Cambria Math"/>
           </w:rPr>
-          <m:t>novýT je nové pole,</m:t>
-        </m:r>
-        <m:r>
-          <w:rPr>
-            <w:rFonts w:ascii="Cambria Math" w:hAnsi="Cambria Math"/>
-          </w:rPr>
-          <m:t xml:space="preserve"> </m:t>
-        </m:r>
-        <m:r>
-          <w:rPr>
-            <w:rFonts w:ascii="Cambria Math" w:hAnsi="Cambria Math"/>
-          </w:rPr>
-          <m:t xml:space="preserve"> starýT staré pole</m:t>
+          <m:t>novýT je nové pole,  starýT staré pole</m:t>
         </m:r>
       </m:oMath>
     </w:p>
@@ -8248,25 +8406,7 @@
           <w:rPr>
             <w:rFonts w:ascii="Cambria Math" w:hAnsi="Cambria Math"/>
           </w:rPr>
-          <m:t>p</m:t>
-        </m:r>
-        <m:r>
-          <w:rPr>
-            <w:rFonts w:ascii="Cambria Math" w:hAnsi="Cambria Math"/>
-          </w:rPr>
-          <m:t xml:space="preserve">ro </m:t>
-        </m:r>
-        <m:r>
-          <w:rPr>
-            <w:rFonts w:ascii="Cambria Math" w:hAnsi="Cambria Math"/>
-          </w:rPr>
-          <m:t>a</m:t>
-        </m:r>
-        <m:r>
-          <w:rPr>
-            <w:rFonts w:ascii="Cambria Math" w:hAnsi="Cambria Math"/>
-          </w:rPr>
-          <m:t xml:space="preserve"> od 0 do len</m:t>
+          <m:t>pro a od 0 do len</m:t>
         </m:r>
         <m:d>
           <m:dPr>
@@ -8436,19 +8576,7 @@
                   <w:rPr>
                     <w:rFonts w:ascii="Cambria Math" w:hAnsi="Cambria Math"/>
                   </w:rPr>
-                  <m:t>pokud c=m ;</m:t>
-                </m:r>
-                <m:r>
-                  <w:rPr>
-                    <w:rFonts w:ascii="Cambria Math" w:hAnsi="Cambria Math"/>
-                  </w:rPr>
-                  <m:t>b :=b+s;c≔0</m:t>
-                </m:r>
-                <m:r>
-                  <w:rPr>
-                    <w:rFonts w:ascii="Cambria Math" w:hAnsi="Cambria Math"/>
-                  </w:rPr>
-                  <m:t xml:space="preserve"> </m:t>
+                  <m:t xml:space="preserve">pokud c=m ;b :=b+s;c≔0 </m:t>
                 </m:r>
               </m:e>
               <m:e>
@@ -8544,32 +8672,19 @@
           <w:i/>
           <w:iCs/>
         </w:rPr>
-        <w:t>i</w:t>
-      </w:r>
-      <w:r>
-        <w:rPr>
-          <w:i/>
-          <w:iCs/>
-        </w:rPr>
+        <w:t xml:space="preserve">i </w:t>
+      </w:r>
+      <w:r>
+        <w:t>v</w:t>
+      </w:r>
+      <w:r>
+        <w:t>ynásobit nově přidanou dimenzí</w:t>
+      </w:r>
+      <w:r>
         <w:t xml:space="preserve"> </w:t>
       </w:r>
       <w:r>
-        <w:t>v</w:t>
-      </w:r>
-      <w:r>
-        <w:t>ynásobit nově přidanou dimenzí</w:t>
-      </w:r>
-      <w:r>
-        <w:t xml:space="preserve"> </w:t>
-      </w:r>
-      <w:r>
-        <w:t xml:space="preserve">po </w:t>
-      </w:r>
-      <w:r>
-        <w:t xml:space="preserve">jejím </w:t>
-      </w:r>
-      <w:r>
-        <w:t>přidání</w:t>
+        <w:t>po jejím přidání</w:t>
       </w:r>
       <w:r>
         <w:t>.</w:t>
@@ -8798,13 +8913,433 @@
     </w:p>
     <w:p>
       <w:pPr>
+        <w:spacing w:line="360" w:lineRule="auto"/>
+      </w:pPr>
+      <w:r>
+        <w:t>Ve výbavě tenzoru jsou také metody umožňující unární i binární operace typů pro každý prvek, prvek jednoho tenzoru na prvek druhého tenzoru jedna ku jednom a také každý prvek jednoho tenzoru s danou hodnotou stejného typu jako hodnotový typ.</w:t>
+      </w:r>
+      <w:r>
+        <w:t xml:space="preserve"> Pro binární operace i s možností určit místo v rámci </w:t>
+      </w:r>
+      <w:proofErr w:type="spellStart"/>
+      <w:r>
+        <w:t>komutativity</w:t>
+      </w:r>
+      <w:proofErr w:type="spellEnd"/>
+      <w:r>
+        <w:t>.</w:t>
+      </w:r>
+      <w:r>
+        <w:t xml:space="preserve"> Takovéto funkce fungují</w:t>
+      </w:r>
+      <w:r>
+        <w:t xml:space="preserve"> na principu přijímání operandů jako referencí a také funkci, která definuje danou operaci.</w:t>
+      </w:r>
+      <w:r>
+        <w:t xml:space="preserve"> Pro tyto funkce byly vytvořeny speciální </w:t>
+      </w:r>
+      <w:r>
+        <w:t>koncepty,</w:t>
+      </w:r>
+      <w:r>
+        <w:t xml:space="preserve"> aby dodržovaly správnou signaturu.</w:t>
+      </w:r>
+      <w:r>
+        <w:t xml:space="preserve"> Uvnitř těchto metod se přijímané funkce použijí na prvek nebo mezi prvky</w:t>
+      </w:r>
+      <w:r>
+        <w:t xml:space="preserve"> dle účelu metody</w:t>
+      </w:r>
+      <w:r>
+        <w:t>.</w:t>
+      </w:r>
+      <w:r>
+        <w:t xml:space="preserve"> Metody jsou také rozdělené do </w:t>
+      </w:r>
+      <w:r>
+        <w:t>těch,</w:t>
+      </w:r>
+      <w:r>
+        <w:t xml:space="preserve"> co dělají operaci na místě (čili výsledek ukládají do prvního operandu) a na ty co vrací nový tenzor.</w:t>
+      </w:r>
+      <w:r>
+        <w:t xml:space="preserve"> Výhodné na těchto metodách je fakt, že jsou operace prvek na prvek </w:t>
+      </w:r>
+      <w:r>
+        <w:lastRenderedPageBreak/>
+        <w:t>naprosto nezávislé na jakékoliv jiné operaci a tím pádem jsou ukázkovým kandidátem na paralelizaci.</w:t>
+      </w:r>
+    </w:p>
+    <w:p>
+      <w:pPr>
+        <w:spacing w:line="360" w:lineRule="auto"/>
+      </w:pPr>
+      <w:r>
+        <w:t xml:space="preserve">Základní způsob, jak inicializovat tenzor je mu při konstrukci dát velikosti dimenzí. Podle nich si </w:t>
+      </w:r>
+      <w:r>
+        <w:t>vypočte</w:t>
+      </w:r>
+      <w:r>
+        <w:t xml:space="preserve"> vnitřní stav a alokuje pole s prvky podle potřebné velikosti.</w:t>
+      </w:r>
+      <w:r>
+        <w:t xml:space="preserve"> Pro rychlou inicializaci je možné společně s velikostmi dimenzí předat i pole se samotnými prvky. Výhodou je menší režie s inicializací, ovšem předání pole o nesprávné velikosti je nedefinované chování.</w:t>
+      </w:r>
+      <w:r>
+        <w:t xml:space="preserve"> Také lze tenzor vykonstruovat z jiného </w:t>
+      </w:r>
+      <w:r>
+        <w:t>tenzoru,</w:t>
+      </w:r>
+      <w:r>
+        <w:t xml:space="preserve"> a to jako kopii, tak i jako přesun.</w:t>
+      </w:r>
+      <w:r>
+        <w:t xml:space="preserve"> Pro to také existují přetížené operátory přiřazení.</w:t>
+      </w:r>
+      <w:r>
+        <w:t xml:space="preserve"> </w:t>
+      </w:r>
+      <w:r>
+        <w:t xml:space="preserve">Kopie tenzoru zkopíruje data i metadata tenzoru </w:t>
+      </w:r>
+      <w:proofErr w:type="spellStart"/>
+      <w:r>
+        <w:t>delega</w:t>
+      </w:r>
+      <w:r>
+        <w:t>čně</w:t>
+      </w:r>
+      <w:proofErr w:type="spellEnd"/>
+      <w:r>
+        <w:t xml:space="preserve"> přes kopii polí. Přesunutí</w:t>
+      </w:r>
+      <w:r>
+        <w:t xml:space="preserve"> opět za pomocí delegace na pole přesune pole dat i metadat. </w:t>
+      </w:r>
+      <w:r>
+        <w:t xml:space="preserve">Nakonec je tenzor </w:t>
+      </w:r>
+      <w:proofErr w:type="spellStart"/>
+      <w:r>
+        <w:t>konstruktibilní</w:t>
+      </w:r>
+      <w:proofErr w:type="spellEnd"/>
+      <w:r>
+        <w:t xml:space="preserve"> i bez parametrů, takzvaně výchozí cestou.</w:t>
+      </w:r>
+      <w:r>
+        <w:t xml:space="preserve"> Technicky vzato se nejedná o invalidní objekt, jenom je bezrozměrný.</w:t>
+      </w:r>
+    </w:p>
+    <w:p>
+      <w:pPr>
+        <w:spacing w:line="360" w:lineRule="auto"/>
+      </w:pPr>
+      <w:r>
+        <w:t>Tenzor má nakonec ve výbavě i analytické a pomocné metody. Příkladem je metoda na zjištění stejné velikosti všech dimenzí, nebo metoda na validaci souřadnic.</w:t>
+      </w:r>
+      <w:r>
+        <w:t xml:space="preserve"> Tenzory jsou také schopné se mezi sebou porovnávat, jak ohledně ekvivalence, tak pomocí pořadí</w:t>
+      </w:r>
+      <w:r>
+        <w:t xml:space="preserve"> větší menší a rovno</w:t>
+      </w:r>
+      <w:r>
+        <w:t>.</w:t>
+      </w:r>
+      <w:r>
+        <w:t xml:space="preserve"> Tyto operace jsou delegovány na samotné pole, které v podobě kontejnerů tyto schopnosti porovnávat se mají také.</w:t>
+      </w:r>
+    </w:p>
+    <w:p>
+      <w:pPr>
+        <w:pStyle w:val="Nadpis2"/>
+      </w:pPr>
+      <w:bookmarkStart w:id="8" w:name="_Toc229844817"/>
+      <w:r>
+        <w:t>1.4 Logika pole/kontejneru na prvky</w:t>
+      </w:r>
+      <w:bookmarkEnd w:id="8"/>
+    </w:p>
+    <w:p>
+      <w:pPr>
+        <w:spacing w:line="360" w:lineRule="auto"/>
+      </w:pPr>
+      <w:r>
+        <w:t>Jedná se o jednorozměrný kontejner s prvky uloženými vedle sebe v paměti.</w:t>
+      </w:r>
+      <w:r>
+        <w:t xml:space="preserve"> Tenzor ho využívá pro ukládání dat i metadat.</w:t>
+      </w:r>
+      <w:r>
+        <w:t xml:space="preserve"> Veřejným rozhraním napodobuje rozhraní </w:t>
+      </w:r>
+      <w:proofErr w:type="spellStart"/>
+      <w:proofErr w:type="gramStart"/>
+      <w:r>
+        <w:t>std</w:t>
+      </w:r>
+      <w:proofErr w:type="spellEnd"/>
+      <w:r>
+        <w:t>::</w:t>
+      </w:r>
+      <w:proofErr w:type="spellStart"/>
+      <w:proofErr w:type="gramEnd"/>
+      <w:r>
+        <w:t>vector</w:t>
+      </w:r>
+      <w:proofErr w:type="spellEnd"/>
+      <w:r>
+        <w:t>.</w:t>
+      </w:r>
+      <w:r>
+        <w:t xml:space="preserve"> Uvnitř si udržuje ukazatel na začátek pole, ukazatel na konec pole a ukazatel na konec kapacity pole.</w:t>
+      </w:r>
+      <w:r>
+        <w:t xml:space="preserve"> Udržuje si také objekt paměťového </w:t>
+      </w:r>
+      <w:proofErr w:type="spellStart"/>
+      <w:r>
+        <w:t>backendu</w:t>
+      </w:r>
+      <w:proofErr w:type="spellEnd"/>
+      <w:r>
+        <w:t xml:space="preserve">, který se stará o práci s pamětí a umožňuje kontejneru pracovat s různými druhy paměti díky vzoru </w:t>
+      </w:r>
+      <w:r>
+        <w:t>vkládání</w:t>
+      </w:r>
+      <w:r>
+        <w:t xml:space="preserve"> závislosti.</w:t>
+      </w:r>
+      <w:r>
+        <w:t xml:space="preserve"> </w:t>
+      </w:r>
+    </w:p>
+    <w:p>
+      <w:pPr>
+        <w:spacing w:line="360" w:lineRule="auto"/>
+      </w:pPr>
+      <w:r>
+        <w:t>Vznikl z několika důvodů.</w:t>
+      </w:r>
+      <w:r>
+        <w:t xml:space="preserve"> Prvním z nich byla nevhodná implementace </w:t>
+      </w:r>
+      <w:proofErr w:type="spellStart"/>
+      <w:proofErr w:type="gramStart"/>
+      <w:r>
+        <w:t>std</w:t>
+      </w:r>
+      <w:proofErr w:type="spellEnd"/>
+      <w:r>
+        <w:t>::</w:t>
+      </w:r>
+      <w:proofErr w:type="spellStart"/>
+      <w:proofErr w:type="gramEnd"/>
+      <w:r>
+        <w:t>vector</w:t>
+      </w:r>
+      <w:proofErr w:type="spellEnd"/>
+      <w:r>
+        <w:t xml:space="preserve"> pro typ </w:t>
+      </w:r>
+      <w:proofErr w:type="spellStart"/>
+      <w:r>
+        <w:rPr>
+          <w:b/>
+          <w:bCs/>
+        </w:rPr>
+        <w:t>bool</w:t>
+      </w:r>
+      <w:proofErr w:type="spellEnd"/>
+      <w:r>
+        <w:t xml:space="preserve">. </w:t>
+      </w:r>
+      <w:r>
+        <w:t xml:space="preserve">Tato specializace totiž ukládá prvky do vektoru v podobě jednotlivých bitů vedle sebe. To sice šetří paměť oproti klasickému </w:t>
+      </w:r>
+      <w:proofErr w:type="spellStart"/>
+      <w:r>
+        <w:t>bool</w:t>
+      </w:r>
+      <w:proofErr w:type="spellEnd"/>
+      <w:r>
+        <w:t xml:space="preserve">, ale </w:t>
+      </w:r>
+      <w:r>
+        <w:t>znemožňovalo</w:t>
+      </w:r>
+      <w:r>
+        <w:t xml:space="preserve"> přístup na prvek přes ukazatel nebo vrácení reference.</w:t>
+      </w:r>
+      <w:r>
+        <w:t xml:space="preserve"> </w:t>
+      </w:r>
+      <w:r>
+        <w:t>Dalším,</w:t>
+      </w:r>
+      <w:r>
+        <w:t xml:space="preserve"> a ještě vážnějším problémem byla nemožnost vložení alokátoru do vektoru jako objektu.</w:t>
+      </w:r>
+      <w:r>
+        <w:t xml:space="preserve"> Alokátor pro </w:t>
+      </w:r>
+      <w:proofErr w:type="spellStart"/>
+      <w:proofErr w:type="gramStart"/>
+      <w:r>
+        <w:t>std</w:t>
+      </w:r>
+      <w:proofErr w:type="spellEnd"/>
+      <w:r>
+        <w:t>::</w:t>
+      </w:r>
+      <w:proofErr w:type="spellStart"/>
+      <w:proofErr w:type="gramEnd"/>
+      <w:r>
+        <w:t>vector</w:t>
+      </w:r>
+      <w:proofErr w:type="spellEnd"/>
+      <w:r>
+        <w:t xml:space="preserve"> se předává jako typový </w:t>
+      </w:r>
+      <w:r>
+        <w:t>parametr,</w:t>
+      </w:r>
+      <w:r>
+        <w:t xml:space="preserve"> a tudíž nemůže uchovávat vnitřní stav, který by se z venku nastavoval.</w:t>
+      </w:r>
+      <w:r>
+        <w:t xml:space="preserve"> Veškerý vnitřní stav, pokud vůbec nějaký, může vytvářet při výchozí konstrukci výchozím způsobem, bez jakéhokoliv nastavování z venku (pokud se bavíme o řase běhu programu).</w:t>
+      </w:r>
+      <w:r>
+        <w:t xml:space="preserve"> To je potřeba, protože pro alokaci paměti USM, jelikož využívá k alokaci objektu s nekonstantními metodami</w:t>
+      </w:r>
+      <w:r>
+        <w:t xml:space="preserve"> (metodami co můžou změnit vnitřní stav</w:t>
+      </w:r>
+      <w:r>
+        <w:t xml:space="preserve"> objektu</w:t>
+      </w:r>
+      <w:r>
+        <w:t>)</w:t>
+      </w:r>
+      <w:r>
+        <w:t>.</w:t>
+      </w:r>
+    </w:p>
+    <w:p>
+      <w:pPr>
+        <w:spacing w:line="360" w:lineRule="auto"/>
+      </w:pPr>
+      <w:r>
+        <w:lastRenderedPageBreak/>
+        <w:t>Kontejner je možné vytvořit ve výchozím stavu bez parametrů jako prázdný, nebo pomocí čísla udávající úvodní velikost.</w:t>
+      </w:r>
+      <w:r>
+        <w:t xml:space="preserve"> Je možné ho pomocí konstruktorů i přetížených operátorů přiřazení kopírovat i přesouvat.</w:t>
+      </w:r>
+      <w:r>
+        <w:t xml:space="preserve"> </w:t>
+      </w:r>
+      <w:r>
+        <w:t xml:space="preserve">Kopie zkopíruje data </w:t>
+      </w:r>
+      <w:r>
+        <w:t>kontejneru,</w:t>
+      </w:r>
+      <w:r>
+        <w:t xml:space="preserve"> zatímco přesunutí jenom předává ukazatele na data (začátek, konec a konec kapacity).</w:t>
+      </w:r>
+      <w:r>
+        <w:t xml:space="preserve"> Kvůli bezpečné práci s pamětí je </w:t>
+      </w:r>
+      <w:r>
+        <w:t xml:space="preserve">paměťový </w:t>
+      </w:r>
+      <w:proofErr w:type="spellStart"/>
+      <w:r>
+        <w:t>backend</w:t>
+      </w:r>
+      <w:proofErr w:type="spellEnd"/>
+      <w:r>
+        <w:t xml:space="preserve"> také předáván a kopírován</w:t>
+      </w:r>
+      <w:r>
+        <w:t xml:space="preserve"> i přesto že klasické kopírování a přesun jsou povoleny pouze pro kontejnery se stejným typem </w:t>
+      </w:r>
+      <w:proofErr w:type="spellStart"/>
+      <w:r>
+        <w:t>backendu</w:t>
+      </w:r>
+      <w:proofErr w:type="spellEnd"/>
+      <w:r>
+        <w:t>.</w:t>
+      </w:r>
+      <w:r>
+        <w:t xml:space="preserve"> Pro bezpečnou kopii do kontejneru s jiným </w:t>
+      </w:r>
+      <w:proofErr w:type="spellStart"/>
+      <w:r>
+        <w:t>backendem</w:t>
+      </w:r>
+      <w:proofErr w:type="spellEnd"/>
+      <w:r>
+        <w:t xml:space="preserve"> slouží speciální </w:t>
+      </w:r>
+      <w:r>
+        <w:t>metoda,</w:t>
+      </w:r>
+      <w:r>
+        <w:t xml:space="preserve"> do které se nový </w:t>
+      </w:r>
+      <w:proofErr w:type="spellStart"/>
+      <w:r>
+        <w:t>backend</w:t>
+      </w:r>
+      <w:proofErr w:type="spellEnd"/>
+      <w:r>
+        <w:t xml:space="preserve"> </w:t>
+      </w:r>
+      <w:proofErr w:type="spellStart"/>
+      <w:r>
+        <w:t>přikladá</w:t>
+      </w:r>
+      <w:proofErr w:type="spellEnd"/>
+      <w:r>
+        <w:t>.</w:t>
+      </w:r>
+      <w:r>
+        <w:t xml:space="preserve"> Tato metoda ovšem dělá pouze kopii, jelikož nelze </w:t>
+      </w:r>
+      <w:proofErr w:type="spellStart"/>
+      <w:r>
+        <w:t>zajitit</w:t>
+      </w:r>
+      <w:proofErr w:type="spellEnd"/>
+      <w:r>
+        <w:t xml:space="preserve"> bezpečný přesun z jednoho </w:t>
+      </w:r>
+      <w:proofErr w:type="spellStart"/>
+      <w:r>
+        <w:t>backendu</w:t>
+      </w:r>
+      <w:proofErr w:type="spellEnd"/>
+      <w:r>
+        <w:t xml:space="preserve"> do druhého.</w:t>
+      </w:r>
+    </w:p>
+    <w:p>
+      <w:pPr>
         <w:pStyle w:val="Nadpis1"/>
         <w:jc w:val="both"/>
       </w:pPr>
       <w:r>
         <w:br w:type="page"/>
       </w:r>
-      <w:bookmarkStart w:id="8" w:name="_Toc229768694"/>
+      <w:bookmarkStart w:id="9" w:name="_Toc229844818"/>
       <w:r>
         <w:lastRenderedPageBreak/>
         <w:t>2</w:t>
@@ -8815,7 +9350,7 @@
       <w:r>
         <w:t>IMPLEMENTACE</w:t>
       </w:r>
-      <w:bookmarkEnd w:id="8"/>
+      <w:bookmarkEnd w:id="9"/>
       <w:r>
         <w:t xml:space="preserve"> </w:t>
       </w:r>
@@ -8899,11 +9434,11 @@
       <w:pPr>
         <w:pStyle w:val="Nadpis2"/>
       </w:pPr>
-      <w:bookmarkStart w:id="9" w:name="_Toc229768695"/>
+      <w:bookmarkStart w:id="10" w:name="_Toc229844819"/>
       <w:r>
         <w:t>2.1 Použité nástroje</w:t>
       </w:r>
-      <w:bookmarkEnd w:id="9"/>
+      <w:bookmarkEnd w:id="10"/>
     </w:p>
     <w:p>
       <w:pPr>
@@ -8923,7 +9458,7 @@
       <w:pPr>
         <w:pStyle w:val="Nadpis3"/>
       </w:pPr>
-      <w:bookmarkStart w:id="10" w:name="_Toc229768696"/>
+      <w:bookmarkStart w:id="11" w:name="_Toc229844820"/>
       <w:r>
         <w:t xml:space="preserve">2.1.1 </w:t>
       </w:r>
@@ -8931,7 +9466,7 @@
       <w:r>
         <w:t>AdaptiveCpp</w:t>
       </w:r>
-      <w:bookmarkEnd w:id="10"/>
+      <w:bookmarkEnd w:id="11"/>
       <w:proofErr w:type="spellEnd"/>
     </w:p>
     <w:p>
@@ -9073,11 +9608,11 @@
       <w:pPr>
         <w:pStyle w:val="Nadpis3"/>
       </w:pPr>
-      <w:bookmarkStart w:id="11" w:name="_Toc229768697"/>
+      <w:bookmarkStart w:id="12" w:name="_Toc229844821"/>
       <w:r>
         <w:t>2.1.2 Google test</w:t>
       </w:r>
-      <w:bookmarkEnd w:id="11"/>
+      <w:bookmarkEnd w:id="12"/>
     </w:p>
     <w:p>
       <w:pPr>
@@ -9114,7 +9649,7 @@
       <w:pPr>
         <w:pStyle w:val="Nadpis2"/>
       </w:pPr>
-      <w:bookmarkStart w:id="12" w:name="_Toc229768698"/>
+      <w:bookmarkStart w:id="13" w:name="_Toc229844822"/>
       <w:r>
         <w:t>2.</w:t>
       </w:r>
@@ -9124,7 +9659,7 @@
       <w:r>
         <w:t xml:space="preserve"> Komponenty</w:t>
       </w:r>
-      <w:bookmarkEnd w:id="12"/>
+      <w:bookmarkEnd w:id="13"/>
     </w:p>
     <w:p>
       <w:pPr>
@@ -9138,11 +9673,11 @@
       <w:pPr>
         <w:pStyle w:val="Nadpis3"/>
       </w:pPr>
-      <w:bookmarkStart w:id="13" w:name="_Toc229768699"/>
+      <w:bookmarkStart w:id="14" w:name="_Toc229844823"/>
       <w:r>
         <w:t>2.2.1 Koncepty</w:t>
       </w:r>
-      <w:bookmarkEnd w:id="13"/>
+      <w:bookmarkEnd w:id="14"/>
     </w:p>
     <w:p>
       <w:pPr>
@@ -9236,7 +9771,7 @@
       <w:pPr>
         <w:pStyle w:val="Nadpis3"/>
       </w:pPr>
-      <w:bookmarkStart w:id="14" w:name="_Toc229768700"/>
+      <w:bookmarkStart w:id="15" w:name="_Toc229844824"/>
       <w:r>
         <w:t>2.2.</w:t>
       </w:r>
@@ -9250,7 +9785,7 @@
       <w:r>
         <w:t>backend</w:t>
       </w:r>
-      <w:bookmarkEnd w:id="14"/>
+      <w:bookmarkEnd w:id="15"/>
       <w:proofErr w:type="spellEnd"/>
     </w:p>
     <w:p>
@@ -9266,7 +9801,7 @@
           <w:lang w:eastAsia="cs-CZ"/>
         </w:rPr>
       </w:pPr>
-      <w:bookmarkStart w:id="15" w:name="_Toc229768701"/>
+      <w:bookmarkStart w:id="16" w:name="_Toc229844825"/>
       <w:r>
         <w:t>2.</w:t>
       </w:r>
@@ -9293,7 +9828,7 @@
         </w:rPr>
         <w:t>Lineární kontejner</w:t>
       </w:r>
-      <w:bookmarkEnd w:id="15"/>
+      <w:bookmarkEnd w:id="16"/>
     </w:p>
     <w:p>
       <w:pPr>
@@ -9367,6 +9902,7 @@
         <w:t xml:space="preserve">Motivace k jeho implementaci je potřeba kontejneru s rozhraním napodobujícím </w:t>
       </w:r>
       <w:proofErr w:type="spellStart"/>
+      <w:proofErr w:type="gramStart"/>
       <w:r>
         <w:rPr>
           <w:lang w:eastAsia="cs-CZ"/>
@@ -9381,6 +9917,7 @@
         <w:t>::</w:t>
       </w:r>
       <w:proofErr w:type="spellStart"/>
+      <w:proofErr w:type="gramEnd"/>
       <w:r>
         <w:rPr>
           <w:lang w:eastAsia="cs-CZ"/>
@@ -9407,6 +9944,7 @@
         <w:t>, jelikož existuje potřeba pro speciální alokaci paměti na různých zařízeních (například GPU), kterou ani vlastní alokátor použitý s </w:t>
       </w:r>
       <w:proofErr w:type="spellStart"/>
+      <w:proofErr w:type="gramStart"/>
       <w:r>
         <w:rPr>
           <w:lang w:eastAsia="cs-CZ"/>
@@ -9421,6 +9959,7 @@
         <w:t>::</w:t>
       </w:r>
       <w:proofErr w:type="spellStart"/>
+      <w:proofErr w:type="gramEnd"/>
       <w:r>
         <w:rPr>
           <w:lang w:eastAsia="cs-CZ"/>
@@ -9558,7 +10097,14 @@
         <w:rPr>
           <w:lang w:eastAsia="cs-CZ"/>
         </w:rPr>
-        <w:t xml:space="preserve"> Tento alokátor řeší použití ::</w:t>
+        <w:t xml:space="preserve"> Tento alokátor řeší </w:t>
+      </w:r>
+      <w:proofErr w:type="gramStart"/>
+      <w:r>
+        <w:rPr>
+          <w:lang w:eastAsia="cs-CZ"/>
+        </w:rPr>
+        <w:t>použití ::</w:t>
       </w:r>
       <w:proofErr w:type="spellStart"/>
       <w:r>
@@ -9568,6 +10114,7 @@
         <w:t>operator</w:t>
       </w:r>
       <w:proofErr w:type="spellEnd"/>
+      <w:proofErr w:type="gramEnd"/>
       <w:r>
         <w:rPr>
           <w:lang w:eastAsia="cs-CZ"/>
@@ -9586,7 +10133,14 @@
         <w:rPr>
           <w:lang w:eastAsia="cs-CZ"/>
         </w:rPr>
-        <w:t xml:space="preserve"> a ::</w:t>
+        <w:t xml:space="preserve"> </w:t>
+      </w:r>
+      <w:proofErr w:type="gramStart"/>
+      <w:r>
+        <w:rPr>
+          <w:lang w:eastAsia="cs-CZ"/>
+        </w:rPr>
+        <w:t>a ::</w:t>
       </w:r>
       <w:proofErr w:type="spellStart"/>
       <w:r>
@@ -9596,6 +10150,7 @@
         <w:t>operator</w:t>
       </w:r>
       <w:proofErr w:type="spellEnd"/>
+      <w:proofErr w:type="gramEnd"/>
       <w:r>
         <w:rPr>
           <w:lang w:eastAsia="cs-CZ"/>
@@ -9685,6 +10240,7 @@
         <w:t xml:space="preserve">Pro kopírování, porovnávání či konstrukci a destrukci jsou v případě triviálně manipulovatelných typů (kontrolováno například pomocí </w:t>
       </w:r>
       <w:proofErr w:type="spellStart"/>
+      <w:proofErr w:type="gramStart"/>
       <w:r>
         <w:rPr>
           <w:lang w:eastAsia="cs-CZ"/>
@@ -9699,6 +10255,7 @@
         <w:t>::</w:t>
       </w:r>
       <w:proofErr w:type="spellStart"/>
+      <w:proofErr w:type="gramEnd"/>
       <w:r>
         <w:rPr>
           <w:lang w:eastAsia="cs-CZ"/>
@@ -9733,6 +10290,7 @@
         <w:t xml:space="preserve"> funkce standartní knihovny jako například </w:t>
       </w:r>
       <w:proofErr w:type="spellStart"/>
+      <w:proofErr w:type="gramStart"/>
       <w:r>
         <w:rPr>
           <w:lang w:eastAsia="cs-CZ"/>
@@ -9747,6 +10305,7 @@
         <w:t>::</w:t>
       </w:r>
       <w:proofErr w:type="spellStart"/>
+      <w:proofErr w:type="gramEnd"/>
       <w:r>
         <w:rPr>
           <w:lang w:eastAsia="cs-CZ"/>
@@ -9761,6 +10320,7 @@
         <w:t xml:space="preserve"> či </w:t>
       </w:r>
       <w:proofErr w:type="spellStart"/>
+      <w:proofErr w:type="gramStart"/>
       <w:r>
         <w:rPr>
           <w:lang w:eastAsia="cs-CZ"/>
@@ -9775,6 +10335,7 @@
         <w:t>::</w:t>
       </w:r>
       <w:proofErr w:type="spellStart"/>
+      <w:proofErr w:type="gramEnd"/>
       <w:r>
         <w:rPr>
           <w:lang w:eastAsia="cs-CZ"/>
@@ -9823,6 +10384,7 @@
         <w:t xml:space="preserve">Z venkovního hlediska se rozhraní této třídy velmi podobá </w:t>
       </w:r>
       <w:proofErr w:type="spellStart"/>
+      <w:proofErr w:type="gramStart"/>
       <w:r>
         <w:rPr>
           <w:lang w:eastAsia="cs-CZ"/>
@@ -9837,6 +10399,7 @@
         <w:t>::</w:t>
       </w:r>
       <w:proofErr w:type="spellStart"/>
+      <w:proofErr w:type="gramEnd"/>
       <w:r>
         <w:rPr>
           <w:lang w:eastAsia="cs-CZ"/>
@@ -9910,7 +10473,21 @@
         <w:rPr>
           <w:lang w:eastAsia="cs-CZ"/>
         </w:rPr>
-        <w:t xml:space="preserve"> metody data()) </w:t>
+        <w:t xml:space="preserve"> metody </w:t>
+      </w:r>
+      <w:proofErr w:type="gramStart"/>
+      <w:r>
+        <w:rPr>
+          <w:lang w:eastAsia="cs-CZ"/>
+        </w:rPr>
+        <w:t>data(</w:t>
+      </w:r>
+      <w:proofErr w:type="gramEnd"/>
+      <w:r>
+        <w:rPr>
+          <w:lang w:eastAsia="cs-CZ"/>
+        </w:rPr>
+        <w:t xml:space="preserve">)) </w:t>
       </w:r>
       <w:r>
         <w:rPr>
@@ -9924,11 +10501,19 @@
         </w:rPr>
         <w:t>použít přetížení indexovacího operátoru ([]) pro přístup na jednotlivé prvky (v </w:t>
       </w:r>
-      <w:r>
-        <w:rPr>
-          <w:lang w:eastAsia="cs-CZ"/>
-        </w:rPr>
-        <w:t>O(1)</w:t>
+      <w:proofErr w:type="gramStart"/>
+      <w:r>
+        <w:rPr>
+          <w:lang w:eastAsia="cs-CZ"/>
+        </w:rPr>
+        <w:t>O(</w:t>
+      </w:r>
+      <w:proofErr w:type="gramEnd"/>
+      <w:r>
+        <w:rPr>
+          <w:lang w:eastAsia="cs-CZ"/>
+        </w:rPr>
+        <w:t>1)</w:t>
       </w:r>
       <w:r>
         <w:rPr>
@@ -9961,6 +10546,7 @@
         <w:t xml:space="preserve">, ze stejného rozhraní u </w:t>
       </w:r>
       <w:proofErr w:type="spellStart"/>
+      <w:proofErr w:type="gramStart"/>
       <w:r>
         <w:rPr>
           <w:lang w:eastAsia="cs-CZ"/>
@@ -9975,6 +10561,7 @@
         <w:t>::</w:t>
       </w:r>
       <w:proofErr w:type="spellStart"/>
+      <w:proofErr w:type="gramEnd"/>
       <w:r>
         <w:rPr>
           <w:lang w:eastAsia="cs-CZ"/>
@@ -10090,7 +10677,7 @@
           <w:lang w:eastAsia="cs-CZ"/>
         </w:rPr>
       </w:pPr>
-      <w:bookmarkStart w:id="16" w:name="_Toc229768702"/>
+      <w:bookmarkStart w:id="17" w:name="_Toc229844826"/>
       <w:r>
         <w:rPr>
           <w:lang w:eastAsia="cs-CZ"/>
@@ -10121,7 +10708,7 @@
         </w:rPr>
         <w:t xml:space="preserve"> Tenzor</w:t>
       </w:r>
-      <w:bookmarkEnd w:id="16"/>
+      <w:bookmarkEnd w:id="17"/>
     </w:p>
     <w:p>
       <w:pPr>
@@ -10173,6 +10760,7 @@
         <w:t xml:space="preserve"> Jelikož udržování informací o struktuře tenzoru (tím myšleno rozměry dimenzí) je očekávané jen se zanedbatelným využitím paměti oproti datům, tak pro jednoduchost byly tyto informace uloženy do </w:t>
       </w:r>
       <w:proofErr w:type="spellStart"/>
+      <w:proofErr w:type="gramStart"/>
       <w:r>
         <w:rPr>
           <w:lang w:eastAsia="cs-CZ"/>
@@ -10187,6 +10775,7 @@
         <w:t>::</w:t>
       </w:r>
       <w:proofErr w:type="spellStart"/>
+      <w:proofErr w:type="gramEnd"/>
       <w:r>
         <w:rPr>
           <w:lang w:eastAsia="cs-CZ"/>
@@ -10279,6 +10868,7 @@
         <w:t xml:space="preserve">ementaci šablonovaných metod. Například reference na jeden prvek není reference na </w:t>
       </w:r>
       <w:proofErr w:type="spellStart"/>
+      <w:proofErr w:type="gramStart"/>
       <w:r>
         <w:rPr>
           <w:lang w:eastAsia="cs-CZ"/>
@@ -10286,6 +10876,7 @@
         <w:t>bool</w:t>
       </w:r>
       <w:proofErr w:type="spellEnd"/>
+      <w:proofErr w:type="gramEnd"/>
       <w:r>
         <w:rPr>
           <w:lang w:eastAsia="cs-CZ"/>
@@ -10372,6 +10963,7 @@
         <w:t xml:space="preserve">, a to pomocí </w:t>
       </w:r>
       <w:proofErr w:type="spellStart"/>
+      <w:proofErr w:type="gramStart"/>
       <w:r>
         <w:rPr>
           <w:lang w:eastAsia="cs-CZ"/>
@@ -10386,6 +10978,7 @@
         <w:t>::</w:t>
       </w:r>
       <w:proofErr w:type="spellStart"/>
+      <w:proofErr w:type="gramEnd"/>
       <w:r>
         <w:rPr>
           <w:lang w:eastAsia="cs-CZ"/>
@@ -10438,6 +11031,7 @@
         <w:t xml:space="preserve"> jak vytvořit tenzor je použít konstruktor přijímající jeden </w:t>
       </w:r>
       <w:proofErr w:type="spellStart"/>
+      <w:proofErr w:type="gramStart"/>
       <w:r>
         <w:rPr>
           <w:lang w:eastAsia="cs-CZ"/>
@@ -10452,6 +11046,7 @@
         <w:t>::</w:t>
       </w:r>
       <w:proofErr w:type="spellStart"/>
+      <w:proofErr w:type="gramEnd"/>
       <w:r>
         <w:rPr>
           <w:lang w:eastAsia="cs-CZ"/>
@@ -10487,7 +11082,21 @@
         <w:rPr>
           <w:lang w:eastAsia="cs-CZ"/>
         </w:rPr>
-        <w:t xml:space="preserve"> Ten vektor obsahuje velikosti dimenzí. V konstruktoru se nakopíruje do vektoru pro udržování velikostí dimenzí a poté se spustí metoda update(), která vypočítá potřebné místo k alokaci tenzoru</w:t>
+        <w:t xml:space="preserve"> Ten vektor obsahuje velikosti dimenzí. V konstruktoru se nakopíruje do vektoru pro udržování velikostí dimenzí a poté se spustí metoda </w:t>
+      </w:r>
+      <w:proofErr w:type="gramStart"/>
+      <w:r>
+        <w:rPr>
+          <w:lang w:eastAsia="cs-CZ"/>
+        </w:rPr>
+        <w:t>update(</w:t>
+      </w:r>
+      <w:proofErr w:type="gramEnd"/>
+      <w:r>
+        <w:rPr>
+          <w:lang w:eastAsia="cs-CZ"/>
+        </w:rPr>
+        <w:t>), která vypočítá potřebné místo k alokaci tenzoru</w:t>
       </w:r>
       <w:r>
         <w:rPr>
@@ -10529,7 +11138,7 @@
           <w:lang w:eastAsia="cs-CZ"/>
         </w:rPr>
       </w:pPr>
-      <w:bookmarkStart w:id="17" w:name="_Toc229768703"/>
+      <w:bookmarkStart w:id="18" w:name="_Toc229844827"/>
       <w:r>
         <w:rPr>
           <w:lang w:eastAsia="cs-CZ"/>
@@ -10560,7 +11169,7 @@
         </w:rPr>
         <w:t xml:space="preserve"> Paralelní tenzor</w:t>
       </w:r>
-      <w:bookmarkEnd w:id="17"/>
+      <w:bookmarkEnd w:id="18"/>
     </w:p>
     <w:p>
       <w:pPr>
@@ -10585,7 +11194,7 @@
           <w:lang w:eastAsia="cs-CZ"/>
         </w:rPr>
       </w:pPr>
-      <w:bookmarkStart w:id="18" w:name="_Toc229768704"/>
+      <w:bookmarkStart w:id="19" w:name="_Toc229844828"/>
       <w:r>
         <w:rPr>
           <w:lang w:eastAsia="cs-CZ"/>
@@ -10616,7 +11225,7 @@
         </w:rPr>
         <w:t xml:space="preserve"> Matice</w:t>
       </w:r>
-      <w:bookmarkEnd w:id="18"/>
+      <w:bookmarkEnd w:id="19"/>
     </w:p>
     <w:p>
       <w:pPr>
@@ -10641,7 +11250,7 @@
           <w:lang w:eastAsia="cs-CZ"/>
         </w:rPr>
       </w:pPr>
-      <w:bookmarkStart w:id="19" w:name="_Toc229768705"/>
+      <w:bookmarkStart w:id="20" w:name="_Toc229844829"/>
       <w:r>
         <w:rPr>
           <w:lang w:eastAsia="cs-CZ"/>
@@ -10672,7 +11281,7 @@
         </w:rPr>
         <w:t xml:space="preserve"> Paralelní matice</w:t>
       </w:r>
-      <w:bookmarkEnd w:id="19"/>
+      <w:bookmarkEnd w:id="20"/>
     </w:p>
     <w:p>
       <w:pPr>
@@ -10697,7 +11306,7 @@
           <w:lang w:eastAsia="cs-CZ"/>
         </w:rPr>
       </w:pPr>
-      <w:bookmarkStart w:id="20" w:name="_Toc229768706"/>
+      <w:bookmarkStart w:id="21" w:name="_Toc229844830"/>
       <w:r>
         <w:rPr>
           <w:lang w:eastAsia="cs-CZ"/>
@@ -10742,7 +11351,7 @@
         </w:rPr>
         <w:t xml:space="preserve"> strom</w:t>
       </w:r>
-      <w:bookmarkEnd w:id="20"/>
+      <w:bookmarkEnd w:id="21"/>
     </w:p>
     <w:p>
       <w:pPr>
@@ -10767,7 +11376,7 @@
           <w:lang w:eastAsia="cs-CZ"/>
         </w:rPr>
       </w:pPr>
-      <w:bookmarkStart w:id="21" w:name="_Toc229768707"/>
+      <w:bookmarkStart w:id="22" w:name="_Toc229844831"/>
       <w:r>
         <w:rPr>
           <w:lang w:eastAsia="cs-CZ"/>
@@ -10786,7 +11395,7 @@
         </w:rPr>
         <w:t xml:space="preserve"> Testy</w:t>
       </w:r>
-      <w:bookmarkEnd w:id="21"/>
+      <w:bookmarkEnd w:id="22"/>
     </w:p>
     <w:p>
       <w:pPr>
@@ -10940,7 +11549,7 @@
           <w:lang w:eastAsia="cs-CZ"/>
         </w:rPr>
       </w:pPr>
-      <w:bookmarkStart w:id="22" w:name="_Toc229768708"/>
+      <w:bookmarkStart w:id="23" w:name="_Toc229844832"/>
       <w:r>
         <w:rPr>
           <w:lang w:eastAsia="cs-CZ"/>
@@ -10959,7 +11568,7 @@
         </w:rPr>
         <w:t>.1 Unit testování</w:t>
       </w:r>
-      <w:bookmarkEnd w:id="22"/>
+      <w:bookmarkEnd w:id="23"/>
     </w:p>
     <w:p>
       <w:pPr>
@@ -10984,7 +11593,7 @@
           <w:lang w:eastAsia="cs-CZ"/>
         </w:rPr>
       </w:pPr>
-      <w:bookmarkStart w:id="23" w:name="_Toc229768709"/>
+      <w:bookmarkStart w:id="24" w:name="_Toc229844833"/>
       <w:r>
         <w:rPr>
           <w:lang w:eastAsia="cs-CZ"/>
@@ -11003,7 +11612,7 @@
         </w:rPr>
         <w:t>.2 Zátěžové testování</w:t>
       </w:r>
-      <w:bookmarkEnd w:id="23"/>
+      <w:bookmarkEnd w:id="24"/>
     </w:p>
     <w:p>
       <w:pPr>
@@ -11043,12 +11652,12 @@
       <w:pPr>
         <w:pStyle w:val="Nadpis1"/>
       </w:pPr>
-      <w:bookmarkStart w:id="24" w:name="_Toc229768710"/>
+      <w:bookmarkStart w:id="25" w:name="_Toc229844834"/>
       <w:r>
         <w:lastRenderedPageBreak/>
         <w:t>3 TEORETICKÉ VYUŽITÍ</w:t>
       </w:r>
-      <w:bookmarkEnd w:id="24"/>
+      <w:bookmarkEnd w:id="25"/>
     </w:p>
     <w:p>
       <w:proofErr w:type="spellStart"/>
@@ -11075,7 +11684,7 @@
           <w:szCs w:val="24"/>
         </w:rPr>
       </w:pPr>
-      <w:bookmarkStart w:id="25" w:name="_Toc227521731"/>
+      <w:bookmarkStart w:id="26" w:name="_Toc227521731"/>
       <w:r>
         <w:rPr>
           <w:i w:val="0"/>
@@ -11150,7 +11759,7 @@
         </w:rPr>
         <w:t>Vzdělanostní struktura obyvatelstva České republiky (2021)</w:t>
       </w:r>
-      <w:bookmarkEnd w:id="25"/>
+      <w:bookmarkEnd w:id="26"/>
     </w:p>
     <w:tbl>
       <w:tblPr>
@@ -11785,8 +12394,8 @@
         </w:rPr>
         <w:t>: Balonky (Min, 2016</w:t>
       </w:r>
-      <w:bookmarkStart w:id="26" w:name="_Toc24458948"/>
-      <w:bookmarkStart w:id="27" w:name="_Toc24459062"/>
+      <w:bookmarkStart w:id="27" w:name="_Toc24458948"/>
+      <w:bookmarkStart w:id="28" w:name="_Toc24459062"/>
       <w:r>
         <w:rPr>
           <w:i w:val="0"/>
@@ -11794,8 +12403,8 @@
         </w:rPr>
         <w:t>)</w:t>
       </w:r>
-      <w:bookmarkEnd w:id="26"/>
       <w:bookmarkEnd w:id="27"/>
+      <w:bookmarkEnd w:id="28"/>
       <w:r>
         <w:rPr>
           <w:i w:val="0"/>
@@ -11814,12 +12423,12 @@
         </w:rPr>
         <w:br w:type="page"/>
       </w:r>
-      <w:bookmarkStart w:id="28" w:name="_Toc229768711"/>
+      <w:bookmarkStart w:id="29" w:name="_Toc229844835"/>
       <w:r>
         <w:lastRenderedPageBreak/>
         <w:t>ZÁVĚR</w:t>
       </w:r>
-      <w:bookmarkEnd w:id="28"/>
+      <w:bookmarkEnd w:id="29"/>
     </w:p>
     <w:p>
       <w:pPr>
@@ -11993,12 +12602,12 @@
       <w:r>
         <w:br w:type="page"/>
       </w:r>
-      <w:bookmarkStart w:id="29" w:name="_Toc229768712"/>
+      <w:bookmarkStart w:id="30" w:name="_Toc229844836"/>
       <w:r>
         <w:lastRenderedPageBreak/>
         <w:t>POUŽITÁ LITERATURA</w:t>
       </w:r>
-      <w:bookmarkEnd w:id="29"/>
+      <w:bookmarkEnd w:id="30"/>
     </w:p>
     <w:p>
       <w:pPr>
@@ -12369,12 +12978,12 @@
       <w:r>
         <w:br w:type="page"/>
       </w:r>
-      <w:bookmarkStart w:id="30" w:name="_Toc229768713"/>
+      <w:bookmarkStart w:id="31" w:name="_Toc229844837"/>
       <w:r>
         <w:lastRenderedPageBreak/>
         <w:t>SEZNAM PŘÍLOH</w:t>
       </w:r>
-      <w:bookmarkEnd w:id="30"/>
+      <w:bookmarkEnd w:id="31"/>
     </w:p>
     <w:p>
       <w:pPr>

</xml_diff>

<commit_message>
documentation - utils + fix citation formatting.
</commit_message>
<xml_diff>
--- a/ŠpaňúrM_KnihovnaProPraci_JM_2026.docx
+++ b/ŠpaňúrM_KnihovnaProPraci_JM_2026.docx
@@ -1618,7 +1618,6 @@
           <w:noProof/>
           <w:kern w:val="2"/>
           <w:szCs w:val="24"/>
-          <w:lang/>
           <w14:ligatures w14:val="standardContextual"/>
         </w:rPr>
       </w:pPr>
@@ -1701,7 +1700,6 @@
           <w:noProof/>
           <w:kern w:val="2"/>
           <w:szCs w:val="24"/>
-          <w:lang/>
           <w14:ligatures w14:val="standardContextual"/>
         </w:rPr>
       </w:pPr>
@@ -1775,7 +1773,6 @@
           <w:noProof/>
           <w:kern w:val="2"/>
           <w:szCs w:val="24"/>
-          <w:lang/>
           <w14:ligatures w14:val="standardContextual"/>
         </w:rPr>
       </w:pPr>
@@ -1849,7 +1846,6 @@
           <w:noProof/>
           <w:kern w:val="2"/>
           <w:szCs w:val="24"/>
-          <w:lang/>
           <w14:ligatures w14:val="standardContextual"/>
         </w:rPr>
       </w:pPr>
@@ -1922,7 +1918,6 @@
           <w:noProof/>
           <w:kern w:val="2"/>
           <w:szCs w:val="24"/>
-          <w:lang/>
           <w14:ligatures w14:val="standardContextual"/>
         </w:rPr>
       </w:pPr>
@@ -1992,7 +1987,6 @@
           <w:noProof/>
           <w:kern w:val="2"/>
           <w:szCs w:val="24"/>
-          <w:lang/>
           <w14:ligatures w14:val="standardContextual"/>
         </w:rPr>
       </w:pPr>
@@ -2062,7 +2056,6 @@
           <w:noProof/>
           <w:kern w:val="2"/>
           <w:szCs w:val="24"/>
-          <w:lang/>
           <w14:ligatures w14:val="standardContextual"/>
         </w:rPr>
       </w:pPr>
@@ -2132,7 +2125,6 @@
           <w:noProof/>
           <w:kern w:val="2"/>
           <w:szCs w:val="24"/>
-          <w:lang/>
           <w14:ligatures w14:val="standardContextual"/>
         </w:rPr>
       </w:pPr>
@@ -2205,7 +2197,6 @@
           <w:noProof/>
           <w:kern w:val="2"/>
           <w:szCs w:val="24"/>
-          <w:lang/>
           <w14:ligatures w14:val="standardContextual"/>
         </w:rPr>
       </w:pPr>
@@ -2278,7 +2269,6 @@
           <w:noProof/>
           <w:kern w:val="2"/>
           <w:szCs w:val="24"/>
-          <w:lang/>
           <w14:ligatures w14:val="standardContextual"/>
         </w:rPr>
       </w:pPr>
@@ -2351,7 +2341,6 @@
           <w:noProof/>
           <w:kern w:val="2"/>
           <w:szCs w:val="24"/>
-          <w:lang/>
           <w14:ligatures w14:val="standardContextual"/>
         </w:rPr>
       </w:pPr>
@@ -2421,7 +2410,6 @@
           <w:noProof/>
           <w:kern w:val="2"/>
           <w:szCs w:val="24"/>
-          <w:lang/>
           <w14:ligatures w14:val="standardContextual"/>
         </w:rPr>
       </w:pPr>
@@ -2494,7 +2482,6 @@
           <w:noProof/>
           <w:kern w:val="2"/>
           <w:szCs w:val="24"/>
-          <w:lang/>
           <w14:ligatures w14:val="standardContextual"/>
         </w:rPr>
       </w:pPr>
@@ -2567,7 +2554,6 @@
           <w:noProof/>
           <w:kern w:val="2"/>
           <w:szCs w:val="24"/>
-          <w:lang/>
           <w14:ligatures w14:val="standardContextual"/>
         </w:rPr>
       </w:pPr>
@@ -2637,7 +2623,6 @@
           <w:noProof/>
           <w:kern w:val="2"/>
           <w:szCs w:val="24"/>
-          <w:lang/>
           <w14:ligatures w14:val="standardContextual"/>
         </w:rPr>
       </w:pPr>
@@ -2710,7 +2695,6 @@
           <w:noProof/>
           <w:kern w:val="2"/>
           <w:szCs w:val="24"/>
-          <w:lang/>
           <w14:ligatures w14:val="standardContextual"/>
         </w:rPr>
       </w:pPr>
@@ -2783,7 +2767,6 @@
           <w:noProof/>
           <w:kern w:val="2"/>
           <w:szCs w:val="24"/>
-          <w:lang/>
           <w14:ligatures w14:val="standardContextual"/>
         </w:rPr>
       </w:pPr>
@@ -2856,7 +2839,6 @@
           <w:noProof/>
           <w:kern w:val="2"/>
           <w:szCs w:val="24"/>
-          <w:lang/>
           <w14:ligatures w14:val="standardContextual"/>
         </w:rPr>
       </w:pPr>
@@ -2937,7 +2919,6 @@
           <w:noProof/>
           <w:kern w:val="2"/>
           <w:szCs w:val="24"/>
-          <w:lang/>
           <w14:ligatures w14:val="standardContextual"/>
         </w:rPr>
       </w:pPr>
@@ -3011,7 +2992,6 @@
           <w:noProof/>
           <w:kern w:val="2"/>
           <w:szCs w:val="24"/>
-          <w:lang/>
           <w14:ligatures w14:val="standardContextual"/>
         </w:rPr>
       </w:pPr>
@@ -3085,7 +3065,6 @@
           <w:noProof/>
           <w:kern w:val="2"/>
           <w:szCs w:val="24"/>
-          <w:lang/>
           <w14:ligatures w14:val="standardContextual"/>
         </w:rPr>
       </w:pPr>
@@ -3159,7 +3138,6 @@
           <w:noProof/>
           <w:kern w:val="2"/>
           <w:szCs w:val="24"/>
-          <w:lang/>
           <w14:ligatures w14:val="standardContextual"/>
         </w:rPr>
       </w:pPr>
@@ -3233,7 +3211,6 @@
           <w:noProof/>
           <w:kern w:val="2"/>
           <w:szCs w:val="24"/>
-          <w:lang/>
           <w14:ligatures w14:val="standardContextual"/>
         </w:rPr>
       </w:pPr>
@@ -3304,7 +3281,6 @@
           <w:noProof/>
           <w:kern w:val="2"/>
           <w:szCs w:val="24"/>
-          <w:lang/>
           <w14:ligatures w14:val="standardContextual"/>
         </w:rPr>
       </w:pPr>
@@ -3378,7 +3354,6 @@
           <w:noProof/>
           <w:kern w:val="2"/>
           <w:szCs w:val="24"/>
-          <w:lang/>
           <w14:ligatures w14:val="standardContextual"/>
         </w:rPr>
       </w:pPr>
@@ -3452,7 +3427,6 @@
           <w:noProof/>
           <w:kern w:val="2"/>
           <w:szCs w:val="24"/>
-          <w:lang/>
           <w14:ligatures w14:val="standardContextual"/>
         </w:rPr>
       </w:pPr>
@@ -3526,7 +3500,6 @@
           <w:noProof/>
           <w:kern w:val="2"/>
           <w:szCs w:val="24"/>
-          <w:lang/>
           <w14:ligatures w14:val="standardContextual"/>
         </w:rPr>
       </w:pPr>
@@ -3599,7 +3572,6 @@
           <w:noProof/>
           <w:kern w:val="2"/>
           <w:szCs w:val="24"/>
-          <w:lang/>
           <w14:ligatures w14:val="standardContextual"/>
         </w:rPr>
       </w:pPr>
@@ -3672,7 +3644,6 @@
           <w:noProof/>
           <w:kern w:val="2"/>
           <w:szCs w:val="24"/>
-          <w:lang/>
           <w14:ligatures w14:val="standardContextual"/>
         </w:rPr>
       </w:pPr>
@@ -3745,7 +3716,6 @@
           <w:noProof/>
           <w:kern w:val="2"/>
           <w:szCs w:val="24"/>
-          <w:lang/>
           <w14:ligatures w14:val="standardContextual"/>
         </w:rPr>
       </w:pPr>
@@ -4842,23 +4812,8 @@
       <w:r>
         <w:rPr>
           <w:szCs w:val="24"/>
-          <w:vertAlign w:val="superscript"/>
-        </w:rPr>
-        <w:t>[</w:t>
-      </w:r>
-      <w:r>
-        <w:rPr>
-          <w:szCs w:val="24"/>
-          <w:vertAlign w:val="superscript"/>
-        </w:rPr>
-        <w:t>1</w:t>
-      </w:r>
-      <w:r>
-        <w:rPr>
-          <w:szCs w:val="24"/>
-          <w:vertAlign w:val="superscript"/>
-        </w:rPr>
-        <w:t>]</w:t>
+        </w:rPr>
+        <w:t xml:space="preserve"> [1]</w:t>
       </w:r>
       <w:r>
         <w:rPr>
@@ -4875,29 +4830,8 @@
       <w:r>
         <w:rPr>
           <w:szCs w:val="24"/>
-          <w:vertAlign w:val="superscript"/>
-        </w:rPr>
-        <w:t>[</w:t>
-      </w:r>
-      <w:r>
-        <w:rPr>
-          <w:szCs w:val="24"/>
-          <w:vertAlign w:val="superscript"/>
-        </w:rPr>
-        <w:t>2</w:t>
-      </w:r>
-      <w:r>
-        <w:rPr>
-          <w:szCs w:val="24"/>
-          <w:vertAlign w:val="superscript"/>
-        </w:rPr>
-        <w:t>]</w:t>
-      </w:r>
-      <w:r>
-        <w:rPr>
-          <w:szCs w:val="24"/>
-        </w:rPr>
-        <w:t xml:space="preserve"> </w:t>
+        </w:rPr>
+        <w:t xml:space="preserve"> [2] </w:t>
       </w:r>
       <w:r>
         <w:rPr>
@@ -4932,23 +4866,8 @@
       <w:r>
         <w:rPr>
           <w:szCs w:val="24"/>
-          <w:vertAlign w:val="superscript"/>
-        </w:rPr>
-        <w:t>[</w:t>
-      </w:r>
-      <w:r>
-        <w:rPr>
-          <w:szCs w:val="24"/>
-          <w:vertAlign w:val="superscript"/>
-        </w:rPr>
-        <w:t>3</w:t>
-      </w:r>
-      <w:r>
-        <w:rPr>
-          <w:szCs w:val="24"/>
-          <w:vertAlign w:val="superscript"/>
-        </w:rPr>
-        <w:t>]</w:t>
+        </w:rPr>
+        <w:t xml:space="preserve"> [3]</w:t>
       </w:r>
       <w:r>
         <w:rPr>
@@ -8607,6 +8526,31 @@
     </w:p>
     <w:p>
       <w:pPr>
+        <w:pStyle w:val="Nadpis3"/>
+      </w:pPr>
+      <w:r>
+        <w:t>1.3.3 Logika paralelního tenzoru</w:t>
+      </w:r>
+    </w:p>
+    <w:p>
+      <w:pPr>
+        <w:spacing w:line="360" w:lineRule="auto"/>
+        <w:jc w:val="both"/>
+      </w:pPr>
+      <w:r>
+        <w:t>Xxx</w:t>
+      </w:r>
+    </w:p>
+    <w:p>
+      <w:pPr>
+        <w:pStyle w:val="Nadpis3"/>
+      </w:pPr>
+      <w:r>
+        <w:t>1.3.4 Logika matice</w:t>
+      </w:r>
+    </w:p>
+    <w:p>
+      <w:pPr>
         <w:pStyle w:val="Nadpis1"/>
         <w:jc w:val="both"/>
       </w:pPr>
@@ -8744,52 +8688,28 @@
         <w:t>Zajímavější je použitá knihovna Adap</w:t>
       </w:r>
       <w:r>
-        <w:t>tiveCpp</w:t>
+        <w:t>tiveCp</w:t>
+      </w:r>
+      <w:r>
+        <w:t>p [4]</w:t>
+      </w:r>
+      <w:r>
+        <w:t>, jejíž hlavní misí je implementace sta</w:t>
+      </w:r>
+      <w:r>
+        <w:t>n</w:t>
+      </w:r>
+      <w:r>
+        <w:t>dartu SYCL</w:t>
       </w:r>
       <w:r>
         <w:rPr>
           <w:vertAlign w:val="superscript"/>
         </w:rPr>
-        <w:t>[</w:t>
-      </w:r>
-      <w:r>
-        <w:rPr>
-          <w:vertAlign w:val="superscript"/>
-        </w:rPr>
-        <w:t>4</w:t>
-      </w:r>
-      <w:r>
-        <w:rPr>
-          <w:vertAlign w:val="superscript"/>
-        </w:rPr>
-        <w:t>]</w:t>
-      </w:r>
-      <w:r>
-        <w:t>, jejíž hlavní misí je implementace sta</w:t>
-      </w:r>
-      <w:r>
-        <w:t>n</w:t>
-      </w:r>
-      <w:r>
-        <w:t>dartu SYCL</w:t>
-      </w:r>
-      <w:r>
-        <w:rPr>
-          <w:vertAlign w:val="superscript"/>
-        </w:rPr>
-        <w:t>[</w:t>
-      </w:r>
-      <w:r>
-        <w:rPr>
-          <w:vertAlign w:val="superscript"/>
-        </w:rPr>
-        <w:t>5</w:t>
-      </w:r>
-      <w:r>
-        <w:rPr>
-          <w:vertAlign w:val="superscript"/>
-        </w:rPr>
-        <w:t>]</w:t>
+        <w:t xml:space="preserve"> </w:t>
+      </w:r>
+      <w:r>
+        <w:t>[5]</w:t>
       </w:r>
       <w:r>
         <w:t xml:space="preserve"> spravovaného </w:t>
@@ -8934,7 +8854,13 @@
         <w:t>.</w:t>
       </w:r>
       <w:r>
-        <w:t xml:space="preserve"> Také funkce a třídy standartní knihovny můžou být problém, pokud například používají polymorfizmus, nebo ukládají paměť na h</w:t>
+        <w:t xml:space="preserve"> Také funkce a třídy standartní knihovny můžou být problém, pokud například používají </w:t>
+      </w:r>
+      <w:r>
+        <w:t>polymorfismus</w:t>
+      </w:r>
+      <w:r>
+        <w:t>, nebo ukládají paměť na h</w:t>
       </w:r>
       <w:r>
         <w:t>aldu</w:t>
@@ -8975,7 +8901,13 @@
         <w:t xml:space="preserve"> Je vhodný díky své jednoduchosti použití a integrace to projektu.</w:t>
       </w:r>
       <w:r>
-        <w:t xml:space="preserve"> Umí rozdělovat testy do skupin, a také měřit čas vykonání testu, čímž je vhodný i pro zátěžové testování.</w:t>
+        <w:t xml:space="preserve"> Umí rozdělovat testy do skupin, a také měřit </w:t>
+      </w:r>
+      <w:r>
+        <w:t>dobu</w:t>
+      </w:r>
+      <w:r>
+        <w:t xml:space="preserve"> vykonání testu, čímž je vhodný i pro zátěžové testování.</w:t>
       </w:r>
     </w:p>
     <w:p>
@@ -9123,7 +9055,17 @@
         <w:jc w:val="both"/>
       </w:pPr>
       <w:r>
-        <w:t>Jedná se o třídy splňující koncept MemoryBackendConcept, které mají za účel řešit nejnižší správu paměti v projektu.</w:t>
+        <w:t xml:space="preserve">Jedná se o třídy splňující koncept </w:t>
+      </w:r>
+      <w:r>
+        <w:rPr>
+          <w:b/>
+          <w:bCs/>
+        </w:rPr>
+        <w:t>MemoryBackendConcept</w:t>
+      </w:r>
+      <w:r>
+        <w:t>, které mají za účel řešit nejnižší správu paměti v projektu.</w:t>
       </w:r>
       <w:r>
         <w:t xml:space="preserve"> Řeší alokace a dealokace, ovšem oproti běžnému alokátoru standartní knihovny má více kompetencí.</w:t>
@@ -9165,7 +9107,13 @@
         <w:t>To se</w:t>
       </w:r>
       <w:r>
-        <w:t xml:space="preserve"> konkrétně hodilo u implementace MemoryBackendUSM, kde třída potřebovala ke své operaci ukazatel na sycl::queue.</w:t>
+        <w:t xml:space="preserve"> konkrétně hodilo u implementace MemoryBackendUSM, kde třída potřeb</w:t>
+      </w:r>
+      <w:r>
+        <w:t>uje</w:t>
+      </w:r>
+      <w:r>
+        <w:t xml:space="preserve"> ke své operaci ukazatel na sycl::queue.</w:t>
       </w:r>
       <w:r>
         <w:t xml:space="preserve"> </w:t>
@@ -9180,14 +9128,47 @@
         <w:t xml:space="preserve"> Výhodou je možnost některé úkony, jako například hromadnou konstrukci a destrukci prvků paralelizovat.</w:t>
       </w:r>
       <w:r>
-        <w:t xml:space="preserve"> Tento backend se může zdát méně zabezpečený, například proti kopiím netriviálně kopírovatelných objektu pomocí metod jako memcpy, ale to není hrozba, jelikož standard SYCL stejně takovéto objekty alokovat </w:t>
-      </w:r>
-      <w:r>
-        <w:t>nebo přesouvat z</w:t>
+        <w:t xml:space="preserve"> Tento backend se může zdát méně zabezpečený, například proti kopiím netriviálně kopírovatelných objektu pomocí metod jako </w:t>
+      </w:r>
+      <w:r>
+        <w:t>sycl::</w:t>
+      </w:r>
+      <w:r>
+        <w:t xml:space="preserve">memcpy, ale to není hrozba, jelikož standard SYCL stejně takovéto objekty alokovat </w:t>
+      </w:r>
+      <w:r>
+        <w:t xml:space="preserve">nebo přesouvat </w:t>
+      </w:r>
+      <w:r>
+        <w:t>na/</w:t>
+      </w:r>
+      <w:r>
+        <w:t>z</w:t>
       </w:r>
       <w:r>
         <w:t xml:space="preserve"> GPU neumožnuje.</w:t>
       </w:r>
+      <w:r>
+        <w:t xml:space="preserve"> Uživatel si nastavením netypového parametru šablony může </w:t>
+      </w:r>
+      <w:r>
+        <w:t>určit,</w:t>
+      </w:r>
+      <w:r>
+        <w:t xml:space="preserve"> jak paměť alokovat.</w:t>
+      </w:r>
+      <w:r>
+        <w:t xml:space="preserve"> Možno je totiž ji alokovat nejen </w:t>
+      </w:r>
+      <w:r>
+        <w:t xml:space="preserve">pro zařízení, také ale pro </w:t>
+      </w:r>
+      <w:r>
+        <w:t>hostitele</w:t>
+      </w:r>
+      <w:r>
+        <w:t xml:space="preserve"> nebo jako sdílenou paměť.</w:t>
+      </w:r>
     </w:p>
     <w:p>
       <w:pPr>
@@ -9198,7 +9179,70 @@
         <w:t>Druhou implementací paměťového backendu je MemoryBackend. Ta slouží jako taková „výchozí“ třída, která je naprosto nezávislá na knihovně AdaptiveCpp a tím pádem použitelná tak, kde uživatel nechce s knihovnou pracovat.</w:t>
       </w:r>
       <w:r>
-        <w:t xml:space="preserve"> Tento backend je</w:t>
+        <w:t xml:space="preserve"> Tento backend </w:t>
+      </w:r>
+      <w:r>
+        <w:t>se dá považovat za výchozí a také je tak použit, pokud uživatel nespecifikuje jiný.</w:t>
+      </w:r>
+      <w:r>
+        <w:t xml:space="preserve"> Navíc nemá vnitřní </w:t>
+      </w:r>
+      <w:r>
+        <w:t>stav,</w:t>
+      </w:r>
+      <w:r>
+        <w:t xml:space="preserve"> a tak není problém ho zkonstruovat automaticky.</w:t>
+      </w:r>
+    </w:p>
+    <w:p>
+      <w:pPr>
+        <w:spacing w:line="360" w:lineRule="auto"/>
+        <w:jc w:val="both"/>
+        <w:rPr>
+          <w:lang w:eastAsia="cs-CZ"/>
+        </w:rPr>
+      </w:pPr>
+      <w:r>
+        <w:rPr>
+          <w:lang w:eastAsia="cs-CZ"/>
+        </w:rPr>
+        <w:t>Backendy</w:t>
+      </w:r>
+      <w:r>
+        <w:rPr>
+          <w:lang w:eastAsia="cs-CZ"/>
+        </w:rPr>
+        <w:t xml:space="preserve"> se snaží o zarovnání alokace na určitý počet bytů kvůli větší cache přívětivosti (která často čte po 64 bytech) a také případným SIMD instrukcím, které kompilátor poté může jednodušeji uplatni</w:t>
+      </w:r>
+      <w:r>
+        <w:rPr>
+          <w:lang w:eastAsia="cs-CZ"/>
+        </w:rPr>
+        <w:t>t [6]</w:t>
+      </w:r>
+      <w:r>
+        <w:rPr>
+          <w:lang w:eastAsia="cs-CZ"/>
+        </w:rPr>
+        <w:t>.</w:t>
+      </w:r>
+      <w:r>
+        <w:rPr>
+          <w:lang w:eastAsia="cs-CZ"/>
+        </w:rPr>
+        <w:t xml:space="preserve"> Toto zarovnání je nastavitelné</w:t>
+      </w:r>
+      <w:r>
+        <w:rPr>
+          <w:lang w:eastAsia="cs-CZ"/>
+        </w:rPr>
+        <w:t xml:space="preserve"> jako netypový parametr šablony</w:t>
+      </w:r>
+      <w:r>
+        <w:rPr>
+          <w:lang w:eastAsia="cs-CZ"/>
+        </w:rPr>
+        <w:t>.</w:t>
       </w:r>
     </w:p>
     <w:p>
@@ -9293,7 +9337,14 @@
         <w:rPr>
           <w:lang w:eastAsia="cs-CZ"/>
         </w:rPr>
-        <w:t>, jelikož existuje potřeba pro speciální alokaci paměti na různých zařízeních (například GPU), kterou ani vlastní alokátor použitý s std::vector nemůže pokrýt.</w:t>
+        <w:t xml:space="preserve">, jelikož </w:t>
+      </w:r>
+      <w:r>
+        <w:rPr>
+          <w:lang w:eastAsia="cs-CZ"/>
+        </w:rPr>
+        <w:lastRenderedPageBreak/>
+        <w:t>existuje potřeba pro speciální alokaci paměti na různých zařízeních (například GPU), kterou ani vlastní alokátor použitý s std::vector nemůže pokrýt.</w:t>
       </w:r>
     </w:p>
     <w:p>
@@ -9407,38 +9458,871 @@
         <w:rPr>
           <w:lang w:eastAsia="cs-CZ"/>
         </w:rPr>
+        <w:t xml:space="preserve">Pro kopírování, porovnávání či konstrukci a destrukci jsou v případě triviálně manipulovatelných typů (kontrolováno například pomocí </w:t>
+      </w:r>
+      <w:r>
+        <w:rPr>
+          <w:lang w:eastAsia="cs-CZ"/>
+        </w:rPr>
+        <w:t>std::is_trivially_copyable_v&lt;T&gt;</w:t>
+      </w:r>
+      <w:r>
+        <w:rPr>
+          <w:lang w:eastAsia="cs-CZ"/>
+        </w:rPr>
+        <w:t xml:space="preserve">) jsou použity </w:t>
+      </w:r>
+      <w:r>
+        <w:rPr>
+          <w:lang w:eastAsia="cs-CZ"/>
+        </w:rPr>
+        <w:t>nízko úrovňové</w:t>
+      </w:r>
+      <w:r>
+        <w:rPr>
+          <w:lang w:eastAsia="cs-CZ"/>
+        </w:rPr>
+        <w:t xml:space="preserve"> funkce standartní knihovny jako například std::memcpy či std::memcmp a podobně.</w:t>
+      </w:r>
+    </w:p>
+    <w:p>
+      <w:pPr>
+        <w:spacing w:line="360" w:lineRule="auto"/>
+        <w:jc w:val="both"/>
+        <w:rPr>
+          <w:lang w:eastAsia="cs-CZ"/>
+        </w:rPr>
+      </w:pPr>
+      <w:r>
+        <w:rPr>
+          <w:lang w:eastAsia="cs-CZ"/>
+        </w:rPr>
+        <w:t>Z venkovního hlediska se rozhraní této třídy velmi podobá std::vector ze standartní knihovny.</w:t>
+      </w:r>
+      <w:r>
+        <w:rPr>
+          <w:lang w:eastAsia="cs-CZ"/>
+        </w:rPr>
+        <w:t xml:space="preserve"> Dá</w:t>
+      </w:r>
+      <w:r>
+        <w:rPr>
+          <w:lang w:eastAsia="cs-CZ"/>
+        </w:rPr>
+        <w:t xml:space="preserve"> </w:t>
+      </w:r>
+      <w:r>
+        <w:rPr>
+          <w:lang w:eastAsia="cs-CZ"/>
+        </w:rPr>
+        <w:t xml:space="preserve">se kopírovat i stěhovat díky copy a move konstruktoru a </w:t>
+      </w:r>
+      <w:r>
+        <w:rPr>
+          <w:lang w:eastAsia="cs-CZ"/>
+        </w:rPr>
+        <w:t>přetížení operátoru přiřazení (=).</w:t>
+      </w:r>
+      <w:r>
+        <w:rPr>
+          <w:lang w:eastAsia="cs-CZ"/>
+        </w:rPr>
+        <w:t xml:space="preserve"> </w:t>
+      </w:r>
+      <w:r>
+        <w:rPr>
+          <w:lang w:eastAsia="cs-CZ"/>
+        </w:rPr>
+        <w:t xml:space="preserve">Dá se z něj přistoupit na syrová data </w:t>
+      </w:r>
+      <w:r>
+        <w:rPr>
+          <w:lang w:eastAsia="cs-CZ"/>
+        </w:rPr>
+        <w:t xml:space="preserve">(pomocí </w:t>
+      </w:r>
+      <w:r>
+        <w:rPr>
+          <w:lang w:eastAsia="cs-CZ"/>
+        </w:rPr>
+        <w:t>stejnojmenné</w:t>
+      </w:r>
+      <w:r>
+        <w:rPr>
+          <w:lang w:eastAsia="cs-CZ"/>
+        </w:rPr>
+        <w:t xml:space="preserve"> metody data()) </w:t>
+      </w:r>
+      <w:r>
+        <w:rPr>
+          <w:lang w:eastAsia="cs-CZ"/>
+        </w:rPr>
+        <w:t xml:space="preserve">a dá se </w:t>
+      </w:r>
+      <w:r>
+        <w:rPr>
+          <w:lang w:eastAsia="cs-CZ"/>
+        </w:rPr>
+        <w:t>použít přetížení indexovacího operátoru ([]) pro přístup na jednotlivé prvky (v </w:t>
+      </w:r>
+      <w:r>
+        <w:rPr>
+          <w:lang w:eastAsia="cs-CZ"/>
+        </w:rPr>
+        <w:t>O(1)</w:t>
+      </w:r>
+      <w:r>
+        <w:rPr>
+          <w:lang w:eastAsia="cs-CZ"/>
+        </w:rPr>
+        <w:t xml:space="preserve"> složitosti).</w:t>
+      </w:r>
+      <w:r>
+        <w:rPr>
+          <w:lang w:eastAsia="cs-CZ"/>
+        </w:rPr>
+        <w:t xml:space="preserve"> Dají se z</w:t>
+      </w:r>
+      <w:r>
+        <w:rPr>
+          <w:lang w:eastAsia="cs-CZ"/>
+        </w:rPr>
+        <w:t> </w:t>
+      </w:r>
+      <w:r>
+        <w:rPr>
+          <w:lang w:eastAsia="cs-CZ"/>
+        </w:rPr>
+        <w:t>něj</w:t>
+      </w:r>
+      <w:r>
+        <w:rPr>
+          <w:lang w:eastAsia="cs-CZ"/>
+        </w:rPr>
+        <w:t>, ze stejného rozhraní u std::vector dostat iterátory jak dopředu</w:t>
+      </w:r>
+      <w:r>
+        <w:rPr>
+          <w:lang w:eastAsia="cs-CZ"/>
+        </w:rPr>
+        <w:t>,</w:t>
+      </w:r>
+      <w:r>
+        <w:rPr>
+          <w:lang w:eastAsia="cs-CZ"/>
+        </w:rPr>
+        <w:t xml:space="preserve"> tak dozadu</w:t>
+      </w:r>
+      <w:r>
+        <w:rPr>
+          <w:lang w:eastAsia="cs-CZ"/>
+        </w:rPr>
+        <w:t>. Iterátor je pro jednoduchost ukazatel, což je jednoduché a efektivní</w:t>
+      </w:r>
+      <w:r>
+        <w:rPr>
+          <w:lang w:eastAsia="cs-CZ"/>
+        </w:rPr>
+        <w:t>.</w:t>
+      </w:r>
+      <w:r>
+        <w:rPr>
+          <w:lang w:eastAsia="cs-CZ"/>
+        </w:rPr>
+        <w:t xml:space="preserve"> Dá se porovnávat s ostatními lineárními kontejnery</w:t>
+      </w:r>
+      <w:r>
+        <w:rPr>
+          <w:lang w:eastAsia="cs-CZ"/>
+        </w:rPr>
+        <w:t xml:space="preserve"> díky přetížení porovnávacího operátoru (==) a operátoru „vesmírné lodi“ (&lt;=&gt;).</w:t>
+      </w:r>
+      <w:r>
+        <w:rPr>
+          <w:lang w:eastAsia="cs-CZ"/>
+        </w:rPr>
+        <w:t xml:space="preserve"> Je možné díky metodě swap také vyměnit obsahy dvou lineárních kontejnerů.</w:t>
+      </w:r>
+      <w:r>
+        <w:rPr>
+          <w:lang w:eastAsia="cs-CZ"/>
+        </w:rPr>
+        <w:t xml:space="preserve"> Samozřejmě je také možné kontejner manuálně změnit v jeho velikosti a kapacitě</w:t>
+      </w:r>
+      <w:r>
+        <w:rPr>
+          <w:lang w:eastAsia="cs-CZ"/>
+        </w:rPr>
+        <w:t xml:space="preserve"> či ho celá vyčistit</w:t>
+      </w:r>
+      <w:r>
+        <w:rPr>
+          <w:lang w:eastAsia="cs-CZ"/>
+        </w:rPr>
+        <w:t>.</w:t>
+      </w:r>
+      <w:r>
+        <w:rPr>
+          <w:lang w:eastAsia="cs-CZ"/>
+        </w:rPr>
+        <w:t xml:space="preserve"> Jde také nakonec přidat prvek či ho z konce odstranit.</w:t>
+      </w:r>
+    </w:p>
+    <w:p>
+      <w:pPr>
+        <w:pStyle w:val="Nadpis3"/>
+        <w:jc w:val="both"/>
+        <w:rPr>
+          <w:lang w:eastAsia="cs-CZ"/>
+        </w:rPr>
+      </w:pPr>
+      <w:bookmarkStart w:id="18" w:name="_Toc229864002"/>
+      <w:r>
+        <w:rPr>
+          <w:lang w:eastAsia="cs-CZ"/>
+        </w:rPr>
+        <w:t>2.</w:t>
+      </w:r>
+      <w:r>
+        <w:rPr>
+          <w:lang w:eastAsia="cs-CZ"/>
+        </w:rPr>
+        <w:t>2</w:t>
+      </w:r>
+      <w:r>
+        <w:rPr>
+          <w:lang w:eastAsia="cs-CZ"/>
+        </w:rPr>
+        <w:t>.</w:t>
+      </w:r>
+      <w:r>
+        <w:rPr>
+          <w:lang w:eastAsia="cs-CZ"/>
+        </w:rPr>
+        <w:t>4</w:t>
+      </w:r>
+      <w:r>
+        <w:rPr>
+          <w:lang w:eastAsia="cs-CZ"/>
+        </w:rPr>
+        <w:t xml:space="preserve"> Tenzor</w:t>
+      </w:r>
+      <w:bookmarkEnd w:id="18"/>
+    </w:p>
+    <w:p>
+      <w:pPr>
+        <w:spacing w:line="360" w:lineRule="auto"/>
+        <w:jc w:val="both"/>
+        <w:rPr>
+          <w:lang w:eastAsia="cs-CZ"/>
+        </w:rPr>
+      </w:pPr>
+      <w:r>
+        <w:rPr>
+          <w:lang w:eastAsia="cs-CZ"/>
+        </w:rPr>
+        <w:t xml:space="preserve">Jedná se o „hlavní“ třídu celé práce. </w:t>
+      </w:r>
+      <w:r>
+        <w:rPr>
+          <w:lang w:eastAsia="cs-CZ"/>
+        </w:rPr>
+        <w:t xml:space="preserve">Tato třída splňuje koncept </w:t>
+      </w:r>
+      <w:r>
+        <w:rPr>
+          <w:b/>
+          <w:bCs/>
+          <w:lang w:eastAsia="cs-CZ"/>
+        </w:rPr>
+        <w:t>TensorConcept</w:t>
+      </w:r>
+      <w:r>
+        <w:rPr>
+          <w:lang w:eastAsia="cs-CZ"/>
+        </w:rPr>
+        <w:t xml:space="preserve">. </w:t>
+      </w:r>
+      <w:r>
+        <w:rPr>
+          <w:lang w:eastAsia="cs-CZ"/>
+        </w:rPr>
+        <w:t>Je navržen a implementován tak, aby byl univerzální, dynamický s širokým využitím.</w:t>
+      </w:r>
+      <w:r>
+        <w:rPr>
+          <w:lang w:eastAsia="cs-CZ"/>
+        </w:rPr>
+        <w:t xml:space="preserve"> </w:t>
+      </w:r>
+      <w:r>
+        <w:rPr>
+          <w:lang w:eastAsia="cs-CZ"/>
+        </w:rPr>
+        <w:t xml:space="preserve">V projektu se nazývá „Tensor“. </w:t>
+      </w:r>
+      <w:r>
+        <w:rPr>
+          <w:lang w:eastAsia="cs-CZ"/>
+        </w:rPr>
+        <w:t xml:space="preserve">Stejně jako lineární kontejner, tak je tato třída šablonovaná pro versatilní ukládání různých datových typů. </w:t>
+      </w:r>
+      <w:r>
+        <w:rPr>
+          <w:lang w:eastAsia="cs-CZ"/>
+        </w:rPr>
+        <w:t xml:space="preserve">Používá </w:t>
+      </w:r>
+      <w:r>
+        <w:rPr>
+          <w:lang w:eastAsia="cs-CZ"/>
+        </w:rPr>
+        <w:t>v sobě lineární kontejner pro udržení dat</w:t>
+      </w:r>
+      <w:r>
+        <w:rPr>
+          <w:lang w:eastAsia="cs-CZ"/>
+        </w:rPr>
+        <w:t xml:space="preserve"> i metadat</w:t>
+      </w:r>
+      <w:r>
+        <w:rPr>
+          <w:lang w:eastAsia="cs-CZ"/>
+        </w:rPr>
+        <w:t>.</w:t>
+      </w:r>
+      <w:r>
+        <w:rPr>
+          <w:lang w:eastAsia="cs-CZ"/>
+        </w:rPr>
+        <w:t xml:space="preserve"> Sám Tensor umožňuje uživateli zvolit si, na jakém paměťovém backendu budou data a zvlášť metadata uložena.</w:t>
+      </w:r>
+      <w:r>
+        <w:rPr>
+          <w:lang w:eastAsia="cs-CZ"/>
+        </w:rPr>
+        <w:t xml:space="preserve"> Jako výchozí hodnota, použitelná ideálně pro neparalelní verzi tenzoru, byl použit MemoryBackend. Není ho ovšem nutno specifikovat, jelikož je to také výchozí hodnota pro lineární kontejner.</w:t>
+      </w:r>
+    </w:p>
+    <w:p>
+      <w:pPr>
+        <w:spacing w:line="360" w:lineRule="auto"/>
+        <w:jc w:val="both"/>
+        <w:rPr>
+          <w:lang w:eastAsia="cs-CZ"/>
+        </w:rPr>
+      </w:pPr>
+      <w:r>
+        <w:rPr>
+          <w:lang w:eastAsia="cs-CZ"/>
+        </w:rPr>
         <w:lastRenderedPageBreak/>
-        <w:t>Na alokaci byl také vytvořen vlastní alokátor.</w:t>
-      </w:r>
-      <w:r>
-        <w:rPr>
-          <w:lang w:eastAsia="cs-CZ"/>
-        </w:rPr>
-        <w:t xml:space="preserve"> Tento alokátor řeší použití ::operator new a ::operator delete, pro získání neinicializované paměti.</w:t>
-      </w:r>
-      <w:r>
-        <w:rPr>
-          <w:lang w:eastAsia="cs-CZ"/>
-        </w:rPr>
-        <w:t xml:space="preserve"> Také se snaží o zarovnání alokace na určitý počet bytů kvůli větší cache přívětivosti (která často čte po 64 bytech) a také případným SIMD instrukcím, které kompilátor poté může jednodušeji uplatnit</w:t>
-      </w:r>
-      <w:r>
-        <w:rPr>
-          <w:vertAlign w:val="superscript"/>
-          <w:lang w:eastAsia="cs-CZ"/>
-        </w:rPr>
-        <w:t>[</w:t>
-      </w:r>
-      <w:r>
-        <w:rPr>
-          <w:vertAlign w:val="superscript"/>
+        <w:t>Použitím lineárního kontejneru se implementace vyhne</w:t>
+      </w:r>
+      <w:r>
+        <w:rPr>
+          <w:lang w:eastAsia="cs-CZ"/>
+        </w:rPr>
+        <w:t xml:space="preserve"> </w:t>
+      </w:r>
+      <w:r>
+        <w:rPr>
+          <w:lang w:eastAsia="cs-CZ"/>
+        </w:rPr>
+        <w:t xml:space="preserve">také </w:t>
+      </w:r>
+      <w:r>
+        <w:rPr>
+          <w:lang w:eastAsia="cs-CZ"/>
+        </w:rPr>
+        <w:t>jednomu velikému problému. Vektor tak jak je ve standartní knihovně má zvláštní specializaci pro datový typ bool. Je to optimalizace za účelem šetření místa, tak, že jeden bool je uložen pouze v jednom bitu místo bytu.</w:t>
+      </w:r>
+      <w:r>
+        <w:rPr>
+          <w:lang w:eastAsia="cs-CZ"/>
+        </w:rPr>
+        <w:t xml:space="preserve"> Taková specializace ovšem přináší problémy při imp</w:t>
+      </w:r>
+      <w:r>
+        <w:rPr>
+          <w:lang w:eastAsia="cs-CZ"/>
+        </w:rPr>
+        <w:t>l</w:t>
+      </w:r>
+      <w:r>
+        <w:rPr>
+          <w:lang w:eastAsia="cs-CZ"/>
+        </w:rPr>
+        <w:t>ementaci šablonovaných metod. Například reference na jeden prvek není reference na bool ale jedná se o složitější objekt. Čtenář si jistě představí, jaké problémy to může přinést, když by se pokoušel programovat genericky. Navíc je tento typ ukládání obtížen drobným overheadem u přístupů k prvkům, jelikož se nejedná o pouhé přistupování na byte paměti, ale dostávání hodnoty konkrétního bitu, což normálně jde jen za pomocí bitových operací a masek.</w:t>
+      </w:r>
+      <w:r>
+        <w:rPr>
+          <w:lang w:eastAsia="cs-CZ"/>
+        </w:rPr>
+        <w:t xml:space="preserve"> V lineárním kontejneru jsou bity uloženy vedle sebe v bytech. To dává stejné chování jako u ostatních primitivních datových typů</w:t>
+      </w:r>
+      <w:r>
+        <w:rPr>
+          <w:lang w:eastAsia="cs-CZ"/>
+        </w:rPr>
+        <w:t>,</w:t>
+      </w:r>
+      <w:r>
+        <w:rPr>
+          <w:lang w:eastAsia="cs-CZ"/>
+        </w:rPr>
+        <w:t xml:space="preserve"> a navíc je bez overheadu.</w:t>
+      </w:r>
+    </w:p>
+    <w:p>
+      <w:pPr>
+        <w:spacing w:line="360" w:lineRule="auto"/>
+        <w:jc w:val="both"/>
+        <w:rPr>
+          <w:lang w:eastAsia="cs-CZ"/>
+        </w:rPr>
+      </w:pPr>
+      <w:r>
+        <w:rPr>
+          <w:lang w:eastAsia="cs-CZ"/>
+        </w:rPr>
+        <w:t>Základním způsobem</w:t>
+      </w:r>
+      <w:r>
+        <w:rPr>
+          <w:lang w:eastAsia="cs-CZ"/>
+        </w:rPr>
+        <w:t>,</w:t>
+      </w:r>
+      <w:r>
+        <w:rPr>
+          <w:lang w:eastAsia="cs-CZ"/>
+        </w:rPr>
+        <w:t xml:space="preserve"> jak vytvořit tenzor je použít konstruktor přijímající jeden </w:t>
+      </w:r>
+      <w:r>
+        <w:rPr>
+          <w:lang w:eastAsia="cs-CZ"/>
+        </w:rPr>
+        <w:t xml:space="preserve">lineární kontejner. </w:t>
+      </w:r>
+      <w:r>
+        <w:rPr>
+          <w:lang w:eastAsia="cs-CZ"/>
+        </w:rPr>
+        <w:t xml:space="preserve">Ten obsahuje velikosti dimenzí. V konstruktoru se nakopíruje do vektoru pro udržování velikostí dimenzí a poté se spustí metoda </w:t>
+      </w:r>
+      <w:r>
+        <w:rPr>
+          <w:lang w:eastAsia="cs-CZ"/>
+        </w:rPr>
+        <w:t>update(),</w:t>
+      </w:r>
+      <w:r>
+        <w:rPr>
+          <w:lang w:eastAsia="cs-CZ"/>
+        </w:rPr>
+        <w:t xml:space="preserve"> která vypočítá potřebné místo k alokaci tenzoru</w:t>
+      </w:r>
+      <w:r>
+        <w:rPr>
+          <w:lang w:eastAsia="cs-CZ"/>
+        </w:rPr>
+        <w:t>,</w:t>
+      </w:r>
+      <w:r>
+        <w:rPr>
+          <w:lang w:eastAsia="cs-CZ"/>
+        </w:rPr>
+        <w:t xml:space="preserve"> a to místo skutečně alokuje na lineárním kontejneru.</w:t>
+      </w:r>
+      <w:r>
+        <w:rPr>
+          <w:lang w:eastAsia="cs-CZ"/>
+        </w:rPr>
+        <w:t xml:space="preserve"> Poté také aktualizuje/vypočítá strukturální optimalizační data závislá na velikostech dimenze jako například vektor kumulativních </w:t>
+      </w:r>
+      <w:r>
+        <w:rPr>
+          <w:lang w:eastAsia="cs-CZ"/>
+        </w:rPr>
+        <w:t>součinů předchozích velikostí dimenzí</w:t>
+      </w:r>
+      <w:r>
+        <w:rPr>
+          <w:lang w:eastAsia="cs-CZ"/>
+        </w:rPr>
+        <w:t xml:space="preserve"> v podobě dalšího lineárního kontejneru</w:t>
+      </w:r>
+      <w:r>
+        <w:rPr>
+          <w:lang w:eastAsia="cs-CZ"/>
+        </w:rPr>
+        <w:t>.</w:t>
+      </w:r>
+    </w:p>
+    <w:p>
+      <w:pPr>
+        <w:spacing w:line="360" w:lineRule="auto"/>
+        <w:jc w:val="both"/>
+        <w:rPr>
+          <w:lang w:eastAsia="cs-CZ"/>
+        </w:rPr>
+      </w:pPr>
+    </w:p>
+    <w:p>
+      <w:pPr>
+        <w:pStyle w:val="Nadpis3"/>
+        <w:jc w:val="both"/>
+        <w:rPr>
+          <w:lang w:eastAsia="cs-CZ"/>
+        </w:rPr>
+      </w:pPr>
+      <w:bookmarkStart w:id="19" w:name="_Toc229864003"/>
+      <w:r>
+        <w:rPr>
+          <w:lang w:eastAsia="cs-CZ"/>
+        </w:rPr>
+        <w:t>2.</w:t>
+      </w:r>
+      <w:r>
+        <w:rPr>
+          <w:lang w:eastAsia="cs-CZ"/>
+        </w:rPr>
+        <w:t>2</w:t>
+      </w:r>
+      <w:r>
+        <w:rPr>
+          <w:lang w:eastAsia="cs-CZ"/>
+        </w:rPr>
+        <w:t>.</w:t>
+      </w:r>
+      <w:r>
+        <w:rPr>
+          <w:lang w:eastAsia="cs-CZ"/>
+        </w:rPr>
+        <w:t>5</w:t>
+      </w:r>
+      <w:r>
+        <w:rPr>
+          <w:lang w:eastAsia="cs-CZ"/>
+        </w:rPr>
+        <w:t xml:space="preserve"> Paralelní tenzor</w:t>
+      </w:r>
+      <w:bookmarkEnd w:id="19"/>
+    </w:p>
+    <w:p>
+      <w:pPr>
+        <w:spacing w:line="360" w:lineRule="auto"/>
+        <w:jc w:val="both"/>
+        <w:rPr>
+          <w:lang w:eastAsia="cs-CZ"/>
+        </w:rPr>
+      </w:pPr>
+      <w:r>
+        <w:rPr>
+          <w:lang w:eastAsia="cs-CZ"/>
+        </w:rPr>
+        <w:t xml:space="preserve">Jedná se o třídu jménem „TensorParallel“, která splňuje koncept </w:t>
+      </w:r>
+      <w:r>
+        <w:rPr>
+          <w:b/>
+          <w:bCs/>
+          <w:lang w:eastAsia="cs-CZ"/>
+        </w:rPr>
+        <w:t>TensorConcept</w:t>
+      </w:r>
+      <w:r>
+        <w:rPr>
+          <w:lang w:eastAsia="cs-CZ"/>
+        </w:rPr>
+        <w:t>.</w:t>
+      </w:r>
+    </w:p>
+    <w:p>
+      <w:pPr>
+        <w:pStyle w:val="Nadpis3"/>
+        <w:jc w:val="both"/>
+        <w:rPr>
+          <w:lang w:eastAsia="cs-CZ"/>
+        </w:rPr>
+      </w:pPr>
+      <w:bookmarkStart w:id="20" w:name="_Toc229864004"/>
+      <w:r>
+        <w:rPr>
+          <w:lang w:eastAsia="cs-CZ"/>
+        </w:rPr>
+        <w:t>2.</w:t>
+      </w:r>
+      <w:r>
+        <w:rPr>
+          <w:lang w:eastAsia="cs-CZ"/>
+        </w:rPr>
+        <w:t>2</w:t>
+      </w:r>
+      <w:r>
+        <w:rPr>
+          <w:lang w:eastAsia="cs-CZ"/>
+        </w:rPr>
+        <w:t>.</w:t>
+      </w:r>
+      <w:r>
+        <w:rPr>
           <w:lang w:eastAsia="cs-CZ"/>
         </w:rPr>
         <w:t>6</w:t>
       </w:r>
       <w:r>
         <w:rPr>
-          <w:vertAlign w:val="superscript"/>
+          <w:lang w:eastAsia="cs-CZ"/>
+        </w:rPr>
+        <w:t xml:space="preserve"> Matice</w:t>
+      </w:r>
+      <w:bookmarkEnd w:id="20"/>
+    </w:p>
+    <w:p>
+      <w:pPr>
+        <w:spacing w:line="360" w:lineRule="auto"/>
+        <w:jc w:val="both"/>
+        <w:rPr>
+          <w:lang w:eastAsia="cs-CZ"/>
+        </w:rPr>
+      </w:pPr>
+      <w:r>
+        <w:rPr>
+          <w:lang w:eastAsia="cs-CZ"/>
+        </w:rPr>
+        <w:t xml:space="preserve">Matice je třída, která reprezentuje matici jako </w:t>
+      </w:r>
+      <w:r>
+        <w:rPr>
+          <w:lang w:eastAsia="cs-CZ"/>
+        </w:rPr>
+        <w:t xml:space="preserve">matematickou </w:t>
+      </w:r>
+      <w:r>
+        <w:rPr>
+          <w:lang w:eastAsia="cs-CZ"/>
+        </w:rPr>
+        <w:t>strukturu.</w:t>
+      </w:r>
+      <w:r>
+        <w:rPr>
+          <w:lang w:eastAsia="cs-CZ"/>
+        </w:rPr>
+        <w:t xml:space="preserve"> Používá k tomu třídu Tensor, která je dle definice tenzoru zobecněním matice.</w:t>
+      </w:r>
+      <w:r>
+        <w:rPr>
+          <w:lang w:eastAsia="cs-CZ"/>
+        </w:rPr>
+        <w:t xml:space="preserve"> Matice je schopná přijmout jak obyřejný Tensor, tak i TensorParallel, tedy jeho </w:t>
+      </w:r>
+      <w:r>
+        <w:rPr>
+          <w:lang w:eastAsia="cs-CZ"/>
+        </w:rPr>
+        <w:t>paralelní</w:t>
+      </w:r>
+      <w:r>
+        <w:rPr>
+          <w:lang w:eastAsia="cs-CZ"/>
+        </w:rPr>
+        <w:t xml:space="preserve"> verzi.</w:t>
+      </w:r>
+      <w:r>
+        <w:rPr>
+          <w:lang w:eastAsia="cs-CZ"/>
+        </w:rPr>
+        <w:t xml:space="preserve"> Shodnost rozhraní těchto typů je vynucena konceptem </w:t>
+      </w:r>
+      <w:r>
+        <w:rPr>
+          <w:b/>
+          <w:bCs/>
+          <w:lang w:eastAsia="cs-CZ"/>
+        </w:rPr>
+        <w:t>TensorConcept</w:t>
+      </w:r>
+      <w:r>
+        <w:rPr>
+          <w:lang w:eastAsia="cs-CZ"/>
+        </w:rPr>
+        <w:t>.</w:t>
+      </w:r>
+      <w:r>
+        <w:rPr>
+          <w:lang w:eastAsia="cs-CZ"/>
+        </w:rPr>
+        <w:t xml:space="preserve"> Matice je navíc od tenzorů obohacena o některé jí specifické metody.</w:t>
+      </w:r>
+    </w:p>
+    <w:p>
+      <w:pPr>
+        <w:pStyle w:val="Nadpis3"/>
+        <w:jc w:val="both"/>
+        <w:rPr>
+          <w:lang w:eastAsia="cs-CZ"/>
+        </w:rPr>
+      </w:pPr>
+      <w:bookmarkStart w:id="21" w:name="_Toc229864006"/>
+      <w:r>
+        <w:rPr>
+          <w:lang w:eastAsia="cs-CZ"/>
+        </w:rPr>
+        <w:t>2.</w:t>
+      </w:r>
+      <w:r>
+        <w:rPr>
+          <w:lang w:eastAsia="cs-CZ"/>
+        </w:rPr>
+        <w:t>2</w:t>
+      </w:r>
+      <w:r>
+        <w:rPr>
+          <w:lang w:eastAsia="cs-CZ"/>
+        </w:rPr>
+        <w:t>.</w:t>
+      </w:r>
+      <w:r>
+        <w:rPr>
+          <w:lang w:eastAsia="cs-CZ"/>
+        </w:rPr>
+        <w:t>7</w:t>
+      </w:r>
+      <w:r>
+        <w:rPr>
+          <w:lang w:eastAsia="cs-CZ"/>
+        </w:rPr>
+        <w:t xml:space="preserve"> N-nární strom</w:t>
+      </w:r>
+      <w:bookmarkEnd w:id="21"/>
+    </w:p>
+    <w:p>
+      <w:pPr>
+        <w:spacing w:line="360" w:lineRule="auto"/>
+        <w:jc w:val="both"/>
+        <w:rPr>
+          <w:lang w:eastAsia="cs-CZ"/>
+        </w:rPr>
+      </w:pPr>
+      <w:r>
+        <w:rPr>
+          <w:lang w:eastAsia="cs-CZ"/>
+        </w:rPr>
+        <w:t>Xxx</w:t>
+      </w:r>
+    </w:p>
+    <w:p>
+      <w:pPr>
+        <w:pStyle w:val="Nadpis3"/>
+        <w:rPr>
+          <w:lang w:eastAsia="cs-CZ"/>
+        </w:rPr>
+      </w:pPr>
+      <w:r>
+        <w:rPr>
+          <w:lang w:eastAsia="cs-CZ"/>
+        </w:rPr>
+        <w:lastRenderedPageBreak/>
+        <w:t>2.2.</w:t>
+      </w:r>
+      <w:r>
+        <w:rPr>
+          <w:lang w:eastAsia="cs-CZ"/>
+        </w:rPr>
+        <w:t>8</w:t>
+      </w:r>
+      <w:r>
+        <w:rPr>
+          <w:lang w:eastAsia="cs-CZ"/>
+        </w:rPr>
+        <w:t xml:space="preserve"> Pomocné</w:t>
+      </w:r>
+    </w:p>
+    <w:p>
+      <w:pPr>
+        <w:spacing w:line="360" w:lineRule="auto"/>
+        <w:jc w:val="both"/>
+        <w:rPr>
+          <w:lang w:eastAsia="cs-CZ"/>
+        </w:rPr>
+      </w:pPr>
+      <w:r>
+        <w:rPr>
+          <w:lang w:eastAsia="cs-CZ"/>
+        </w:rPr>
+        <w:t>Jednou z velice šikovných „pomůcek“ je třída span_view.</w:t>
+      </w:r>
+      <w:r>
+        <w:rPr>
+          <w:lang w:eastAsia="cs-CZ"/>
+        </w:rPr>
+        <w:t xml:space="preserve"> Tato třída dědí od třídy std::span&lt;const T, </w:t>
+      </w:r>
+      <w:r>
+        <w:rPr>
+          <w:lang w:eastAsia="cs-CZ"/>
+        </w:rPr>
+        <w:t>Extent = std::dynamic_extent</w:t>
+      </w:r>
+      <w:r>
+        <w:rPr>
+          <w:lang w:eastAsia="cs-CZ"/>
+        </w:rPr>
+        <w:t>&gt; a jenom ji rozšiřuje o jediný konstruktor. O konstruktor přijímající std::initializer_list.</w:t>
+      </w:r>
+      <w:r>
+        <w:rPr>
+          <w:lang w:eastAsia="cs-CZ"/>
+        </w:rPr>
+        <w:t xml:space="preserve"> Pro běžné použití jako proměnná je to nebezpečné, ovšem zde je to užito jenom jako parametr.</w:t>
+      </w:r>
+      <w:r>
+        <w:rPr>
+          <w:lang w:eastAsia="cs-CZ"/>
+        </w:rPr>
+        <w:t xml:space="preserve"> Tím zanikají problémy s životností std::initializer_list.</w:t>
+      </w:r>
+      <w:r>
+        <w:rPr>
+          <w:lang w:eastAsia="cs-CZ"/>
+        </w:rPr>
+        <w:t xml:space="preserve"> To je velice přínosné, jelikož tak budu uživatel moci do jediné metody zadat jak cokoliv konvertibilní na std::span, tak také inicializační list.</w:t>
+      </w:r>
+      <w:r>
+        <w:rPr>
+          <w:lang w:eastAsia="cs-CZ"/>
+        </w:rPr>
+        <w:t xml:space="preserve"> V komunitě standardu C++ o tomto tématu byla diskuse. Přišel návrh na přidání konstrukce std::span z </w:t>
+      </w:r>
+      <w:r>
+        <w:rPr>
+          <w:lang w:eastAsia="cs-CZ"/>
+        </w:rPr>
+        <w:t>std::initializer_list</w:t>
+      </w:r>
+      <w:r>
+        <w:rPr>
+          <w:lang w:eastAsia="cs-CZ"/>
+        </w:rPr>
+        <w:t xml:space="preserve"> a tento návr</w:t>
+      </w:r>
+      <w:r>
+        <w:rPr>
+          <w:lang w:eastAsia="cs-CZ"/>
+        </w:rPr>
+        <w:t>h [</w:t>
+      </w:r>
+      <w:r>
+        <w:rPr>
+          <w:lang w:eastAsia="cs-CZ"/>
+        </w:rPr>
+        <w:t>7</w:t>
+      </w:r>
+      <w:r>
+        <w:rPr>
           <w:lang w:eastAsia="cs-CZ"/>
         </w:rPr>
         <w:t>]</w:t>
@@ -9447,14 +10331,176 @@
         <w:rPr>
           <w:lang w:eastAsia="cs-CZ"/>
         </w:rPr>
+        <w:t xml:space="preserve"> byl dokonce schválen komisí pro standard C++26.</w:t>
+      </w:r>
+      <w:r>
+        <w:rPr>
+          <w:lang w:eastAsia="cs-CZ"/>
+        </w:rPr>
+        <w:t xml:space="preserve"> Poté se ale zjistily problémy s tímto návrhem, kdy se díky této změně volaly jiné metody a konstruktory a přišel protinávrh</w:t>
+      </w:r>
+      <w:r>
+        <w:rPr>
+          <w:lang w:eastAsia="cs-CZ"/>
+        </w:rPr>
+        <w:t xml:space="preserve"> [8]</w:t>
+      </w:r>
+      <w:r>
+        <w:rPr>
+          <w:lang w:eastAsia="cs-CZ"/>
+        </w:rPr>
+        <w:t xml:space="preserve"> odstraňující tento návrh.</w:t>
+      </w:r>
+      <w:r>
+        <w:rPr>
+          <w:lang w:eastAsia="cs-CZ"/>
+        </w:rPr>
+        <w:t xml:space="preserve"> Komise pro vývoj knihovny C++ nakonec odhlasovala tento </w:t>
+      </w:r>
+      <w:r>
+        <w:rPr>
+          <w:lang w:eastAsia="cs-CZ"/>
+        </w:rPr>
+        <w:t>protinávrh,</w:t>
+      </w:r>
+      <w:r>
+        <w:rPr>
+          <w:lang w:eastAsia="cs-CZ"/>
+        </w:rPr>
+        <w:t xml:space="preserve"> a tudíž byl původní návrh z C++26</w:t>
+      </w:r>
+      <w:r>
+        <w:rPr>
+          <w:lang w:eastAsia="cs-CZ"/>
+        </w:rPr>
+        <w:t xml:space="preserve"> </w:t>
+      </w:r>
+      <w:r>
+        <w:rPr>
+          <w:lang w:eastAsia="cs-CZ"/>
+        </w:rPr>
+        <w:t>vyřazen.</w:t>
+      </w:r>
+      <w:r>
+        <w:rPr>
+          <w:lang w:eastAsia="cs-CZ"/>
+        </w:rPr>
+        <w:t xml:space="preserve"> Není ovšem zcela vyloučeno, že </w:t>
+      </w:r>
+      <w:r>
+        <w:rPr>
+          <w:lang w:eastAsia="cs-CZ"/>
+        </w:rPr>
+        <w:t>existuje</w:t>
+      </w:r>
+      <w:r>
+        <w:rPr>
+          <w:lang w:eastAsia="cs-CZ"/>
+        </w:rPr>
+        <w:t xml:space="preserve"> verz</w:t>
+      </w:r>
+      <w:r>
+        <w:rPr>
+          <w:lang w:eastAsia="cs-CZ"/>
+        </w:rPr>
+        <w:t>e v některém ze</w:t>
+      </w:r>
+      <w:r>
+        <w:rPr>
+          <w:lang w:eastAsia="cs-CZ"/>
+        </w:rPr>
+        <w:t xml:space="preserve"> známých kompilátorů</w:t>
+      </w:r>
+      <w:r>
+        <w:rPr>
+          <w:lang w:eastAsia="cs-CZ"/>
+        </w:rPr>
+        <w:t>, kde je tato věc implementována</w:t>
+      </w:r>
+      <w:r>
+        <w:rPr>
+          <w:lang w:eastAsia="cs-CZ"/>
+        </w:rPr>
         <w:t>.</w:t>
       </w:r>
-      <w:r>
-        <w:rPr>
-          <w:lang w:eastAsia="cs-CZ"/>
+    </w:p>
+    <w:p>
+      <w:pPr>
+        <w:spacing w:line="360" w:lineRule="auto"/>
+        <w:jc w:val="both"/>
+        <w:rPr>
+          <w:lang w:eastAsia="cs-CZ"/>
+        </w:rPr>
+      </w:pPr>
+      <w:r>
+        <w:rPr>
+          <w:lang w:eastAsia="cs-CZ"/>
+        </w:rPr>
+        <w:t>Déle byly implementovány třídy podle návrhového vzoru funktor se jmény „DefaultEquals“ a „DefaultOrder“, které definují obecná postup pro porovnávání dvou prvků.</w:t>
+      </w:r>
+      <w:r>
+        <w:rPr>
+          <w:lang w:eastAsia="cs-CZ"/>
+        </w:rPr>
+        <w:t xml:space="preserve"> U typů s plovoucí desetinnou čárkou používají porovnávání pomocí epsilon a absolutní hodnoty a u ostatních typů jen volají příslušné operátory.</w:t>
+      </w:r>
+      <w:r>
+        <w:rPr>
+          <w:lang w:eastAsia="cs-CZ"/>
+        </w:rPr>
+        <w:t xml:space="preserve"> Pro vyjádření pořadí je zde i ve zbytku projektu využito std::</w:t>
+      </w:r>
+      <w:r>
+        <w:rPr>
+          <w:rFonts w:ascii="Consolas" w:eastAsia="Times New Roman" w:hAnsi="Consolas"/>
+          <w:color w:val="4EC9B0"/>
+          <w:sz w:val="21"/>
+          <w:szCs w:val="21"/>
+          <w:lang/>
         </w:rPr>
         <w:t xml:space="preserve"> </w:t>
       </w:r>
+      <w:r>
+        <w:rPr>
+          <w:lang w:eastAsia="cs-CZ"/>
+        </w:rPr>
+        <w:t>partial_ordering</w:t>
+      </w:r>
+      <w:r>
+        <w:rPr>
+          <w:lang w:eastAsia="cs-CZ"/>
+        </w:rPr>
+        <w:t>.</w:t>
+      </w:r>
+    </w:p>
+    <w:p>
+      <w:pPr>
+        <w:pStyle w:val="Nadpis2"/>
+        <w:jc w:val="both"/>
+        <w:rPr>
+          <w:lang w:eastAsia="cs-CZ"/>
+        </w:rPr>
+      </w:pPr>
+      <w:bookmarkStart w:id="22" w:name="_Toc229864007"/>
+      <w:r>
+        <w:rPr>
+          <w:lang w:eastAsia="cs-CZ"/>
+        </w:rPr>
+        <w:t>2.</w:t>
+      </w:r>
+      <w:r>
+        <w:rPr>
+          <w:lang w:eastAsia="cs-CZ"/>
+        </w:rPr>
+        <w:t>3</w:t>
+      </w:r>
+      <w:r>
+        <w:rPr>
+          <w:lang w:eastAsia="cs-CZ"/>
+        </w:rPr>
+        <w:t xml:space="preserve"> Testy</w:t>
+      </w:r>
+      <w:bookmarkEnd w:id="22"/>
     </w:p>
     <w:p>
       <w:pPr>
@@ -9468,25 +10514,49 @@
         <w:rPr>
           <w:lang w:eastAsia="cs-CZ"/>
         </w:rPr>
-        <w:t xml:space="preserve">Pro kopírování, porovnávání či konstrukci a destrukci jsou v případě triviálně manipulovatelných typů (kontrolováno například pomocí </w:t>
-      </w:r>
-      <w:r>
-        <w:rPr>
-          <w:lang w:eastAsia="cs-CZ"/>
-        </w:rPr>
-        <w:t>std::is_trivially_copyable_v&lt;T&gt;</w:t>
-      </w:r>
-      <w:r>
-        <w:rPr>
-          <w:lang w:eastAsia="cs-CZ"/>
-        </w:rPr>
-        <w:t>) jsou použity nízkoúrovňové funkce standartní knihovny jako například std::memcpy či std::memcmp a podobně.</w:t>
-      </w:r>
-      <w:r>
-        <w:rPr>
-          <w:lang w:eastAsia="cs-CZ"/>
-        </w:rPr>
-        <w:t xml:space="preserve"> Jestli jde takovéto operace (téměř s jistotou by se dalo říct optimalizace) jde na daném typu skutečně provést jde vykonat během kompilace a není tím pádem žádný overhead.</w:t>
+        <w:t>Testy byly uskutečněny pomocí GoogleTest frameworku.</w:t>
+      </w:r>
+      <w:r>
+        <w:rPr>
+          <w:lang w:eastAsia="cs-CZ"/>
+        </w:rPr>
+        <w:t xml:space="preserve"> Testy jsou ve složce „test“ ve které je složka „src“ ve které je struktura </w:t>
+      </w:r>
+      <w:r>
+        <w:rPr>
+          <w:lang w:eastAsia="cs-CZ"/>
+        </w:rPr>
+        <w:t>kopírující</w:t>
+      </w:r>
+      <w:r>
+        <w:rPr>
+          <w:lang w:eastAsia="cs-CZ"/>
+        </w:rPr>
+        <w:t xml:space="preserve"> strukturu projektu.</w:t>
+      </w:r>
+      <w:r>
+        <w:rPr>
+          <w:lang w:eastAsia="cs-CZ"/>
+        </w:rPr>
+        <w:t xml:space="preserve"> Na místech zdrojových kódu, které jsou </w:t>
+      </w:r>
+      <w:r>
+        <w:rPr>
+          <w:lang w:eastAsia="cs-CZ"/>
+        </w:rPr>
+        <w:t xml:space="preserve">unit </w:t>
+      </w:r>
+      <w:r>
+        <w:rPr>
+          <w:lang w:eastAsia="cs-CZ"/>
+        </w:rPr>
+        <w:t>testovány tam ovšem jsou soubory s testy podle jmenné konvence: „jméno původního souboru + _test + .cpp“.</w:t>
+      </w:r>
+      <w:r>
+        <w:rPr>
+          <w:lang w:eastAsia="cs-CZ"/>
+        </w:rPr>
+        <w:t xml:space="preserve"> Pro zátěžové testy je konvence stejná, jenom místo „_test“ je nahrazeno „_stress“.</w:t>
       </w:r>
     </w:p>
     <w:p>
@@ -9501,169 +10571,31 @@
         <w:rPr>
           <w:lang w:eastAsia="cs-CZ"/>
         </w:rPr>
-        <w:t>Z venkovního hlediska se rozhraní této třídy velmi podobá std::vector ze standartní knihovny.</w:t>
-      </w:r>
-      <w:r>
-        <w:rPr>
-          <w:lang w:eastAsia="cs-CZ"/>
-        </w:rPr>
-        <w:t xml:space="preserve"> Dá</w:t>
-      </w:r>
-      <w:r>
-        <w:rPr>
-          <w:lang w:eastAsia="cs-CZ"/>
-        </w:rPr>
-        <w:t xml:space="preserve"> </w:t>
-      </w:r>
-      <w:r>
-        <w:rPr>
-          <w:lang w:eastAsia="cs-CZ"/>
-        </w:rPr>
-        <w:t xml:space="preserve">se kopírovat i stěhovat díky copy a move konstruktoru a </w:t>
-      </w:r>
-      <w:r>
-        <w:rPr>
-          <w:lang w:eastAsia="cs-CZ"/>
-        </w:rPr>
-        <w:t>přetížení operátoru přiřazení (=).</w:t>
-      </w:r>
-      <w:r>
-        <w:rPr>
-          <w:lang w:eastAsia="cs-CZ"/>
-        </w:rPr>
-        <w:t xml:space="preserve"> Dá se z něj přistoupit na syrová data </w:t>
-      </w:r>
-      <w:r>
-        <w:rPr>
-          <w:lang w:eastAsia="cs-CZ"/>
-        </w:rPr>
-        <w:t xml:space="preserve">(pomocí </w:t>
-      </w:r>
-      <w:r>
-        <w:rPr>
-          <w:lang w:eastAsia="cs-CZ"/>
-        </w:rPr>
-        <w:t>stejnojmenné</w:t>
-      </w:r>
-      <w:r>
-        <w:rPr>
-          <w:lang w:eastAsia="cs-CZ"/>
-        </w:rPr>
-        <w:t xml:space="preserve"> metody data()) </w:t>
-      </w:r>
-      <w:r>
-        <w:rPr>
-          <w:lang w:eastAsia="cs-CZ"/>
-        </w:rPr>
-        <w:t xml:space="preserve">a dá se </w:t>
-      </w:r>
-      <w:r>
-        <w:rPr>
-          <w:lang w:eastAsia="cs-CZ"/>
-        </w:rPr>
-        <w:t>použít přetížení indexovacího operátoru ([]) pro přístup na jednotlivé prvky (v </w:t>
-      </w:r>
-      <w:r>
-        <w:rPr>
-          <w:lang w:eastAsia="cs-CZ"/>
-        </w:rPr>
-        <w:t>O(1)</w:t>
-      </w:r>
-      <w:r>
-        <w:rPr>
-          <w:lang w:eastAsia="cs-CZ"/>
-        </w:rPr>
-        <w:t xml:space="preserve"> složitosti).</w:t>
-      </w:r>
-      <w:r>
-        <w:rPr>
-          <w:lang w:eastAsia="cs-CZ"/>
-        </w:rPr>
-        <w:t xml:space="preserve"> Dají se z</w:t>
-      </w:r>
-      <w:r>
-        <w:rPr>
-          <w:lang w:eastAsia="cs-CZ"/>
-        </w:rPr>
-        <w:t> </w:t>
-      </w:r>
-      <w:r>
-        <w:rPr>
-          <w:lang w:eastAsia="cs-CZ"/>
-        </w:rPr>
-        <w:t>něj</w:t>
-      </w:r>
-      <w:r>
-        <w:rPr>
-          <w:lang w:eastAsia="cs-CZ"/>
-        </w:rPr>
-        <w:t>, ze stejného rozhraní u std::vector dostat iterátory jak dopředu</w:t>
-      </w:r>
-      <w:r>
-        <w:rPr>
-          <w:lang w:eastAsia="cs-CZ"/>
-        </w:rPr>
-        <w:t>,</w:t>
-      </w:r>
-      <w:r>
-        <w:rPr>
-          <w:lang w:eastAsia="cs-CZ"/>
-        </w:rPr>
-        <w:t xml:space="preserve"> tak dozadu</w:t>
-      </w:r>
-      <w:r>
-        <w:rPr>
-          <w:lang w:eastAsia="cs-CZ"/>
-        </w:rPr>
-        <w:t>. Iterátor je pro jednoduchost ukazatel, což je jednoduché a efektivní</w:t>
-      </w:r>
-      <w:r>
-        <w:rPr>
-          <w:lang w:eastAsia="cs-CZ"/>
-        </w:rPr>
-        <w:t>.</w:t>
-      </w:r>
-      <w:r>
-        <w:rPr>
-          <w:lang w:eastAsia="cs-CZ"/>
-        </w:rPr>
-        <w:t xml:space="preserve"> Dá se porovnávat s ostatními lineárními kontejnery</w:t>
-      </w:r>
-      <w:r>
-        <w:rPr>
-          <w:lang w:eastAsia="cs-CZ"/>
-        </w:rPr>
-        <w:t xml:space="preserve"> díky přetížení porovnávacího operátoru (==) a operátoru „vesmírné lodi“ (&lt;=&gt;).</w:t>
-      </w:r>
-      <w:r>
-        <w:rPr>
-          <w:lang w:eastAsia="cs-CZ"/>
-        </w:rPr>
-        <w:t xml:space="preserve"> Je možné díky metodě swap také vyměnit obsahy dvou lineárních kontejnerů.</w:t>
-      </w:r>
-      <w:r>
-        <w:rPr>
-          <w:lang w:eastAsia="cs-CZ"/>
-        </w:rPr>
-        <w:t xml:space="preserve"> Samozřejmě je také možné kontejner manuálně změnit v jeho velikosti a kapacitě</w:t>
-      </w:r>
-      <w:r>
-        <w:rPr>
-          <w:lang w:eastAsia="cs-CZ"/>
-        </w:rPr>
-        <w:t xml:space="preserve"> či ho celá vyčistit</w:t>
-      </w:r>
-      <w:r>
-        <w:rPr>
-          <w:lang w:eastAsia="cs-CZ"/>
-        </w:rPr>
-        <w:t>.</w:t>
-      </w:r>
-      <w:r>
-        <w:rPr>
-          <w:lang w:eastAsia="cs-CZ"/>
-        </w:rPr>
-        <w:t xml:space="preserve"> Jde také nakonec přidat prvek či ho z konce odstranit.</w:t>
+        <w:t xml:space="preserve">V obou typech testů (unit i zátěž) bylo na začátku, těsně před vložením hlavičkového souboru „Tensor.hpp“ </w:t>
+      </w:r>
+      <w:r>
+        <w:rPr>
+          <w:lang w:eastAsia="cs-CZ"/>
+        </w:rPr>
+        <w:t>definováno makro, které ihned po vložení tohoto hlavičkového souboru oddefinováno.</w:t>
+      </w:r>
+      <w:r>
+        <w:rPr>
+          <w:lang w:eastAsia="cs-CZ"/>
+        </w:rPr>
+        <w:t xml:space="preserve"> Toto makro zaměňuje klíčové slovo C++ „</w:t>
+      </w:r>
+      <w:r>
+        <w:rPr>
+          <w:lang w:eastAsia="cs-CZ"/>
+        </w:rPr>
+        <w:t>protected</w:t>
+      </w:r>
+      <w:r>
+        <w:rPr>
+          <w:lang w:eastAsia="cs-CZ"/>
+        </w:rPr>
+        <w:t>“ za „public“ a tím pádem pro testy odkrývá privátní členy třídy k jejich otestování.</w:t>
       </w:r>
     </w:p>
     <w:p>
@@ -9674,7 +10606,7 @@
           <w:lang w:eastAsia="cs-CZ"/>
         </w:rPr>
       </w:pPr>
-      <w:bookmarkStart w:id="18" w:name="_Toc229864002"/>
+      <w:bookmarkStart w:id="23" w:name="_Toc229864008"/>
       <w:r>
         <w:rPr>
           <w:lang w:eastAsia="cs-CZ"/>
@@ -9685,27 +10617,15 @@
         <w:rPr>
           <w:lang w:eastAsia="cs-CZ"/>
         </w:rPr>
-        <w:t>2</w:t>
-      </w:r>
-      <w:r>
-        <w:rPr>
-          <w:lang w:eastAsia="cs-CZ"/>
-        </w:rPr>
-        <w:t>.</w:t>
-      </w:r>
-      <w:r>
-        <w:rPr>
-          <w:lang w:eastAsia="cs-CZ"/>
-        </w:rPr>
-        <w:t>4</w:t>
-      </w:r>
-      <w:r>
-        <w:rPr>
-          <w:lang w:eastAsia="cs-CZ"/>
-        </w:rPr>
-        <w:t xml:space="preserve"> Tenzor</w:t>
-      </w:r>
-      <w:bookmarkEnd w:id="18"/>
+        <w:t>3</w:t>
+      </w:r>
+      <w:r>
+        <w:rPr>
+          <w:lang w:eastAsia="cs-CZ"/>
+        </w:rPr>
+        <w:t>.1 Unit testování</w:t>
+      </w:r>
+      <w:bookmarkEnd w:id="23"/>
     </w:p>
     <w:p>
       <w:pPr>
@@ -9719,50 +10639,74 @@
         <w:rPr>
           <w:lang w:eastAsia="cs-CZ"/>
         </w:rPr>
-        <w:t>Jedná se o „hlavní“ třídu celé práce. Je navržen a implementován tak, aby byl univerzální, dynamický s širokým využitím.</w:t>
-      </w:r>
-      <w:r>
-        <w:rPr>
-          <w:lang w:eastAsia="cs-CZ"/>
-        </w:rPr>
-        <w:t xml:space="preserve"> </w:t>
-      </w:r>
-      <w:r>
-        <w:rPr>
-          <w:lang w:eastAsia="cs-CZ"/>
-        </w:rPr>
-        <w:t xml:space="preserve">V projektu se nazývá „Tensor“. </w:t>
-      </w:r>
-      <w:r>
-        <w:rPr>
-          <w:lang w:eastAsia="cs-CZ"/>
-        </w:rPr>
-        <w:t xml:space="preserve">Stejně jako lineární kontejner, tak je tato třída šablonovaná pro versatilní ukládání různých datových typů. </w:t>
-      </w:r>
-      <w:r>
-        <w:rPr>
-          <w:lang w:eastAsia="cs-CZ"/>
-        </w:rPr>
-        <w:t xml:space="preserve">Používá </w:t>
-      </w:r>
-      <w:r>
-        <w:rPr>
-          <w:lang w:eastAsia="cs-CZ"/>
-        </w:rPr>
-        <w:t>v sobě lineární kontejner pro udržení dat.</w:t>
-      </w:r>
-      <w:r>
-        <w:rPr>
-          <w:lang w:eastAsia="cs-CZ"/>
-        </w:rPr>
-        <w:t xml:space="preserve"> Jelikož udržování informací o struktuře tenzoru (tím myšleno rozměry dimenzí) je očekávané jen se zanedbatelným využitím paměti oproti datům, tak pro jednoduchost byly tyto informace uloženy do std::vector. Díky tomu je možné využít plného rozhraní manipulace nabízeného standartní knihovnou a </w:t>
-      </w:r>
-      <w:r>
-        <w:rPr>
-          <w:lang w:eastAsia="cs-CZ"/>
-        </w:rPr>
-        <w:t>také využít optimalizací, které s sebou knihovna přináší.</w:t>
-      </w:r>
+        <w:t>Na tenzor samotný připadá přes 140 testů.</w:t>
+      </w:r>
+      <w:r>
+        <w:rPr>
+          <w:lang w:eastAsia="cs-CZ"/>
+        </w:rPr>
+        <w:t xml:space="preserve"> Každá důležitější metoda je testována vícekrát pro jiný případ.</w:t>
+      </w:r>
+      <w:r>
+        <w:rPr>
+          <w:lang w:eastAsia="cs-CZ"/>
+        </w:rPr>
+        <w:t xml:space="preserve"> Pro testy byla využita makra google testu TEST a uvnitř asertivní makra pro kontrolu výsledku testu, většinou EXPECT_EQ pro posouzení rovnosti výsledku s očekávanou </w:t>
+      </w:r>
+      <w:r>
+        <w:rPr>
+          <w:lang w:eastAsia="cs-CZ"/>
+        </w:rPr>
+        <w:lastRenderedPageBreak/>
+        <w:t>hodnotou.</w:t>
+      </w:r>
+      <w:r>
+        <w:rPr>
+          <w:lang w:eastAsia="cs-CZ"/>
+        </w:rPr>
+        <w:t xml:space="preserve"> Většina těchto testů byla znovupoužita na otestování paralelní verze tenzoru až na výjimku testů, co vyžadovaly v typovém parametrů nekompatibilní datové typy pro kopii na GPU paměť.</w:t>
+      </w:r>
+      <w:r>
+        <w:rPr>
+          <w:lang w:eastAsia="cs-CZ"/>
+        </w:rPr>
+        <w:t xml:space="preserve"> Například std::string nebo i tenzor v tenzoru.</w:t>
+      </w:r>
+      <w:r>
+        <w:rPr>
+          <w:lang w:eastAsia="cs-CZ"/>
+        </w:rPr>
+        <w:t xml:space="preserve"> To zredukovalo počet unit testů pro paralelní zpracování na něco přes 110.</w:t>
+      </w:r>
+    </w:p>
+    <w:p>
+      <w:pPr>
+        <w:pStyle w:val="Nadpis3"/>
+        <w:jc w:val="both"/>
+        <w:rPr>
+          <w:lang w:eastAsia="cs-CZ"/>
+        </w:rPr>
+      </w:pPr>
+      <w:bookmarkStart w:id="24" w:name="_Toc229864009"/>
+      <w:r>
+        <w:rPr>
+          <w:lang w:eastAsia="cs-CZ"/>
+        </w:rPr>
+        <w:t>2.</w:t>
+      </w:r>
+      <w:r>
+        <w:rPr>
+          <w:lang w:eastAsia="cs-CZ"/>
+        </w:rPr>
+        <w:t>3</w:t>
+      </w:r>
+      <w:r>
+        <w:rPr>
+          <w:lang w:eastAsia="cs-CZ"/>
+        </w:rPr>
+        <w:t>.2 Zátěžové testování</w:t>
+      </w:r>
+      <w:bookmarkEnd w:id="24"/>
     </w:p>
     <w:p>
       <w:pPr>
@@ -9776,651 +10720,11 @@
         <w:rPr>
           <w:lang w:eastAsia="cs-CZ"/>
         </w:rPr>
-        <w:t>Použitím lineárního kontejneru se implementace vyhne</w:t>
-      </w:r>
-      <w:r>
-        <w:rPr>
-          <w:lang w:eastAsia="cs-CZ"/>
-        </w:rPr>
-        <w:t xml:space="preserve"> jednomu velikému problému. Vektor tak jak je ve standartní knihovně má zvláštní specializaci pro datový typ bool. Je to optimalizace za účelem šetření místa, tak, že jeden bool je uložen pouze v jednom bitu místo bytu.</w:t>
-      </w:r>
-      <w:r>
-        <w:rPr>
-          <w:lang w:eastAsia="cs-CZ"/>
-        </w:rPr>
-        <w:t xml:space="preserve"> Taková </w:t>
-      </w:r>
-      <w:r>
-        <w:rPr>
-          <w:lang w:eastAsia="cs-CZ"/>
-        </w:rPr>
-        <w:lastRenderedPageBreak/>
-        <w:t>specializace ovšem přináší problémy při imp</w:t>
-      </w:r>
-      <w:r>
-        <w:rPr>
-          <w:lang w:eastAsia="cs-CZ"/>
-        </w:rPr>
-        <w:t>l</w:t>
-      </w:r>
-      <w:r>
-        <w:rPr>
-          <w:lang w:eastAsia="cs-CZ"/>
-        </w:rPr>
-        <w:t>ementaci šablonovaných metod. Například reference na jeden prvek není reference na bool ale jedná se o složitější objekt. Čtenář si jistě představí, jaké problémy to může přinést, když by se pokoušel programovat genericky. Navíc je tento typ ukládání obtížen drobným overheadem u přístupů k prvkům, jelikož se nejedná o pouhé přistupování na byte paměti, ale dostávání hodnoty konkrétního bitu, což normálně jde jen za pomocí bitových operací a masek.</w:t>
-      </w:r>
-      <w:r>
-        <w:rPr>
-          <w:lang w:eastAsia="cs-CZ"/>
-        </w:rPr>
-        <w:t xml:space="preserve"> V lineárním kontejneru jsou bity uloženy vedle sebe v bytech. To dává stejné chování jako u ostatních primitivních datových typů</w:t>
-      </w:r>
-      <w:r>
-        <w:rPr>
-          <w:lang w:eastAsia="cs-CZ"/>
-        </w:rPr>
-        <w:t>,</w:t>
-      </w:r>
-      <w:r>
-        <w:rPr>
-          <w:lang w:eastAsia="cs-CZ"/>
-        </w:rPr>
-        <w:t xml:space="preserve"> a navíc je bez overheadu.</w:t>
-      </w:r>
-    </w:p>
-    <w:p>
-      <w:pPr>
-        <w:spacing w:line="360" w:lineRule="auto"/>
-        <w:jc w:val="both"/>
-        <w:rPr>
-          <w:lang w:eastAsia="cs-CZ"/>
-        </w:rPr>
-      </w:pPr>
-      <w:r>
-        <w:rPr>
-          <w:lang w:eastAsia="cs-CZ"/>
-        </w:rPr>
-        <w:t>V této třídě je také uložen vektor kumulativních součinů</w:t>
-      </w:r>
-      <w:r>
-        <w:rPr>
-          <w:lang w:eastAsia="cs-CZ"/>
-        </w:rPr>
-        <w:t xml:space="preserve"> předešlých dimenzí</w:t>
-      </w:r>
-      <w:r>
-        <w:rPr>
-          <w:lang w:eastAsia="cs-CZ"/>
-        </w:rPr>
-        <w:t>, a to pomocí std::vector. Ze stejných důvodů jako u dimenzí tenzoru je toto řešení do</w:t>
-      </w:r>
-      <w:r>
-        <w:rPr>
-          <w:lang w:eastAsia="cs-CZ"/>
-        </w:rPr>
-        <w:t>s</w:t>
-      </w:r>
-      <w:r>
-        <w:rPr>
-          <w:lang w:eastAsia="cs-CZ"/>
-        </w:rPr>
-        <w:t>tačující.</w:t>
-      </w:r>
-    </w:p>
-    <w:p>
-      <w:pPr>
-        <w:spacing w:line="360" w:lineRule="auto"/>
-        <w:jc w:val="both"/>
-        <w:rPr>
-          <w:lang w:eastAsia="cs-CZ"/>
-        </w:rPr>
-      </w:pPr>
-      <w:r>
-        <w:rPr>
-          <w:lang w:eastAsia="cs-CZ"/>
-        </w:rPr>
-        <w:t>Základním způsobem</w:t>
-      </w:r>
-      <w:r>
-        <w:rPr>
-          <w:lang w:eastAsia="cs-CZ"/>
-        </w:rPr>
-        <w:t>,</w:t>
-      </w:r>
-      <w:r>
-        <w:rPr>
-          <w:lang w:eastAsia="cs-CZ"/>
-        </w:rPr>
-        <w:t xml:space="preserve"> jak vytvořit tenzor je použít konstruktor přijímající jeden std::ve</w:t>
-      </w:r>
-      <w:r>
-        <w:rPr>
-          <w:lang w:eastAsia="cs-CZ"/>
-        </w:rPr>
-        <w:t>c</w:t>
-      </w:r>
-      <w:r>
-        <w:rPr>
-          <w:lang w:eastAsia="cs-CZ"/>
-        </w:rPr>
-        <w:t>tor</w:t>
-      </w:r>
-      <w:r>
-        <w:rPr>
-          <w:lang w:eastAsia="cs-CZ"/>
-        </w:rPr>
-        <w:t>&lt;uint64_t&gt;</w:t>
-      </w:r>
-      <w:r>
-        <w:rPr>
-          <w:lang w:eastAsia="cs-CZ"/>
-        </w:rPr>
-        <w:t>.</w:t>
-      </w:r>
-      <w:r>
-        <w:rPr>
-          <w:lang w:eastAsia="cs-CZ"/>
-        </w:rPr>
-        <w:t xml:space="preserve"> Ten vektor obsahuje velikosti dimenzí. V konstruktoru se nakopíruje do vektoru pro udržování velikostí dimenzí a poté se spustí metoda update(), která vypočítá potřebné místo k alokaci tenzoru</w:t>
-      </w:r>
-      <w:r>
-        <w:rPr>
-          <w:lang w:eastAsia="cs-CZ"/>
-        </w:rPr>
-        <w:t>,</w:t>
-      </w:r>
-      <w:r>
-        <w:rPr>
-          <w:lang w:eastAsia="cs-CZ"/>
-        </w:rPr>
-        <w:t xml:space="preserve"> a to místo skutečně alokuje na lineárním kontejneru.</w:t>
-      </w:r>
-      <w:r>
-        <w:rPr>
-          <w:lang w:eastAsia="cs-CZ"/>
-        </w:rPr>
-        <w:t xml:space="preserve"> Poté také aktualizuje/vypočítá strukturální optimalizační data závislá na velikostech dimenze jako například vektor kumulativních </w:t>
-      </w:r>
-      <w:r>
-        <w:rPr>
-          <w:lang w:eastAsia="cs-CZ"/>
-        </w:rPr>
-        <w:t>součinů předchozích velikostí dimenzí.</w:t>
-      </w:r>
-    </w:p>
-    <w:p>
-      <w:pPr>
-        <w:spacing w:line="360" w:lineRule="auto"/>
-        <w:jc w:val="both"/>
-        <w:rPr>
-          <w:lang w:eastAsia="cs-CZ"/>
-        </w:rPr>
-      </w:pPr>
-    </w:p>
-    <w:p>
-      <w:pPr>
-        <w:pStyle w:val="Nadpis3"/>
-        <w:jc w:val="both"/>
-        <w:rPr>
-          <w:lang w:eastAsia="cs-CZ"/>
-        </w:rPr>
-      </w:pPr>
-      <w:bookmarkStart w:id="19" w:name="_Toc229864003"/>
-      <w:r>
-        <w:rPr>
-          <w:lang w:eastAsia="cs-CZ"/>
-        </w:rPr>
-        <w:t>2.</w:t>
-      </w:r>
-      <w:r>
-        <w:rPr>
-          <w:lang w:eastAsia="cs-CZ"/>
-        </w:rPr>
-        <w:t>2</w:t>
-      </w:r>
-      <w:r>
-        <w:rPr>
-          <w:lang w:eastAsia="cs-CZ"/>
-        </w:rPr>
-        <w:t>.</w:t>
-      </w:r>
-      <w:r>
-        <w:rPr>
-          <w:lang w:eastAsia="cs-CZ"/>
-        </w:rPr>
-        <w:t>5</w:t>
-      </w:r>
-      <w:r>
-        <w:rPr>
-          <w:lang w:eastAsia="cs-CZ"/>
-        </w:rPr>
-        <w:t xml:space="preserve"> Paralelní tenzor</w:t>
-      </w:r>
-      <w:bookmarkEnd w:id="19"/>
-    </w:p>
-    <w:p>
-      <w:pPr>
-        <w:spacing w:line="360" w:lineRule="auto"/>
-        <w:jc w:val="both"/>
-        <w:rPr>
-          <w:lang w:eastAsia="cs-CZ"/>
-        </w:rPr>
-      </w:pPr>
-      <w:r>
-        <w:rPr>
-          <w:lang w:eastAsia="cs-CZ"/>
-        </w:rPr>
         <w:t>Xxx</w:t>
       </w:r>
     </w:p>
     <w:p>
       <w:pPr>
-        <w:pStyle w:val="Nadpis3"/>
-        <w:jc w:val="both"/>
-        <w:rPr>
-          <w:lang w:eastAsia="cs-CZ"/>
-        </w:rPr>
-      </w:pPr>
-      <w:bookmarkStart w:id="20" w:name="_Toc229864004"/>
-      <w:r>
-        <w:rPr>
-          <w:lang w:eastAsia="cs-CZ"/>
-        </w:rPr>
-        <w:t>2.</w:t>
-      </w:r>
-      <w:r>
-        <w:rPr>
-          <w:lang w:eastAsia="cs-CZ"/>
-        </w:rPr>
-        <w:t>2</w:t>
-      </w:r>
-      <w:r>
-        <w:rPr>
-          <w:lang w:eastAsia="cs-CZ"/>
-        </w:rPr>
-        <w:t>.</w:t>
-      </w:r>
-      <w:r>
-        <w:rPr>
-          <w:lang w:eastAsia="cs-CZ"/>
-        </w:rPr>
-        <w:t>6</w:t>
-      </w:r>
-      <w:r>
-        <w:rPr>
-          <w:lang w:eastAsia="cs-CZ"/>
-        </w:rPr>
-        <w:t xml:space="preserve"> Matice</w:t>
-      </w:r>
-      <w:bookmarkEnd w:id="20"/>
-    </w:p>
-    <w:p>
-      <w:pPr>
-        <w:spacing w:line="360" w:lineRule="auto"/>
-        <w:jc w:val="both"/>
-        <w:rPr>
-          <w:lang w:eastAsia="cs-CZ"/>
-        </w:rPr>
-      </w:pPr>
-      <w:r>
-        <w:rPr>
-          <w:lang w:eastAsia="cs-CZ"/>
-        </w:rPr>
-        <w:t>Xxx</w:t>
-      </w:r>
-    </w:p>
-    <w:p>
-      <w:pPr>
-        <w:pStyle w:val="Nadpis3"/>
-        <w:jc w:val="both"/>
-        <w:rPr>
-          <w:lang w:eastAsia="cs-CZ"/>
-        </w:rPr>
-      </w:pPr>
-      <w:bookmarkStart w:id="21" w:name="_Toc229864005"/>
-      <w:r>
-        <w:rPr>
-          <w:lang w:eastAsia="cs-CZ"/>
-        </w:rPr>
-        <w:t>2.</w:t>
-      </w:r>
-      <w:r>
-        <w:rPr>
-          <w:lang w:eastAsia="cs-CZ"/>
-        </w:rPr>
-        <w:t>2</w:t>
-      </w:r>
-      <w:r>
-        <w:rPr>
-          <w:lang w:eastAsia="cs-CZ"/>
-        </w:rPr>
-        <w:t>.</w:t>
-      </w:r>
-      <w:r>
-        <w:rPr>
-          <w:lang w:eastAsia="cs-CZ"/>
-        </w:rPr>
-        <w:t>7</w:t>
-      </w:r>
-      <w:r>
-        <w:rPr>
-          <w:lang w:eastAsia="cs-CZ"/>
-        </w:rPr>
-        <w:t xml:space="preserve"> Paralelní matice</w:t>
-      </w:r>
-      <w:bookmarkEnd w:id="21"/>
-    </w:p>
-    <w:p>
-      <w:pPr>
-        <w:spacing w:line="360" w:lineRule="auto"/>
-        <w:jc w:val="both"/>
-        <w:rPr>
-          <w:lang w:eastAsia="cs-CZ"/>
-        </w:rPr>
-      </w:pPr>
-      <w:r>
-        <w:rPr>
-          <w:lang w:eastAsia="cs-CZ"/>
-        </w:rPr>
-        <w:t>Xxx</w:t>
-      </w:r>
-    </w:p>
-    <w:p>
-      <w:pPr>
-        <w:pStyle w:val="Nadpis3"/>
-        <w:jc w:val="both"/>
-        <w:rPr>
-          <w:lang w:eastAsia="cs-CZ"/>
-        </w:rPr>
-      </w:pPr>
-      <w:bookmarkStart w:id="22" w:name="_Toc229864006"/>
-      <w:r>
-        <w:rPr>
-          <w:lang w:eastAsia="cs-CZ"/>
-        </w:rPr>
-        <w:t>2.</w:t>
-      </w:r>
-      <w:r>
-        <w:rPr>
-          <w:lang w:eastAsia="cs-CZ"/>
-        </w:rPr>
-        <w:t>2</w:t>
-      </w:r>
-      <w:r>
-        <w:rPr>
-          <w:lang w:eastAsia="cs-CZ"/>
-        </w:rPr>
-        <w:t>.</w:t>
-      </w:r>
-      <w:r>
-        <w:rPr>
-          <w:lang w:eastAsia="cs-CZ"/>
-        </w:rPr>
-        <w:t>8</w:t>
-      </w:r>
-      <w:r>
-        <w:rPr>
-          <w:lang w:eastAsia="cs-CZ"/>
-        </w:rPr>
-        <w:t xml:space="preserve"> N-nární strom</w:t>
-      </w:r>
-      <w:bookmarkEnd w:id="22"/>
-    </w:p>
-    <w:p>
-      <w:pPr>
-        <w:spacing w:line="360" w:lineRule="auto"/>
-        <w:jc w:val="both"/>
-        <w:rPr>
-          <w:lang w:eastAsia="cs-CZ"/>
-        </w:rPr>
-      </w:pPr>
-      <w:r>
-        <w:rPr>
-          <w:lang w:eastAsia="cs-CZ"/>
-        </w:rPr>
-        <w:t>Xxx</w:t>
-      </w:r>
-    </w:p>
-    <w:p>
-      <w:pPr>
-        <w:pStyle w:val="Nadpis2"/>
-        <w:jc w:val="both"/>
-        <w:rPr>
-          <w:lang w:eastAsia="cs-CZ"/>
-        </w:rPr>
-      </w:pPr>
-      <w:bookmarkStart w:id="23" w:name="_Toc229864007"/>
-      <w:r>
-        <w:rPr>
-          <w:lang w:eastAsia="cs-CZ"/>
-        </w:rPr>
-        <w:t>2.</w:t>
-      </w:r>
-      <w:r>
-        <w:rPr>
-          <w:lang w:eastAsia="cs-CZ"/>
-        </w:rPr>
-        <w:t>3</w:t>
-      </w:r>
-      <w:r>
-        <w:rPr>
-          <w:lang w:eastAsia="cs-CZ"/>
-        </w:rPr>
-        <w:t xml:space="preserve"> Testy</w:t>
-      </w:r>
-      <w:bookmarkEnd w:id="23"/>
-    </w:p>
-    <w:p>
-      <w:pPr>
-        <w:spacing w:line="360" w:lineRule="auto"/>
-        <w:jc w:val="both"/>
-        <w:rPr>
-          <w:lang w:eastAsia="cs-CZ"/>
-        </w:rPr>
-      </w:pPr>
-      <w:r>
-        <w:rPr>
-          <w:lang w:eastAsia="cs-CZ"/>
-        </w:rPr>
-        <w:t>Testy byly uskutečněny pomocí GoogleTest frameworku.</w:t>
-      </w:r>
-      <w:r>
-        <w:rPr>
-          <w:lang w:eastAsia="cs-CZ"/>
-        </w:rPr>
-        <w:t xml:space="preserve"> Testy jsou ve složce „test“ ve které je složka „src“ ve které je struktura </w:t>
-      </w:r>
-      <w:r>
-        <w:rPr>
-          <w:lang w:eastAsia="cs-CZ"/>
-        </w:rPr>
-        <w:t>kopírující</w:t>
-      </w:r>
-      <w:r>
-        <w:rPr>
-          <w:lang w:eastAsia="cs-CZ"/>
-        </w:rPr>
-        <w:t xml:space="preserve"> strukturu projektu.</w:t>
-      </w:r>
-      <w:r>
-        <w:rPr>
-          <w:lang w:eastAsia="cs-CZ"/>
-        </w:rPr>
-        <w:t xml:space="preserve"> Na místech zdrojových kódu, které jsou </w:t>
-      </w:r>
-      <w:r>
-        <w:rPr>
-          <w:lang w:eastAsia="cs-CZ"/>
-        </w:rPr>
-        <w:t xml:space="preserve">unit </w:t>
-      </w:r>
-      <w:r>
-        <w:rPr>
-          <w:lang w:eastAsia="cs-CZ"/>
-        </w:rPr>
-        <w:t xml:space="preserve">testovány tam ovšem jsou soubory s testy podle jmenné konvence: „jméno </w:t>
-      </w:r>
-      <w:r>
-        <w:rPr>
-          <w:lang w:eastAsia="cs-CZ"/>
-        </w:rPr>
-        <w:lastRenderedPageBreak/>
-        <w:t>původního souboru + _test + .cpp“.</w:t>
-      </w:r>
-      <w:r>
-        <w:rPr>
-          <w:lang w:eastAsia="cs-CZ"/>
-        </w:rPr>
-        <w:t xml:space="preserve"> Pro zátěžové testy je konvence stejná, jenom místo „_test“ je nahrazeno „_stress“.</w:t>
-      </w:r>
-    </w:p>
-    <w:p>
-      <w:pPr>
-        <w:spacing w:line="360" w:lineRule="auto"/>
-        <w:jc w:val="both"/>
-        <w:rPr>
-          <w:lang w:eastAsia="cs-CZ"/>
-        </w:rPr>
-      </w:pPr>
-      <w:r>
-        <w:rPr>
-          <w:lang w:eastAsia="cs-CZ"/>
-        </w:rPr>
-        <w:t xml:space="preserve">V obou typech testů (unit i zátěž) bylo na začátku, těsně před vložením hlavičkového souboru „Tensor.hpp“ </w:t>
-      </w:r>
-      <w:r>
-        <w:rPr>
-          <w:lang w:eastAsia="cs-CZ"/>
-        </w:rPr>
-        <w:t>definováno makro, které ihned po vložení tohoto hlavičkového souboru oddefinováno.</w:t>
-      </w:r>
-      <w:r>
-        <w:rPr>
-          <w:lang w:eastAsia="cs-CZ"/>
-        </w:rPr>
-        <w:t xml:space="preserve"> Toto makro zaměňuje klíčové slovo C++ „private“ za „public“ a tím pádem pro testy odkrývá privátní členy třídy k jejich otestování.</w:t>
-      </w:r>
-    </w:p>
-    <w:p>
-      <w:pPr>
-        <w:pStyle w:val="Nadpis3"/>
-        <w:jc w:val="both"/>
-        <w:rPr>
-          <w:lang w:eastAsia="cs-CZ"/>
-        </w:rPr>
-      </w:pPr>
-      <w:bookmarkStart w:id="24" w:name="_Toc229864008"/>
-      <w:r>
-        <w:rPr>
-          <w:lang w:eastAsia="cs-CZ"/>
-        </w:rPr>
-        <w:t>2.</w:t>
-      </w:r>
-      <w:r>
-        <w:rPr>
-          <w:lang w:eastAsia="cs-CZ"/>
-        </w:rPr>
-        <w:t>3</w:t>
-      </w:r>
-      <w:r>
-        <w:rPr>
-          <w:lang w:eastAsia="cs-CZ"/>
-        </w:rPr>
-        <w:t>.1 Unit testování</w:t>
-      </w:r>
-      <w:bookmarkEnd w:id="24"/>
-    </w:p>
-    <w:p>
-      <w:pPr>
-        <w:spacing w:line="360" w:lineRule="auto"/>
-        <w:jc w:val="both"/>
-        <w:rPr>
-          <w:lang w:eastAsia="cs-CZ"/>
-        </w:rPr>
-      </w:pPr>
-      <w:r>
-        <w:rPr>
-          <w:lang w:eastAsia="cs-CZ"/>
-        </w:rPr>
-        <w:t>Na tenzor samotný připadá přes 140 testů.</w:t>
-      </w:r>
-      <w:r>
-        <w:rPr>
-          <w:lang w:eastAsia="cs-CZ"/>
-        </w:rPr>
-        <w:t xml:space="preserve"> Každá důležitější metoda je testována vícekrát pro jiný případ.</w:t>
-      </w:r>
-      <w:r>
-        <w:rPr>
-          <w:lang w:eastAsia="cs-CZ"/>
-        </w:rPr>
-        <w:t xml:space="preserve"> Pro testy byla využita makra google testu TEST a uvnitř asertivní makra pro kontrolu výsledku testu, většinou EXPECT_EQ pro posouzení rovnosti výsledku s očekávanou hodnotou.</w:t>
-      </w:r>
-      <w:r>
-        <w:rPr>
-          <w:lang w:eastAsia="cs-CZ"/>
-        </w:rPr>
-        <w:t xml:space="preserve"> Většina těchto testů byla znovupoužita na otestování paralelní verze tenzoru až na výjimku testů, co vyžadovaly v typovém parametrů nekompatibilní datové typy pro kopii na GPU paměť.</w:t>
-      </w:r>
-      <w:r>
-        <w:rPr>
-          <w:lang w:eastAsia="cs-CZ"/>
-        </w:rPr>
-        <w:t xml:space="preserve"> Například std::string nebo i tenzor v tenzoru.</w:t>
-      </w:r>
-      <w:r>
-        <w:rPr>
-          <w:lang w:eastAsia="cs-CZ"/>
-        </w:rPr>
-        <w:t xml:space="preserve"> To zredukovalo počet unit testů pro paralelní zpracování na něco přes 110.</w:t>
-      </w:r>
-    </w:p>
-    <w:p>
-      <w:pPr>
-        <w:pStyle w:val="Nadpis3"/>
-        <w:jc w:val="both"/>
-        <w:rPr>
-          <w:lang w:eastAsia="cs-CZ"/>
-        </w:rPr>
-      </w:pPr>
-      <w:bookmarkStart w:id="25" w:name="_Toc229864009"/>
-      <w:r>
-        <w:rPr>
-          <w:lang w:eastAsia="cs-CZ"/>
-        </w:rPr>
-        <w:t>2.</w:t>
-      </w:r>
-      <w:r>
-        <w:rPr>
-          <w:lang w:eastAsia="cs-CZ"/>
-        </w:rPr>
-        <w:t>3</w:t>
-      </w:r>
-      <w:r>
-        <w:rPr>
-          <w:lang w:eastAsia="cs-CZ"/>
-        </w:rPr>
-        <w:t>.2 Zátěžové testování</w:t>
-      </w:r>
-      <w:bookmarkEnd w:id="25"/>
-    </w:p>
-    <w:p>
-      <w:pPr>
-        <w:spacing w:line="360" w:lineRule="auto"/>
-        <w:jc w:val="both"/>
-        <w:rPr>
-          <w:lang w:eastAsia="cs-CZ"/>
-        </w:rPr>
-      </w:pPr>
-      <w:r>
-        <w:rPr>
-          <w:lang w:eastAsia="cs-CZ"/>
-        </w:rPr>
-        <w:t>Xxx</w:t>
-      </w:r>
-    </w:p>
-    <w:p>
-      <w:pPr>
         <w:spacing w:after="0" w:line="240" w:lineRule="auto"/>
         <w:rPr>
           <w:noProof/>
@@ -10441,12 +10745,12 @@
       <w:pPr>
         <w:pStyle w:val="Nadpis1"/>
       </w:pPr>
-      <w:bookmarkStart w:id="26" w:name="_Toc229864010"/>
+      <w:bookmarkStart w:id="25" w:name="_Toc229864010"/>
       <w:r>
         <w:lastRenderedPageBreak/>
         <w:t>3 TEORETICKÉ VYUŽITÍ</w:t>
       </w:r>
-      <w:bookmarkEnd w:id="26"/>
+      <w:bookmarkEnd w:id="25"/>
     </w:p>
     <w:p>
       <w:r>
@@ -10471,7 +10775,7 @@
           <w:szCs w:val="24"/>
         </w:rPr>
       </w:pPr>
-      <w:bookmarkStart w:id="27" w:name="_Toc227521731"/>
+      <w:bookmarkStart w:id="26" w:name="_Toc227521731"/>
       <w:r>
         <w:rPr>
           <w:i w:val="0"/>
@@ -10546,7 +10850,7 @@
         </w:rPr>
         <w:t>Vzdělanostní struktura obyvatelstva České republiky (2021)</w:t>
       </w:r>
-      <w:bookmarkEnd w:id="27"/>
+      <w:bookmarkEnd w:id="26"/>
     </w:p>
     <w:tbl>
       <w:tblPr>
@@ -11181,8 +11485,8 @@
         </w:rPr>
         <w:t>: Balonky (Min, 2016</w:t>
       </w:r>
-      <w:bookmarkStart w:id="28" w:name="_Toc24458948"/>
-      <w:bookmarkStart w:id="29" w:name="_Toc24459062"/>
+      <w:bookmarkStart w:id="27" w:name="_Toc24458948"/>
+      <w:bookmarkStart w:id="28" w:name="_Toc24459062"/>
       <w:r>
         <w:rPr>
           <w:i w:val="0"/>
@@ -11190,8 +11494,8 @@
         </w:rPr>
         <w:t>)</w:t>
       </w:r>
+      <w:bookmarkEnd w:id="27"/>
       <w:bookmarkEnd w:id="28"/>
-      <w:bookmarkEnd w:id="29"/>
       <w:r>
         <w:rPr>
           <w:i w:val="0"/>
@@ -11210,12 +11514,12 @@
         </w:rPr>
         <w:br w:type="page"/>
       </w:r>
-      <w:bookmarkStart w:id="30" w:name="_Toc229864011"/>
+      <w:bookmarkStart w:id="29" w:name="_Toc229864011"/>
       <w:r>
         <w:lastRenderedPageBreak/>
         <w:t>ZÁVĚR</w:t>
       </w:r>
-      <w:bookmarkEnd w:id="30"/>
+      <w:bookmarkEnd w:id="29"/>
     </w:p>
     <w:p>
       <w:pPr>
@@ -11229,115 +11533,73 @@
         <w:rPr>
           <w:szCs w:val="24"/>
         </w:rPr>
-        <w:t>Překvapit by však mohl fakt, že nikdo, snad krom toho, kdo balónky k obloze vypustil, netuší, jakou má ona stuha barvu. Je totiž tak lesklá, že za světla se v ní odráží nebe a za tmy zase není vidět vůbec. Když svítí slunce tak silně jako nyní, tak se stuha třpytí jako kapka rosy a</w:t>
-      </w:r>
-      <w:r>
-        <w:rPr>
-          <w:szCs w:val="24"/>
-        </w:rPr>
-        <w:t> </w:t>
-      </w:r>
-      <w:r>
-        <w:rPr>
-          <w:szCs w:val="24"/>
-        </w:rPr>
-        <w:t xml:space="preserve">jen málokdo vydrží dívat se na ni přímo déle než pár chvil. Jak vlastně vypadají ony </w:t>
-      </w:r>
-      <w:r>
-        <w:rPr>
-          <w:szCs w:val="24"/>
-        </w:rPr>
-        <w:t>balónky?</w:t>
-      </w:r>
-      <w:r>
-        <w:rPr>
-          <w:szCs w:val="24"/>
-        </w:rPr>
-        <w:t xml:space="preserve"> Ptají se často lidé. </w:t>
-      </w:r>
-      <w:r>
-        <w:rPr>
-          <w:szCs w:val="24"/>
-        </w:rPr>
-        <w:t>Inu,</w:t>
-      </w:r>
-      <w:r>
-        <w:rPr>
-          <w:szCs w:val="24"/>
-        </w:rPr>
-        <w:t xml:space="preserve"> jak by </w:t>
-      </w:r>
-      <w:r>
-        <w:rPr>
-          <w:szCs w:val="24"/>
-        </w:rPr>
-        <w:t>vypadaly – jako</w:t>
-      </w:r>
-      <w:r>
-        <w:rPr>
-          <w:szCs w:val="24"/>
-        </w:rPr>
-        <w:t xml:space="preserve"> běžné pouťové balónky střední velikosti, tak akorát nafouknuté. Červený se vedle modrého a zeleného zdá trochu menší, ale</w:t>
-      </w:r>
-      <w:r>
-        <w:rPr>
-          <w:szCs w:val="24"/>
-        </w:rPr>
-        <w:t> </w:t>
-      </w:r>
-      <w:r>
-        <w:rPr>
-          <w:szCs w:val="24"/>
-        </w:rPr>
-        <w:t>to je nejspíš jen optický klam, a i kdyby byl skutečně o něco málo menší, tak vážně jen o</w:t>
-      </w:r>
-      <w:r>
-        <w:rPr>
-          <w:szCs w:val="24"/>
-        </w:rPr>
-        <w:t> </w:t>
-      </w:r>
-      <w:r>
-        <w:rPr>
-          <w:szCs w:val="24"/>
-        </w:rPr>
-        <w:t xml:space="preserve">trošičku. Vítr skoro </w:t>
-      </w:r>
-      <w:r>
-        <w:rPr>
-          <w:szCs w:val="24"/>
-        </w:rPr>
-        <w:t>nefouká,</w:t>
-      </w:r>
-      <w:r>
-        <w:rPr>
-          <w:szCs w:val="24"/>
-        </w:rPr>
-        <w:t xml:space="preserve"> a tak by se na první pohled mohlo zdát, že se balónky snad vůbec nepohybují. Jenom tak klidně levitují ve vzduchu. Jelikož slunce jasně září a na obloze byste od východu k západu hledali mráček marně, balónky působí jako jakási fata morgána uprostřed pouště. Zkrátka široko daleko nikde nic, jen zelenkavá tráva, jasně modrá obloha a</w:t>
-      </w:r>
-      <w:r>
-        <w:rPr>
-          <w:szCs w:val="24"/>
-        </w:rPr>
-        <w:t> </w:t>
-      </w:r>
-      <w:r>
-        <w:rPr>
-          <w:szCs w:val="24"/>
-        </w:rPr>
-        <w:t xml:space="preserve">tři křiklavě barevné pouťové balónky, které se téměř nepozorovatelně pohupují ani ne moc vysoko, ani moc nízko nad zemí. Kdyby pod balónky nebyla sytě zelenkavá tráva, ale třeba suchá silnice či beton, možná by bylo vidět jejich barevné </w:t>
-      </w:r>
-      <w:r>
-        <w:rPr>
-          <w:szCs w:val="24"/>
-        </w:rPr>
-        <w:t>stíny – to,</w:t>
-      </w:r>
-      <w:r>
-        <w:rPr>
-          <w:szCs w:val="24"/>
-        </w:rPr>
-        <w:t xml:space="preserve"> jak přes poloprůsvitné barevné balónky prochází ostré sluneční paprsky. Jenže kvůli všudy přítomné trávě jsou stíny balónků sotva vidět, natož aby šlo rozeznat, jakou barvu tyto stíny mají.</w:t>
+        <w:t>V konečném důsledku se podařilo implementovat a popsat projekt tak,</w:t>
+      </w:r>
+      <w:r>
+        <w:rPr>
+          <w:szCs w:val="24"/>
+        </w:rPr>
+        <w:t xml:space="preserve"> </w:t>
+      </w:r>
+      <w:r>
+        <w:rPr>
+          <w:szCs w:val="24"/>
+        </w:rPr>
+        <w:t>aby splňoval zadání.</w:t>
+      </w:r>
+      <w:r>
+        <w:rPr>
+          <w:szCs w:val="24"/>
+        </w:rPr>
+        <w:t xml:space="preserve"> Jedná se o celek, který je schopen fungovat bez </w:t>
+      </w:r>
+      <w:r>
+        <w:rPr>
+          <w:szCs w:val="24"/>
+        </w:rPr>
+        <w:t>knihoven,</w:t>
+      </w:r>
+      <w:r>
+        <w:rPr>
+          <w:szCs w:val="24"/>
+        </w:rPr>
+        <w:t xml:space="preserve"> a tak uživateli </w:t>
+      </w:r>
+      <w:r>
+        <w:rPr>
+          <w:szCs w:val="24"/>
+        </w:rPr>
+        <w:t xml:space="preserve">prostě jen </w:t>
+      </w:r>
+      <w:r>
+        <w:rPr>
+          <w:szCs w:val="24"/>
+        </w:rPr>
+        <w:t>ulehčit práci</w:t>
+      </w:r>
+      <w:r>
+        <w:rPr>
+          <w:szCs w:val="24"/>
+        </w:rPr>
+        <w:t>,</w:t>
+      </w:r>
+      <w:r>
+        <w:rPr>
+          <w:szCs w:val="24"/>
+        </w:rPr>
+        <w:t xml:space="preserve"> </w:t>
+      </w:r>
+      <w:r>
+        <w:rPr>
+          <w:szCs w:val="24"/>
+        </w:rPr>
+        <w:t>nebo</w:t>
+      </w:r>
+      <w:r>
+        <w:rPr>
+          <w:szCs w:val="24"/>
+        </w:rPr>
+        <w:t xml:space="preserve"> řečené knihovny využít a dát uživateli do ruky přívětivý nástroj pro výpočty těžící z paralelizace.</w:t>
       </w:r>
     </w:p>
     <w:p>
@@ -11352,34 +11614,7 @@
         <w:rPr>
           <w:szCs w:val="24"/>
         </w:rPr>
-        <w:t xml:space="preserve">Uvidět tak balónky náhodný kolemjdoucí, jistě by si pomyslel, že už tu takhle poletují snad tisíc let. Stále si víceméně drží výšku a ani do stran se příliš nepohybují. Proti slunci to vypadá, že se slunce pohybuje k západu rychleji než balónky, a možná to tak skutečně je. Nejeden filozof by mohl tvrdit, že balónky se sluncem závodí, ale fyzikové by to jistě vyvrátili. Z fyzikálního pohledu totiž balónky působí zcela nezajímavě. Nejvíc bezpochyby zaujmou </w:t>
-      </w:r>
-      <w:r>
-        <w:rPr>
-          <w:szCs w:val="24"/>
-        </w:rPr>
-        <w:t>děti – jedna</w:t>
-      </w:r>
-      <w:r>
-        <w:rPr>
-          <w:szCs w:val="24"/>
-        </w:rPr>
-        <w:t xml:space="preserve"> malá holčička zrovna včera div nebrečela, že by snad balónky mohly prasknout.</w:t>
-      </w:r>
-    </w:p>
-    <w:p>
-      <w:pPr>
-        <w:spacing w:line="360" w:lineRule="auto"/>
-        <w:jc w:val="both"/>
-        <w:rPr>
-          <w:szCs w:val="24"/>
-        </w:rPr>
-      </w:pPr>
-      <w:r>
-        <w:rPr>
-          <w:szCs w:val="24"/>
-        </w:rPr>
-        <w:t>A co teprve ta stuha. Stuha, kterou je každý z trojice balónků uvázán, aby se nevypustil. Očividně je uvázaná dostatečně pevně, protože balónky skutečně neucházejí. To ale není nic zvláštního. Překvapit by však mohl fakt, že nikdo, snad krom toho, kdo balónky k obloze vypustil, netuší, jakou má ona stuha barvu. Je totiž tak lesklá, že za světla se v ní odráží nebe a za tmy zase není vidět vůbec. Když svítí slunce tak silně jako nyní, tak se stuha třpytí jako kapka rosy a jen málokdo vydrží dívat se na ni přímo déle než pár chvil.</w:t>
+        <w:t>Je velice pravděpodobné, že autor bude na projektu pracovat i v budoucnosti.</w:t>
       </w:r>
     </w:p>
     <w:p>
@@ -11389,12 +11624,12 @@
       <w:r>
         <w:br w:type="page"/>
       </w:r>
-      <w:bookmarkStart w:id="31" w:name="_Toc229864012"/>
+      <w:bookmarkStart w:id="30" w:name="_Toc229864012"/>
       <w:r>
         <w:lastRenderedPageBreak/>
         <w:t>POUŽITÁ LITERATURA</w:t>
       </w:r>
-      <w:bookmarkEnd w:id="31"/>
+      <w:bookmarkEnd w:id="30"/>
     </w:p>
     <w:p>
       <w:pPr>
@@ -11411,10 +11646,43 @@
       </w:pPr>
       <w:r>
         <w:rPr>
+          <w:i/>
+          <w:iCs/>
           <w:sz w:val="24"/>
           <w:szCs w:val="24"/>
         </w:rPr>
-        <w:t>Xtensor. Online. Github. 2016. Dostupné z: https://github.com/xtensor-stack/xtensor. [cit. 2026-05-16].</w:t>
+        <w:t>Xtensor</w:t>
+      </w:r>
+      <w:r>
+        <w:rPr>
+          <w:sz w:val="24"/>
+          <w:szCs w:val="24"/>
+        </w:rPr>
+        <w:t>. Online. Github. 2016. Dostupné z: </w:t>
+      </w:r>
+      <w:hyperlink r:id="rId13" w:history="1">
+        <w:r>
+          <w:rPr>
+            <w:rStyle w:val="Hypertextovodkaz"/>
+            <w:sz w:val="24"/>
+            <w:szCs w:val="24"/>
+          </w:rPr>
+          <w:t>https://github.com/xtensor-stack/xtensor</w:t>
+        </w:r>
+      </w:hyperlink>
+      <w:r>
+        <w:rPr>
+          <w:sz w:val="24"/>
+          <w:szCs w:val="24"/>
+        </w:rPr>
+        <w:t>. [cit. 2026-05-16].</w:t>
+      </w:r>
+      <w:r>
+        <w:rPr>
+          <w:sz w:val="24"/>
+          <w:szCs w:val="24"/>
+        </w:rPr>
+        <w:t xml:space="preserve"> </w:t>
       </w:r>
     </w:p>
     <w:p>
@@ -11435,7 +11703,40 @@
           <w:sz w:val="24"/>
           <w:szCs w:val="24"/>
         </w:rPr>
-        <w:t>GUENNEBAUD, Gaël a JACOB, Benoît. Eigen. Online. GitLab. 2010. Dostupné z: https://libeigen.gitlab.io. [cit. 2026-05-16].</w:t>
+        <w:t>GUENNEBAUD, Gaël a JACOB, Benoît. </w:t>
+      </w:r>
+      <w:r>
+        <w:rPr>
+          <w:i/>
+          <w:iCs/>
+          <w:sz w:val="24"/>
+          <w:szCs w:val="24"/>
+        </w:rPr>
+        <w:t>Eigen</w:t>
+      </w:r>
+      <w:r>
+        <w:rPr>
+          <w:sz w:val="24"/>
+          <w:szCs w:val="24"/>
+        </w:rPr>
+        <w:t>. Online. GitLab. 2010. Dostupné z: </w:t>
+      </w:r>
+      <w:hyperlink r:id="rId14" w:history="1">
+        <w:r>
+          <w:rPr>
+            <w:rStyle w:val="Hypertextovodkaz"/>
+            <w:sz w:val="24"/>
+            <w:szCs w:val="24"/>
+          </w:rPr>
+          <w:t>https://libeigen.gitlab.io</w:t>
+        </w:r>
+      </w:hyperlink>
+      <w:r>
+        <w:rPr>
+          <w:sz w:val="24"/>
+          <w:szCs w:val="24"/>
+        </w:rPr>
+        <w:t>. [cit. 2026-05-16].</w:t>
       </w:r>
     </w:p>
     <w:p>
@@ -11456,7 +11757,30 @@
           <w:sz w:val="24"/>
           <w:szCs w:val="24"/>
         </w:rPr>
-        <w:t>SOLOMONIK, Edgar; MATTHEWS, Devin; HAMMOND, Jeff R; STANTON, John F. a DEMMEL, James. A massively parallel tensor contraction framework for coupled-cluster. Journal of Parallel and Distributed Computing. 2014, vol. 2014, no. 74, s. 3176-3190. ISSN 0743-7315.</w:t>
+        <w:t>SOLOMONIK, Edgar; MATTHEWS, Devin; HAMMOND, Jeff R; STANTON, John F. a DEMMEL, James. A massively parallel tensor contraction framework for coupled-cluster. </w:t>
+      </w:r>
+      <w:r>
+        <w:rPr>
+          <w:i/>
+          <w:iCs/>
+          <w:sz w:val="24"/>
+          <w:szCs w:val="24"/>
+        </w:rPr>
+        <w:t>Journal of Parallel and Distributed Computing</w:t>
+      </w:r>
+      <w:r>
+        <w:rPr>
+          <w:sz w:val="24"/>
+          <w:szCs w:val="24"/>
+        </w:rPr>
+        <w:t>. 2014, vol. 2014, no. 74, s. 3176-3190. ISSN 0743-7315.</w:t>
+      </w:r>
+      <w:r>
+        <w:rPr>
+          <w:sz w:val="24"/>
+          <w:szCs w:val="24"/>
+        </w:rPr>
+        <w:t xml:space="preserve"> </w:t>
       </w:r>
     </w:p>
     <w:p>
@@ -11477,21 +11801,24 @@
           <w:sz w:val="24"/>
           <w:szCs w:val="24"/>
         </w:rPr>
-        <w:t>International Workshop on OpenCL. Online. 2023. ISBN 9798400707452.</w:t>
-      </w:r>
+        <w:t>International Workshop on OpenCL. Online. 2023. ISBN 9798400707452. Dostupné z: </w:t>
+      </w:r>
+      <w:hyperlink r:id="rId15" w:history="1">
+        <w:r>
+          <w:rPr>
+            <w:rStyle w:val="Hypertextovodkaz"/>
+            <w:sz w:val="24"/>
+            <w:szCs w:val="24"/>
+          </w:rPr>
+          <w:t>https://doi.org/10.1145/3585341</w:t>
+        </w:r>
+      </w:hyperlink>
       <w:r>
         <w:rPr>
           <w:sz w:val="24"/>
           <w:szCs w:val="24"/>
         </w:rPr>
-        <w:br/>
-      </w:r>
-      <w:r>
-        <w:rPr>
-          <w:sz w:val="24"/>
-          <w:szCs w:val="24"/>
-        </w:rPr>
-        <w:t>Dostupné z: https://doi.org/10.1145/3585341. [cit. 2026-05-16].</w:t>
+        <w:t>. [cit. 2026-05-17].</w:t>
       </w:r>
     </w:p>
     <w:p>
@@ -11546,36 +11873,145 @@
       </w:pPr>
       <w:r>
         <w:rPr>
+          <w:i/>
+          <w:iCs/>
           <w:sz w:val="24"/>
           <w:szCs w:val="24"/>
         </w:rPr>
-        <w:t xml:space="preserve">Intel® 64 and IA-32 Architectures Optimization Reference Manual Volume 1. Online. Intel. 2024. Dostupné z: </w:t>
+        <w:t>Intel® 64 and IA-32 Architectures Optimization Reference Manual Volume 1</w:t>
       </w:r>
       <w:r>
         <w:rPr>
           <w:sz w:val="24"/>
           <w:szCs w:val="24"/>
         </w:rPr>
-        <w:t>https://</w:t>
-      </w:r>
+        <w:t>. Online. Intel. 2024. Dostupné z: </w:t>
+      </w:r>
+      <w:hyperlink r:id="rId16" w:history="1">
+        <w:r>
+          <w:rPr>
+            <w:rStyle w:val="Hypertextovodkaz"/>
+            <w:sz w:val="24"/>
+            <w:szCs w:val="24"/>
+          </w:rPr>
+          <w:t>https://www.intel.com/content/www/us/en/content-details/821612/intel-64-and-ia-32-architectures-optimization-reference-manual-volume-1.html</w:t>
+        </w:r>
+      </w:hyperlink>
       <w:r>
         <w:rPr>
           <w:sz w:val="24"/>
           <w:szCs w:val="24"/>
         </w:rPr>
-        <w:t>www.intel.com/content/www/us/en/content-details/821612/intel-64-and-ia-32-architectures-optimization-reference-manual-volume-1.html. [cit. 2026-05-16].</w:t>
+        <w:t>. [cit. 2026-05-16].</w:t>
       </w:r>
     </w:p>
     <w:p>
       <w:pPr>
         <w:pStyle w:val="Textpoznpodarou"/>
+        <w:numPr>
+          <w:ilvl w:val="0"/>
+          <w:numId w:val="13"/>
+        </w:numPr>
         <w:spacing w:after="160" w:line="360" w:lineRule="auto"/>
-        <w:ind w:left="720"/>
         <w:rPr>
           <w:sz w:val="24"/>
           <w:szCs w:val="24"/>
         </w:rPr>
       </w:pPr>
+      <w:r>
+        <w:rPr>
+          <w:sz w:val="24"/>
+          <w:szCs w:val="24"/>
+        </w:rPr>
+        <w:t>O'DWYER, Arthur a KIRCHEIS, Federico. </w:t>
+      </w:r>
+      <w:r>
+        <w:rPr>
+          <w:i/>
+          <w:iCs/>
+          <w:sz w:val="24"/>
+          <w:szCs w:val="24"/>
+        </w:rPr>
+        <w:t>P2447R6 std::span over an initializer list</w:t>
+      </w:r>
+      <w:r>
+        <w:rPr>
+          <w:sz w:val="24"/>
+          <w:szCs w:val="24"/>
+        </w:rPr>
+        <w:t>. Online. Open Standards. 2023. Dostupné z: </w:t>
+      </w:r>
+      <w:hyperlink r:id="rId17" w:history="1">
+        <w:r>
+          <w:rPr>
+            <w:rStyle w:val="Hypertextovodkaz"/>
+            <w:sz w:val="24"/>
+            <w:szCs w:val="24"/>
+          </w:rPr>
+          <w:t>https://www.open-std.org/jtc1/sc22/wg21/docs/papers/2023/p2447r6.html</w:t>
+        </w:r>
+      </w:hyperlink>
+      <w:r>
+        <w:rPr>
+          <w:sz w:val="24"/>
+          <w:szCs w:val="24"/>
+        </w:rPr>
+        <w:t>. [cit. 2026-05-17].</w:t>
+      </w:r>
+    </w:p>
+    <w:p>
+      <w:pPr>
+        <w:pStyle w:val="Textpoznpodarou"/>
+        <w:numPr>
+          <w:ilvl w:val="0"/>
+          <w:numId w:val="13"/>
+        </w:numPr>
+        <w:spacing w:after="160" w:line="360" w:lineRule="auto"/>
+        <w:rPr>
+          <w:sz w:val="24"/>
+          <w:szCs w:val="24"/>
+        </w:rPr>
+      </w:pPr>
+      <w:r>
+        <w:rPr>
+          <w:sz w:val="24"/>
+          <w:szCs w:val="24"/>
+        </w:rPr>
+        <w:t>HOEMMEN, Mark; KAMIŃSKI, Tomasz; SONG, Tim a WAKELY, Jonathan. </w:t>
+      </w:r>
+      <w:r>
+        <w:rPr>
+          <w:i/>
+          <w:iCs/>
+          <w:sz w:val="24"/>
+          <w:szCs w:val="24"/>
+        </w:rPr>
+        <w:t>P4144R1 Remove span’s initializer_list constructor for C++26</w:t>
+      </w:r>
+      <w:r>
+        <w:rPr>
+          <w:sz w:val="24"/>
+          <w:szCs w:val="24"/>
+        </w:rPr>
+        <w:t>. Online. Open Standards. 2026. Dostupné z: </w:t>
+      </w:r>
+      <w:hyperlink r:id="rId18" w:history="1">
+        <w:r>
+          <w:rPr>
+            <w:rStyle w:val="Hypertextovodkaz"/>
+            <w:sz w:val="24"/>
+            <w:szCs w:val="24"/>
+          </w:rPr>
+          <w:t>https://www.open-std.org/jtc1/sc22/wg21/docs/papers/2026/p4144r1.html</w:t>
+        </w:r>
+      </w:hyperlink>
+      <w:r>
+        <w:rPr>
+          <w:sz w:val="24"/>
+          <w:szCs w:val="24"/>
+        </w:rPr>
+        <w:t>. [cit. 2026-05-17].</w:t>
+      </w:r>
     </w:p>
     <w:p>
       <w:pPr>
@@ -11587,12 +12023,12 @@
       <w:r>
         <w:br w:type="page"/>
       </w:r>
-      <w:bookmarkStart w:id="32" w:name="_Toc229864013"/>
+      <w:bookmarkStart w:id="31" w:name="_Toc229864013"/>
       <w:r>
         <w:lastRenderedPageBreak/>
         <w:t>SEZNAM PŘÍLOH</w:t>
       </w:r>
-      <w:bookmarkEnd w:id="32"/>
+      <w:bookmarkEnd w:id="31"/>
     </w:p>
     <w:p>
       <w:pPr>
@@ -11711,7 +12147,7 @@
       </w:pPr>
     </w:p>
     <w:sectPr>
-      <w:footerReference w:type="default" r:id="rId13"/>
+      <w:footerReference w:type="default" r:id="rId19"/>
       <w:pgSz w:w="11906" w:h="16838"/>
       <w:pgMar w:top="1418" w:right="851" w:bottom="1418" w:left="1985" w:header="709" w:footer="709" w:gutter="0"/>
       <w:cols w:space="708"/>
@@ -13650,7 +14086,6 @@
   <w:style w:type="character" w:default="1" w:styleId="Standardnpsmoodstavce">
     <w:name w:val="Default Paragraph Font"/>
     <w:uiPriority w:val="1"/>
-    <w:semiHidden/>
     <w:unhideWhenUsed/>
   </w:style>
   <w:style w:type="table" w:default="1" w:styleId="Normlntabulka">

</xml_diff>